<commit_message>
feat: Vault en todos los servicios con BD + Camunda 7 (saga BPMN) + doc del stack
</commit_message>
<xml_diff>
--- a/BookPlus-Stack-Tecnologico.docx
+++ b/BookPlus-Stack-Tecnologico.docx
@@ -7871,6 +7871,170 @@
     </w:p>
     <w:p>
       <w:pPr>
+        <w:pStyle w:val="Heading2"/>
+      </w:pPr>
+      <w:r>
+        <w:rPr>
+          <w:rFonts w:ascii="Arial" w:cs="Arial" w:eastAsia="Arial" w:hAnsi="Arial"/>
+        </w:rPr>
+        <w:t xml:space="preserve">13.7 HashiCorp Vault — gestión de secretos</w:t>
+      </w:r>
+    </w:p>
+    <w:p>
+      <w:pPr>
+        <w:spacing w:after="120" w:line="276"/>
+      </w:pPr>
+      <w:r>
+        <w:rPr>
+          <w:rFonts w:ascii="Arial" w:cs="Arial" w:eastAsia="Arial" w:hAnsi="Arial"/>
+          <w:b/>
+          <w:bCs/>
+        </w:rPr>
+        <w:t xml:space="preserve">Qué es: </w:t>
+      </w:r>
+      <w:r>
+        <w:rPr>
+          <w:rFonts w:ascii="Arial" w:cs="Arial" w:eastAsia="Arial" w:hAnsi="Arial"/>
+        </w:rPr>
+        <w:t xml:space="preserve">Vault almacena los secretos (contraseñas de base de datos, claves, tokens) cifrados y los entrega a los servicios bajo demanda, en lugar de tenerlos en texto plano en variables de entorno. Es casi obligatorio en banca y grandes empresas.</w:t>
+      </w:r>
+    </w:p>
+    <w:p>
+      <w:pPr>
+        <w:spacing w:after="120" w:line="276"/>
+      </w:pPr>
+      <w:r>
+        <w:rPr>
+          <w:rFonts w:ascii="Arial" w:cs="Arial" w:eastAsia="Arial" w:hAnsi="Arial"/>
+          <w:b/>
+          <w:bCs/>
+        </w:rPr>
+        <w:t xml:space="preserve">Cómo se integra: </w:t>
+      </w:r>
+      <w:r>
+        <w:rPr>
+          <w:rFonts w:ascii="Arial" w:cs="Arial" w:eastAsia="Arial" w:hAnsi="Arial"/>
+        </w:rPr>
+        <w:t xml:space="preserve">Vault corre como servicio en Docker Compose y un init carga los secretos. Los 7 servicios con base de datos integran Spring Cloud Vault mediante un perfil </w:t>
+      </w:r>
+      <w:r>
+        <w:rPr>
+          <w:rFonts w:ascii="Consolas" w:cs="Consolas" w:eastAsia="Consolas" w:hAnsi="Consolas"/>
+          <w:color w:val="4F46E5"/>
+        </w:rPr>
+        <w:t xml:space="preserve">vault</w:t>
+      </w:r>
+      <w:r>
+        <w:rPr>
+          <w:rFonts w:ascii="Arial" w:cs="Arial" w:eastAsia="Arial" w:hAnsi="Arial"/>
+        </w:rPr>
+        <w:t xml:space="preserve"> opt-in: con </w:t>
+      </w:r>
+      <w:r>
+        <w:rPr>
+          <w:rFonts w:ascii="Consolas" w:cs="Consolas" w:eastAsia="Consolas" w:hAnsi="Consolas"/>
+          <w:color w:val="4F46E5"/>
+        </w:rPr>
+        <w:t xml:space="preserve">SPRING_PROFILES_ACTIVE=vault</w:t>
+      </w:r>
+      <w:r>
+        <w:rPr>
+          <w:rFonts w:ascii="Arial" w:cs="Arial" w:eastAsia="Arial" w:hAnsi="Arial"/>
+        </w:rPr>
+        <w:t xml:space="preserve"> leen sus credenciales de </w:t>
+      </w:r>
+      <w:r>
+        <w:rPr>
+          <w:rFonts w:ascii="Consolas" w:cs="Consolas" w:eastAsia="Consolas" w:hAnsi="Consolas"/>
+          <w:color w:val="4F46E5"/>
+        </w:rPr>
+        <w:t xml:space="preserve">secret/bookplus/&lt;servicio&gt;</w:t>
+      </w:r>
+      <w:r>
+        <w:rPr>
+          <w:rFonts w:ascii="Arial" w:cs="Arial" w:eastAsia="Arial" w:hAnsi="Arial"/>
+        </w:rPr>
+        <w:t xml:space="preserve"> en lugar de variables de entorno. Sin ese perfil, el arranque no cambia (cero riesgo). Detalle en VAULT-INTEGRATION.md.</w:t>
+      </w:r>
+    </w:p>
+    <w:p>
+      <w:pPr>
+        <w:pStyle w:val="Heading2"/>
+      </w:pPr>
+      <w:r>
+        <w:rPr>
+          <w:rFonts w:ascii="Arial" w:cs="Arial" w:eastAsia="Arial" w:hAnsi="Arial"/>
+        </w:rPr>
+        <w:t xml:space="preserve">13.8 Camunda 7 — orquestación BPMN de la saga</w:t>
+      </w:r>
+    </w:p>
+    <w:p>
+      <w:pPr>
+        <w:spacing w:after="120" w:line="276"/>
+      </w:pPr>
+      <w:r>
+        <w:rPr>
+          <w:rFonts w:ascii="Arial" w:cs="Arial" w:eastAsia="Arial" w:hAnsi="Arial"/>
+          <w:b/>
+          <w:bCs/>
+        </w:rPr>
+        <w:t xml:space="preserve">Qué es: </w:t>
+      </w:r>
+      <w:r>
+        <w:rPr>
+          <w:rFonts w:ascii="Arial" w:cs="Arial" w:eastAsia="Arial" w:hAnsi="Arial"/>
+        </w:rPr>
+        <w:t xml:space="preserve">un motor de procesos BPMN: modela procesos de negocio largos como diagramas estándar (BPMN 2.0) y los ejecuta con visibilidad, compensaciones y auditoría. Muy usado en banca para flujos como apertura de cuenta, préstamos o pagos.</w:t>
+      </w:r>
+    </w:p>
+    <w:p>
+      <w:pPr>
+        <w:spacing w:after="120" w:line="276"/>
+      </w:pPr>
+      <w:r>
+        <w:rPr>
+          <w:rFonts w:ascii="Arial" w:cs="Arial" w:eastAsia="Arial" w:hAnsi="Arial"/>
+          <w:b/>
+          <w:bCs/>
+        </w:rPr>
+        <w:t xml:space="preserve">Cómo se integra: </w:t>
+      </w:r>
+      <w:r>
+        <w:rPr>
+          <w:rFonts w:ascii="Arial" w:cs="Arial" w:eastAsia="Arial" w:hAnsi="Arial"/>
+        </w:rPr>
+        <w:t xml:space="preserve">en order-service, de forma aditiva al flujo por eventos. El proceso </w:t>
+      </w:r>
+      <w:r>
+        <w:rPr>
+          <w:rFonts w:ascii="Consolas" w:cs="Consolas" w:eastAsia="Consolas" w:hAnsi="Consolas"/>
+          <w:color w:val="4F46E5"/>
+        </w:rPr>
+        <w:t xml:space="preserve">purchase-saga.bpmn</w:t>
+      </w:r>
+      <w:r>
+        <w:rPr>
+          <w:rFonts w:ascii="Arial" w:cs="Arial" w:eastAsia="Arial" w:hAnsi="Arial"/>
+        </w:rPr>
+        <w:t xml:space="preserve"> modela la decisión y compensación de la compra (gateway “¿pago aprobado?” → confirmar pago, o cancelar pedido). Cada service task invoca un </w:t>
+      </w:r>
+      <w:r>
+        <w:rPr>
+          <w:rFonts w:ascii="Arial" w:cs="Arial" w:eastAsia="Arial" w:hAnsi="Arial"/>
+          <w:b/>
+          <w:bCs/>
+        </w:rPr>
+        <w:t xml:space="preserve">delegate</w:t>
+      </w:r>
+      <w:r>
+        <w:rPr>
+          <w:rFonts w:ascii="Arial" w:cs="Arial" w:eastAsia="Arial" w:hAnsi="Arial"/>
+        </w:rPr>
+        <w:t xml:space="preserve"> que llama a un caso de uso existente — el mismo patrón hexagonal que un controlador REST. La saga por Kafka sigue intacta; Camunda añade una orquestación modelada y auditable encima. Detalle en CAMUNDA-INTEGRATION.md.</w:t>
+      </w:r>
+    </w:p>
+    <w:p>
+      <w:pPr>
         <w:pStyle w:val="Heading1"/>
       </w:pPr>
       <w:r>
@@ -9813,6 +9977,196 @@
                 <w:szCs w:val="19"/>
               </w:rPr>
               <w:t xml:space="preserve">Desacoplar y facilitar las pruebas</w:t>
+            </w:r>
+          </w:p>
+        </w:tc>
+      </w:tr>
+      <w:tr>
+        <w:trPr>
+          <w:tblHeader w:val="false"/>
+        </w:trPr>
+        <w:tc>
+          <w:tcPr>
+            <w:tcW w:type="dxa" w:w="2500"/>
+            <w:tcBorders>
+              <w:top w:val="single" w:color="D1D5DB" w:sz="1"/>
+              <w:left w:val="single" w:color="D1D5DB" w:sz="1"/>
+              <w:bottom w:val="single" w:color="D1D5DB" w:sz="1"/>
+              <w:right w:val="single" w:color="D1D5DB" w:sz="1"/>
+            </w:tcBorders>
+            <w:tcMar>
+              <w:top w:type="dxa" w:w="60"/>
+              <w:left w:type="dxa" w:w="110"/>
+              <w:bottom w:type="dxa" w:w="60"/>
+              <w:right w:type="dxa" w:w="110"/>
+            </w:tcMar>
+          </w:tcPr>
+          <w:p>
+            <w:pPr>
+              <w:spacing w:after="0" w:line="264"/>
+            </w:pPr>
+            <w:r>
+              <w:rPr>
+                <w:rFonts w:ascii="Arial" w:cs="Arial" w:eastAsia="Arial" w:hAnsi="Arial"/>
+                <w:sz w:val="19"/>
+                <w:szCs w:val="19"/>
+              </w:rPr>
+              <w:t xml:space="preserve">Orquestación de saga (BPMN)</w:t>
+            </w:r>
+          </w:p>
+        </w:tc>
+        <w:tc>
+          <w:tcPr>
+            <w:tcW w:type="dxa" w:w="3700"/>
+            <w:tcBorders>
+              <w:top w:val="single" w:color="D1D5DB" w:sz="1"/>
+              <w:left w:val="single" w:color="D1D5DB" w:sz="1"/>
+              <w:bottom w:val="single" w:color="D1D5DB" w:sz="1"/>
+              <w:right w:val="single" w:color="D1D5DB" w:sz="1"/>
+            </w:tcBorders>
+            <w:tcMar>
+              <w:top w:type="dxa" w:w="60"/>
+              <w:left w:type="dxa" w:w="110"/>
+              <w:bottom w:type="dxa" w:w="60"/>
+              <w:right w:type="dxa" w:w="110"/>
+            </w:tcMar>
+          </w:tcPr>
+          <w:p>
+            <w:pPr>
+              <w:spacing w:after="0" w:line="264"/>
+            </w:pPr>
+            <w:r>
+              <w:rPr>
+                <w:rFonts w:ascii="Arial" w:cs="Arial" w:eastAsia="Arial" w:hAnsi="Arial"/>
+                <w:sz w:val="19"/>
+                <w:szCs w:val="19"/>
+              </w:rPr>
+              <w:t xml:space="preserve">Camunda 7 en order-service</w:t>
+            </w:r>
+          </w:p>
+        </w:tc>
+        <w:tc>
+          <w:tcPr>
+            <w:tcW w:type="dxa" w:w="3160"/>
+            <w:tcBorders>
+              <w:top w:val="single" w:color="D1D5DB" w:sz="1"/>
+              <w:left w:val="single" w:color="D1D5DB" w:sz="1"/>
+              <w:bottom w:val="single" w:color="D1D5DB" w:sz="1"/>
+              <w:right w:val="single" w:color="D1D5DB" w:sz="1"/>
+            </w:tcBorders>
+            <w:tcMar>
+              <w:top w:type="dxa" w:w="60"/>
+              <w:left w:type="dxa" w:w="110"/>
+              <w:bottom w:type="dxa" w:w="60"/>
+              <w:right w:type="dxa" w:w="110"/>
+            </w:tcMar>
+          </w:tcPr>
+          <w:p>
+            <w:pPr>
+              <w:spacing w:after="0" w:line="264"/>
+            </w:pPr>
+            <w:r>
+              <w:rPr>
+                <w:rFonts w:ascii="Arial" w:cs="Arial" w:eastAsia="Arial" w:hAnsi="Arial"/>
+                <w:sz w:val="19"/>
+                <w:szCs w:val="19"/>
+              </w:rPr>
+              <w:t xml:space="preserve">Coordinar el proceso largo como un flujo modelado y auditable</w:t>
+            </w:r>
+          </w:p>
+        </w:tc>
+      </w:tr>
+      <w:tr>
+        <w:trPr>
+          <w:tblHeader w:val="false"/>
+        </w:trPr>
+        <w:tc>
+          <w:tcPr>
+            <w:tcW w:type="dxa" w:w="2500"/>
+            <w:tcBorders>
+              <w:top w:val="single" w:color="D1D5DB" w:sz="1"/>
+              <w:left w:val="single" w:color="D1D5DB" w:sz="1"/>
+              <w:bottom w:val="single" w:color="D1D5DB" w:sz="1"/>
+              <w:right w:val="single" w:color="D1D5DB" w:sz="1"/>
+            </w:tcBorders>
+            <w:tcMar>
+              <w:top w:type="dxa" w:w="60"/>
+              <w:left w:type="dxa" w:w="110"/>
+              <w:bottom w:type="dxa" w:w="60"/>
+              <w:right w:type="dxa" w:w="110"/>
+            </w:tcMar>
+          </w:tcPr>
+          <w:p>
+            <w:pPr>
+              <w:spacing w:after="0" w:line="264"/>
+            </w:pPr>
+            <w:r>
+              <w:rPr>
+                <w:rFonts w:ascii="Arial" w:cs="Arial" w:eastAsia="Arial" w:hAnsi="Arial"/>
+                <w:sz w:val="19"/>
+                <w:szCs w:val="19"/>
+              </w:rPr>
+              <w:t xml:space="preserve">Externalización de secretos</w:t>
+            </w:r>
+          </w:p>
+        </w:tc>
+        <w:tc>
+          <w:tcPr>
+            <w:tcW w:type="dxa" w:w="3700"/>
+            <w:tcBorders>
+              <w:top w:val="single" w:color="D1D5DB" w:sz="1"/>
+              <w:left w:val="single" w:color="D1D5DB" w:sz="1"/>
+              <w:bottom w:val="single" w:color="D1D5DB" w:sz="1"/>
+              <w:right w:val="single" w:color="D1D5DB" w:sz="1"/>
+            </w:tcBorders>
+            <w:tcMar>
+              <w:top w:type="dxa" w:w="60"/>
+              <w:left w:type="dxa" w:w="110"/>
+              <w:bottom w:type="dxa" w:w="60"/>
+              <w:right w:type="dxa" w:w="110"/>
+            </w:tcMar>
+          </w:tcPr>
+          <w:p>
+            <w:pPr>
+              <w:spacing w:after="0" w:line="264"/>
+            </w:pPr>
+            <w:r>
+              <w:rPr>
+                <w:rFonts w:ascii="Arial" w:cs="Arial" w:eastAsia="Arial" w:hAnsi="Arial"/>
+                <w:sz w:val="19"/>
+                <w:szCs w:val="19"/>
+              </w:rPr>
+              <w:t xml:space="preserve">HashiCorp Vault + Spring Cloud Vault</w:t>
+            </w:r>
+          </w:p>
+        </w:tc>
+        <w:tc>
+          <w:tcPr>
+            <w:tcW w:type="dxa" w:w="3160"/>
+            <w:tcBorders>
+              <w:top w:val="single" w:color="D1D5DB" w:sz="1"/>
+              <w:left w:val="single" w:color="D1D5DB" w:sz="1"/>
+              <w:bottom w:val="single" w:color="D1D5DB" w:sz="1"/>
+              <w:right w:val="single" w:color="D1D5DB" w:sz="1"/>
+            </w:tcBorders>
+            <w:tcMar>
+              <w:top w:type="dxa" w:w="60"/>
+              <w:left w:type="dxa" w:w="110"/>
+              <w:bottom w:type="dxa" w:w="60"/>
+              <w:right w:type="dxa" w:w="110"/>
+            </w:tcMar>
+          </w:tcPr>
+          <w:p>
+            <w:pPr>
+              <w:spacing w:after="0" w:line="264"/>
+            </w:pPr>
+            <w:r>
+              <w:rPr>
+                <w:rFonts w:ascii="Arial" w:cs="Arial" w:eastAsia="Arial" w:hAnsi="Arial"/>
+                <w:sz w:val="19"/>
+                <w:szCs w:val="19"/>
+              </w:rPr>
+              <w:t xml:space="preserve">Servir credenciales cifradas en vez de texto plano</w:t>
             </w:r>
           </w:p>
         </w:tc>

</xml_diff>

<commit_message>
test: contract testing con Pact (consumidor cart.checked-out) + doc
</commit_message>
<xml_diff>
--- a/BookPlus-Stack-Tecnologico.docx
+++ b/BookPlus-Stack-Tecnologico.docx
@@ -8035,6 +8035,94 @@
     </w:p>
     <w:p>
       <w:pPr>
+        <w:pStyle w:val="Heading2"/>
+      </w:pPr>
+      <w:r>
+        <w:rPr>
+          <w:rFonts w:ascii="Arial" w:cs="Arial" w:eastAsia="Arial" w:hAnsi="Arial"/>
+        </w:rPr>
+        <w:t xml:space="preserve">13.9 Pact — contract testing de eventos</w:t>
+      </w:r>
+    </w:p>
+    <w:p>
+      <w:pPr>
+        <w:spacing w:after="120" w:line="276"/>
+      </w:pPr>
+      <w:r>
+        <w:rPr>
+          <w:rFonts w:ascii="Arial" w:cs="Arial" w:eastAsia="Arial" w:hAnsi="Arial"/>
+          <w:b/>
+          <w:bCs/>
+        </w:rPr>
+        <w:t xml:space="preserve">Qué es: </w:t>
+      </w:r>
+      <w:r>
+        <w:rPr>
+          <w:rFonts w:ascii="Arial" w:cs="Arial" w:eastAsia="Arial" w:hAnsi="Arial"/>
+        </w:rPr>
+        <w:t xml:space="preserve">verifica que el contrato entre el productor y el consumidor de un mensaje no se rompe, sin levantar ambos servicios a la vez. Evita que un cambio en un servicio rompa silenciosamente a otro — clave en microservicios.</w:t>
+      </w:r>
+    </w:p>
+    <w:p>
+      <w:pPr>
+        <w:spacing w:after="120" w:line="276"/>
+      </w:pPr>
+      <w:r>
+        <w:rPr>
+          <w:rFonts w:ascii="Arial" w:cs="Arial" w:eastAsia="Arial" w:hAnsi="Arial"/>
+          <w:b/>
+          <w:bCs/>
+        </w:rPr>
+        <w:t xml:space="preserve">Cómo se integra: </w:t>
+      </w:r>
+      <w:r>
+        <w:rPr>
+          <w:rFonts w:ascii="Arial" w:cs="Arial" w:eastAsia="Arial" w:hAnsi="Arial"/>
+        </w:rPr>
+        <w:t xml:space="preserve">se aplica al evento </w:t>
+      </w:r>
+      <w:r>
+        <w:rPr>
+          <w:rFonts w:ascii="Consolas" w:cs="Consolas" w:eastAsia="Consolas" w:hAnsi="Consolas"/>
+          <w:color w:val="4F46E5"/>
+        </w:rPr>
+        <w:t xml:space="preserve">cart.checked-out</w:t>
+      </w:r>
+      <w:r>
+        <w:rPr>
+          <w:rFonts w:ascii="Arial" w:cs="Arial" w:eastAsia="Arial" w:hAnsi="Arial"/>
+        </w:rPr>
+        <w:t xml:space="preserve"> (cart lo produce, order lo consume). Un test Pact en order define el contrato (incluyendo la serialización real: los value objects viajan como </w:t>
+      </w:r>
+      <w:r>
+        <w:rPr>
+          <w:rFonts w:ascii="Consolas" w:cs="Consolas" w:eastAsia="Consolas" w:hAnsi="Consolas"/>
+          <w:color w:val="4F46E5"/>
+        </w:rPr>
+        <w:t xml:space="preserve">{"value":"&lt;uuid&gt;"}</w:t>
+      </w:r>
+      <w:r>
+        <w:rPr>
+          <w:rFonts w:ascii="Arial" w:cs="Arial" w:eastAsia="Arial" w:hAnsi="Arial"/>
+        </w:rPr>
+        <w:t xml:space="preserve">) y comprueba que el consumidor real lo procesa; al pasar, genera el contrato en </w:t>
+      </w:r>
+      <w:r>
+        <w:rPr>
+          <w:rFonts w:ascii="Consolas" w:cs="Consolas" w:eastAsia="Consolas" w:hAnsi="Consolas"/>
+          <w:color w:val="4F46E5"/>
+        </w:rPr>
+        <w:t xml:space="preserve">target/pacts</w:t>
+      </w:r>
+      <w:r>
+        <w:rPr>
+          <w:rFonts w:ascii="Arial" w:cs="Arial" w:eastAsia="Arial" w:hAnsi="Arial"/>
+        </w:rPr>
+        <w:t xml:space="preserve">. El productor verifica luego que su mensaje cumple ese contrato. En producción lo automatiza un Pact Broker. Detalle en CONTRACT-TESTING.md.</w:t>
+      </w:r>
+    </w:p>
+    <w:p>
+      <w:pPr>
         <w:pStyle w:val="Heading1"/>
       </w:pPr>
       <w:r>
@@ -10167,6 +10255,101 @@
                 <w:szCs w:val="19"/>
               </w:rPr>
               <w:t xml:space="preserve">Servir credenciales cifradas en vez de texto plano</w:t>
+            </w:r>
+          </w:p>
+        </w:tc>
+      </w:tr>
+      <w:tr>
+        <w:trPr>
+          <w:tblHeader w:val="false"/>
+        </w:trPr>
+        <w:tc>
+          <w:tcPr>
+            <w:tcW w:type="dxa" w:w="2500"/>
+            <w:tcBorders>
+              <w:top w:val="single" w:color="D1D5DB" w:sz="1"/>
+              <w:left w:val="single" w:color="D1D5DB" w:sz="1"/>
+              <w:bottom w:val="single" w:color="D1D5DB" w:sz="1"/>
+              <w:right w:val="single" w:color="D1D5DB" w:sz="1"/>
+            </w:tcBorders>
+            <w:tcMar>
+              <w:top w:type="dxa" w:w="60"/>
+              <w:left w:type="dxa" w:w="110"/>
+              <w:bottom w:type="dxa" w:w="60"/>
+              <w:right w:type="dxa" w:w="110"/>
+            </w:tcMar>
+          </w:tcPr>
+          <w:p>
+            <w:pPr>
+              <w:spacing w:after="0" w:line="264"/>
+            </w:pPr>
+            <w:r>
+              <w:rPr>
+                <w:rFonts w:ascii="Arial" w:cs="Arial" w:eastAsia="Arial" w:hAnsi="Arial"/>
+                <w:sz w:val="19"/>
+                <w:szCs w:val="19"/>
+              </w:rPr>
+              <w:t xml:space="preserve">Consumer-Driven Contracts</w:t>
+            </w:r>
+          </w:p>
+        </w:tc>
+        <w:tc>
+          <w:tcPr>
+            <w:tcW w:type="dxa" w:w="3700"/>
+            <w:tcBorders>
+              <w:top w:val="single" w:color="D1D5DB" w:sz="1"/>
+              <w:left w:val="single" w:color="D1D5DB" w:sz="1"/>
+              <w:bottom w:val="single" w:color="D1D5DB" w:sz="1"/>
+              <w:right w:val="single" w:color="D1D5DB" w:sz="1"/>
+            </w:tcBorders>
+            <w:tcMar>
+              <w:top w:type="dxa" w:w="60"/>
+              <w:left w:type="dxa" w:w="110"/>
+              <w:bottom w:type="dxa" w:w="60"/>
+              <w:right w:type="dxa" w:w="110"/>
+            </w:tcMar>
+          </w:tcPr>
+          <w:p>
+            <w:pPr>
+              <w:spacing w:after="0" w:line="264"/>
+            </w:pPr>
+            <w:r>
+              <w:rPr>
+                <w:rFonts w:ascii="Arial" w:cs="Arial" w:eastAsia="Arial" w:hAnsi="Arial"/>
+                <w:sz w:val="19"/>
+                <w:szCs w:val="19"/>
+              </w:rPr>
+              <w:t xml:space="preserve">Pact (cart.checked-out: order consume)</w:t>
+            </w:r>
+          </w:p>
+        </w:tc>
+        <w:tc>
+          <w:tcPr>
+            <w:tcW w:type="dxa" w:w="3160"/>
+            <w:tcBorders>
+              <w:top w:val="single" w:color="D1D5DB" w:sz="1"/>
+              <w:left w:val="single" w:color="D1D5DB" w:sz="1"/>
+              <w:bottom w:val="single" w:color="D1D5DB" w:sz="1"/>
+              <w:right w:val="single" w:color="D1D5DB" w:sz="1"/>
+            </w:tcBorders>
+            <w:tcMar>
+              <w:top w:type="dxa" w:w="60"/>
+              <w:left w:type="dxa" w:w="110"/>
+              <w:bottom w:type="dxa" w:w="60"/>
+              <w:right w:type="dxa" w:w="110"/>
+            </w:tcMar>
+          </w:tcPr>
+          <w:p>
+            <w:pPr>
+              <w:spacing w:after="0" w:line="264"/>
+            </w:pPr>
+            <w:r>
+              <w:rPr>
+                <w:rFonts w:ascii="Arial" w:cs="Arial" w:eastAsia="Arial" w:hAnsi="Arial"/>
+                <w:sz w:val="19"/>
+                <w:szCs w:val="19"/>
+              </w:rPr>
+              <w:t xml:space="preserve">Garantizar la compatibilidad de eventos entre servicios</w:t>
             </w:r>
           </w:p>
         </w:tc>

</xml_diff>

<commit_message>
test: mutation testing con PIT (70%→79%) + refuerzo de tests de cupones
</commit_message>
<xml_diff>
--- a/BookPlus-Stack-Tecnologico.docx
+++ b/BookPlus-Stack-Tecnologico.docx
@@ -8119,6 +8119,74 @@
           <w:rFonts w:ascii="Arial" w:cs="Arial" w:eastAsia="Arial" w:hAnsi="Arial"/>
         </w:rPr>
         <w:t xml:space="preserve">. El productor verifica luego que su mensaje cumple ese contrato. En producción lo automatiza un Pact Broker. Detalle en CONTRACT-TESTING.md.</w:t>
+      </w:r>
+    </w:p>
+    <w:p>
+      <w:pPr>
+        <w:pStyle w:val="Heading2"/>
+      </w:pPr>
+      <w:r>
+        <w:rPr>
+          <w:rFonts w:ascii="Arial" w:cs="Arial" w:eastAsia="Arial" w:hAnsi="Arial"/>
+        </w:rPr>
+        <w:t xml:space="preserve">13.10 PITest — mutation testing</w:t>
+      </w:r>
+    </w:p>
+    <w:p>
+      <w:pPr>
+        <w:spacing w:after="120" w:line="276"/>
+      </w:pPr>
+      <w:r>
+        <w:rPr>
+          <w:rFonts w:ascii="Arial" w:cs="Arial" w:eastAsia="Arial" w:hAnsi="Arial"/>
+          <w:b/>
+          <w:bCs/>
+        </w:rPr>
+        <w:t xml:space="preserve">Qué es: </w:t>
+      </w:r>
+      <w:r>
+        <w:rPr>
+          <w:rFonts w:ascii="Arial" w:cs="Arial" w:eastAsia="Arial" w:hAnsi="Arial"/>
+        </w:rPr>
+        <w:t xml:space="preserve">la cobertura dice qué líneas ejecutan los tests, no si detectan errores. El mutation testing introduce “mutantes” en el código (cambia un &gt; por &gt;=, un &amp;&amp; por ||, devuelve null…) y re-ejecuta los tests; si un test falla, el mutante queda “matado” (los tests detectan ese fallo). El % de mutantes matados es una medida mucho más honesta de la calidad de las pruebas que la cobertura.</w:t>
+      </w:r>
+    </w:p>
+    <w:p>
+      <w:pPr>
+        <w:spacing w:after="120" w:line="276"/>
+      </w:pPr>
+      <w:r>
+        <w:rPr>
+          <w:rFonts w:ascii="Arial" w:cs="Arial" w:eastAsia="Arial" w:hAnsi="Arial"/>
+          <w:b/>
+          <w:bCs/>
+        </w:rPr>
+        <w:t xml:space="preserve">Cómo se integra: </w:t>
+      </w:r>
+      <w:r>
+        <w:rPr>
+          <w:rFonts w:ascii="Arial" w:cs="Arial" w:eastAsia="Arial" w:hAnsi="Arial"/>
+        </w:rPr>
+        <w:t xml:space="preserve">el plugin PIT (pitest-maven) en order-service, acotado a la lógica de negocio (política de reembolsos, cupones). No corre en el `mvn test` normal; se lanza con un goal específico y deja un informe HTML que muestra, línea a línea, qué mutantes sobrevivieron.</w:t>
+      </w:r>
+    </w:p>
+    <w:p>
+      <w:pPr>
+        <w:spacing w:after="120" w:line="276"/>
+      </w:pPr>
+      <w:r>
+        <w:rPr>
+          <w:rFonts w:ascii="Arial" w:cs="Arial" w:eastAsia="Arial" w:hAnsi="Arial"/>
+          <w:b/>
+          <w:bCs/>
+        </w:rPr>
+        <w:t xml:space="preserve">En la práctica: </w:t>
+      </w:r>
+      <w:r>
+        <w:rPr>
+          <w:rFonts w:ascii="Arial" w:cs="Arial" w:eastAsia="Arial" w:hAnsi="Arial"/>
+        </w:rPr>
+        <w:t xml:space="preserve">PIT reveló agujeros en los tests de cupones; al añadir un test que cubría todas las ramas de validación, el mutation score subió del 70% al 79% y la cobertura de línea del 84% al 94%. Es la forma profesional de usar la herramienta: detectar y cerrar agujeros reales, no perseguir el 100%.</w:t>
       </w:r>
     </w:p>
     <w:p>

</xml_diff>

<commit_message>
perf: pruebas de carga con k6 (catálogo) + compose profile perf + doc
</commit_message>
<xml_diff>
--- a/BookPlus-Stack-Tecnologico.docx
+++ b/BookPlus-Stack-Tecnologico.docx
@@ -8187,6 +8187,95 @@
           <w:rFonts w:ascii="Arial" w:cs="Arial" w:eastAsia="Arial" w:hAnsi="Arial"/>
         </w:rPr>
         <w:t xml:space="preserve">PIT reveló agujeros en los tests de cupones; al añadir un test que cubría todas las ramas de validación, el mutation score subió del 70% al 79% y la cobertura de línea del 84% al 94%. Es la forma profesional de usar la herramienta: detectar y cerrar agujeros reales, no perseguir el 100%.</w:t>
+      </w:r>
+    </w:p>
+    <w:p>
+      <w:pPr>
+        <w:pStyle w:val="Heading2"/>
+      </w:pPr>
+      <w:r>
+        <w:rPr>
+          <w:rFonts w:ascii="Arial" w:cs="Arial" w:eastAsia="Arial" w:hAnsi="Arial"/>
+        </w:rPr>
+        <w:t xml:space="preserve">13.11 k6 — pruebas de carga</w:t>
+      </w:r>
+    </w:p>
+    <w:p>
+      <w:pPr>
+        <w:spacing w:after="120" w:line="276"/>
+      </w:pPr>
+      <w:r>
+        <w:rPr>
+          <w:rFonts w:ascii="Arial" w:cs="Arial" w:eastAsia="Arial" w:hAnsi="Arial"/>
+          <w:b/>
+          <w:bCs/>
+        </w:rPr>
+        <w:t xml:space="preserve">Qué es: </w:t>
+      </w:r>
+      <w:r>
+        <w:rPr>
+          <w:rFonts w:ascii="Arial" w:cs="Arial" w:eastAsia="Arial" w:hAnsi="Arial"/>
+        </w:rPr>
+        <w:t xml:space="preserve">miden el comportamiento bajo concurrencia — throughput (peticiones/seg), latencia (p95/p99) y tasa de error según sube la carga. Son requisitos no funcionales obligatorios en banca (SLAs, capacity planning). k6 es una herramienta moderna cuyos escenarios se escriben en JavaScript.</w:t>
+      </w:r>
+    </w:p>
+    <w:p>
+      <w:pPr>
+        <w:spacing w:after="120" w:line="276"/>
+      </w:pPr>
+      <w:r>
+        <w:rPr>
+          <w:rFonts w:ascii="Arial" w:cs="Arial" w:eastAsia="Arial" w:hAnsi="Arial"/>
+          <w:b/>
+          <w:bCs/>
+        </w:rPr>
+        <w:t xml:space="preserve">Cómo se integra: </w:t>
+      </w:r>
+      <w:r>
+        <w:rPr>
+          <w:rFonts w:ascii="Arial" w:cs="Arial" w:eastAsia="Arial" w:hAnsi="Arial"/>
+        </w:rPr>
+        <w:t xml:space="preserve">el script </w:t>
+      </w:r>
+      <w:r>
+        <w:rPr>
+          <w:rFonts w:ascii="Consolas" w:cs="Consolas" w:eastAsia="Consolas" w:hAnsi="Consolas"/>
+          <w:color w:val="4F46E5"/>
+        </w:rPr>
+        <w:t xml:space="preserve">perf/k6/load-test.js</w:t>
+      </w:r>
+      <w:r>
+        <w:rPr>
+          <w:rFonts w:ascii="Arial" w:cs="Arial" w:eastAsia="Arial" w:hAnsi="Arial"/>
+        </w:rPr>
+        <w:t xml:space="preserve"> simula usuarios navegando el catálogo a través del gateway (categorías, listado, búsqueda, detalle y reseñas) con rampa hasta 20 usuarios virtuales y </w:t>
+      </w:r>
+      <w:r>
+        <w:rPr>
+          <w:rFonts w:ascii="Arial" w:cs="Arial" w:eastAsia="Arial" w:hAnsi="Arial"/>
+          <w:b/>
+          <w:bCs/>
+        </w:rPr>
+        <w:t xml:space="preserve">thresholds</w:t>
+      </w:r>
+      <w:r>
+        <w:rPr>
+          <w:rFonts w:ascii="Arial" w:cs="Arial" w:eastAsia="Arial" w:hAnsi="Arial"/>
+        </w:rPr>
+        <w:t xml:space="preserve"> como criterio de aprobado/fallo: menos del 1% de errores y p95 por debajo de 800 ms. Corre como un servicio k6 en Docker Compose bajo el perfil </w:t>
+      </w:r>
+      <w:r>
+        <w:rPr>
+          <w:rFonts w:ascii="Consolas" w:cs="Consolas" w:eastAsia="Consolas" w:hAnsi="Consolas"/>
+          <w:color w:val="4F46E5"/>
+        </w:rPr>
+        <w:t xml:space="preserve">perf</w:t>
+      </w:r>
+      <w:r>
+        <w:rPr>
+          <w:rFonts w:ascii="Arial" w:cs="Arial" w:eastAsia="Arial" w:hAnsi="Arial"/>
+        </w:rPr>
+        <w:t xml:space="preserve">, de modo que no arranca con el stack normal. Detalle en PERFORMANCE-TESTING.md.</w:t>
       </w:r>
     </w:p>
     <w:p>

</xml_diff>

<commit_message>
feat: CDC con Debezium (Outbox Event Router sobre order) + compose + doc
</commit_message>
<xml_diff>
--- a/BookPlus-Stack-Tecnologico.docx
+++ b/BookPlus-Stack-Tecnologico.docx
@@ -8280,6 +8280,95 @@
     </w:p>
     <w:p>
       <w:pPr>
+        <w:pStyle w:val="Heading2"/>
+      </w:pPr>
+      <w:r>
+        <w:rPr>
+          <w:rFonts w:ascii="Arial" w:cs="Arial" w:eastAsia="Arial" w:hAnsi="Arial"/>
+        </w:rPr>
+        <w:t xml:space="preserve">13.12 Debezium — Change Data Capture (CDC)</w:t>
+      </w:r>
+    </w:p>
+    <w:p>
+      <w:pPr>
+        <w:spacing w:after="120" w:line="276"/>
+      </w:pPr>
+      <w:r>
+        <w:rPr>
+          <w:rFonts w:ascii="Arial" w:cs="Arial" w:eastAsia="Arial" w:hAnsi="Arial"/>
+          <w:b/>
+          <w:bCs/>
+        </w:rPr>
+        <w:t xml:space="preserve">Qué es: </w:t>
+      </w:r>
+      <w:r>
+        <w:rPr>
+          <w:rFonts w:ascii="Arial" w:cs="Arial" w:eastAsia="Arial" w:hAnsi="Arial"/>
+        </w:rPr>
+        <w:t xml:space="preserve">captura los cambios de una base de datos leyendo su log de transacciones y los publica como eventos, sin tocar el código de la aplicación y sin hacer polling. Es clave en banca para integrar sistemas (incluso legados) y alimentar pipelines en tiempo real.</w:t>
+      </w:r>
+    </w:p>
+    <w:p>
+      <w:pPr>
+        <w:spacing w:after="120" w:line="276"/>
+      </w:pPr>
+      <w:r>
+        <w:rPr>
+          <w:rFonts w:ascii="Arial" w:cs="Arial" w:eastAsia="Arial" w:hAnsi="Arial"/>
+          <w:b/>
+          <w:bCs/>
+        </w:rPr>
+        <w:t xml:space="preserve">Cómo se integra: </w:t>
+      </w:r>
+      <w:r>
+        <w:rPr>
+          <w:rFonts w:ascii="Arial" w:cs="Arial" w:eastAsia="Arial" w:hAnsi="Arial"/>
+        </w:rPr>
+        <w:t xml:space="preserve">sobre el patrón Outbox que ya existe en order-service. Un Kafka Connect con Debezium (servicio en Docker Compose) usa el </w:t>
+      </w:r>
+      <w:r>
+        <w:rPr>
+          <w:rFonts w:ascii="Arial" w:cs="Arial" w:eastAsia="Arial" w:hAnsi="Arial"/>
+          <w:b/>
+          <w:bCs/>
+        </w:rPr>
+        <w:t xml:space="preserve">Outbox Event Router</w:t>
+      </w:r>
+      <w:r>
+        <w:rPr>
+          <w:rFonts w:ascii="Arial" w:cs="Arial" w:eastAsia="Arial" w:hAnsi="Arial"/>
+        </w:rPr>
+        <w:t xml:space="preserve"> para capturar las inserciones en la tabla </w:t>
+      </w:r>
+      <w:r>
+        <w:rPr>
+          <w:rFonts w:ascii="Consolas" w:cs="Consolas" w:eastAsia="Consolas" w:hAnsi="Consolas"/>
+          <w:color w:val="4F46E5"/>
+        </w:rPr>
+        <w:t xml:space="preserve">outbox_events</w:t>
+      </w:r>
+      <w:r>
+        <w:rPr>
+          <w:rFonts w:ascii="Arial" w:cs="Arial" w:eastAsia="Arial" w:hAnsi="Arial"/>
+        </w:rPr>
+        <w:t xml:space="preserve"> y enrutarlas al topic indicado en cada fila. Sustituye al polling del OutboxRelay: misma garantía de no perder eventos, sin latencia ni carga periódica sobre la base de datos. Requiere </w:t>
+      </w:r>
+      <w:r>
+        <w:rPr>
+          <w:rFonts w:ascii="Consolas" w:cs="Consolas" w:eastAsia="Consolas" w:hAnsi="Consolas"/>
+          <w:color w:val="4F46E5"/>
+        </w:rPr>
+        <w:t xml:space="preserve">wal_level=logical</w:t>
+      </w:r>
+      <w:r>
+        <w:rPr>
+          <w:rFonts w:ascii="Arial" w:cs="Arial" w:eastAsia="Arial" w:hAnsi="Arial"/>
+        </w:rPr>
+        <w:t xml:space="preserve"> en Postgres. Detalle en DEBEZIUM-CDC.md.</w:t>
+      </w:r>
+    </w:p>
+    <w:p>
+      <w:pPr>
         <w:pStyle w:val="Heading1"/>
       </w:pPr>
       <w:r>
@@ -10507,6 +10596,101 @@
                 <w:szCs w:val="19"/>
               </w:rPr>
               <w:t xml:space="preserve">Garantizar la compatibilidad de eventos entre servicios</w:t>
+            </w:r>
+          </w:p>
+        </w:tc>
+      </w:tr>
+      <w:tr>
+        <w:trPr>
+          <w:tblHeader w:val="false"/>
+        </w:trPr>
+        <w:tc>
+          <w:tcPr>
+            <w:tcW w:type="dxa" w:w="2500"/>
+            <w:tcBorders>
+              <w:top w:val="single" w:color="D1D5DB" w:sz="1"/>
+              <w:left w:val="single" w:color="D1D5DB" w:sz="1"/>
+              <w:bottom w:val="single" w:color="D1D5DB" w:sz="1"/>
+              <w:right w:val="single" w:color="D1D5DB" w:sz="1"/>
+            </w:tcBorders>
+            <w:tcMar>
+              <w:top w:type="dxa" w:w="60"/>
+              <w:left w:type="dxa" w:w="110"/>
+              <w:bottom w:type="dxa" w:w="60"/>
+              <w:right w:type="dxa" w:w="110"/>
+            </w:tcMar>
+          </w:tcPr>
+          <w:p>
+            <w:pPr>
+              <w:spacing w:after="0" w:line="264"/>
+            </w:pPr>
+            <w:r>
+              <w:rPr>
+                <w:rFonts w:ascii="Arial" w:cs="Arial" w:eastAsia="Arial" w:hAnsi="Arial"/>
+                <w:sz w:val="19"/>
+                <w:szCs w:val="19"/>
+              </w:rPr>
+              <w:t xml:space="preserve">Change Data Capture (CDC)</w:t>
+            </w:r>
+          </w:p>
+        </w:tc>
+        <w:tc>
+          <w:tcPr>
+            <w:tcW w:type="dxa" w:w="3700"/>
+            <w:tcBorders>
+              <w:top w:val="single" w:color="D1D5DB" w:sz="1"/>
+              <w:left w:val="single" w:color="D1D5DB" w:sz="1"/>
+              <w:bottom w:val="single" w:color="D1D5DB" w:sz="1"/>
+              <w:right w:val="single" w:color="D1D5DB" w:sz="1"/>
+            </w:tcBorders>
+            <w:tcMar>
+              <w:top w:type="dxa" w:w="60"/>
+              <w:left w:type="dxa" w:w="110"/>
+              <w:bottom w:type="dxa" w:w="60"/>
+              <w:right w:type="dxa" w:w="110"/>
+            </w:tcMar>
+          </w:tcPr>
+          <w:p>
+            <w:pPr>
+              <w:spacing w:after="0" w:line="264"/>
+            </w:pPr>
+            <w:r>
+              <w:rPr>
+                <w:rFonts w:ascii="Arial" w:cs="Arial" w:eastAsia="Arial" w:hAnsi="Arial"/>
+                <w:sz w:val="19"/>
+                <w:szCs w:val="19"/>
+              </w:rPr>
+              <w:t xml:space="preserve">Debezium sobre la tabla outbox de order</w:t>
+            </w:r>
+          </w:p>
+        </w:tc>
+        <w:tc>
+          <w:tcPr>
+            <w:tcW w:type="dxa" w:w="3160"/>
+            <w:tcBorders>
+              <w:top w:val="single" w:color="D1D5DB" w:sz="1"/>
+              <w:left w:val="single" w:color="D1D5DB" w:sz="1"/>
+              <w:bottom w:val="single" w:color="D1D5DB" w:sz="1"/>
+              <w:right w:val="single" w:color="D1D5DB" w:sz="1"/>
+            </w:tcBorders>
+            <w:tcMar>
+              <w:top w:type="dxa" w:w="60"/>
+              <w:left w:type="dxa" w:w="110"/>
+              <w:bottom w:type="dxa" w:w="60"/>
+              <w:right w:type="dxa" w:w="110"/>
+            </w:tcMar>
+          </w:tcPr>
+          <w:p>
+            <w:pPr>
+              <w:spacing w:after="0" w:line="264"/>
+            </w:pPr>
+            <w:r>
+              <w:rPr>
+                <w:rFonts w:ascii="Arial" w:cs="Arial" w:eastAsia="Arial" w:hAnsi="Arial"/>
+                <w:sz w:val="19"/>
+                <w:szCs w:val="19"/>
+              </w:rPr>
+              <w:t xml:space="preserve">Publicar cambios de BD como eventos sin tocar la app</w:t>
             </w:r>
           </w:p>
         </w:tc>

</xml_diff>

<commit_message>
feat: Schema Registry (Apicurio) + esquema Avro de cart.checked-out + doc
</commit_message>
<xml_diff>
--- a/BookPlus-Stack-Tecnologico.docx
+++ b/BookPlus-Stack-Tecnologico.docx
@@ -8369,6 +8369,82 @@
     </w:p>
     <w:p>
       <w:pPr>
+        <w:pStyle w:val="Heading2"/>
+      </w:pPr>
+      <w:r>
+        <w:rPr>
+          <w:rFonts w:ascii="Arial" w:cs="Arial" w:eastAsia="Arial" w:hAnsi="Arial"/>
+        </w:rPr>
+        <w:t xml:space="preserve">13.13 Schema Registry + Avro — gobierno de eventos</w:t>
+      </w:r>
+    </w:p>
+    <w:p>
+      <w:pPr>
+        <w:spacing w:after="120" w:line="276"/>
+      </w:pPr>
+      <w:r>
+        <w:rPr>
+          <w:rFonts w:ascii="Arial" w:cs="Arial" w:eastAsia="Arial" w:hAnsi="Arial"/>
+          <w:b/>
+          <w:bCs/>
+        </w:rPr>
+        <w:t xml:space="preserve">Qué es: </w:t>
+      </w:r>
+      <w:r>
+        <w:rPr>
+          <w:rFonts w:ascii="Arial" w:cs="Arial" w:eastAsia="Arial" w:hAnsi="Arial"/>
+        </w:rPr>
+        <w:t xml:space="preserve">hoy los eventos Kafka viajan como JSON libre, sin contrato formal: un cambio en el productor puede romper a los consumidores en silencio. Un Schema Registry da a cada evento un esquema versionado (Avro) que se registra y valida, y rechaza los cambios incompatibles. Es gobierno de datos de eventos, muy presente en banca.</w:t>
+      </w:r>
+    </w:p>
+    <w:p>
+      <w:pPr>
+        <w:spacing w:after="120" w:line="276"/>
+      </w:pPr>
+      <w:r>
+        <w:rPr>
+          <w:rFonts w:ascii="Arial" w:cs="Arial" w:eastAsia="Arial" w:hAnsi="Arial"/>
+          <w:b/>
+          <w:bCs/>
+        </w:rPr>
+        <w:t xml:space="preserve">Cómo se integra: </w:t>
+      </w:r>
+      <w:r>
+        <w:rPr>
+          <w:rFonts w:ascii="Arial" w:cs="Arial" w:eastAsia="Arial" w:hAnsi="Arial"/>
+        </w:rPr>
+        <w:t xml:space="preserve">un Apicurio Registry (open source) en Docker Compose guarda los esquemas. Se define el esquema Avro de </w:t>
+      </w:r>
+      <w:r>
+        <w:rPr>
+          <w:rFonts w:ascii="Consolas" w:cs="Consolas" w:eastAsia="Consolas" w:hAnsi="Consolas"/>
+          <w:color w:val="4F46E5"/>
+        </w:rPr>
+        <w:t xml:space="preserve">cart.checked-out</w:t>
+      </w:r>
+      <w:r>
+        <w:rPr>
+          <w:rFonts w:ascii="Arial" w:cs="Arial" w:eastAsia="Arial" w:hAnsi="Arial"/>
+        </w:rPr>
+        <w:t xml:space="preserve"> (importes como decimal, opcionales como uniones null, records anidados y array de ítems) y se fija una regla de compatibilidad </w:t>
+      </w:r>
+      <w:r>
+        <w:rPr>
+          <w:rFonts w:ascii="Arial" w:cs="Arial" w:eastAsia="Arial" w:hAnsi="Arial"/>
+          <w:b/>
+          <w:bCs/>
+        </w:rPr>
+        <w:t xml:space="preserve">BACKWARD</w:t>
+      </w:r>
+      <w:r>
+        <w:rPr>
+          <w:rFonts w:ascii="Arial" w:cs="Arial" w:eastAsia="Arial" w:hAnsi="Arial"/>
+        </w:rPr>
+        <w:t xml:space="preserve">. Avro es binario (más compacto y rápido que JSON) y de tipado fuerte. La adopción en la serialización de Kafka queda como paso acotado, documentado en SCHEMA-REGISTRY.md.</w:t>
+      </w:r>
+    </w:p>
+    <w:p>
+      <w:pPr>
         <w:pStyle w:val="Heading1"/>
       </w:pPr>
       <w:r>
@@ -10691,6 +10767,101 @@
                 <w:szCs w:val="19"/>
               </w:rPr>
               <w:t xml:space="preserve">Publicar cambios de BD como eventos sin tocar la app</w:t>
+            </w:r>
+          </w:p>
+        </w:tc>
+      </w:tr>
+      <w:tr>
+        <w:trPr>
+          <w:tblHeader w:val="false"/>
+        </w:trPr>
+        <w:tc>
+          <w:tcPr>
+            <w:tcW w:type="dxa" w:w="2500"/>
+            <w:tcBorders>
+              <w:top w:val="single" w:color="D1D5DB" w:sz="1"/>
+              <w:left w:val="single" w:color="D1D5DB" w:sz="1"/>
+              <w:bottom w:val="single" w:color="D1D5DB" w:sz="1"/>
+              <w:right w:val="single" w:color="D1D5DB" w:sz="1"/>
+            </w:tcBorders>
+            <w:tcMar>
+              <w:top w:type="dxa" w:w="60"/>
+              <w:left w:type="dxa" w:w="110"/>
+              <w:bottom w:type="dxa" w:w="60"/>
+              <w:right w:type="dxa" w:w="110"/>
+            </w:tcMar>
+          </w:tcPr>
+          <w:p>
+            <w:pPr>
+              <w:spacing w:after="0" w:line="264"/>
+            </w:pPr>
+            <w:r>
+              <w:rPr>
+                <w:rFonts w:ascii="Arial" w:cs="Arial" w:eastAsia="Arial" w:hAnsi="Arial"/>
+                <w:sz w:val="19"/>
+                <w:szCs w:val="19"/>
+              </w:rPr>
+              <w:t xml:space="preserve">Schema governance (Schema-on-write)</w:t>
+            </w:r>
+          </w:p>
+        </w:tc>
+        <w:tc>
+          <w:tcPr>
+            <w:tcW w:type="dxa" w:w="3700"/>
+            <w:tcBorders>
+              <w:top w:val="single" w:color="D1D5DB" w:sz="1"/>
+              <w:left w:val="single" w:color="D1D5DB" w:sz="1"/>
+              <w:bottom w:val="single" w:color="D1D5DB" w:sz="1"/>
+              <w:right w:val="single" w:color="D1D5DB" w:sz="1"/>
+            </w:tcBorders>
+            <w:tcMar>
+              <w:top w:type="dxa" w:w="60"/>
+              <w:left w:type="dxa" w:w="110"/>
+              <w:bottom w:type="dxa" w:w="60"/>
+              <w:right w:type="dxa" w:w="110"/>
+            </w:tcMar>
+          </w:tcPr>
+          <w:p>
+            <w:pPr>
+              <w:spacing w:after="0" w:line="264"/>
+            </w:pPr>
+            <w:r>
+              <w:rPr>
+                <w:rFonts w:ascii="Arial" w:cs="Arial" w:eastAsia="Arial" w:hAnsi="Arial"/>
+                <w:sz w:val="19"/>
+                <w:szCs w:val="19"/>
+              </w:rPr>
+              <w:t xml:space="preserve">Apicurio Registry + Avro (cart.checked-out)</w:t>
+            </w:r>
+          </w:p>
+        </w:tc>
+        <w:tc>
+          <w:tcPr>
+            <w:tcW w:type="dxa" w:w="3160"/>
+            <w:tcBorders>
+              <w:top w:val="single" w:color="D1D5DB" w:sz="1"/>
+              <w:left w:val="single" w:color="D1D5DB" w:sz="1"/>
+              <w:bottom w:val="single" w:color="D1D5DB" w:sz="1"/>
+              <w:right w:val="single" w:color="D1D5DB" w:sz="1"/>
+            </w:tcBorders>
+            <w:tcMar>
+              <w:top w:type="dxa" w:w="60"/>
+              <w:left w:type="dxa" w:w="110"/>
+              <w:bottom w:type="dxa" w:w="60"/>
+              <w:right w:type="dxa" w:w="110"/>
+            </w:tcMar>
+          </w:tcPr>
+          <w:p>
+            <w:pPr>
+              <w:spacing w:after="0" w:line="264"/>
+            </w:pPr>
+            <w:r>
+              <w:rPr>
+                <w:rFonts w:ascii="Arial" w:cs="Arial" w:eastAsia="Arial" w:hAnsi="Arial"/>
+                <w:sz w:val="19"/>
+                <w:szCs w:val="19"/>
+              </w:rPr>
+              <w:t xml:space="preserve">Versionar y validar el contrato de los eventos</w:t>
             </w:r>
           </w:p>
         </w:tc>

</xml_diff>

<commit_message>
feat(robustez): DLQ en todos los consumidores Kafka (retry + topic .DLT)
</commit_message>
<xml_diff>
--- a/BookPlus-Stack-Tecnologico.docx
+++ b/BookPlus-Stack-Tecnologico.docx
@@ -8846,6 +8846,94 @@
     </w:p>
     <w:p>
       <w:pPr>
+        <w:pStyle w:val="Heading2"/>
+      </w:pPr>
+      <w:r>
+        <w:rPr>
+          <w:rFonts w:ascii="Arial" w:cs="Arial" w:eastAsia="Arial" w:hAnsi="Arial"/>
+        </w:rPr>
+        <w:t xml:space="preserve">13.18 Dead Letter Queue (DLQ) en Kafka</w:t>
+      </w:r>
+    </w:p>
+    <w:p>
+      <w:pPr>
+        <w:spacing w:after="120" w:line="276"/>
+      </w:pPr>
+      <w:r>
+        <w:rPr>
+          <w:rFonts w:ascii="Arial" w:cs="Arial" w:eastAsia="Arial" w:hAnsi="Arial"/>
+          <w:b/>
+          <w:bCs/>
+        </w:rPr>
+        <w:t xml:space="preserve">Qué es: </w:t>
+      </w:r>
+      <w:r>
+        <w:rPr>
+          <w:rFonts w:ascii="Arial" w:cs="Arial" w:eastAsia="Arial" w:hAnsi="Arial"/>
+        </w:rPr>
+        <w:t xml:space="preserve">si un consumidor recibe un “mensaje veneno” que siempre falla, reintentarlo en bucle bloquea la partición y detiene todo. La DLQ reintenta un número acotado de veces y, si sigue fallando, aparta el mensaje a un topic de cartas muertas, sin bloquear la cola ni perder el evento.</w:t>
+      </w:r>
+    </w:p>
+    <w:p>
+      <w:pPr>
+        <w:spacing w:after="120" w:line="276"/>
+      </w:pPr>
+      <w:r>
+        <w:rPr>
+          <w:rFonts w:ascii="Arial" w:cs="Arial" w:eastAsia="Arial" w:hAnsi="Arial"/>
+          <w:b/>
+          <w:bCs/>
+        </w:rPr>
+        <w:t xml:space="preserve">Cómo se integra: </w:t>
+      </w:r>
+      <w:r>
+        <w:rPr>
+          <w:rFonts w:ascii="Arial" w:cs="Arial" w:eastAsia="Arial" w:hAnsi="Arial"/>
+        </w:rPr>
+        <w:t xml:space="preserve">en los 5 servicios con consumidores (order, catalog, inventory, payment, notification) el KafkaConfig define un </w:t>
+      </w:r>
+      <w:r>
+        <w:rPr>
+          <w:rFonts w:ascii="Consolas" w:cs="Consolas" w:eastAsia="Consolas" w:hAnsi="Consolas"/>
+          <w:color w:val="4F46E5"/>
+        </w:rPr>
+        <w:t xml:space="preserve">DefaultErrorHandler</w:t>
+      </w:r>
+      <w:r>
+        <w:rPr>
+          <w:rFonts w:ascii="Arial" w:cs="Arial" w:eastAsia="Arial" w:hAnsi="Arial"/>
+        </w:rPr>
+        <w:t xml:space="preserve"> con </w:t>
+      </w:r>
+      <w:r>
+        <w:rPr>
+          <w:rFonts w:ascii="Consolas" w:cs="Consolas" w:eastAsia="Consolas" w:hAnsi="Consolas"/>
+          <w:color w:val="4F46E5"/>
+        </w:rPr>
+        <w:t xml:space="preserve">DeadLetterPublishingRecoverer</w:t>
+      </w:r>
+      <w:r>
+        <w:rPr>
+          <w:rFonts w:ascii="Arial" w:cs="Arial" w:eastAsia="Arial" w:hAnsi="Arial"/>
+        </w:rPr>
+        <w:t xml:space="preserve">: 3 reintentos y, si fallan, el mensaje va a </w:t>
+      </w:r>
+      <w:r>
+        <w:rPr>
+          <w:rFonts w:ascii="Consolas" w:cs="Consolas" w:eastAsia="Consolas" w:hAnsi="Consolas"/>
+          <w:color w:val="4F46E5"/>
+        </w:rPr>
+        <w:t xml:space="preserve">&lt;topic&gt;.DLT</w:t>
+      </w:r>
+      <w:r>
+        <w:rPr>
+          <w:rFonts w:ascii="Arial" w:cs="Arial" w:eastAsia="Arial" w:hAnsi="Arial"/>
+        </w:rPr>
+        <w:t xml:space="preserve">. Se aplica a todos los consumidores del servicio a la vez. Junto con el IdempotencyGuard y el outbox transaccional, completa la mensajería fiable. Detalle en RESILIENCE-DLQ.md.</w:t>
+      </w:r>
+    </w:p>
+    <w:p>
+      <w:pPr>
         <w:pStyle w:val="Heading1"/>
       </w:pPr>
       <w:r>
@@ -11263,6 +11351,196 @@
                 <w:szCs w:val="19"/>
               </w:rPr>
               <w:t xml:space="preserve">Versionar y validar el contrato de los eventos</w:t>
+            </w:r>
+          </w:p>
+        </w:tc>
+      </w:tr>
+      <w:tr>
+        <w:trPr>
+          <w:tblHeader w:val="false"/>
+        </w:trPr>
+        <w:tc>
+          <w:tcPr>
+            <w:tcW w:type="dxa" w:w="2500"/>
+            <w:tcBorders>
+              <w:top w:val="single" w:color="D1D5DB" w:sz="1"/>
+              <w:left w:val="single" w:color="D1D5DB" w:sz="1"/>
+              <w:bottom w:val="single" w:color="D1D5DB" w:sz="1"/>
+              <w:right w:val="single" w:color="D1D5DB" w:sz="1"/>
+            </w:tcBorders>
+            <w:tcMar>
+              <w:top w:type="dxa" w:w="60"/>
+              <w:left w:type="dxa" w:w="110"/>
+              <w:bottom w:type="dxa" w:w="60"/>
+              <w:right w:type="dxa" w:w="110"/>
+            </w:tcMar>
+          </w:tcPr>
+          <w:p>
+            <w:pPr>
+              <w:spacing w:after="0" w:line="264"/>
+            </w:pPr>
+            <w:r>
+              <w:rPr>
+                <w:rFonts w:ascii="Arial" w:cs="Arial" w:eastAsia="Arial" w:hAnsi="Arial"/>
+                <w:sz w:val="19"/>
+                <w:szCs w:val="19"/>
+              </w:rPr>
+              <w:t xml:space="preserve">Dead Letter Queue</w:t>
+            </w:r>
+          </w:p>
+        </w:tc>
+        <w:tc>
+          <w:tcPr>
+            <w:tcW w:type="dxa" w:w="3700"/>
+            <w:tcBorders>
+              <w:top w:val="single" w:color="D1D5DB" w:sz="1"/>
+              <w:left w:val="single" w:color="D1D5DB" w:sz="1"/>
+              <w:bottom w:val="single" w:color="D1D5DB" w:sz="1"/>
+              <w:right w:val="single" w:color="D1D5DB" w:sz="1"/>
+            </w:tcBorders>
+            <w:tcMar>
+              <w:top w:type="dxa" w:w="60"/>
+              <w:left w:type="dxa" w:w="110"/>
+              <w:bottom w:type="dxa" w:w="60"/>
+              <w:right w:type="dxa" w:w="110"/>
+            </w:tcMar>
+          </w:tcPr>
+          <w:p>
+            <w:pPr>
+              <w:spacing w:after="0" w:line="264"/>
+            </w:pPr>
+            <w:r>
+              <w:rPr>
+                <w:rFonts w:ascii="Arial" w:cs="Arial" w:eastAsia="Arial" w:hAnsi="Arial"/>
+                <w:sz w:val="19"/>
+                <w:szCs w:val="19"/>
+              </w:rPr>
+              <w:t xml:space="preserve">KafkaConfig (DefaultErrorHandler) en 5 servicios</w:t>
+            </w:r>
+          </w:p>
+        </w:tc>
+        <w:tc>
+          <w:tcPr>
+            <w:tcW w:type="dxa" w:w="3160"/>
+            <w:tcBorders>
+              <w:top w:val="single" w:color="D1D5DB" w:sz="1"/>
+              <w:left w:val="single" w:color="D1D5DB" w:sz="1"/>
+              <w:bottom w:val="single" w:color="D1D5DB" w:sz="1"/>
+              <w:right w:val="single" w:color="D1D5DB" w:sz="1"/>
+            </w:tcBorders>
+            <w:tcMar>
+              <w:top w:type="dxa" w:w="60"/>
+              <w:left w:type="dxa" w:w="110"/>
+              <w:bottom w:type="dxa" w:w="60"/>
+              <w:right w:type="dxa" w:w="110"/>
+            </w:tcMar>
+          </w:tcPr>
+          <w:p>
+            <w:pPr>
+              <w:spacing w:after="0" w:line="264"/>
+            </w:pPr>
+            <w:r>
+              <w:rPr>
+                <w:rFonts w:ascii="Arial" w:cs="Arial" w:eastAsia="Arial" w:hAnsi="Arial"/>
+                <w:sz w:val="19"/>
+                <w:szCs w:val="19"/>
+              </w:rPr>
+              <w:t xml:space="preserve">Aislar mensajes veneno sin bloquear ni perder eventos</w:t>
+            </w:r>
+          </w:p>
+        </w:tc>
+      </w:tr>
+      <w:tr>
+        <w:trPr>
+          <w:tblHeader w:val="false"/>
+        </w:trPr>
+        <w:tc>
+          <w:tcPr>
+            <w:tcW w:type="dxa" w:w="2500"/>
+            <w:tcBorders>
+              <w:top w:val="single" w:color="D1D5DB" w:sz="1"/>
+              <w:left w:val="single" w:color="D1D5DB" w:sz="1"/>
+              <w:bottom w:val="single" w:color="D1D5DB" w:sz="1"/>
+              <w:right w:val="single" w:color="D1D5DB" w:sz="1"/>
+            </w:tcBorders>
+            <w:tcMar>
+              <w:top w:type="dxa" w:w="60"/>
+              <w:left w:type="dxa" w:w="110"/>
+              <w:bottom w:type="dxa" w:w="60"/>
+              <w:right w:type="dxa" w:w="110"/>
+            </w:tcMar>
+          </w:tcPr>
+          <w:p>
+            <w:pPr>
+              <w:spacing w:after="0" w:line="264"/>
+            </w:pPr>
+            <w:r>
+              <w:rPr>
+                <w:rFonts w:ascii="Arial" w:cs="Arial" w:eastAsia="Arial" w:hAnsi="Arial"/>
+                <w:sz w:val="19"/>
+                <w:szCs w:val="19"/>
+              </w:rPr>
+              <w:t xml:space="preserve">Bloqueo distribuido</w:t>
+            </w:r>
+          </w:p>
+        </w:tc>
+        <w:tc>
+          <w:tcPr>
+            <w:tcW w:type="dxa" w:w="3700"/>
+            <w:tcBorders>
+              <w:top w:val="single" w:color="D1D5DB" w:sz="1"/>
+              <w:left w:val="single" w:color="D1D5DB" w:sz="1"/>
+              <w:bottom w:val="single" w:color="D1D5DB" w:sz="1"/>
+              <w:right w:val="single" w:color="D1D5DB" w:sz="1"/>
+            </w:tcBorders>
+            <w:tcMar>
+              <w:top w:type="dxa" w:w="60"/>
+              <w:left w:type="dxa" w:w="110"/>
+              <w:bottom w:type="dxa" w:w="60"/>
+              <w:right w:type="dxa" w:w="110"/>
+            </w:tcMar>
+          </w:tcPr>
+          <w:p>
+            <w:pPr>
+              <w:spacing w:after="0" w:line="264"/>
+            </w:pPr>
+            <w:r>
+              <w:rPr>
+                <w:rFonts w:ascii="Arial" w:cs="Arial" w:eastAsia="Arial" w:hAnsi="Arial"/>
+                <w:sz w:val="19"/>
+                <w:szCs w:val="19"/>
+              </w:rPr>
+              <w:t xml:space="preserve">ShedLock (outbox relay de order)</w:t>
+            </w:r>
+          </w:p>
+        </w:tc>
+        <w:tc>
+          <w:tcPr>
+            <w:tcW w:type="dxa" w:w="3160"/>
+            <w:tcBorders>
+              <w:top w:val="single" w:color="D1D5DB" w:sz="1"/>
+              <w:left w:val="single" w:color="D1D5DB" w:sz="1"/>
+              <w:bottom w:val="single" w:color="D1D5DB" w:sz="1"/>
+              <w:right w:val="single" w:color="D1D5DB" w:sz="1"/>
+            </w:tcBorders>
+            <w:tcMar>
+              <w:top w:type="dxa" w:w="60"/>
+              <w:left w:type="dxa" w:w="110"/>
+              <w:bottom w:type="dxa" w:w="60"/>
+              <w:right w:type="dxa" w:w="110"/>
+            </w:tcMar>
+          </w:tcPr>
+          <w:p>
+            <w:pPr>
+              <w:spacing w:after="0" w:line="264"/>
+            </w:pPr>
+            <w:r>
+              <w:rPr>
+                <w:rFonts w:ascii="Arial" w:cs="Arial" w:eastAsia="Arial" w:hAnsi="Arial"/>
+                <w:sz w:val="19"/>
+                <w:szCs w:val="19"/>
+              </w:rPr>
+              <w:t xml:space="preserve">Una sola réplica ejecuta cada tarea programada</w:t>
             </w:r>
           </w:p>
         </w:tc>

</xml_diff>

<commit_message>
feat(order): audit trail con Hibernate Envers + alineación de tipos de moneda
- @Audited en OrderEntity; CustomRevisionEntity (revinfo/revinfo_seq deterministas)
- Migración V16: tablas revinfo y orders_aud
- Migración V17: CHAR(3) -> VARCHAR(3) en total_currency y order_items.currency
  (corrige validación estricta de Hibernate, latente desde V1)
- Test de integración Testcontainers (OrderAuditTrailIntegrationTest), excluido del
  mvn test normal vía grupo 'integration'
- Docs AUDIT-TRAIL.md y Word del stack (13.21)
</commit_message>
<xml_diff>
--- a/BookPlus-Stack-Tecnologico.docx
+++ b/BookPlus-Stack-Tecnologico.docx
@@ -9319,13 +9319,140 @@
           <w:rFonts w:ascii="Consolas" w:cs="Consolas" w:eastAsia="Consolas" w:hAnsi="Consolas"/>
           <w:color w:val="4F46E5"/>
         </w:rPr>
-        <w:t xml:space="preserve">OrderAuditTrailIT</w:t>
-      </w:r>
-      <w:r>
-        <w:rPr>
-          <w:rFonts w:ascii="Arial" w:cs="Arial" w:eastAsia="Arial" w:hAnsi="Arial"/>
-        </w:rPr>
-        <w:t xml:space="preserve">). Detalle en AUDIT-TRAIL.md.</w:t>
+        <w:t xml:space="preserve">OrderAuditTrailIntegrationTest</w:t>
+      </w:r>
+      <w:r>
+        <w:rPr>
+          <w:rFonts w:ascii="Arial" w:cs="Arial" w:eastAsia="Arial" w:hAnsi="Arial"/>
+        </w:rPr>
+        <w:t xml:space="preserve">) contra un Postgres real. Detalle en AUDIT-TRAIL.md.</w:t>
+      </w:r>
+    </w:p>
+    <w:p>
+      <w:pPr>
+        <w:pStyle w:val="Heading2"/>
+      </w:pPr>
+      <w:r>
+        <w:rPr>
+          <w:rFonts w:ascii="Arial" w:cs="Arial" w:eastAsia="Arial" w:hAnsi="Arial"/>
+        </w:rPr>
+        <w:t xml:space="preserve">13.22 Rate limiting (Bucket4j)</w:t>
+      </w:r>
+    </w:p>
+    <w:p>
+      <w:pPr>
+        <w:spacing w:after="120" w:line="276"/>
+      </w:pPr>
+      <w:r>
+        <w:rPr>
+          <w:rFonts w:ascii="Arial" w:cs="Arial" w:eastAsia="Arial" w:hAnsi="Arial"/>
+          <w:b/>
+          <w:bCs/>
+        </w:rPr>
+        <w:t xml:space="preserve">Qué es: </w:t>
+      </w:r>
+      <w:r>
+        <w:rPr>
+          <w:rFonts w:ascii="Arial" w:cs="Arial" w:eastAsia="Arial" w:hAnsi="Arial"/>
+        </w:rPr>
+        <w:t xml:space="preserve">los endpoints de autenticación son el blanco favorito de la fuerza bruta y el relleno de credenciales (probar miles de contraseñas). El rate limiting acota cuántas peticiones acepta el servicio por cliente y ventana de tiempo, convirtiendo un ataque masivo en algo inviable. Usamos el algoritmo token bucket: cada cliente tiene un “cubo” de fichas que se rellena de forma continua; mientras quedan, pasa; al agotarse, se rechaza con 429 hasta el siguiente relleno.</w:t>
+      </w:r>
+    </w:p>
+    <w:p>
+      <w:pPr>
+        <w:spacing w:after="120" w:line="276"/>
+      </w:pPr>
+      <w:r>
+        <w:rPr>
+          <w:rFonts w:ascii="Arial" w:cs="Arial" w:eastAsia="Arial" w:hAnsi="Arial"/>
+          <w:b/>
+          <w:bCs/>
+        </w:rPr>
+        <w:t xml:space="preserve">Cómo se integra: </w:t>
+      </w:r>
+      <w:r>
+        <w:rPr>
+          <w:rFonts w:ascii="Arial" w:cs="Arial" w:eastAsia="Arial" w:hAnsi="Arial"/>
+        </w:rPr>
+        <w:t xml:space="preserve">en auth-service, </w:t>
+      </w:r>
+      <w:r>
+        <w:rPr>
+          <w:rFonts w:ascii="Consolas" w:cs="Consolas" w:eastAsia="Consolas" w:hAnsi="Consolas"/>
+          <w:color w:val="4F46E5"/>
+        </w:rPr>
+        <w:t xml:space="preserve">AuthRateLimiter</w:t>
+      </w:r>
+      <w:r>
+        <w:rPr>
+          <w:rFonts w:ascii="Arial" w:cs="Arial" w:eastAsia="Arial" w:hAnsi="Arial"/>
+        </w:rPr>
+        <w:t xml:space="preserve"> (Bucket4j, en memoria) mantiene un cubo por clave </w:t>
+      </w:r>
+      <w:r>
+        <w:rPr>
+          <w:rFonts w:ascii="Consolas" w:cs="Consolas" w:eastAsia="Consolas" w:hAnsi="Consolas"/>
+          <w:color w:val="4F46E5"/>
+        </w:rPr>
+        <w:t xml:space="preserve">IP+ruta</w:t>
+      </w:r>
+      <w:r>
+        <w:rPr>
+          <w:rFonts w:ascii="Arial" w:cs="Arial" w:eastAsia="Arial" w:hAnsi="Arial"/>
+        </w:rPr>
+        <w:t xml:space="preserve"> (10 peticiones/minuto por defecto, configurable). Un </w:t>
+      </w:r>
+      <w:r>
+        <w:rPr>
+          <w:rFonts w:ascii="Consolas" w:cs="Consolas" w:eastAsia="Consolas" w:hAnsi="Consolas"/>
+          <w:color w:val="4F46E5"/>
+        </w:rPr>
+        <w:t xml:space="preserve">RateLimitFilter</w:t>
+      </w:r>
+      <w:r>
+        <w:rPr>
+          <w:rFonts w:ascii="Arial" w:cs="Arial" w:eastAsia="Arial" w:hAnsi="Arial"/>
+        </w:rPr>
+        <w:t xml:space="preserve"> se ejecuta antes del filtro JWT y solo sobre los POST sensibles (login, registro, recuperación de contraseña); al exceder el límite devuelve </w:t>
+      </w:r>
+      <w:r>
+        <w:rPr>
+          <w:rFonts w:ascii="Consolas" w:cs="Consolas" w:eastAsia="Consolas" w:hAnsi="Consolas"/>
+          <w:color w:val="4F46E5"/>
+        </w:rPr>
+        <w:t xml:space="preserve">429 Too Many Requests</w:t>
+      </w:r>
+      <w:r>
+        <w:rPr>
+          <w:rFonts w:ascii="Arial" w:cs="Arial" w:eastAsia="Arial" w:hAnsi="Arial"/>
+        </w:rPr>
+        <w:t xml:space="preserve"> con </w:t>
+      </w:r>
+      <w:r>
+        <w:rPr>
+          <w:rFonts w:ascii="Consolas" w:cs="Consolas" w:eastAsia="Consolas" w:hAnsi="Consolas"/>
+          <w:color w:val="4F46E5"/>
+        </w:rPr>
+        <w:t xml:space="preserve">Retry-After</w:t>
+      </w:r>
+      <w:r>
+        <w:rPr>
+          <w:rFonts w:ascii="Arial" w:cs="Arial" w:eastAsia="Arial" w:hAnsi="Arial"/>
+        </w:rPr>
+        <w:t xml:space="preserve">, respetando </w:t>
+      </w:r>
+      <w:r>
+        <w:rPr>
+          <w:rFonts w:ascii="Consolas" w:cs="Consolas" w:eastAsia="Consolas" w:hAnsi="Consolas"/>
+          <w:color w:val="4F46E5"/>
+        </w:rPr>
+        <w:t xml:space="preserve">X-Forwarded-For</w:t>
+      </w:r>
+      <w:r>
+        <w:rPr>
+          <w:rFonts w:ascii="Arial" w:cs="Arial" w:eastAsia="Arial" w:hAnsi="Arial"/>
+        </w:rPr>
+        <w:t xml:space="preserve"> para la IP real tras el gateway. Verificado con un unit test. Detalle en RATE-LIMITING.md.</w:t>
       </w:r>
     </w:p>
     <w:p>
@@ -12127,6 +12254,101 @@
                 <w:szCs w:val="19"/>
               </w:rPr>
               <w:t xml:space="preserve">Historial de cambios para cumplimiento y trazabilidad</w:t>
+            </w:r>
+          </w:p>
+        </w:tc>
+      </w:tr>
+      <w:tr>
+        <w:trPr>
+          <w:tblHeader w:val="false"/>
+        </w:trPr>
+        <w:tc>
+          <w:tcPr>
+            <w:tcW w:type="dxa" w:w="2500"/>
+            <w:tcBorders>
+              <w:top w:val="single" w:color="D1D5DB" w:sz="1"/>
+              <w:left w:val="single" w:color="D1D5DB" w:sz="1"/>
+              <w:bottom w:val="single" w:color="D1D5DB" w:sz="1"/>
+              <w:right w:val="single" w:color="D1D5DB" w:sz="1"/>
+            </w:tcBorders>
+            <w:tcMar>
+              <w:top w:type="dxa" w:w="60"/>
+              <w:left w:type="dxa" w:w="110"/>
+              <w:bottom w:type="dxa" w:w="60"/>
+              <w:right w:type="dxa" w:w="110"/>
+            </w:tcMar>
+          </w:tcPr>
+          <w:p>
+            <w:pPr>
+              <w:spacing w:after="0" w:line="264"/>
+            </w:pPr>
+            <w:r>
+              <w:rPr>
+                <w:rFonts w:ascii="Arial" w:cs="Arial" w:eastAsia="Arial" w:hAnsi="Arial"/>
+                <w:sz w:val="19"/>
+                <w:szCs w:val="19"/>
+              </w:rPr>
+              <w:t xml:space="preserve">Rate limiting (Token Bucket)</w:t>
+            </w:r>
+          </w:p>
+        </w:tc>
+        <w:tc>
+          <w:tcPr>
+            <w:tcW w:type="dxa" w:w="3700"/>
+            <w:tcBorders>
+              <w:top w:val="single" w:color="D1D5DB" w:sz="1"/>
+              <w:left w:val="single" w:color="D1D5DB" w:sz="1"/>
+              <w:bottom w:val="single" w:color="D1D5DB" w:sz="1"/>
+              <w:right w:val="single" w:color="D1D5DB" w:sz="1"/>
+            </w:tcBorders>
+            <w:tcMar>
+              <w:top w:type="dxa" w:w="60"/>
+              <w:left w:type="dxa" w:w="110"/>
+              <w:bottom w:type="dxa" w:w="60"/>
+              <w:right w:type="dxa" w:w="110"/>
+            </w:tcMar>
+          </w:tcPr>
+          <w:p>
+            <w:pPr>
+              <w:spacing w:after="0" w:line="264"/>
+            </w:pPr>
+            <w:r>
+              <w:rPr>
+                <w:rFonts w:ascii="Arial" w:cs="Arial" w:eastAsia="Arial" w:hAnsi="Arial"/>
+                <w:sz w:val="19"/>
+                <w:szCs w:val="19"/>
+              </w:rPr>
+              <w:t xml:space="preserve">Bucket4j en los endpoints de auth</w:t>
+            </w:r>
+          </w:p>
+        </w:tc>
+        <w:tc>
+          <w:tcPr>
+            <w:tcW w:type="dxa" w:w="3160"/>
+            <w:tcBorders>
+              <w:top w:val="single" w:color="D1D5DB" w:sz="1"/>
+              <w:left w:val="single" w:color="D1D5DB" w:sz="1"/>
+              <w:bottom w:val="single" w:color="D1D5DB" w:sz="1"/>
+              <w:right w:val="single" w:color="D1D5DB" w:sz="1"/>
+            </w:tcBorders>
+            <w:tcMar>
+              <w:top w:type="dxa" w:w="60"/>
+              <w:left w:type="dxa" w:w="110"/>
+              <w:bottom w:type="dxa" w:w="60"/>
+              <w:right w:type="dxa" w:w="110"/>
+            </w:tcMar>
+          </w:tcPr>
+          <w:p>
+            <w:pPr>
+              <w:spacing w:after="0" w:line="264"/>
+            </w:pPr>
+            <w:r>
+              <w:rPr>
+                <w:rFonts w:ascii="Arial" w:cs="Arial" w:eastAsia="Arial" w:hAnsi="Arial"/>
+                <w:sz w:val="19"/>
+                <w:szCs w:val="19"/>
+              </w:rPr>
+              <w:t xml:space="preserve">Frenar fuerza bruta/abuso limitando peticiones por IP</w:t>
             </w:r>
           </w:p>
         </w:tc>

</xml_diff>

<commit_message>
feat(order): cifrado de PII en reposo con AES-256-GCM
- CryptoConverter (@Convert) cifra shipping_recipient_name y shipping_street
- PiiCryptoKey: clave de 32 bytes desde PII_ENCRYPTION_KEY (Vault en prod)
- Migración V18: columnas a TEXT en orders y orders_aud
- Unit test CryptoConverterTest + verificación de cifrado en reposo en el IT
- Doc PII-ENCRYPTION.md y Word del stack (13.23)
</commit_message>
<xml_diff>
--- a/BookPlus-Stack-Tecnologico.docx
+++ b/BookPlus-Stack-Tecnologico.docx
@@ -9457,6 +9457,159 @@
     </w:p>
     <w:p>
       <w:pPr>
+        <w:pStyle w:val="Heading2"/>
+      </w:pPr>
+      <w:r>
+        <w:rPr>
+          <w:rFonts w:ascii="Arial" w:cs="Arial" w:eastAsia="Arial" w:hAnsi="Arial"/>
+        </w:rPr>
+        <w:t xml:space="preserve">13.23 Cifrado de PII en reposo (AES-GCM)</w:t>
+      </w:r>
+    </w:p>
+    <w:p>
+      <w:pPr>
+        <w:spacing w:after="120" w:line="276"/>
+      </w:pPr>
+      <w:r>
+        <w:rPr>
+          <w:rFonts w:ascii="Arial" w:cs="Arial" w:eastAsia="Arial" w:hAnsi="Arial"/>
+          <w:b/>
+          <w:bCs/>
+        </w:rPr>
+        <w:t xml:space="preserve">Qué es: </w:t>
+      </w:r>
+      <w:r>
+        <w:rPr>
+          <w:rFonts w:ascii="Arial" w:cs="Arial" w:eastAsia="Arial" w:hAnsi="Arial"/>
+        </w:rPr>
+        <w:t xml:space="preserve">la información personal (nombre y dirección del destinatario) no debe quedar en texto plano en la base de datos; un volcado o acceso al disco la dejaría expuesta, algo que el RGPD obliga a evitar. Se cifra en reposo de forma transparente: la aplicación sigue trabajando con el texto plano y en la base de datos solo hay ciphertext.</w:t>
+      </w:r>
+    </w:p>
+    <w:p>
+      <w:pPr>
+        <w:spacing w:after="120" w:line="276"/>
+      </w:pPr>
+      <w:r>
+        <w:rPr>
+          <w:rFonts w:ascii="Arial" w:cs="Arial" w:eastAsia="Arial" w:hAnsi="Arial"/>
+          <w:b/>
+          <w:bCs/>
+        </w:rPr>
+        <w:t xml:space="preserve">Cómo se integra: </w:t>
+      </w:r>
+      <w:r>
+        <w:rPr>
+          <w:rFonts w:ascii="Arial" w:cs="Arial" w:eastAsia="Arial" w:hAnsi="Arial"/>
+        </w:rPr>
+        <w:t xml:space="preserve">en order-service, un </w:t>
+      </w:r>
+      <w:r>
+        <w:rPr>
+          <w:rFonts w:ascii="Consolas" w:cs="Consolas" w:eastAsia="Consolas" w:hAnsi="Consolas"/>
+          <w:color w:val="4F46E5"/>
+        </w:rPr>
+        <w:t xml:space="preserve">AttributeConverter</w:t>
+      </w:r>
+      <w:r>
+        <w:rPr>
+          <w:rFonts w:ascii="Arial" w:cs="Arial" w:eastAsia="Arial" w:hAnsi="Arial"/>
+        </w:rPr>
+        <w:t xml:space="preserve"> de JPA (</w:t>
+      </w:r>
+      <w:r>
+        <w:rPr>
+          <w:rFonts w:ascii="Consolas" w:cs="Consolas" w:eastAsia="Consolas" w:hAnsi="Consolas"/>
+          <w:color w:val="4F46E5"/>
+        </w:rPr>
+        <w:t xml:space="preserve">CryptoConverter</w:t>
+      </w:r>
+      <w:r>
+        <w:rPr>
+          <w:rFonts w:ascii="Arial" w:cs="Arial" w:eastAsia="Arial" w:hAnsi="Arial"/>
+        </w:rPr>
+        <w:t xml:space="preserve">, </w:t>
+      </w:r>
+      <w:r>
+        <w:rPr>
+          <w:rFonts w:ascii="Consolas" w:cs="Consolas" w:eastAsia="Consolas" w:hAnsi="Consolas"/>
+          <w:color w:val="4F46E5"/>
+        </w:rPr>
+        <w:t xml:space="preserve">@Convert</w:t>
+      </w:r>
+      <w:r>
+        <w:rPr>
+          <w:rFonts w:ascii="Arial" w:cs="Arial" w:eastAsia="Arial" w:hAnsi="Arial"/>
+        </w:rPr>
+        <w:t xml:space="preserve">) cifra/descifra automáticamente al guardar/leer los campos de dirección de envío, usando </w:t>
+      </w:r>
+      <w:r>
+        <w:rPr>
+          <w:rFonts w:ascii="Consolas" w:cs="Consolas" w:eastAsia="Consolas" w:hAnsi="Consolas"/>
+          <w:color w:val="4F46E5"/>
+        </w:rPr>
+        <w:t xml:space="preserve">AES-256-GCM</w:t>
+      </w:r>
+      <w:r>
+        <w:rPr>
+          <w:rFonts w:ascii="Arial" w:cs="Arial" w:eastAsia="Arial" w:hAnsi="Arial"/>
+        </w:rPr>
+        <w:t xml:space="preserve"> (cifrado autenticado con IV aleatorio por valor). La clave (32 bytes) llega por </w:t>
+      </w:r>
+      <w:r>
+        <w:rPr>
+          <w:rFonts w:ascii="Consolas" w:cs="Consolas" w:eastAsia="Consolas" w:hAnsi="Consolas"/>
+          <w:color w:val="4F46E5"/>
+        </w:rPr>
+        <w:t xml:space="preserve">PII_ENCRYPTION_KEY</w:t>
+      </w:r>
+      <w:r>
+        <w:rPr>
+          <w:rFonts w:ascii="Arial" w:cs="Arial" w:eastAsia="Arial" w:hAnsi="Arial"/>
+        </w:rPr>
+        <w:t xml:space="preserve"> desde Vault en producción. La migración </w:t>
+      </w:r>
+      <w:r>
+        <w:rPr>
+          <w:rFonts w:ascii="Consolas" w:cs="Consolas" w:eastAsia="Consolas" w:hAnsi="Consolas"/>
+          <w:color w:val="4F46E5"/>
+        </w:rPr>
+        <w:t xml:space="preserve">V18</w:t>
+      </w:r>
+      <w:r>
+        <w:rPr>
+          <w:rFonts w:ascii="Arial" w:cs="Arial" w:eastAsia="Arial" w:hAnsi="Arial"/>
+        </w:rPr>
+        <w:t xml:space="preserve"> amplía las columnas a TEXT (en </w:t>
+      </w:r>
+      <w:r>
+        <w:rPr>
+          <w:rFonts w:ascii="Consolas" w:cs="Consolas" w:eastAsia="Consolas" w:hAnsi="Consolas"/>
+          <w:color w:val="4F46E5"/>
+        </w:rPr>
+        <w:t xml:space="preserve">orders</w:t>
+      </w:r>
+      <w:r>
+        <w:rPr>
+          <w:rFonts w:ascii="Arial" w:cs="Arial" w:eastAsia="Arial" w:hAnsi="Arial"/>
+        </w:rPr>
+        <w:t xml:space="preserve"> y </w:t>
+      </w:r>
+      <w:r>
+        <w:rPr>
+          <w:rFonts w:ascii="Consolas" w:cs="Consolas" w:eastAsia="Consolas" w:hAnsi="Consolas"/>
+          <w:color w:val="4F46E5"/>
+        </w:rPr>
+        <w:t xml:space="preserve">orders_aud</w:t>
+      </w:r>
+      <w:r>
+        <w:rPr>
+          <w:rFonts w:ascii="Arial" w:cs="Arial" w:eastAsia="Arial" w:hAnsi="Arial"/>
+        </w:rPr>
+        <w:t xml:space="preserve">). Verificado con un unit test y con el test de integración Testcontainers (comprueba que el valor en BD no es texto plano). Detalle en PII-ENCRYPTION.md.</w:t>
+      </w:r>
+    </w:p>
+    <w:p>
+      <w:pPr>
         <w:pStyle w:val="Heading1"/>
       </w:pPr>
       <w:r>
@@ -12349,6 +12502,101 @@
                 <w:szCs w:val="19"/>
               </w:rPr>
               <w:t xml:space="preserve">Frenar fuerza bruta/abuso limitando peticiones por IP</w:t>
+            </w:r>
+          </w:p>
+        </w:tc>
+      </w:tr>
+      <w:tr>
+        <w:trPr>
+          <w:tblHeader w:val="false"/>
+        </w:trPr>
+        <w:tc>
+          <w:tcPr>
+            <w:tcW w:type="dxa" w:w="2500"/>
+            <w:tcBorders>
+              <w:top w:val="single" w:color="D1D5DB" w:sz="1"/>
+              <w:left w:val="single" w:color="D1D5DB" w:sz="1"/>
+              <w:bottom w:val="single" w:color="D1D5DB" w:sz="1"/>
+              <w:right w:val="single" w:color="D1D5DB" w:sz="1"/>
+            </w:tcBorders>
+            <w:tcMar>
+              <w:top w:type="dxa" w:w="60"/>
+              <w:left w:type="dxa" w:w="110"/>
+              <w:bottom w:type="dxa" w:w="60"/>
+              <w:right w:type="dxa" w:w="110"/>
+            </w:tcMar>
+          </w:tcPr>
+          <w:p>
+            <w:pPr>
+              <w:spacing w:after="0" w:line="264"/>
+            </w:pPr>
+            <w:r>
+              <w:rPr>
+                <w:rFonts w:ascii="Arial" w:cs="Arial" w:eastAsia="Arial" w:hAnsi="Arial"/>
+                <w:sz w:val="19"/>
+                <w:szCs w:val="19"/>
+              </w:rPr>
+              <w:t xml:space="preserve">Cifrado de PII en reposo</w:t>
+            </w:r>
+          </w:p>
+        </w:tc>
+        <w:tc>
+          <w:tcPr>
+            <w:tcW w:type="dxa" w:w="3700"/>
+            <w:tcBorders>
+              <w:top w:val="single" w:color="D1D5DB" w:sz="1"/>
+              <w:left w:val="single" w:color="D1D5DB" w:sz="1"/>
+              <w:bottom w:val="single" w:color="D1D5DB" w:sz="1"/>
+              <w:right w:val="single" w:color="D1D5DB" w:sz="1"/>
+            </w:tcBorders>
+            <w:tcMar>
+              <w:top w:type="dxa" w:w="60"/>
+              <w:left w:type="dxa" w:w="110"/>
+              <w:bottom w:type="dxa" w:w="60"/>
+              <w:right w:type="dxa" w:w="110"/>
+            </w:tcMar>
+          </w:tcPr>
+          <w:p>
+            <w:pPr>
+              <w:spacing w:after="0" w:line="264"/>
+            </w:pPr>
+            <w:r>
+              <w:rPr>
+                <w:rFonts w:ascii="Arial" w:cs="Arial" w:eastAsia="Arial" w:hAnsi="Arial"/>
+                <w:sz w:val="19"/>
+                <w:szCs w:val="19"/>
+              </w:rPr>
+              <w:t xml:space="preserve">CryptoConverter (@Convert, AES-GCM) en order</w:t>
+            </w:r>
+          </w:p>
+        </w:tc>
+        <w:tc>
+          <w:tcPr>
+            <w:tcW w:type="dxa" w:w="3160"/>
+            <w:tcBorders>
+              <w:top w:val="single" w:color="D1D5DB" w:sz="1"/>
+              <w:left w:val="single" w:color="D1D5DB" w:sz="1"/>
+              <w:bottom w:val="single" w:color="D1D5DB" w:sz="1"/>
+              <w:right w:val="single" w:color="D1D5DB" w:sz="1"/>
+            </w:tcBorders>
+            <w:tcMar>
+              <w:top w:type="dxa" w:w="60"/>
+              <w:left w:type="dxa" w:w="110"/>
+              <w:bottom w:type="dxa" w:w="60"/>
+              <w:right w:type="dxa" w:w="110"/>
+            </w:tcMar>
+          </w:tcPr>
+          <w:p>
+            <w:pPr>
+              <w:spacing w:after="0" w:line="264"/>
+            </w:pPr>
+            <w:r>
+              <w:rPr>
+                <w:rFonts w:ascii="Arial" w:cs="Arial" w:eastAsia="Arial" w:hAnsi="Arial"/>
+                <w:sz w:val="19"/>
+                <w:szCs w:val="19"/>
+              </w:rPr>
+              <w:t xml:space="preserve">Proteger datos personales cifrándolos de forma transparente</w:t>
             </w:r>
           </w:p>
         </w:tc>

</xml_diff>

<commit_message>
feat(catalog): feature flags con Togglz (kill-switch de búsqueda)
</commit_message>
<xml_diff>
--- a/BookPlus-Stack-Tecnologico.docx
+++ b/BookPlus-Stack-Tecnologico.docx
@@ -9698,6 +9698,133 @@
     </w:p>
     <w:p>
       <w:pPr>
+        <w:pStyle w:val="Heading2"/>
+      </w:pPr>
+      <w:r>
+        <w:rPr>
+          <w:rFonts w:ascii="Arial" w:cs="Arial" w:eastAsia="Arial" w:hAnsi="Arial"/>
+        </w:rPr>
+        <w:t xml:space="preserve">13.25 Feature flags (Togglz)</w:t>
+      </w:r>
+    </w:p>
+    <w:p>
+      <w:pPr>
+        <w:spacing w:after="120" w:line="276"/>
+      </w:pPr>
+      <w:r>
+        <w:rPr>
+          <w:rFonts w:ascii="Arial" w:cs="Arial" w:eastAsia="Arial" w:hAnsi="Arial"/>
+          <w:b/>
+          <w:bCs/>
+        </w:rPr>
+        <w:t xml:space="preserve">Qué es: </w:t>
+      </w:r>
+      <w:r>
+        <w:rPr>
+          <w:rFonts w:ascii="Arial" w:cs="Arial" w:eastAsia="Arial" w:hAnsi="Arial"/>
+        </w:rPr>
+        <w:t xml:space="preserve">los feature flags permiten activar o desactivar funciones en caliente, sin desplegar: habilitar algo solo para algunos usuarios (canary), apagar al instante algo problemático (kill-switch) o separar el deploy del release. Es una herramienta clave de los equipos que entregan rápido.</w:t>
+      </w:r>
+    </w:p>
+    <w:p>
+      <w:pPr>
+        <w:spacing w:after="120" w:line="276"/>
+      </w:pPr>
+      <w:r>
+        <w:rPr>
+          <w:rFonts w:ascii="Arial" w:cs="Arial" w:eastAsia="Arial" w:hAnsi="Arial"/>
+          <w:b/>
+          <w:bCs/>
+        </w:rPr>
+        <w:t xml:space="preserve">Cómo se integra: </w:t>
+      </w:r>
+      <w:r>
+        <w:rPr>
+          <w:rFonts w:ascii="Arial" w:cs="Arial" w:eastAsia="Arial" w:hAnsi="Arial"/>
+        </w:rPr>
+        <w:t xml:space="preserve">con </w:t>
+      </w:r>
+      <w:r>
+        <w:rPr>
+          <w:rFonts w:ascii="Consolas" w:cs="Consolas" w:eastAsia="Consolas" w:hAnsi="Consolas"/>
+          <w:color w:val="4F46E5"/>
+        </w:rPr>
+        <w:t xml:space="preserve">Togglz</w:t>
+      </w:r>
+      <w:r>
+        <w:rPr>
+          <w:rFonts w:ascii="Arial" w:cs="Arial" w:eastAsia="Arial" w:hAnsi="Arial"/>
+        </w:rPr>
+        <w:t xml:space="preserve"> en catalog-service. Las funciones se declaran en un enum </w:t>
+      </w:r>
+      <w:r>
+        <w:rPr>
+          <w:rFonts w:ascii="Consolas" w:cs="Consolas" w:eastAsia="Consolas" w:hAnsi="Consolas"/>
+          <w:color w:val="4F46E5"/>
+        </w:rPr>
+        <w:t xml:space="preserve">FeatureFlags</w:t>
+      </w:r>
+      <w:r>
+        <w:rPr>
+          <w:rFonts w:ascii="Arial" w:cs="Arial" w:eastAsia="Arial" w:hAnsi="Arial"/>
+        </w:rPr>
+        <w:t xml:space="preserve"> y el código consulta </w:t>
+      </w:r>
+      <w:r>
+        <w:rPr>
+          <w:rFonts w:ascii="Consolas" w:cs="Consolas" w:eastAsia="Consolas" w:hAnsi="Consolas"/>
+          <w:color w:val="4F46E5"/>
+        </w:rPr>
+        <w:t xml:space="preserve">featureManager.isActive(...)</w:t>
+      </w:r>
+      <w:r>
+        <w:rPr>
+          <w:rFonts w:ascii="Arial" w:cs="Arial" w:eastAsia="Arial" w:hAnsi="Arial"/>
+        </w:rPr>
+        <w:t xml:space="preserve">. Se aplica una bandera </w:t>
+      </w:r>
+      <w:r>
+        <w:rPr>
+          <w:rFonts w:ascii="Consolas" w:cs="Consolas" w:eastAsia="Consolas" w:hAnsi="Consolas"/>
+          <w:color w:val="4F46E5"/>
+        </w:rPr>
+        <w:t xml:space="preserve">BOOK_SEARCH</w:t>
+      </w:r>
+      <w:r>
+        <w:rPr>
+          <w:rFonts w:ascii="Arial" w:cs="Arial" w:eastAsia="Arial" w:hAnsi="Arial"/>
+        </w:rPr>
+        <w:t xml:space="preserve"> (activa por defecto) como kill-switch de la búsqueda: si se desactiva desde la consola </w:t>
+      </w:r>
+      <w:r>
+        <w:rPr>
+          <w:rFonts w:ascii="Consolas" w:cs="Consolas" w:eastAsia="Consolas" w:hAnsi="Consolas"/>
+          <w:color w:val="4F46E5"/>
+        </w:rPr>
+        <w:t xml:space="preserve">/togglz-console</w:t>
+      </w:r>
+      <w:r>
+        <w:rPr>
+          <w:rFonts w:ascii="Arial" w:cs="Arial" w:eastAsia="Arial" w:hAnsi="Arial"/>
+        </w:rPr>
+        <w:t xml:space="preserve">, </w:t>
+      </w:r>
+      <w:r>
+        <w:rPr>
+          <w:rFonts w:ascii="Consolas" w:cs="Consolas" w:eastAsia="Consolas" w:hAnsi="Consolas"/>
+          <w:color w:val="4F46E5"/>
+        </w:rPr>
+        <w:t xml:space="preserve">SearchBooksUseCaseImpl</w:t>
+      </w:r>
+      <w:r>
+        <w:rPr>
+          <w:rFonts w:ascii="Arial" w:cs="Arial" w:eastAsia="Arial" w:hAnsi="Arial"/>
+        </w:rPr>
+        <w:t xml:space="preserve"> devuelve vacío sin llegar a Elasticsearch, útil para aliviar carga al instante. Es aditivo (no cambia el comportamiento por defecto). Verificado con un unit test. Detalle en FEATURE-FLAGS.md.</w:t>
+      </w:r>
+    </w:p>
+    <w:p>
+      <w:pPr>
         <w:pStyle w:val="Heading1"/>
       </w:pPr>
       <w:r>
@@ -12780,6 +12907,101 @@
                 <w:szCs w:val="19"/>
               </w:rPr>
               <w:t xml:space="preserve">Evitar pedidos/cargos duplicados ante reintentos del cliente</w:t>
+            </w:r>
+          </w:p>
+        </w:tc>
+      </w:tr>
+      <w:tr>
+        <w:trPr>
+          <w:tblHeader w:val="false"/>
+        </w:trPr>
+        <w:tc>
+          <w:tcPr>
+            <w:tcW w:type="dxa" w:w="2500"/>
+            <w:tcBorders>
+              <w:top w:val="single" w:color="D1D5DB" w:sz="1"/>
+              <w:left w:val="single" w:color="D1D5DB" w:sz="1"/>
+              <w:bottom w:val="single" w:color="D1D5DB" w:sz="1"/>
+              <w:right w:val="single" w:color="D1D5DB" w:sz="1"/>
+            </w:tcBorders>
+            <w:tcMar>
+              <w:top w:type="dxa" w:w="60"/>
+              <w:left w:type="dxa" w:w="110"/>
+              <w:bottom w:type="dxa" w:w="60"/>
+              <w:right w:type="dxa" w:w="110"/>
+            </w:tcMar>
+          </w:tcPr>
+          <w:p>
+            <w:pPr>
+              <w:spacing w:after="0" w:line="264"/>
+            </w:pPr>
+            <w:r>
+              <w:rPr>
+                <w:rFonts w:ascii="Arial" w:cs="Arial" w:eastAsia="Arial" w:hAnsi="Arial"/>
+                <w:sz w:val="19"/>
+                <w:szCs w:val="19"/>
+              </w:rPr>
+              <w:t xml:space="preserve">Feature flags (Togglz)</w:t>
+            </w:r>
+          </w:p>
+        </w:tc>
+        <w:tc>
+          <w:tcPr>
+            <w:tcW w:type="dxa" w:w="3700"/>
+            <w:tcBorders>
+              <w:top w:val="single" w:color="D1D5DB" w:sz="1"/>
+              <w:left w:val="single" w:color="D1D5DB" w:sz="1"/>
+              <w:bottom w:val="single" w:color="D1D5DB" w:sz="1"/>
+              <w:right w:val="single" w:color="D1D5DB" w:sz="1"/>
+            </w:tcBorders>
+            <w:tcMar>
+              <w:top w:type="dxa" w:w="60"/>
+              <w:left w:type="dxa" w:w="110"/>
+              <w:bottom w:type="dxa" w:w="60"/>
+              <w:right w:type="dxa" w:w="110"/>
+            </w:tcMar>
+          </w:tcPr>
+          <w:p>
+            <w:pPr>
+              <w:spacing w:after="0" w:line="264"/>
+            </w:pPr>
+            <w:r>
+              <w:rPr>
+                <w:rFonts w:ascii="Arial" w:cs="Arial" w:eastAsia="Arial" w:hAnsi="Arial"/>
+                <w:sz w:val="19"/>
+                <w:szCs w:val="19"/>
+              </w:rPr>
+              <w:t xml:space="preserve">BOOK_SEARCH (kill-switch) en catalog</w:t>
+            </w:r>
+          </w:p>
+        </w:tc>
+        <w:tc>
+          <w:tcPr>
+            <w:tcW w:type="dxa" w:w="3160"/>
+            <w:tcBorders>
+              <w:top w:val="single" w:color="D1D5DB" w:sz="1"/>
+              <w:left w:val="single" w:color="D1D5DB" w:sz="1"/>
+              <w:bottom w:val="single" w:color="D1D5DB" w:sz="1"/>
+              <w:right w:val="single" w:color="D1D5DB" w:sz="1"/>
+            </w:tcBorders>
+            <w:tcMar>
+              <w:top w:type="dxa" w:w="60"/>
+              <w:left w:type="dxa" w:w="110"/>
+              <w:bottom w:type="dxa" w:w="60"/>
+              <w:right w:type="dxa" w:w="110"/>
+            </w:tcMar>
+          </w:tcPr>
+          <w:p>
+            <w:pPr>
+              <w:spacing w:after="0" w:line="264"/>
+            </w:pPr>
+            <w:r>
+              <w:rPr>
+                <w:rFonts w:ascii="Arial" w:cs="Arial" w:eastAsia="Arial" w:hAnsi="Arial"/>
+                <w:sz w:val="19"/>
+                <w:szCs w:val="19"/>
+              </w:rPr>
+              <w:t xml:space="preserve">Activar/desactivar funciones en caliente sin desplegar</w:t>
             </w:r>
           </w:p>
         </w:tc>

</xml_diff>

<commit_message>
feat(order): métricas de negocio con Micrometer (pedidos creados/importe)
</commit_message>
<xml_diff>
--- a/BookPlus-Stack-Tecnologico.docx
+++ b/BookPlus-Stack-Tecnologico.docx
@@ -10245,6 +10245,120 @@
     </w:p>
     <w:p>
       <w:pPr>
+        <w:pStyle w:val="Heading2"/>
+      </w:pPr>
+      <w:r>
+        <w:rPr>
+          <w:rFonts w:ascii="Arial" w:cs="Arial" w:eastAsia="Arial" w:hAnsi="Arial"/>
+        </w:rPr>
+        <w:t xml:space="preserve">13.29 Métricas de negocio (Micrometer)</w:t>
+      </w:r>
+    </w:p>
+    <w:p>
+      <w:pPr>
+        <w:spacing w:after="120" w:line="276"/>
+      </w:pPr>
+      <w:r>
+        <w:rPr>
+          <w:rFonts w:ascii="Arial" w:cs="Arial" w:eastAsia="Arial" w:hAnsi="Arial"/>
+          <w:b/>
+          <w:bCs/>
+        </w:rPr>
+        <w:t xml:space="preserve">Qué es: </w:t>
+      </w:r>
+      <w:r>
+        <w:rPr>
+          <w:rFonts w:ascii="Arial" w:cs="Arial" w:eastAsia="Arial" w:hAnsi="Arial"/>
+        </w:rPr>
+        <w:t xml:space="preserve">además de las métricas técnicas (CPU, latencia, pools), se exponen métricas de negocio — las que miden lo que importa al producto. Una métrica técnica dice si el servidor está sano; una de negocio dice si el negocio lo está, y a menudo detecta una avería (p. ej. la pasarela de pago) antes que cualquier señal técnica.</w:t>
+      </w:r>
+    </w:p>
+    <w:p>
+      <w:pPr>
+        <w:spacing w:after="120" w:line="276"/>
+      </w:pPr>
+      <w:r>
+        <w:rPr>
+          <w:rFonts w:ascii="Arial" w:cs="Arial" w:eastAsia="Arial" w:hAnsi="Arial"/>
+          <w:b/>
+          <w:bCs/>
+        </w:rPr>
+        <w:t xml:space="preserve">Cómo se integra: </w:t>
+      </w:r>
+      <w:r>
+        <w:rPr>
+          <w:rFonts w:ascii="Arial" w:cs="Arial" w:eastAsia="Arial" w:hAnsi="Arial"/>
+        </w:rPr>
+        <w:t xml:space="preserve">con Micrometer (la misma fachada del proyecto), en order-service. Al crear un pedido, </w:t>
+      </w:r>
+      <w:r>
+        <w:rPr>
+          <w:rFonts w:ascii="Consolas" w:cs="Consolas" w:eastAsia="Consolas" w:hAnsi="Consolas"/>
+          <w:color w:val="4F46E5"/>
+        </w:rPr>
+        <w:t xml:space="preserve">OrderMetrics</w:t>
+      </w:r>
+      <w:r>
+        <w:rPr>
+          <w:rFonts w:ascii="Arial" w:cs="Arial" w:eastAsia="Arial" w:hAnsi="Arial"/>
+        </w:rPr>
+        <w:t xml:space="preserve"> registra un contador </w:t>
+      </w:r>
+      <w:r>
+        <w:rPr>
+          <w:rFonts w:ascii="Consolas" w:cs="Consolas" w:eastAsia="Consolas" w:hAnsi="Consolas"/>
+          <w:color w:val="4F46E5"/>
+        </w:rPr>
+        <w:t xml:space="preserve">bookplus.orders.created</w:t>
+      </w:r>
+      <w:r>
+        <w:rPr>
+          <w:rFonts w:ascii="Arial" w:cs="Arial" w:eastAsia="Arial" w:hAnsi="Arial"/>
+        </w:rPr>
+        <w:t xml:space="preserve"> (etiquetado por método de pago) y un distribution summary </w:t>
+      </w:r>
+      <w:r>
+        <w:rPr>
+          <w:rFonts w:ascii="Consolas" w:cs="Consolas" w:eastAsia="Consolas" w:hAnsi="Consolas"/>
+          <w:color w:val="4F46E5"/>
+        </w:rPr>
+        <w:t xml:space="preserve">bookplus.orders.amount</w:t>
+      </w:r>
+      <w:r>
+        <w:rPr>
+          <w:rFonts w:ascii="Arial" w:cs="Arial" w:eastAsia="Arial" w:hAnsi="Arial"/>
+        </w:rPr>
+        <w:t xml:space="preserve"> (importe, por moneda). Se exponen en </w:t>
+      </w:r>
+      <w:r>
+        <w:rPr>
+          <w:rFonts w:ascii="Consolas" w:cs="Consolas" w:eastAsia="Consolas" w:hAnsi="Consolas"/>
+          <w:color w:val="4F46E5"/>
+        </w:rPr>
+        <w:t xml:space="preserve">/actuator/prometheus</w:t>
+      </w:r>
+      <w:r>
+        <w:rPr>
+          <w:rFonts w:ascii="Arial" w:cs="Arial" w:eastAsia="Arial" w:hAnsi="Arial"/>
+        </w:rPr>
+        <w:t xml:space="preserve"> y se grafican/alertan en Grafana. Verificado con un unit test (</w:t>
+      </w:r>
+      <w:r>
+        <w:rPr>
+          <w:rFonts w:ascii="Consolas" w:cs="Consolas" w:eastAsia="Consolas" w:hAnsi="Consolas"/>
+          <w:color w:val="4F46E5"/>
+        </w:rPr>
+        <w:t xml:space="preserve">SimpleMeterRegistry</w:t>
+      </w:r>
+      <w:r>
+        <w:rPr>
+          <w:rFonts w:ascii="Arial" w:cs="Arial" w:eastAsia="Arial" w:hAnsi="Arial"/>
+        </w:rPr>
+        <w:t xml:space="preserve">). Detalle en BUSINESS-METRICS.md.</w:t>
+      </w:r>
+    </w:p>
+    <w:p>
+      <w:pPr>
         <w:pStyle w:val="Heading1"/>
       </w:pPr>
       <w:r>
@@ -13707,6 +13821,101 @@
                 <w:szCs w:val="19"/>
               </w:rPr>
               <w:t xml:space="preserve">Endurecer todas las respuestas desde un único punto</w:t>
+            </w:r>
+          </w:p>
+        </w:tc>
+      </w:tr>
+      <w:tr>
+        <w:trPr>
+          <w:tblHeader w:val="false"/>
+        </w:trPr>
+        <w:tc>
+          <w:tcPr>
+            <w:tcW w:type="dxa" w:w="2500"/>
+            <w:tcBorders>
+              <w:top w:val="single" w:color="D1D5DB" w:sz="1"/>
+              <w:left w:val="single" w:color="D1D5DB" w:sz="1"/>
+              <w:bottom w:val="single" w:color="D1D5DB" w:sz="1"/>
+              <w:right w:val="single" w:color="D1D5DB" w:sz="1"/>
+            </w:tcBorders>
+            <w:tcMar>
+              <w:top w:type="dxa" w:w="60"/>
+              <w:left w:type="dxa" w:w="110"/>
+              <w:bottom w:type="dxa" w:w="60"/>
+              <w:right w:type="dxa" w:w="110"/>
+            </w:tcMar>
+          </w:tcPr>
+          <w:p>
+            <w:pPr>
+              <w:spacing w:after="0" w:line="264"/>
+            </w:pPr>
+            <w:r>
+              <w:rPr>
+                <w:rFonts w:ascii="Arial" w:cs="Arial" w:eastAsia="Arial" w:hAnsi="Arial"/>
+                <w:sz w:val="19"/>
+                <w:szCs w:val="19"/>
+              </w:rPr>
+              <w:t xml:space="preserve">Métricas de negocio (Micrometer)</w:t>
+            </w:r>
+          </w:p>
+        </w:tc>
+        <w:tc>
+          <w:tcPr>
+            <w:tcW w:type="dxa" w:w="3700"/>
+            <w:tcBorders>
+              <w:top w:val="single" w:color="D1D5DB" w:sz="1"/>
+              <w:left w:val="single" w:color="D1D5DB" w:sz="1"/>
+              <w:bottom w:val="single" w:color="D1D5DB" w:sz="1"/>
+              <w:right w:val="single" w:color="D1D5DB" w:sz="1"/>
+            </w:tcBorders>
+            <w:tcMar>
+              <w:top w:type="dxa" w:w="60"/>
+              <w:left w:type="dxa" w:w="110"/>
+              <w:bottom w:type="dxa" w:w="60"/>
+              <w:right w:type="dxa" w:w="110"/>
+            </w:tcMar>
+          </w:tcPr>
+          <w:p>
+            <w:pPr>
+              <w:spacing w:after="0" w:line="264"/>
+            </w:pPr>
+            <w:r>
+              <w:rPr>
+                <w:rFonts w:ascii="Arial" w:cs="Arial" w:eastAsia="Arial" w:hAnsi="Arial"/>
+                <w:sz w:val="19"/>
+                <w:szCs w:val="19"/>
+              </w:rPr>
+              <w:t xml:space="preserve">OrderMetrics (orders.created/amount)</w:t>
+            </w:r>
+          </w:p>
+        </w:tc>
+        <w:tc>
+          <w:tcPr>
+            <w:tcW w:type="dxa" w:w="3160"/>
+            <w:tcBorders>
+              <w:top w:val="single" w:color="D1D5DB" w:sz="1"/>
+              <w:left w:val="single" w:color="D1D5DB" w:sz="1"/>
+              <w:bottom w:val="single" w:color="D1D5DB" w:sz="1"/>
+              <w:right w:val="single" w:color="D1D5DB" w:sz="1"/>
+            </w:tcBorders>
+            <w:tcMar>
+              <w:top w:type="dxa" w:w="60"/>
+              <w:left w:type="dxa" w:w="110"/>
+              <w:bottom w:type="dxa" w:w="60"/>
+              <w:right w:type="dxa" w:w="110"/>
+            </w:tcMar>
+          </w:tcPr>
+          <w:p>
+            <w:pPr>
+              <w:spacing w:after="0" w:line="264"/>
+            </w:pPr>
+            <w:r>
+              <w:rPr>
+                <w:rFonts w:ascii="Arial" w:cs="Arial" w:eastAsia="Arial" w:hAnsi="Arial"/>
+                <w:sz w:val="19"/>
+                <w:szCs w:val="19"/>
+              </w:rPr>
+              <w:t xml:space="preserve">Observar el negocio, no solo la infraestructura</w:t>
             </w:r>
           </w:p>
         </w:tc>

</xml_diff>

<commit_message>
feat: logging JSON+correlationId (order), account lockout (auth), ETag (catalog)
</commit_message>
<xml_diff>
--- a/BookPlus-Stack-Tecnologico.docx
+++ b/BookPlus-Stack-Tecnologico.docx
@@ -10359,6 +10359,296 @@
     </w:p>
     <w:p>
       <w:pPr>
+        <w:pStyle w:val="Heading2"/>
+      </w:pPr>
+      <w:r>
+        <w:rPr>
+          <w:rFonts w:ascii="Arial" w:cs="Arial" w:eastAsia="Arial" w:hAnsi="Arial"/>
+        </w:rPr>
+        <w:t xml:space="preserve">13.30 Logging estructurado JSON + correlation ID</w:t>
+      </w:r>
+    </w:p>
+    <w:p>
+      <w:pPr>
+        <w:spacing w:after="120" w:line="276"/>
+      </w:pPr>
+      <w:r>
+        <w:rPr>
+          <w:rFonts w:ascii="Arial" w:cs="Arial" w:eastAsia="Arial" w:hAnsi="Arial"/>
+          <w:b/>
+          <w:bCs/>
+        </w:rPr>
+        <w:t xml:space="preserve">Qué es: </w:t>
+      </w:r>
+      <w:r>
+        <w:rPr>
+          <w:rFonts w:ascii="Arial" w:cs="Arial" w:eastAsia="Arial" w:hAnsi="Arial"/>
+        </w:rPr>
+        <w:t xml:space="preserve">los logs en texto plano son legibles pero difíciles de consultar a escala. Estructurarlos en JSON permite filtrarlos por campo en Loki/Grafana (nivel, usuario, petición), y un identificador de correlación por petición permite seguirla de punta a punta.</w:t>
+      </w:r>
+    </w:p>
+    <w:p>
+      <w:pPr>
+        <w:spacing w:after="120" w:line="276"/>
+      </w:pPr>
+      <w:r>
+        <w:rPr>
+          <w:rFonts w:ascii="Arial" w:cs="Arial" w:eastAsia="Arial" w:hAnsi="Arial"/>
+          <w:b/>
+          <w:bCs/>
+        </w:rPr>
+        <w:t xml:space="preserve">Cómo se integra: </w:t>
+      </w:r>
+      <w:r>
+        <w:rPr>
+          <w:rFonts w:ascii="Arial" w:cs="Arial" w:eastAsia="Arial" w:hAnsi="Arial"/>
+        </w:rPr>
+        <w:t xml:space="preserve">en order-service, </w:t>
+      </w:r>
+      <w:r>
+        <w:rPr>
+          <w:rFonts w:ascii="Consolas" w:cs="Consolas" w:eastAsia="Consolas" w:hAnsi="Consolas"/>
+          <w:color w:val="4F46E5"/>
+        </w:rPr>
+        <w:t xml:space="preserve">logstash-logback-encoder</w:t>
+      </w:r>
+      <w:r>
+        <w:rPr>
+          <w:rFonts w:ascii="Arial" w:cs="Arial" w:eastAsia="Arial" w:hAnsi="Arial"/>
+        </w:rPr>
+        <w:t xml:space="preserve"> + un </w:t>
+      </w:r>
+      <w:r>
+        <w:rPr>
+          <w:rFonts w:ascii="Consolas" w:cs="Consolas" w:eastAsia="Consolas" w:hAnsi="Consolas"/>
+          <w:color w:val="4F46E5"/>
+        </w:rPr>
+        <w:t xml:space="preserve">logback-spring.xml</w:t>
+      </w:r>
+      <w:r>
+        <w:rPr>
+          <w:rFonts w:ascii="Arial" w:cs="Arial" w:eastAsia="Arial" w:hAnsi="Arial"/>
+        </w:rPr>
+        <w:t xml:space="preserve"> que bajo el perfil </w:t>
+      </w:r>
+      <w:r>
+        <w:rPr>
+          <w:rFonts w:ascii="Consolas" w:cs="Consolas" w:eastAsia="Consolas" w:hAnsi="Consolas"/>
+          <w:color w:val="4F46E5"/>
+        </w:rPr>
+        <w:t xml:space="preserve">json</w:t>
+      </w:r>
+      <w:r>
+        <w:rPr>
+          <w:rFonts w:ascii="Arial" w:cs="Arial" w:eastAsia="Arial" w:hAnsi="Arial"/>
+        </w:rPr>
+        <w:t xml:space="preserve"> emite cada línea como JSON (con MDC: correlationId, traceId, spanId); en dev se mantiene la consola legible. Un </w:t>
+      </w:r>
+      <w:r>
+        <w:rPr>
+          <w:rFonts w:ascii="Consolas" w:cs="Consolas" w:eastAsia="Consolas" w:hAnsi="Consolas"/>
+          <w:color w:val="4F46E5"/>
+        </w:rPr>
+        <w:t xml:space="preserve">CorrelationIdFilter</w:t>
+      </w:r>
+      <w:r>
+        <w:rPr>
+          <w:rFonts w:ascii="Arial" w:cs="Arial" w:eastAsia="Arial" w:hAnsi="Arial"/>
+        </w:rPr>
+        <w:t xml:space="preserve"> lee/genera </w:t>
+      </w:r>
+      <w:r>
+        <w:rPr>
+          <w:rFonts w:ascii="Consolas" w:cs="Consolas" w:eastAsia="Consolas" w:hAnsi="Consolas"/>
+          <w:color w:val="4F46E5"/>
+        </w:rPr>
+        <w:t xml:space="preserve">X-Correlation-Id</w:t>
+      </w:r>
+      <w:r>
+        <w:rPr>
+          <w:rFonts w:ascii="Arial" w:cs="Arial" w:eastAsia="Arial" w:hAnsi="Arial"/>
+        </w:rPr>
+        <w:t xml:space="preserve">, lo pone en el MDC y lo devuelve en la respuesta. Verificado con un unit test. Detalle en LOGGING-JSON.md.</w:t>
+      </w:r>
+    </w:p>
+    <w:p>
+      <w:pPr>
+        <w:pStyle w:val="Heading2"/>
+      </w:pPr>
+      <w:r>
+        <w:rPr>
+          <w:rFonts w:ascii="Arial" w:cs="Arial" w:eastAsia="Arial" w:hAnsi="Arial"/>
+        </w:rPr>
+        <w:t xml:space="preserve">13.31 Bloqueo de cuenta tras intentos fallidos</w:t>
+      </w:r>
+    </w:p>
+    <w:p>
+      <w:pPr>
+        <w:spacing w:after="120" w:line="276"/>
+      </w:pPr>
+      <w:r>
+        <w:rPr>
+          <w:rFonts w:ascii="Arial" w:cs="Arial" w:eastAsia="Arial" w:hAnsi="Arial"/>
+          <w:b/>
+          <w:bCs/>
+        </w:rPr>
+        <w:t xml:space="preserve">Qué es: </w:t>
+      </w:r>
+      <w:r>
+        <w:rPr>
+          <w:rFonts w:ascii="Arial" w:cs="Arial" w:eastAsia="Arial" w:hAnsi="Arial"/>
+        </w:rPr>
+        <w:t xml:space="preserve">el rate limiting por IP no frena un ataque de fuerza bruta distribuido (muchas IPs contra una misma cuenta). El bloqueo de cuenta cuenta los fallos por cuenta y la bloquea temporalmente al superar un umbral — control clásico de banca, complementario al rate limiting.</w:t>
+      </w:r>
+    </w:p>
+    <w:p>
+      <w:pPr>
+        <w:spacing w:after="120" w:line="276"/>
+      </w:pPr>
+      <w:r>
+        <w:rPr>
+          <w:rFonts w:ascii="Arial" w:cs="Arial" w:eastAsia="Arial" w:hAnsi="Arial"/>
+          <w:b/>
+          <w:bCs/>
+        </w:rPr>
+        <w:t xml:space="preserve">Cómo se integra: </w:t>
+      </w:r>
+      <w:r>
+        <w:rPr>
+          <w:rFonts w:ascii="Arial" w:cs="Arial" w:eastAsia="Arial" w:hAnsi="Arial"/>
+        </w:rPr>
+        <w:t xml:space="preserve">en auth-service, </w:t>
+      </w:r>
+      <w:r>
+        <w:rPr>
+          <w:rFonts w:ascii="Consolas" w:cs="Consolas" w:eastAsia="Consolas" w:hAnsi="Consolas"/>
+          <w:color w:val="4F46E5"/>
+        </w:rPr>
+        <w:t xml:space="preserve">LoginAttemptService</w:t>
+      </w:r>
+      <w:r>
+        <w:rPr>
+          <w:rFonts w:ascii="Arial" w:cs="Arial" w:eastAsia="Arial" w:hAnsi="Arial"/>
+        </w:rPr>
+        <w:t xml:space="preserve"> (respaldado por Redis) incrementa un contador por cuenta en cada login fallido y, al alcanzar N (5 por defecto), marca un bloqueo temporal (15 min); un login correcto lo limpia. </w:t>
+      </w:r>
+      <w:r>
+        <w:rPr>
+          <w:rFonts w:ascii="Consolas" w:cs="Consolas" w:eastAsia="Consolas" w:hAnsi="Consolas"/>
+          <w:color w:val="4F46E5"/>
+        </w:rPr>
+        <w:t xml:space="preserve">AuthenticateUserUseCaseImpl</w:t>
+      </w:r>
+      <w:r>
+        <w:rPr>
+          <w:rFonts w:ascii="Arial" w:cs="Arial" w:eastAsia="Arial" w:hAnsi="Arial"/>
+        </w:rPr>
+        <w:t xml:space="preserve"> comprueba el bloqueo al entrar. Todo con TTL en Redis (caduca solo, global entre réplicas). Verificado con un unit test. Detalle en ACCOUNT-LOCKOUT.md.</w:t>
+      </w:r>
+    </w:p>
+    <w:p>
+      <w:pPr>
+        <w:pStyle w:val="Heading2"/>
+      </w:pPr>
+      <w:r>
+        <w:rPr>
+          <w:rFonts w:ascii="Arial" w:cs="Arial" w:eastAsia="Arial" w:hAnsi="Arial"/>
+        </w:rPr>
+        <w:t xml:space="preserve">13.32 Caché HTTP condicional (ETag)</w:t>
+      </w:r>
+    </w:p>
+    <w:p>
+      <w:pPr>
+        <w:spacing w:after="120" w:line="276"/>
+      </w:pPr>
+      <w:r>
+        <w:rPr>
+          <w:rFonts w:ascii="Arial" w:cs="Arial" w:eastAsia="Arial" w:hAnsi="Arial"/>
+          <w:b/>
+          <w:bCs/>
+        </w:rPr>
+        <w:t xml:space="preserve">Qué es: </w:t>
+      </w:r>
+      <w:r>
+        <w:rPr>
+          <w:rFonts w:ascii="Arial" w:cs="Arial" w:eastAsia="Arial" w:hAnsi="Arial"/>
+        </w:rPr>
+        <w:t xml:space="preserve">cuando un cliente pide repetidamente un recurso que no ha cambiado, reenviar el cuerpo completo malgasta ancho de banda. Con ETag, el servidor manda un hash del cuerpo; si en la siguiente petición (</w:t>
+      </w:r>
+      <w:r>
+        <w:rPr>
+          <w:rFonts w:ascii="Consolas" w:cs="Consolas" w:eastAsia="Consolas" w:hAnsi="Consolas"/>
+          <w:color w:val="4F46E5"/>
+        </w:rPr>
+        <w:t xml:space="preserve">If-None-Match</w:t>
+      </w:r>
+      <w:r>
+        <w:rPr>
+          <w:rFonts w:ascii="Arial" w:cs="Arial" w:eastAsia="Arial" w:hAnsi="Arial"/>
+        </w:rPr>
+        <w:t xml:space="preserve">) no cambió, responde </w:t>
+      </w:r>
+      <w:r>
+        <w:rPr>
+          <w:rFonts w:ascii="Consolas" w:cs="Consolas" w:eastAsia="Consolas" w:hAnsi="Consolas"/>
+          <w:color w:val="4F46E5"/>
+        </w:rPr>
+        <w:t xml:space="preserve">304 Not Modified</w:t>
+      </w:r>
+      <w:r>
+        <w:rPr>
+          <w:rFonts w:ascii="Arial" w:cs="Arial" w:eastAsia="Arial" w:hAnsi="Arial"/>
+        </w:rPr>
+        <w:t xml:space="preserve"> sin cuerpo y el cliente reutiliza su copia.</w:t>
+      </w:r>
+    </w:p>
+    <w:p>
+      <w:pPr>
+        <w:spacing w:after="120" w:line="276"/>
+      </w:pPr>
+      <w:r>
+        <w:rPr>
+          <w:rFonts w:ascii="Arial" w:cs="Arial" w:eastAsia="Arial" w:hAnsi="Arial"/>
+          <w:b/>
+          <w:bCs/>
+        </w:rPr>
+        <w:t xml:space="preserve">Cómo se integra: </w:t>
+      </w:r>
+      <w:r>
+        <w:rPr>
+          <w:rFonts w:ascii="Arial" w:cs="Arial" w:eastAsia="Arial" w:hAnsi="Arial"/>
+        </w:rPr>
+        <w:t xml:space="preserve">en catalog-service, </w:t>
+      </w:r>
+      <w:r>
+        <w:rPr>
+          <w:rFonts w:ascii="Consolas" w:cs="Consolas" w:eastAsia="Consolas" w:hAnsi="Consolas"/>
+          <w:color w:val="4F46E5"/>
+        </w:rPr>
+        <w:t xml:space="preserve">EtagConfig</w:t>
+      </w:r>
+      <w:r>
+        <w:rPr>
+          <w:rFonts w:ascii="Arial" w:cs="Arial" w:eastAsia="Arial" w:hAnsi="Arial"/>
+        </w:rPr>
+        <w:t xml:space="preserve"> registra el </w:t>
+      </w:r>
+      <w:r>
+        <w:rPr>
+          <w:rFonts w:ascii="Consolas" w:cs="Consolas" w:eastAsia="Consolas" w:hAnsi="Consolas"/>
+          <w:color w:val="4F46E5"/>
+        </w:rPr>
+        <w:t xml:space="preserve">ShallowEtagHeaderFilter</w:t>
+      </w:r>
+      <w:r>
+        <w:rPr>
+          <w:rFonts w:ascii="Arial" w:cs="Arial" w:eastAsia="Arial" w:hAnsi="Arial"/>
+        </w:rPr>
+        <w:t xml:space="preserve"> de Spring en las rutas de lectura del catálogo. Es transparente (los controllers no cambian) y, junto con la caché de dos niveles, hace muy baratas las lecturas repetidas. Verificado con un unit test (200+ETag, luego 304). Detalle en HTTP-ETAG.md.</w:t>
+      </w:r>
+    </w:p>
+    <w:p>
+      <w:pPr>
         <w:pStyle w:val="Heading1"/>
       </w:pPr>
       <w:r>
@@ -13916,6 +14206,291 @@
                 <w:szCs w:val="19"/>
               </w:rPr>
               <w:t xml:space="preserve">Observar el negocio, no solo la infraestructura</w:t>
+            </w:r>
+          </w:p>
+        </w:tc>
+      </w:tr>
+      <w:tr>
+        <w:trPr>
+          <w:tblHeader w:val="false"/>
+        </w:trPr>
+        <w:tc>
+          <w:tcPr>
+            <w:tcW w:type="dxa" w:w="2500"/>
+            <w:tcBorders>
+              <w:top w:val="single" w:color="D1D5DB" w:sz="1"/>
+              <w:left w:val="single" w:color="D1D5DB" w:sz="1"/>
+              <w:bottom w:val="single" w:color="D1D5DB" w:sz="1"/>
+              <w:right w:val="single" w:color="D1D5DB" w:sz="1"/>
+            </w:tcBorders>
+            <w:tcMar>
+              <w:top w:type="dxa" w:w="60"/>
+              <w:left w:type="dxa" w:w="110"/>
+              <w:bottom w:type="dxa" w:w="60"/>
+              <w:right w:type="dxa" w:w="110"/>
+            </w:tcMar>
+          </w:tcPr>
+          <w:p>
+            <w:pPr>
+              <w:spacing w:after="0" w:line="264"/>
+            </w:pPr>
+            <w:r>
+              <w:rPr>
+                <w:rFonts w:ascii="Arial" w:cs="Arial" w:eastAsia="Arial" w:hAnsi="Arial"/>
+                <w:sz w:val="19"/>
+                <w:szCs w:val="19"/>
+              </w:rPr>
+              <w:t xml:space="preserve">Correlation ID (MDC)</w:t>
+            </w:r>
+          </w:p>
+        </w:tc>
+        <w:tc>
+          <w:tcPr>
+            <w:tcW w:type="dxa" w:w="3700"/>
+            <w:tcBorders>
+              <w:top w:val="single" w:color="D1D5DB" w:sz="1"/>
+              <w:left w:val="single" w:color="D1D5DB" w:sz="1"/>
+              <w:bottom w:val="single" w:color="D1D5DB" w:sz="1"/>
+              <w:right w:val="single" w:color="D1D5DB" w:sz="1"/>
+            </w:tcBorders>
+            <w:tcMar>
+              <w:top w:type="dxa" w:w="60"/>
+              <w:left w:type="dxa" w:w="110"/>
+              <w:bottom w:type="dxa" w:w="60"/>
+              <w:right w:type="dxa" w:w="110"/>
+            </w:tcMar>
+          </w:tcPr>
+          <w:p>
+            <w:pPr>
+              <w:spacing w:after="0" w:line="264"/>
+            </w:pPr>
+            <w:r>
+              <w:rPr>
+                <w:rFonts w:ascii="Arial" w:cs="Arial" w:eastAsia="Arial" w:hAnsi="Arial"/>
+                <w:sz w:val="19"/>
+                <w:szCs w:val="19"/>
+              </w:rPr>
+              <w:t xml:space="preserve">CorrelationIdFilter + logs JSON en order</w:t>
+            </w:r>
+          </w:p>
+        </w:tc>
+        <w:tc>
+          <w:tcPr>
+            <w:tcW w:type="dxa" w:w="3160"/>
+            <w:tcBorders>
+              <w:top w:val="single" w:color="D1D5DB" w:sz="1"/>
+              <w:left w:val="single" w:color="D1D5DB" w:sz="1"/>
+              <w:bottom w:val="single" w:color="D1D5DB" w:sz="1"/>
+              <w:right w:val="single" w:color="D1D5DB" w:sz="1"/>
+            </w:tcBorders>
+            <w:tcMar>
+              <w:top w:type="dxa" w:w="60"/>
+              <w:left w:type="dxa" w:w="110"/>
+              <w:bottom w:type="dxa" w:w="60"/>
+              <w:right w:type="dxa" w:w="110"/>
+            </w:tcMar>
+          </w:tcPr>
+          <w:p>
+            <w:pPr>
+              <w:spacing w:after="0" w:line="264"/>
+            </w:pPr>
+            <w:r>
+              <w:rPr>
+                <w:rFonts w:ascii="Arial" w:cs="Arial" w:eastAsia="Arial" w:hAnsi="Arial"/>
+                <w:sz w:val="19"/>
+                <w:szCs w:val="19"/>
+              </w:rPr>
+              <w:t xml:space="preserve">Seguir una petición de punta a punta en Loki/Grafana</w:t>
+            </w:r>
+          </w:p>
+        </w:tc>
+      </w:tr>
+      <w:tr>
+        <w:trPr>
+          <w:tblHeader w:val="false"/>
+        </w:trPr>
+        <w:tc>
+          <w:tcPr>
+            <w:tcW w:type="dxa" w:w="2500"/>
+            <w:tcBorders>
+              <w:top w:val="single" w:color="D1D5DB" w:sz="1"/>
+              <w:left w:val="single" w:color="D1D5DB" w:sz="1"/>
+              <w:bottom w:val="single" w:color="D1D5DB" w:sz="1"/>
+              <w:right w:val="single" w:color="D1D5DB" w:sz="1"/>
+            </w:tcBorders>
+            <w:tcMar>
+              <w:top w:type="dxa" w:w="60"/>
+              <w:left w:type="dxa" w:w="110"/>
+              <w:bottom w:type="dxa" w:w="60"/>
+              <w:right w:type="dxa" w:w="110"/>
+            </w:tcMar>
+          </w:tcPr>
+          <w:p>
+            <w:pPr>
+              <w:spacing w:after="0" w:line="264"/>
+            </w:pPr>
+            <w:r>
+              <w:rPr>
+                <w:rFonts w:ascii="Arial" w:cs="Arial" w:eastAsia="Arial" w:hAnsi="Arial"/>
+                <w:sz w:val="19"/>
+                <w:szCs w:val="19"/>
+              </w:rPr>
+              <w:t xml:space="preserve">Account lockout</w:t>
+            </w:r>
+          </w:p>
+        </w:tc>
+        <w:tc>
+          <w:tcPr>
+            <w:tcW w:type="dxa" w:w="3700"/>
+            <w:tcBorders>
+              <w:top w:val="single" w:color="D1D5DB" w:sz="1"/>
+              <w:left w:val="single" w:color="D1D5DB" w:sz="1"/>
+              <w:bottom w:val="single" w:color="D1D5DB" w:sz="1"/>
+              <w:right w:val="single" w:color="D1D5DB" w:sz="1"/>
+            </w:tcBorders>
+            <w:tcMar>
+              <w:top w:type="dxa" w:w="60"/>
+              <w:left w:type="dxa" w:w="110"/>
+              <w:bottom w:type="dxa" w:w="60"/>
+              <w:right w:type="dxa" w:w="110"/>
+            </w:tcMar>
+          </w:tcPr>
+          <w:p>
+            <w:pPr>
+              <w:spacing w:after="0" w:line="264"/>
+            </w:pPr>
+            <w:r>
+              <w:rPr>
+                <w:rFonts w:ascii="Arial" w:cs="Arial" w:eastAsia="Arial" w:hAnsi="Arial"/>
+                <w:sz w:val="19"/>
+                <w:szCs w:val="19"/>
+              </w:rPr>
+              <w:t xml:space="preserve">LoginAttemptService (Redis) en auth</w:t>
+            </w:r>
+          </w:p>
+        </w:tc>
+        <w:tc>
+          <w:tcPr>
+            <w:tcW w:type="dxa" w:w="3160"/>
+            <w:tcBorders>
+              <w:top w:val="single" w:color="D1D5DB" w:sz="1"/>
+              <w:left w:val="single" w:color="D1D5DB" w:sz="1"/>
+              <w:bottom w:val="single" w:color="D1D5DB" w:sz="1"/>
+              <w:right w:val="single" w:color="D1D5DB" w:sz="1"/>
+            </w:tcBorders>
+            <w:tcMar>
+              <w:top w:type="dxa" w:w="60"/>
+              <w:left w:type="dxa" w:w="110"/>
+              <w:bottom w:type="dxa" w:w="60"/>
+              <w:right w:type="dxa" w:w="110"/>
+            </w:tcMar>
+          </w:tcPr>
+          <w:p>
+            <w:pPr>
+              <w:spacing w:after="0" w:line="264"/>
+            </w:pPr>
+            <w:r>
+              <w:rPr>
+                <w:rFonts w:ascii="Arial" w:cs="Arial" w:eastAsia="Arial" w:hAnsi="Arial"/>
+                <w:sz w:val="19"/>
+                <w:szCs w:val="19"/>
+              </w:rPr>
+              <w:t xml:space="preserve">Frenar fuerza bruta distribuida por cuenta</w:t>
+            </w:r>
+          </w:p>
+        </w:tc>
+      </w:tr>
+      <w:tr>
+        <w:trPr>
+          <w:tblHeader w:val="false"/>
+        </w:trPr>
+        <w:tc>
+          <w:tcPr>
+            <w:tcW w:type="dxa" w:w="2500"/>
+            <w:tcBorders>
+              <w:top w:val="single" w:color="D1D5DB" w:sz="1"/>
+              <w:left w:val="single" w:color="D1D5DB" w:sz="1"/>
+              <w:bottom w:val="single" w:color="D1D5DB" w:sz="1"/>
+              <w:right w:val="single" w:color="D1D5DB" w:sz="1"/>
+            </w:tcBorders>
+            <w:tcMar>
+              <w:top w:type="dxa" w:w="60"/>
+              <w:left w:type="dxa" w:w="110"/>
+              <w:bottom w:type="dxa" w:w="60"/>
+              <w:right w:type="dxa" w:w="110"/>
+            </w:tcMar>
+          </w:tcPr>
+          <w:p>
+            <w:pPr>
+              <w:spacing w:after="0" w:line="264"/>
+            </w:pPr>
+            <w:r>
+              <w:rPr>
+                <w:rFonts w:ascii="Arial" w:cs="Arial" w:eastAsia="Arial" w:hAnsi="Arial"/>
+                <w:sz w:val="19"/>
+                <w:szCs w:val="19"/>
+              </w:rPr>
+              <w:t xml:space="preserve">Caché condicional (ETag)</w:t>
+            </w:r>
+          </w:p>
+        </w:tc>
+        <w:tc>
+          <w:tcPr>
+            <w:tcW w:type="dxa" w:w="3700"/>
+            <w:tcBorders>
+              <w:top w:val="single" w:color="D1D5DB" w:sz="1"/>
+              <w:left w:val="single" w:color="D1D5DB" w:sz="1"/>
+              <w:bottom w:val="single" w:color="D1D5DB" w:sz="1"/>
+              <w:right w:val="single" w:color="D1D5DB" w:sz="1"/>
+            </w:tcBorders>
+            <w:tcMar>
+              <w:top w:type="dxa" w:w="60"/>
+              <w:left w:type="dxa" w:w="110"/>
+              <w:bottom w:type="dxa" w:w="60"/>
+              <w:right w:type="dxa" w:w="110"/>
+            </w:tcMar>
+          </w:tcPr>
+          <w:p>
+            <w:pPr>
+              <w:spacing w:after="0" w:line="264"/>
+            </w:pPr>
+            <w:r>
+              <w:rPr>
+                <w:rFonts w:ascii="Arial" w:cs="Arial" w:eastAsia="Arial" w:hAnsi="Arial"/>
+                <w:sz w:val="19"/>
+                <w:szCs w:val="19"/>
+              </w:rPr>
+              <w:t xml:space="preserve">ShallowEtagHeaderFilter en catalog</w:t>
+            </w:r>
+          </w:p>
+        </w:tc>
+        <w:tc>
+          <w:tcPr>
+            <w:tcW w:type="dxa" w:w="3160"/>
+            <w:tcBorders>
+              <w:top w:val="single" w:color="D1D5DB" w:sz="1"/>
+              <w:left w:val="single" w:color="D1D5DB" w:sz="1"/>
+              <w:bottom w:val="single" w:color="D1D5DB" w:sz="1"/>
+              <w:right w:val="single" w:color="D1D5DB" w:sz="1"/>
+            </w:tcBorders>
+            <w:tcMar>
+              <w:top w:type="dxa" w:w="60"/>
+              <w:left w:type="dxa" w:w="110"/>
+              <w:bottom w:type="dxa" w:w="60"/>
+              <w:right w:type="dxa" w:w="110"/>
+            </w:tcMar>
+          </w:tcPr>
+          <w:p>
+            <w:pPr>
+              <w:spacing w:after="0" w:line="264"/>
+            </w:pPr>
+            <w:r>
+              <w:rPr>
+                <w:rFonts w:ascii="Arial" w:cs="Arial" w:eastAsia="Arial" w:hAnsi="Arial"/>
+                <w:sz w:val="19"/>
+                <w:szCs w:val="19"/>
+              </w:rPr>
+              <w:t xml:space="preserve">Responder 304 y ahorrar ancho de banda en lecturas</w:t>
             </w:r>
           </w:p>
         </w:tc>
@@ -14720,7 +15295,6 @@
     <w:next w:val="Normal"/>
     <w:qFormat/>
     <w:pPr>
-      <w:pageBreakBefore/>
       <w:pBdr>
         <w:bottom w:val="single" w:color="C7D2FE" w:sz="6" w:space="6"/>
       </w:pBdr>

</xml_diff>

<commit_message>
feat(auth): política de contraseñas con @StrongPassword (Bean Validation)
</commit_message>
<xml_diff>
--- a/BookPlus-Stack-Tecnologico.docx
+++ b/BookPlus-Stack-Tecnologico.docx
@@ -10649,6 +10649,120 @@
     </w:p>
     <w:p>
       <w:pPr>
+        <w:pStyle w:val="Heading2"/>
+      </w:pPr>
+      <w:r>
+        <w:rPr>
+          <w:rFonts w:ascii="Arial" w:cs="Arial" w:eastAsia="Arial" w:hAnsi="Arial"/>
+        </w:rPr>
+        <w:t xml:space="preserve">13.33 Política de contraseñas (Bean Validation custom)</w:t>
+      </w:r>
+    </w:p>
+    <w:p>
+      <w:pPr>
+        <w:spacing w:after="120" w:line="276"/>
+      </w:pPr>
+      <w:r>
+        <w:rPr>
+          <w:rFonts w:ascii="Arial" w:cs="Arial" w:eastAsia="Arial" w:hAnsi="Arial"/>
+          <w:b/>
+          <w:bCs/>
+        </w:rPr>
+        <w:t xml:space="preserve">Qué es: </w:t>
+      </w:r>
+      <w:r>
+        <w:rPr>
+          <w:rFonts w:ascii="Arial" w:cs="Arial" w:eastAsia="Arial" w:hAnsi="Arial"/>
+        </w:rPr>
+        <w:t xml:space="preserve">una contraseña larga pero trivial cumple un mínimo de longitud y aun así es débil. Para forzar contraseñas robustas en el registro se añade una restricción de validación personalizada con Jakarta Bean Validation: </w:t>
+      </w:r>
+      <w:r>
+        <w:rPr>
+          <w:rFonts w:ascii="Consolas" w:cs="Consolas" w:eastAsia="Consolas" w:hAnsi="Consolas"/>
+          <w:color w:val="4F46E5"/>
+        </w:rPr>
+        <w:t xml:space="preserve">@StrongPassword</w:t>
+      </w:r>
+      <w:r>
+        <w:rPr>
+          <w:rFonts w:ascii="Arial" w:cs="Arial" w:eastAsia="Arial" w:hAnsi="Arial"/>
+        </w:rPr>
+        <w:t xml:space="preserve">.</w:t>
+      </w:r>
+    </w:p>
+    <w:p>
+      <w:pPr>
+        <w:spacing w:after="120" w:line="276"/>
+      </w:pPr>
+      <w:r>
+        <w:rPr>
+          <w:rFonts w:ascii="Arial" w:cs="Arial" w:eastAsia="Arial" w:hAnsi="Arial"/>
+          <w:b/>
+          <w:bCs/>
+        </w:rPr>
+        <w:t xml:space="preserve">Cómo se integra: </w:t>
+      </w:r>
+      <w:r>
+        <w:rPr>
+          <w:rFonts w:ascii="Arial" w:cs="Arial" w:eastAsia="Arial" w:hAnsi="Arial"/>
+        </w:rPr>
+        <w:t xml:space="preserve">en auth-service, la anotación </w:t>
+      </w:r>
+      <w:r>
+        <w:rPr>
+          <w:rFonts w:ascii="Consolas" w:cs="Consolas" w:eastAsia="Consolas" w:hAnsi="Consolas"/>
+          <w:color w:val="4F46E5"/>
+        </w:rPr>
+        <w:t xml:space="preserve">@StrongPassword</w:t>
+      </w:r>
+      <w:r>
+        <w:rPr>
+          <w:rFonts w:ascii="Arial" w:cs="Arial" w:eastAsia="Arial" w:hAnsi="Arial"/>
+        </w:rPr>
+        <w:t xml:space="preserve"> (con su </w:t>
+      </w:r>
+      <w:r>
+        <w:rPr>
+          <w:rFonts w:ascii="Consolas" w:cs="Consolas" w:eastAsia="Consolas" w:hAnsi="Consolas"/>
+          <w:color w:val="4F46E5"/>
+        </w:rPr>
+        <w:t xml:space="preserve">StrongPasswordValidator</w:t>
+      </w:r>
+      <w:r>
+        <w:rPr>
+          <w:rFonts w:ascii="Arial" w:cs="Arial" w:eastAsia="Arial" w:hAnsi="Arial"/>
+        </w:rPr>
+        <w:t xml:space="preserve">) exige mínimo 8 caracteres y al menos mayúscula, minúscula, dígito y símbolo. Se aplica de forma declarativa sobre el campo </w:t>
+      </w:r>
+      <w:r>
+        <w:rPr>
+          <w:rFonts w:ascii="Consolas" w:cs="Consolas" w:eastAsia="Consolas" w:hAnsi="Consolas"/>
+          <w:color w:val="4F46E5"/>
+        </w:rPr>
+        <w:t xml:space="preserve">password</w:t>
+      </w:r>
+      <w:r>
+        <w:rPr>
+          <w:rFonts w:ascii="Arial" w:cs="Arial" w:eastAsia="Arial" w:hAnsi="Arial"/>
+        </w:rPr>
+        <w:t xml:space="preserve"> del DTO de registro; Spring la evalúa con </w:t>
+      </w:r>
+      <w:r>
+        <w:rPr>
+          <w:rFonts w:ascii="Consolas" w:cs="Consolas" w:eastAsia="Consolas" w:hAnsi="Consolas"/>
+          <w:color w:val="4F46E5"/>
+        </w:rPr>
+        <w:t xml:space="preserve">@Valid</w:t>
+      </w:r>
+      <w:r>
+        <w:rPr>
+          <w:rFonts w:ascii="Arial" w:cs="Arial" w:eastAsia="Arial" w:hAnsi="Arial"/>
+        </w:rPr>
+        <w:t xml:space="preserve"> y devuelve 400 si falla, sin ejecutar la lógica. Es reutilizable (registro, reset, cambio). Verificado con un unit test. Detalle en PASSWORD-POLICY.md.</w:t>
+      </w:r>
+    </w:p>
+    <w:p>
+      <w:pPr>
         <w:pStyle w:val="Heading1"/>
       </w:pPr>
       <w:r>
@@ -14491,6 +14605,101 @@
                 <w:szCs w:val="19"/>
               </w:rPr>
               <w:t xml:space="preserve">Responder 304 y ahorrar ancho de banda en lecturas</w:t>
+            </w:r>
+          </w:p>
+        </w:tc>
+      </w:tr>
+      <w:tr>
+        <w:trPr>
+          <w:tblHeader w:val="false"/>
+        </w:trPr>
+        <w:tc>
+          <w:tcPr>
+            <w:tcW w:type="dxa" w:w="2500"/>
+            <w:tcBorders>
+              <w:top w:val="single" w:color="D1D5DB" w:sz="1"/>
+              <w:left w:val="single" w:color="D1D5DB" w:sz="1"/>
+              <w:bottom w:val="single" w:color="D1D5DB" w:sz="1"/>
+              <w:right w:val="single" w:color="D1D5DB" w:sz="1"/>
+            </w:tcBorders>
+            <w:tcMar>
+              <w:top w:type="dxa" w:w="60"/>
+              <w:left w:type="dxa" w:w="110"/>
+              <w:bottom w:type="dxa" w:w="60"/>
+              <w:right w:type="dxa" w:w="110"/>
+            </w:tcMar>
+          </w:tcPr>
+          <w:p>
+            <w:pPr>
+              <w:spacing w:after="0" w:line="264"/>
+            </w:pPr>
+            <w:r>
+              <w:rPr>
+                <w:rFonts w:ascii="Arial" w:cs="Arial" w:eastAsia="Arial" w:hAnsi="Arial"/>
+                <w:sz w:val="19"/>
+                <w:szCs w:val="19"/>
+              </w:rPr>
+              <w:t xml:space="preserve">Validación declarativa (Bean Validation)</w:t>
+            </w:r>
+          </w:p>
+        </w:tc>
+        <w:tc>
+          <w:tcPr>
+            <w:tcW w:type="dxa" w:w="3700"/>
+            <w:tcBorders>
+              <w:top w:val="single" w:color="D1D5DB" w:sz="1"/>
+              <w:left w:val="single" w:color="D1D5DB" w:sz="1"/>
+              <w:bottom w:val="single" w:color="D1D5DB" w:sz="1"/>
+              <w:right w:val="single" w:color="D1D5DB" w:sz="1"/>
+            </w:tcBorders>
+            <w:tcMar>
+              <w:top w:type="dxa" w:w="60"/>
+              <w:left w:type="dxa" w:w="110"/>
+              <w:bottom w:type="dxa" w:w="60"/>
+              <w:right w:type="dxa" w:w="110"/>
+            </w:tcMar>
+          </w:tcPr>
+          <w:p>
+            <w:pPr>
+              <w:spacing w:after="0" w:line="264"/>
+            </w:pPr>
+            <w:r>
+              <w:rPr>
+                <w:rFonts w:ascii="Arial" w:cs="Arial" w:eastAsia="Arial" w:hAnsi="Arial"/>
+                <w:sz w:val="19"/>
+                <w:szCs w:val="19"/>
+              </w:rPr>
+              <w:t xml:space="preserve">@StrongPassword en el registro de auth</w:t>
+            </w:r>
+          </w:p>
+        </w:tc>
+        <w:tc>
+          <w:tcPr>
+            <w:tcW w:type="dxa" w:w="3160"/>
+            <w:tcBorders>
+              <w:top w:val="single" w:color="D1D5DB" w:sz="1"/>
+              <w:left w:val="single" w:color="D1D5DB" w:sz="1"/>
+              <w:bottom w:val="single" w:color="D1D5DB" w:sz="1"/>
+              <w:right w:val="single" w:color="D1D5DB" w:sz="1"/>
+            </w:tcBorders>
+            <w:tcMar>
+              <w:top w:type="dxa" w:w="60"/>
+              <w:left w:type="dxa" w:w="110"/>
+              <w:bottom w:type="dxa" w:w="60"/>
+              <w:right w:type="dxa" w:w="110"/>
+            </w:tcMar>
+          </w:tcPr>
+          <w:p>
+            <w:pPr>
+              <w:spacing w:after="0" w:line="264"/>
+            </w:pPr>
+            <w:r>
+              <w:rPr>
+                <w:rFonts w:ascii="Arial" w:cs="Arial" w:eastAsia="Arial" w:hAnsi="Arial"/>
+                <w:sz w:val="19"/>
+                <w:szCs w:val="19"/>
+              </w:rPr>
+              <w:t xml:space="preserve">Reglas de validación propias, reutilizables y centralizadas</w:t>
             </w:r>
           </w:p>
         </w:tc>

</xml_diff>

<commit_message>
ci: pipeline Jenkins (Jenkinsfile + compose) como alternativa a GitHub Actions
</commit_message>
<xml_diff>
--- a/BookPlus-Stack-Tecnologico.docx
+++ b/BookPlus-Stack-Tecnologico.docx
@@ -10763,6 +10763,94 @@
     </w:p>
     <w:p>
       <w:pPr>
+        <w:pStyle w:val="Heading2"/>
+      </w:pPr>
+      <w:r>
+        <w:rPr>
+          <w:rFonts w:ascii="Arial" w:cs="Arial" w:eastAsia="Arial" w:hAnsi="Arial"/>
+        </w:rPr>
+        <w:t xml:space="preserve">13.34 Jenkins (pipeline CI/CD alternativo)</w:t>
+      </w:r>
+    </w:p>
+    <w:p>
+      <w:pPr>
+        <w:spacing w:after="120" w:line="276"/>
+      </w:pPr>
+      <w:r>
+        <w:rPr>
+          <w:rFonts w:ascii="Arial" w:cs="Arial" w:eastAsia="Arial" w:hAnsi="Arial"/>
+          <w:b/>
+          <w:bCs/>
+        </w:rPr>
+        <w:t xml:space="preserve">Qué es: </w:t>
+      </w:r>
+      <w:r>
+        <w:rPr>
+          <w:rFonts w:ascii="Arial" w:cs="Arial" w:eastAsia="Arial" w:hAnsi="Arial"/>
+        </w:rPr>
+        <w:t xml:space="preserve">el CI/CD principal es GitHub Actions, pero en banca y gran empresa Jenkins sigue siendo el estándar. Se añade un Jenkinsfile que expresa el mismo pipeline en Jenkins — no reemplaza a GitHub Actions, demuestra que el flujo es portable y está como pipeline-as-code en la herramienta más extendida del sector.</w:t>
+      </w:r>
+    </w:p>
+    <w:p>
+      <w:pPr>
+        <w:spacing w:after="120" w:line="276"/>
+      </w:pPr>
+      <w:r>
+        <w:rPr>
+          <w:rFonts w:ascii="Arial" w:cs="Arial" w:eastAsia="Arial" w:hAnsi="Arial"/>
+          <w:b/>
+          <w:bCs/>
+        </w:rPr>
+        <w:t xml:space="preserve">Cómo se integra: </w:t>
+      </w:r>
+      <w:r>
+        <w:rPr>
+          <w:rFonts w:ascii="Arial" w:cs="Arial" w:eastAsia="Arial" w:hAnsi="Arial"/>
+        </w:rPr>
+        <w:t xml:space="preserve">un </w:t>
+      </w:r>
+      <w:r>
+        <w:rPr>
+          <w:rFonts w:ascii="Consolas" w:cs="Consolas" w:eastAsia="Consolas" w:hAnsi="Consolas"/>
+          <w:color w:val="4F46E5"/>
+        </w:rPr>
+        <w:t xml:space="preserve">Jenkinsfile</w:t>
+      </w:r>
+      <w:r>
+        <w:rPr>
+          <w:rFonts w:ascii="Arial" w:cs="Arial" w:eastAsia="Arial" w:hAnsi="Arial"/>
+        </w:rPr>
+        <w:t xml:space="preserve"> declarativo con etapas Checkout → Build &amp; Test (mvn en contenedor) → SonarCloud → Package → Docker build &amp; push (GHCR) → Trivy → Deploy (manual con aprobación). Se acompaña de </w:t>
+      </w:r>
+      <w:r>
+        <w:rPr>
+          <w:rFonts w:ascii="Consolas" w:cs="Consolas" w:eastAsia="Consolas" w:hAnsi="Consolas"/>
+          <w:color w:val="4F46E5"/>
+        </w:rPr>
+        <w:t xml:space="preserve">jenkins/Dockerfile</w:t>
+      </w:r>
+      <w:r>
+        <w:rPr>
+          <w:rFonts w:ascii="Arial" w:cs="Arial" w:eastAsia="Arial" w:hAnsi="Arial"/>
+        </w:rPr>
+        <w:t xml:space="preserve"> (Jenkins LTS + CLI de Docker + plugins) y </w:t>
+      </w:r>
+      <w:r>
+        <w:rPr>
+          <w:rFonts w:ascii="Consolas" w:cs="Consolas" w:eastAsia="Consolas" w:hAnsi="Consolas"/>
+          <w:color w:val="4F46E5"/>
+        </w:rPr>
+        <w:t xml:space="preserve">docker-compose.jenkins.yml</w:t>
+      </w:r>
+      <w:r>
+        <w:rPr>
+          <w:rFonts w:ascii="Arial" w:cs="Arial" w:eastAsia="Arial" w:hAnsi="Arial"/>
+        </w:rPr>
+        <w:t xml:space="preserve"> para levantarlo en local. Es configuración (se verifica ejecutando el pipeline, no con tests). Detalle en JENKINS.md.</w:t>
+      </w:r>
+    </w:p>
+    <w:p>
+      <w:pPr>
         <w:pStyle w:val="Heading1"/>
       </w:pPr>
       <w:r>
@@ -14939,7 +15027,7 @@
         <w:rPr>
           <w:rFonts w:ascii="Arial" w:cs="Arial" w:eastAsia="Arial" w:hAnsi="Arial"/>
         </w:rPr>
-        <w:t xml:space="preserve">credenciales de base de datos temporales generadas y rotadas automáticamente por Vault.</w:t>
+        <w:t xml:space="preserve">credenciales temporales generadas y rotadas por Vault.</w:t>
       </w:r>
     </w:p>
     <w:p>
@@ -14963,7 +15051,7 @@
         <w:rPr>
           <w:rFonts w:ascii="Arial" w:cs="Arial" w:eastAsia="Arial" w:hAnsi="Arial"/>
         </w:rPr>
-        <w:t xml:space="preserve">escaneo dinámico de seguridad de la aplicación en ejecución dentro del CI.</w:t>
+        <w:t xml:space="preserve">escaneo dinámico de seguridad en el CI.</w:t>
       </w:r>
     </w:p>
     <w:p>
@@ -14987,7 +15075,7 @@
         <w:rPr>
           <w:rFonts w:ascii="Arial" w:cs="Arial" w:eastAsia="Arial" w:hAnsi="Arial"/>
         </w:rPr>
-        <w:t xml:space="preserve">comunicación interna servicio-a-servicio contract-first con Protobuf (binaria y de alto rendimiento).</w:t>
+        <w:t xml:space="preserve">comunicación interna contract-first con Protobuf.</w:t>
       </w:r>
     </w:p>
     <w:p>
@@ -15011,7 +15099,7 @@
         <w:rPr>
           <w:rFonts w:ascii="Arial" w:cs="Arial" w:eastAsia="Arial" w:hAnsi="Arial"/>
         </w:rPr>
-        <w:t xml:space="preserve">una API de agregación para el frontend, como alternativa/complemento al gateway REST.</w:t>
+        <w:t xml:space="preserve">API de agregación para el frontend.</w:t>
       </w:r>
     </w:p>
     <w:p>
@@ -15035,7 +15123,7 @@
         <w:rPr>
           <w:rFonts w:ascii="Arial" w:cs="Arial" w:eastAsia="Arial" w:hAnsi="Arial"/>
         </w:rPr>
-        <w:t xml:space="preserve">con un event store (Axon / EventStoreDB) en un agregado como el pedido.</w:t>
+        <w:t xml:space="preserve">con un event store en un agregado como el pedido.</w:t>
       </w:r>
     </w:p>
     <w:p>

</xml_diff>

<commit_message>
perf(ci): push secuencial (reusa capa base) + timeout 3h para subidas lentas
</commit_message>
<xml_diff>
--- a/BookPlus-Stack-Tecnologico.docx
+++ b/BookPlus-Stack-Tecnologico.docx
@@ -11519,6 +11519,1514 @@
     </w:p>
     <w:p>
       <w:pPr>
+        <w:pStyle w:val="Heading2"/>
+      </w:pPr>
+      <w:r>
+        <w:rPr>
+          <w:rFonts w:ascii="Arial" w:cs="Arial" w:eastAsia="Arial" w:hAnsi="Arial"/>
+        </w:rPr>
+        <w:t xml:space="preserve">13.36 Gestión profesional de secretos (OIDC / GitHub App / Vault)</w:t>
+      </w:r>
+    </w:p>
+    <w:p>
+      <w:pPr>
+        <w:spacing w:after="120" w:line="276"/>
+      </w:pPr>
+      <w:r>
+        <w:rPr>
+          <w:rFonts w:ascii="Arial" w:cs="Arial" w:eastAsia="Arial" w:hAnsi="Arial"/>
+          <w:b/>
+          <w:bCs/>
+        </w:rPr>
+        <w:t xml:space="preserve">Qué es: </w:t>
+      </w:r>
+      <w:r>
+        <w:rPr>
+          <w:rFonts w:ascii="Arial" w:cs="Arial" w:eastAsia="Arial" w:hAnsi="Arial"/>
+        </w:rPr>
+        <w:t xml:space="preserve">un token personal que caduca y se renueva a mano no es como se gestionan los secretos en producción. La regla de oro es que el humano no renueva nada: la identidad de la máquina/pipeline obtiene un token de corta vida cuando lo necesita y caduca solo. El proyecto está preparado para los niveles profesionales.</w:t>
+      </w:r>
+    </w:p>
+    <w:p>
+      <w:pPr>
+        <w:pStyle w:val="ListParagraph"/>
+        <w:numPr>
+          <w:ilvl w:val="0"/>
+          <w:numId w:val="2"/>
+        </w:numPr>
+        <w:spacing w:after="80" w:line="268"/>
+      </w:pPr>
+      <w:r>
+        <w:rPr>
+          <w:rFonts w:ascii="Arial" w:cs="Arial" w:eastAsia="Arial" w:hAnsi="Arial"/>
+          <w:b/>
+          <w:bCs/>
+        </w:rPr>
+        <w:t xml:space="preserve">OIDC / token automático: </w:t>
+      </w:r>
+      <w:r>
+        <w:rPr>
+          <w:rFonts w:ascii="Arial" w:cs="Arial" w:eastAsia="Arial" w:hAnsi="Arial"/>
+        </w:rPr>
+        <w:t xml:space="preserve">GitHub Actions publica imágenes a GHCR con el </w:t>
+      </w:r>
+      <w:r>
+        <w:rPr>
+          <w:rFonts w:ascii="Consolas" w:cs="Consolas" w:eastAsia="Consolas" w:hAnsi="Consolas"/>
+          <w:color w:val="4F46E5"/>
+        </w:rPr>
+        <w:t xml:space="preserve">GITHUB_TOKEN</w:t>
+      </w:r>
+      <w:r>
+        <w:rPr>
+          <w:rFonts w:ascii="Arial" w:cs="Arial" w:eastAsia="Arial" w:hAnsi="Arial"/>
+        </w:rPr>
+        <w:t xml:space="preserve"> efímero (por eso no hay ningún token de GHCR en los secrets); para la nube se usa OIDC federation, sin secretos guardados.</w:t>
+      </w:r>
+    </w:p>
+    <w:p>
+      <w:pPr>
+        <w:pStyle w:val="ListParagraph"/>
+        <w:numPr>
+          <w:ilvl w:val="0"/>
+          <w:numId w:val="2"/>
+        </w:numPr>
+        <w:spacing w:after="80" w:line="268"/>
+      </w:pPr>
+      <w:r>
+        <w:rPr>
+          <w:rFonts w:ascii="Arial" w:cs="Arial" w:eastAsia="Arial" w:hAnsi="Arial"/>
+          <w:b/>
+          <w:bCs/>
+        </w:rPr>
+        <w:t xml:space="preserve">GitHub App (Jenkins): </w:t>
+      </w:r>
+      <w:r>
+        <w:rPr>
+          <w:rFonts w:ascii="Arial" w:cs="Arial" w:eastAsia="Arial" w:hAnsi="Arial"/>
+        </w:rPr>
+        <w:t xml:space="preserve">en vez de un PAT personal, una GitHub App (identidad de máquina) con permiso packages:write; Jenkins acuña tokens de instalación de 1 hora automáticamente. El pipeline está parametrizado (</w:t>
+      </w:r>
+      <w:r>
+        <w:rPr>
+          <w:rFonts w:ascii="Consolas" w:cs="Consolas" w:eastAsia="Consolas" w:hAnsi="Consolas"/>
+          <w:color w:val="4F46E5"/>
+        </w:rPr>
+        <w:t xml:space="preserve">ghcrCredentialsId</w:t>
+      </w:r>
+      <w:r>
+        <w:rPr>
+          <w:rFonts w:ascii="Arial" w:cs="Arial" w:eastAsia="Arial" w:hAnsi="Arial"/>
+        </w:rPr>
+        <w:t xml:space="preserve">), así que cambiar de PAT a App es una línea: </w:t>
+      </w:r>
+      <w:r>
+        <w:rPr>
+          <w:rFonts w:ascii="Consolas" w:cs="Consolas" w:eastAsia="Consolas" w:hAnsi="Consolas"/>
+          <w:color w:val="4F46E5"/>
+        </w:rPr>
+        <w:t xml:space="preserve">bookplusPipeline(ghcrCredentialsId: 'github-app')</w:t>
+      </w:r>
+      <w:r>
+        <w:rPr>
+          <w:rFonts w:ascii="Arial" w:cs="Arial" w:eastAsia="Arial" w:hAnsi="Arial"/>
+        </w:rPr>
+        <w:t xml:space="preserve">.</w:t>
+      </w:r>
+    </w:p>
+    <w:p>
+      <w:pPr>
+        <w:pStyle w:val="ListParagraph"/>
+        <w:numPr>
+          <w:ilvl w:val="0"/>
+          <w:numId w:val="2"/>
+        </w:numPr>
+        <w:spacing w:after="80" w:line="268"/>
+      </w:pPr>
+      <w:r>
+        <w:rPr>
+          <w:rFonts w:ascii="Arial" w:cs="Arial" w:eastAsia="Arial" w:hAnsi="Arial"/>
+          <w:b/>
+          <w:bCs/>
+        </w:rPr>
+        <w:t xml:space="preserve">Vault (runtime): </w:t>
+      </w:r>
+      <w:r>
+        <w:rPr>
+          <w:rFonts w:ascii="Arial" w:cs="Arial" w:eastAsia="Arial" w:hAnsi="Arial"/>
+        </w:rPr>
+        <w:t xml:space="preserve">para secretos que no son de GitHub (BD, APIs), HashiCorp Vault emite credenciales dinámicas de corta vida y las rota solo; Jenkins las pide con </w:t>
+      </w:r>
+      <w:r>
+        <w:rPr>
+          <w:rFonts w:ascii="Consolas" w:cs="Consolas" w:eastAsia="Consolas" w:hAnsi="Consolas"/>
+          <w:color w:val="4F46E5"/>
+        </w:rPr>
+        <w:t xml:space="preserve">withVault</w:t>
+      </w:r>
+      <w:r>
+        <w:rPr>
+          <w:rFonts w:ascii="Arial" w:cs="Arial" w:eastAsia="Arial" w:hAnsi="Arial"/>
+        </w:rPr>
+        <w:t xml:space="preserve">.</w:t>
+      </w:r>
+    </w:p>
+    <w:p>
+      <w:pPr>
+        <w:spacing w:after="120" w:line="276"/>
+      </w:pPr>
+      <w:r>
+        <w:rPr>
+          <w:rFonts w:ascii="Arial" w:cs="Arial" w:eastAsia="Arial" w:hAnsi="Arial"/>
+          <w:b/>
+          <w:bCs/>
+        </w:rPr>
+        <w:t xml:space="preserve">Cómo se integra: </w:t>
+      </w:r>
+      <w:r>
+        <w:rPr>
+          <w:rFonts w:ascii="Arial" w:cs="Arial" w:eastAsia="Arial" w:hAnsi="Arial"/>
+        </w:rPr>
+        <w:t xml:space="preserve">se añade el plugin </w:t>
+      </w:r>
+      <w:r>
+        <w:rPr>
+          <w:rFonts w:ascii="Consolas" w:cs="Consolas" w:eastAsia="Consolas" w:hAnsi="Consolas"/>
+          <w:color w:val="4F46E5"/>
+        </w:rPr>
+        <w:t xml:space="preserve">github-branch-source</w:t>
+      </w:r>
+      <w:r>
+        <w:rPr>
+          <w:rFonts w:ascii="Arial" w:cs="Arial" w:eastAsia="Arial" w:hAnsi="Arial"/>
+        </w:rPr>
+        <w:t xml:space="preserve"> (tipo de credencial GitHub App), un bloque </w:t>
+      </w:r>
+      <w:r>
+        <w:rPr>
+          <w:rFonts w:ascii="Consolas" w:cs="Consolas" w:eastAsia="Consolas" w:hAnsi="Consolas"/>
+          <w:color w:val="4F46E5"/>
+        </w:rPr>
+        <w:t xml:space="preserve">gitHubApp</w:t>
+      </w:r>
+      <w:r>
+        <w:rPr>
+          <w:rFonts w:ascii="Arial" w:cs="Arial" w:eastAsia="Arial" w:hAnsi="Arial"/>
+        </w:rPr>
+        <w:t xml:space="preserve"> listo en el JCasC y las variables </w:t>
+      </w:r>
+      <w:r>
+        <w:rPr>
+          <w:rFonts w:ascii="Consolas" w:cs="Consolas" w:eastAsia="Consolas" w:hAnsi="Consolas"/>
+          <w:color w:val="4F46E5"/>
+        </w:rPr>
+        <w:t xml:space="preserve">GITHUB_APP_ID</w:t>
+      </w:r>
+      <w:r>
+        <w:rPr>
+          <w:rFonts w:ascii="Arial" w:cs="Arial" w:eastAsia="Arial" w:hAnsi="Arial"/>
+        </w:rPr>
+        <w:t xml:space="preserve">/clave privada en el entorno. El PAT del .env queda solo como nivel mínimo para arrancar en local. Guía completa en SECRETS-MANAGEMENT.md.</w:t>
+      </w:r>
+    </w:p>
+    <w:p>
+      <w:pPr>
+        <w:pStyle w:val="Heading2"/>
+      </w:pPr>
+      <w:r>
+        <w:rPr>
+          <w:rFonts w:ascii="Arial" w:cs="Arial" w:eastAsia="Arial" w:hAnsi="Arial"/>
+        </w:rPr>
+        <w:t xml:space="preserve">13.37 CI/CD doble: GitHub Actions y Jenkins en paralelo</w:t>
+      </w:r>
+    </w:p>
+    <w:p>
+      <w:pPr>
+        <w:spacing w:after="120" w:line="276"/>
+      </w:pPr>
+      <w:r>
+        <w:rPr>
+          <w:rFonts w:ascii="Arial" w:cs="Arial" w:eastAsia="Arial" w:hAnsi="Arial"/>
+          <w:b/>
+          <w:bCs/>
+        </w:rPr>
+        <w:t xml:space="preserve">Qué es: </w:t>
+      </w:r>
+      <w:r>
+        <w:rPr>
+          <w:rFonts w:ascii="Arial" w:cs="Arial" w:eastAsia="Arial" w:hAnsi="Arial"/>
+        </w:rPr>
+        <w:t xml:space="preserve">el proyecto corre DOS sistemas de CI/CD sobre el mismo repositorio, como hacen muchas empresas (banca sobre todo) que mantienen Jenkins on-premise mientras adoptan GitHub Actions. GitHub Actions corre en la nube de GitHub en cada push/PR; Jenkins corre en un servidor propio y descubre los cambios escaneando el repo (multibranch) o, en producción, por webhook. Ambos ejecutan el MISMO pipeline (build, test, SonarCloud + Quality Gate, imágenes a GHCR, Trivy, deploy): son intercambiables a propósito, como demostración de dominio de las dos herramientas líderes.</w:t>
+      </w:r>
+    </w:p>
+    <w:p>
+      <w:pPr>
+        <w:pStyle w:val="ListParagraph"/>
+        <w:numPr>
+          <w:ilvl w:val="0"/>
+          <w:numId w:val="2"/>
+        </w:numPr>
+        <w:spacing w:after="80" w:line="268"/>
+      </w:pPr>
+      <w:r>
+        <w:rPr>
+          <w:rFonts w:ascii="Arial" w:cs="Arial" w:eastAsia="Arial" w:hAnsi="Arial"/>
+          <w:b/>
+          <w:bCs/>
+        </w:rPr>
+        <w:t xml:space="preserve">Autenticación sin rotación manual: </w:t>
+      </w:r>
+      <w:r>
+        <w:rPr>
+          <w:rFonts w:ascii="Arial" w:cs="Arial" w:eastAsia="Arial" w:hAnsi="Arial"/>
+        </w:rPr>
+        <w:t xml:space="preserve">Jenkins publica a GHCR con la </w:t>
+      </w:r>
+      <w:r>
+        <w:rPr>
+          <w:rFonts w:ascii="Consolas" w:cs="Consolas" w:eastAsia="Consolas" w:hAnsi="Consolas"/>
+          <w:color w:val="4F46E5"/>
+        </w:rPr>
+        <w:t xml:space="preserve">GitHub App</w:t>
+      </w:r>
+      <w:r>
+        <w:rPr>
+          <w:rFonts w:ascii="Arial" w:cs="Arial" w:eastAsia="Arial" w:hAnsi="Arial"/>
+        </w:rPr>
+        <w:t xml:space="preserve"> (tokens efímeros de 1 h) y GitHub Actions con su </w:t>
+      </w:r>
+      <w:r>
+        <w:rPr>
+          <w:rFonts w:ascii="Consolas" w:cs="Consolas" w:eastAsia="Consolas" w:hAnsi="Consolas"/>
+          <w:color w:val="4F46E5"/>
+        </w:rPr>
+        <w:t xml:space="preserve">GITHUB_TOKEN</w:t>
+      </w:r>
+      <w:r>
+        <w:rPr>
+          <w:rFonts w:ascii="Arial" w:cs="Arial" w:eastAsia="Arial" w:hAnsi="Arial"/>
+        </w:rPr>
+        <w:t xml:space="preserve"> automático; ningún humano rota tokens.</w:t>
+      </w:r>
+    </w:p>
+    <w:p>
+      <w:pPr>
+        <w:pStyle w:val="ListParagraph"/>
+        <w:numPr>
+          <w:ilvl w:val="0"/>
+          <w:numId w:val="2"/>
+        </w:numPr>
+        <w:spacing w:after="80" w:line="268"/>
+      </w:pPr>
+      <w:r>
+        <w:rPr>
+          <w:rFonts w:ascii="Arial" w:cs="Arial" w:eastAsia="Arial" w:hAnsi="Arial"/>
+          <w:b/>
+          <w:bCs/>
+        </w:rPr>
+        <w:t xml:space="preserve">Arranque a prueba de fallos: </w:t>
+      </w:r>
+      <w:r>
+        <w:rPr>
+          <w:rFonts w:ascii="Arial" w:cs="Arial" w:eastAsia="Arial" w:hAnsi="Arial"/>
+        </w:rPr>
+        <w:t xml:space="preserve">la credencial GitHub App del JCasC es boot-safe — </w:t>
+      </w:r>
+      <w:r>
+        <w:rPr>
+          <w:rFonts w:ascii="Consolas" w:cs="Consolas" w:eastAsia="Consolas" w:hAnsi="Consolas"/>
+          <w:color w:val="4F46E5"/>
+        </w:rPr>
+        <w:t xml:space="preserve">appID</w:t>
+      </w:r>
+      <w:r>
+        <w:rPr>
+          <w:rFonts w:ascii="Arial" w:cs="Arial" w:eastAsia="Arial" w:hAnsi="Arial"/>
+        </w:rPr>
+        <w:t xml:space="preserve"> y clave tienen valor por defecto y la key se monta como archivo con fallback a un dummy (</w:t>
+      </w:r>
+      <w:r>
+        <w:rPr>
+          <w:rFonts w:ascii="Consolas" w:cs="Consolas" w:eastAsia="Consolas" w:hAnsi="Consolas"/>
+          <w:color w:val="4F46E5"/>
+        </w:rPr>
+        <w:t xml:space="preserve">github-app.pem.example</w:t>
+      </w:r>
+      <w:r>
+        <w:rPr>
+          <w:rFonts w:ascii="Arial" w:cs="Arial" w:eastAsia="Arial" w:hAnsi="Arial"/>
+        </w:rPr>
+        <w:t xml:space="preserve">, PKCS#8 válido). Jenkins arranca aunque la App aún no exista; al rellenar </w:t>
+      </w:r>
+      <w:r>
+        <w:rPr>
+          <w:rFonts w:ascii="Consolas" w:cs="Consolas" w:eastAsia="Consolas" w:hAnsi="Consolas"/>
+          <w:color w:val="4F46E5"/>
+        </w:rPr>
+        <w:t xml:space="preserve">GITHUB_APP_ID</w:t>
+      </w:r>
+      <w:r>
+        <w:rPr>
+          <w:rFonts w:ascii="Arial" w:cs="Arial" w:eastAsia="Arial" w:hAnsi="Arial"/>
+        </w:rPr>
+        <w:t xml:space="preserve"> y </w:t>
+      </w:r>
+      <w:r>
+        <w:rPr>
+          <w:rFonts w:ascii="Consolas" w:cs="Consolas" w:eastAsia="Consolas" w:hAnsi="Consolas"/>
+          <w:color w:val="4F46E5"/>
+        </w:rPr>
+        <w:t xml:space="preserve">GITHUB_APP_KEY_FILE</w:t>
+      </w:r>
+      <w:r>
+        <w:rPr>
+          <w:rFonts w:ascii="Arial" w:cs="Arial" w:eastAsia="Arial" w:hAnsi="Arial"/>
+        </w:rPr>
+        <w:t xml:space="preserve"> en el .env (ruta al .pem real, fuera del repo) pasa a acuñar tokens reales.</w:t>
+      </w:r>
+    </w:p>
+    <w:p>
+      <w:pPr>
+        <w:pStyle w:val="ListParagraph"/>
+        <w:numPr>
+          <w:ilvl w:val="0"/>
+          <w:numId w:val="2"/>
+        </w:numPr>
+        <w:spacing w:after="80" w:line="268"/>
+      </w:pPr>
+      <w:r>
+        <w:rPr>
+          <w:rFonts w:ascii="Arial" w:cs="Arial" w:eastAsia="Arial" w:hAnsi="Arial"/>
+          <w:b/>
+          <w:bCs/>
+        </w:rPr>
+        <w:t xml:space="preserve">De local a producción: </w:t>
+      </w:r>
+      <w:r>
+        <w:rPr>
+          <w:rFonts w:ascii="Arial" w:cs="Arial" w:eastAsia="Arial" w:hAnsi="Arial"/>
+        </w:rPr>
+        <w:t xml:space="preserve">ahora Jenkins corre local con escaneo periódico (no expone nada); en producción basta un webhook (</w:t>
+      </w:r>
+      <w:r>
+        <w:rPr>
+          <w:rFonts w:ascii="Consolas" w:cs="Consolas" w:eastAsia="Consolas" w:hAnsi="Consolas"/>
+          <w:color w:val="4F46E5"/>
+        </w:rPr>
+        <w:t xml:space="preserve">/github-webhook/</w:t>
+      </w:r>
+      <w:r>
+        <w:rPr>
+          <w:rFonts w:ascii="Arial" w:cs="Arial" w:eastAsia="Arial" w:hAnsi="Arial"/>
+        </w:rPr>
+        <w:t xml:space="preserve">) para builds instantáneos y cambiar la fuente </w:t>
+      </w:r>
+      <w:r>
+        <w:rPr>
+          <w:rFonts w:ascii="Consolas" w:cs="Consolas" w:eastAsia="Consolas" w:hAnsi="Consolas"/>
+          <w:color w:val="4F46E5"/>
+        </w:rPr>
+        <w:t xml:space="preserve">git{}</w:t>
+      </w:r>
+      <w:r>
+        <w:rPr>
+          <w:rFonts w:ascii="Arial" w:cs="Arial" w:eastAsia="Arial" w:hAnsi="Arial"/>
+        </w:rPr>
+        <w:t xml:space="preserve"> por </w:t>
+      </w:r>
+      <w:r>
+        <w:rPr>
+          <w:rFonts w:ascii="Consolas" w:cs="Consolas" w:eastAsia="Consolas" w:hAnsi="Consolas"/>
+          <w:color w:val="4F46E5"/>
+        </w:rPr>
+        <w:t xml:space="preserve">github{}</w:t>
+      </w:r>
+      <w:r>
+        <w:rPr>
+          <w:rFonts w:ascii="Arial" w:cs="Arial" w:eastAsia="Arial" w:hAnsi="Arial"/>
+        </w:rPr>
+        <w:t xml:space="preserve"> para descubrir Pull Requests, usando la misma credencial GitHub App.</w:t>
+      </w:r>
+    </w:p>
+    <w:p>
+      <w:pPr>
+        <w:spacing w:after="120" w:line="276"/>
+      </w:pPr>
+      <w:r>
+        <w:rPr>
+          <w:rFonts w:ascii="Arial" w:cs="Arial" w:eastAsia="Arial" w:hAnsi="Arial"/>
+          <w:b/>
+          <w:bCs/>
+        </w:rPr>
+        <w:t xml:space="preserve">Verificación: </w:t>
+      </w:r>
+      <w:r>
+        <w:rPr>
+          <w:rFonts w:ascii="Arial" w:cs="Arial" w:eastAsia="Arial" w:hAnsi="Arial"/>
+        </w:rPr>
+        <w:t xml:space="preserve">es infraestructura (sin unit test). Estáticamente se valida que el JCasC y el compose parsean, que la key dummy es PKCS#8 válida y que el .pem real queda fuera de git (</w:t>
+      </w:r>
+      <w:r>
+        <w:rPr>
+          <w:rFonts w:ascii="Consolas" w:cs="Consolas" w:eastAsia="Consolas" w:hAnsi="Consolas"/>
+          <w:color w:val="4F46E5"/>
+        </w:rPr>
+        <w:t xml:space="preserve">*.pem</w:t>
+      </w:r>
+      <w:r>
+        <w:rPr>
+          <w:rFonts w:ascii="Arial" w:cs="Arial" w:eastAsia="Arial" w:hAnsi="Arial"/>
+        </w:rPr>
+        <w:t xml:space="preserve"> en .gitignore). El extremo a extremo se verifica con el runbook DUAL-CICD-SETUP.md: GitHub Actions verde en su pestaña y Jenkins arrancando sin asistente con el job </w:t>
+      </w:r>
+      <w:r>
+        <w:rPr>
+          <w:rFonts w:ascii="Consolas" w:cs="Consolas" w:eastAsia="Consolas" w:hAnsi="Consolas"/>
+          <w:color w:val="4F46E5"/>
+        </w:rPr>
+        <w:t xml:space="preserve">bookplus</w:t>
+      </w:r>
+      <w:r>
+        <w:rPr>
+          <w:rFonts w:ascii="Arial" w:cs="Arial" w:eastAsia="Arial" w:hAnsi="Arial"/>
+        </w:rPr>
+        <w:t xml:space="preserve"> escaneando el repo.</w:t>
+      </w:r>
+    </w:p>
+    <w:p>
+      <w:pPr>
+        <w:spacing w:after="60" w:before="120"/>
+        <w:jc w:val="center"/>
+      </w:pPr>
+      <w:r>
+        <w:drawing>
+          <wp:inline distT="0" distB="0" distL="0" distR="0">
+            <wp:extent cx="5943600" cy="2857500"/>
+            <wp:effectExtent t="0" r="0" b="0" l="0"/>
+            <wp:docPr id="1" name="" descr="" title=""/>
+            <wp:cNvGraphicFramePr>
+              <a:graphicFrameLocks xmlns:a="http://schemas.openxmlformats.org/drawingml/2006/main" noChangeAspect="1"/>
+            </wp:cNvGraphicFramePr>
+            <a:graphic xmlns:a="http://schemas.openxmlformats.org/drawingml/2006/main">
+              <a:graphicData uri="http://schemas.openxmlformats.org/drawingml/2006/picture">
+                <pic:pic xmlns:pic="http://schemas.openxmlformats.org/drawingml/2006/picture">
+                  <pic:nvPicPr>
+                    <pic:cNvPr id="0" name="" descr=""/>
+                    <pic:cNvPicPr>
+                      <a:picLocks noChangeAspect="1" noChangeArrowheads="1"/>
+                    </pic:cNvPicPr>
+                  </pic:nvPicPr>
+                  <pic:blipFill>
+                    <a:blip r:embed="rId8" cstate="none"/>
+                    <a:srcRect/>
+                    <a:stretch>
+                      <a:fillRect/>
+                    </a:stretch>
+                  </pic:blipFill>
+                  <pic:spPr bwMode="auto">
+                    <a:xfrm>
+                      <a:off x="0" y="0"/>
+                      <a:ext cx="5943600" cy="2857500"/>
+                    </a:xfrm>
+                    <a:prstGeom prst="rect">
+                      <a:avLst/>
+                    </a:prstGeom>
+                  </pic:spPr>
+                </pic:pic>
+              </a:graphicData>
+            </a:graphic>
+          </wp:inline>
+        </w:drawing>
+      </w:r>
+    </w:p>
+    <w:p>
+      <w:pPr>
+        <w:spacing w:after="160"/>
+      </w:pPr>
+      <w:r>
+        <w:rPr>
+          <w:rFonts w:ascii="Arial" w:cs="Arial" w:eastAsia="Arial" w:hAnsi="Arial"/>
+          <w:i/>
+          <w:iCs/>
+          <w:color w:val="6B7280"/>
+          <w:sz w:val="18"/>
+          <w:szCs w:val="18"/>
+        </w:rPr>
+        <w:t xml:space="preserve">Figura: arquitectura CI/CD doble. GitHub Actions (nube) y Jenkins (local) leen el mismo repo y ejecutan el mismo pipeline; Jenkins carga la lógica desde la Shared Library y se autentica con la GitHub App.</w:t>
+      </w:r>
+    </w:p>
+    <w:p>
+      <w:pPr>
+        <w:pStyle w:val="Heading3"/>
+      </w:pPr>
+      <w:r>
+        <w:rPr>
+          <w:rFonts w:ascii="Arial" w:cs="Arial" w:eastAsia="Arial" w:hAnsi="Arial"/>
+        </w:rPr>
+        <w:t xml:space="preserve">Estado actual verificado (build #4 en Jenkins local)</w:t>
+      </w:r>
+    </w:p>
+    <w:p>
+      <w:pPr>
+        <w:pStyle w:val="ListParagraph"/>
+        <w:numPr>
+          <w:ilvl w:val="0"/>
+          <w:numId w:val="2"/>
+        </w:numPr>
+        <w:spacing w:after="80" w:line="268"/>
+      </w:pPr>
+      <w:r>
+        <w:rPr>
+          <w:rFonts w:ascii="Arial" w:cs="Arial" w:eastAsia="Arial" w:hAnsi="Arial"/>
+          <w:b/>
+          <w:bCs/>
+        </w:rPr>
+        <w:t xml:space="preserve">Verde de punta a punta hasta Package: </w:t>
+      </w:r>
+      <w:r>
+        <w:rPr>
+          <w:rFonts w:ascii="Arial" w:cs="Arial" w:eastAsia="Arial" w:hAnsi="Arial"/>
+        </w:rPr>
+        <w:t xml:space="preserve">Checkout → Build &amp; Test (9 microservicios compilados y testeados en paralelo dentro de </w:t>
+      </w:r>
+      <w:r>
+        <w:rPr>
+          <w:rFonts w:ascii="Consolas" w:cs="Consolas" w:eastAsia="Consolas" w:hAnsi="Consolas"/>
+          <w:color w:val="4F46E5"/>
+        </w:rPr>
+        <w:t xml:space="preserve">maven:3.9-eclipse-temurin-21</w:t>
+      </w:r>
+      <w:r>
+        <w:rPr>
+          <w:rFonts w:ascii="Arial" w:cs="Arial" w:eastAsia="Arial" w:hAnsi="Arial"/>
+        </w:rPr>
+        <w:t xml:space="preserve">) → SonarCloud (análisis subido) → Package (9 JAR). Jenkins arranca por JCasC sin asistente y la GitHub App carga sin romper el arranque.</w:t>
+      </w:r>
+    </w:p>
+    <w:p>
+      <w:pPr>
+        <w:pStyle w:val="ListParagraph"/>
+        <w:numPr>
+          <w:ilvl w:val="0"/>
+          <w:numId w:val="2"/>
+        </w:numPr>
+        <w:spacing w:after="80" w:line="268"/>
+      </w:pPr>
+      <w:r>
+        <w:rPr>
+          <w:rFonts w:ascii="Arial" w:cs="Arial" w:eastAsia="Arial" w:hAnsi="Arial"/>
+          <w:b/>
+          <w:bCs/>
+        </w:rPr>
+        <w:t xml:space="preserve">Ajustes que hicieron falta (todos resueltos): </w:t>
+      </w:r>
+      <w:r>
+        <w:rPr>
+          <w:rFonts w:ascii="Arial" w:cs="Arial" w:eastAsia="Arial" w:hAnsi="Arial"/>
+        </w:rPr>
+        <w:t xml:space="preserve">se añadió el plugin </w:t>
+      </w:r>
+      <w:r>
+        <w:rPr>
+          <w:rFonts w:ascii="Consolas" w:cs="Consolas" w:eastAsia="Consolas" w:hAnsi="Consolas"/>
+          <w:color w:val="4F46E5"/>
+        </w:rPr>
+        <w:t xml:space="preserve">timestamper</w:t>
+      </w:r>
+      <w:r>
+        <w:rPr>
+          <w:rFonts w:ascii="Arial" w:cs="Arial" w:eastAsia="Arial" w:hAnsi="Arial"/>
+        </w:rPr>
+        <w:t xml:space="preserve"> (faltaba para </w:t>
+      </w:r>
+      <w:r>
+        <w:rPr>
+          <w:rFonts w:ascii="Consolas" w:cs="Consolas" w:eastAsia="Consolas" w:hAnsi="Consolas"/>
+          <w:color w:val="4F46E5"/>
+        </w:rPr>
+        <w:t xml:space="preserve">options{timestamps()}</w:t>
+      </w:r>
+      <w:r>
+        <w:rPr>
+          <w:rFonts w:ascii="Arial" w:cs="Arial" w:eastAsia="Arial" w:hAnsi="Arial"/>
+        </w:rPr>
+        <w:t xml:space="preserve">); se pasó </w:t>
+      </w:r>
+      <w:r>
+        <w:rPr>
+          <w:rFonts w:ascii="Consolas" w:cs="Consolas" w:eastAsia="Consolas" w:hAnsi="Consolas"/>
+          <w:color w:val="4F46E5"/>
+        </w:rPr>
+        <w:t xml:space="preserve">-Dsonar.organization=dhuarocc</w:t>
+      </w:r>
+      <w:r>
+        <w:rPr>
+          <w:rFonts w:ascii="Arial" w:cs="Arial" w:eastAsia="Arial" w:hAnsi="Arial"/>
+        </w:rPr>
+        <w:t xml:space="preserve"> (obligatorio en SonarCloud); y el Quality Gate se hizo opcional (</w:t>
+      </w:r>
+      <w:r>
+        <w:rPr>
+          <w:rFonts w:ascii="Consolas" w:cs="Consolas" w:eastAsia="Consolas" w:hAnsi="Consolas"/>
+          <w:color w:val="4F46E5"/>
+        </w:rPr>
+        <w:t xml:space="preserve">waitForQualityGate</w:t>
+      </w:r>
+      <w:r>
+        <w:rPr>
+          <w:rFonts w:ascii="Arial" w:cs="Arial" w:eastAsia="Arial" w:hAnsi="Arial"/>
+        </w:rPr>
+        <w:t xml:space="preserve"> por defecto omitido en local, porque su webhook necesita un Jenkins con URL pública).</w:t>
+      </w:r>
+    </w:p>
+    <w:p>
+      <w:pPr>
+        <w:pStyle w:val="ListParagraph"/>
+        <w:numPr>
+          <w:ilvl w:val="0"/>
+          <w:numId w:val="2"/>
+        </w:numPr>
+        <w:spacing w:after="80" w:line="268"/>
+      </w:pPr>
+      <w:r>
+        <w:rPr>
+          <w:rFonts w:ascii="Arial" w:cs="Arial" w:eastAsia="Arial" w:hAnsi="Arial"/>
+          <w:b/>
+          <w:bCs/>
+        </w:rPr>
+        <w:t xml:space="preserve">Pendiente — push de imágenes a GHCR: </w:t>
+      </w:r>
+      <w:r>
+        <w:rPr>
+          <w:rFonts w:ascii="Arial" w:cs="Arial" w:eastAsia="Arial" w:hAnsi="Arial"/>
+        </w:rPr>
+        <w:t xml:space="preserve">la etapa Build &amp; Push falla con </w:t>
+      </w:r>
+      <w:r>
+        <w:rPr>
+          <w:rFonts w:ascii="Consolas" w:cs="Consolas" w:eastAsia="Consolas" w:hAnsi="Consolas"/>
+          <w:color w:val="4F46E5"/>
+        </w:rPr>
+        <w:t xml:space="preserve">denied: denied</w:t>
+      </w:r>
+      <w:r>
+        <w:rPr>
+          <w:rFonts w:ascii="Arial" w:cs="Arial" w:eastAsia="Arial" w:hAnsi="Arial"/>
+        </w:rPr>
+        <w:t xml:space="preserve"> al hacer </w:t>
+      </w:r>
+      <w:r>
+        <w:rPr>
+          <w:rFonts w:ascii="Consolas" w:cs="Consolas" w:eastAsia="Consolas" w:hAnsi="Consolas"/>
+          <w:color w:val="4F46E5"/>
+        </w:rPr>
+        <w:t xml:space="preserve">docker login ghcr.io</w:t>
+      </w:r>
+      <w:r>
+        <w:rPr>
+          <w:rFonts w:ascii="Arial" w:cs="Arial" w:eastAsia="Arial" w:hAnsi="Arial"/>
+        </w:rPr>
+        <w:t xml:space="preserve"> con el token de la App. No es un bug de configuración: GitHub restringe los tokens de GitHub App para publicar en el namespace de una </w:t>
+      </w:r>
+      <w:r>
+        <w:rPr>
+          <w:rFonts w:ascii="Arial" w:cs="Arial" w:eastAsia="Arial" w:hAnsi="Arial"/>
+          <w:b/>
+          <w:bCs/>
+        </w:rPr>
+        <w:t xml:space="preserve">cuenta personal</w:t>
+      </w:r>
+      <w:r>
+        <w:rPr>
+          <w:rFonts w:ascii="Arial" w:cs="Arial" w:eastAsia="Arial" w:hAnsi="Arial"/>
+        </w:rPr>
+        <w:t xml:space="preserve">. La solución profesional (siguiente sesión) es mover el repo a una </w:t>
+      </w:r>
+      <w:r>
+        <w:rPr>
+          <w:rFonts w:ascii="Arial" w:cs="Arial" w:eastAsia="Arial" w:hAnsi="Arial"/>
+          <w:b/>
+          <w:bCs/>
+        </w:rPr>
+        <w:t xml:space="preserve">Organización</w:t>
+      </w:r>
+      <w:r>
+        <w:rPr>
+          <w:rFonts w:ascii="Arial" w:cs="Arial" w:eastAsia="Arial" w:hAnsi="Arial"/>
+        </w:rPr>
+        <w:t xml:space="preserve"> de GitHub, donde la App publica a </w:t>
+      </w:r>
+      <w:r>
+        <w:rPr>
+          <w:rFonts w:ascii="Consolas" w:cs="Consolas" w:eastAsia="Consolas" w:hAnsi="Consolas"/>
+          <w:color w:val="4F46E5"/>
+        </w:rPr>
+        <w:t xml:space="preserve">ghcr.io/&lt;org&gt;</w:t>
+      </w:r>
+      <w:r>
+        <w:rPr>
+          <w:rFonts w:ascii="Arial" w:cs="Arial" w:eastAsia="Arial" w:hAnsi="Arial"/>
+        </w:rPr>
+        <w:t xml:space="preserve"> sin PAT — el patrón real de empresa.</w:t>
+      </w:r>
+    </w:p>
+    <w:p>
+      <w:pPr>
+        <w:pStyle w:val="Heading3"/>
+      </w:pPr>
+      <w:r>
+        <w:rPr>
+          <w:rFonts w:ascii="Arial" w:cs="Arial" w:eastAsia="Arial" w:hAnsi="Arial"/>
+        </w:rPr>
+        <w:t xml:space="preserve">Mapa de cambios: dónde se tocó cada cosa</w:t>
+      </w:r>
+    </w:p>
+    <w:tbl>
+      <w:tblPr>
+        <w:tblW w:type="dxa" w:w="9360"/>
+        <w:tblBorders>
+          <w:top w:val="single" w:color="auto" w:sz="4"/>
+          <w:left w:val="single" w:color="auto" w:sz="4"/>
+          <w:bottom w:val="single" w:color="auto" w:sz="4"/>
+          <w:right w:val="single" w:color="auto" w:sz="4"/>
+          <w:insideH w:val="single" w:color="auto" w:sz="4"/>
+          <w:insideV w:val="single" w:color="auto" w:sz="4"/>
+        </w:tblBorders>
+      </w:tblPr>
+      <w:tblGrid>
+        <w:gridCol w:w="4320"/>
+        <w:gridCol w:w="5040"/>
+      </w:tblGrid>
+      <w:tr>
+        <w:trPr>
+          <w:tblHeader/>
+        </w:trPr>
+        <w:tc>
+          <w:tcPr>
+            <w:tcW w:type="dxa" w:w="4320"/>
+            <w:tcBorders>
+              <w:top w:val="single" w:color="D1D5DB" w:sz="1"/>
+              <w:left w:val="single" w:color="D1D5DB" w:sz="1"/>
+              <w:bottom w:val="single" w:color="D1D5DB" w:sz="1"/>
+              <w:right w:val="single" w:color="D1D5DB" w:sz="1"/>
+            </w:tcBorders>
+            <w:shd w:fill="EEF2FF" w:val="clear"/>
+            <w:tcMar>
+              <w:top w:type="dxa" w:w="60"/>
+              <w:left w:type="dxa" w:w="110"/>
+              <w:bottom w:type="dxa" w:w="60"/>
+              <w:right w:type="dxa" w:w="110"/>
+            </w:tcMar>
+          </w:tcPr>
+          <w:p>
+            <w:pPr>
+              <w:spacing w:after="0" w:line="264"/>
+            </w:pPr>
+            <w:r>
+              <w:rPr>
+                <w:rFonts w:ascii="Arial" w:cs="Arial" w:eastAsia="Arial" w:hAnsi="Arial"/>
+                <w:b/>
+                <w:bCs/>
+                <w:sz w:val="19"/>
+                <w:szCs w:val="19"/>
+              </w:rPr>
+              <w:t xml:space="preserve">Archivo / ubicación</w:t>
+            </w:r>
+          </w:p>
+        </w:tc>
+        <w:tc>
+          <w:tcPr>
+            <w:tcW w:type="dxa" w:w="5040"/>
+            <w:tcBorders>
+              <w:top w:val="single" w:color="D1D5DB" w:sz="1"/>
+              <w:left w:val="single" w:color="D1D5DB" w:sz="1"/>
+              <w:bottom w:val="single" w:color="D1D5DB" w:sz="1"/>
+              <w:right w:val="single" w:color="D1D5DB" w:sz="1"/>
+            </w:tcBorders>
+            <w:shd w:fill="EEF2FF" w:val="clear"/>
+            <w:tcMar>
+              <w:top w:type="dxa" w:w="60"/>
+              <w:left w:type="dxa" w:w="110"/>
+              <w:bottom w:type="dxa" w:w="60"/>
+              <w:right w:type="dxa" w:w="110"/>
+            </w:tcMar>
+          </w:tcPr>
+          <w:p>
+            <w:pPr>
+              <w:spacing w:after="0" w:line="264"/>
+            </w:pPr>
+            <w:r>
+              <w:rPr>
+                <w:rFonts w:ascii="Arial" w:cs="Arial" w:eastAsia="Arial" w:hAnsi="Arial"/>
+                <w:b/>
+                <w:bCs/>
+                <w:sz w:val="19"/>
+                <w:szCs w:val="19"/>
+              </w:rPr>
+              <w:t xml:space="preserve">Qué se hizo</w:t>
+            </w:r>
+          </w:p>
+        </w:tc>
+      </w:tr>
+      <w:tr>
+        <w:trPr>
+          <w:tblHeader w:val="false"/>
+        </w:trPr>
+        <w:tc>
+          <w:tcPr>
+            <w:tcW w:type="dxa" w:w="4320"/>
+            <w:tcBorders>
+              <w:top w:val="single" w:color="D1D5DB" w:sz="1"/>
+              <w:left w:val="single" w:color="D1D5DB" w:sz="1"/>
+              <w:bottom w:val="single" w:color="D1D5DB" w:sz="1"/>
+              <w:right w:val="single" w:color="D1D5DB" w:sz="1"/>
+            </w:tcBorders>
+            <w:tcMar>
+              <w:top w:type="dxa" w:w="60"/>
+              <w:left w:type="dxa" w:w="110"/>
+              <w:bottom w:type="dxa" w:w="60"/>
+              <w:right w:type="dxa" w:w="110"/>
+            </w:tcMar>
+          </w:tcPr>
+          <w:p>
+            <w:pPr>
+              <w:spacing w:after="0" w:line="264"/>
+            </w:pPr>
+            <w:r>
+              <w:rPr>
+                <w:rFonts w:ascii="Consolas" w:cs="Consolas" w:eastAsia="Consolas" w:hAnsi="Consolas"/>
+                <w:color w:val="4F46E5"/>
+              </w:rPr>
+              <w:t xml:space="preserve">Jenkinsfile</w:t>
+            </w:r>
+          </w:p>
+        </w:tc>
+        <w:tc>
+          <w:tcPr>
+            <w:tcW w:type="dxa" w:w="5040"/>
+            <w:tcBorders>
+              <w:top w:val="single" w:color="D1D5DB" w:sz="1"/>
+              <w:left w:val="single" w:color="D1D5DB" w:sz="1"/>
+              <w:bottom w:val="single" w:color="D1D5DB" w:sz="1"/>
+              <w:right w:val="single" w:color="D1D5DB" w:sz="1"/>
+            </w:tcBorders>
+            <w:tcMar>
+              <w:top w:type="dxa" w:w="60"/>
+              <w:left w:type="dxa" w:w="110"/>
+              <w:bottom w:type="dxa" w:w="60"/>
+              <w:right w:type="dxa" w:w="110"/>
+            </w:tcMar>
+          </w:tcPr>
+          <w:p>
+            <w:pPr>
+              <w:spacing w:after="0" w:line="264"/>
+            </w:pPr>
+            <w:r>
+              <w:rPr>
+                <w:rFonts w:ascii="Arial" w:cs="Arial" w:eastAsia="Arial" w:hAnsi="Arial"/>
+                <w:sz w:val="19"/>
+                <w:szCs w:val="19"/>
+              </w:rPr>
+              <w:t xml:space="preserve">Slim (~10 líneas): @Library + bookplusPipeline(ghcrCredentialsId:'github-app').</w:t>
+            </w:r>
+          </w:p>
+        </w:tc>
+      </w:tr>
+      <w:tr>
+        <w:trPr>
+          <w:tblHeader w:val="false"/>
+        </w:trPr>
+        <w:tc>
+          <w:tcPr>
+            <w:tcW w:type="dxa" w:w="4320"/>
+            <w:tcBorders>
+              <w:top w:val="single" w:color="D1D5DB" w:sz="1"/>
+              <w:left w:val="single" w:color="D1D5DB" w:sz="1"/>
+              <w:bottom w:val="single" w:color="D1D5DB" w:sz="1"/>
+              <w:right w:val="single" w:color="D1D5DB" w:sz="1"/>
+            </w:tcBorders>
+            <w:tcMar>
+              <w:top w:type="dxa" w:w="60"/>
+              <w:left w:type="dxa" w:w="110"/>
+              <w:bottom w:type="dxa" w:w="60"/>
+              <w:right w:type="dxa" w:w="110"/>
+            </w:tcMar>
+          </w:tcPr>
+          <w:p>
+            <w:pPr>
+              <w:spacing w:after="0" w:line="264"/>
+            </w:pPr>
+            <w:r>
+              <w:rPr>
+                <w:rFonts w:ascii="Consolas" w:cs="Consolas" w:eastAsia="Consolas" w:hAnsi="Consolas"/>
+                <w:color w:val="4F46E5"/>
+              </w:rPr>
+              <w:t xml:space="preserve">jenkins-shared-library/vars/bookplusPipeline.groovy</w:t>
+            </w:r>
+          </w:p>
+        </w:tc>
+        <w:tc>
+          <w:tcPr>
+            <w:tcW w:type="dxa" w:w="5040"/>
+            <w:tcBorders>
+              <w:top w:val="single" w:color="D1D5DB" w:sz="1"/>
+              <w:left w:val="single" w:color="D1D5DB" w:sz="1"/>
+              <w:bottom w:val="single" w:color="D1D5DB" w:sz="1"/>
+              <w:right w:val="single" w:color="D1D5DB" w:sz="1"/>
+            </w:tcBorders>
+            <w:tcMar>
+              <w:top w:type="dxa" w:w="60"/>
+              <w:left w:type="dxa" w:w="110"/>
+              <w:bottom w:type="dxa" w:w="60"/>
+              <w:right w:type="dxa" w:w="110"/>
+            </w:tcMar>
+          </w:tcPr>
+          <w:p>
+            <w:pPr>
+              <w:spacing w:after="0" w:line="264"/>
+            </w:pPr>
+            <w:r>
+              <w:rPr>
+                <w:rFonts w:ascii="Arial" w:cs="Arial" w:eastAsia="Arial" w:hAnsi="Arial"/>
+                <w:sz w:val="19"/>
+                <w:szCs w:val="19"/>
+              </w:rPr>
+              <w:t xml:space="preserve">Pipeline declarativo completo; parámetros sonarOrg/waitGate/ghcrCreds; Sonar con organization; gate opcional.</w:t>
+            </w:r>
+          </w:p>
+        </w:tc>
+      </w:tr>
+      <w:tr>
+        <w:trPr>
+          <w:tblHeader w:val="false"/>
+        </w:trPr>
+        <w:tc>
+          <w:tcPr>
+            <w:tcW w:type="dxa" w:w="4320"/>
+            <w:tcBorders>
+              <w:top w:val="single" w:color="D1D5DB" w:sz="1"/>
+              <w:left w:val="single" w:color="D1D5DB" w:sz="1"/>
+              <w:bottom w:val="single" w:color="D1D5DB" w:sz="1"/>
+              <w:right w:val="single" w:color="D1D5DB" w:sz="1"/>
+            </w:tcBorders>
+            <w:tcMar>
+              <w:top w:type="dxa" w:w="60"/>
+              <w:left w:type="dxa" w:w="110"/>
+              <w:bottom w:type="dxa" w:w="60"/>
+              <w:right w:type="dxa" w:w="110"/>
+            </w:tcMar>
+          </w:tcPr>
+          <w:p>
+            <w:pPr>
+              <w:spacing w:after="0" w:line="264"/>
+            </w:pPr>
+            <w:r>
+              <w:rPr>
+                <w:rFonts w:ascii="Consolas" w:cs="Consolas" w:eastAsia="Consolas" w:hAnsi="Consolas"/>
+                <w:color w:val="4F46E5"/>
+              </w:rPr>
+              <w:t xml:space="preserve">jenkins-shared-library/vars/notify.groovy</w:t>
+            </w:r>
+          </w:p>
+        </w:tc>
+        <w:tc>
+          <w:tcPr>
+            <w:tcW w:type="dxa" w:w="5040"/>
+            <w:tcBorders>
+              <w:top w:val="single" w:color="D1D5DB" w:sz="1"/>
+              <w:left w:val="single" w:color="D1D5DB" w:sz="1"/>
+              <w:bottom w:val="single" w:color="D1D5DB" w:sz="1"/>
+              <w:right w:val="single" w:color="D1D5DB" w:sz="1"/>
+            </w:tcBorders>
+            <w:tcMar>
+              <w:top w:type="dxa" w:w="60"/>
+              <w:left w:type="dxa" w:w="110"/>
+              <w:bottom w:type="dxa" w:w="60"/>
+              <w:right w:type="dxa" w:w="110"/>
+            </w:tcMar>
+          </w:tcPr>
+          <w:p>
+            <w:pPr>
+              <w:spacing w:after="0" w:line="264"/>
+            </w:pPr>
+            <w:r>
+              <w:rPr>
+                <w:rFonts w:ascii="Arial" w:cs="Arial" w:eastAsia="Arial" w:hAnsi="Arial"/>
+                <w:sz w:val="19"/>
+                <w:szCs w:val="19"/>
+              </w:rPr>
+              <w:t xml:space="preserve">Notificaciones Slack/email tolerantes a fallos (no rompen el build).</w:t>
+            </w:r>
+          </w:p>
+        </w:tc>
+      </w:tr>
+      <w:tr>
+        <w:trPr>
+          <w:tblHeader w:val="false"/>
+        </w:trPr>
+        <w:tc>
+          <w:tcPr>
+            <w:tcW w:type="dxa" w:w="4320"/>
+            <w:tcBorders>
+              <w:top w:val="single" w:color="D1D5DB" w:sz="1"/>
+              <w:left w:val="single" w:color="D1D5DB" w:sz="1"/>
+              <w:bottom w:val="single" w:color="D1D5DB" w:sz="1"/>
+              <w:right w:val="single" w:color="D1D5DB" w:sz="1"/>
+            </w:tcBorders>
+            <w:tcMar>
+              <w:top w:type="dxa" w:w="60"/>
+              <w:left w:type="dxa" w:w="110"/>
+              <w:bottom w:type="dxa" w:w="60"/>
+              <w:right w:type="dxa" w:w="110"/>
+            </w:tcMar>
+          </w:tcPr>
+          <w:p>
+            <w:pPr>
+              <w:spacing w:after="0" w:line="264"/>
+            </w:pPr>
+            <w:r>
+              <w:rPr>
+                <w:rFonts w:ascii="Consolas" w:cs="Consolas" w:eastAsia="Consolas" w:hAnsi="Consolas"/>
+                <w:color w:val="4F46E5"/>
+              </w:rPr>
+              <w:t xml:space="preserve">jenkins-shared-library/vars/blueGreenDeploy.groovy</w:t>
+            </w:r>
+          </w:p>
+        </w:tc>
+        <w:tc>
+          <w:tcPr>
+            <w:tcW w:type="dxa" w:w="5040"/>
+            <w:tcBorders>
+              <w:top w:val="single" w:color="D1D5DB" w:sz="1"/>
+              <w:left w:val="single" w:color="D1D5DB" w:sz="1"/>
+              <w:bottom w:val="single" w:color="D1D5DB" w:sz="1"/>
+              <w:right w:val="single" w:color="D1D5DB" w:sz="1"/>
+            </w:tcBorders>
+            <w:tcMar>
+              <w:top w:type="dxa" w:w="60"/>
+              <w:left w:type="dxa" w:w="110"/>
+              <w:bottom w:type="dxa" w:w="60"/>
+              <w:right w:type="dxa" w:w="110"/>
+            </w:tcMar>
+          </w:tcPr>
+          <w:p>
+            <w:pPr>
+              <w:spacing w:after="0" w:line="264"/>
+            </w:pPr>
+            <w:r>
+              <w:rPr>
+                <w:rFonts w:ascii="Arial" w:cs="Arial" w:eastAsia="Arial" w:hAnsi="Arial"/>
+                <w:sz w:val="19"/>
+                <w:szCs w:val="19"/>
+              </w:rPr>
+              <w:t xml:space="preserve">Despliegue blue-green con health check y rollback.</w:t>
+            </w:r>
+          </w:p>
+        </w:tc>
+      </w:tr>
+      <w:tr>
+        <w:trPr>
+          <w:tblHeader w:val="false"/>
+        </w:trPr>
+        <w:tc>
+          <w:tcPr>
+            <w:tcW w:type="dxa" w:w="4320"/>
+            <w:tcBorders>
+              <w:top w:val="single" w:color="D1D5DB" w:sz="1"/>
+              <w:left w:val="single" w:color="D1D5DB" w:sz="1"/>
+              <w:bottom w:val="single" w:color="D1D5DB" w:sz="1"/>
+              <w:right w:val="single" w:color="D1D5DB" w:sz="1"/>
+            </w:tcBorders>
+            <w:tcMar>
+              <w:top w:type="dxa" w:w="60"/>
+              <w:left w:type="dxa" w:w="110"/>
+              <w:bottom w:type="dxa" w:w="60"/>
+              <w:right w:type="dxa" w:w="110"/>
+            </w:tcMar>
+          </w:tcPr>
+          <w:p>
+            <w:pPr>
+              <w:spacing w:after="0" w:line="264"/>
+            </w:pPr>
+            <w:r>
+              <w:rPr>
+                <w:rFonts w:ascii="Consolas" w:cs="Consolas" w:eastAsia="Consolas" w:hAnsi="Consolas"/>
+                <w:color w:val="4F46E5"/>
+              </w:rPr>
+              <w:t xml:space="preserve">jenkins/casc/jenkins.yaml</w:t>
+            </w:r>
+          </w:p>
+        </w:tc>
+        <w:tc>
+          <w:tcPr>
+            <w:tcW w:type="dxa" w:w="5040"/>
+            <w:tcBorders>
+              <w:top w:val="single" w:color="D1D5DB" w:sz="1"/>
+              <w:left w:val="single" w:color="D1D5DB" w:sz="1"/>
+              <w:bottom w:val="single" w:color="D1D5DB" w:sz="1"/>
+              <w:right w:val="single" w:color="D1D5DB" w:sz="1"/>
+            </w:tcBorders>
+            <w:tcMar>
+              <w:top w:type="dxa" w:w="60"/>
+              <w:left w:type="dxa" w:w="110"/>
+              <w:bottom w:type="dxa" w:w="60"/>
+              <w:right w:type="dxa" w:w="110"/>
+            </w:tcMar>
+          </w:tcPr>
+          <w:p>
+            <w:pPr>
+              <w:spacing w:after="0" w:line="264"/>
+            </w:pPr>
+            <w:r>
+              <w:rPr>
+                <w:rFonts w:ascii="Arial" w:cs="Arial" w:eastAsia="Arial" w:hAnsi="Arial"/>
+                <w:sz w:val="19"/>
+                <w:szCs w:val="19"/>
+              </w:rPr>
+              <w:t xml:space="preserve">JCasC: seguridad, credenciales (ghcr + GitHub App boot-safe), Shared Library, SonarCloud, job Multibranch.</w:t>
+            </w:r>
+          </w:p>
+        </w:tc>
+      </w:tr>
+      <w:tr>
+        <w:trPr>
+          <w:tblHeader w:val="false"/>
+        </w:trPr>
+        <w:tc>
+          <w:tcPr>
+            <w:tcW w:type="dxa" w:w="4320"/>
+            <w:tcBorders>
+              <w:top w:val="single" w:color="D1D5DB" w:sz="1"/>
+              <w:left w:val="single" w:color="D1D5DB" w:sz="1"/>
+              <w:bottom w:val="single" w:color="D1D5DB" w:sz="1"/>
+              <w:right w:val="single" w:color="D1D5DB" w:sz="1"/>
+            </w:tcBorders>
+            <w:tcMar>
+              <w:top w:type="dxa" w:w="60"/>
+              <w:left w:type="dxa" w:w="110"/>
+              <w:bottom w:type="dxa" w:w="60"/>
+              <w:right w:type="dxa" w:w="110"/>
+            </w:tcMar>
+          </w:tcPr>
+          <w:p>
+            <w:pPr>
+              <w:spacing w:after="0" w:line="264"/>
+            </w:pPr>
+            <w:r>
+              <w:rPr>
+                <w:rFonts w:ascii="Consolas" w:cs="Consolas" w:eastAsia="Consolas" w:hAnsi="Consolas"/>
+                <w:color w:val="4F46E5"/>
+              </w:rPr>
+              <w:t xml:space="preserve">jenkins/Dockerfile</w:t>
+            </w:r>
+          </w:p>
+        </w:tc>
+        <w:tc>
+          <w:tcPr>
+            <w:tcW w:type="dxa" w:w="5040"/>
+            <w:tcBorders>
+              <w:top w:val="single" w:color="D1D5DB" w:sz="1"/>
+              <w:left w:val="single" w:color="D1D5DB" w:sz="1"/>
+              <w:bottom w:val="single" w:color="D1D5DB" w:sz="1"/>
+              <w:right w:val="single" w:color="D1D5DB" w:sz="1"/>
+            </w:tcBorders>
+            <w:tcMar>
+              <w:top w:type="dxa" w:w="60"/>
+              <w:left w:type="dxa" w:w="110"/>
+              <w:bottom w:type="dxa" w:w="60"/>
+              <w:right w:type="dxa" w:w="110"/>
+            </w:tcMar>
+          </w:tcPr>
+          <w:p>
+            <w:pPr>
+              <w:spacing w:after="0" w:line="264"/>
+            </w:pPr>
+            <w:r>
+              <w:rPr>
+                <w:rFonts w:ascii="Arial" w:cs="Arial" w:eastAsia="Arial" w:hAnsi="Arial"/>
+                <w:sz w:val="19"/>
+                <w:szCs w:val="19"/>
+              </w:rPr>
+              <w:t xml:space="preserve">Imagen Jenkins LTS-JDK21 + Docker CLI + plugins (añadidos github-branch-source y timestamper).</w:t>
+            </w:r>
+          </w:p>
+        </w:tc>
+      </w:tr>
+      <w:tr>
+        <w:trPr>
+          <w:tblHeader w:val="false"/>
+        </w:trPr>
+        <w:tc>
+          <w:tcPr>
+            <w:tcW w:type="dxa" w:w="4320"/>
+            <w:tcBorders>
+              <w:top w:val="single" w:color="D1D5DB" w:sz="1"/>
+              <w:left w:val="single" w:color="D1D5DB" w:sz="1"/>
+              <w:bottom w:val="single" w:color="D1D5DB" w:sz="1"/>
+              <w:right w:val="single" w:color="D1D5DB" w:sz="1"/>
+            </w:tcBorders>
+            <w:tcMar>
+              <w:top w:type="dxa" w:w="60"/>
+              <w:left w:type="dxa" w:w="110"/>
+              <w:bottom w:type="dxa" w:w="60"/>
+              <w:right w:type="dxa" w:w="110"/>
+            </w:tcMar>
+          </w:tcPr>
+          <w:p>
+            <w:pPr>
+              <w:spacing w:after="0" w:line="264"/>
+            </w:pPr>
+            <w:r>
+              <w:rPr>
+                <w:rFonts w:ascii="Consolas" w:cs="Consolas" w:eastAsia="Consolas" w:hAnsi="Consolas"/>
+                <w:color w:val="4F46E5"/>
+              </w:rPr>
+              <w:t xml:space="preserve">docker-compose.jenkins.yml</w:t>
+            </w:r>
+          </w:p>
+        </w:tc>
+        <w:tc>
+          <w:tcPr>
+            <w:tcW w:type="dxa" w:w="5040"/>
+            <w:tcBorders>
+              <w:top w:val="single" w:color="D1D5DB" w:sz="1"/>
+              <w:left w:val="single" w:color="D1D5DB" w:sz="1"/>
+              <w:bottom w:val="single" w:color="D1D5DB" w:sz="1"/>
+              <w:right w:val="single" w:color="D1D5DB" w:sz="1"/>
+            </w:tcBorders>
+            <w:tcMar>
+              <w:top w:type="dxa" w:w="60"/>
+              <w:left w:type="dxa" w:w="110"/>
+              <w:bottom w:type="dxa" w:w="60"/>
+              <w:right w:type="dxa" w:w="110"/>
+            </w:tcMar>
+          </w:tcPr>
+          <w:p>
+            <w:pPr>
+              <w:spacing w:after="0" w:line="264"/>
+            </w:pPr>
+            <w:r>
+              <w:rPr>
+                <w:rFonts w:ascii="Arial" w:cs="Arial" w:eastAsia="Arial" w:hAnsi="Arial"/>
+                <w:sz w:val="19"/>
+                <w:szCs w:val="19"/>
+              </w:rPr>
+              <w:t xml:space="preserve">Servicio Jenkins; monta la key de la App (con fallback al dummy) y el JCasC; variables de entorno.</w:t>
+            </w:r>
+          </w:p>
+        </w:tc>
+      </w:tr>
+      <w:tr>
+        <w:trPr>
+          <w:tblHeader w:val="false"/>
+        </w:trPr>
+        <w:tc>
+          <w:tcPr>
+            <w:tcW w:type="dxa" w:w="4320"/>
+            <w:tcBorders>
+              <w:top w:val="single" w:color="D1D5DB" w:sz="1"/>
+              <w:left w:val="single" w:color="D1D5DB" w:sz="1"/>
+              <w:bottom w:val="single" w:color="D1D5DB" w:sz="1"/>
+              <w:right w:val="single" w:color="D1D5DB" w:sz="1"/>
+            </w:tcBorders>
+            <w:tcMar>
+              <w:top w:type="dxa" w:w="60"/>
+              <w:left w:type="dxa" w:w="110"/>
+              <w:bottom w:type="dxa" w:w="60"/>
+              <w:right w:type="dxa" w:w="110"/>
+            </w:tcMar>
+          </w:tcPr>
+          <w:p>
+            <w:pPr>
+              <w:spacing w:after="0" w:line="264"/>
+            </w:pPr>
+            <w:r>
+              <w:rPr>
+                <w:rFonts w:ascii="Consolas" w:cs="Consolas" w:eastAsia="Consolas" w:hAnsi="Consolas"/>
+                <w:color w:val="4F46E5"/>
+              </w:rPr>
+              <w:t xml:space="preserve">.env / .env.jenkins.example</w:t>
+            </w:r>
+          </w:p>
+        </w:tc>
+        <w:tc>
+          <w:tcPr>
+            <w:tcW w:type="dxa" w:w="5040"/>
+            <w:tcBorders>
+              <w:top w:val="single" w:color="D1D5DB" w:sz="1"/>
+              <w:left w:val="single" w:color="D1D5DB" w:sz="1"/>
+              <w:bottom w:val="single" w:color="D1D5DB" w:sz="1"/>
+              <w:right w:val="single" w:color="D1D5DB" w:sz="1"/>
+            </w:tcBorders>
+            <w:tcMar>
+              <w:top w:type="dxa" w:w="60"/>
+              <w:left w:type="dxa" w:w="110"/>
+              <w:bottom w:type="dxa" w:w="60"/>
+              <w:right w:type="dxa" w:w="110"/>
+            </w:tcMar>
+          </w:tcPr>
+          <w:p>
+            <w:pPr>
+              <w:spacing w:after="0" w:line="264"/>
+            </w:pPr>
+            <w:r>
+              <w:rPr>
+                <w:rFonts w:ascii="Arial" w:cs="Arial" w:eastAsia="Arial" w:hAnsi="Arial"/>
+                <w:sz w:val="19"/>
+                <w:szCs w:val="19"/>
+              </w:rPr>
+              <w:t xml:space="preserve">GITHUB_APP_ID=4105762, GITHUB_APP_KEY_FILE; gitignored, fuera del repo.</w:t>
+            </w:r>
+          </w:p>
+        </w:tc>
+      </w:tr>
+      <w:tr>
+        <w:trPr>
+          <w:tblHeader w:val="false"/>
+        </w:trPr>
+        <w:tc>
+          <w:tcPr>
+            <w:tcW w:type="dxa" w:w="4320"/>
+            <w:tcBorders>
+              <w:top w:val="single" w:color="D1D5DB" w:sz="1"/>
+              <w:left w:val="single" w:color="D1D5DB" w:sz="1"/>
+              <w:bottom w:val="single" w:color="D1D5DB" w:sz="1"/>
+              <w:right w:val="single" w:color="D1D5DB" w:sz="1"/>
+            </w:tcBorders>
+            <w:tcMar>
+              <w:top w:type="dxa" w:w="60"/>
+              <w:left w:type="dxa" w:w="110"/>
+              <w:bottom w:type="dxa" w:w="60"/>
+              <w:right w:type="dxa" w:w="110"/>
+            </w:tcMar>
+          </w:tcPr>
+          <w:p>
+            <w:pPr>
+              <w:spacing w:after="0" w:line="264"/>
+            </w:pPr>
+            <w:r>
+              <w:rPr>
+                <w:rFonts w:ascii="Consolas" w:cs="Consolas" w:eastAsia="Consolas" w:hAnsi="Consolas"/>
+                <w:color w:val="4F46E5"/>
+              </w:rPr>
+              <w:t xml:space="preserve">jenkins/casc/github-app.pem.example</w:t>
+            </w:r>
+          </w:p>
+        </w:tc>
+        <w:tc>
+          <w:tcPr>
+            <w:tcW w:type="dxa" w:w="5040"/>
+            <w:tcBorders>
+              <w:top w:val="single" w:color="D1D5DB" w:sz="1"/>
+              <w:left w:val="single" w:color="D1D5DB" w:sz="1"/>
+              <w:bottom w:val="single" w:color="D1D5DB" w:sz="1"/>
+              <w:right w:val="single" w:color="D1D5DB" w:sz="1"/>
+            </w:tcBorders>
+            <w:tcMar>
+              <w:top w:type="dxa" w:w="60"/>
+              <w:left w:type="dxa" w:w="110"/>
+              <w:bottom w:type="dxa" w:w="60"/>
+              <w:right w:type="dxa" w:w="110"/>
+            </w:tcMar>
+          </w:tcPr>
+          <w:p>
+            <w:pPr>
+              <w:spacing w:after="0" w:line="264"/>
+            </w:pPr>
+            <w:r>
+              <w:rPr>
+                <w:rFonts w:ascii="Arial" w:cs="Arial" w:eastAsia="Arial" w:hAnsi="Arial"/>
+                <w:sz w:val="19"/>
+                <w:szCs w:val="19"/>
+              </w:rPr>
+              <w:t xml:space="preserve">Key dummy PKCS#8 para que JCasC arranque sin la App real.</w:t>
+            </w:r>
+          </w:p>
+        </w:tc>
+      </w:tr>
+      <w:tr>
+        <w:trPr>
+          <w:tblHeader w:val="false"/>
+        </w:trPr>
+        <w:tc>
+          <w:tcPr>
+            <w:tcW w:type="dxa" w:w="4320"/>
+            <w:tcBorders>
+              <w:top w:val="single" w:color="D1D5DB" w:sz="1"/>
+              <w:left w:val="single" w:color="D1D5DB" w:sz="1"/>
+              <w:bottom w:val="single" w:color="D1D5DB" w:sz="1"/>
+              <w:right w:val="single" w:color="D1D5DB" w:sz="1"/>
+            </w:tcBorders>
+            <w:tcMar>
+              <w:top w:type="dxa" w:w="60"/>
+              <w:left w:type="dxa" w:w="110"/>
+              <w:bottom w:type="dxa" w:w="60"/>
+              <w:right w:type="dxa" w:w="110"/>
+            </w:tcMar>
+          </w:tcPr>
+          <w:p>
+            <w:pPr>
+              <w:spacing w:after="0" w:line="264"/>
+            </w:pPr>
+            <w:r>
+              <w:rPr>
+                <w:rFonts w:ascii="Consolas" w:cs="Consolas" w:eastAsia="Consolas" w:hAnsi="Consolas"/>
+                <w:color w:val="4F46E5"/>
+              </w:rPr>
+              <w:t xml:space="preserve">SECRETS-MANAGEMENT.md / DUAL-CICD-SETUP.md</w:t>
+            </w:r>
+          </w:p>
+        </w:tc>
+        <w:tc>
+          <w:tcPr>
+            <w:tcW w:type="dxa" w:w="5040"/>
+            <w:tcBorders>
+              <w:top w:val="single" w:color="D1D5DB" w:sz="1"/>
+              <w:left w:val="single" w:color="D1D5DB" w:sz="1"/>
+              <w:bottom w:val="single" w:color="D1D5DB" w:sz="1"/>
+              <w:right w:val="single" w:color="D1D5DB" w:sz="1"/>
+            </w:tcBorders>
+            <w:tcMar>
+              <w:top w:type="dxa" w:w="60"/>
+              <w:left w:type="dxa" w:w="110"/>
+              <w:bottom w:type="dxa" w:w="60"/>
+              <w:right w:type="dxa" w:w="110"/>
+            </w:tcMar>
+          </w:tcPr>
+          <w:p>
+            <w:pPr>
+              <w:spacing w:after="0" w:line="264"/>
+            </w:pPr>
+            <w:r>
+              <w:rPr>
+                <w:rFonts w:ascii="Arial" w:cs="Arial" w:eastAsia="Arial" w:hAnsi="Arial"/>
+                <w:sz w:val="19"/>
+                <w:szCs w:val="19"/>
+              </w:rPr>
+              <w:t xml:space="preserve">Doc de niveles de secretos y runbook paso a paso de los dos CI/CD.</w:t>
+            </w:r>
+          </w:p>
+        </w:tc>
+      </w:tr>
+    </w:tbl>
+    <w:p>
+      <w:pPr>
+        <w:spacing w:after="160"/>
+      </w:pPr>
+      <w:r>
+        <w:rPr>
+          <w:rFonts w:ascii="Arial" w:cs="Arial" w:eastAsia="Arial" w:hAnsi="Arial"/>
+          <w:i/>
+          <w:iCs/>
+          <w:color w:val="6B7280"/>
+          <w:sz w:val="18"/>
+          <w:szCs w:val="18"/>
+        </w:rPr>
+        <w:t xml:space="preserve">La Shared Library vive en su propio repositorio (bookplus-jenkins-shared-lib) para poder importarse vía @Library, como en un setup real.</w:t>
+      </w:r>
+    </w:p>
+    <w:p>
+      <w:pPr>
         <w:pStyle w:val="Heading1"/>
       </w:pPr>
       <w:r>
@@ -15719,7 +17227,7 @@
         <w:rPr>
           <w:rFonts w:ascii="Arial" w:cs="Arial" w:eastAsia="Arial" w:hAnsi="Arial"/>
         </w:rPr>
-        <w:t xml:space="preserve">escaneo dinámico de seguridad en el CI.</w:t>
+        <w:t xml:space="preserve">escaneo dinámico de seguridad de la aplicación en ejecución dentro del CI.</w:t>
       </w:r>
     </w:p>
     <w:p>
@@ -15737,13 +17245,61 @@
           <w:b/>
           <w:bCs/>
         </w:rPr>
-        <w:t xml:space="preserve">Kubernetes: </w:t>
-      </w:r>
-      <w:r>
-        <w:rPr>
-          <w:rFonts w:ascii="Arial" w:cs="Arial" w:eastAsia="Arial" w:hAnsi="Arial"/>
-        </w:rPr>
-        <w:t xml:space="preserve">orquestación con probes, HPA, secrets e ingress.</w:t>
+        <w:t xml:space="preserve">gRPC: </w:t>
+      </w:r>
+      <w:r>
+        <w:rPr>
+          <w:rFonts w:ascii="Arial" w:cs="Arial" w:eastAsia="Arial" w:hAnsi="Arial"/>
+        </w:rPr>
+        <w:t xml:space="preserve">comunicación interna servicio-a-servicio contract-first con Protobuf.</w:t>
+      </w:r>
+    </w:p>
+    <w:p>
+      <w:pPr>
+        <w:pStyle w:val="ListParagraph"/>
+        <w:numPr>
+          <w:ilvl w:val="0"/>
+          <w:numId w:val="2"/>
+        </w:numPr>
+        <w:spacing w:after="80" w:line="268"/>
+      </w:pPr>
+      <w:r>
+        <w:rPr>
+          <w:rFonts w:ascii="Arial" w:cs="Arial" w:eastAsia="Arial" w:hAnsi="Arial"/>
+          <w:b/>
+          <w:bCs/>
+        </w:rPr>
+        <w:t xml:space="preserve">GraphQL (Spring for GraphQL): </w:t>
+      </w:r>
+      <w:r>
+        <w:rPr>
+          <w:rFonts w:ascii="Arial" w:cs="Arial" w:eastAsia="Arial" w:hAnsi="Arial"/>
+        </w:rPr>
+        <w:t xml:space="preserve">una API de agregación para el frontend.</w:t>
+      </w:r>
+    </w:p>
+    <w:p>
+      <w:pPr>
+        <w:pStyle w:val="ListParagraph"/>
+        <w:numPr>
+          <w:ilvl w:val="0"/>
+          <w:numId w:val="2"/>
+        </w:numPr>
+        <w:spacing w:after="80" w:line="268"/>
+      </w:pPr>
+      <w:r>
+        <w:rPr>
+          <w:rFonts w:ascii="Arial" w:cs="Arial" w:eastAsia="Arial" w:hAnsi="Arial"/>
+          <w:b/>
+          <w:bCs/>
+        </w:rPr>
+        <w:t xml:space="preserve">Event Sourcing completo: </w:t>
+      </w:r>
+      <w:r>
+        <w:rPr>
+          <w:rFonts w:ascii="Arial" w:cs="Arial" w:eastAsia="Arial" w:hAnsi="Arial"/>
+        </w:rPr>
+        <w:t xml:space="preserve">con un event store (Axon / EventStoreDB) en un agregado como el pedido.</w:t>
       </w:r>
     </w:p>
     <w:p>

</xml_diff>

<commit_message>
ci: DNS fijo Jenkins, buildx, Dockerfile.runtime, org bookplus-org + Word actualizado
</commit_message>
<xml_diff>
--- a/BookPlus-Stack-Tecnologico.docx
+++ b/BookPlus-Stack-Tecnologico.docx
@@ -12063,7 +12063,175 @@
         <w:rPr>
           <w:rFonts w:ascii="Arial" w:cs="Arial" w:eastAsia="Arial" w:hAnsi="Arial"/>
         </w:rPr>
-        <w:t xml:space="preserve">Estado actual verificado (build #4 en Jenkins local)</w:t>
+        <w:t xml:space="preserve">Migración a Organización de GitHub (setup de empresa real)</w:t>
+      </w:r>
+    </w:p>
+    <w:p>
+      <w:pPr>
+        <w:spacing w:after="120" w:line="276"/>
+      </w:pPr>
+      <w:r>
+        <w:rPr>
+          <w:rFonts w:ascii="Arial" w:cs="Arial" w:eastAsia="Arial" w:hAnsi="Arial"/>
+          <w:b/>
+          <w:bCs/>
+        </w:rPr>
+        <w:t xml:space="preserve">Por qué: </w:t>
+      </w:r>
+      <w:r>
+        <w:rPr>
+          <w:rFonts w:ascii="Arial" w:cs="Arial" w:eastAsia="Arial" w:hAnsi="Arial"/>
+        </w:rPr>
+        <w:t xml:space="preserve">una GitHub App no puede publicar paquetes en el namespace de una </w:t>
+      </w:r>
+      <w:r>
+        <w:rPr>
+          <w:rFonts w:ascii="Arial" w:cs="Arial" w:eastAsia="Arial" w:hAnsi="Arial"/>
+          <w:b/>
+          <w:bCs/>
+        </w:rPr>
+        <w:t xml:space="preserve">cuenta personal</w:t>
+      </w:r>
+      <w:r>
+        <w:rPr>
+          <w:rFonts w:ascii="Arial" w:cs="Arial" w:eastAsia="Arial" w:hAnsi="Arial"/>
+        </w:rPr>
+        <w:t xml:space="preserve"> (límite de GitHub). La forma en que lo hacen las empresas es alojar el código en una </w:t>
+      </w:r>
+      <w:r>
+        <w:rPr>
+          <w:rFonts w:ascii="Arial" w:cs="Arial" w:eastAsia="Arial" w:hAnsi="Arial"/>
+          <w:b/>
+          <w:bCs/>
+        </w:rPr>
+        <w:t xml:space="preserve">Organización</w:t>
+      </w:r>
+      <w:r>
+        <w:rPr>
+          <w:rFonts w:ascii="Arial" w:cs="Arial" w:eastAsia="Arial" w:hAnsi="Arial"/>
+        </w:rPr>
+        <w:t xml:space="preserve">. Se creó la organización </w:t>
+      </w:r>
+      <w:r>
+        <w:rPr>
+          <w:rFonts w:ascii="Consolas" w:cs="Consolas" w:eastAsia="Consolas" w:hAnsi="Consolas"/>
+          <w:color w:val="4F46E5"/>
+        </w:rPr>
+        <w:t xml:space="preserve">bookplus-org</w:t>
+      </w:r>
+      <w:r>
+        <w:rPr>
+          <w:rFonts w:ascii="Arial" w:cs="Arial" w:eastAsia="Arial" w:hAnsi="Arial"/>
+        </w:rPr>
+        <w:t xml:space="preserve">, se transfirió el repo a </w:t>
+      </w:r>
+      <w:r>
+        <w:rPr>
+          <w:rFonts w:ascii="Consolas" w:cs="Consolas" w:eastAsia="Consolas" w:hAnsi="Consolas"/>
+          <w:color w:val="4F46E5"/>
+        </w:rPr>
+        <w:t xml:space="preserve">bookplus-org/bookplus</w:t>
+      </w:r>
+      <w:r>
+        <w:rPr>
+          <w:rFonts w:ascii="Arial" w:cs="Arial" w:eastAsia="Arial" w:hAnsi="Arial"/>
+        </w:rPr>
+        <w:t xml:space="preserve">, y la GitHub App se hizo pública e instaló en la org con permiso </w:t>
+      </w:r>
+      <w:r>
+        <w:rPr>
+          <w:rFonts w:ascii="Consolas" w:cs="Consolas" w:eastAsia="Consolas" w:hAnsi="Consolas"/>
+          <w:color w:val="4F46E5"/>
+        </w:rPr>
+        <w:t xml:space="preserve">packages: write</w:t>
+      </w:r>
+      <w:r>
+        <w:rPr>
+          <w:rFonts w:ascii="Arial" w:cs="Arial" w:eastAsia="Arial" w:hAnsi="Arial"/>
+        </w:rPr>
+        <w:t xml:space="preserve">. El registro pasó a </w:t>
+      </w:r>
+      <w:r>
+        <w:rPr>
+          <w:rFonts w:ascii="Consolas" w:cs="Consolas" w:eastAsia="Consolas" w:hAnsi="Consolas"/>
+          <w:color w:val="4F46E5"/>
+        </w:rPr>
+        <w:t xml:space="preserve">ghcr.io/bookplus-org</w:t>
+      </w:r>
+      <w:r>
+        <w:rPr>
+          <w:rFonts w:ascii="Arial" w:cs="Arial" w:eastAsia="Arial" w:hAnsi="Arial"/>
+        </w:rPr>
+        <w:t xml:space="preserve">.</w:t>
+      </w:r>
+    </w:p>
+    <w:p>
+      <w:pPr>
+        <w:spacing w:after="120" w:line="276"/>
+      </w:pPr>
+      <w:r>
+        <w:rPr>
+          <w:rFonts w:ascii="Arial" w:cs="Arial" w:eastAsia="Arial" w:hAnsi="Arial"/>
+          <w:b/>
+          <w:bCs/>
+        </w:rPr>
+        <w:t xml:space="preserve">Reparto de responsabilidades (lo que hace un equipo de verdad): </w:t>
+      </w:r>
+      <w:r>
+        <w:rPr>
+          <w:rFonts w:ascii="Arial" w:cs="Arial" w:eastAsia="Arial" w:hAnsi="Arial"/>
+        </w:rPr>
+        <w:t xml:space="preserve">GitHub Actions publica las imágenes (su </w:t>
+      </w:r>
+      <w:r>
+        <w:rPr>
+          <w:rFonts w:ascii="Consolas" w:cs="Consolas" w:eastAsia="Consolas" w:hAnsi="Consolas"/>
+          <w:color w:val="4F46E5"/>
+        </w:rPr>
+        <w:t xml:space="preserve">GITHUB_TOKEN</w:t>
+      </w:r>
+      <w:r>
+        <w:rPr>
+          <w:rFonts w:ascii="Arial" w:cs="Arial" w:eastAsia="Arial" w:hAnsi="Arial"/>
+        </w:rPr>
+        <w:t xml:space="preserve"> sí crea paquetes de organización y firma con Cosign); Jenkins valida y también publica a paquetes ya existentes con el token efímero de la GitHub App (</w:t>
+      </w:r>
+      <w:r>
+        <w:rPr>
+          <w:rFonts w:ascii="Consolas" w:cs="Consolas" w:eastAsia="Consolas" w:hAnsi="Consolas"/>
+          <w:color w:val="4F46E5"/>
+        </w:rPr>
+        <w:t xml:space="preserve">owner: bookplus-org</w:t>
+      </w:r>
+      <w:r>
+        <w:rPr>
+          <w:rFonts w:ascii="Arial" w:cs="Arial" w:eastAsia="Arial" w:hAnsi="Arial"/>
+        </w:rPr>
+        <w:t xml:space="preserve">). Por eso </w:t>
+      </w:r>
+      <w:r>
+        <w:rPr>
+          <w:rFonts w:ascii="Consolas" w:cs="Consolas" w:eastAsia="Consolas" w:hAnsi="Consolas"/>
+          <w:color w:val="4F46E5"/>
+        </w:rPr>
+        <w:t xml:space="preserve">PUSH_IMAGES</w:t>
+      </w:r>
+      <w:r>
+        <w:rPr>
+          <w:rFonts w:ascii="Arial" w:cs="Arial" w:eastAsia="Arial" w:hAnsi="Arial"/>
+        </w:rPr>
+        <w:t xml:space="preserve"> queda best-effort y por defecto en false en Jenkins.</w:t>
+      </w:r>
+    </w:p>
+    <w:p>
+      <w:pPr>
+        <w:pStyle w:val="Heading3"/>
+      </w:pPr>
+      <w:r>
+        <w:rPr>
+          <w:rFonts w:ascii="Arial" w:cs="Arial" w:eastAsia="Arial" w:hAnsi="Arial"/>
+        </w:rPr>
+        <w:t xml:space="preserve">Estado final verificado (pipeline completo en verde)</w:t>
       </w:r>
     </w:p>
     <w:p>
@@ -12081,26 +12249,40 @@
           <w:b/>
           <w:bCs/>
         </w:rPr>
-        <w:t xml:space="preserve">Verde de punta a punta hasta Package: </w:t>
-      </w:r>
-      <w:r>
-        <w:rPr>
-          <w:rFonts w:ascii="Arial" w:cs="Arial" w:eastAsia="Arial" w:hAnsi="Arial"/>
-        </w:rPr>
-        <w:t xml:space="preserve">Checkout → Build &amp; Test (9 microservicios compilados y testeados en paralelo dentro de </w:t>
-      </w:r>
-      <w:r>
-        <w:rPr>
-          <w:rFonts w:ascii="Consolas" w:cs="Consolas" w:eastAsia="Consolas" w:hAnsi="Consolas"/>
-          <w:color w:val="4F46E5"/>
-        </w:rPr>
-        <w:t xml:space="preserve">maven:3.9-eclipse-temurin-21</w:t>
-      </w:r>
-      <w:r>
-        <w:rPr>
-          <w:rFonts w:ascii="Arial" w:cs="Arial" w:eastAsia="Arial" w:hAnsi="Arial"/>
-        </w:rPr>
-        <w:t xml:space="preserve">) → SonarCloud (análisis subido) → Package (9 JAR). Jenkins arranca por JCasC sin asistente y la GitHub App carga sin romper el arranque.</w:t>
+        <w:t xml:space="preserve">De punta a punta: </w:t>
+      </w:r>
+      <w:r>
+        <w:rPr>
+          <w:rFonts w:ascii="Arial" w:cs="Arial" w:eastAsia="Arial" w:hAnsi="Arial"/>
+        </w:rPr>
+        <w:t xml:space="preserve">Checkout → Build &amp; Test (9 microservicios en paralelo) → SonarCloud → Package → </w:t>
+      </w:r>
+      <w:r>
+        <w:rPr>
+          <w:rFonts w:ascii="Arial" w:cs="Arial" w:eastAsia="Arial" w:hAnsi="Arial"/>
+          <w:b/>
+          <w:bCs/>
+        </w:rPr>
+        <w:t xml:space="preserve">Build &amp; Push images (9 imágenes a ghcr.io/bookplus-org)</w:t>
+      </w:r>
+      <w:r>
+        <w:rPr>
+          <w:rFonts w:ascii="Arial" w:cs="Arial" w:eastAsia="Arial" w:hAnsi="Arial"/>
+        </w:rPr>
+        <w:t xml:space="preserve"> → Security scan (Trivy) → Post. El build termina completo; la GitHub App autentica contra GHCR de la org (</w:t>
+      </w:r>
+      <w:r>
+        <w:rPr>
+          <w:rFonts w:ascii="Consolas" w:cs="Consolas" w:eastAsia="Consolas" w:hAnsi="Consolas"/>
+          <w:color w:val="4F46E5"/>
+        </w:rPr>
+        <w:t xml:space="preserve">Login Succeeded</w:t>
+      </w:r>
+      <w:r>
+        <w:rPr>
+          <w:rFonts w:ascii="Arial" w:cs="Arial" w:eastAsia="Arial" w:hAnsi="Arial"/>
+        </w:rPr>
+        <w:t xml:space="preserve">).</w:t>
       </w:r>
     </w:p>
     <w:p>
@@ -12118,65 +12300,39 @@
           <w:b/>
           <w:bCs/>
         </w:rPr>
-        <w:t xml:space="preserve">Ajustes que hicieron falta (todos resueltos): </w:t>
-      </w:r>
-      <w:r>
-        <w:rPr>
-          <w:rFonts w:ascii="Arial" w:cs="Arial" w:eastAsia="Arial" w:hAnsi="Arial"/>
-        </w:rPr>
-        <w:t xml:space="preserve">se añadió el plugin </w:t>
-      </w:r>
-      <w:r>
-        <w:rPr>
-          <w:rFonts w:ascii="Consolas" w:cs="Consolas" w:eastAsia="Consolas" w:hAnsi="Consolas"/>
-          <w:color w:val="4F46E5"/>
-        </w:rPr>
-        <w:t xml:space="preserve">timestamper</w:t>
-      </w:r>
-      <w:r>
-        <w:rPr>
-          <w:rFonts w:ascii="Arial" w:cs="Arial" w:eastAsia="Arial" w:hAnsi="Arial"/>
-        </w:rPr>
-        <w:t xml:space="preserve"> (faltaba para </w:t>
-      </w:r>
-      <w:r>
-        <w:rPr>
-          <w:rFonts w:ascii="Consolas" w:cs="Consolas" w:eastAsia="Consolas" w:hAnsi="Consolas"/>
-          <w:color w:val="4F46E5"/>
-        </w:rPr>
-        <w:t xml:space="preserve">options{timestamps()}</w:t>
-      </w:r>
-      <w:r>
-        <w:rPr>
-          <w:rFonts w:ascii="Arial" w:cs="Arial" w:eastAsia="Arial" w:hAnsi="Arial"/>
-        </w:rPr>
-        <w:t xml:space="preserve">); se pasó </w:t>
-      </w:r>
-      <w:r>
-        <w:rPr>
-          <w:rFonts w:ascii="Consolas" w:cs="Consolas" w:eastAsia="Consolas" w:hAnsi="Consolas"/>
-          <w:color w:val="4F46E5"/>
-        </w:rPr>
-        <w:t xml:space="preserve">-Dsonar.organization=dhuarocc</w:t>
-      </w:r>
-      <w:r>
-        <w:rPr>
-          <w:rFonts w:ascii="Arial" w:cs="Arial" w:eastAsia="Arial" w:hAnsi="Arial"/>
-        </w:rPr>
-        <w:t xml:space="preserve"> (obligatorio en SonarCloud); y el Quality Gate se hizo opcional (</w:t>
-      </w:r>
-      <w:r>
-        <w:rPr>
-          <w:rFonts w:ascii="Consolas" w:cs="Consolas" w:eastAsia="Consolas" w:hAnsi="Consolas"/>
-          <w:color w:val="4F46E5"/>
-        </w:rPr>
-        <w:t xml:space="preserve">waitForQualityGate</w:t>
-      </w:r>
-      <w:r>
-        <w:rPr>
-          <w:rFonts w:ascii="Arial" w:cs="Arial" w:eastAsia="Arial" w:hAnsi="Arial"/>
-        </w:rPr>
-        <w:t xml:space="preserve"> por defecto omitido en local, porque su webhook necesita un Jenkins con URL pública).</w:t>
+        <w:t xml:space="preserve">Rendimiento (build-once): </w:t>
+      </w:r>
+      <w:r>
+        <w:rPr>
+          <w:rFonts w:ascii="Arial" w:cs="Arial" w:eastAsia="Arial" w:hAnsi="Arial"/>
+        </w:rPr>
+        <w:t xml:space="preserve">las imágenes ya no recompilan con Maven dentro; se construye el JAR una vez en Package y un </w:t>
+      </w:r>
+      <w:r>
+        <w:rPr>
+          <w:rFonts w:ascii="Consolas" w:cs="Consolas" w:eastAsia="Consolas" w:hAnsi="Consolas"/>
+          <w:color w:val="4F46E5"/>
+        </w:rPr>
+        <w:t xml:space="preserve">Dockerfile.runtime</w:t>
+      </w:r>
+      <w:r>
+        <w:rPr>
+          <w:rFonts w:ascii="Arial" w:cs="Arial" w:eastAsia="Arial" w:hAnsi="Arial"/>
+        </w:rPr>
+        <w:t xml:space="preserve"> solo lo copia, con </w:t>
+      </w:r>
+      <w:r>
+        <w:rPr>
+          <w:rFonts w:ascii="Consolas" w:cs="Consolas" w:eastAsia="Consolas" w:hAnsi="Consolas"/>
+          <w:color w:val="4F46E5"/>
+        </w:rPr>
+        <w:t xml:space="preserve">buildx/BuildKit</w:t>
+      </w:r>
+      <w:r>
+        <w:rPr>
+          <w:rFonts w:ascii="Arial" w:cs="Arial" w:eastAsia="Arial" w:hAnsi="Arial"/>
+        </w:rPr>
+        <w:t xml:space="preserve"> → cada imagen en segundos en vez de minutos.</w:t>
       </w:r>
     </w:p>
     <w:p>
@@ -12194,80 +12350,104 @@
           <w:b/>
           <w:bCs/>
         </w:rPr>
-        <w:t xml:space="preserve">Pendiente — push de imágenes a GHCR: </w:t>
-      </w:r>
-      <w:r>
-        <w:rPr>
-          <w:rFonts w:ascii="Arial" w:cs="Arial" w:eastAsia="Arial" w:hAnsi="Arial"/>
-        </w:rPr>
-        <w:t xml:space="preserve">la etapa Build &amp; Push falla con </w:t>
-      </w:r>
-      <w:r>
-        <w:rPr>
-          <w:rFonts w:ascii="Consolas" w:cs="Consolas" w:eastAsia="Consolas" w:hAnsi="Consolas"/>
-          <w:color w:val="4F46E5"/>
-        </w:rPr>
-        <w:t xml:space="preserve">denied: denied</w:t>
-      </w:r>
-      <w:r>
-        <w:rPr>
-          <w:rFonts w:ascii="Arial" w:cs="Arial" w:eastAsia="Arial" w:hAnsi="Arial"/>
-        </w:rPr>
-        <w:t xml:space="preserve"> al hacer </w:t>
-      </w:r>
-      <w:r>
-        <w:rPr>
-          <w:rFonts w:ascii="Consolas" w:cs="Consolas" w:eastAsia="Consolas" w:hAnsi="Consolas"/>
-          <w:color w:val="4F46E5"/>
-        </w:rPr>
-        <w:t xml:space="preserve">docker login ghcr.io</w:t>
-      </w:r>
-      <w:r>
-        <w:rPr>
-          <w:rFonts w:ascii="Arial" w:cs="Arial" w:eastAsia="Arial" w:hAnsi="Arial"/>
-        </w:rPr>
-        <w:t xml:space="preserve"> con el token de la App. No es un bug de configuración: GitHub restringe los tokens de GitHub App para publicar en el namespace de una </w:t>
-      </w:r>
-      <w:r>
-        <w:rPr>
-          <w:rFonts w:ascii="Arial" w:cs="Arial" w:eastAsia="Arial" w:hAnsi="Arial"/>
-          <w:b/>
-          <w:bCs/>
-        </w:rPr>
-        <w:t xml:space="preserve">cuenta personal</w:t>
-      </w:r>
-      <w:r>
-        <w:rPr>
-          <w:rFonts w:ascii="Arial" w:cs="Arial" w:eastAsia="Arial" w:hAnsi="Arial"/>
-        </w:rPr>
-        <w:t xml:space="preserve">. La solución profesional (siguiente sesión) es mover el repo a una </w:t>
-      </w:r>
-      <w:r>
-        <w:rPr>
-          <w:rFonts w:ascii="Arial" w:cs="Arial" w:eastAsia="Arial" w:hAnsi="Arial"/>
-          <w:b/>
-          <w:bCs/>
-        </w:rPr>
-        <w:t xml:space="preserve">Organización</w:t>
-      </w:r>
-      <w:r>
-        <w:rPr>
-          <w:rFonts w:ascii="Arial" w:cs="Arial" w:eastAsia="Arial" w:hAnsi="Arial"/>
-        </w:rPr>
-        <w:t xml:space="preserve"> de GitHub, donde la App publica a </w:t>
-      </w:r>
-      <w:r>
-        <w:rPr>
-          <w:rFonts w:ascii="Consolas" w:cs="Consolas" w:eastAsia="Consolas" w:hAnsi="Consolas"/>
-          <w:color w:val="4F46E5"/>
-        </w:rPr>
-        <w:t xml:space="preserve">ghcr.io/&lt;org&gt;</w:t>
-      </w:r>
-      <w:r>
-        <w:rPr>
-          <w:rFonts w:ascii="Arial" w:cs="Arial" w:eastAsia="Arial" w:hAnsi="Arial"/>
-        </w:rPr>
-        <w:t xml:space="preserve"> sin PAT — el patrón real de empresa.</w:t>
+        <w:t xml:space="preserve">Robustez aprendida en el camino: </w:t>
+      </w:r>
+      <w:r>
+        <w:rPr>
+          <w:rFonts w:ascii="Arial" w:cs="Arial" w:eastAsia="Arial" w:hAnsi="Arial"/>
+        </w:rPr>
+        <w:t xml:space="preserve">plugin </w:t>
+      </w:r>
+      <w:r>
+        <w:rPr>
+          <w:rFonts w:ascii="Consolas" w:cs="Consolas" w:eastAsia="Consolas" w:hAnsi="Consolas"/>
+          <w:color w:val="4F46E5"/>
+        </w:rPr>
+        <w:t xml:space="preserve">timestamper</w:t>
+      </w:r>
+      <w:r>
+        <w:rPr>
+          <w:rFonts w:ascii="Arial" w:cs="Arial" w:eastAsia="Arial" w:hAnsi="Arial"/>
+        </w:rPr>
+        <w:t xml:space="preserve">; </w:t>
+      </w:r>
+      <w:r>
+        <w:rPr>
+          <w:rFonts w:ascii="Consolas" w:cs="Consolas" w:eastAsia="Consolas" w:hAnsi="Consolas"/>
+          <w:color w:val="4F46E5"/>
+        </w:rPr>
+        <w:t xml:space="preserve">-Dsonar.organization</w:t>
+      </w:r>
+      <w:r>
+        <w:rPr>
+          <w:rFonts w:ascii="Arial" w:cs="Arial" w:eastAsia="Arial" w:hAnsi="Arial"/>
+        </w:rPr>
+        <w:t xml:space="preserve">; Quality Gate opcional (webhook no llega a un Jenkins local); push </w:t>
+      </w:r>
+      <w:r>
+        <w:rPr>
+          <w:rFonts w:ascii="Arial" w:cs="Arial" w:eastAsia="Arial" w:hAnsi="Arial"/>
+          <w:b/>
+          <w:bCs/>
+        </w:rPr>
+        <w:t xml:space="preserve">secuencial</w:t>
+      </w:r>
+      <w:r>
+        <w:rPr>
+          <w:rFonts w:ascii="Arial" w:cs="Arial" w:eastAsia="Arial" w:hAnsi="Arial"/>
+        </w:rPr>
+        <w:t xml:space="preserve"> (reusa la capa base, no satura la subida); DNS fijo del contenedor (8.8.8.8/1.1.1.1) ante los cortes de Docker Desktop; y Trivy con </w:t>
+      </w:r>
+      <w:r>
+        <w:rPr>
+          <w:rFonts w:ascii="Consolas" w:cs="Consolas" w:eastAsia="Consolas" w:hAnsi="Consolas"/>
+          <w:color w:val="4F46E5"/>
+        </w:rPr>
+        <w:t xml:space="preserve">--timeout 30m</w:t>
+      </w:r>
+      <w:r>
+        <w:rPr>
+          <w:rFonts w:ascii="Arial" w:cs="Arial" w:eastAsia="Arial" w:hAnsi="Arial"/>
+        </w:rPr>
+        <w:t xml:space="preserve">, </w:t>
+      </w:r>
+      <w:r>
+        <w:rPr>
+          <w:rFonts w:ascii="Arial" w:cs="Arial" w:eastAsia="Arial" w:hAnsi="Arial"/>
+          <w:b/>
+          <w:bCs/>
+        </w:rPr>
+        <w:t xml:space="preserve">caché de su BD</w:t>
+      </w:r>
+      <w:r>
+        <w:rPr>
+          <w:rFonts w:ascii="Arial" w:cs="Arial" w:eastAsia="Arial" w:hAnsi="Arial"/>
+        </w:rPr>
+        <w:t xml:space="preserve"> (884 MB una sola vez) y best-effort.</w:t>
+      </w:r>
+    </w:p>
+    <w:p>
+      <w:pPr>
+        <w:pStyle w:val="ListParagraph"/>
+        <w:numPr>
+          <w:ilvl w:val="0"/>
+          <w:numId w:val="2"/>
+        </w:numPr>
+        <w:spacing w:after="80" w:line="268"/>
+      </w:pPr>
+      <w:r>
+        <w:rPr>
+          <w:rFonts w:ascii="Arial" w:cs="Arial" w:eastAsia="Arial" w:hAnsi="Arial"/>
+          <w:b/>
+          <w:bCs/>
+        </w:rPr>
+        <w:t xml:space="preserve">Seguridad real: </w:t>
+      </w:r>
+      <w:r>
+        <w:rPr>
+          <w:rFonts w:ascii="Arial" w:cs="Arial" w:eastAsia="Arial" w:hAnsi="Arial"/>
+        </w:rPr>
+        <w:t xml:space="preserve">Trivy reporta CVEs de dependencias (jackson-databind, netty, spring-security, spring-cloud-gateway, etc.) con versión corregida disponible; Dependabot ya abre los PRs de actualización. El escaneo informa sin bloquear el build (UNSTABLE, no FAILURE).</w:t>
       </w:r>
     </w:p>
     <w:p>
@@ -12491,7 +12671,71 @@
                 <w:sz w:val="19"/>
                 <w:szCs w:val="19"/>
               </w:rPr>
-              <w:t xml:space="preserve">Pipeline declarativo completo; parámetros sonarOrg/waitGate/ghcrCreds; Sonar con organization; gate opcional.</w:t>
+              <w:t xml:space="preserve">Pipeline declarativo; build-once + buildx, push secuencial best-effort, Trivy con caché/timeout, Sonar con organization, gate opcional.</w:t>
+            </w:r>
+          </w:p>
+        </w:tc>
+      </w:tr>
+      <w:tr>
+        <w:trPr>
+          <w:tblHeader w:val="false"/>
+        </w:trPr>
+        <w:tc>
+          <w:tcPr>
+            <w:tcW w:type="dxa" w:w="4320"/>
+            <w:tcBorders>
+              <w:top w:val="single" w:color="D1D5DB" w:sz="1"/>
+              <w:left w:val="single" w:color="D1D5DB" w:sz="1"/>
+              <w:bottom w:val="single" w:color="D1D5DB" w:sz="1"/>
+              <w:right w:val="single" w:color="D1D5DB" w:sz="1"/>
+            </w:tcBorders>
+            <w:tcMar>
+              <w:top w:type="dxa" w:w="60"/>
+              <w:left w:type="dxa" w:w="110"/>
+              <w:bottom w:type="dxa" w:w="60"/>
+              <w:right w:type="dxa" w:w="110"/>
+            </w:tcMar>
+          </w:tcPr>
+          <w:p>
+            <w:pPr>
+              <w:spacing w:after="0" w:line="264"/>
+            </w:pPr>
+            <w:r>
+              <w:rPr>
+                <w:rFonts w:ascii="Consolas" w:cs="Consolas" w:eastAsia="Consolas" w:hAnsi="Consolas"/>
+                <w:color w:val="4F46E5"/>
+              </w:rPr>
+              <w:t xml:space="preserve">Dockerfile.runtime</w:t>
+            </w:r>
+          </w:p>
+        </w:tc>
+        <w:tc>
+          <w:tcPr>
+            <w:tcW w:type="dxa" w:w="5040"/>
+            <w:tcBorders>
+              <w:top w:val="single" w:color="D1D5DB" w:sz="1"/>
+              <w:left w:val="single" w:color="D1D5DB" w:sz="1"/>
+              <w:bottom w:val="single" w:color="D1D5DB" w:sz="1"/>
+              <w:right w:val="single" w:color="D1D5DB" w:sz="1"/>
+            </w:tcBorders>
+            <w:tcMar>
+              <w:top w:type="dxa" w:w="60"/>
+              <w:left w:type="dxa" w:w="110"/>
+              <w:bottom w:type="dxa" w:w="60"/>
+              <w:right w:type="dxa" w:w="110"/>
+            </w:tcMar>
+          </w:tcPr>
+          <w:p>
+            <w:pPr>
+              <w:spacing w:after="0" w:line="264"/>
+            </w:pPr>
+            <w:r>
+              <w:rPr>
+                <w:rFonts w:ascii="Arial" w:cs="Arial" w:eastAsia="Arial" w:hAnsi="Arial"/>
+                <w:sz w:val="19"/>
+                <w:szCs w:val="19"/>
+              </w:rPr>
+              <w:t xml:space="preserve">Imagen de runtime que solo copia el JAR ya construido (build-once, sin recompilar).</w:t>
             </w:r>
           </w:p>
         </w:tc>

</xml_diff>

<commit_message>
feat(observability): trazabilidad distribuida OpenTelemetry + Grafana Tempo (9 servicios)
</commit_message>
<xml_diff>
--- a/BookPlus-Stack-Tecnologico.docx
+++ b/BookPlus-Stack-Tecnologico.docx
@@ -13267,6 +13267,350 @@
           <w:szCs w:val="18"/>
         </w:rPr>
         <w:t xml:space="preserve">La Shared Library vive en su propio repositorio (bookplus-jenkins-shared-lib) para poder importarse vía @Library, como en un setup real.</w:t>
+      </w:r>
+    </w:p>
+    <w:p>
+      <w:pPr>
+        <w:pStyle w:val="Heading2"/>
+      </w:pPr>
+      <w:r>
+        <w:rPr>
+          <w:rFonts w:ascii="Arial" w:cs="Arial" w:eastAsia="Arial" w:hAnsi="Arial"/>
+        </w:rPr>
+        <w:t xml:space="preserve">13.38 Trazabilidad distribuida (OpenTelemetry + Grafana Tempo)</w:t>
+      </w:r>
+    </w:p>
+    <w:p>
+      <w:pPr>
+        <w:spacing w:after="120" w:line="276"/>
+      </w:pPr>
+      <w:r>
+        <w:rPr>
+          <w:rFonts w:ascii="Arial" w:cs="Arial" w:eastAsia="Arial" w:hAnsi="Arial"/>
+          <w:b/>
+          <w:bCs/>
+        </w:rPr>
+        <w:t xml:space="preserve">Qué es: </w:t>
+      </w:r>
+      <w:r>
+        <w:rPr>
+          <w:rFonts w:ascii="Arial" w:cs="Arial" w:eastAsia="Arial" w:hAnsi="Arial"/>
+        </w:rPr>
+        <w:t xml:space="preserve">cuando una petición atraviesa varios microservicios (p. ej. gateway → catalog, o la saga de compra), una </w:t>
+      </w:r>
+      <w:r>
+        <w:rPr>
+          <w:rFonts w:ascii="Arial" w:cs="Arial" w:eastAsia="Arial" w:hAnsi="Arial"/>
+          <w:b/>
+          <w:bCs/>
+        </w:rPr>
+        <w:t xml:space="preserve">traza distribuida</w:t>
+      </w:r>
+      <w:r>
+        <w:rPr>
+          <w:rFonts w:ascii="Arial" w:cs="Arial" w:eastAsia="Arial" w:hAnsi="Arial"/>
+        </w:rPr>
+        <w:t xml:space="preserve"> reconstruye ese recorrido completo como un árbol de spans con tiempos, para saber exactamente en qué servicio se fue el tiempo o dónde falló. Es una herramienta clave de operación y auditoría en banca.</w:t>
+      </w:r>
+    </w:p>
+    <w:p>
+      <w:pPr>
+        <w:pStyle w:val="ListParagraph"/>
+        <w:numPr>
+          <w:ilvl w:val="0"/>
+          <w:numId w:val="2"/>
+        </w:numPr>
+        <w:spacing w:after="80" w:line="268"/>
+      </w:pPr>
+      <w:r>
+        <w:rPr>
+          <w:rFonts w:ascii="Arial" w:cs="Arial" w:eastAsia="Arial" w:hAnsi="Arial"/>
+          <w:b/>
+          <w:bCs/>
+        </w:rPr>
+        <w:t xml:space="preserve">OpenTelemetry-native: </w:t>
+      </w:r>
+      <w:r>
+        <w:rPr>
+          <w:rFonts w:ascii="Arial" w:cs="Arial" w:eastAsia="Arial" w:hAnsi="Arial"/>
+        </w:rPr>
+        <w:t xml:space="preserve">los 9 microservicios se instrumentan con </w:t>
+      </w:r>
+      <w:r>
+        <w:rPr>
+          <w:rFonts w:ascii="Consolas" w:cs="Consolas" w:eastAsia="Consolas" w:hAnsi="Consolas"/>
+          <w:color w:val="4F46E5"/>
+        </w:rPr>
+        <w:t xml:space="preserve">micrometer-tracing-bridge-otel</w:t>
+      </w:r>
+      <w:r>
+        <w:rPr>
+          <w:rFonts w:ascii="Arial" w:cs="Arial" w:eastAsia="Arial" w:hAnsi="Arial"/>
+        </w:rPr>
+        <w:t xml:space="preserve"> + </w:t>
+      </w:r>
+      <w:r>
+        <w:rPr>
+          <w:rFonts w:ascii="Consolas" w:cs="Consolas" w:eastAsia="Consolas" w:hAnsi="Consolas"/>
+          <w:color w:val="4F46E5"/>
+        </w:rPr>
+        <w:t xml:space="preserve">opentelemetry-exporter-otlp</w:t>
+      </w:r>
+      <w:r>
+        <w:rPr>
+          <w:rFonts w:ascii="Arial" w:cs="Arial" w:eastAsia="Arial" w:hAnsi="Arial"/>
+        </w:rPr>
+        <w:t xml:space="preserve">. Micrometer instrumenta automáticamente HTTP entrante/saliente y Kafka, y </w:t>
+      </w:r>
+      <w:r>
+        <w:rPr>
+          <w:rFonts w:ascii="Arial" w:cs="Arial" w:eastAsia="Arial" w:hAnsi="Arial"/>
+          <w:b/>
+          <w:bCs/>
+        </w:rPr>
+        <w:t xml:space="preserve">propaga el contexto</w:t>
+      </w:r>
+      <w:r>
+        <w:rPr>
+          <w:rFonts w:ascii="Arial" w:cs="Arial" w:eastAsia="Arial" w:hAnsi="Arial"/>
+        </w:rPr>
+        <w:t xml:space="preserve"> (traceparent) entre servicios, de modo que todos los spans de una misma petición comparten el </w:t>
+      </w:r>
+      <w:r>
+        <w:rPr>
+          <w:rFonts w:ascii="Consolas" w:cs="Consolas" w:eastAsia="Consolas" w:hAnsi="Consolas"/>
+          <w:color w:val="4F46E5"/>
+        </w:rPr>
+        <w:t xml:space="preserve">traceId</w:t>
+      </w:r>
+      <w:r>
+        <w:rPr>
+          <w:rFonts w:ascii="Arial" w:cs="Arial" w:eastAsia="Arial" w:hAnsi="Arial"/>
+        </w:rPr>
+        <w:t xml:space="preserve">.</w:t>
+      </w:r>
+    </w:p>
+    <w:p>
+      <w:pPr>
+        <w:pStyle w:val="ListParagraph"/>
+        <w:numPr>
+          <w:ilvl w:val="0"/>
+          <w:numId w:val="2"/>
+        </w:numPr>
+        <w:spacing w:after="80" w:line="268"/>
+      </w:pPr>
+      <w:r>
+        <w:rPr>
+          <w:rFonts w:ascii="Arial" w:cs="Arial" w:eastAsia="Arial" w:hAnsi="Arial"/>
+          <w:b/>
+          <w:bCs/>
+        </w:rPr>
+        <w:t xml:space="preserve">Pipeline de telemetría: </w:t>
+      </w:r>
+      <w:r>
+        <w:rPr>
+          <w:rFonts w:ascii="Arial" w:cs="Arial" w:eastAsia="Arial" w:hAnsi="Arial"/>
+        </w:rPr>
+        <w:t xml:space="preserve">cada servicio exporta spans por OTLP al </w:t>
+      </w:r>
+      <w:r>
+        <w:rPr>
+          <w:rFonts w:ascii="Consolas" w:cs="Consolas" w:eastAsia="Consolas" w:hAnsi="Consolas"/>
+          <w:color w:val="4F46E5"/>
+        </w:rPr>
+        <w:t xml:space="preserve">OpenTelemetry Collector</w:t>
+      </w:r>
+      <w:r>
+        <w:rPr>
+          <w:rFonts w:ascii="Arial" w:cs="Arial" w:eastAsia="Arial" w:hAnsi="Arial"/>
+        </w:rPr>
+        <w:t xml:space="preserve"> (endpoint </w:t>
+      </w:r>
+      <w:r>
+        <w:rPr>
+          <w:rFonts w:ascii="Consolas" w:cs="Consolas" w:eastAsia="Consolas" w:hAnsi="Consolas"/>
+          <w:color w:val="4F46E5"/>
+        </w:rPr>
+        <w:t xml:space="preserve">http://otel-collector:4318/v1/traces</w:t>
+      </w:r>
+      <w:r>
+        <w:rPr>
+          <w:rFonts w:ascii="Arial" w:cs="Arial" w:eastAsia="Arial" w:hAnsi="Arial"/>
+        </w:rPr>
+        <w:t xml:space="preserve">), que los reenvía a </w:t>
+      </w:r>
+      <w:r>
+        <w:rPr>
+          <w:rFonts w:ascii="Arial" w:cs="Arial" w:eastAsia="Arial" w:hAnsi="Arial"/>
+          <w:b/>
+          <w:bCs/>
+        </w:rPr>
+        <w:t xml:space="preserve">Grafana Tempo</w:t>
+      </w:r>
+      <w:r>
+        <w:rPr>
+          <w:rFonts w:ascii="Arial" w:cs="Arial" w:eastAsia="Arial" w:hAnsi="Arial"/>
+        </w:rPr>
+        <w:t xml:space="preserve"> (backend de trazas). Se sustituyó el Zipkin anterior por este flujo, más estándar y ya integrado en Grafana junto a métricas (Prometheus) y logs (Loki).</w:t>
+      </w:r>
+    </w:p>
+    <w:p>
+      <w:pPr>
+        <w:pStyle w:val="ListParagraph"/>
+        <w:numPr>
+          <w:ilvl w:val="0"/>
+          <w:numId w:val="2"/>
+        </w:numPr>
+        <w:spacing w:after="80" w:line="268"/>
+      </w:pPr>
+      <w:r>
+        <w:rPr>
+          <w:rFonts w:ascii="Arial" w:cs="Arial" w:eastAsia="Arial" w:hAnsi="Arial"/>
+          <w:b/>
+          <w:bCs/>
+        </w:rPr>
+        <w:t xml:space="preserve">Correlación traza↔logs: </w:t>
+      </w:r>
+      <w:r>
+        <w:rPr>
+          <w:rFonts w:ascii="Arial" w:cs="Arial" w:eastAsia="Arial" w:hAnsi="Arial"/>
+        </w:rPr>
+        <w:t xml:space="preserve">Grafana lleva un datasource Tempo con </w:t>
+      </w:r>
+      <w:r>
+        <w:rPr>
+          <w:rFonts w:ascii="Consolas" w:cs="Consolas" w:eastAsia="Consolas" w:hAnsi="Consolas"/>
+          <w:color w:val="4F46E5"/>
+        </w:rPr>
+        <w:t xml:space="preserve">tracesToLogsV2</w:t>
+      </w:r>
+      <w:r>
+        <w:rPr>
+          <w:rFonts w:ascii="Arial" w:cs="Arial" w:eastAsia="Arial" w:hAnsi="Arial"/>
+        </w:rPr>
+        <w:t xml:space="preserve"> hacia Loki: al abrir un span puedes saltar a los logs con ese mismo </w:t>
+      </w:r>
+      <w:r>
+        <w:rPr>
+          <w:rFonts w:ascii="Consolas" w:cs="Consolas" w:eastAsia="Consolas" w:hAnsi="Consolas"/>
+          <w:color w:val="4F46E5"/>
+        </w:rPr>
+        <w:t xml:space="preserve">traceId</w:t>
+      </w:r>
+      <w:r>
+        <w:rPr>
+          <w:rFonts w:ascii="Arial" w:cs="Arial" w:eastAsia="Arial" w:hAnsi="Arial"/>
+        </w:rPr>
+        <w:t xml:space="preserve"> (que ya aparece en cada línea gracias al patrón de logging con MDC). También queda habilitado el </w:t>
+      </w:r>
+      <w:r>
+        <w:rPr>
+          <w:rFonts w:ascii="Arial" w:cs="Arial" w:eastAsia="Arial" w:hAnsi="Arial"/>
+          <w:b/>
+          <w:bCs/>
+        </w:rPr>
+        <w:t xml:space="preserve">service map</w:t>
+      </w:r>
+      <w:r>
+        <w:rPr>
+          <w:rFonts w:ascii="Arial" w:cs="Arial" w:eastAsia="Arial" w:hAnsi="Arial"/>
+        </w:rPr>
+        <w:t xml:space="preserve"> (mapa de dependencias entre servicios).</w:t>
+      </w:r>
+    </w:p>
+    <w:p>
+      <w:pPr>
+        <w:pStyle w:val="ListParagraph"/>
+        <w:numPr>
+          <w:ilvl w:val="0"/>
+          <w:numId w:val="2"/>
+        </w:numPr>
+        <w:spacing w:after="80" w:line="268"/>
+      </w:pPr>
+      <w:r>
+        <w:rPr>
+          <w:rFonts w:ascii="Arial" w:cs="Arial" w:eastAsia="Arial" w:hAnsi="Arial"/>
+          <w:b/>
+          <w:bCs/>
+        </w:rPr>
+        <w:t xml:space="preserve">Configuración por entorno: </w:t>
+      </w:r>
+      <w:r>
+        <w:rPr>
+          <w:rFonts w:ascii="Arial" w:cs="Arial" w:eastAsia="Arial" w:hAnsi="Arial"/>
+        </w:rPr>
+        <w:t xml:space="preserve">el endpoint y el muestreo se controlan con variables (</w:t>
+      </w:r>
+      <w:r>
+        <w:rPr>
+          <w:rFonts w:ascii="Consolas" w:cs="Consolas" w:eastAsia="Consolas" w:hAnsi="Consolas"/>
+          <w:color w:val="4F46E5"/>
+        </w:rPr>
+        <w:t xml:space="preserve">MANAGEMENT_OTLP_TRACING_ENDPOINT</w:t>
+      </w:r>
+      <w:r>
+        <w:rPr>
+          <w:rFonts w:ascii="Arial" w:cs="Arial" w:eastAsia="Arial" w:hAnsi="Arial"/>
+        </w:rPr>
+        <w:t xml:space="preserve">, </w:t>
+      </w:r>
+      <w:r>
+        <w:rPr>
+          <w:rFonts w:ascii="Consolas" w:cs="Consolas" w:eastAsia="Consolas" w:hAnsi="Consolas"/>
+          <w:color w:val="4F46E5"/>
+        </w:rPr>
+        <w:t xml:space="preserve">MANAGEMENT_TRACING_SAMPLING_PROBABILITY</w:t>
+      </w:r>
+      <w:r>
+        <w:rPr>
+          <w:rFonts w:ascii="Arial" w:cs="Arial" w:eastAsia="Arial" w:hAnsi="Arial"/>
+        </w:rPr>
+        <w:t xml:space="preserve">); en dev el sampling es 1.0 (todas las trazas) y en producción se baja para no saturar.</w:t>
+      </w:r>
+    </w:p>
+    <w:p>
+      <w:pPr>
+        <w:spacing w:after="120" w:line="276"/>
+      </w:pPr>
+      <w:r>
+        <w:rPr>
+          <w:rFonts w:ascii="Arial" w:cs="Arial" w:eastAsia="Arial" w:hAnsi="Arial"/>
+          <w:b/>
+          <w:bCs/>
+        </w:rPr>
+        <w:t xml:space="preserve">Verificación: </w:t>
+      </w:r>
+      <w:r>
+        <w:rPr>
+          <w:rFonts w:ascii="Arial" w:cs="Arial" w:eastAsia="Arial" w:hAnsi="Arial"/>
+        </w:rPr>
+        <w:t xml:space="preserve">se levanta el stack (</w:t>
+      </w:r>
+      <w:r>
+        <w:rPr>
+          <w:rFonts w:ascii="Consolas" w:cs="Consolas" w:eastAsia="Consolas" w:hAnsi="Consolas"/>
+          <w:color w:val="4F46E5"/>
+        </w:rPr>
+        <w:t xml:space="preserve">docker-compose.full.yml</w:t>
+      </w:r>
+      <w:r>
+        <w:rPr>
+          <w:rFonts w:ascii="Arial" w:cs="Arial" w:eastAsia="Arial" w:hAnsi="Arial"/>
+        </w:rPr>
+        <w:t xml:space="preserve"> añade el servicio </w:t>
+      </w:r>
+      <w:r>
+        <w:rPr>
+          <w:rFonts w:ascii="Consolas" w:cs="Consolas" w:eastAsia="Consolas" w:hAnsi="Consolas"/>
+          <w:color w:val="4F46E5"/>
+        </w:rPr>
+        <w:t xml:space="preserve">tempo</w:t>
+      </w:r>
+      <w:r>
+        <w:rPr>
+          <w:rFonts w:ascii="Arial" w:cs="Arial" w:eastAsia="Arial" w:hAnsi="Arial"/>
+        </w:rPr>
+        <w:t xml:space="preserve">), se hace una petición a través del gateway y en Grafana → Explore → Tempo aparece la traza con los spans de cada servicio encadenados por el mismo traceId, con enlace a sus logs en Loki.</w:t>
       </w:r>
     </w:p>
     <w:p>

</xml_diff>

<commit_message>
feat(security): DAST con OWASP ZAP baseline en el CI (SAST+SCA+DAST)
</commit_message>
<xml_diff>
--- a/BookPlus-Stack-Tecnologico.docx
+++ b/BookPlus-Stack-Tecnologico.docx
@@ -13611,6 +13611,351 @@
           <w:rFonts w:ascii="Arial" w:cs="Arial" w:eastAsia="Arial" w:hAnsi="Arial"/>
         </w:rPr>
         <w:t xml:space="preserve">), se hace una petición a través del gateway y en Grafana → Explore → Tempo aparece la traza con los spans de cada servicio encadenados por el mismo traceId, con enlace a sus logs en Loki.</w:t>
+      </w:r>
+    </w:p>
+    <w:p>
+      <w:pPr>
+        <w:pStyle w:val="Heading2"/>
+      </w:pPr>
+      <w:r>
+        <w:rPr>
+          <w:rFonts w:ascii="Arial" w:cs="Arial" w:eastAsia="Arial" w:hAnsi="Arial"/>
+        </w:rPr>
+        <w:t xml:space="preserve">13.39 Seguridad dinámica: OWASP ZAP (DAST) en el CI</w:t>
+      </w:r>
+    </w:p>
+    <w:p>
+      <w:pPr>
+        <w:spacing w:after="120" w:line="276"/>
+      </w:pPr>
+      <w:r>
+        <w:rPr>
+          <w:rFonts w:ascii="Arial" w:cs="Arial" w:eastAsia="Arial" w:hAnsi="Arial"/>
+          <w:b/>
+          <w:bCs/>
+        </w:rPr>
+        <w:t xml:space="preserve">Qué es: </w:t>
+      </w:r>
+      <w:r>
+        <w:rPr>
+          <w:rFonts w:ascii="Arial" w:cs="Arial" w:eastAsia="Arial" w:hAnsi="Arial"/>
+        </w:rPr>
+        <w:t xml:space="preserve">DAST (Dynamic Application Security Testing) prueba la aplicación </w:t>
+      </w:r>
+      <w:r>
+        <w:rPr>
+          <w:rFonts w:ascii="Arial" w:cs="Arial" w:eastAsia="Arial" w:hAnsi="Arial"/>
+          <w:b/>
+          <w:bCs/>
+        </w:rPr>
+        <w:t xml:space="preserve">en ejecución</w:t>
+      </w:r>
+      <w:r>
+        <w:rPr>
+          <w:rFonts w:ascii="Arial" w:cs="Arial" w:eastAsia="Arial" w:hAnsi="Arial"/>
+        </w:rPr>
+        <w:t xml:space="preserve">, atacándola desde fuera como lo haría un intruso, a diferencia del análisis estático. Con esto el proyecto cierra el triángulo de seguridad de aplicaciones: </w:t>
+      </w:r>
+      <w:r>
+        <w:rPr>
+          <w:rFonts w:ascii="Arial" w:cs="Arial" w:eastAsia="Arial" w:hAnsi="Arial"/>
+          <w:b/>
+          <w:bCs/>
+        </w:rPr>
+        <w:t xml:space="preserve">SAST</w:t>
+      </w:r>
+      <w:r>
+        <w:rPr>
+          <w:rFonts w:ascii="Arial" w:cs="Arial" w:eastAsia="Arial" w:hAnsi="Arial"/>
+        </w:rPr>
+        <w:t xml:space="preserve"> (SonarCloud, sobre el código) + </w:t>
+      </w:r>
+      <w:r>
+        <w:rPr>
+          <w:rFonts w:ascii="Arial" w:cs="Arial" w:eastAsia="Arial" w:hAnsi="Arial"/>
+          <w:b/>
+          <w:bCs/>
+        </w:rPr>
+        <w:t xml:space="preserve">SCA</w:t>
+      </w:r>
+      <w:r>
+        <w:rPr>
+          <w:rFonts w:ascii="Arial" w:cs="Arial" w:eastAsia="Arial" w:hAnsi="Arial"/>
+        </w:rPr>
+        <w:t xml:space="preserve"> (Trivy/Dependency-Check, sobre dependencias e imágenes) + </w:t>
+      </w:r>
+      <w:r>
+        <w:rPr>
+          <w:rFonts w:ascii="Arial" w:cs="Arial" w:eastAsia="Arial" w:hAnsi="Arial"/>
+          <w:b/>
+          <w:bCs/>
+        </w:rPr>
+        <w:t xml:space="preserve">DAST</w:t>
+      </w:r>
+      <w:r>
+        <w:rPr>
+          <w:rFonts w:ascii="Arial" w:cs="Arial" w:eastAsia="Arial" w:hAnsi="Arial"/>
+        </w:rPr>
+        <w:t xml:space="preserve"> (OWASP ZAP, sobre la app viva).</w:t>
+      </w:r>
+    </w:p>
+    <w:p>
+      <w:pPr>
+        <w:pStyle w:val="ListParagraph"/>
+        <w:numPr>
+          <w:ilvl w:val="0"/>
+          <w:numId w:val="2"/>
+        </w:numPr>
+        <w:spacing w:after="80" w:line="268"/>
+      </w:pPr>
+      <w:r>
+        <w:rPr>
+          <w:rFonts w:ascii="Arial" w:cs="Arial" w:eastAsia="Arial" w:hAnsi="Arial"/>
+          <w:b/>
+          <w:bCs/>
+        </w:rPr>
+        <w:t xml:space="preserve">Herramienta y modo: </w:t>
+      </w:r>
+      <w:r>
+        <w:rPr>
+          <w:rFonts w:ascii="Arial" w:cs="Arial" w:eastAsia="Arial" w:hAnsi="Arial"/>
+        </w:rPr>
+        <w:t xml:space="preserve">OWASP ZAP en modo </w:t>
+      </w:r>
+      <w:r>
+        <w:rPr>
+          <w:rFonts w:ascii="Consolas" w:cs="Consolas" w:eastAsia="Consolas" w:hAnsi="Consolas"/>
+          <w:color w:val="4F46E5"/>
+        </w:rPr>
+        <w:t xml:space="preserve">baseline</w:t>
+      </w:r>
+      <w:r>
+        <w:rPr>
+          <w:rFonts w:ascii="Arial" w:cs="Arial" w:eastAsia="Arial" w:hAnsi="Arial"/>
+        </w:rPr>
+        <w:t xml:space="preserve"> (spider + reglas passive): rápido y sin autenticación, ideal para el CI. Comprueba cabeceras de seguridad, cookies, fugas de información, configuración TLS y errores del borde.</w:t>
+      </w:r>
+    </w:p>
+    <w:p>
+      <w:pPr>
+        <w:pStyle w:val="ListParagraph"/>
+        <w:numPr>
+          <w:ilvl w:val="0"/>
+          <w:numId w:val="2"/>
+        </w:numPr>
+        <w:spacing w:after="80" w:line="268"/>
+      </w:pPr>
+      <w:r>
+        <w:rPr>
+          <w:rFonts w:ascii="Arial" w:cs="Arial" w:eastAsia="Arial" w:hAnsi="Arial"/>
+          <w:b/>
+          <w:bCs/>
+        </w:rPr>
+        <w:t xml:space="preserve">Target ligero y fiable: </w:t>
+      </w:r>
+      <w:r>
+        <w:rPr>
+          <w:rFonts w:ascii="Arial" w:cs="Arial" w:eastAsia="Arial" w:hAnsi="Arial"/>
+        </w:rPr>
+        <w:t xml:space="preserve">un compose mínimo (</w:t>
+      </w:r>
+      <w:r>
+        <w:rPr>
+          <w:rFonts w:ascii="Consolas" w:cs="Consolas" w:eastAsia="Consolas" w:hAnsi="Consolas"/>
+          <w:color w:val="4F46E5"/>
+        </w:rPr>
+        <w:t xml:space="preserve">docker-compose.dast.yml</w:t>
+      </w:r>
+      <w:r>
+        <w:rPr>
+          <w:rFonts w:ascii="Arial" w:cs="Arial" w:eastAsia="Arial" w:hAnsi="Arial"/>
+        </w:rPr>
+        <w:t xml:space="preserve">) levanta solo el </w:t>
+      </w:r>
+      <w:r>
+        <w:rPr>
+          <w:rFonts w:ascii="Consolas" w:cs="Consolas" w:eastAsia="Consolas" w:hAnsi="Consolas"/>
+          <w:color w:val="4F46E5"/>
+        </w:rPr>
+        <w:t xml:space="preserve">api-gateway</w:t>
+      </w:r>
+      <w:r>
+        <w:rPr>
+          <w:rFonts w:ascii="Arial" w:cs="Arial" w:eastAsia="Arial" w:hAnsi="Arial"/>
+        </w:rPr>
+        <w:t xml:space="preserve"> + su Redis. El gateway es el borde donde viven las </w:t>
+      </w:r>
+      <w:r>
+        <w:rPr>
+          <w:rFonts w:ascii="Arial" w:cs="Arial" w:eastAsia="Arial" w:hAnsi="Arial"/>
+          <w:b/>
+          <w:bCs/>
+        </w:rPr>
+        <w:t xml:space="preserve">cabeceras de seguridad</w:t>
+      </w:r>
+      <w:r>
+        <w:rPr>
+          <w:rFonts w:ascii="Arial" w:cs="Arial" w:eastAsia="Arial" w:hAnsi="Arial"/>
+        </w:rPr>
+        <w:t xml:space="preserve"> (CSP, HSTS, etc.) y el rate limiting, justo lo que interesa que ZAP verifique. No hace falta arrancar Kafka ni los 9 backends.</w:t>
+      </w:r>
+    </w:p>
+    <w:p>
+      <w:pPr>
+        <w:pStyle w:val="ListParagraph"/>
+        <w:numPr>
+          <w:ilvl w:val="0"/>
+          <w:numId w:val="2"/>
+        </w:numPr>
+        <w:spacing w:after="80" w:line="268"/>
+      </w:pPr>
+      <w:r>
+        <w:rPr>
+          <w:rFonts w:ascii="Arial" w:cs="Arial" w:eastAsia="Arial" w:hAnsi="Arial"/>
+          <w:b/>
+          <w:bCs/>
+        </w:rPr>
+        <w:t xml:space="preserve">Integración en el pipeline: </w:t>
+      </w:r>
+      <w:r>
+        <w:rPr>
+          <w:rFonts w:ascii="Arial" w:cs="Arial" w:eastAsia="Arial" w:hAnsi="Arial"/>
+        </w:rPr>
+        <w:t xml:space="preserve">workflow </w:t>
+      </w:r>
+      <w:r>
+        <w:rPr>
+          <w:rFonts w:ascii="Consolas" w:cs="Consolas" w:eastAsia="Consolas" w:hAnsi="Consolas"/>
+          <w:color w:val="4F46E5"/>
+        </w:rPr>
+        <w:t xml:space="preserve">.github/workflows/dast.yml</w:t>
+      </w:r>
+      <w:r>
+        <w:rPr>
+          <w:rFonts w:ascii="Arial" w:cs="Arial" w:eastAsia="Arial" w:hAnsi="Arial"/>
+        </w:rPr>
+        <w:t xml:space="preserve"> a demanda (</w:t>
+      </w:r>
+      <w:r>
+        <w:rPr>
+          <w:rFonts w:ascii="Consolas" w:cs="Consolas" w:eastAsia="Consolas" w:hAnsi="Consolas"/>
+          <w:color w:val="4F46E5"/>
+        </w:rPr>
+        <w:t xml:space="preserve">workflow_dispatch</w:t>
+      </w:r>
+      <w:r>
+        <w:rPr>
+          <w:rFonts w:ascii="Arial" w:cs="Arial" w:eastAsia="Arial" w:hAnsi="Arial"/>
+        </w:rPr>
+        <w:t xml:space="preserve">) y semanal (</w:t>
+      </w:r>
+      <w:r>
+        <w:rPr>
+          <w:rFonts w:ascii="Consolas" w:cs="Consolas" w:eastAsia="Consolas" w:hAnsi="Consolas"/>
+          <w:color w:val="4F46E5"/>
+        </w:rPr>
+        <w:t xml:space="preserve">cron</w:t>
+      </w:r>
+      <w:r>
+        <w:rPr>
+          <w:rFonts w:ascii="Arial" w:cs="Arial" w:eastAsia="Arial" w:hAnsi="Arial"/>
+        </w:rPr>
+        <w:t xml:space="preserve">), porque el DAST es lento y no conviene en cada push. Genera una clave JWT efímera para arrancar el gateway, escanea con </w:t>
+      </w:r>
+      <w:r>
+        <w:rPr>
+          <w:rFonts w:ascii="Consolas" w:cs="Consolas" w:eastAsia="Consolas" w:hAnsi="Consolas"/>
+          <w:color w:val="4F46E5"/>
+        </w:rPr>
+        <w:t xml:space="preserve">--network host</w:t>
+      </w:r>
+      <w:r>
+        <w:rPr>
+          <w:rFonts w:ascii="Arial" w:cs="Arial" w:eastAsia="Arial" w:hAnsi="Arial"/>
+        </w:rPr>
+        <w:t xml:space="preserve"> y publica el reporte HTML como artefacto.</w:t>
+      </w:r>
+    </w:p>
+    <w:p>
+      <w:pPr>
+        <w:pStyle w:val="ListParagraph"/>
+        <w:numPr>
+          <w:ilvl w:val="0"/>
+          <w:numId w:val="2"/>
+        </w:numPr>
+        <w:spacing w:after="80" w:line="268"/>
+      </w:pPr>
+      <w:r>
+        <w:rPr>
+          <w:rFonts w:ascii="Arial" w:cs="Arial" w:eastAsia="Arial" w:hAnsi="Arial"/>
+          <w:b/>
+          <w:bCs/>
+        </w:rPr>
+        <w:t xml:space="preserve">Informativo, no bloqueante: </w:t>
+      </w:r>
+      <w:r>
+        <w:rPr>
+          <w:rFonts w:ascii="Arial" w:cs="Arial" w:eastAsia="Arial" w:hAnsi="Arial"/>
+        </w:rPr>
+        <w:t xml:space="preserve">igual que Trivy, el escaneo reporta hallazgos sin romper el build (</w:t>
+      </w:r>
+      <w:r>
+        <w:rPr>
+          <w:rFonts w:ascii="Consolas" w:cs="Consolas" w:eastAsia="Consolas" w:hAnsi="Consolas"/>
+          <w:color w:val="4F46E5"/>
+        </w:rPr>
+        <w:t xml:space="preserve">-I</w:t>
+      </w:r>
+      <w:r>
+        <w:rPr>
+          <w:rFonts w:ascii="Arial" w:cs="Arial" w:eastAsia="Arial" w:hAnsi="Arial"/>
+        </w:rPr>
+        <w:t xml:space="preserve">); las reglas de </w:t>
+      </w:r>
+      <w:r>
+        <w:rPr>
+          <w:rFonts w:ascii="Consolas" w:cs="Consolas" w:eastAsia="Consolas" w:hAnsi="Consolas"/>
+          <w:color w:val="4F46E5"/>
+        </w:rPr>
+        <w:t xml:space="preserve">.zap/rules.tsv</w:t>
+      </w:r>
+      <w:r>
+        <w:rPr>
+          <w:rFonts w:ascii="Arial" w:cs="Arial" w:eastAsia="Arial" w:hAnsi="Arial"/>
+        </w:rPr>
+        <w:t xml:space="preserve"> silencian el ruido para que destaque lo accionable. En producción se subiría a modo full-scan contra un staging real.</w:t>
+      </w:r>
+    </w:p>
+    <w:p>
+      <w:pPr>
+        <w:spacing w:after="120" w:line="276"/>
+      </w:pPr>
+      <w:r>
+        <w:rPr>
+          <w:rFonts w:ascii="Arial" w:cs="Arial" w:eastAsia="Arial" w:hAnsi="Arial"/>
+          <w:b/>
+          <w:bCs/>
+        </w:rPr>
+        <w:t xml:space="preserve">Verificación: </w:t>
+      </w:r>
+      <w:r>
+        <w:rPr>
+          <w:rFonts w:ascii="Arial" w:cs="Arial" w:eastAsia="Arial" w:hAnsi="Arial"/>
+        </w:rPr>
+        <w:t xml:space="preserve">se lanza el workflow desde la pestaña Actions; ZAP arranca el gateway, lo escanea y sube </w:t>
+      </w:r>
+      <w:r>
+        <w:rPr>
+          <w:rFonts w:ascii="Consolas" w:cs="Consolas" w:eastAsia="Consolas" w:hAnsi="Consolas"/>
+          <w:color w:val="4F46E5"/>
+        </w:rPr>
+        <w:t xml:space="preserve">zap-report.html</w:t>
+      </w:r>
+      <w:r>
+        <w:rPr>
+          <w:rFonts w:ascii="Arial" w:cs="Arial" w:eastAsia="Arial" w:hAnsi="Arial"/>
+        </w:rPr>
+        <w:t xml:space="preserve"> como artefacto descargable con el listado de alertas por severidad.</w:t>
       </w:r>
     </w:p>
     <w:p>

</xml_diff>

<commit_message>
feat: rate limiting por usuario/IP (gateway), GraphQL (catalog) y gRPC contract-first (inventory)
</commit_message>
<xml_diff>
--- a/BookPlus-Stack-Tecnologico.docx
+++ b/BookPlus-Stack-Tecnologico.docx
@@ -13960,6 +13960,1332 @@
     </w:p>
     <w:p>
       <w:pPr>
+        <w:pStyle w:val="Heading2"/>
+      </w:pPr>
+      <w:r>
+        <w:rPr>
+          <w:rFonts w:ascii="Arial" w:cs="Arial" w:eastAsia="Arial" w:hAnsi="Arial"/>
+        </w:rPr>
+        <w:t xml:space="preserve">13.40 Rate limiting avanzado en el Gateway (por usuario/IP)</w:t>
+      </w:r>
+    </w:p>
+    <w:p>
+      <w:pPr>
+        <w:spacing w:after="120" w:line="276"/>
+      </w:pPr>
+      <w:r>
+        <w:rPr>
+          <w:rFonts w:ascii="Arial" w:cs="Arial" w:eastAsia="Arial" w:hAnsi="Arial"/>
+          <w:b/>
+          <w:bCs/>
+        </w:rPr>
+        <w:t xml:space="preserve">Qué es: </w:t>
+      </w:r>
+      <w:r>
+        <w:rPr>
+          <w:rFonts w:ascii="Arial" w:cs="Arial" w:eastAsia="Arial" w:hAnsi="Arial"/>
+        </w:rPr>
+        <w:t xml:space="preserve">limitar cuántas peticiones puede hacer cada cliente en una ventana de tiempo, para frenar abuso, fuerza bruta y picos que degraden el servicio. A diferencia del rate limiting de Bucket4j (que ya protege endpoints de </w:t>
+      </w:r>
+      <w:r>
+        <w:rPr>
+          <w:rFonts w:ascii="Consolas" w:cs="Consolas" w:eastAsia="Consolas" w:hAnsi="Consolas"/>
+          <w:color w:val="4F46E5"/>
+        </w:rPr>
+        <w:t xml:space="preserve">auth</w:t>
+      </w:r>
+      <w:r>
+        <w:rPr>
+          <w:rFonts w:ascii="Arial" w:cs="Arial" w:eastAsia="Arial" w:hAnsi="Arial"/>
+        </w:rPr>
+        <w:t xml:space="preserve"> por IP dentro del servicio), este actúa en el </w:t>
+      </w:r>
+      <w:r>
+        <w:rPr>
+          <w:rFonts w:ascii="Arial" w:cs="Arial" w:eastAsia="Arial" w:hAnsi="Arial"/>
+          <w:b/>
+          <w:bCs/>
+        </w:rPr>
+        <w:t xml:space="preserve">borde</w:t>
+      </w:r>
+      <w:r>
+        <w:rPr>
+          <w:rFonts w:ascii="Arial" w:cs="Arial" w:eastAsia="Arial" w:hAnsi="Arial"/>
+        </w:rPr>
+        <w:t xml:space="preserve">, en el api-gateway, antes de que la petición toque ningún backend.</w:t>
+      </w:r>
+    </w:p>
+    <w:p>
+      <w:pPr>
+        <w:pStyle w:val="ListParagraph"/>
+        <w:numPr>
+          <w:ilvl w:val="0"/>
+          <w:numId w:val="2"/>
+        </w:numPr>
+        <w:spacing w:after="80" w:line="268"/>
+      </w:pPr>
+      <w:r>
+        <w:rPr>
+          <w:rFonts w:ascii="Arial" w:cs="Arial" w:eastAsia="Arial" w:hAnsi="Arial"/>
+          <w:b/>
+          <w:bCs/>
+        </w:rPr>
+        <w:t xml:space="preserve">Token bucket distribuido con Redis: </w:t>
+      </w:r>
+      <w:r>
+        <w:rPr>
+          <w:rFonts w:ascii="Arial" w:cs="Arial" w:eastAsia="Arial" w:hAnsi="Arial"/>
+        </w:rPr>
+        <w:t xml:space="preserve">cada ruta usa el filtro </w:t>
+      </w:r>
+      <w:r>
+        <w:rPr>
+          <w:rFonts w:ascii="Consolas" w:cs="Consolas" w:eastAsia="Consolas" w:hAnsi="Consolas"/>
+          <w:color w:val="4F46E5"/>
+        </w:rPr>
+        <w:t xml:space="preserve">RequestRateLimiter</w:t>
+      </w:r>
+      <w:r>
+        <w:rPr>
+          <w:rFonts w:ascii="Arial" w:cs="Arial" w:eastAsia="Arial" w:hAnsi="Arial"/>
+        </w:rPr>
+        <w:t xml:space="preserve"> de Spring Cloud Gateway con </w:t>
+      </w:r>
+      <w:r>
+        <w:rPr>
+          <w:rFonts w:ascii="Consolas" w:cs="Consolas" w:eastAsia="Consolas" w:hAnsi="Consolas"/>
+          <w:color w:val="4F46E5"/>
+        </w:rPr>
+        <w:t xml:space="preserve">redis-rate-limiter</w:t>
+      </w:r>
+      <w:r>
+        <w:rPr>
+          <w:rFonts w:ascii="Arial" w:cs="Arial" w:eastAsia="Arial" w:hAnsi="Arial"/>
+        </w:rPr>
+        <w:t xml:space="preserve">. El estado del bucket vive en Redis, así que el límite es </w:t>
+      </w:r>
+      <w:r>
+        <w:rPr>
+          <w:rFonts w:ascii="Arial" w:cs="Arial" w:eastAsia="Arial" w:hAnsi="Arial"/>
+          <w:b/>
+          <w:bCs/>
+        </w:rPr>
+        <w:t xml:space="preserve">consistente entre todas las réplicas</w:t>
+      </w:r>
+      <w:r>
+        <w:rPr>
+          <w:rFonts w:ascii="Arial" w:cs="Arial" w:eastAsia="Arial" w:hAnsi="Arial"/>
+        </w:rPr>
+        <w:t xml:space="preserve"> del gateway (no cada instancia por su cuenta). Se afina por ruta con </w:t>
+      </w:r>
+      <w:r>
+        <w:rPr>
+          <w:rFonts w:ascii="Consolas" w:cs="Consolas" w:eastAsia="Consolas" w:hAnsi="Consolas"/>
+          <w:color w:val="4F46E5"/>
+        </w:rPr>
+        <w:t xml:space="preserve">replenishRate</w:t>
+      </w:r>
+      <w:r>
+        <w:rPr>
+          <w:rFonts w:ascii="Arial" w:cs="Arial" w:eastAsia="Arial" w:hAnsi="Arial"/>
+        </w:rPr>
+        <w:t xml:space="preserve"> (reposición/seg), </w:t>
+      </w:r>
+      <w:r>
+        <w:rPr>
+          <w:rFonts w:ascii="Consolas" w:cs="Consolas" w:eastAsia="Consolas" w:hAnsi="Consolas"/>
+          <w:color w:val="4F46E5"/>
+        </w:rPr>
+        <w:t xml:space="preserve">burstCapacity</w:t>
+      </w:r>
+      <w:r>
+        <w:rPr>
+          <w:rFonts w:ascii="Arial" w:cs="Arial" w:eastAsia="Arial" w:hAnsi="Arial"/>
+        </w:rPr>
+        <w:t xml:space="preserve"> (pico) y </w:t>
+      </w:r>
+      <w:r>
+        <w:rPr>
+          <w:rFonts w:ascii="Consolas" w:cs="Consolas" w:eastAsia="Consolas" w:hAnsi="Consolas"/>
+          <w:color w:val="4F46E5"/>
+        </w:rPr>
+        <w:t xml:space="preserve">requestedTokens</w:t>
+      </w:r>
+      <w:r>
+        <w:rPr>
+          <w:rFonts w:ascii="Arial" w:cs="Arial" w:eastAsia="Arial" w:hAnsi="Arial"/>
+        </w:rPr>
+        <w:t xml:space="preserve">.</w:t>
+      </w:r>
+    </w:p>
+    <w:p>
+      <w:pPr>
+        <w:pStyle w:val="ListParagraph"/>
+        <w:numPr>
+          <w:ilvl w:val="0"/>
+          <w:numId w:val="2"/>
+        </w:numPr>
+        <w:spacing w:after="80" w:line="268"/>
+      </w:pPr>
+      <w:r>
+        <w:rPr>
+          <w:rFonts w:ascii="Arial" w:cs="Arial" w:eastAsia="Arial" w:hAnsi="Arial"/>
+          <w:b/>
+          <w:bCs/>
+        </w:rPr>
+        <w:t xml:space="preserve">Límites por criticidad: </w:t>
+      </w:r>
+      <w:r>
+        <w:rPr>
+          <w:rFonts w:ascii="Arial" w:cs="Arial" w:eastAsia="Arial" w:hAnsi="Arial"/>
+        </w:rPr>
+        <w:t xml:space="preserve">las rutas se calibran según su naturaleza: lectura de catálogo generosa (50/100), escritura y operaciones sensibles (</w:t>
+      </w:r>
+      <w:r>
+        <w:rPr>
+          <w:rFonts w:ascii="Consolas" w:cs="Consolas" w:eastAsia="Consolas" w:hAnsi="Consolas"/>
+          <w:color w:val="4F46E5"/>
+        </w:rPr>
+        <w:t xml:space="preserve">auth</w:t>
+      </w:r>
+      <w:r>
+        <w:rPr>
+          <w:rFonts w:ascii="Arial" w:cs="Arial" w:eastAsia="Arial" w:hAnsi="Arial"/>
+        </w:rPr>
+        <w:t xml:space="preserve">, </w:t>
+      </w:r>
+      <w:r>
+        <w:rPr>
+          <w:rFonts w:ascii="Consolas" w:cs="Consolas" w:eastAsia="Consolas" w:hAnsi="Consolas"/>
+          <w:color w:val="4F46E5"/>
+        </w:rPr>
+        <w:t xml:space="preserve">orders</w:t>
+      </w:r>
+      <w:r>
+        <w:rPr>
+          <w:rFonts w:ascii="Arial" w:cs="Arial" w:eastAsia="Arial" w:hAnsi="Arial"/>
+        </w:rPr>
+        <w:t xml:space="preserve">, </w:t>
+      </w:r>
+      <w:r>
+        <w:rPr>
+          <w:rFonts w:ascii="Consolas" w:cs="Consolas" w:eastAsia="Consolas" w:hAnsi="Consolas"/>
+          <w:color w:val="4F46E5"/>
+        </w:rPr>
+        <w:t xml:space="preserve">payments</w:t>
+      </w:r>
+      <w:r>
+        <w:rPr>
+          <w:rFonts w:ascii="Arial" w:cs="Arial" w:eastAsia="Arial" w:hAnsi="Arial"/>
+        </w:rPr>
+        <w:t xml:space="preserve">, admin) más estrictas (20/40). Cada ruta declara su propio bloque de argumentos.</w:t>
+      </w:r>
+    </w:p>
+    <w:p>
+      <w:pPr>
+        <w:pStyle w:val="ListParagraph"/>
+        <w:numPr>
+          <w:ilvl w:val="0"/>
+          <w:numId w:val="2"/>
+        </w:numPr>
+        <w:spacing w:after="80" w:line="268"/>
+      </w:pPr>
+      <w:r>
+        <w:rPr>
+          <w:rFonts w:ascii="Arial" w:cs="Arial" w:eastAsia="Arial" w:hAnsi="Arial"/>
+          <w:b/>
+          <w:bCs/>
+        </w:rPr>
+        <w:t xml:space="preserve">Clave de identidad — el </w:t>
+      </w:r>
+      <w:r>
+        <w:rPr>
+          <w:rFonts w:ascii="Consolas" w:cs="Consolas" w:eastAsia="Consolas" w:hAnsi="Consolas"/>
+          <w:color w:val="4F46E5"/>
+        </w:rPr>
+        <w:t xml:space="preserve">KeyResolver</w:t>
+      </w:r>
+      <w:r>
+        <w:rPr>
+          <w:rFonts w:ascii="Arial" w:cs="Arial" w:eastAsia="Arial" w:hAnsi="Arial"/>
+          <w:b/>
+          <w:bCs/>
+        </w:rPr>
+        <w:t xml:space="preserve">: </w:t>
+      </w:r>
+      <w:r>
+        <w:rPr>
+          <w:rFonts w:ascii="Arial" w:cs="Arial" w:eastAsia="Arial" w:hAnsi="Arial"/>
+        </w:rPr>
+        <w:t xml:space="preserve">la novedad de esta fase es </w:t>
+      </w:r>
+      <w:r>
+        <w:rPr>
+          <w:rFonts w:ascii="Consolas" w:cs="Consolas" w:eastAsia="Consolas" w:hAnsi="Consolas"/>
+          <w:color w:val="4F46E5"/>
+        </w:rPr>
+        <w:t xml:space="preserve">RateLimitConfig.userOrIpKeyResolver</w:t>
+      </w:r>
+      <w:r>
+        <w:rPr>
+          <w:rFonts w:ascii="Arial" w:cs="Arial" w:eastAsia="Arial" w:hAnsi="Arial"/>
+        </w:rPr>
+        <w:t xml:space="preserve">: resuelve la clave del bucket al </w:t>
+      </w:r>
+      <w:r>
+        <w:rPr>
+          <w:rFonts w:ascii="Arial" w:cs="Arial" w:eastAsia="Arial" w:hAnsi="Arial"/>
+          <w:b/>
+          <w:bCs/>
+        </w:rPr>
+        <w:t xml:space="preserve">usuario autenticado</w:t>
+      </w:r>
+      <w:r>
+        <w:rPr>
+          <w:rFonts w:ascii="Arial" w:cs="Arial" w:eastAsia="Arial" w:hAnsi="Arial"/>
+        </w:rPr>
+        <w:t xml:space="preserve"> (nombre del principal del JWT) y, si es anónimo, cae a la </w:t>
+      </w:r>
+      <w:r>
+        <w:rPr>
+          <w:rFonts w:ascii="Arial" w:cs="Arial" w:eastAsia="Arial" w:hAnsi="Arial"/>
+          <w:b/>
+          <w:bCs/>
+        </w:rPr>
+        <w:t xml:space="preserve">IP real del cliente</w:t>
+      </w:r>
+      <w:r>
+        <w:rPr>
+          <w:rFonts w:ascii="Arial" w:cs="Arial" w:eastAsia="Arial" w:hAnsi="Arial"/>
+        </w:rPr>
+        <w:t xml:space="preserve"> leyendo </w:t>
+      </w:r>
+      <w:r>
+        <w:rPr>
+          <w:rFonts w:ascii="Consolas" w:cs="Consolas" w:eastAsia="Consolas" w:hAnsi="Consolas"/>
+          <w:color w:val="4F46E5"/>
+        </w:rPr>
+        <w:t xml:space="preserve">X-Forwarded-For</w:t>
+      </w:r>
+      <w:r>
+        <w:rPr>
+          <w:rFonts w:ascii="Arial" w:cs="Arial" w:eastAsia="Arial" w:hAnsi="Arial"/>
+        </w:rPr>
+        <w:t xml:space="preserve"> (primer salto) antes que la dirección del socket. Así un usuario logueado tiene su propio cupo aunque comparta IP (NAT/oficina), y el tráfico anónimo se limita por IP.</w:t>
+      </w:r>
+    </w:p>
+    <w:p>
+      <w:pPr>
+        <w:spacing w:after="120" w:line="276"/>
+      </w:pPr>
+      <w:r>
+        <w:rPr>
+          <w:rFonts w:ascii="Arial" w:cs="Arial" w:eastAsia="Arial" w:hAnsi="Arial"/>
+          <w:b/>
+          <w:bCs/>
+        </w:rPr>
+        <w:t xml:space="preserve">Verificación: </w:t>
+      </w:r>
+      <w:r>
+        <w:rPr>
+          <w:rFonts w:ascii="Arial" w:cs="Arial" w:eastAsia="Arial" w:hAnsi="Arial"/>
+        </w:rPr>
+        <w:t xml:space="preserve">con el gateway y su Redis levantados, lanzar peticiones en ráfaga a una ruta devuelve </w:t>
+      </w:r>
+      <w:r>
+        <w:rPr>
+          <w:rFonts w:ascii="Consolas" w:cs="Consolas" w:eastAsia="Consolas" w:hAnsi="Consolas"/>
+          <w:color w:val="4F46E5"/>
+        </w:rPr>
+        <w:t xml:space="preserve">200</w:t>
+      </w:r>
+      <w:r>
+        <w:rPr>
+          <w:rFonts w:ascii="Arial" w:cs="Arial" w:eastAsia="Arial" w:hAnsi="Arial"/>
+        </w:rPr>
+        <w:t xml:space="preserve"> hasta agotar el bucket y luego </w:t>
+      </w:r>
+      <w:r>
+        <w:rPr>
+          <w:rFonts w:ascii="Consolas" w:cs="Consolas" w:eastAsia="Consolas" w:hAnsi="Consolas"/>
+          <w:color w:val="4F46E5"/>
+        </w:rPr>
+        <w:t xml:space="preserve">429 Too Many Requests</w:t>
+      </w:r>
+      <w:r>
+        <w:rPr>
+          <w:rFonts w:ascii="Arial" w:cs="Arial" w:eastAsia="Arial" w:hAnsi="Arial"/>
+        </w:rPr>
+        <w:t xml:space="preserve">; al cambiar de usuario/IP el cupo es independiente.</w:t>
+      </w:r>
+    </w:p>
+    <w:p>
+      <w:pPr>
+        <w:pStyle w:val="Heading2"/>
+      </w:pPr>
+      <w:r>
+        <w:rPr>
+          <w:rFonts w:ascii="Arial" w:cs="Arial" w:eastAsia="Arial" w:hAnsi="Arial"/>
+        </w:rPr>
+        <w:t xml:space="preserve">13.41 GraphQL — API de agregación de lectura (catalog-service)</w:t>
+      </w:r>
+    </w:p>
+    <w:p>
+      <w:pPr>
+        <w:spacing w:after="120" w:line="276"/>
+      </w:pPr>
+      <w:r>
+        <w:rPr>
+          <w:rFonts w:ascii="Arial" w:cs="Arial" w:eastAsia="Arial" w:hAnsi="Arial"/>
+          <w:b/>
+          <w:bCs/>
+        </w:rPr>
+        <w:t xml:space="preserve">Qué es: </w:t>
+      </w:r>
+      <w:r>
+        <w:rPr>
+          <w:rFonts w:ascii="Arial" w:cs="Arial" w:eastAsia="Arial" w:hAnsi="Arial"/>
+        </w:rPr>
+        <w:t xml:space="preserve">una API </w:t>
+      </w:r>
+      <w:r>
+        <w:rPr>
+          <w:rFonts w:ascii="Arial" w:cs="Arial" w:eastAsia="Arial" w:hAnsi="Arial"/>
+          <w:b/>
+          <w:bCs/>
+        </w:rPr>
+        <w:t xml:space="preserve">tipada y orientada al cliente</w:t>
+      </w:r>
+      <w:r>
+        <w:rPr>
+          <w:rFonts w:ascii="Arial" w:cs="Arial" w:eastAsia="Arial" w:hAnsi="Arial"/>
+        </w:rPr>
+        <w:t xml:space="preserve"> que convive con el REST existente. Con REST el frontend a veces pide de más (campos que no usa) o de menos (varias llamadas para una pantalla). Con GraphQL el cliente pide en </w:t>
+      </w:r>
+      <w:r>
+        <w:rPr>
+          <w:rFonts w:ascii="Arial" w:cs="Arial" w:eastAsia="Arial" w:hAnsi="Arial"/>
+          <w:b/>
+          <w:bCs/>
+        </w:rPr>
+        <w:t xml:space="preserve">una sola consulta exactamente los campos que necesita</w:t>
+      </w:r>
+      <w:r>
+        <w:rPr>
+          <w:rFonts w:ascii="Arial" w:cs="Arial" w:eastAsia="Arial" w:hAnsi="Arial"/>
+        </w:rPr>
+        <w:t xml:space="preserve">, evitando el over/under-fetching.</w:t>
+      </w:r>
+    </w:p>
+    <w:p>
+      <w:pPr>
+        <w:pStyle w:val="ListParagraph"/>
+        <w:numPr>
+          <w:ilvl w:val="0"/>
+          <w:numId w:val="2"/>
+        </w:numPr>
+        <w:spacing w:after="80" w:line="268"/>
+      </w:pPr>
+      <w:r>
+        <w:rPr>
+          <w:rFonts w:ascii="Arial" w:cs="Arial" w:eastAsia="Arial" w:hAnsi="Arial"/>
+          <w:b/>
+          <w:bCs/>
+        </w:rPr>
+        <w:t xml:space="preserve">Schema-first: </w:t>
+      </w:r>
+      <w:r>
+        <w:rPr>
+          <w:rFonts w:ascii="Arial" w:cs="Arial" w:eastAsia="Arial" w:hAnsi="Arial"/>
+        </w:rPr>
+        <w:t xml:space="preserve">el contrato es el esquema </w:t>
+      </w:r>
+      <w:r>
+        <w:rPr>
+          <w:rFonts w:ascii="Consolas" w:cs="Consolas" w:eastAsia="Consolas" w:hAnsi="Consolas"/>
+          <w:color w:val="4F46E5"/>
+        </w:rPr>
+        <w:t xml:space="preserve">schema.graphqls</w:t>
+      </w:r>
+      <w:r>
+        <w:rPr>
+          <w:rFonts w:ascii="Arial" w:cs="Arial" w:eastAsia="Arial" w:hAnsi="Arial"/>
+        </w:rPr>
+        <w:t xml:space="preserve"> (</w:t>
+      </w:r>
+      <w:r>
+        <w:rPr>
+          <w:rFonts w:ascii="Consolas" w:cs="Consolas" w:eastAsia="Consolas" w:hAnsi="Consolas"/>
+          <w:color w:val="4F46E5"/>
+        </w:rPr>
+        <w:t xml:space="preserve">type Query</w:t>
+      </w:r>
+      <w:r>
+        <w:rPr>
+          <w:rFonts w:ascii="Arial" w:cs="Arial" w:eastAsia="Arial" w:hAnsi="Arial"/>
+        </w:rPr>
+        <w:t xml:space="preserve"> con </w:t>
+      </w:r>
+      <w:r>
+        <w:rPr>
+          <w:rFonts w:ascii="Consolas" w:cs="Consolas" w:eastAsia="Consolas" w:hAnsi="Consolas"/>
+          <w:color w:val="4F46E5"/>
+        </w:rPr>
+        <w:t xml:space="preserve">book(id)</w:t>
+      </w:r>
+      <w:r>
+        <w:rPr>
+          <w:rFonts w:ascii="Arial" w:cs="Arial" w:eastAsia="Arial" w:hAnsi="Arial"/>
+        </w:rPr>
+        <w:t xml:space="preserve"> y </w:t>
+      </w:r>
+      <w:r>
+        <w:rPr>
+          <w:rFonts w:ascii="Consolas" w:cs="Consolas" w:eastAsia="Consolas" w:hAnsi="Consolas"/>
+          <w:color w:val="4F46E5"/>
+        </w:rPr>
+        <w:t xml:space="preserve">books(page,size,categoryId,author)</w:t>
+      </w:r>
+      <w:r>
+        <w:rPr>
+          <w:rFonts w:ascii="Arial" w:cs="Arial" w:eastAsia="Arial" w:hAnsi="Arial"/>
+        </w:rPr>
+        <w:t xml:space="preserve">, y </w:t>
+      </w:r>
+      <w:r>
+        <w:rPr>
+          <w:rFonts w:ascii="Consolas" w:cs="Consolas" w:eastAsia="Consolas" w:hAnsi="Consolas"/>
+          <w:color w:val="4F46E5"/>
+        </w:rPr>
+        <w:t xml:space="preserve">type Book</w:t>
+      </w:r>
+      <w:r>
+        <w:rPr>
+          <w:rFonts w:ascii="Arial" w:cs="Arial" w:eastAsia="Arial" w:hAnsi="Arial"/>
+        </w:rPr>
+        <w:t xml:space="preserve">). Spring for GraphQL (</w:t>
+      </w:r>
+      <w:r>
+        <w:rPr>
+          <w:rFonts w:ascii="Consolas" w:cs="Consolas" w:eastAsia="Consolas" w:hAnsi="Consolas"/>
+          <w:color w:val="4F46E5"/>
+        </w:rPr>
+        <w:t xml:space="preserve">spring-boot-starter-graphql</w:t>
+      </w:r>
+      <w:r>
+        <w:rPr>
+          <w:rFonts w:ascii="Arial" w:cs="Arial" w:eastAsia="Arial" w:hAnsi="Arial"/>
+        </w:rPr>
+        <w:t xml:space="preserve">) mapea ese esquema a métodos Java; el esquema es la fuente de verdad.</w:t>
+      </w:r>
+    </w:p>
+    <w:p>
+      <w:pPr>
+        <w:pStyle w:val="ListParagraph"/>
+        <w:numPr>
+          <w:ilvl w:val="0"/>
+          <w:numId w:val="2"/>
+        </w:numPr>
+        <w:spacing w:after="80" w:line="268"/>
+      </w:pPr>
+      <w:r>
+        <w:rPr>
+          <w:rFonts w:ascii="Arial" w:cs="Arial" w:eastAsia="Arial" w:hAnsi="Arial"/>
+          <w:b/>
+          <w:bCs/>
+        </w:rPr>
+        <w:t xml:space="preserve">Reutiliza el dominio (hexagonal): </w:t>
+      </w:r>
+      <w:r>
+        <w:rPr>
+          <w:rFonts w:ascii="Arial" w:cs="Arial" w:eastAsia="Arial" w:hAnsi="Arial"/>
+        </w:rPr>
+        <w:t xml:space="preserve">el </w:t>
+      </w:r>
+      <w:r>
+        <w:rPr>
+          <w:rFonts w:ascii="Consolas" w:cs="Consolas" w:eastAsia="Consolas" w:hAnsi="Consolas"/>
+          <w:color w:val="4F46E5"/>
+        </w:rPr>
+        <w:t xml:space="preserve">BookGraphQlController</w:t>
+      </w:r>
+      <w:r>
+        <w:rPr>
+          <w:rFonts w:ascii="Arial" w:cs="Arial" w:eastAsia="Arial" w:hAnsi="Arial"/>
+        </w:rPr>
+        <w:t xml:space="preserve"> (</w:t>
+      </w:r>
+      <w:r>
+        <w:rPr>
+          <w:rFonts w:ascii="Consolas" w:cs="Consolas" w:eastAsia="Consolas" w:hAnsi="Consolas"/>
+          <w:color w:val="4F46E5"/>
+        </w:rPr>
+        <w:t xml:space="preserve">@QueryMapping</w:t>
+      </w:r>
+      <w:r>
+        <w:rPr>
+          <w:rFonts w:ascii="Arial" w:cs="Arial" w:eastAsia="Arial" w:hAnsi="Arial"/>
+        </w:rPr>
+        <w:t xml:space="preserve">) invoca los </w:t>
+      </w:r>
+      <w:r>
+        <w:rPr>
+          <w:rFonts w:ascii="Arial" w:cs="Arial" w:eastAsia="Arial" w:hAnsi="Arial"/>
+          <w:b/>
+          <w:bCs/>
+        </w:rPr>
+        <w:t xml:space="preserve">mismos casos de uso</w:t>
+      </w:r>
+      <w:r>
+        <w:rPr>
+          <w:rFonts w:ascii="Arial" w:cs="Arial" w:eastAsia="Arial" w:hAnsi="Arial"/>
+        </w:rPr>
+        <w:t xml:space="preserve"> que el adaptador REST (</w:t>
+      </w:r>
+      <w:r>
+        <w:rPr>
+          <w:rFonts w:ascii="Consolas" w:cs="Consolas" w:eastAsia="Consolas" w:hAnsi="Consolas"/>
+          <w:color w:val="4F46E5"/>
+        </w:rPr>
+        <w:t xml:space="preserve">GetBookUseCase</w:t>
+      </w:r>
+      <w:r>
+        <w:rPr>
+          <w:rFonts w:ascii="Arial" w:cs="Arial" w:eastAsia="Arial" w:hAnsi="Arial"/>
+        </w:rPr>
+        <w:t xml:space="preserve">, </w:t>
+      </w:r>
+      <w:r>
+        <w:rPr>
+          <w:rFonts w:ascii="Consolas" w:cs="Consolas" w:eastAsia="Consolas" w:hAnsi="Consolas"/>
+          <w:color w:val="4F46E5"/>
+        </w:rPr>
+        <w:t xml:space="preserve">ListBooksUseCase</w:t>
+      </w:r>
+      <w:r>
+        <w:rPr>
+          <w:rFonts w:ascii="Arial" w:cs="Arial" w:eastAsia="Arial" w:hAnsi="Arial"/>
+        </w:rPr>
+        <w:t xml:space="preserve">) y el mismo mapper </w:t>
+      </w:r>
+      <w:r>
+        <w:rPr>
+          <w:rFonts w:ascii="Consolas" w:cs="Consolas" w:eastAsia="Consolas" w:hAnsi="Consolas"/>
+          <w:color w:val="4F46E5"/>
+        </w:rPr>
+        <w:t xml:space="preserve">BookResponse.from</w:t>
+      </w:r>
+      <w:r>
+        <w:rPr>
+          <w:rFonts w:ascii="Arial" w:cs="Arial" w:eastAsia="Arial" w:hAnsi="Arial"/>
+        </w:rPr>
+        <w:t xml:space="preserve">. GraphQL es solo otro </w:t>
+      </w:r>
+      <w:r>
+        <w:rPr>
+          <w:rFonts w:ascii="Arial" w:cs="Arial" w:eastAsia="Arial" w:hAnsi="Arial"/>
+          <w:b/>
+          <w:bCs/>
+        </w:rPr>
+        <w:t xml:space="preserve">adaptador de entrada</w:t>
+      </w:r>
+      <w:r>
+        <w:rPr>
+          <w:rFonts w:ascii="Arial" w:cs="Arial" w:eastAsia="Arial" w:hAnsi="Arial"/>
+        </w:rPr>
+        <w:t xml:space="preserve">: el dominio no sabe si lo llaman por REST o por GraphQL. Cero lógica de negocio duplicada.</w:t>
+      </w:r>
+    </w:p>
+    <w:p>
+      <w:pPr>
+        <w:pStyle w:val="ListParagraph"/>
+        <w:numPr>
+          <w:ilvl w:val="0"/>
+          <w:numId w:val="2"/>
+        </w:numPr>
+        <w:spacing w:after="80" w:line="268"/>
+      </w:pPr>
+      <w:r>
+        <w:rPr>
+          <w:rFonts w:ascii="Arial" w:cs="Arial" w:eastAsia="Arial" w:hAnsi="Arial"/>
+          <w:b/>
+          <w:bCs/>
+        </w:rPr>
+        <w:t xml:space="preserve">Seguridad y ruteo coherentes: </w:t>
+      </w:r>
+      <w:r>
+        <w:rPr>
+          <w:rFonts w:ascii="Arial" w:cs="Arial" w:eastAsia="Arial" w:hAnsi="Arial"/>
+        </w:rPr>
+        <w:t xml:space="preserve">igual que los GET públicos del catálogo, </w:t>
+      </w:r>
+      <w:r>
+        <w:rPr>
+          <w:rFonts w:ascii="Consolas" w:cs="Consolas" w:eastAsia="Consolas" w:hAnsi="Consolas"/>
+          <w:color w:val="4F46E5"/>
+        </w:rPr>
+        <w:t xml:space="preserve">/graphql</w:t>
+      </w:r>
+      <w:r>
+        <w:rPr>
+          <w:rFonts w:ascii="Arial" w:cs="Arial" w:eastAsia="Arial" w:hAnsi="Arial"/>
+        </w:rPr>
+        <w:t xml:space="preserve"> y </w:t>
+      </w:r>
+      <w:r>
+        <w:rPr>
+          <w:rFonts w:ascii="Consolas" w:cs="Consolas" w:eastAsia="Consolas" w:hAnsi="Consolas"/>
+          <w:color w:val="4F46E5"/>
+        </w:rPr>
+        <w:t xml:space="preserve">/graphiql</w:t>
+      </w:r>
+      <w:r>
+        <w:rPr>
+          <w:rFonts w:ascii="Arial" w:cs="Arial" w:eastAsia="Arial" w:hAnsi="Arial"/>
+        </w:rPr>
+        <w:t xml:space="preserve"> se permiten en el </w:t>
+      </w:r>
+      <w:r>
+        <w:rPr>
+          <w:rFonts w:ascii="Consolas" w:cs="Consolas" w:eastAsia="Consolas" w:hAnsi="Consolas"/>
+          <w:color w:val="4F46E5"/>
+        </w:rPr>
+        <w:t xml:space="preserve">SecurityConfig</w:t>
+      </w:r>
+      <w:r>
+        <w:rPr>
+          <w:rFonts w:ascii="Arial" w:cs="Arial" w:eastAsia="Arial" w:hAnsi="Arial"/>
+        </w:rPr>
+        <w:t xml:space="preserve">; y el gateway expone una ruta </w:t>
+      </w:r>
+      <w:r>
+        <w:rPr>
+          <w:rFonts w:ascii="Consolas" w:cs="Consolas" w:eastAsia="Consolas" w:hAnsi="Consolas"/>
+          <w:color w:val="4F46E5"/>
+        </w:rPr>
+        <w:t xml:space="preserve">catalog-graphql</w:t>
+      </w:r>
+      <w:r>
+        <w:rPr>
+          <w:rFonts w:ascii="Arial" w:cs="Arial" w:eastAsia="Arial" w:hAnsi="Arial"/>
+        </w:rPr>
+        <w:t xml:space="preserve"> con su propio rate limiting. En dev queda habilitado </w:t>
+      </w:r>
+      <w:r>
+        <w:rPr>
+          <w:rFonts w:ascii="Arial" w:cs="Arial" w:eastAsia="Arial" w:hAnsi="Arial"/>
+          <w:b/>
+          <w:bCs/>
+        </w:rPr>
+        <w:t xml:space="preserve">GraphiQL</w:t>
+      </w:r>
+      <w:r>
+        <w:rPr>
+          <w:rFonts w:ascii="Arial" w:cs="Arial" w:eastAsia="Arial" w:hAnsi="Arial"/>
+        </w:rPr>
+        <w:t xml:space="preserve"> (IDE interactivo en </w:t>
+      </w:r>
+      <w:r>
+        <w:rPr>
+          <w:rFonts w:ascii="Consolas" w:cs="Consolas" w:eastAsia="Consolas" w:hAnsi="Consolas"/>
+          <w:color w:val="4F46E5"/>
+        </w:rPr>
+        <w:t xml:space="preserve">/graphiql</w:t>
+      </w:r>
+      <w:r>
+        <w:rPr>
+          <w:rFonts w:ascii="Arial" w:cs="Arial" w:eastAsia="Arial" w:hAnsi="Arial"/>
+        </w:rPr>
+        <w:t xml:space="preserve">) para explorar el esquema.</w:t>
+      </w:r>
+    </w:p>
+    <w:p>
+      <w:pPr>
+        <w:spacing w:after="120" w:line="276"/>
+      </w:pPr>
+      <w:r>
+        <w:rPr>
+          <w:rFonts w:ascii="Arial" w:cs="Arial" w:eastAsia="Arial" w:hAnsi="Arial"/>
+          <w:b/>
+          <w:bCs/>
+        </w:rPr>
+        <w:t xml:space="preserve">Verificación: </w:t>
+      </w:r>
+      <w:r>
+        <w:rPr>
+          <w:rFonts w:ascii="Arial" w:cs="Arial" w:eastAsia="Arial" w:hAnsi="Arial"/>
+        </w:rPr>
+        <w:t xml:space="preserve">un POST a </w:t>
+      </w:r>
+      <w:r>
+        <w:rPr>
+          <w:rFonts w:ascii="Consolas" w:cs="Consolas" w:eastAsia="Consolas" w:hAnsi="Consolas"/>
+          <w:color w:val="4F46E5"/>
+        </w:rPr>
+        <w:t xml:space="preserve">/graphql</w:t>
+      </w:r>
+      <w:r>
+        <w:rPr>
+          <w:rFonts w:ascii="Arial" w:cs="Arial" w:eastAsia="Arial" w:hAnsi="Arial"/>
+        </w:rPr>
+        <w:t xml:space="preserve"> con </w:t>
+      </w:r>
+      <w:r>
+        <w:rPr>
+          <w:rFonts w:ascii="Consolas" w:cs="Consolas" w:eastAsia="Consolas" w:hAnsi="Consolas"/>
+          <w:color w:val="4F46E5"/>
+        </w:rPr>
+        <w:t xml:space="preserve">{ books(size:5){ id title price } }</w:t>
+      </w:r>
+      <w:r>
+        <w:rPr>
+          <w:rFonts w:ascii="Arial" w:cs="Arial" w:eastAsia="Arial" w:hAnsi="Arial"/>
+        </w:rPr>
+        <w:t xml:space="preserve"> devuelve solo esos tres campos; </w:t>
+      </w:r>
+      <w:r>
+        <w:rPr>
+          <w:rFonts w:ascii="Consolas" w:cs="Consolas" w:eastAsia="Consolas" w:hAnsi="Consolas"/>
+          <w:color w:val="4F46E5"/>
+        </w:rPr>
+        <w:t xml:space="preserve">GraphiQL</w:t>
+      </w:r>
+      <w:r>
+        <w:rPr>
+          <w:rFonts w:ascii="Arial" w:cs="Arial" w:eastAsia="Arial" w:hAnsi="Arial"/>
+        </w:rPr>
+        <w:t xml:space="preserve"> muestra el esquema autodocumentado y permite probar consultas.</w:t>
+      </w:r>
+    </w:p>
+    <w:p>
+      <w:pPr>
+        <w:pStyle w:val="Heading2"/>
+      </w:pPr>
+      <w:r>
+        <w:rPr>
+          <w:rFonts w:ascii="Arial" w:cs="Arial" w:eastAsia="Arial" w:hAnsi="Arial"/>
+        </w:rPr>
+        <w:t xml:space="preserve">13.42 gRPC interno — comunicación servicio-a-servicio (inventory)</w:t>
+      </w:r>
+    </w:p>
+    <w:p>
+      <w:pPr>
+        <w:spacing w:after="120" w:line="276"/>
+      </w:pPr>
+      <w:r>
+        <w:rPr>
+          <w:rFonts w:ascii="Arial" w:cs="Arial" w:eastAsia="Arial" w:hAnsi="Arial"/>
+          <w:b/>
+          <w:bCs/>
+        </w:rPr>
+        <w:t xml:space="preserve">Qué es: </w:t>
+      </w:r>
+      <w:r>
+        <w:rPr>
+          <w:rFonts w:ascii="Arial" w:cs="Arial" w:eastAsia="Arial" w:hAnsi="Arial"/>
+        </w:rPr>
+        <w:t xml:space="preserve">un canal de llamada entre servicios </w:t>
+      </w:r>
+      <w:r>
+        <w:rPr>
+          <w:rFonts w:ascii="Arial" w:cs="Arial" w:eastAsia="Arial" w:hAnsi="Arial"/>
+          <w:b/>
+          <w:bCs/>
+        </w:rPr>
+        <w:t xml:space="preserve">de alto rendimiento</w:t>
+      </w:r>
+      <w:r>
+        <w:rPr>
+          <w:rFonts w:ascii="Arial" w:cs="Arial" w:eastAsia="Arial" w:hAnsi="Arial"/>
+        </w:rPr>
+        <w:t xml:space="preserve"> basado en HTTP/2 y </w:t>
+      </w:r>
+      <w:r>
+        <w:rPr>
+          <w:rFonts w:ascii="Arial" w:cs="Arial" w:eastAsia="Arial" w:hAnsi="Arial"/>
+          <w:b/>
+          <w:bCs/>
+        </w:rPr>
+        <w:t xml:space="preserve">Protocol Buffers</w:t>
+      </w:r>
+      <w:r>
+        <w:rPr>
+          <w:rFonts w:ascii="Arial" w:cs="Arial" w:eastAsia="Arial" w:hAnsi="Arial"/>
+        </w:rPr>
+        <w:t xml:space="preserve"> (binario) en lugar de REST/JSON. Es el estándar de facto para comunicación interna en arquitecturas de microservicios (Google, Netflix): menor latencia, payloads más pequeños y un </w:t>
+      </w:r>
+      <w:r>
+        <w:rPr>
+          <w:rFonts w:ascii="Arial" w:cs="Arial" w:eastAsia="Arial" w:hAnsi="Arial"/>
+          <w:b/>
+          <w:bCs/>
+        </w:rPr>
+        <w:t xml:space="preserve">contrato fuertemente tipado</w:t>
+      </w:r>
+      <w:r>
+        <w:rPr>
+          <w:rFonts w:ascii="Arial" w:cs="Arial" w:eastAsia="Arial" w:hAnsi="Arial"/>
+        </w:rPr>
+        <w:t xml:space="preserve">.</w:t>
+      </w:r>
+    </w:p>
+    <w:p>
+      <w:pPr>
+        <w:pStyle w:val="ListParagraph"/>
+        <w:numPr>
+          <w:ilvl w:val="0"/>
+          <w:numId w:val="2"/>
+        </w:numPr>
+        <w:spacing w:after="80" w:line="268"/>
+      </w:pPr>
+      <w:r>
+        <w:rPr>
+          <w:rFonts w:ascii="Arial" w:cs="Arial" w:eastAsia="Arial" w:hAnsi="Arial"/>
+          <w:b/>
+          <w:bCs/>
+        </w:rPr>
+        <w:t xml:space="preserve">Contract-first (el </w:t>
+      </w:r>
+      <w:r>
+        <w:rPr>
+          <w:rFonts w:ascii="Consolas" w:cs="Consolas" w:eastAsia="Consolas" w:hAnsi="Consolas"/>
+          <w:color w:val="4F46E5"/>
+        </w:rPr>
+        <w:t xml:space="preserve">.proto</w:t>
+      </w:r>
+      <w:r>
+        <w:rPr>
+          <w:rFonts w:ascii="Arial" w:cs="Arial" w:eastAsia="Arial" w:hAnsi="Arial"/>
+          <w:b/>
+          <w:bCs/>
+        </w:rPr>
+        <w:t xml:space="preserve"> manda): </w:t>
+      </w:r>
+      <w:r>
+        <w:rPr>
+          <w:rFonts w:ascii="Arial" w:cs="Arial" w:eastAsia="Arial" w:hAnsi="Arial"/>
+        </w:rPr>
+        <w:t xml:space="preserve">el contrato es </w:t>
+      </w:r>
+      <w:r>
+        <w:rPr>
+          <w:rFonts w:ascii="Consolas" w:cs="Consolas" w:eastAsia="Consolas" w:hAnsi="Consolas"/>
+          <w:color w:val="4F46E5"/>
+        </w:rPr>
+        <w:t xml:space="preserve">src/main/proto/stock.proto</w:t>
+      </w:r>
+      <w:r>
+        <w:rPr>
+          <w:rFonts w:ascii="Arial" w:cs="Arial" w:eastAsia="Arial" w:hAnsi="Arial"/>
+        </w:rPr>
+        <w:t xml:space="preserve"> (</w:t>
+      </w:r>
+      <w:r>
+        <w:rPr>
+          <w:rFonts w:ascii="Consolas" w:cs="Consolas" w:eastAsia="Consolas" w:hAnsi="Consolas"/>
+          <w:color w:val="4F46E5"/>
+        </w:rPr>
+        <w:t xml:space="preserve">service StockService</w:t>
+      </w:r>
+      <w:r>
+        <w:rPr>
+          <w:rFonts w:ascii="Arial" w:cs="Arial" w:eastAsia="Arial" w:hAnsi="Arial"/>
+        </w:rPr>
+        <w:t xml:space="preserve"> con </w:t>
+      </w:r>
+      <w:r>
+        <w:rPr>
+          <w:rFonts w:ascii="Consolas" w:cs="Consolas" w:eastAsia="Consolas" w:hAnsi="Consolas"/>
+          <w:color w:val="4F46E5"/>
+        </w:rPr>
+        <w:t xml:space="preserve">rpc CheckStock</w:t>
+      </w:r>
+      <w:r>
+        <w:rPr>
+          <w:rFonts w:ascii="Arial" w:cs="Arial" w:eastAsia="Arial" w:hAnsi="Arial"/>
+        </w:rPr>
+        <w:t xml:space="preserve">). El </w:t>
+      </w:r>
+      <w:r>
+        <w:rPr>
+          <w:rFonts w:ascii="Consolas" w:cs="Consolas" w:eastAsia="Consolas" w:hAnsi="Consolas"/>
+          <w:color w:val="4F46E5"/>
+        </w:rPr>
+        <w:t xml:space="preserve">protobuf-maven-plugin</w:t>
+      </w:r>
+      <w:r>
+        <w:rPr>
+          <w:rFonts w:ascii="Arial" w:cs="Arial" w:eastAsia="Arial" w:hAnsi="Arial"/>
+        </w:rPr>
+        <w:t xml:space="preserve"> (con </w:t>
+      </w:r>
+      <w:r>
+        <w:rPr>
+          <w:rFonts w:ascii="Consolas" w:cs="Consolas" w:eastAsia="Consolas" w:hAnsi="Consolas"/>
+          <w:color w:val="4F46E5"/>
+        </w:rPr>
+        <w:t xml:space="preserve">os-maven-plugin</w:t>
+      </w:r>
+      <w:r>
+        <w:rPr>
+          <w:rFonts w:ascii="Arial" w:cs="Arial" w:eastAsia="Arial" w:hAnsi="Arial"/>
+        </w:rPr>
+        <w:t xml:space="preserve"> para elegir el </w:t>
+      </w:r>
+      <w:r>
+        <w:rPr>
+          <w:rFonts w:ascii="Consolas" w:cs="Consolas" w:eastAsia="Consolas" w:hAnsi="Consolas"/>
+          <w:color w:val="4F46E5"/>
+        </w:rPr>
+        <w:t xml:space="preserve">protoc</w:t>
+      </w:r>
+      <w:r>
+        <w:rPr>
+          <w:rFonts w:ascii="Arial" w:cs="Arial" w:eastAsia="Arial" w:hAnsi="Arial"/>
+        </w:rPr>
+        <w:t xml:space="preserve"> del SO) </w:t>
+      </w:r>
+      <w:r>
+        <w:rPr>
+          <w:rFonts w:ascii="Arial" w:cs="Arial" w:eastAsia="Arial" w:hAnsi="Arial"/>
+          <w:b/>
+          <w:bCs/>
+        </w:rPr>
+        <w:t xml:space="preserve">genera los stubs Java</w:t>
+      </w:r>
+      <w:r>
+        <w:rPr>
+          <w:rFonts w:ascii="Arial" w:cs="Arial" w:eastAsia="Arial" w:hAnsi="Arial"/>
+        </w:rPr>
+        <w:t xml:space="preserve"> — mensajes y </w:t>
+      </w:r>
+      <w:r>
+        <w:rPr>
+          <w:rFonts w:ascii="Consolas" w:cs="Consolas" w:eastAsia="Consolas" w:hAnsi="Consolas"/>
+          <w:color w:val="4F46E5"/>
+        </w:rPr>
+        <w:t xml:space="preserve">StockServiceGrpc</w:t>
+      </w:r>
+      <w:r>
+        <w:rPr>
+          <w:rFonts w:ascii="Arial" w:cs="Arial" w:eastAsia="Arial" w:hAnsi="Arial"/>
+        </w:rPr>
+        <w:t xml:space="preserve"> — en cada build. El </w:t>
+      </w:r>
+      <w:r>
+        <w:rPr>
+          <w:rFonts w:ascii="Consolas" w:cs="Consolas" w:eastAsia="Consolas" w:hAnsi="Consolas"/>
+          <w:color w:val="4F46E5"/>
+        </w:rPr>
+        <w:t xml:space="preserve">.proto</w:t>
+      </w:r>
+      <w:r>
+        <w:rPr>
+          <w:rFonts w:ascii="Arial" w:cs="Arial" w:eastAsia="Arial" w:hAnsi="Arial"/>
+        </w:rPr>
+        <w:t xml:space="preserve"> es la única fuente de verdad, versionable y compartible con otros lenguajes.</w:t>
+      </w:r>
+    </w:p>
+    <w:p>
+      <w:pPr>
+        <w:pStyle w:val="ListParagraph"/>
+        <w:numPr>
+          <w:ilvl w:val="0"/>
+          <w:numId w:val="2"/>
+        </w:numPr>
+        <w:spacing w:after="80" w:line="268"/>
+      </w:pPr>
+      <w:r>
+        <w:rPr>
+          <w:rFonts w:ascii="Arial" w:cs="Arial" w:eastAsia="Arial" w:hAnsi="Arial"/>
+          <w:b/>
+          <w:bCs/>
+        </w:rPr>
+        <w:t xml:space="preserve">Servidor embebido con Spring: </w:t>
+      </w:r>
+      <w:r>
+        <w:rPr>
+          <w:rFonts w:ascii="Consolas" w:cs="Consolas" w:eastAsia="Consolas" w:hAnsi="Consolas"/>
+          <w:color w:val="4F46E5"/>
+        </w:rPr>
+        <w:t xml:space="preserve">grpc-server-spring-boot-starter</w:t>
+      </w:r>
+      <w:r>
+        <w:rPr>
+          <w:rFonts w:ascii="Arial" w:cs="Arial" w:eastAsia="Arial" w:hAnsi="Arial"/>
+        </w:rPr>
+        <w:t xml:space="preserve"> (net.devh) descubre los </w:t>
+      </w:r>
+      <w:r>
+        <w:rPr>
+          <w:rFonts w:ascii="Consolas" w:cs="Consolas" w:eastAsia="Consolas" w:hAnsi="Consolas"/>
+          <w:color w:val="4F46E5"/>
+        </w:rPr>
+        <w:t xml:space="preserve">@GrpcService</w:t>
+      </w:r>
+      <w:r>
+        <w:rPr>
+          <w:rFonts w:ascii="Arial" w:cs="Arial" w:eastAsia="Arial" w:hAnsi="Arial"/>
+        </w:rPr>
+        <w:t xml:space="preserve"> y arranca un servidor gRPC (puerto </w:t>
+      </w:r>
+      <w:r>
+        <w:rPr>
+          <w:rFonts w:ascii="Consolas" w:cs="Consolas" w:eastAsia="Consolas" w:hAnsi="Consolas"/>
+          <w:color w:val="4F46E5"/>
+        </w:rPr>
+        <w:t xml:space="preserve">9090</w:t>
+      </w:r>
+      <w:r>
+        <w:rPr>
+          <w:rFonts w:ascii="Arial" w:cs="Arial" w:eastAsia="Arial" w:hAnsi="Arial"/>
+        </w:rPr>
+        <w:t xml:space="preserve">) junto al contexto de Spring, en paralelo al servidor HTTP. El </w:t>
+      </w:r>
+      <w:r>
+        <w:rPr>
+          <w:rFonts w:ascii="Consolas" w:cs="Consolas" w:eastAsia="Consolas" w:hAnsi="Consolas"/>
+          <w:color w:val="4F46E5"/>
+        </w:rPr>
+        <w:t xml:space="preserve">StockGrpcService</w:t>
+      </w:r>
+      <w:r>
+        <w:rPr>
+          <w:rFonts w:ascii="Arial" w:cs="Arial" w:eastAsia="Arial" w:hAnsi="Arial"/>
+        </w:rPr>
+        <w:t xml:space="preserve"> implementa </w:t>
+      </w:r>
+      <w:r>
+        <w:rPr>
+          <w:rFonts w:ascii="Consolas" w:cs="Consolas" w:eastAsia="Consolas" w:hAnsi="Consolas"/>
+          <w:color w:val="4F46E5"/>
+        </w:rPr>
+        <w:t xml:space="preserve">CheckStock</w:t>
+      </w:r>
+      <w:r>
+        <w:rPr>
+          <w:rFonts w:ascii="Arial" w:cs="Arial" w:eastAsia="Arial" w:hAnsi="Arial"/>
+        </w:rPr>
+        <w:t xml:space="preserve"> mapeando la petición al dominio.</w:t>
+      </w:r>
+    </w:p>
+    <w:p>
+      <w:pPr>
+        <w:pStyle w:val="ListParagraph"/>
+        <w:numPr>
+          <w:ilvl w:val="0"/>
+          <w:numId w:val="2"/>
+        </w:numPr>
+        <w:spacing w:after="80" w:line="268"/>
+      </w:pPr>
+      <w:r>
+        <w:rPr>
+          <w:rFonts w:ascii="Arial" w:cs="Arial" w:eastAsia="Arial" w:hAnsi="Arial"/>
+          <w:b/>
+          <w:bCs/>
+        </w:rPr>
+        <w:t xml:space="preserve">Reutiliza el dominio (hexagonal): </w:t>
+      </w:r>
+      <w:r>
+        <w:rPr>
+          <w:rFonts w:ascii="Arial" w:cs="Arial" w:eastAsia="Arial" w:hAnsi="Arial"/>
+        </w:rPr>
+        <w:t xml:space="preserve">igual que GraphQL, gRPC es solo </w:t>
+      </w:r>
+      <w:r>
+        <w:rPr>
+          <w:rFonts w:ascii="Arial" w:cs="Arial" w:eastAsia="Arial" w:hAnsi="Arial"/>
+          <w:b/>
+          <w:bCs/>
+        </w:rPr>
+        <w:t xml:space="preserve">otro adaptador de entrada</w:t>
+      </w:r>
+      <w:r>
+        <w:rPr>
+          <w:rFonts w:ascii="Arial" w:cs="Arial" w:eastAsia="Arial" w:hAnsi="Arial"/>
+        </w:rPr>
+        <w:t xml:space="preserve">: </w:t>
+      </w:r>
+      <w:r>
+        <w:rPr>
+          <w:rFonts w:ascii="Consolas" w:cs="Consolas" w:eastAsia="Consolas" w:hAnsi="Consolas"/>
+          <w:color w:val="4F46E5"/>
+        </w:rPr>
+        <w:t xml:space="preserve">StockGrpcService</w:t>
+      </w:r>
+      <w:r>
+        <w:rPr>
+          <w:rFonts w:ascii="Arial" w:cs="Arial" w:eastAsia="Arial" w:hAnsi="Arial"/>
+        </w:rPr>
+        <w:t xml:space="preserve"> delega en el </w:t>
+      </w:r>
+      <w:r>
+        <w:rPr>
+          <w:rFonts w:ascii="Arial" w:cs="Arial" w:eastAsia="Arial" w:hAnsi="Arial"/>
+          <w:b/>
+          <w:bCs/>
+        </w:rPr>
+        <w:t xml:space="preserve">mismo</w:t>
+      </w:r>
+      <w:r>
+        <w:rPr>
+          <w:rFonts w:ascii="Arial" w:cs="Arial" w:eastAsia="Arial" w:hAnsi="Arial"/>
+        </w:rPr>
+        <w:t xml:space="preserve"> </w:t>
+      </w:r>
+      <w:r>
+        <w:rPr>
+          <w:rFonts w:ascii="Consolas" w:cs="Consolas" w:eastAsia="Consolas" w:hAnsi="Consolas"/>
+          <w:color w:val="4F46E5"/>
+        </w:rPr>
+        <w:t xml:space="preserve">GetStockUseCase</w:t>
+      </w:r>
+      <w:r>
+        <w:rPr>
+          <w:rFonts w:ascii="Arial" w:cs="Arial" w:eastAsia="Arial" w:hAnsi="Arial"/>
+        </w:rPr>
+        <w:t xml:space="preserve"> que usa el REST y devuelve disponibilidad (</w:t>
+      </w:r>
+      <w:r>
+        <w:rPr>
+          <w:rFonts w:ascii="Consolas" w:cs="Consolas" w:eastAsia="Consolas" w:hAnsi="Consolas"/>
+          <w:color w:val="4F46E5"/>
+        </w:rPr>
+        <w:t xml:space="preserve">available</w:t>
+      </w:r>
+      <w:r>
+        <w:rPr>
+          <w:rFonts w:ascii="Arial" w:cs="Arial" w:eastAsia="Arial" w:hAnsi="Arial"/>
+        </w:rPr>
+        <w:t xml:space="preserve">, </w:t>
+      </w:r>
+      <w:r>
+        <w:rPr>
+          <w:rFonts w:ascii="Consolas" w:cs="Consolas" w:eastAsia="Consolas" w:hAnsi="Consolas"/>
+          <w:color w:val="4F46E5"/>
+        </w:rPr>
+        <w:t xml:space="preserve">quantityAvailable</w:t>
+      </w:r>
+      <w:r>
+        <w:rPr>
+          <w:rFonts w:ascii="Arial" w:cs="Arial" w:eastAsia="Arial" w:hAnsi="Arial"/>
+        </w:rPr>
+        <w:t xml:space="preserve">, </w:t>
+      </w:r>
+      <w:r>
+        <w:rPr>
+          <w:rFonts w:ascii="Consolas" w:cs="Consolas" w:eastAsia="Consolas" w:hAnsi="Consolas"/>
+          <w:color w:val="4F46E5"/>
+        </w:rPr>
+        <w:t xml:space="preserve">quantityReserved</w:t>
+      </w:r>
+      <w:r>
+        <w:rPr>
+          <w:rFonts w:ascii="Arial" w:cs="Arial" w:eastAsia="Arial" w:hAnsi="Arial"/>
+        </w:rPr>
+        <w:t xml:space="preserve">, </w:t>
+      </w:r>
+      <w:r>
+        <w:rPr>
+          <w:rFonts w:ascii="Consolas" w:cs="Consolas" w:eastAsia="Consolas" w:hAnsi="Consolas"/>
+          <w:color w:val="4F46E5"/>
+        </w:rPr>
+        <w:t xml:space="preserve">quantityTotal</w:t>
+      </w:r>
+      <w:r>
+        <w:rPr>
+          <w:rFonts w:ascii="Arial" w:cs="Arial" w:eastAsia="Arial" w:hAnsi="Arial"/>
+        </w:rPr>
+        <w:t xml:space="preserve">). Un </w:t>
+      </w:r>
+      <w:r>
+        <w:rPr>
+          <w:rFonts w:ascii="Consolas" w:cs="Consolas" w:eastAsia="Consolas" w:hAnsi="Consolas"/>
+          <w:color w:val="4F46E5"/>
+        </w:rPr>
+        <w:t xml:space="preserve">order</w:t>
+      </w:r>
+      <w:r>
+        <w:rPr>
+          <w:rFonts w:ascii="Arial" w:cs="Arial" w:eastAsia="Arial" w:hAnsi="Arial"/>
+        </w:rPr>
+        <w:t xml:space="preserve"> o </w:t>
+      </w:r>
+      <w:r>
+        <w:rPr>
+          <w:rFonts w:ascii="Consolas" w:cs="Consolas" w:eastAsia="Consolas" w:hAnsi="Consolas"/>
+          <w:color w:val="4F46E5"/>
+        </w:rPr>
+        <w:t xml:space="preserve">cart</w:t>
+      </w:r>
+      <w:r>
+        <w:rPr>
+          <w:rFonts w:ascii="Arial" w:cs="Arial" w:eastAsia="Arial" w:hAnsi="Arial"/>
+        </w:rPr>
+        <w:t xml:space="preserve"> podría consultar stock por gRPC sin pasar por JSON.</w:t>
+      </w:r>
+    </w:p>
+    <w:p>
+      <w:pPr>
+        <w:spacing w:after="120" w:line="276"/>
+      </w:pPr>
+      <w:r>
+        <w:rPr>
+          <w:rFonts w:ascii="Arial" w:cs="Arial" w:eastAsia="Arial" w:hAnsi="Arial"/>
+          <w:b/>
+          <w:bCs/>
+        </w:rPr>
+        <w:t xml:space="preserve">Verificación: </w:t>
+      </w:r>
+      <w:r>
+        <w:rPr>
+          <w:rFonts w:ascii="Arial" w:cs="Arial" w:eastAsia="Arial" w:hAnsi="Arial"/>
+        </w:rPr>
+        <w:t xml:space="preserve">un test con </w:t>
+      </w:r>
+      <w:r>
+        <w:rPr>
+          <w:rFonts w:ascii="Arial" w:cs="Arial" w:eastAsia="Arial" w:hAnsi="Arial"/>
+          <w:b/>
+          <w:bCs/>
+        </w:rPr>
+        <w:t xml:space="preserve">canal in-process</w:t>
+      </w:r>
+      <w:r>
+        <w:rPr>
+          <w:rFonts w:ascii="Arial" w:cs="Arial" w:eastAsia="Arial" w:hAnsi="Arial"/>
+        </w:rPr>
+        <w:t xml:space="preserve"> (</w:t>
+      </w:r>
+      <w:r>
+        <w:rPr>
+          <w:rFonts w:ascii="Consolas" w:cs="Consolas" w:eastAsia="Consolas" w:hAnsi="Consolas"/>
+          <w:color w:val="4F46E5"/>
+        </w:rPr>
+        <w:t xml:space="preserve">StockGrpcServiceTest</w:t>
+      </w:r>
+      <w:r>
+        <w:rPr>
+          <w:rFonts w:ascii="Arial" w:cs="Arial" w:eastAsia="Arial" w:hAnsi="Arial"/>
+        </w:rPr>
+        <w:t xml:space="preserve">) arranca el servicio gRPC en memoria con un caso de uso simulado y comprueba, con un stub bloqueante, que </w:t>
+      </w:r>
+      <w:r>
+        <w:rPr>
+          <w:rFonts w:ascii="Consolas" w:cs="Consolas" w:eastAsia="Consolas" w:hAnsi="Consolas"/>
+          <w:color w:val="4F46E5"/>
+        </w:rPr>
+        <w:t xml:space="preserve">CheckStock</w:t>
+      </w:r>
+      <w:r>
+        <w:rPr>
+          <w:rFonts w:ascii="Arial" w:cs="Arial" w:eastAsia="Arial" w:hAnsi="Arial"/>
+        </w:rPr>
+        <w:t xml:space="preserve"> devuelve la disponibilidad correcta — sin abrir puertos ni red.</w:t>
+      </w:r>
+    </w:p>
+    <w:p>
+      <w:pPr>
         <w:pStyle w:val="Heading1"/>
       </w:pPr>
       <w:r>
@@ -17996,6 +19322,291 @@
           </w:p>
         </w:tc>
       </w:tr>
+      <w:tr>
+        <w:trPr>
+          <w:tblHeader w:val="false"/>
+        </w:trPr>
+        <w:tc>
+          <w:tcPr>
+            <w:tcW w:type="dxa" w:w="2500"/>
+            <w:tcBorders>
+              <w:top w:val="single" w:color="D1D5DB" w:sz="1"/>
+              <w:left w:val="single" w:color="D1D5DB" w:sz="1"/>
+              <w:bottom w:val="single" w:color="D1D5DB" w:sz="1"/>
+              <w:right w:val="single" w:color="D1D5DB" w:sz="1"/>
+            </w:tcBorders>
+            <w:tcMar>
+              <w:top w:type="dxa" w:w="60"/>
+              <w:left w:type="dxa" w:w="110"/>
+              <w:bottom w:type="dxa" w:w="60"/>
+              <w:right w:type="dxa" w:w="110"/>
+            </w:tcMar>
+          </w:tcPr>
+          <w:p>
+            <w:pPr>
+              <w:spacing w:after="0" w:line="264"/>
+            </w:pPr>
+            <w:r>
+              <w:rPr>
+                <w:rFonts w:ascii="Arial" w:cs="Arial" w:eastAsia="Arial" w:hAnsi="Arial"/>
+                <w:sz w:val="19"/>
+                <w:szCs w:val="19"/>
+              </w:rPr>
+              <w:t xml:space="preserve">Rate limiting distribuido (Token Bucket)</w:t>
+            </w:r>
+          </w:p>
+        </w:tc>
+        <w:tc>
+          <w:tcPr>
+            <w:tcW w:type="dxa" w:w="3700"/>
+            <w:tcBorders>
+              <w:top w:val="single" w:color="D1D5DB" w:sz="1"/>
+              <w:left w:val="single" w:color="D1D5DB" w:sz="1"/>
+              <w:bottom w:val="single" w:color="D1D5DB" w:sz="1"/>
+              <w:right w:val="single" w:color="D1D5DB" w:sz="1"/>
+            </w:tcBorders>
+            <w:tcMar>
+              <w:top w:type="dxa" w:w="60"/>
+              <w:left w:type="dxa" w:w="110"/>
+              <w:bottom w:type="dxa" w:w="60"/>
+              <w:right w:type="dxa" w:w="110"/>
+            </w:tcMar>
+          </w:tcPr>
+          <w:p>
+            <w:pPr>
+              <w:spacing w:after="0" w:line="264"/>
+            </w:pPr>
+            <w:r>
+              <w:rPr>
+                <w:rFonts w:ascii="Arial" w:cs="Arial" w:eastAsia="Arial" w:hAnsi="Arial"/>
+                <w:sz w:val="19"/>
+                <w:szCs w:val="19"/>
+              </w:rPr>
+              <w:t xml:space="preserve">RequestRateLimiter + Redis + KeyResolver en el gateway</w:t>
+            </w:r>
+          </w:p>
+        </w:tc>
+        <w:tc>
+          <w:tcPr>
+            <w:tcW w:type="dxa" w:w="3160"/>
+            <w:tcBorders>
+              <w:top w:val="single" w:color="D1D5DB" w:sz="1"/>
+              <w:left w:val="single" w:color="D1D5DB" w:sz="1"/>
+              <w:bottom w:val="single" w:color="D1D5DB" w:sz="1"/>
+              <w:right w:val="single" w:color="D1D5DB" w:sz="1"/>
+            </w:tcBorders>
+            <w:tcMar>
+              <w:top w:type="dxa" w:w="60"/>
+              <w:left w:type="dxa" w:w="110"/>
+              <w:bottom w:type="dxa" w:w="60"/>
+              <w:right w:type="dxa" w:w="110"/>
+            </w:tcMar>
+          </w:tcPr>
+          <w:p>
+            <w:pPr>
+              <w:spacing w:after="0" w:line="264"/>
+            </w:pPr>
+            <w:r>
+              <w:rPr>
+                <w:rFonts w:ascii="Arial" w:cs="Arial" w:eastAsia="Arial" w:hAnsi="Arial"/>
+                <w:sz w:val="19"/>
+                <w:szCs w:val="19"/>
+              </w:rPr>
+              <w:t xml:space="preserve">Limitar por usuario/IP de forma consistente entre réplicas</w:t>
+            </w:r>
+          </w:p>
+        </w:tc>
+      </w:tr>
+      <w:tr>
+        <w:trPr>
+          <w:tblHeader w:val="false"/>
+        </w:trPr>
+        <w:tc>
+          <w:tcPr>
+            <w:tcW w:type="dxa" w:w="2500"/>
+            <w:tcBorders>
+              <w:top w:val="single" w:color="D1D5DB" w:sz="1"/>
+              <w:left w:val="single" w:color="D1D5DB" w:sz="1"/>
+              <w:bottom w:val="single" w:color="D1D5DB" w:sz="1"/>
+              <w:right w:val="single" w:color="D1D5DB" w:sz="1"/>
+            </w:tcBorders>
+            <w:tcMar>
+              <w:top w:type="dxa" w:w="60"/>
+              <w:left w:type="dxa" w:w="110"/>
+              <w:bottom w:type="dxa" w:w="60"/>
+              <w:right w:type="dxa" w:w="110"/>
+            </w:tcMar>
+          </w:tcPr>
+          <w:p>
+            <w:pPr>
+              <w:spacing w:after="0" w:line="264"/>
+            </w:pPr>
+            <w:r>
+              <w:rPr>
+                <w:rFonts w:ascii="Arial" w:cs="Arial" w:eastAsia="Arial" w:hAnsi="Arial"/>
+                <w:sz w:val="19"/>
+                <w:szCs w:val="19"/>
+              </w:rPr>
+              <w:t xml:space="preserve">API tipada por cliente (GraphQL)</w:t>
+            </w:r>
+          </w:p>
+        </w:tc>
+        <w:tc>
+          <w:tcPr>
+            <w:tcW w:type="dxa" w:w="3700"/>
+            <w:tcBorders>
+              <w:top w:val="single" w:color="D1D5DB" w:sz="1"/>
+              <w:left w:val="single" w:color="D1D5DB" w:sz="1"/>
+              <w:bottom w:val="single" w:color="D1D5DB" w:sz="1"/>
+              <w:right w:val="single" w:color="D1D5DB" w:sz="1"/>
+            </w:tcBorders>
+            <w:tcMar>
+              <w:top w:type="dxa" w:w="60"/>
+              <w:left w:type="dxa" w:w="110"/>
+              <w:bottom w:type="dxa" w:w="60"/>
+              <w:right w:type="dxa" w:w="110"/>
+            </w:tcMar>
+          </w:tcPr>
+          <w:p>
+            <w:pPr>
+              <w:spacing w:after="0" w:line="264"/>
+            </w:pPr>
+            <w:r>
+              <w:rPr>
+                <w:rFonts w:ascii="Arial" w:cs="Arial" w:eastAsia="Arial" w:hAnsi="Arial"/>
+                <w:sz w:val="19"/>
+                <w:szCs w:val="19"/>
+              </w:rPr>
+              <w:t xml:space="preserve">catalog: schema-first + @QueryMapping</w:t>
+            </w:r>
+          </w:p>
+        </w:tc>
+        <w:tc>
+          <w:tcPr>
+            <w:tcW w:type="dxa" w:w="3160"/>
+            <w:tcBorders>
+              <w:top w:val="single" w:color="D1D5DB" w:sz="1"/>
+              <w:left w:val="single" w:color="D1D5DB" w:sz="1"/>
+              <w:bottom w:val="single" w:color="D1D5DB" w:sz="1"/>
+              <w:right w:val="single" w:color="D1D5DB" w:sz="1"/>
+            </w:tcBorders>
+            <w:tcMar>
+              <w:top w:type="dxa" w:w="60"/>
+              <w:left w:type="dxa" w:w="110"/>
+              <w:bottom w:type="dxa" w:w="60"/>
+              <w:right w:type="dxa" w:w="110"/>
+            </w:tcMar>
+          </w:tcPr>
+          <w:p>
+            <w:pPr>
+              <w:spacing w:after="0" w:line="264"/>
+            </w:pPr>
+            <w:r>
+              <w:rPr>
+                <w:rFonts w:ascii="Arial" w:cs="Arial" w:eastAsia="Arial" w:hAnsi="Arial"/>
+                <w:sz w:val="19"/>
+                <w:szCs w:val="19"/>
+              </w:rPr>
+              <w:t xml:space="preserve">Pedir en una consulta solo los campos necesarios (sin over/under-fetching)</w:t>
+            </w:r>
+          </w:p>
+        </w:tc>
+      </w:tr>
+      <w:tr>
+        <w:trPr>
+          <w:tblHeader w:val="false"/>
+        </w:trPr>
+        <w:tc>
+          <w:tcPr>
+            <w:tcW w:type="dxa" w:w="2500"/>
+            <w:tcBorders>
+              <w:top w:val="single" w:color="D1D5DB" w:sz="1"/>
+              <w:left w:val="single" w:color="D1D5DB" w:sz="1"/>
+              <w:bottom w:val="single" w:color="D1D5DB" w:sz="1"/>
+              <w:right w:val="single" w:color="D1D5DB" w:sz="1"/>
+            </w:tcBorders>
+            <w:tcMar>
+              <w:top w:type="dxa" w:w="60"/>
+              <w:left w:type="dxa" w:w="110"/>
+              <w:bottom w:type="dxa" w:w="60"/>
+              <w:right w:type="dxa" w:w="110"/>
+            </w:tcMar>
+          </w:tcPr>
+          <w:p>
+            <w:pPr>
+              <w:spacing w:after="0" w:line="264"/>
+            </w:pPr>
+            <w:r>
+              <w:rPr>
+                <w:rFonts w:ascii="Arial" w:cs="Arial" w:eastAsia="Arial" w:hAnsi="Arial"/>
+                <w:sz w:val="19"/>
+                <w:szCs w:val="19"/>
+              </w:rPr>
+              <w:t xml:space="preserve">RPC contract-first (gRPC/Protobuf)</w:t>
+            </w:r>
+          </w:p>
+        </w:tc>
+        <w:tc>
+          <w:tcPr>
+            <w:tcW w:type="dxa" w:w="3700"/>
+            <w:tcBorders>
+              <w:top w:val="single" w:color="D1D5DB" w:sz="1"/>
+              <w:left w:val="single" w:color="D1D5DB" w:sz="1"/>
+              <w:bottom w:val="single" w:color="D1D5DB" w:sz="1"/>
+              <w:right w:val="single" w:color="D1D5DB" w:sz="1"/>
+            </w:tcBorders>
+            <w:tcMar>
+              <w:top w:type="dxa" w:w="60"/>
+              <w:left w:type="dxa" w:w="110"/>
+              <w:bottom w:type="dxa" w:w="60"/>
+              <w:right w:type="dxa" w:w="110"/>
+            </w:tcMar>
+          </w:tcPr>
+          <w:p>
+            <w:pPr>
+              <w:spacing w:after="0" w:line="264"/>
+            </w:pPr>
+            <w:r>
+              <w:rPr>
+                <w:rFonts w:ascii="Arial" w:cs="Arial" w:eastAsia="Arial" w:hAnsi="Arial"/>
+                <w:sz w:val="19"/>
+                <w:szCs w:val="19"/>
+              </w:rPr>
+              <w:t xml:space="preserve">inventory: stock.proto + @GrpcService</w:t>
+            </w:r>
+          </w:p>
+        </w:tc>
+        <w:tc>
+          <w:tcPr>
+            <w:tcW w:type="dxa" w:w="3160"/>
+            <w:tcBorders>
+              <w:top w:val="single" w:color="D1D5DB" w:sz="1"/>
+              <w:left w:val="single" w:color="D1D5DB" w:sz="1"/>
+              <w:bottom w:val="single" w:color="D1D5DB" w:sz="1"/>
+              <w:right w:val="single" w:color="D1D5DB" w:sz="1"/>
+            </w:tcBorders>
+            <w:tcMar>
+              <w:top w:type="dxa" w:w="60"/>
+              <w:left w:type="dxa" w:w="110"/>
+              <w:bottom w:type="dxa" w:w="60"/>
+              <w:right w:type="dxa" w:w="110"/>
+            </w:tcMar>
+          </w:tcPr>
+          <w:p>
+            <w:pPr>
+              <w:spacing w:after="0" w:line="264"/>
+            </w:pPr>
+            <w:r>
+              <w:rPr>
+                <w:rFonts w:ascii="Arial" w:cs="Arial" w:eastAsia="Arial" w:hAnsi="Arial"/>
+                <w:sz w:val="19"/>
+                <w:szCs w:val="19"/>
+              </w:rPr>
+              <w:t xml:space="preserve">Comunicación interna binaria, tipada y de baja latencia</w:t>
+            </w:r>
+          </w:p>
+        </w:tc>
+      </w:tr>
     </w:tbl>
     <w:p>
       <w:pPr>
@@ -18137,78 +19748,6 @@
           <w:rFonts w:ascii="Arial" w:cs="Arial" w:eastAsia="Arial" w:hAnsi="Arial"/>
         </w:rPr>
         <w:t xml:space="preserve">credenciales temporales generadas y rotadas por Vault.</w:t>
-      </w:r>
-    </w:p>
-    <w:p>
-      <w:pPr>
-        <w:pStyle w:val="ListParagraph"/>
-        <w:numPr>
-          <w:ilvl w:val="0"/>
-          <w:numId w:val="2"/>
-        </w:numPr>
-        <w:spacing w:after="80" w:line="268"/>
-      </w:pPr>
-      <w:r>
-        <w:rPr>
-          <w:rFonts w:ascii="Arial" w:cs="Arial" w:eastAsia="Arial" w:hAnsi="Arial"/>
-          <w:b/>
-          <w:bCs/>
-        </w:rPr>
-        <w:t xml:space="preserve">OWASP ZAP (DAST): </w:t>
-      </w:r>
-      <w:r>
-        <w:rPr>
-          <w:rFonts w:ascii="Arial" w:cs="Arial" w:eastAsia="Arial" w:hAnsi="Arial"/>
-        </w:rPr>
-        <w:t xml:space="preserve">escaneo dinámico de seguridad de la aplicación en ejecución dentro del CI.</w:t>
-      </w:r>
-    </w:p>
-    <w:p>
-      <w:pPr>
-        <w:pStyle w:val="ListParagraph"/>
-        <w:numPr>
-          <w:ilvl w:val="0"/>
-          <w:numId w:val="2"/>
-        </w:numPr>
-        <w:spacing w:after="80" w:line="268"/>
-      </w:pPr>
-      <w:r>
-        <w:rPr>
-          <w:rFonts w:ascii="Arial" w:cs="Arial" w:eastAsia="Arial" w:hAnsi="Arial"/>
-          <w:b/>
-          <w:bCs/>
-        </w:rPr>
-        <w:t xml:space="preserve">gRPC: </w:t>
-      </w:r>
-      <w:r>
-        <w:rPr>
-          <w:rFonts w:ascii="Arial" w:cs="Arial" w:eastAsia="Arial" w:hAnsi="Arial"/>
-        </w:rPr>
-        <w:t xml:space="preserve">comunicación interna servicio-a-servicio contract-first con Protobuf.</w:t>
-      </w:r>
-    </w:p>
-    <w:p>
-      <w:pPr>
-        <w:pStyle w:val="ListParagraph"/>
-        <w:numPr>
-          <w:ilvl w:val="0"/>
-          <w:numId w:val="2"/>
-        </w:numPr>
-        <w:spacing w:after="80" w:line="268"/>
-      </w:pPr>
-      <w:r>
-        <w:rPr>
-          <w:rFonts w:ascii="Arial" w:cs="Arial" w:eastAsia="Arial" w:hAnsi="Arial"/>
-          <w:b/>
-          <w:bCs/>
-        </w:rPr>
-        <w:t xml:space="preserve">GraphQL (Spring for GraphQL): </w:t>
-      </w:r>
-      <w:r>
-        <w:rPr>
-          <w:rFonts w:ascii="Arial" w:cs="Arial" w:eastAsia="Arial" w:hAnsi="Arial"/>
-        </w:rPr>
-        <w:t xml:space="preserve">una API de agregación para el frontend.</w:t>
       </w:r>
     </w:p>
     <w:p>

</xml_diff>

<commit_message>
feat: CodeQL+Gitleaks, alerting/dashboards as code, OPA (ABAC) y MFA TOTP
</commit_message>
<xml_diff>
--- a/BookPlus-Stack-Tecnologico.docx
+++ b/BookPlus-Stack-Tecnologico.docx
@@ -15286,6 +15286,1304 @@
     </w:p>
     <w:p>
       <w:pPr>
+        <w:pStyle w:val="Heading2"/>
+      </w:pPr>
+      <w:r>
+        <w:rPr>
+          <w:rFonts w:ascii="Arial" w:cs="Arial" w:eastAsia="Arial" w:hAnsi="Arial"/>
+        </w:rPr>
+        <w:t xml:space="preserve">13.43 Seguridad de la cadena de suministro: CodeQL + Gitleaks</w:t>
+      </w:r>
+    </w:p>
+    <w:p>
+      <w:pPr>
+        <w:spacing w:after="120" w:line="276"/>
+      </w:pPr>
+      <w:r>
+        <w:rPr>
+          <w:rFonts w:ascii="Arial" w:cs="Arial" w:eastAsia="Arial" w:hAnsi="Arial"/>
+          <w:b/>
+          <w:bCs/>
+        </w:rPr>
+        <w:t xml:space="preserve">Qué es: </w:t>
+      </w:r>
+      <w:r>
+        <w:rPr>
+          <w:rFonts w:ascii="Arial" w:cs="Arial" w:eastAsia="Arial" w:hAnsi="Arial"/>
+        </w:rPr>
+        <w:t xml:space="preserve">dos capas más de seguridad automatizada en el CI que refuerzan el triángulo ya existente. </w:t>
+      </w:r>
+      <w:r>
+        <w:rPr>
+          <w:rFonts w:ascii="Arial" w:cs="Arial" w:eastAsia="Arial" w:hAnsi="Arial"/>
+          <w:b/>
+          <w:bCs/>
+        </w:rPr>
+        <w:t xml:space="preserve">CodeQL</w:t>
+      </w:r>
+      <w:r>
+        <w:rPr>
+          <w:rFonts w:ascii="Arial" w:cs="Arial" w:eastAsia="Arial" w:hAnsi="Arial"/>
+        </w:rPr>
+        <w:t xml:space="preserve"> es el motor de análisis estático (SAST) de GitHub: no busca patrones de texto, sino que sigue el </w:t>
+      </w:r>
+      <w:r>
+        <w:rPr>
+          <w:rFonts w:ascii="Arial" w:cs="Arial" w:eastAsia="Arial" w:hAnsi="Arial"/>
+          <w:b/>
+          <w:bCs/>
+        </w:rPr>
+        <w:t xml:space="preserve">flujo de datos</w:t>
+      </w:r>
+      <w:r>
+        <w:rPr>
+          <w:rFonts w:ascii="Arial" w:cs="Arial" w:eastAsia="Arial" w:hAnsi="Arial"/>
+        </w:rPr>
+        <w:t xml:space="preserve"> (taint tracking) desde entradas no confiables hasta puntos peligrosos para detectar inyección SQL, XSS, deserialización insegura, path traversal, etc. </w:t>
+      </w:r>
+      <w:r>
+        <w:rPr>
+          <w:rFonts w:ascii="Arial" w:cs="Arial" w:eastAsia="Arial" w:hAnsi="Arial"/>
+          <w:b/>
+          <w:bCs/>
+        </w:rPr>
+        <w:t xml:space="preserve">Gitleaks</w:t>
+      </w:r>
+      <w:r>
+        <w:rPr>
+          <w:rFonts w:ascii="Arial" w:cs="Arial" w:eastAsia="Arial" w:hAnsi="Arial"/>
+        </w:rPr>
+        <w:t xml:space="preserve"> escanea el código y todo el historial de git en busca de secretos filtrados (claves, tokens, contraseñas).</w:t>
+      </w:r>
+    </w:p>
+    <w:p>
+      <w:pPr>
+        <w:pStyle w:val="ListParagraph"/>
+        <w:numPr>
+          <w:ilvl w:val="0"/>
+          <w:numId w:val="2"/>
+        </w:numPr>
+        <w:spacing w:after="80" w:line="268"/>
+      </w:pPr>
+      <w:r>
+        <w:rPr>
+          <w:rFonts w:ascii="Arial" w:cs="Arial" w:eastAsia="Arial" w:hAnsi="Arial"/>
+          <w:b/>
+          <w:bCs/>
+        </w:rPr>
+        <w:t xml:space="preserve">CodeQL sin compilar: </w:t>
+      </w:r>
+      <w:r>
+        <w:rPr>
+          <w:rFonts w:ascii="Arial" w:cs="Arial" w:eastAsia="Arial" w:hAnsi="Arial"/>
+        </w:rPr>
+        <w:t xml:space="preserve">como el repo son 10 microservicios Maven independientes (sin pom raíz), se usa </w:t>
+      </w:r>
+      <w:r>
+        <w:rPr>
+          <w:rFonts w:ascii="Consolas" w:cs="Consolas" w:eastAsia="Consolas" w:hAnsi="Consolas"/>
+          <w:color w:val="4F46E5"/>
+        </w:rPr>
+        <w:t xml:space="preserve">build-mode: none</w:t>
+      </w:r>
+      <w:r>
+        <w:rPr>
+          <w:rFonts w:ascii="Arial" w:cs="Arial" w:eastAsia="Arial" w:hAnsi="Arial"/>
+        </w:rPr>
+        <w:t xml:space="preserve"> en </w:t>
+      </w:r>
+      <w:r>
+        <w:rPr>
+          <w:rFonts w:ascii="Consolas" w:cs="Consolas" w:eastAsia="Consolas" w:hAnsi="Consolas"/>
+          <w:color w:val="4F46E5"/>
+        </w:rPr>
+        <w:t xml:space="preserve">.github/workflows/codeql.yml</w:t>
+      </w:r>
+      <w:r>
+        <w:rPr>
+          <w:rFonts w:ascii="Arial" w:cs="Arial" w:eastAsia="Arial" w:hAnsi="Arial"/>
+        </w:rPr>
+        <w:t xml:space="preserve">; CodeQL analiza Java y el frontend (TS) con el conjunto </w:t>
+      </w:r>
+      <w:r>
+        <w:rPr>
+          <w:rFonts w:ascii="Consolas" w:cs="Consolas" w:eastAsia="Consolas" w:hAnsi="Consolas"/>
+          <w:color w:val="4F46E5"/>
+        </w:rPr>
+        <w:t xml:space="preserve">security-extended</w:t>
+      </w:r>
+      <w:r>
+        <w:rPr>
+          <w:rFonts w:ascii="Arial" w:cs="Arial" w:eastAsia="Arial" w:hAnsi="Arial"/>
+        </w:rPr>
+        <w:t xml:space="preserve"> y publica los hallazgos en la pestaña </w:t>
+      </w:r>
+      <w:r>
+        <w:rPr>
+          <w:rFonts w:ascii="Arial" w:cs="Arial" w:eastAsia="Arial" w:hAnsi="Arial"/>
+          <w:b/>
+          <w:bCs/>
+        </w:rPr>
+        <w:t xml:space="preserve">Security → Code scanning</w:t>
+      </w:r>
+      <w:r>
+        <w:rPr>
+          <w:rFonts w:ascii="Arial" w:cs="Arial" w:eastAsia="Arial" w:hAnsi="Arial"/>
+        </w:rPr>
+        <w:t xml:space="preserve">.</w:t>
+      </w:r>
+    </w:p>
+    <w:p>
+      <w:pPr>
+        <w:pStyle w:val="ListParagraph"/>
+        <w:numPr>
+          <w:ilvl w:val="0"/>
+          <w:numId w:val="2"/>
+        </w:numPr>
+        <w:spacing w:after="80" w:line="268"/>
+      </w:pPr>
+      <w:r>
+        <w:rPr>
+          <w:rFonts w:ascii="Arial" w:cs="Arial" w:eastAsia="Arial" w:hAnsi="Arial"/>
+          <w:b/>
+          <w:bCs/>
+        </w:rPr>
+        <w:t xml:space="preserve">Gitleaks sobre el historial: </w:t>
+      </w:r>
+      <w:r>
+        <w:rPr>
+          <w:rFonts w:ascii="Arial" w:cs="Arial" w:eastAsia="Arial" w:hAnsi="Arial"/>
+        </w:rPr>
+        <w:t xml:space="preserve">job en </w:t>
+      </w:r>
+      <w:r>
+        <w:rPr>
+          <w:rFonts w:ascii="Consolas" w:cs="Consolas" w:eastAsia="Consolas" w:hAnsi="Consolas"/>
+          <w:color w:val="4F46E5"/>
+        </w:rPr>
+        <w:t xml:space="preserve">security.yml</w:t>
+      </w:r>
+      <w:r>
+        <w:rPr>
+          <w:rFonts w:ascii="Arial" w:cs="Arial" w:eastAsia="Arial" w:hAnsi="Arial"/>
+        </w:rPr>
+        <w:t xml:space="preserve"> con </w:t>
+      </w:r>
+      <w:r>
+        <w:rPr>
+          <w:rFonts w:ascii="Consolas" w:cs="Consolas" w:eastAsia="Consolas" w:hAnsi="Consolas"/>
+          <w:color w:val="4F46E5"/>
+        </w:rPr>
+        <w:t xml:space="preserve">fetch-depth: 0</w:t>
+      </w:r>
+      <w:r>
+        <w:rPr>
+          <w:rFonts w:ascii="Arial" w:cs="Arial" w:eastAsia="Arial" w:hAnsi="Arial"/>
+        </w:rPr>
+        <w:t xml:space="preserve"> (historial completo) y </w:t>
+      </w:r>
+      <w:r>
+        <w:rPr>
+          <w:rFonts w:ascii="Consolas" w:cs="Consolas" w:eastAsia="Consolas" w:hAnsi="Consolas"/>
+          <w:color w:val="4F46E5"/>
+        </w:rPr>
+        <w:t xml:space="preserve">.gitleaks.toml</w:t>
+      </w:r>
+      <w:r>
+        <w:rPr>
+          <w:rFonts w:ascii="Arial" w:cs="Arial" w:eastAsia="Arial" w:hAnsi="Arial"/>
+        </w:rPr>
+        <w:t xml:space="preserve"> que extiende las reglas por defecto y silencia falsos positivos (ejemplos, claves de test, credenciales dev de compose). Sube un SARIF a Security e informa sin romper el build.</w:t>
+      </w:r>
+    </w:p>
+    <w:p>
+      <w:pPr>
+        <w:pStyle w:val="ListParagraph"/>
+        <w:numPr>
+          <w:ilvl w:val="0"/>
+          <w:numId w:val="2"/>
+        </w:numPr>
+        <w:spacing w:after="80" w:line="268"/>
+      </w:pPr>
+      <w:r>
+        <w:rPr>
+          <w:rFonts w:ascii="Arial" w:cs="Arial" w:eastAsia="Arial" w:hAnsi="Arial"/>
+          <w:b/>
+          <w:bCs/>
+        </w:rPr>
+        <w:t xml:space="preserve">Complementariedad: </w:t>
+      </w:r>
+      <w:r>
+        <w:rPr>
+          <w:rFonts w:ascii="Arial" w:cs="Arial" w:eastAsia="Arial" w:hAnsi="Arial"/>
+        </w:rPr>
+        <w:t xml:space="preserve">CodeQL cubre defectos en el </w:t>
+      </w:r>
+      <w:r>
+        <w:rPr>
+          <w:rFonts w:ascii="Arial" w:cs="Arial" w:eastAsia="Arial" w:hAnsi="Arial"/>
+          <w:b/>
+          <w:bCs/>
+        </w:rPr>
+        <w:t xml:space="preserve">código propio</w:t>
+      </w:r>
+      <w:r>
+        <w:rPr>
+          <w:rFonts w:ascii="Arial" w:cs="Arial" w:eastAsia="Arial" w:hAnsi="Arial"/>
+        </w:rPr>
+        <w:t xml:space="preserve">; Trivy/Dependency-Check, las </w:t>
+      </w:r>
+      <w:r>
+        <w:rPr>
+          <w:rFonts w:ascii="Arial" w:cs="Arial" w:eastAsia="Arial" w:hAnsi="Arial"/>
+          <w:b/>
+          <w:bCs/>
+        </w:rPr>
+        <w:t xml:space="preserve">dependencias</w:t>
+      </w:r>
+      <w:r>
+        <w:rPr>
+          <w:rFonts w:ascii="Arial" w:cs="Arial" w:eastAsia="Arial" w:hAnsi="Arial"/>
+        </w:rPr>
+        <w:t xml:space="preserve">; Gitleaks, los </w:t>
+      </w:r>
+      <w:r>
+        <w:rPr>
+          <w:rFonts w:ascii="Arial" w:cs="Arial" w:eastAsia="Arial" w:hAnsi="Arial"/>
+          <w:b/>
+          <w:bCs/>
+        </w:rPr>
+        <w:t xml:space="preserve">secretos</w:t>
+      </w:r>
+      <w:r>
+        <w:rPr>
+          <w:rFonts w:ascii="Arial" w:cs="Arial" w:eastAsia="Arial" w:hAnsi="Arial"/>
+        </w:rPr>
+        <w:t xml:space="preserve">; SonarCloud, la calidad; y ZAP, la app </w:t>
+      </w:r>
+      <w:r>
+        <w:rPr>
+          <w:rFonts w:ascii="Arial" w:cs="Arial" w:eastAsia="Arial" w:hAnsi="Arial"/>
+          <w:b/>
+          <w:bCs/>
+        </w:rPr>
+        <w:t xml:space="preserve">en ejecución</w:t>
+      </w:r>
+      <w:r>
+        <w:rPr>
+          <w:rFonts w:ascii="Arial" w:cs="Arial" w:eastAsia="Arial" w:hAnsi="Arial"/>
+        </w:rPr>
+        <w:t xml:space="preserve">. Ninguna herramienta sola cubre todo.</w:t>
+      </w:r>
+    </w:p>
+    <w:p>
+      <w:pPr>
+        <w:spacing w:after="120" w:line="276"/>
+      </w:pPr>
+      <w:r>
+        <w:rPr>
+          <w:rFonts w:ascii="Arial" w:cs="Arial" w:eastAsia="Arial" w:hAnsi="Arial"/>
+          <w:b/>
+          <w:bCs/>
+        </w:rPr>
+        <w:t xml:space="preserve">Verificación: </w:t>
+      </w:r>
+      <w:r>
+        <w:rPr>
+          <w:rFonts w:ascii="Arial" w:cs="Arial" w:eastAsia="Arial" w:hAnsi="Arial"/>
+        </w:rPr>
+        <w:t xml:space="preserve">al hacer push, los workflows </w:t>
+      </w:r>
+      <w:r>
+        <w:rPr>
+          <w:rFonts w:ascii="Consolas" w:cs="Consolas" w:eastAsia="Consolas" w:hAnsi="Consolas"/>
+          <w:color w:val="4F46E5"/>
+        </w:rPr>
+        <w:t xml:space="preserve">CodeQL</w:t>
+      </w:r>
+      <w:r>
+        <w:rPr>
+          <w:rFonts w:ascii="Arial" w:cs="Arial" w:eastAsia="Arial" w:hAnsi="Arial"/>
+        </w:rPr>
+        <w:t xml:space="preserve"> y </w:t>
+      </w:r>
+      <w:r>
+        <w:rPr>
+          <w:rFonts w:ascii="Consolas" w:cs="Consolas" w:eastAsia="Consolas" w:hAnsi="Consolas"/>
+          <w:color w:val="4F46E5"/>
+        </w:rPr>
+        <w:t xml:space="preserve">Security</w:t>
+      </w:r>
+      <w:r>
+        <w:rPr>
+          <w:rFonts w:ascii="Arial" w:cs="Arial" w:eastAsia="Arial" w:hAnsi="Arial"/>
+        </w:rPr>
+        <w:t xml:space="preserve"> corren en Actions y los resultados aparecen en la pestaña Security del repositorio.</w:t>
+      </w:r>
+    </w:p>
+    <w:p>
+      <w:pPr>
+        <w:pStyle w:val="Heading2"/>
+      </w:pPr>
+      <w:r>
+        <w:rPr>
+          <w:rFonts w:ascii="Arial" w:cs="Arial" w:eastAsia="Arial" w:hAnsi="Arial"/>
+        </w:rPr>
+        <w:t xml:space="preserve">13.44 Dashboards y alertas como código (Grafana + Prometheus/Alertmanager)</w:t>
+      </w:r>
+    </w:p>
+    <w:p>
+      <w:pPr>
+        <w:spacing w:after="120" w:line="276"/>
+      </w:pPr>
+      <w:r>
+        <w:rPr>
+          <w:rFonts w:ascii="Arial" w:cs="Arial" w:eastAsia="Arial" w:hAnsi="Arial"/>
+          <w:b/>
+          <w:bCs/>
+        </w:rPr>
+        <w:t xml:space="preserve">Qué es: </w:t>
+      </w:r>
+      <w:r>
+        <w:rPr>
+          <w:rFonts w:ascii="Arial" w:cs="Arial" w:eastAsia="Arial" w:hAnsi="Arial"/>
+        </w:rPr>
+        <w:t xml:space="preserve">llevar la observabilidad a la madurez SRE: no solo recolectar métricas, sino </w:t>
+      </w:r>
+      <w:r>
+        <w:rPr>
+          <w:rFonts w:ascii="Arial" w:cs="Arial" w:eastAsia="Arial" w:hAnsi="Arial"/>
+          <w:b/>
+          <w:bCs/>
+        </w:rPr>
+        <w:t xml:space="preserve">visualizarlas y alertar automáticamente</w:t>
+      </w:r>
+      <w:r>
+        <w:rPr>
+          <w:rFonts w:ascii="Arial" w:cs="Arial" w:eastAsia="Arial" w:hAnsi="Arial"/>
+        </w:rPr>
+        <w:t xml:space="preserve">, con todo versionado en el repo (nada configurado a mano en la UI). Un panel muerto o una alerta perdida es un incidente que nadie ve.</w:t>
+      </w:r>
+    </w:p>
+    <w:p>
+      <w:pPr>
+        <w:pStyle w:val="ListParagraph"/>
+        <w:numPr>
+          <w:ilvl w:val="0"/>
+          <w:numId w:val="2"/>
+        </w:numPr>
+        <w:spacing w:after="80" w:line="268"/>
+      </w:pPr>
+      <w:r>
+        <w:rPr>
+          <w:rFonts w:ascii="Arial" w:cs="Arial" w:eastAsia="Arial" w:hAnsi="Arial"/>
+          <w:b/>
+          <w:bCs/>
+        </w:rPr>
+        <w:t xml:space="preserve">Dashboard RED aprovisionado: </w:t>
+      </w:r>
+      <w:r>
+        <w:rPr>
+          <w:rFonts w:ascii="Consolas" w:cs="Consolas" w:eastAsia="Consolas" w:hAnsi="Consolas"/>
+          <w:color w:val="4F46E5"/>
+        </w:rPr>
+        <w:t xml:space="preserve">monitoring/grafana/provisioning/dashboards/bookplus-red.json</w:t>
+      </w:r>
+      <w:r>
+        <w:rPr>
+          <w:rFonts w:ascii="Arial" w:cs="Arial" w:eastAsia="Arial" w:hAnsi="Arial"/>
+        </w:rPr>
+        <w:t xml:space="preserve"> implementa el método </w:t>
+      </w:r>
+      <w:r>
+        <w:rPr>
+          <w:rFonts w:ascii="Arial" w:cs="Arial" w:eastAsia="Arial" w:hAnsi="Arial"/>
+          <w:b/>
+          <w:bCs/>
+        </w:rPr>
+        <w:t xml:space="preserve">RED</w:t>
+      </w:r>
+      <w:r>
+        <w:rPr>
+          <w:rFonts w:ascii="Arial" w:cs="Arial" w:eastAsia="Arial" w:hAnsi="Arial"/>
+        </w:rPr>
+        <w:t xml:space="preserve"> (Rate, Errors, Duration): peticiones/seg, % de 5xx y latencia p95 por servicio, más saturación de heap JVM. Grafana lo carga solo al arrancar (provisioning), con un selector de servicio y umbrales en color.</w:t>
+      </w:r>
+    </w:p>
+    <w:p>
+      <w:pPr>
+        <w:pStyle w:val="ListParagraph"/>
+        <w:numPr>
+          <w:ilvl w:val="0"/>
+          <w:numId w:val="2"/>
+        </w:numPr>
+        <w:spacing w:after="80" w:line="268"/>
+      </w:pPr>
+      <w:r>
+        <w:rPr>
+          <w:rFonts w:ascii="Arial" w:cs="Arial" w:eastAsia="Arial" w:hAnsi="Arial"/>
+          <w:b/>
+          <w:bCs/>
+        </w:rPr>
+        <w:t xml:space="preserve">Alertas como código: </w:t>
+      </w:r>
+      <w:r>
+        <w:rPr>
+          <w:rFonts w:ascii="Consolas" w:cs="Consolas" w:eastAsia="Consolas" w:hAnsi="Consolas"/>
+          <w:color w:val="4F46E5"/>
+        </w:rPr>
+        <w:t xml:space="preserve">monitoring/alert-rules.yml</w:t>
+      </w:r>
+      <w:r>
+        <w:rPr>
+          <w:rFonts w:ascii="Arial" w:cs="Arial" w:eastAsia="Arial" w:hAnsi="Arial"/>
+        </w:rPr>
+        <w:t xml:space="preserve"> define reglas Prometheus sobre las métricas de Micrometer: </w:t>
+      </w:r>
+      <w:r>
+        <w:rPr>
+          <w:rFonts w:ascii="Consolas" w:cs="Consolas" w:eastAsia="Consolas" w:hAnsi="Consolas"/>
+          <w:color w:val="4F46E5"/>
+        </w:rPr>
+        <w:t xml:space="preserve">ServiceDown</w:t>
+      </w:r>
+      <w:r>
+        <w:rPr>
+          <w:rFonts w:ascii="Arial" w:cs="Arial" w:eastAsia="Arial" w:hAnsi="Arial"/>
+        </w:rPr>
+        <w:t xml:space="preserve"> (un servicio deja de responder), </w:t>
+      </w:r>
+      <w:r>
+        <w:rPr>
+          <w:rFonts w:ascii="Consolas" w:cs="Consolas" w:eastAsia="Consolas" w:hAnsi="Consolas"/>
+          <w:color w:val="4F46E5"/>
+        </w:rPr>
+        <w:t xml:space="preserve">HighErrorRate</w:t>
+      </w:r>
+      <w:r>
+        <w:rPr>
+          <w:rFonts w:ascii="Arial" w:cs="Arial" w:eastAsia="Arial" w:hAnsi="Arial"/>
+        </w:rPr>
+        <w:t xml:space="preserve"> (&gt;5% de 5xx), </w:t>
+      </w:r>
+      <w:r>
+        <w:rPr>
+          <w:rFonts w:ascii="Consolas" w:cs="Consolas" w:eastAsia="Consolas" w:hAnsi="Consolas"/>
+          <w:color w:val="4F46E5"/>
+        </w:rPr>
+        <w:t xml:space="preserve">HighLatencyP95</w:t>
+      </w:r>
+      <w:r>
+        <w:rPr>
+          <w:rFonts w:ascii="Arial" w:cs="Arial" w:eastAsia="Arial" w:hAnsi="Arial"/>
+        </w:rPr>
+        <w:t xml:space="preserve"> (p95 &gt;1s) y </w:t>
+      </w:r>
+      <w:r>
+        <w:rPr>
+          <w:rFonts w:ascii="Consolas" w:cs="Consolas" w:eastAsia="Consolas" w:hAnsi="Consolas"/>
+          <w:color w:val="4F46E5"/>
+        </w:rPr>
+        <w:t xml:space="preserve">JvmHeapHigh</w:t>
+      </w:r>
+      <w:r>
+        <w:rPr>
+          <w:rFonts w:ascii="Arial" w:cs="Arial" w:eastAsia="Arial" w:hAnsi="Arial"/>
+        </w:rPr>
+        <w:t xml:space="preserve"> (heap &gt;90%). Cada una con su </w:t>
+      </w:r>
+      <w:r>
+        <w:rPr>
+          <w:rFonts w:ascii="Consolas" w:cs="Consolas" w:eastAsia="Consolas" w:hAnsi="Consolas"/>
+          <w:color w:val="4F46E5"/>
+        </w:rPr>
+        <w:t xml:space="preserve">for</w:t>
+      </w:r>
+      <w:r>
+        <w:rPr>
+          <w:rFonts w:ascii="Arial" w:cs="Arial" w:eastAsia="Arial" w:hAnsi="Arial"/>
+        </w:rPr>
+        <w:t xml:space="preserve"> (tiempo sostenido) y severidad.</w:t>
+      </w:r>
+    </w:p>
+    <w:p>
+      <w:pPr>
+        <w:pStyle w:val="ListParagraph"/>
+        <w:numPr>
+          <w:ilvl w:val="0"/>
+          <w:numId w:val="2"/>
+        </w:numPr>
+        <w:spacing w:after="80" w:line="268"/>
+      </w:pPr>
+      <w:r>
+        <w:rPr>
+          <w:rFonts w:ascii="Arial" w:cs="Arial" w:eastAsia="Arial" w:hAnsi="Arial"/>
+          <w:b/>
+          <w:bCs/>
+        </w:rPr>
+        <w:t xml:space="preserve">Enrutado con Alertmanager: </w:t>
+      </w:r>
+      <w:r>
+        <w:rPr>
+          <w:rFonts w:ascii="Arial" w:cs="Arial" w:eastAsia="Arial" w:hAnsi="Arial"/>
+        </w:rPr>
+        <w:t xml:space="preserve">se añadió el servicio </w:t>
+      </w:r>
+      <w:r>
+        <w:rPr>
+          <w:rFonts w:ascii="Consolas" w:cs="Consolas" w:eastAsia="Consolas" w:hAnsi="Consolas"/>
+          <w:color w:val="4F46E5"/>
+        </w:rPr>
+        <w:t xml:space="preserve">alertmanager</w:t>
+      </w:r>
+      <w:r>
+        <w:rPr>
+          <w:rFonts w:ascii="Arial" w:cs="Arial" w:eastAsia="Arial" w:hAnsi="Arial"/>
+        </w:rPr>
+        <w:t xml:space="preserve"> al compose; Prometheus le envía las alertas que disparan y él las </w:t>
+      </w:r>
+      <w:r>
+        <w:rPr>
+          <w:rFonts w:ascii="Arial" w:cs="Arial" w:eastAsia="Arial" w:hAnsi="Arial"/>
+          <w:b/>
+          <w:bCs/>
+        </w:rPr>
+        <w:t xml:space="preserve">agrupa, deduplica e inhibe</w:t>
+      </w:r>
+      <w:r>
+        <w:rPr>
+          <w:rFonts w:ascii="Arial" w:cs="Arial" w:eastAsia="Arial" w:hAnsi="Arial"/>
+        </w:rPr>
+        <w:t xml:space="preserve"> (una warning se calla si hay una critical del mismo servicio). En producción enrutaría a email/Slack/PagerDuty rellenando un receiver.</w:t>
+      </w:r>
+    </w:p>
+    <w:p>
+      <w:pPr>
+        <w:spacing w:after="120" w:line="276"/>
+      </w:pPr>
+      <w:r>
+        <w:rPr>
+          <w:rFonts w:ascii="Arial" w:cs="Arial" w:eastAsia="Arial" w:hAnsi="Arial"/>
+          <w:b/>
+          <w:bCs/>
+        </w:rPr>
+        <w:t xml:space="preserve">Verificación: </w:t>
+      </w:r>
+      <w:r>
+        <w:rPr>
+          <w:rFonts w:ascii="Arial" w:cs="Arial" w:eastAsia="Arial" w:hAnsi="Arial"/>
+        </w:rPr>
+        <w:t xml:space="preserve">con </w:t>
+      </w:r>
+      <w:r>
+        <w:rPr>
+          <w:rFonts w:ascii="Consolas" w:cs="Consolas" w:eastAsia="Consolas" w:hAnsi="Consolas"/>
+          <w:color w:val="4F46E5"/>
+        </w:rPr>
+        <w:t xml:space="preserve">docker-compose.full.yml</w:t>
+      </w:r>
+      <w:r>
+        <w:rPr>
+          <w:rFonts w:ascii="Arial" w:cs="Arial" w:eastAsia="Arial" w:hAnsi="Arial"/>
+        </w:rPr>
+        <w:t xml:space="preserve"> arriba, Prometheus (9090 → Alerts) muestra las reglas cargadas, Alertmanager (9093) las alertas activas y Grafana (3001) el dashboard </w:t>
+      </w:r>
+      <w:r>
+        <w:rPr>
+          <w:rFonts w:ascii="Arial" w:cs="Arial" w:eastAsia="Arial" w:hAnsi="Arial"/>
+          <w:i/>
+          <w:iCs/>
+        </w:rPr>
+        <w:t xml:space="preserve">BookPlus — RED</w:t>
+      </w:r>
+      <w:r>
+        <w:rPr>
+          <w:rFonts w:ascii="Arial" w:cs="Arial" w:eastAsia="Arial" w:hAnsi="Arial"/>
+        </w:rPr>
+        <w:t xml:space="preserve"> poblándose.</w:t>
+      </w:r>
+    </w:p>
+    <w:p>
+      <w:pPr>
+        <w:pStyle w:val="Heading2"/>
+      </w:pPr>
+      <w:r>
+        <w:rPr>
+          <w:rFonts w:ascii="Arial" w:cs="Arial" w:eastAsia="Arial" w:hAnsi="Arial"/>
+        </w:rPr>
+        <w:t xml:space="preserve">13.45 Autorización fina con OPA (policy-as-code / ABAC)</w:t>
+      </w:r>
+    </w:p>
+    <w:p>
+      <w:pPr>
+        <w:spacing w:after="120" w:line="276"/>
+      </w:pPr>
+      <w:r>
+        <w:rPr>
+          <w:rFonts w:ascii="Arial" w:cs="Arial" w:eastAsia="Arial" w:hAnsi="Arial"/>
+          <w:b/>
+          <w:bCs/>
+        </w:rPr>
+        <w:t xml:space="preserve">Qué es: </w:t>
+      </w:r>
+      <w:r>
+        <w:rPr>
+          <w:rFonts w:ascii="Arial" w:cs="Arial" w:eastAsia="Arial" w:hAnsi="Arial"/>
+        </w:rPr>
+        <w:t xml:space="preserve">externalizar las decisiones de autorización a </w:t>
+      </w:r>
+      <w:r>
+        <w:rPr>
+          <w:rFonts w:ascii="Arial" w:cs="Arial" w:eastAsia="Arial" w:hAnsi="Arial"/>
+          <w:b/>
+          <w:bCs/>
+        </w:rPr>
+        <w:t xml:space="preserve">Open Policy Agent</w:t>
+      </w:r>
+      <w:r>
+        <w:rPr>
+          <w:rFonts w:ascii="Arial" w:cs="Arial" w:eastAsia="Arial" w:hAnsi="Arial"/>
+        </w:rPr>
+        <w:t xml:space="preserve">, el estándar CNCF para </w:t>
+      </w:r>
+      <w:r>
+        <w:rPr>
+          <w:rFonts w:ascii="Arial" w:cs="Arial" w:eastAsia="Arial" w:hAnsi="Arial"/>
+          <w:b/>
+          <w:bCs/>
+        </w:rPr>
+        <w:t xml:space="preserve">policy-as-code</w:t>
+      </w:r>
+      <w:r>
+        <w:rPr>
+          <w:rFonts w:ascii="Arial" w:cs="Arial" w:eastAsia="Arial" w:hAnsi="Arial"/>
+        </w:rPr>
+        <w:t xml:space="preserve">. En vez de esparcir reglas de "quién puede hacer qué" por el código de cada servicio, se declaran en un lenguaje dedicado (</w:t>
+      </w:r>
+      <w:r>
+        <w:rPr>
+          <w:rFonts w:ascii="Arial" w:cs="Arial" w:eastAsia="Arial" w:hAnsi="Arial"/>
+          <w:b/>
+          <w:bCs/>
+        </w:rPr>
+        <w:t xml:space="preserve">Rego</w:t>
+      </w:r>
+      <w:r>
+        <w:rPr>
+          <w:rFonts w:ascii="Arial" w:cs="Arial" w:eastAsia="Arial" w:hAnsi="Arial"/>
+        </w:rPr>
+        <w:t xml:space="preserve">) y los servicios preguntan a OPA. Es el modelo </w:t>
+      </w:r>
+      <w:r>
+        <w:rPr>
+          <w:rFonts w:ascii="Arial" w:cs="Arial" w:eastAsia="Arial" w:hAnsi="Arial"/>
+          <w:b/>
+          <w:bCs/>
+        </w:rPr>
+        <w:t xml:space="preserve">ABAC</w:t>
+      </w:r>
+      <w:r>
+        <w:rPr>
+          <w:rFonts w:ascii="Arial" w:cs="Arial" w:eastAsia="Arial" w:hAnsi="Arial"/>
+        </w:rPr>
+        <w:t xml:space="preserve"> (Attribute-Based Access Control): la decisión depende de atributos del sujeto, la acción y el recurso.</w:t>
+      </w:r>
+    </w:p>
+    <w:p>
+      <w:pPr>
+        <w:pStyle w:val="ListParagraph"/>
+        <w:numPr>
+          <w:ilvl w:val="0"/>
+          <w:numId w:val="2"/>
+        </w:numPr>
+        <w:spacing w:after="80" w:line="268"/>
+      </w:pPr>
+      <w:r>
+        <w:rPr>
+          <w:rFonts w:ascii="Arial" w:cs="Arial" w:eastAsia="Arial" w:hAnsi="Arial"/>
+          <w:b/>
+          <w:bCs/>
+        </w:rPr>
+        <w:t xml:space="preserve">Política declarativa: </w:t>
+      </w:r>
+      <w:r>
+        <w:rPr>
+          <w:rFonts w:ascii="Consolas" w:cs="Consolas" w:eastAsia="Consolas" w:hAnsi="Consolas"/>
+          <w:color w:val="4F46E5"/>
+        </w:rPr>
+        <w:t xml:space="preserve">opa/policies/authz.rego</w:t>
+      </w:r>
+      <w:r>
+        <w:rPr>
+          <w:rFonts w:ascii="Arial" w:cs="Arial" w:eastAsia="Arial" w:hAnsi="Arial"/>
+        </w:rPr>
+        <w:t xml:space="preserve"> (</w:t>
+      </w:r>
+      <w:r>
+        <w:rPr>
+          <w:rFonts w:ascii="Consolas" w:cs="Consolas" w:eastAsia="Consolas" w:hAnsi="Consolas"/>
+          <w:color w:val="4F46E5"/>
+        </w:rPr>
+        <w:t xml:space="preserve">package bookplus.authz</w:t>
+      </w:r>
+      <w:r>
+        <w:rPr>
+          <w:rFonts w:ascii="Arial" w:cs="Arial" w:eastAsia="Arial" w:hAnsi="Arial"/>
+        </w:rPr>
+        <w:t xml:space="preserve">) implementa reglas como: el dueño lee/edita su propio recurso (bloquea IDOR), un </w:t>
+      </w:r>
+      <w:r>
+        <w:rPr>
+          <w:rFonts w:ascii="Consolas" w:cs="Consolas" w:eastAsia="Consolas" w:hAnsi="Consolas"/>
+          <w:color w:val="4F46E5"/>
+        </w:rPr>
+        <w:t xml:space="preserve">ADMIN</w:t>
+      </w:r>
+      <w:r>
+        <w:rPr>
+          <w:rFonts w:ascii="Arial" w:cs="Arial" w:eastAsia="Arial" w:hAnsi="Arial"/>
+        </w:rPr>
+        <w:t xml:space="preserve"> aprueba reembolsos </w:t>
+      </w:r>
+      <w:r>
+        <w:rPr>
+          <w:rFonts w:ascii="Arial" w:cs="Arial" w:eastAsia="Arial" w:hAnsi="Arial"/>
+          <w:b/>
+          <w:bCs/>
+        </w:rPr>
+        <w:t xml:space="preserve">hasta un límite</w:t>
+      </w:r>
+      <w:r>
+        <w:rPr>
+          <w:rFonts w:ascii="Arial" w:cs="Arial" w:eastAsia="Arial" w:hAnsi="Arial"/>
+        </w:rPr>
+        <w:t xml:space="preserve"> y por encima solo un </w:t>
+      </w:r>
+      <w:r>
+        <w:rPr>
+          <w:rFonts w:ascii="Consolas" w:cs="Consolas" w:eastAsia="Consolas" w:hAnsi="Consolas"/>
+          <w:color w:val="4F46E5"/>
+        </w:rPr>
+        <w:t xml:space="preserve">SUPERADMIN</w:t>
+      </w:r>
+      <w:r>
+        <w:rPr>
+          <w:rFonts w:ascii="Arial" w:cs="Arial" w:eastAsia="Arial" w:hAnsi="Arial"/>
+        </w:rPr>
+        <w:t xml:space="preserve">, un </w:t>
+      </w:r>
+      <w:r>
+        <w:rPr>
+          <w:rFonts w:ascii="Consolas" w:cs="Consolas" w:eastAsia="Consolas" w:hAnsi="Consolas"/>
+          <w:color w:val="4F46E5"/>
+        </w:rPr>
+        <w:t xml:space="preserve">REPARTIDOR</w:t>
+      </w:r>
+      <w:r>
+        <w:rPr>
+          <w:rFonts w:ascii="Arial" w:cs="Arial" w:eastAsia="Arial" w:hAnsi="Arial"/>
+        </w:rPr>
+        <w:t xml:space="preserve"> solo entrega pedidos asignados a él. Por defecto </w:t>
+      </w:r>
+      <w:r>
+        <w:rPr>
+          <w:rFonts w:ascii="Arial" w:cs="Arial" w:eastAsia="Arial" w:hAnsi="Arial"/>
+          <w:b/>
+          <w:bCs/>
+        </w:rPr>
+        <w:t xml:space="preserve">deniega</w:t>
+      </w:r>
+      <w:r>
+        <w:rPr>
+          <w:rFonts w:ascii="Arial" w:cs="Arial" w:eastAsia="Arial" w:hAnsi="Arial"/>
+        </w:rPr>
+        <w:t xml:space="preserve"> (fail-safe).</w:t>
+      </w:r>
+    </w:p>
+    <w:p>
+      <w:pPr>
+        <w:pStyle w:val="ListParagraph"/>
+        <w:numPr>
+          <w:ilvl w:val="0"/>
+          <w:numId w:val="2"/>
+        </w:numPr>
+        <w:spacing w:after="80" w:line="268"/>
+      </w:pPr>
+      <w:r>
+        <w:rPr>
+          <w:rFonts w:ascii="Arial" w:cs="Arial" w:eastAsia="Arial" w:hAnsi="Arial"/>
+          <w:b/>
+          <w:bCs/>
+        </w:rPr>
+        <w:t xml:space="preserve">Probada como código: </w:t>
+      </w:r>
+      <w:r>
+        <w:rPr>
+          <w:rFonts w:ascii="Consolas" w:cs="Consolas" w:eastAsia="Consolas" w:hAnsi="Consolas"/>
+          <w:color w:val="4F46E5"/>
+        </w:rPr>
+        <w:t xml:space="preserve">opa/policies/authz_test.rego</w:t>
+      </w:r>
+      <w:r>
+        <w:rPr>
+          <w:rFonts w:ascii="Arial" w:cs="Arial" w:eastAsia="Arial" w:hAnsi="Arial"/>
+        </w:rPr>
+        <w:t xml:space="preserve"> son pruebas unitarias de la política (framework </w:t>
+      </w:r>
+      <w:r>
+        <w:rPr>
+          <w:rFonts w:ascii="Consolas" w:cs="Consolas" w:eastAsia="Consolas" w:hAnsi="Consolas"/>
+          <w:color w:val="4F46E5"/>
+        </w:rPr>
+        <w:t xml:space="preserve">opa test</w:t>
+      </w:r>
+      <w:r>
+        <w:rPr>
+          <w:rFonts w:ascii="Arial" w:cs="Arial" w:eastAsia="Arial" w:hAnsi="Arial"/>
+        </w:rPr>
+        <w:t xml:space="preserve">); el workflow </w:t>
+      </w:r>
+      <w:r>
+        <w:rPr>
+          <w:rFonts w:ascii="Consolas" w:cs="Consolas" w:eastAsia="Consolas" w:hAnsi="Consolas"/>
+          <w:color w:val="4F46E5"/>
+        </w:rPr>
+        <w:t xml:space="preserve">.github/workflows/opa.yml</w:t>
+      </w:r>
+      <w:r>
+        <w:rPr>
+          <w:rFonts w:ascii="Arial" w:cs="Arial" w:eastAsia="Arial" w:hAnsi="Arial"/>
+        </w:rPr>
+        <w:t xml:space="preserve"> ejecuta </w:t>
+      </w:r>
+      <w:r>
+        <w:rPr>
+          <w:rFonts w:ascii="Consolas" w:cs="Consolas" w:eastAsia="Consolas" w:hAnsi="Consolas"/>
+          <w:color w:val="4F46E5"/>
+        </w:rPr>
+        <w:t xml:space="preserve">opa fmt</w:t>
+      </w:r>
+      <w:r>
+        <w:rPr>
+          <w:rFonts w:ascii="Arial" w:cs="Arial" w:eastAsia="Arial" w:hAnsi="Arial"/>
+        </w:rPr>
+        <w:t xml:space="preserve">, </w:t>
+      </w:r>
+      <w:r>
+        <w:rPr>
+          <w:rFonts w:ascii="Consolas" w:cs="Consolas" w:eastAsia="Consolas" w:hAnsi="Consolas"/>
+          <w:color w:val="4F46E5"/>
+        </w:rPr>
+        <w:t xml:space="preserve">opa check</w:t>
+      </w:r>
+      <w:r>
+        <w:rPr>
+          <w:rFonts w:ascii="Arial" w:cs="Arial" w:eastAsia="Arial" w:hAnsi="Arial"/>
+        </w:rPr>
+        <w:t xml:space="preserve"> y </w:t>
+      </w:r>
+      <w:r>
+        <w:rPr>
+          <w:rFonts w:ascii="Consolas" w:cs="Consolas" w:eastAsia="Consolas" w:hAnsi="Consolas"/>
+          <w:color w:val="4F46E5"/>
+        </w:rPr>
+        <w:t xml:space="preserve">opa test</w:t>
+      </w:r>
+      <w:r>
+        <w:rPr>
+          <w:rFonts w:ascii="Arial" w:cs="Arial" w:eastAsia="Arial" w:hAnsi="Arial"/>
+        </w:rPr>
+        <w:t xml:space="preserve"> como </w:t>
+      </w:r>
+      <w:r>
+        <w:rPr>
+          <w:rFonts w:ascii="Arial" w:cs="Arial" w:eastAsia="Arial" w:hAnsi="Arial"/>
+          <w:b/>
+          <w:bCs/>
+        </w:rPr>
+        <w:t xml:space="preserve">policy gate</w:t>
+      </w:r>
+      <w:r>
+        <w:rPr>
+          <w:rFonts w:ascii="Arial" w:cs="Arial" w:eastAsia="Arial" w:hAnsi="Arial"/>
+        </w:rPr>
+        <w:t xml:space="preserve"> del pipeline. OPA corre como servicio en el compose (puerto 8181).</w:t>
+      </w:r>
+    </w:p>
+    <w:p>
+      <w:pPr>
+        <w:pStyle w:val="ListParagraph"/>
+        <w:numPr>
+          <w:ilvl w:val="0"/>
+          <w:numId w:val="2"/>
+        </w:numPr>
+        <w:spacing w:after="80" w:line="268"/>
+      </w:pPr>
+      <w:r>
+        <w:rPr>
+          <w:rFonts w:ascii="Arial" w:cs="Arial" w:eastAsia="Arial" w:hAnsi="Arial"/>
+          <w:b/>
+          <w:bCs/>
+        </w:rPr>
+        <w:t xml:space="preserve">Punto de aplicación desacoplado: </w:t>
+      </w:r>
+      <w:r>
+        <w:rPr>
+          <w:rFonts w:ascii="Consolas" w:cs="Consolas" w:eastAsia="Consolas" w:hAnsi="Consolas"/>
+          <w:color w:val="4F46E5"/>
+        </w:rPr>
+        <w:t xml:space="preserve">OpaAuthorizationClient</w:t>
+      </w:r>
+      <w:r>
+        <w:rPr>
+          <w:rFonts w:ascii="Arial" w:cs="Arial" w:eastAsia="Arial" w:hAnsi="Arial"/>
+        </w:rPr>
+        <w:t xml:space="preserve"> (order-service, adaptador de salida, JDK puro) envía el input {sujeto, acción, recurso} a OPA y obtiene allow/deny. Se despliega en </w:t>
+      </w:r>
+      <w:r>
+        <w:rPr>
+          <w:rFonts w:ascii="Arial" w:cs="Arial" w:eastAsia="Arial" w:hAnsi="Arial"/>
+          <w:b/>
+          <w:bCs/>
+        </w:rPr>
+        <w:t xml:space="preserve">modo shadow</w:t>
+      </w:r>
+      <w:r>
+        <w:rPr>
+          <w:rFonts w:ascii="Arial" w:cs="Arial" w:eastAsia="Arial" w:hAnsi="Arial"/>
+        </w:rPr>
+        <w:t xml:space="preserve"> (</w:t>
+      </w:r>
+      <w:r>
+        <w:rPr>
+          <w:rFonts w:ascii="Consolas" w:cs="Consolas" w:eastAsia="Consolas" w:hAnsi="Consolas"/>
+          <w:color w:val="4F46E5"/>
+        </w:rPr>
+        <w:t xml:space="preserve">opa.enabled=false</w:t>
+      </w:r>
+      <w:r>
+        <w:rPr>
+          <w:rFonts w:ascii="Arial" w:cs="Arial" w:eastAsia="Arial" w:hAnsi="Arial"/>
+        </w:rPr>
+        <w:t xml:space="preserve">) para un rollout gradual, con </w:t>
+      </w:r>
+      <w:r>
+        <w:rPr>
+          <w:rFonts w:ascii="Consolas" w:cs="Consolas" w:eastAsia="Consolas" w:hAnsi="Consolas"/>
+          <w:color w:val="4F46E5"/>
+        </w:rPr>
+        <w:t xml:space="preserve">fail-open</w:t>
+      </w:r>
+      <w:r>
+        <w:rPr>
+          <w:rFonts w:ascii="Arial" w:cs="Arial" w:eastAsia="Arial" w:hAnsi="Arial"/>
+        </w:rPr>
+        <w:t xml:space="preserve"> configurable ante indisponibilidad de OPA.</w:t>
+      </w:r>
+    </w:p>
+    <w:p>
+      <w:pPr>
+        <w:spacing w:after="120" w:line="276"/>
+      </w:pPr>
+      <w:r>
+        <w:rPr>
+          <w:rFonts w:ascii="Arial" w:cs="Arial" w:eastAsia="Arial" w:hAnsi="Arial"/>
+          <w:b/>
+          <w:bCs/>
+        </w:rPr>
+        <w:t xml:space="preserve">Verificación: </w:t>
+      </w:r>
+      <w:r>
+        <w:rPr>
+          <w:rFonts w:ascii="Arial" w:cs="Arial" w:eastAsia="Arial" w:hAnsi="Arial"/>
+        </w:rPr>
+        <w:t xml:space="preserve">la lógica de las 9 reglas se validó (allow/deny esperado en cada caso) y el </w:t>
+      </w:r>
+      <w:r>
+        <w:rPr>
+          <w:rFonts w:ascii="Consolas" w:cs="Consolas" w:eastAsia="Consolas" w:hAnsi="Consolas"/>
+          <w:color w:val="4F46E5"/>
+        </w:rPr>
+        <w:t xml:space="preserve">OpaAuthorizationClientTest</w:t>
+      </w:r>
+      <w:r>
+        <w:rPr>
+          <w:rFonts w:ascii="Arial" w:cs="Arial" w:eastAsia="Arial" w:hAnsi="Arial"/>
+        </w:rPr>
+        <w:t xml:space="preserve"> cubre la construcción del input y el modo shadow; en el CI, </w:t>
+      </w:r>
+      <w:r>
+        <w:rPr>
+          <w:rFonts w:ascii="Consolas" w:cs="Consolas" w:eastAsia="Consolas" w:hAnsi="Consolas"/>
+          <w:color w:val="4F46E5"/>
+        </w:rPr>
+        <w:t xml:space="preserve">opa test</w:t>
+      </w:r>
+      <w:r>
+        <w:rPr>
+          <w:rFonts w:ascii="Arial" w:cs="Arial" w:eastAsia="Arial" w:hAnsi="Arial"/>
+        </w:rPr>
+        <w:t xml:space="preserve"> valida el Rego real.</w:t>
+      </w:r>
+    </w:p>
+    <w:p>
+      <w:pPr>
+        <w:pStyle w:val="Heading2"/>
+      </w:pPr>
+      <w:r>
+        <w:rPr>
+          <w:rFonts w:ascii="Arial" w:cs="Arial" w:eastAsia="Arial" w:hAnsi="Arial"/>
+        </w:rPr>
+        <w:t xml:space="preserve">13.46 MFA — segundo factor con TOTP (RFC 6238)</w:t>
+      </w:r>
+    </w:p>
+    <w:p>
+      <w:pPr>
+        <w:spacing w:after="120" w:line="276"/>
+      </w:pPr>
+      <w:r>
+        <w:rPr>
+          <w:rFonts w:ascii="Arial" w:cs="Arial" w:eastAsia="Arial" w:hAnsi="Arial"/>
+          <w:b/>
+          <w:bCs/>
+        </w:rPr>
+        <w:t xml:space="preserve">Qué es: </w:t>
+      </w:r>
+      <w:r>
+        <w:rPr>
+          <w:rFonts w:ascii="Arial" w:cs="Arial" w:eastAsia="Arial" w:hAnsi="Arial"/>
+        </w:rPr>
+        <w:t xml:space="preserve">autenticación multifactor (MFA) mediante </w:t>
+      </w:r>
+      <w:r>
+        <w:rPr>
+          <w:rFonts w:ascii="Arial" w:cs="Arial" w:eastAsia="Arial" w:hAnsi="Arial"/>
+          <w:b/>
+          <w:bCs/>
+        </w:rPr>
+        <w:t xml:space="preserve">TOTP</w:t>
+      </w:r>
+      <w:r>
+        <w:rPr>
+          <w:rFonts w:ascii="Arial" w:cs="Arial" w:eastAsia="Arial" w:hAnsi="Arial"/>
+        </w:rPr>
+        <w:t xml:space="preserve"> (Time-based One-Time Password), el segundo factor de banca por excelencia, compatible con Google Authenticator, Authy, 1Password, etc. Además de la contraseña, el usuario prueba que posee un dispositivo que genera un código de 6 dígitos que cambia cada 30s.</w:t>
+      </w:r>
+    </w:p>
+    <w:p>
+      <w:pPr>
+        <w:pStyle w:val="ListParagraph"/>
+        <w:numPr>
+          <w:ilvl w:val="0"/>
+          <w:numId w:val="2"/>
+        </w:numPr>
+        <w:spacing w:after="80" w:line="268"/>
+      </w:pPr>
+      <w:r>
+        <w:rPr>
+          <w:rFonts w:ascii="Arial" w:cs="Arial" w:eastAsia="Arial" w:hAnsi="Arial"/>
+          <w:b/>
+          <w:bCs/>
+        </w:rPr>
+        <w:t xml:space="preserve">Criptografía en JDK puro: </w:t>
+      </w:r>
+      <w:r>
+        <w:rPr>
+          <w:rFonts w:ascii="Consolas" w:cs="Consolas" w:eastAsia="Consolas" w:hAnsi="Consolas"/>
+          <w:color w:val="4F46E5"/>
+        </w:rPr>
+        <w:t xml:space="preserve">TotpService</w:t>
+      </w:r>
+      <w:r>
+        <w:rPr>
+          <w:rFonts w:ascii="Arial" w:cs="Arial" w:eastAsia="Arial" w:hAnsi="Arial"/>
+        </w:rPr>
+        <w:t xml:space="preserve"> (auth-service) implementa </w:t>
+      </w:r>
+      <w:r>
+        <w:rPr>
+          <w:rFonts w:ascii="Arial" w:cs="Arial" w:eastAsia="Arial" w:hAnsi="Arial"/>
+          <w:b/>
+          <w:bCs/>
+        </w:rPr>
+        <w:t xml:space="preserve">RFC 6238</w:t>
+      </w:r>
+      <w:r>
+        <w:rPr>
+          <w:rFonts w:ascii="Arial" w:cs="Arial" w:eastAsia="Arial" w:hAnsi="Arial"/>
+        </w:rPr>
+        <w:t xml:space="preserve"> sobre HOTP (RFC 4226) con </w:t>
+      </w:r>
+      <w:r>
+        <w:rPr>
+          <w:rFonts w:ascii="Consolas" w:cs="Consolas" w:eastAsia="Consolas" w:hAnsi="Consolas"/>
+          <w:color w:val="4F46E5"/>
+        </w:rPr>
+        <w:t xml:space="preserve">HmacSHA1</w:t>
+      </w:r>
+      <w:r>
+        <w:rPr>
+          <w:rFonts w:ascii="Arial" w:cs="Arial" w:eastAsia="Arial" w:hAnsi="Arial"/>
+        </w:rPr>
+        <w:t xml:space="preserve">, sin dependencias externas. Incluye </w:t>
+      </w:r>
+      <w:r>
+        <w:rPr>
+          <w:rFonts w:ascii="Consolas" w:cs="Consolas" w:eastAsia="Consolas" w:hAnsi="Consolas"/>
+          <w:color w:val="4F46E5"/>
+        </w:rPr>
+        <w:t xml:space="preserve">Base32</w:t>
+      </w:r>
+      <w:r>
+        <w:rPr>
+          <w:rFonts w:ascii="Arial" w:cs="Arial" w:eastAsia="Arial" w:hAnsi="Arial"/>
+        </w:rPr>
+        <w:t xml:space="preserve"> (RFC 4648) para el secreto y la generación de la URI </w:t>
+      </w:r>
+      <w:r>
+        <w:rPr>
+          <w:rFonts w:ascii="Consolas" w:cs="Consolas" w:eastAsia="Consolas" w:hAnsi="Consolas"/>
+          <w:color w:val="4F46E5"/>
+        </w:rPr>
+        <w:t xml:space="preserve">otpauth://</w:t>
+      </w:r>
+      <w:r>
+        <w:rPr>
+          <w:rFonts w:ascii="Arial" w:cs="Arial" w:eastAsia="Arial" w:hAnsi="Arial"/>
+        </w:rPr>
+        <w:t xml:space="preserve"> que se pinta como código QR en el enrolamiento.</w:t>
+      </w:r>
+    </w:p>
+    <w:p>
+      <w:pPr>
+        <w:pStyle w:val="ListParagraph"/>
+        <w:numPr>
+          <w:ilvl w:val="0"/>
+          <w:numId w:val="2"/>
+        </w:numPr>
+        <w:spacing w:after="80" w:line="268"/>
+      </w:pPr>
+      <w:r>
+        <w:rPr>
+          <w:rFonts w:ascii="Arial" w:cs="Arial" w:eastAsia="Arial" w:hAnsi="Arial"/>
+          <w:b/>
+          <w:bCs/>
+        </w:rPr>
+        <w:t xml:space="preserve">Ventana de tolerancia y comparación segura: </w:t>
+      </w:r>
+      <w:r>
+        <w:rPr>
+          <w:rFonts w:ascii="Arial" w:cs="Arial" w:eastAsia="Arial" w:hAnsi="Arial"/>
+        </w:rPr>
+        <w:t xml:space="preserve">la verificación acepta ±1 paso (±30s) para absorber el desfase de reloj, y compara en </w:t>
+      </w:r>
+      <w:r>
+        <w:rPr>
+          <w:rFonts w:ascii="Arial" w:cs="Arial" w:eastAsia="Arial" w:hAnsi="Arial"/>
+          <w:b/>
+          <w:bCs/>
+        </w:rPr>
+        <w:t xml:space="preserve">tiempo constante</w:t>
+      </w:r>
+      <w:r>
+        <w:rPr>
+          <w:rFonts w:ascii="Arial" w:cs="Arial" w:eastAsia="Arial" w:hAnsi="Arial"/>
+        </w:rPr>
+        <w:t xml:space="preserve"> para no filtrar información por temporización.</w:t>
+      </w:r>
+    </w:p>
+    <w:p>
+      <w:pPr>
+        <w:pStyle w:val="ListParagraph"/>
+        <w:numPr>
+          <w:ilvl w:val="0"/>
+          <w:numId w:val="2"/>
+        </w:numPr>
+        <w:spacing w:after="80" w:line="268"/>
+      </w:pPr>
+      <w:r>
+        <w:rPr>
+          <w:rFonts w:ascii="Arial" w:cs="Arial" w:eastAsia="Arial" w:hAnsi="Arial"/>
+          <w:b/>
+          <w:bCs/>
+        </w:rPr>
+        <w:t xml:space="preserve">Endpoints: </w:t>
+      </w:r>
+      <w:r>
+        <w:rPr>
+          <w:rFonts w:ascii="Consolas" w:cs="Consolas" w:eastAsia="Consolas" w:hAnsi="Consolas"/>
+          <w:color w:val="4F46E5"/>
+        </w:rPr>
+        <w:t xml:space="preserve">POST /api/v1/auth/mfa/enroll</w:t>
+      </w:r>
+      <w:r>
+        <w:rPr>
+          <w:rFonts w:ascii="Arial" w:cs="Arial" w:eastAsia="Arial" w:hAnsi="Arial"/>
+        </w:rPr>
+        <w:t xml:space="preserve"> (devuelve el secreto y la URI otpauth) y </w:t>
+      </w:r>
+      <w:r>
+        <w:rPr>
+          <w:rFonts w:ascii="Consolas" w:cs="Consolas" w:eastAsia="Consolas" w:hAnsi="Consolas"/>
+          <w:color w:val="4F46E5"/>
+        </w:rPr>
+        <w:t xml:space="preserve">POST /api/v1/auth/mfa/verify</w:t>
+      </w:r>
+      <w:r>
+        <w:rPr>
+          <w:rFonts w:ascii="Arial" w:cs="Arial" w:eastAsia="Arial" w:hAnsi="Arial"/>
+        </w:rPr>
+        <w:t xml:space="preserve"> (valida un código); ambos requieren estar autenticado. La persistencia del secreto por usuario y su exigencia en el login se apoyan en este núcleo.</w:t>
+      </w:r>
+    </w:p>
+    <w:p>
+      <w:pPr>
+        <w:spacing w:after="120" w:line="276"/>
+      </w:pPr>
+      <w:r>
+        <w:rPr>
+          <w:rFonts w:ascii="Arial" w:cs="Arial" w:eastAsia="Arial" w:hAnsi="Arial"/>
+          <w:b/>
+          <w:bCs/>
+        </w:rPr>
+        <w:t xml:space="preserve">Verificación: </w:t>
+      </w:r>
+      <w:r>
+        <w:rPr>
+          <w:rFonts w:ascii="Arial" w:cs="Arial" w:eastAsia="Arial" w:hAnsi="Arial"/>
+        </w:rPr>
+        <w:t xml:space="preserve">el </w:t>
+      </w:r>
+      <w:r>
+        <w:rPr>
+          <w:rFonts w:ascii="Consolas" w:cs="Consolas" w:eastAsia="Consolas" w:hAnsi="Consolas"/>
+          <w:color w:val="4F46E5"/>
+        </w:rPr>
+        <w:t xml:space="preserve">TotpServiceTest</w:t>
+      </w:r>
+      <w:r>
+        <w:rPr>
+          <w:rFonts w:ascii="Arial" w:cs="Arial" w:eastAsia="Arial" w:hAnsi="Arial"/>
+        </w:rPr>
+        <w:t xml:space="preserve"> comprueba el algoritmo </w:t>
+      </w:r>
+      <w:r>
+        <w:rPr>
+          <w:rFonts w:ascii="Arial" w:cs="Arial" w:eastAsia="Arial" w:hAnsi="Arial"/>
+          <w:b/>
+          <w:bCs/>
+        </w:rPr>
+        <w:t xml:space="preserve">contra los vectores oficiales del RFC 6238</w:t>
+      </w:r>
+      <w:r>
+        <w:rPr>
+          <w:rFonts w:ascii="Arial" w:cs="Arial" w:eastAsia="Arial" w:hAnsi="Arial"/>
+        </w:rPr>
+        <w:t xml:space="preserve">, el round-trip de Base32, la ventana de tolerancia y el rechazo de códigos expirados/inválidos.</w:t>
+      </w:r>
+    </w:p>
+    <w:p>
+      <w:pPr>
         <w:pStyle w:val="Heading1"/>
       </w:pPr>
       <w:r>
@@ -19603,6 +20901,386 @@
                 <w:szCs w:val="19"/>
               </w:rPr>
               <w:t xml:space="preserve">Comunicación interna binaria, tipada y de baja latencia</w:t>
+            </w:r>
+          </w:p>
+        </w:tc>
+      </w:tr>
+      <w:tr>
+        <w:trPr>
+          <w:tblHeader w:val="false"/>
+        </w:trPr>
+        <w:tc>
+          <w:tcPr>
+            <w:tcW w:type="dxa" w:w="2500"/>
+            <w:tcBorders>
+              <w:top w:val="single" w:color="D1D5DB" w:sz="1"/>
+              <w:left w:val="single" w:color="D1D5DB" w:sz="1"/>
+              <w:bottom w:val="single" w:color="D1D5DB" w:sz="1"/>
+              <w:right w:val="single" w:color="D1D5DB" w:sz="1"/>
+            </w:tcBorders>
+            <w:tcMar>
+              <w:top w:type="dxa" w:w="60"/>
+              <w:left w:type="dxa" w:w="110"/>
+              <w:bottom w:type="dxa" w:w="60"/>
+              <w:right w:type="dxa" w:w="110"/>
+            </w:tcMar>
+          </w:tcPr>
+          <w:p>
+            <w:pPr>
+              <w:spacing w:after="0" w:line="264"/>
+            </w:pPr>
+            <w:r>
+              <w:rPr>
+                <w:rFonts w:ascii="Arial" w:cs="Arial" w:eastAsia="Arial" w:hAnsi="Arial"/>
+                <w:sz w:val="19"/>
+                <w:szCs w:val="19"/>
+              </w:rPr>
+              <w:t xml:space="preserve">SAST por taint analysis (CodeQL)</w:t>
+            </w:r>
+          </w:p>
+        </w:tc>
+        <w:tc>
+          <w:tcPr>
+            <w:tcW w:type="dxa" w:w="3700"/>
+            <w:tcBorders>
+              <w:top w:val="single" w:color="D1D5DB" w:sz="1"/>
+              <w:left w:val="single" w:color="D1D5DB" w:sz="1"/>
+              <w:bottom w:val="single" w:color="D1D5DB" w:sz="1"/>
+              <w:right w:val="single" w:color="D1D5DB" w:sz="1"/>
+            </w:tcBorders>
+            <w:tcMar>
+              <w:top w:type="dxa" w:w="60"/>
+              <w:left w:type="dxa" w:w="110"/>
+              <w:bottom w:type="dxa" w:w="60"/>
+              <w:right w:type="dxa" w:w="110"/>
+            </w:tcMar>
+          </w:tcPr>
+          <w:p>
+            <w:pPr>
+              <w:spacing w:after="0" w:line="264"/>
+            </w:pPr>
+            <w:r>
+              <w:rPr>
+                <w:rFonts w:ascii="Arial" w:cs="Arial" w:eastAsia="Arial" w:hAnsi="Arial"/>
+                <w:sz w:val="19"/>
+                <w:szCs w:val="19"/>
+              </w:rPr>
+              <w:t xml:space="preserve">CI: codeql.yml (build-mode none)</w:t>
+            </w:r>
+          </w:p>
+        </w:tc>
+        <w:tc>
+          <w:tcPr>
+            <w:tcW w:type="dxa" w:w="3160"/>
+            <w:tcBorders>
+              <w:top w:val="single" w:color="D1D5DB" w:sz="1"/>
+              <w:left w:val="single" w:color="D1D5DB" w:sz="1"/>
+              <w:bottom w:val="single" w:color="D1D5DB" w:sz="1"/>
+              <w:right w:val="single" w:color="D1D5DB" w:sz="1"/>
+            </w:tcBorders>
+            <w:tcMar>
+              <w:top w:type="dxa" w:w="60"/>
+              <w:left w:type="dxa" w:w="110"/>
+              <w:bottom w:type="dxa" w:w="60"/>
+              <w:right w:type="dxa" w:w="110"/>
+            </w:tcMar>
+          </w:tcPr>
+          <w:p>
+            <w:pPr>
+              <w:spacing w:after="0" w:line="264"/>
+            </w:pPr>
+            <w:r>
+              <w:rPr>
+                <w:rFonts w:ascii="Arial" w:cs="Arial" w:eastAsia="Arial" w:hAnsi="Arial"/>
+                <w:sz w:val="19"/>
+                <w:szCs w:val="19"/>
+              </w:rPr>
+              <w:t xml:space="preserve">Detectar inyección/XSS siguiendo el flujo de datos del código propio</w:t>
+            </w:r>
+          </w:p>
+        </w:tc>
+      </w:tr>
+      <w:tr>
+        <w:trPr>
+          <w:tblHeader w:val="false"/>
+        </w:trPr>
+        <w:tc>
+          <w:tcPr>
+            <w:tcW w:type="dxa" w:w="2500"/>
+            <w:tcBorders>
+              <w:top w:val="single" w:color="D1D5DB" w:sz="1"/>
+              <w:left w:val="single" w:color="D1D5DB" w:sz="1"/>
+              <w:bottom w:val="single" w:color="D1D5DB" w:sz="1"/>
+              <w:right w:val="single" w:color="D1D5DB" w:sz="1"/>
+            </w:tcBorders>
+            <w:tcMar>
+              <w:top w:type="dxa" w:w="60"/>
+              <w:left w:type="dxa" w:w="110"/>
+              <w:bottom w:type="dxa" w:w="60"/>
+              <w:right w:type="dxa" w:w="110"/>
+            </w:tcMar>
+          </w:tcPr>
+          <w:p>
+            <w:pPr>
+              <w:spacing w:after="0" w:line="264"/>
+            </w:pPr>
+            <w:r>
+              <w:rPr>
+                <w:rFonts w:ascii="Arial" w:cs="Arial" w:eastAsia="Arial" w:hAnsi="Arial"/>
+                <w:sz w:val="19"/>
+                <w:szCs w:val="19"/>
+              </w:rPr>
+              <w:t xml:space="preserve">Alerting as Code</w:t>
+            </w:r>
+          </w:p>
+        </w:tc>
+        <w:tc>
+          <w:tcPr>
+            <w:tcW w:type="dxa" w:w="3700"/>
+            <w:tcBorders>
+              <w:top w:val="single" w:color="D1D5DB" w:sz="1"/>
+              <w:left w:val="single" w:color="D1D5DB" w:sz="1"/>
+              <w:bottom w:val="single" w:color="D1D5DB" w:sz="1"/>
+              <w:right w:val="single" w:color="D1D5DB" w:sz="1"/>
+            </w:tcBorders>
+            <w:tcMar>
+              <w:top w:type="dxa" w:w="60"/>
+              <w:left w:type="dxa" w:w="110"/>
+              <w:bottom w:type="dxa" w:w="60"/>
+              <w:right w:type="dxa" w:w="110"/>
+            </w:tcMar>
+          </w:tcPr>
+          <w:p>
+            <w:pPr>
+              <w:spacing w:after="0" w:line="264"/>
+            </w:pPr>
+            <w:r>
+              <w:rPr>
+                <w:rFonts w:ascii="Arial" w:cs="Arial" w:eastAsia="Arial" w:hAnsi="Arial"/>
+                <w:sz w:val="19"/>
+                <w:szCs w:val="19"/>
+              </w:rPr>
+              <w:t xml:space="preserve">Prometheus rules + Alertmanager (alert-rules.yml)</w:t>
+            </w:r>
+          </w:p>
+        </w:tc>
+        <w:tc>
+          <w:tcPr>
+            <w:tcW w:type="dxa" w:w="3160"/>
+            <w:tcBorders>
+              <w:top w:val="single" w:color="D1D5DB" w:sz="1"/>
+              <w:left w:val="single" w:color="D1D5DB" w:sz="1"/>
+              <w:bottom w:val="single" w:color="D1D5DB" w:sz="1"/>
+              <w:right w:val="single" w:color="D1D5DB" w:sz="1"/>
+            </w:tcBorders>
+            <w:tcMar>
+              <w:top w:type="dxa" w:w="60"/>
+              <w:left w:type="dxa" w:w="110"/>
+              <w:bottom w:type="dxa" w:w="60"/>
+              <w:right w:type="dxa" w:w="110"/>
+            </w:tcMar>
+          </w:tcPr>
+          <w:p>
+            <w:pPr>
+              <w:spacing w:after="0" w:line="264"/>
+            </w:pPr>
+            <w:r>
+              <w:rPr>
+                <w:rFonts w:ascii="Arial" w:cs="Arial" w:eastAsia="Arial" w:hAnsi="Arial"/>
+                <w:sz w:val="19"/>
+                <w:szCs w:val="19"/>
+              </w:rPr>
+              <w:t xml:space="preserve">Alertas versionadas (RED + saturación) enrutadas y deduplicadas</w:t>
+            </w:r>
+          </w:p>
+        </w:tc>
+      </w:tr>
+      <w:tr>
+        <w:trPr>
+          <w:tblHeader w:val="false"/>
+        </w:trPr>
+        <w:tc>
+          <w:tcPr>
+            <w:tcW w:type="dxa" w:w="2500"/>
+            <w:tcBorders>
+              <w:top w:val="single" w:color="D1D5DB" w:sz="1"/>
+              <w:left w:val="single" w:color="D1D5DB" w:sz="1"/>
+              <w:bottom w:val="single" w:color="D1D5DB" w:sz="1"/>
+              <w:right w:val="single" w:color="D1D5DB" w:sz="1"/>
+            </w:tcBorders>
+            <w:tcMar>
+              <w:top w:type="dxa" w:w="60"/>
+              <w:left w:type="dxa" w:w="110"/>
+              <w:bottom w:type="dxa" w:w="60"/>
+              <w:right w:type="dxa" w:w="110"/>
+            </w:tcMar>
+          </w:tcPr>
+          <w:p>
+            <w:pPr>
+              <w:spacing w:after="0" w:line="264"/>
+            </w:pPr>
+            <w:r>
+              <w:rPr>
+                <w:rFonts w:ascii="Arial" w:cs="Arial" w:eastAsia="Arial" w:hAnsi="Arial"/>
+                <w:sz w:val="19"/>
+                <w:szCs w:val="19"/>
+              </w:rPr>
+              <w:t xml:space="preserve">Policy as Code / External Authorization</w:t>
+            </w:r>
+          </w:p>
+        </w:tc>
+        <w:tc>
+          <w:tcPr>
+            <w:tcW w:type="dxa" w:w="3700"/>
+            <w:tcBorders>
+              <w:top w:val="single" w:color="D1D5DB" w:sz="1"/>
+              <w:left w:val="single" w:color="D1D5DB" w:sz="1"/>
+              <w:bottom w:val="single" w:color="D1D5DB" w:sz="1"/>
+              <w:right w:val="single" w:color="D1D5DB" w:sz="1"/>
+            </w:tcBorders>
+            <w:tcMar>
+              <w:top w:type="dxa" w:w="60"/>
+              <w:left w:type="dxa" w:w="110"/>
+              <w:bottom w:type="dxa" w:w="60"/>
+              <w:right w:type="dxa" w:w="110"/>
+            </w:tcMar>
+          </w:tcPr>
+          <w:p>
+            <w:pPr>
+              <w:spacing w:after="0" w:line="264"/>
+            </w:pPr>
+            <w:r>
+              <w:rPr>
+                <w:rFonts w:ascii="Arial" w:cs="Arial" w:eastAsia="Arial" w:hAnsi="Arial"/>
+                <w:sz w:val="19"/>
+                <w:szCs w:val="19"/>
+              </w:rPr>
+              <w:t xml:space="preserve">OPA + Rego (opa/policies) + OpaAuthorizationClient</w:t>
+            </w:r>
+          </w:p>
+        </w:tc>
+        <w:tc>
+          <w:tcPr>
+            <w:tcW w:type="dxa" w:w="3160"/>
+            <w:tcBorders>
+              <w:top w:val="single" w:color="D1D5DB" w:sz="1"/>
+              <w:left w:val="single" w:color="D1D5DB" w:sz="1"/>
+              <w:bottom w:val="single" w:color="D1D5DB" w:sz="1"/>
+              <w:right w:val="single" w:color="D1D5DB" w:sz="1"/>
+            </w:tcBorders>
+            <w:tcMar>
+              <w:top w:type="dxa" w:w="60"/>
+              <w:left w:type="dxa" w:w="110"/>
+              <w:bottom w:type="dxa" w:w="60"/>
+              <w:right w:type="dxa" w:w="110"/>
+            </w:tcMar>
+          </w:tcPr>
+          <w:p>
+            <w:pPr>
+              <w:spacing w:after="0" w:line="264"/>
+            </w:pPr>
+            <w:r>
+              <w:rPr>
+                <w:rFonts w:ascii="Arial" w:cs="Arial" w:eastAsia="Arial" w:hAnsi="Arial"/>
+                <w:sz w:val="19"/>
+                <w:szCs w:val="19"/>
+              </w:rPr>
+              <w:t xml:space="preserve">Autorización ABAC desacoplada del código, probada con opa test</w:t>
+            </w:r>
+          </w:p>
+        </w:tc>
+      </w:tr>
+      <w:tr>
+        <w:trPr>
+          <w:tblHeader w:val="false"/>
+        </w:trPr>
+        <w:tc>
+          <w:tcPr>
+            <w:tcW w:type="dxa" w:w="2500"/>
+            <w:tcBorders>
+              <w:top w:val="single" w:color="D1D5DB" w:sz="1"/>
+              <w:left w:val="single" w:color="D1D5DB" w:sz="1"/>
+              <w:bottom w:val="single" w:color="D1D5DB" w:sz="1"/>
+              <w:right w:val="single" w:color="D1D5DB" w:sz="1"/>
+            </w:tcBorders>
+            <w:tcMar>
+              <w:top w:type="dxa" w:w="60"/>
+              <w:left w:type="dxa" w:w="110"/>
+              <w:bottom w:type="dxa" w:w="60"/>
+              <w:right w:type="dxa" w:w="110"/>
+            </w:tcMar>
+          </w:tcPr>
+          <w:p>
+            <w:pPr>
+              <w:spacing w:after="0" w:line="264"/>
+            </w:pPr>
+            <w:r>
+              <w:rPr>
+                <w:rFonts w:ascii="Arial" w:cs="Arial" w:eastAsia="Arial" w:hAnsi="Arial"/>
+                <w:sz w:val="19"/>
+                <w:szCs w:val="19"/>
+              </w:rPr>
+              <w:t xml:space="preserve">MFA / TOTP (RFC 6238)</w:t>
+            </w:r>
+          </w:p>
+        </w:tc>
+        <w:tc>
+          <w:tcPr>
+            <w:tcW w:type="dxa" w:w="3700"/>
+            <w:tcBorders>
+              <w:top w:val="single" w:color="D1D5DB" w:sz="1"/>
+              <w:left w:val="single" w:color="D1D5DB" w:sz="1"/>
+              <w:bottom w:val="single" w:color="D1D5DB" w:sz="1"/>
+              <w:right w:val="single" w:color="D1D5DB" w:sz="1"/>
+            </w:tcBorders>
+            <w:tcMar>
+              <w:top w:type="dxa" w:w="60"/>
+              <w:left w:type="dxa" w:w="110"/>
+              <w:bottom w:type="dxa" w:w="60"/>
+              <w:right w:type="dxa" w:w="110"/>
+            </w:tcMar>
+          </w:tcPr>
+          <w:p>
+            <w:pPr>
+              <w:spacing w:after="0" w:line="264"/>
+            </w:pPr>
+            <w:r>
+              <w:rPr>
+                <w:rFonts w:ascii="Arial" w:cs="Arial" w:eastAsia="Arial" w:hAnsi="Arial"/>
+                <w:sz w:val="19"/>
+                <w:szCs w:val="19"/>
+              </w:rPr>
+              <w:t xml:space="preserve">auth: TotpService + MfaController</w:t>
+            </w:r>
+          </w:p>
+        </w:tc>
+        <w:tc>
+          <w:tcPr>
+            <w:tcW w:type="dxa" w:w="3160"/>
+            <w:tcBorders>
+              <w:top w:val="single" w:color="D1D5DB" w:sz="1"/>
+              <w:left w:val="single" w:color="D1D5DB" w:sz="1"/>
+              <w:bottom w:val="single" w:color="D1D5DB" w:sz="1"/>
+              <w:right w:val="single" w:color="D1D5DB" w:sz="1"/>
+            </w:tcBorders>
+            <w:tcMar>
+              <w:top w:type="dxa" w:w="60"/>
+              <w:left w:type="dxa" w:w="110"/>
+              <w:bottom w:type="dxa" w:w="60"/>
+              <w:right w:type="dxa" w:w="110"/>
+            </w:tcMar>
+          </w:tcPr>
+          <w:p>
+            <w:pPr>
+              <w:spacing w:after="0" w:line="264"/>
+            </w:pPr>
+            <w:r>
+              <w:rPr>
+                <w:rFonts w:ascii="Arial" w:cs="Arial" w:eastAsia="Arial" w:hAnsi="Arial"/>
+                <w:sz w:val="19"/>
+                <w:szCs w:val="19"/>
+              </w:rPr>
+              <w:t xml:space="preserve">Segundo factor con HMAC-SHA1, compatible con apps autenticadoras</w:t>
             </w:r>
           </w:p>
         </w:tc>

</xml_diff>

<commit_message>
feat: Buf gRPC governance, tamper-evident audit log, Toxiproxy chaos, WebAuthn/passkeys
</commit_message>
<xml_diff>
--- a/BookPlus-Stack-Tecnologico.docx
+++ b/BookPlus-Stack-Tecnologico.docx
@@ -16584,6 +16584,2143 @@
     </w:p>
     <w:p>
       <w:pPr>
+        <w:pStyle w:val="Heading2"/>
+      </w:pPr>
+      <w:r>
+        <w:rPr>
+          <w:rFonts w:ascii="Arial" w:cs="Arial" w:eastAsia="Arial" w:hAnsi="Arial"/>
+        </w:rPr>
+        <w:t xml:space="preserve">13.47 API REST contract-first (OpenAPI + Spectral)</w:t>
+      </w:r>
+    </w:p>
+    <w:p>
+      <w:pPr>
+        <w:spacing w:after="120" w:line="276"/>
+      </w:pPr>
+      <w:r>
+        <w:rPr>
+          <w:rFonts w:ascii="Arial" w:cs="Arial" w:eastAsia="Arial" w:hAnsi="Arial"/>
+          <w:b/>
+          <w:bCs/>
+        </w:rPr>
+        <w:t xml:space="preserve">Qué es: </w:t>
+      </w:r>
+      <w:r>
+        <w:rPr>
+          <w:rFonts w:ascii="Arial" w:cs="Arial" w:eastAsia="Arial" w:hAnsi="Arial"/>
+        </w:rPr>
+        <w:t xml:space="preserve">gobernanza de API con enfoque </w:t>
+      </w:r>
+      <w:r>
+        <w:rPr>
+          <w:rFonts w:ascii="Arial" w:cs="Arial" w:eastAsia="Arial" w:hAnsi="Arial"/>
+          <w:b/>
+          <w:bCs/>
+        </w:rPr>
+        <w:t xml:space="preserve">contract-first</w:t>
+      </w:r>
+      <w:r>
+        <w:rPr>
+          <w:rFonts w:ascii="Arial" w:cs="Arial" w:eastAsia="Arial" w:hAnsi="Arial"/>
+        </w:rPr>
+        <w:t xml:space="preserve">: el contrato OpenAPI (</w:t>
+      </w:r>
+      <w:r>
+        <w:rPr>
+          <w:rFonts w:ascii="Consolas" w:cs="Consolas" w:eastAsia="Consolas" w:hAnsi="Consolas"/>
+          <w:color w:val="4F46E5"/>
+        </w:rPr>
+        <w:t xml:space="preserve">api/openapi/auth-service.yaml</w:t>
+      </w:r>
+      <w:r>
+        <w:rPr>
+          <w:rFonts w:ascii="Arial" w:cs="Arial" w:eastAsia="Arial" w:hAnsi="Arial"/>
+        </w:rPr>
+        <w:t xml:space="preserve">) es la FUENTE DE VERDAD del API, no una consecuencia del código. De él pueden generarse stubs de cliente/servidor y se valida automáticamente para que el contrato no se degrade.</w:t>
+      </w:r>
+    </w:p>
+    <w:p>
+      <w:pPr>
+        <w:pStyle w:val="ListParagraph"/>
+        <w:numPr>
+          <w:ilvl w:val="0"/>
+          <w:numId w:val="2"/>
+        </w:numPr>
+        <w:spacing w:after="80" w:line="268"/>
+      </w:pPr>
+      <w:r>
+        <w:rPr>
+          <w:rFonts w:ascii="Arial" w:cs="Arial" w:eastAsia="Arial" w:hAnsi="Arial"/>
+          <w:b/>
+          <w:bCs/>
+        </w:rPr>
+        <w:t xml:space="preserve">Contrato versionado: </w:t>
+      </w:r>
+      <w:r>
+        <w:rPr>
+          <w:rFonts w:ascii="Arial" w:cs="Arial" w:eastAsia="Arial" w:hAnsi="Arial"/>
+        </w:rPr>
+        <w:t xml:space="preserve">un OpenAPI 3.0 describe rutas, esquemas, seguridad (JWT bearer) y respuestas del auth-service (registro, login, refresh, recuperación y MFA). Al estar en el repo, evoluciona con revisión de código como cualquier otro artefacto.</w:t>
+      </w:r>
+    </w:p>
+    <w:p>
+      <w:pPr>
+        <w:pStyle w:val="ListParagraph"/>
+        <w:numPr>
+          <w:ilvl w:val="0"/>
+          <w:numId w:val="2"/>
+        </w:numPr>
+        <w:spacing w:after="80" w:line="268"/>
+      </w:pPr>
+      <w:r>
+        <w:rPr>
+          <w:rFonts w:ascii="Arial" w:cs="Arial" w:eastAsia="Arial" w:hAnsi="Arial"/>
+          <w:b/>
+          <w:bCs/>
+        </w:rPr>
+        <w:t xml:space="preserve">Lint del contrato en el CI: </w:t>
+      </w:r>
+      <w:r>
+        <w:rPr>
+          <w:rFonts w:ascii="Consolas" w:cs="Consolas" w:eastAsia="Consolas" w:hAnsi="Consolas"/>
+          <w:color w:val="4F46E5"/>
+        </w:rPr>
+        <w:t xml:space="preserve">Spectral</w:t>
+      </w:r>
+      <w:r>
+        <w:rPr>
+          <w:rFonts w:ascii="Arial" w:cs="Arial" w:eastAsia="Arial" w:hAnsi="Arial"/>
+        </w:rPr>
+        <w:t xml:space="preserve"> (ruleset </w:t>
+      </w:r>
+      <w:r>
+        <w:rPr>
+          <w:rFonts w:ascii="Consolas" w:cs="Consolas" w:eastAsia="Consolas" w:hAnsi="Consolas"/>
+          <w:color w:val="4F46E5"/>
+        </w:rPr>
+        <w:t xml:space="preserve">.spectral.yaml</w:t>
+      </w:r>
+      <w:r>
+        <w:rPr>
+          <w:rFonts w:ascii="Arial" w:cs="Arial" w:eastAsia="Arial" w:hAnsi="Arial"/>
+        </w:rPr>
+        <w:t xml:space="preserve">, extiende </w:t>
+      </w:r>
+      <w:r>
+        <w:rPr>
+          <w:rFonts w:ascii="Consolas" w:cs="Consolas" w:eastAsia="Consolas" w:hAnsi="Consolas"/>
+          <w:color w:val="4F46E5"/>
+        </w:rPr>
+        <w:t xml:space="preserve">spectral:oas</w:t>
+      </w:r>
+      <w:r>
+        <w:rPr>
+          <w:rFonts w:ascii="Arial" w:cs="Arial" w:eastAsia="Arial" w:hAnsi="Arial"/>
+        </w:rPr>
+        <w:t xml:space="preserve">) comprueba en cada cambio que toda operación tiene </w:t>
+      </w:r>
+      <w:r>
+        <w:rPr>
+          <w:rFonts w:ascii="Consolas" w:cs="Consolas" w:eastAsia="Consolas" w:hAnsi="Consolas"/>
+          <w:color w:val="4F46E5"/>
+        </w:rPr>
+        <w:t xml:space="preserve">operationId</w:t>
+      </w:r>
+      <w:r>
+        <w:rPr>
+          <w:rFonts w:ascii="Arial" w:cs="Arial" w:eastAsia="Arial" w:hAnsi="Arial"/>
+        </w:rPr>
+        <w:t xml:space="preserve"> y tag, que hay contacto/descripción y servidores declarados. El workflow </w:t>
+      </w:r>
+      <w:r>
+        <w:rPr>
+          <w:rFonts w:ascii="Consolas" w:cs="Consolas" w:eastAsia="Consolas" w:hAnsi="Consolas"/>
+          <w:color w:val="4F46E5"/>
+        </w:rPr>
+        <w:t xml:space="preserve">openapi.yml</w:t>
+      </w:r>
+      <w:r>
+        <w:rPr>
+          <w:rFonts w:ascii="Arial" w:cs="Arial" w:eastAsia="Arial" w:hAnsi="Arial"/>
+        </w:rPr>
+        <w:t xml:space="preserve"> falla si el contrato rompe una regla — un </w:t>
+      </w:r>
+      <w:r>
+        <w:rPr>
+          <w:rFonts w:ascii="Arial" w:cs="Arial" w:eastAsia="Arial" w:hAnsi="Arial"/>
+          <w:b/>
+          <w:bCs/>
+        </w:rPr>
+        <w:t xml:space="preserve">contract gate</w:t>
+      </w:r>
+      <w:r>
+        <w:rPr>
+          <w:rFonts w:ascii="Arial" w:cs="Arial" w:eastAsia="Arial" w:hAnsi="Arial"/>
+        </w:rPr>
+        <w:t xml:space="preserve">.</w:t>
+      </w:r>
+    </w:p>
+    <w:p>
+      <w:pPr>
+        <w:spacing w:after="120" w:line="276"/>
+      </w:pPr>
+      <w:r>
+        <w:rPr>
+          <w:rFonts w:ascii="Arial" w:cs="Arial" w:eastAsia="Arial" w:hAnsi="Arial"/>
+          <w:b/>
+          <w:bCs/>
+        </w:rPr>
+        <w:t xml:space="preserve">Verificación: </w:t>
+      </w:r>
+      <w:r>
+        <w:rPr>
+          <w:rFonts w:ascii="Arial" w:cs="Arial" w:eastAsia="Arial" w:hAnsi="Arial"/>
+        </w:rPr>
+        <w:t xml:space="preserve">el spec se validó como OpenAPI 3.0 correcto (8 rutas, 15 esquemas) y Spectral corre en el pipeline sobre </w:t>
+      </w:r>
+      <w:r>
+        <w:rPr>
+          <w:rFonts w:ascii="Consolas" w:cs="Consolas" w:eastAsia="Consolas" w:hAnsi="Consolas"/>
+          <w:color w:val="4F46E5"/>
+        </w:rPr>
+        <w:t xml:space="preserve">api/openapi/*.yaml</w:t>
+      </w:r>
+      <w:r>
+        <w:rPr>
+          <w:rFonts w:ascii="Arial" w:cs="Arial" w:eastAsia="Arial" w:hAnsi="Arial"/>
+        </w:rPr>
+        <w:t xml:space="preserve">.</w:t>
+      </w:r>
+    </w:p>
+    <w:p>
+      <w:pPr>
+        <w:pStyle w:val="Heading2"/>
+      </w:pPr>
+      <w:r>
+        <w:rPr>
+          <w:rFonts w:ascii="Arial" w:cs="Arial" w:eastAsia="Arial" w:hAnsi="Arial"/>
+        </w:rPr>
+        <w:t xml:space="preserve">13.48 gRPC de punta a punta (order → inventory)</w:t>
+      </w:r>
+    </w:p>
+    <w:p>
+      <w:pPr>
+        <w:spacing w:after="120" w:line="276"/>
+      </w:pPr>
+      <w:r>
+        <w:rPr>
+          <w:rFonts w:ascii="Arial" w:cs="Arial" w:eastAsia="Arial" w:hAnsi="Arial"/>
+          <w:b/>
+          <w:bCs/>
+        </w:rPr>
+        <w:t xml:space="preserve">Qué es: </w:t>
+      </w:r>
+      <w:r>
+        <w:rPr>
+          <w:rFonts w:ascii="Arial" w:cs="Arial" w:eastAsia="Arial" w:hAnsi="Arial"/>
+        </w:rPr>
+        <w:t xml:space="preserve">completar el RPC interno: el </w:t>
+      </w:r>
+      <w:r>
+        <w:rPr>
+          <w:rFonts w:ascii="Consolas" w:cs="Consolas" w:eastAsia="Consolas" w:hAnsi="Consolas"/>
+          <w:color w:val="4F46E5"/>
+        </w:rPr>
+        <w:t xml:space="preserve">order-service</w:t>
+      </w:r>
+      <w:r>
+        <w:rPr>
+          <w:rFonts w:ascii="Arial" w:cs="Arial" w:eastAsia="Arial" w:hAnsi="Arial"/>
+        </w:rPr>
+        <w:t xml:space="preserve"> ahora puede consultar la disponibilidad de stock al </w:t>
+      </w:r>
+      <w:r>
+        <w:rPr>
+          <w:rFonts w:ascii="Consolas" w:cs="Consolas" w:eastAsia="Consolas" w:hAnsi="Consolas"/>
+          <w:color w:val="4F46E5"/>
+        </w:rPr>
+        <w:t xml:space="preserve">inventory-service</w:t>
+      </w:r>
+      <w:r>
+        <w:rPr>
+          <w:rFonts w:ascii="Arial" w:cs="Arial" w:eastAsia="Arial" w:hAnsi="Arial"/>
+        </w:rPr>
+        <w:t xml:space="preserve"> por </w:t>
+      </w:r>
+      <w:r>
+        <w:rPr>
+          <w:rFonts w:ascii="Arial" w:cs="Arial" w:eastAsia="Arial" w:hAnsi="Arial"/>
+          <w:b/>
+          <w:bCs/>
+        </w:rPr>
+        <w:t xml:space="preserve">gRPC</w:t>
+      </w:r>
+      <w:r>
+        <w:rPr>
+          <w:rFonts w:ascii="Arial" w:cs="Arial" w:eastAsia="Arial" w:hAnsi="Arial"/>
+        </w:rPr>
+        <w:t xml:space="preserve"> (HTTP/2 binario), en lugar de REST/JSON, reutilizando el mismo contrato Protobuf.</w:t>
+      </w:r>
+    </w:p>
+    <w:p>
+      <w:pPr>
+        <w:pStyle w:val="ListParagraph"/>
+        <w:numPr>
+          <w:ilvl w:val="0"/>
+          <w:numId w:val="2"/>
+        </w:numPr>
+        <w:spacing w:after="80" w:line="268"/>
+      </w:pPr>
+      <w:r>
+        <w:rPr>
+          <w:rFonts w:ascii="Arial" w:cs="Arial" w:eastAsia="Arial" w:hAnsi="Arial"/>
+          <w:b/>
+          <w:bCs/>
+        </w:rPr>
+        <w:t xml:space="preserve">Contrato compartido: </w:t>
+      </w:r>
+      <w:r>
+        <w:rPr>
+          <w:rFonts w:ascii="Arial" w:cs="Arial" w:eastAsia="Arial" w:hAnsi="Arial"/>
+        </w:rPr>
+        <w:t xml:space="preserve">el mismo </w:t>
+      </w:r>
+      <w:r>
+        <w:rPr>
+          <w:rFonts w:ascii="Consolas" w:cs="Consolas" w:eastAsia="Consolas" w:hAnsi="Consolas"/>
+          <w:color w:val="4F46E5"/>
+        </w:rPr>
+        <w:t xml:space="preserve">stock.proto</w:t>
+      </w:r>
+      <w:r>
+        <w:rPr>
+          <w:rFonts w:ascii="Arial" w:cs="Arial" w:eastAsia="Arial" w:hAnsi="Arial"/>
+        </w:rPr>
+        <w:t xml:space="preserve"> vive en ambos servicios; </w:t>
+      </w:r>
+      <w:r>
+        <w:rPr>
+          <w:rFonts w:ascii="Consolas" w:cs="Consolas" w:eastAsia="Consolas" w:hAnsi="Consolas"/>
+          <w:color w:val="4F46E5"/>
+        </w:rPr>
+        <w:t xml:space="preserve">protobuf-maven-plugin</w:t>
+      </w:r>
+      <w:r>
+        <w:rPr>
+          <w:rFonts w:ascii="Arial" w:cs="Arial" w:eastAsia="Arial" w:hAnsi="Arial"/>
+        </w:rPr>
+        <w:t xml:space="preserve"> genera en order los stubs del </w:t>
+      </w:r>
+      <w:r>
+        <w:rPr>
+          <w:rFonts w:ascii="Arial" w:cs="Arial" w:eastAsia="Arial" w:hAnsi="Arial"/>
+          <w:b/>
+          <w:bCs/>
+        </w:rPr>
+        <w:t xml:space="preserve">cliente</w:t>
+      </w:r>
+      <w:r>
+        <w:rPr>
+          <w:rFonts w:ascii="Arial" w:cs="Arial" w:eastAsia="Arial" w:hAnsi="Arial"/>
+        </w:rPr>
+        <w:t xml:space="preserve"> (</w:t>
+      </w:r>
+      <w:r>
+        <w:rPr>
+          <w:rFonts w:ascii="Consolas" w:cs="Consolas" w:eastAsia="Consolas" w:hAnsi="Consolas"/>
+          <w:color w:val="4F46E5"/>
+        </w:rPr>
+        <w:t xml:space="preserve">StockServiceGrpc</w:t>
+      </w:r>
+      <w:r>
+        <w:rPr>
+          <w:rFonts w:ascii="Arial" w:cs="Arial" w:eastAsia="Arial" w:hAnsi="Arial"/>
+        </w:rPr>
+        <w:t xml:space="preserve">) en el build. </w:t>
+      </w:r>
+      <w:r>
+        <w:rPr>
+          <w:rFonts w:ascii="Consolas" w:cs="Consolas" w:eastAsia="Consolas" w:hAnsi="Consolas"/>
+          <w:color w:val="4F46E5"/>
+        </w:rPr>
+        <w:t xml:space="preserve">StockGrpcClient</w:t>
+      </w:r>
+      <w:r>
+        <w:rPr>
+          <w:rFonts w:ascii="Arial" w:cs="Arial" w:eastAsia="Arial" w:hAnsi="Arial"/>
+        </w:rPr>
+        <w:t xml:space="preserve"> (adaptador de salida) abre el canal hacia </w:t>
+      </w:r>
+      <w:r>
+        <w:rPr>
+          <w:rFonts w:ascii="Consolas" w:cs="Consolas" w:eastAsia="Consolas" w:hAnsi="Consolas"/>
+          <w:color w:val="4F46E5"/>
+        </w:rPr>
+        <w:t xml:space="preserve">inventory-service:9090</w:t>
+      </w:r>
+      <w:r>
+        <w:rPr>
+          <w:rFonts w:ascii="Arial" w:cs="Arial" w:eastAsia="Arial" w:hAnsi="Arial"/>
+        </w:rPr>
+        <w:t xml:space="preserve">, con </w:t>
+      </w:r>
+      <w:r>
+        <w:rPr>
+          <w:rFonts w:ascii="Arial" w:cs="Arial" w:eastAsia="Arial" w:hAnsi="Arial"/>
+          <w:b/>
+          <w:bCs/>
+        </w:rPr>
+        <w:t xml:space="preserve">deadline</w:t>
+      </w:r>
+      <w:r>
+        <w:rPr>
+          <w:rFonts w:ascii="Arial" w:cs="Arial" w:eastAsia="Arial" w:hAnsi="Arial"/>
+        </w:rPr>
+        <w:t xml:space="preserve"> de 2s, y mapea la respuesta a un objeto de dominio.</w:t>
+      </w:r>
+    </w:p>
+    <w:p>
+      <w:pPr>
+        <w:pStyle w:val="ListParagraph"/>
+        <w:numPr>
+          <w:ilvl w:val="0"/>
+          <w:numId w:val="2"/>
+        </w:numPr>
+        <w:spacing w:after="80" w:line="268"/>
+      </w:pPr>
+      <w:r>
+        <w:rPr>
+          <w:rFonts w:ascii="Arial" w:cs="Arial" w:eastAsia="Arial" w:hAnsi="Arial"/>
+          <w:b/>
+          <w:bCs/>
+        </w:rPr>
+        <w:t xml:space="preserve">Servidor operable: </w:t>
+      </w:r>
+      <w:r>
+        <w:rPr>
+          <w:rFonts w:ascii="Arial" w:cs="Arial" w:eastAsia="Arial" w:hAnsi="Arial"/>
+        </w:rPr>
+        <w:t xml:space="preserve">en inventory se habilitaron el </w:t>
+      </w:r>
+      <w:r>
+        <w:rPr>
+          <w:rFonts w:ascii="Arial" w:cs="Arial" w:eastAsia="Arial" w:hAnsi="Arial"/>
+          <w:b/>
+          <w:bCs/>
+        </w:rPr>
+        <w:t xml:space="preserve">health check gRPC</w:t>
+      </w:r>
+      <w:r>
+        <w:rPr>
+          <w:rFonts w:ascii="Arial" w:cs="Arial" w:eastAsia="Arial" w:hAnsi="Arial"/>
+        </w:rPr>
+        <w:t xml:space="preserve"> estándar y el </w:t>
+      </w:r>
+      <w:r>
+        <w:rPr>
+          <w:rFonts w:ascii="Arial" w:cs="Arial" w:eastAsia="Arial" w:hAnsi="Arial"/>
+          <w:b/>
+          <w:bCs/>
+        </w:rPr>
+        <w:t xml:space="preserve">Server Reflection</w:t>
+      </w:r>
+      <w:r>
+        <w:rPr>
+          <w:rFonts w:ascii="Arial" w:cs="Arial" w:eastAsia="Arial" w:hAnsi="Arial"/>
+        </w:rPr>
+        <w:t xml:space="preserve"> (permite a </w:t>
+      </w:r>
+      <w:r>
+        <w:rPr>
+          <w:rFonts w:ascii="Consolas" w:cs="Consolas" w:eastAsia="Consolas" w:hAnsi="Consolas"/>
+          <w:color w:val="4F46E5"/>
+        </w:rPr>
+        <w:t xml:space="preserve">grpcurl</w:t>
+      </w:r>
+      <w:r>
+        <w:rPr>
+          <w:rFonts w:ascii="Arial" w:cs="Arial" w:eastAsia="Arial" w:hAnsi="Arial"/>
+        </w:rPr>
+        <w:t xml:space="preserve"> y clientes descubrir el servicio sin el .proto), útiles para operación y depuración.</w:t>
+      </w:r>
+    </w:p>
+    <w:p>
+      <w:pPr>
+        <w:spacing w:after="120" w:line="276"/>
+      </w:pPr>
+      <w:r>
+        <w:rPr>
+          <w:rFonts w:ascii="Arial" w:cs="Arial" w:eastAsia="Arial" w:hAnsi="Arial"/>
+          <w:b/>
+          <w:bCs/>
+        </w:rPr>
+        <w:t xml:space="preserve">Verificación: </w:t>
+      </w:r>
+      <w:r>
+        <w:rPr>
+          <w:rFonts w:ascii="Consolas" w:cs="Consolas" w:eastAsia="Consolas" w:hAnsi="Consolas"/>
+          <w:color w:val="4F46E5"/>
+        </w:rPr>
+        <w:t xml:space="preserve">StockGrpcClientTest</w:t>
+      </w:r>
+      <w:r>
+        <w:rPr>
+          <w:rFonts w:ascii="Arial" w:cs="Arial" w:eastAsia="Arial" w:hAnsi="Arial"/>
+        </w:rPr>
+        <w:t xml:space="preserve"> levanta un StockService falso en un </w:t>
+      </w:r>
+      <w:r>
+        <w:rPr>
+          <w:rFonts w:ascii="Arial" w:cs="Arial" w:eastAsia="Arial" w:hAnsi="Arial"/>
+          <w:b/>
+          <w:bCs/>
+        </w:rPr>
+        <w:t xml:space="preserve">canal in-process</w:t>
+      </w:r>
+      <w:r>
+        <w:rPr>
+          <w:rFonts w:ascii="Arial" w:cs="Arial" w:eastAsia="Arial" w:hAnsi="Arial"/>
+        </w:rPr>
+        <w:t xml:space="preserve"> y comprueba que el cliente serializa la petición y mapea la respuesta — sin red ni puertos.</w:t>
+      </w:r>
+    </w:p>
+    <w:p>
+      <w:pPr>
+        <w:pStyle w:val="Heading2"/>
+      </w:pPr>
+      <w:r>
+        <w:rPr>
+          <w:rFonts w:ascii="Arial" w:cs="Arial" w:eastAsia="Arial" w:hAnsi="Arial"/>
+        </w:rPr>
+        <w:t xml:space="preserve">13.49 Vault dynamic secrets (credenciales de BD efímeras)</w:t>
+      </w:r>
+    </w:p>
+    <w:p>
+      <w:pPr>
+        <w:spacing w:after="120" w:line="276"/>
+      </w:pPr>
+      <w:r>
+        <w:rPr>
+          <w:rFonts w:ascii="Arial" w:cs="Arial" w:eastAsia="Arial" w:hAnsi="Arial"/>
+          <w:b/>
+          <w:bCs/>
+        </w:rPr>
+        <w:t xml:space="preserve">Qué es: </w:t>
+      </w:r>
+      <w:r>
+        <w:rPr>
+          <w:rFonts w:ascii="Arial" w:cs="Arial" w:eastAsia="Arial" w:hAnsi="Arial"/>
+        </w:rPr>
+        <w:t xml:space="preserve">el grado más alto de gestión de secretos: en vez de una contraseña de base de datos </w:t>
+      </w:r>
+      <w:r>
+        <w:rPr>
+          <w:rFonts w:ascii="Arial" w:cs="Arial" w:eastAsia="Arial" w:hAnsi="Arial"/>
+          <w:b/>
+          <w:bCs/>
+        </w:rPr>
+        <w:t xml:space="preserve">fija</w:t>
+      </w:r>
+      <w:r>
+        <w:rPr>
+          <w:rFonts w:ascii="Arial" w:cs="Arial" w:eastAsia="Arial" w:hAnsi="Arial"/>
+        </w:rPr>
+        <w:t xml:space="preserve"> (aunque esté en Vault), Vault </w:t>
+      </w:r>
+      <w:r>
+        <w:rPr>
+          <w:rFonts w:ascii="Arial" w:cs="Arial" w:eastAsia="Arial" w:hAnsi="Arial"/>
+          <w:b/>
+          <w:bCs/>
+        </w:rPr>
+        <w:t xml:space="preserve">genera credenciales de PostgreSQL temporales bajo demanda</w:t>
+      </w:r>
+      <w:r>
+        <w:rPr>
+          <w:rFonts w:ascii="Arial" w:cs="Arial" w:eastAsia="Arial" w:hAnsi="Arial"/>
+        </w:rPr>
+        <w:t xml:space="preserve"> y las revoca al expirar su </w:t>
+      </w:r>
+      <w:r>
+        <w:rPr>
+          <w:rFonts w:ascii="Arial" w:cs="Arial" w:eastAsia="Arial" w:hAnsi="Arial"/>
+          <w:b/>
+          <w:bCs/>
+        </w:rPr>
+        <w:t xml:space="preserve">lease</w:t>
+      </w:r>
+      <w:r>
+        <w:rPr>
+          <w:rFonts w:ascii="Arial" w:cs="Arial" w:eastAsia="Arial" w:hAnsi="Arial"/>
+        </w:rPr>
+        <w:t xml:space="preserve">. Si se filtran, caducan solas en una hora.</w:t>
+      </w:r>
+    </w:p>
+    <w:p>
+      <w:pPr>
+        <w:pStyle w:val="ListParagraph"/>
+        <w:numPr>
+          <w:ilvl w:val="0"/>
+          <w:numId w:val="2"/>
+        </w:numPr>
+        <w:spacing w:after="80" w:line="268"/>
+      </w:pPr>
+      <w:r>
+        <w:rPr>
+          <w:rFonts w:ascii="Arial" w:cs="Arial" w:eastAsia="Arial" w:hAnsi="Arial"/>
+          <w:b/>
+          <w:bCs/>
+        </w:rPr>
+        <w:t xml:space="preserve">Motor database de Vault: </w:t>
+      </w:r>
+      <w:r>
+        <w:rPr>
+          <w:rFonts w:ascii="Arial" w:cs="Arial" w:eastAsia="Arial" w:hAnsi="Arial"/>
+        </w:rPr>
+        <w:t xml:space="preserve">el script </w:t>
+      </w:r>
+      <w:r>
+        <w:rPr>
+          <w:rFonts w:ascii="Consolas" w:cs="Consolas" w:eastAsia="Consolas" w:hAnsi="Consolas"/>
+          <w:color w:val="4F46E5"/>
+        </w:rPr>
+        <w:t xml:space="preserve">vault/dynamic-db.sh</w:t>
+      </w:r>
+      <w:r>
+        <w:rPr>
+          <w:rFonts w:ascii="Arial" w:cs="Arial" w:eastAsia="Arial" w:hAnsi="Arial"/>
+        </w:rPr>
+        <w:t xml:space="preserve"> habilita el motor </w:t>
+      </w:r>
+      <w:r>
+        <w:rPr>
+          <w:rFonts w:ascii="Consolas" w:cs="Consolas" w:eastAsia="Consolas" w:hAnsi="Consolas"/>
+          <w:color w:val="4F46E5"/>
+        </w:rPr>
+        <w:t xml:space="preserve">database</w:t>
+      </w:r>
+      <w:r>
+        <w:rPr>
+          <w:rFonts w:ascii="Arial" w:cs="Arial" w:eastAsia="Arial" w:hAnsi="Arial"/>
+        </w:rPr>
+        <w:t xml:space="preserve">, configura la conexión a </w:t>
+      </w:r>
+      <w:r>
+        <w:rPr>
+          <w:rFonts w:ascii="Consolas" w:cs="Consolas" w:eastAsia="Consolas" w:hAnsi="Consolas"/>
+          <w:color w:val="4F46E5"/>
+        </w:rPr>
+        <w:t xml:space="preserve">auth-postgres</w:t>
+      </w:r>
+      <w:r>
+        <w:rPr>
+          <w:rFonts w:ascii="Arial" w:cs="Arial" w:eastAsia="Arial" w:hAnsi="Arial"/>
+        </w:rPr>
+        <w:t xml:space="preserve"> y define el rol </w:t>
+      </w:r>
+      <w:r>
+        <w:rPr>
+          <w:rFonts w:ascii="Consolas" w:cs="Consolas" w:eastAsia="Consolas" w:hAnsi="Consolas"/>
+          <w:color w:val="4F46E5"/>
+        </w:rPr>
+        <w:t xml:space="preserve">auth-role</w:t>
+      </w:r>
+      <w:r>
+        <w:rPr>
+          <w:rFonts w:ascii="Arial" w:cs="Arial" w:eastAsia="Arial" w:hAnsi="Arial"/>
+        </w:rPr>
+        <w:t xml:space="preserve"> con </w:t>
+      </w:r>
+      <w:r>
+        <w:rPr>
+          <w:rFonts w:ascii="Consolas" w:cs="Consolas" w:eastAsia="Consolas" w:hAnsi="Consolas"/>
+          <w:color w:val="4F46E5"/>
+        </w:rPr>
+        <w:t xml:space="preserve">creation_statements</w:t>
+      </w:r>
+      <w:r>
+        <w:rPr>
+          <w:rFonts w:ascii="Arial" w:cs="Arial" w:eastAsia="Arial" w:hAnsi="Arial"/>
+        </w:rPr>
+        <w:t xml:space="preserve"> (crea un usuario con contraseña aleatoria y </w:t>
+      </w:r>
+      <w:r>
+        <w:rPr>
+          <w:rFonts w:ascii="Consolas" w:cs="Consolas" w:eastAsia="Consolas" w:hAnsi="Consolas"/>
+          <w:color w:val="4F46E5"/>
+        </w:rPr>
+        <w:t xml:space="preserve">VALID UNTIL</w:t>
+      </w:r>
+      <w:r>
+        <w:rPr>
+          <w:rFonts w:ascii="Arial" w:cs="Arial" w:eastAsia="Arial" w:hAnsi="Arial"/>
+        </w:rPr>
+        <w:t xml:space="preserve">) y </w:t>
+      </w:r>
+      <w:r>
+        <w:rPr>
+          <w:rFonts w:ascii="Consolas" w:cs="Consolas" w:eastAsia="Consolas" w:hAnsi="Consolas"/>
+          <w:color w:val="4F46E5"/>
+        </w:rPr>
+        <w:t xml:space="preserve">default_ttl=1h</w:t>
+      </w:r>
+      <w:r>
+        <w:rPr>
+          <w:rFonts w:ascii="Arial" w:cs="Arial" w:eastAsia="Arial" w:hAnsi="Arial"/>
+        </w:rPr>
+        <w:t xml:space="preserve">. Lo aplica el contenedor </w:t>
+      </w:r>
+      <w:r>
+        <w:rPr>
+          <w:rFonts w:ascii="Consolas" w:cs="Consolas" w:eastAsia="Consolas" w:hAnsi="Consolas"/>
+          <w:color w:val="4F46E5"/>
+        </w:rPr>
+        <w:t xml:space="preserve">vault-db-init</w:t>
+      </w:r>
+      <w:r>
+        <w:rPr>
+          <w:rFonts w:ascii="Arial" w:cs="Arial" w:eastAsia="Arial" w:hAnsi="Arial"/>
+        </w:rPr>
+        <w:t xml:space="preserve"> cuando Vault y Postgres están sanos.</w:t>
+      </w:r>
+    </w:p>
+    <w:p>
+      <w:pPr>
+        <w:pStyle w:val="ListParagraph"/>
+        <w:numPr>
+          <w:ilvl w:val="0"/>
+          <w:numId w:val="2"/>
+        </w:numPr>
+        <w:spacing w:after="80" w:line="268"/>
+      </w:pPr>
+      <w:r>
+        <w:rPr>
+          <w:rFonts w:ascii="Arial" w:cs="Arial" w:eastAsia="Arial" w:hAnsi="Arial"/>
+          <w:b/>
+          <w:bCs/>
+        </w:rPr>
+        <w:t xml:space="preserve">Integración con Spring: </w:t>
+      </w:r>
+      <w:r>
+        <w:rPr>
+          <w:rFonts w:ascii="Arial" w:cs="Arial" w:eastAsia="Arial" w:hAnsi="Arial"/>
+        </w:rPr>
+        <w:t xml:space="preserve">el perfil </w:t>
+      </w:r>
+      <w:r>
+        <w:rPr>
+          <w:rFonts w:ascii="Consolas" w:cs="Consolas" w:eastAsia="Consolas" w:hAnsi="Consolas"/>
+          <w:color w:val="4F46E5"/>
+        </w:rPr>
+        <w:t xml:space="preserve">vault-dynamic</w:t>
+      </w:r>
+      <w:r>
+        <w:rPr>
+          <w:rFonts w:ascii="Arial" w:cs="Arial" w:eastAsia="Arial" w:hAnsi="Arial"/>
+        </w:rPr>
+        <w:t xml:space="preserve"> (</w:t>
+      </w:r>
+      <w:r>
+        <w:rPr>
+          <w:rFonts w:ascii="Consolas" w:cs="Consolas" w:eastAsia="Consolas" w:hAnsi="Consolas"/>
+          <w:color w:val="4F46E5"/>
+        </w:rPr>
+        <w:t xml:space="preserve">application-vault-dynamic.yml</w:t>
+      </w:r>
+      <w:r>
+        <w:rPr>
+          <w:rFonts w:ascii="Arial" w:cs="Arial" w:eastAsia="Arial" w:hAnsi="Arial"/>
+        </w:rPr>
+        <w:t xml:space="preserve">) usa el backend </w:t>
+      </w:r>
+      <w:r>
+        <w:rPr>
+          <w:rFonts w:ascii="Consolas" w:cs="Consolas" w:eastAsia="Consolas" w:hAnsi="Consolas"/>
+          <w:color w:val="4F46E5"/>
+        </w:rPr>
+        <w:t xml:space="preserve">spring.cloud.vault.database</w:t>
+      </w:r>
+      <w:r>
+        <w:rPr>
+          <w:rFonts w:ascii="Arial" w:cs="Arial" w:eastAsia="Arial" w:hAnsi="Arial"/>
+        </w:rPr>
+        <w:t xml:space="preserve">: al arrancar, Spring pide a Vault usuario y contraseña, y Spring Cloud Vault </w:t>
+      </w:r>
+      <w:r>
+        <w:rPr>
+          <w:rFonts w:ascii="Arial" w:cs="Arial" w:eastAsia="Arial" w:hAnsi="Arial"/>
+          <w:b/>
+          <w:bCs/>
+        </w:rPr>
+        <w:t xml:space="preserve">renueva el lease</w:t>
+      </w:r>
+      <w:r>
+        <w:rPr>
+          <w:rFonts w:ascii="Arial" w:cs="Arial" w:eastAsia="Arial" w:hAnsi="Arial"/>
+        </w:rPr>
+        <w:t xml:space="preserve"> en segundo plano. No hay contraseñas de BD en configuración ni en variables de entorno.</w:t>
+      </w:r>
+    </w:p>
+    <w:p>
+      <w:pPr>
+        <w:spacing w:after="120" w:line="276"/>
+      </w:pPr>
+      <w:r>
+        <w:rPr>
+          <w:rFonts w:ascii="Arial" w:cs="Arial" w:eastAsia="Arial" w:hAnsi="Arial"/>
+          <w:b/>
+          <w:bCs/>
+        </w:rPr>
+        <w:t xml:space="preserve">Verificación: </w:t>
+      </w:r>
+      <w:r>
+        <w:rPr>
+          <w:rFonts w:ascii="Arial" w:cs="Arial" w:eastAsia="Arial" w:hAnsi="Arial"/>
+        </w:rPr>
+        <w:t xml:space="preserve">con el stack arriba, </w:t>
+      </w:r>
+      <w:r>
+        <w:rPr>
+          <w:rFonts w:ascii="Consolas" w:cs="Consolas" w:eastAsia="Consolas" w:hAnsi="Consolas"/>
+          <w:color w:val="4F46E5"/>
+        </w:rPr>
+        <w:t xml:space="preserve">vault read database/creds/auth-role</w:t>
+      </w:r>
+      <w:r>
+        <w:rPr>
+          <w:rFonts w:ascii="Arial" w:cs="Arial" w:eastAsia="Arial" w:hAnsi="Arial"/>
+        </w:rPr>
+        <w:t xml:space="preserve"> emite un par usuario/contraseña nuevo cada vez, con su TTL; el auth-service arranca con el perfil </w:t>
+      </w:r>
+      <w:r>
+        <w:rPr>
+          <w:rFonts w:ascii="Consolas" w:cs="Consolas" w:eastAsia="Consolas" w:hAnsi="Consolas"/>
+          <w:color w:val="4F46E5"/>
+        </w:rPr>
+        <w:t xml:space="preserve">vault-dynamic</w:t>
+      </w:r>
+      <w:r>
+        <w:rPr>
+          <w:rFonts w:ascii="Arial" w:cs="Arial" w:eastAsia="Arial" w:hAnsi="Arial"/>
+        </w:rPr>
+        <w:t xml:space="preserve"> tomando esas credenciales.</w:t>
+      </w:r>
+    </w:p>
+    <w:p>
+      <w:pPr>
+        <w:pStyle w:val="Heading2"/>
+      </w:pPr>
+      <w:r>
+        <w:rPr>
+          <w:rFonts w:ascii="Arial" w:cs="Arial" w:eastAsia="Arial" w:hAnsi="Arial"/>
+        </w:rPr>
+        <w:t xml:space="preserve">13.50 Event Sourcing + CQRS (agregado Pedido)</w:t>
+      </w:r>
+    </w:p>
+    <w:p>
+      <w:pPr>
+        <w:spacing w:after="120" w:line="276"/>
+      </w:pPr>
+      <w:r>
+        <w:rPr>
+          <w:rFonts w:ascii="Arial" w:cs="Arial" w:eastAsia="Arial" w:hAnsi="Arial"/>
+          <w:b/>
+          <w:bCs/>
+        </w:rPr>
+        <w:t xml:space="preserve">Qué es: </w:t>
+      </w:r>
+      <w:r>
+        <w:rPr>
+          <w:rFonts w:ascii="Arial" w:cs="Arial" w:eastAsia="Arial" w:hAnsi="Arial"/>
+        </w:rPr>
+        <w:t xml:space="preserve">dos patrones avanzados de DDD. En </w:t>
+      </w:r>
+      <w:r>
+        <w:rPr>
+          <w:rFonts w:ascii="Arial" w:cs="Arial" w:eastAsia="Arial" w:hAnsi="Arial"/>
+          <w:b/>
+          <w:bCs/>
+        </w:rPr>
+        <w:t xml:space="preserve">Event Sourcing</w:t>
+      </w:r>
+      <w:r>
+        <w:rPr>
+          <w:rFonts w:ascii="Arial" w:cs="Arial" w:eastAsia="Arial" w:hAnsi="Arial"/>
+        </w:rPr>
+        <w:t xml:space="preserve"> el estado del pedido no se guarda como una fila mutable, sino como la </w:t>
+      </w:r>
+      <w:r>
+        <w:rPr>
+          <w:rFonts w:ascii="Arial" w:cs="Arial" w:eastAsia="Arial" w:hAnsi="Arial"/>
+          <w:b/>
+          <w:bCs/>
+        </w:rPr>
+        <w:t xml:space="preserve">secuencia inmutable de eventos</w:t>
+      </w:r>
+      <w:r>
+        <w:rPr>
+          <w:rFonts w:ascii="Arial" w:cs="Arial" w:eastAsia="Arial" w:hAnsi="Arial"/>
+        </w:rPr>
+        <w:t xml:space="preserve"> que le ocurrieron; el estado actual se obtiene reproduciéndolos. En </w:t>
+      </w:r>
+      <w:r>
+        <w:rPr>
+          <w:rFonts w:ascii="Arial" w:cs="Arial" w:eastAsia="Arial" w:hAnsi="Arial"/>
+          <w:b/>
+          <w:bCs/>
+        </w:rPr>
+        <w:t xml:space="preserve">CQRS</w:t>
+      </w:r>
+      <w:r>
+        <w:rPr>
+          <w:rFonts w:ascii="Arial" w:cs="Arial" w:eastAsia="Arial" w:hAnsi="Arial"/>
+        </w:rPr>
+        <w:t xml:space="preserve"> se separa el modelo de escritura (validar invariantes) del de lectura (consultar rápido).</w:t>
+      </w:r>
+    </w:p>
+    <w:p>
+      <w:pPr>
+        <w:pStyle w:val="ListParagraph"/>
+        <w:numPr>
+          <w:ilvl w:val="0"/>
+          <w:numId w:val="2"/>
+        </w:numPr>
+        <w:spacing w:after="80" w:line="268"/>
+      </w:pPr>
+      <w:r>
+        <w:rPr>
+          <w:rFonts w:ascii="Arial" w:cs="Arial" w:eastAsia="Arial" w:hAnsi="Arial"/>
+          <w:b/>
+          <w:bCs/>
+        </w:rPr>
+        <w:t xml:space="preserve">Modelo de escritura: </w:t>
+      </w:r>
+      <w:r>
+        <w:rPr>
+          <w:rFonts w:ascii="Consolas" w:cs="Consolas" w:eastAsia="Consolas" w:hAnsi="Consolas"/>
+          <w:color w:val="4F46E5"/>
+        </w:rPr>
+        <w:t xml:space="preserve">EventSourcedOrder</w:t>
+      </w:r>
+      <w:r>
+        <w:rPr>
+          <w:rFonts w:ascii="Arial" w:cs="Arial" w:eastAsia="Arial" w:hAnsi="Arial"/>
+        </w:rPr>
+        <w:t xml:space="preserve"> — los comandos (</w:t>
+      </w:r>
+      <w:r>
+        <w:rPr>
+          <w:rFonts w:ascii="Consolas" w:cs="Consolas" w:eastAsia="Consolas" w:hAnsi="Consolas"/>
+          <w:color w:val="4F46E5"/>
+        </w:rPr>
+        <w:t xml:space="preserve">place</w:t>
+      </w:r>
+      <w:r>
+        <w:rPr>
+          <w:rFonts w:ascii="Arial" w:cs="Arial" w:eastAsia="Arial" w:hAnsi="Arial"/>
+        </w:rPr>
+        <w:t xml:space="preserve">, </w:t>
+      </w:r>
+      <w:r>
+        <w:rPr>
+          <w:rFonts w:ascii="Consolas" w:cs="Consolas" w:eastAsia="Consolas" w:hAnsi="Consolas"/>
+          <w:color w:val="4F46E5"/>
+        </w:rPr>
+        <w:t xml:space="preserve">addItem</w:t>
+      </w:r>
+      <w:r>
+        <w:rPr>
+          <w:rFonts w:ascii="Arial" w:cs="Arial" w:eastAsia="Arial" w:hAnsi="Arial"/>
+        </w:rPr>
+        <w:t xml:space="preserve">, </w:t>
+      </w:r>
+      <w:r>
+        <w:rPr>
+          <w:rFonts w:ascii="Consolas" w:cs="Consolas" w:eastAsia="Consolas" w:hAnsi="Consolas"/>
+          <w:color w:val="4F46E5"/>
+        </w:rPr>
+        <w:t xml:space="preserve">markPaid</w:t>
+      </w:r>
+      <w:r>
+        <w:rPr>
+          <w:rFonts w:ascii="Arial" w:cs="Arial" w:eastAsia="Arial" w:hAnsi="Arial"/>
+        </w:rPr>
+        <w:t xml:space="preserve">, </w:t>
+      </w:r>
+      <w:r>
+        <w:rPr>
+          <w:rFonts w:ascii="Consolas" w:cs="Consolas" w:eastAsia="Consolas" w:hAnsi="Consolas"/>
+          <w:color w:val="4F46E5"/>
+        </w:rPr>
+        <w:t xml:space="preserve">cancel</w:t>
+      </w:r>
+      <w:r>
+        <w:rPr>
+          <w:rFonts w:ascii="Arial" w:cs="Arial" w:eastAsia="Arial" w:hAnsi="Arial"/>
+        </w:rPr>
+        <w:t xml:space="preserve">) validan la invariante y EMITEN un evento; el estado solo cambia en </w:t>
+      </w:r>
+      <w:r>
+        <w:rPr>
+          <w:rFonts w:ascii="Consolas" w:cs="Consolas" w:eastAsia="Consolas" w:hAnsi="Consolas"/>
+          <w:color w:val="4F46E5"/>
+        </w:rPr>
+        <w:t xml:space="preserve">apply()</w:t>
+      </w:r>
+      <w:r>
+        <w:rPr>
+          <w:rFonts w:ascii="Arial" w:cs="Arial" w:eastAsia="Arial" w:hAnsi="Arial"/>
+        </w:rPr>
+        <w:t xml:space="preserve">, que es puro y se reutiliza al reconstruir. </w:t>
+      </w:r>
+      <w:r>
+        <w:rPr>
+          <w:rFonts w:ascii="Consolas" w:cs="Consolas" w:eastAsia="Consolas" w:hAnsi="Consolas"/>
+          <w:color w:val="4F46E5"/>
+        </w:rPr>
+        <w:t xml:space="preserve">rehydrate()</w:t>
+      </w:r>
+      <w:r>
+        <w:rPr>
+          <w:rFonts w:ascii="Arial" w:cs="Arial" w:eastAsia="Arial" w:hAnsi="Arial"/>
+        </w:rPr>
+        <w:t xml:space="preserve"> recompone el agregado reproduciendo su historial (</w:t>
+      </w:r>
+      <w:r>
+        <w:rPr>
+          <w:rFonts w:ascii="Arial" w:cs="Arial" w:eastAsia="Arial" w:hAnsi="Arial"/>
+          <w:b/>
+          <w:bCs/>
+        </w:rPr>
+        <w:t xml:space="preserve">replay</w:t>
+      </w:r>
+      <w:r>
+        <w:rPr>
+          <w:rFonts w:ascii="Arial" w:cs="Arial" w:eastAsia="Arial" w:hAnsi="Arial"/>
+        </w:rPr>
+        <w:t xml:space="preserve">).</w:t>
+      </w:r>
+    </w:p>
+    <w:p>
+      <w:pPr>
+        <w:pStyle w:val="ListParagraph"/>
+        <w:numPr>
+          <w:ilvl w:val="0"/>
+          <w:numId w:val="2"/>
+        </w:numPr>
+        <w:spacing w:after="80" w:line="268"/>
+      </w:pPr>
+      <w:r>
+        <w:rPr>
+          <w:rFonts w:ascii="Arial" w:cs="Arial" w:eastAsia="Arial" w:hAnsi="Arial"/>
+          <w:b/>
+          <w:bCs/>
+        </w:rPr>
+        <w:t xml:space="preserve">Almacén y lectura: </w:t>
+      </w:r>
+      <w:r>
+        <w:rPr>
+          <w:rFonts w:ascii="Consolas" w:cs="Consolas" w:eastAsia="Consolas" w:hAnsi="Consolas"/>
+          <w:color w:val="4F46E5"/>
+        </w:rPr>
+        <w:t xml:space="preserve">EventStore</w:t>
+      </w:r>
+      <w:r>
+        <w:rPr>
+          <w:rFonts w:ascii="Arial" w:cs="Arial" w:eastAsia="Arial" w:hAnsi="Arial"/>
+        </w:rPr>
+        <w:t xml:space="preserve"> es un puerto </w:t>
+      </w:r>
+      <w:r>
+        <w:rPr>
+          <w:rFonts w:ascii="Arial" w:cs="Arial" w:eastAsia="Arial" w:hAnsi="Arial"/>
+          <w:b/>
+          <w:bCs/>
+        </w:rPr>
+        <w:t xml:space="preserve">append-only</w:t>
+      </w:r>
+      <w:r>
+        <w:rPr>
+          <w:rFonts w:ascii="Arial" w:cs="Arial" w:eastAsia="Arial" w:hAnsi="Arial"/>
+        </w:rPr>
+        <w:t xml:space="preserve"> (los eventos nunca se modifican; en producción sería una tabla o EventStoreDB) con una implementación en memoria. </w:t>
+      </w:r>
+      <w:r>
+        <w:rPr>
+          <w:rFonts w:ascii="Consolas" w:cs="Consolas" w:eastAsia="Consolas" w:hAnsi="Consolas"/>
+          <w:color w:val="4F46E5"/>
+        </w:rPr>
+        <w:t xml:space="preserve">OrderSummaryProjection</w:t>
+      </w:r>
+      <w:r>
+        <w:rPr>
+          <w:rFonts w:ascii="Arial" w:cs="Arial" w:eastAsia="Arial" w:hAnsi="Arial"/>
+        </w:rPr>
+        <w:t xml:space="preserve"> es el modelo de lectura: escucha los eventos y mantiene una vista desnormalizada lista para consultar.</w:t>
+      </w:r>
+    </w:p>
+    <w:p>
+      <w:pPr>
+        <w:pStyle w:val="ListParagraph"/>
+        <w:numPr>
+          <w:ilvl w:val="0"/>
+          <w:numId w:val="2"/>
+        </w:numPr>
+        <w:spacing w:after="80" w:line="268"/>
+      </w:pPr>
+      <w:r>
+        <w:rPr>
+          <w:rFonts w:ascii="Arial" w:cs="Arial" w:eastAsia="Arial" w:hAnsi="Arial"/>
+          <w:b/>
+          <w:bCs/>
+        </w:rPr>
+        <w:t xml:space="preserve">Ventaja de banca: </w:t>
+      </w:r>
+      <w:r>
+        <w:rPr>
+          <w:rFonts w:ascii="Arial" w:cs="Arial" w:eastAsia="Arial" w:hAnsi="Arial"/>
+        </w:rPr>
+        <w:t xml:space="preserve">historial de auditoría perfecto e inmutable por diseño, y capacidad de reconstruir el estado a cualquier punto del tiempo. Se implementó </w:t>
+      </w:r>
+      <w:r>
+        <w:rPr>
+          <w:rFonts w:ascii="Arial" w:cs="Arial" w:eastAsia="Arial" w:hAnsi="Arial"/>
+          <w:b/>
+          <w:bCs/>
+        </w:rPr>
+        <w:t xml:space="preserve">aislado</w:t>
+      </w:r>
+      <w:r>
+        <w:rPr>
+          <w:rFonts w:ascii="Arial" w:cs="Arial" w:eastAsia="Arial" w:hAnsi="Arial"/>
+        </w:rPr>
+        <w:t xml:space="preserve"> del flujo actual del pedido, como modelo de referencia.</w:t>
+      </w:r>
+    </w:p>
+    <w:p>
+      <w:pPr>
+        <w:spacing w:after="120" w:line="276"/>
+      </w:pPr>
+      <w:r>
+        <w:rPr>
+          <w:rFonts w:ascii="Arial" w:cs="Arial" w:eastAsia="Arial" w:hAnsi="Arial"/>
+          <w:b/>
+          <w:bCs/>
+        </w:rPr>
+        <w:t xml:space="preserve">Verificación: </w:t>
+      </w:r>
+      <w:r>
+        <w:rPr>
+          <w:rFonts w:ascii="Consolas" w:cs="Consolas" w:eastAsia="Consolas" w:hAnsi="Consolas"/>
+          <w:color w:val="4F46E5"/>
+        </w:rPr>
+        <w:t xml:space="preserve">OrderEventSourcingTest</w:t>
+      </w:r>
+      <w:r>
+        <w:rPr>
+          <w:rFonts w:ascii="Arial" w:cs="Arial" w:eastAsia="Arial" w:hAnsi="Arial"/>
+        </w:rPr>
+        <w:t xml:space="preserve"> comprueba que los comandos derivan el estado esperado, que </w:t>
+      </w:r>
+      <w:r>
+        <w:rPr>
+          <w:rFonts w:ascii="Arial" w:cs="Arial" w:eastAsia="Arial" w:hAnsi="Arial"/>
+          <w:b/>
+          <w:bCs/>
+        </w:rPr>
+        <w:t xml:space="preserve">reproducir los eventos reconstruye el mismo estado</w:t>
+      </w:r>
+      <w:r>
+        <w:rPr>
+          <w:rFonts w:ascii="Arial" w:cs="Arial" w:eastAsia="Arial" w:hAnsi="Arial"/>
+        </w:rPr>
+        <w:t xml:space="preserve"> (replay), que la proyección refleja el resultado y que las invariantes se respetan (no pagar sin líneas, no añadir tras pagar).</w:t>
+      </w:r>
+    </w:p>
+    <w:p>
+      <w:pPr>
+        <w:pStyle w:val="Heading2"/>
+      </w:pPr>
+      <w:r>
+        <w:rPr>
+          <w:rFonts w:ascii="Arial" w:cs="Arial" w:eastAsia="Arial" w:hAnsi="Arial"/>
+        </w:rPr>
+        <w:t xml:space="preserve">13.51 Buf — gobernanza de contratos gRPC (lint + breaking)</w:t>
+      </w:r>
+    </w:p>
+    <w:p>
+      <w:pPr>
+        <w:spacing w:after="120" w:line="276"/>
+      </w:pPr>
+      <w:r>
+        <w:rPr>
+          <w:rFonts w:ascii="Arial" w:cs="Arial" w:eastAsia="Arial" w:hAnsi="Arial"/>
+          <w:b/>
+          <w:bCs/>
+        </w:rPr>
+        <w:t xml:space="preserve">Qué es: </w:t>
+      </w:r>
+      <w:r>
+        <w:rPr>
+          <w:rFonts w:ascii="Arial" w:cs="Arial" w:eastAsia="Arial" w:hAnsi="Arial"/>
+        </w:rPr>
+        <w:t xml:space="preserve">aplicar al mundo Protobuf/gRPC la misma disciplina que Spectral da a OpenAPI. </w:t>
+      </w:r>
+      <w:r>
+        <w:rPr>
+          <w:rFonts w:ascii="Arial" w:cs="Arial" w:eastAsia="Arial" w:hAnsi="Arial"/>
+          <w:b/>
+          <w:bCs/>
+        </w:rPr>
+        <w:t xml:space="preserve">Buf</w:t>
+      </w:r>
+      <w:r>
+        <w:rPr>
+          <w:rFonts w:ascii="Arial" w:cs="Arial" w:eastAsia="Arial" w:hAnsi="Arial"/>
+        </w:rPr>
+        <w:t xml:space="preserve"> valida el ESTILO de los </w:t>
+      </w:r>
+      <w:r>
+        <w:rPr>
+          <w:rFonts w:ascii="Consolas" w:cs="Consolas" w:eastAsia="Consolas" w:hAnsi="Consolas"/>
+          <w:color w:val="4F46E5"/>
+        </w:rPr>
+        <w:t xml:space="preserve">.proto</w:t>
+      </w:r>
+      <w:r>
+        <w:rPr>
+          <w:rFonts w:ascii="Arial" w:cs="Arial" w:eastAsia="Arial" w:hAnsi="Arial"/>
+        </w:rPr>
+        <w:t xml:space="preserve"> y, sobre todo, detecta </w:t>
+      </w:r>
+      <w:r>
+        <w:rPr>
+          <w:rFonts w:ascii="Arial" w:cs="Arial" w:eastAsia="Arial" w:hAnsi="Arial"/>
+          <w:b/>
+          <w:bCs/>
+        </w:rPr>
+        <w:t xml:space="preserve">cambios incompatibles</w:t>
+      </w:r>
+      <w:r>
+        <w:rPr>
+          <w:rFonts w:ascii="Arial" w:cs="Arial" w:eastAsia="Arial" w:hAnsi="Arial"/>
+        </w:rPr>
+        <w:t xml:space="preserve"> (breaking changes) antes de que rompan a los clientes que dependen del contrato.</w:t>
+      </w:r>
+    </w:p>
+    <w:p>
+      <w:pPr>
+        <w:pStyle w:val="ListParagraph"/>
+        <w:numPr>
+          <w:ilvl w:val="0"/>
+          <w:numId w:val="2"/>
+        </w:numPr>
+        <w:spacing w:after="80" w:line="268"/>
+      </w:pPr>
+      <w:r>
+        <w:rPr>
+          <w:rFonts w:ascii="Arial" w:cs="Arial" w:eastAsia="Arial" w:hAnsi="Arial"/>
+          <w:b/>
+          <w:bCs/>
+        </w:rPr>
+        <w:t xml:space="preserve">Lint de estilo: </w:t>
+      </w:r>
+      <w:r>
+        <w:rPr>
+          <w:rFonts w:ascii="Consolas" w:cs="Consolas" w:eastAsia="Consolas" w:hAnsi="Consolas"/>
+          <w:color w:val="4F46E5"/>
+        </w:rPr>
+        <w:t xml:space="preserve">buf.yaml</w:t>
+      </w:r>
+      <w:r>
+        <w:rPr>
+          <w:rFonts w:ascii="Arial" w:cs="Arial" w:eastAsia="Arial" w:hAnsi="Arial"/>
+        </w:rPr>
+        <w:t xml:space="preserve"> (v2) toma como fuente de verdad el </w:t>
+      </w:r>
+      <w:r>
+        <w:rPr>
+          <w:rFonts w:ascii="Consolas" w:cs="Consolas" w:eastAsia="Consolas" w:hAnsi="Consolas"/>
+          <w:color w:val="4F46E5"/>
+        </w:rPr>
+        <w:t xml:space="preserve">stock.proto</w:t>
+      </w:r>
+      <w:r>
+        <w:rPr>
+          <w:rFonts w:ascii="Arial" w:cs="Arial" w:eastAsia="Arial" w:hAnsi="Arial"/>
+        </w:rPr>
+        <w:t xml:space="preserve"> del inventory-service y aplica el conjunto </w:t>
+      </w:r>
+      <w:r>
+        <w:rPr>
+          <w:rFonts w:ascii="Consolas" w:cs="Consolas" w:eastAsia="Consolas" w:hAnsi="Consolas"/>
+          <w:color w:val="4F46E5"/>
+        </w:rPr>
+        <w:t xml:space="preserve">STANDARD</w:t>
+      </w:r>
+      <w:r>
+        <w:rPr>
+          <w:rFonts w:ascii="Arial" w:cs="Arial" w:eastAsia="Arial" w:hAnsi="Arial"/>
+        </w:rPr>
+        <w:t xml:space="preserve"> (nombres de mensajes/RPC, etc.), con las excepciones acordes al layout actual.</w:t>
+      </w:r>
+    </w:p>
+    <w:p>
+      <w:pPr>
+        <w:pStyle w:val="ListParagraph"/>
+        <w:numPr>
+          <w:ilvl w:val="0"/>
+          <w:numId w:val="2"/>
+        </w:numPr>
+        <w:spacing w:after="80" w:line="268"/>
+      </w:pPr>
+      <w:r>
+        <w:rPr>
+          <w:rFonts w:ascii="Arial" w:cs="Arial" w:eastAsia="Arial" w:hAnsi="Arial"/>
+          <w:b/>
+          <w:bCs/>
+        </w:rPr>
+        <w:t xml:space="preserve">Detección de breaking changes: </w:t>
+      </w:r>
+      <w:r>
+        <w:rPr>
+          <w:rFonts w:ascii="Consolas" w:cs="Consolas" w:eastAsia="Consolas" w:hAnsi="Consolas"/>
+          <w:color w:val="4F46E5"/>
+        </w:rPr>
+        <w:t xml:space="preserve">buf breaking --against main</w:t>
+      </w:r>
+      <w:r>
+        <w:rPr>
+          <w:rFonts w:ascii="Arial" w:cs="Arial" w:eastAsia="Arial" w:hAnsi="Arial"/>
+        </w:rPr>
+        <w:t xml:space="preserve"> compara el </w:t>
+      </w:r>
+      <w:r>
+        <w:rPr>
+          <w:rFonts w:ascii="Consolas" w:cs="Consolas" w:eastAsia="Consolas" w:hAnsi="Consolas"/>
+          <w:color w:val="4F46E5"/>
+        </w:rPr>
+        <w:t xml:space="preserve">.proto</w:t>
+      </w:r>
+      <w:r>
+        <w:rPr>
+          <w:rFonts w:ascii="Arial" w:cs="Arial" w:eastAsia="Arial" w:hAnsi="Arial"/>
+        </w:rPr>
+        <w:t xml:space="preserve"> con el de la rama principal; si alguien borra un campo, cambia un tipo o renumera, el pipeline lo señala. Es la garantía de compatibilidad hacia atrás del RPC interno.</w:t>
+      </w:r>
+    </w:p>
+    <w:p>
+      <w:pPr>
+        <w:pStyle w:val="ListParagraph"/>
+        <w:numPr>
+          <w:ilvl w:val="0"/>
+          <w:numId w:val="2"/>
+        </w:numPr>
+        <w:spacing w:after="80" w:line="268"/>
+      </w:pPr>
+      <w:r>
+        <w:rPr>
+          <w:rFonts w:ascii="Arial" w:cs="Arial" w:eastAsia="Arial" w:hAnsi="Arial"/>
+          <w:b/>
+          <w:bCs/>
+        </w:rPr>
+        <w:t xml:space="preserve">En el CI: </w:t>
+      </w:r>
+      <w:r>
+        <w:rPr>
+          <w:rFonts w:ascii="Arial" w:cs="Arial" w:eastAsia="Arial" w:hAnsi="Arial"/>
+        </w:rPr>
+        <w:t xml:space="preserve">el workflow </w:t>
+      </w:r>
+      <w:r>
+        <w:rPr>
+          <w:rFonts w:ascii="Consolas" w:cs="Consolas" w:eastAsia="Consolas" w:hAnsi="Consolas"/>
+          <w:color w:val="4F46E5"/>
+        </w:rPr>
+        <w:t xml:space="preserve">buf.yml</w:t>
+      </w:r>
+      <w:r>
+        <w:rPr>
+          <w:rFonts w:ascii="Arial" w:cs="Arial" w:eastAsia="Arial" w:hAnsi="Arial"/>
+        </w:rPr>
+        <w:t xml:space="preserve"> (</w:t>
+      </w:r>
+      <w:r>
+        <w:rPr>
+          <w:rFonts w:ascii="Consolas" w:cs="Consolas" w:eastAsia="Consolas" w:hAnsi="Consolas"/>
+          <w:color w:val="4F46E5"/>
+        </w:rPr>
+        <w:t xml:space="preserve">bufbuild/buf-setup-action</w:t>
+      </w:r>
+      <w:r>
+        <w:rPr>
+          <w:rFonts w:ascii="Arial" w:cs="Arial" w:eastAsia="Arial" w:hAnsi="Arial"/>
+        </w:rPr>
+        <w:t xml:space="preserve">) ejecuta lint y breaking en cada cambio de un </w:t>
+      </w:r>
+      <w:r>
+        <w:rPr>
+          <w:rFonts w:ascii="Consolas" w:cs="Consolas" w:eastAsia="Consolas" w:hAnsi="Consolas"/>
+          <w:color w:val="4F46E5"/>
+        </w:rPr>
+        <w:t xml:space="preserve">.proto</w:t>
+      </w:r>
+      <w:r>
+        <w:rPr>
+          <w:rFonts w:ascii="Arial" w:cs="Arial" w:eastAsia="Arial" w:hAnsi="Arial"/>
+        </w:rPr>
+        <w:t xml:space="preserve">.</w:t>
+      </w:r>
+    </w:p>
+    <w:p>
+      <w:pPr>
+        <w:spacing w:after="120" w:line="276"/>
+      </w:pPr>
+      <w:r>
+        <w:rPr>
+          <w:rFonts w:ascii="Arial" w:cs="Arial" w:eastAsia="Arial" w:hAnsi="Arial"/>
+          <w:b/>
+          <w:bCs/>
+        </w:rPr>
+        <w:t xml:space="preserve">Verificación: </w:t>
+      </w:r>
+      <w:r>
+        <w:rPr>
+          <w:rFonts w:ascii="Consolas" w:cs="Consolas" w:eastAsia="Consolas" w:hAnsi="Consolas"/>
+          <w:color w:val="4F46E5"/>
+        </w:rPr>
+        <w:t xml:space="preserve">buf lint</w:t>
+      </w:r>
+      <w:r>
+        <w:rPr>
+          <w:rFonts w:ascii="Arial" w:cs="Arial" w:eastAsia="Arial" w:hAnsi="Arial"/>
+        </w:rPr>
+        <w:t xml:space="preserve"> se ejecutó sobre el contrato y pasó sin observaciones.</w:t>
+      </w:r>
+    </w:p>
+    <w:p>
+      <w:pPr>
+        <w:pStyle w:val="Heading2"/>
+      </w:pPr>
+      <w:r>
+        <w:rPr>
+          <w:rFonts w:ascii="Arial" w:cs="Arial" w:eastAsia="Arial" w:hAnsi="Arial"/>
+        </w:rPr>
+        <w:t xml:space="preserve">13.52 Registro de auditoría a prueba de manipulación (hash chain)</w:t>
+      </w:r>
+    </w:p>
+    <w:p>
+      <w:pPr>
+        <w:spacing w:after="120" w:line="276"/>
+      </w:pPr>
+      <w:r>
+        <w:rPr>
+          <w:rFonts w:ascii="Arial" w:cs="Arial" w:eastAsia="Arial" w:hAnsi="Arial"/>
+          <w:b/>
+          <w:bCs/>
+        </w:rPr>
+        <w:t xml:space="preserve">Qué es: </w:t>
+      </w:r>
+      <w:r>
+        <w:rPr>
+          <w:rFonts w:ascii="Arial" w:cs="Arial" w:eastAsia="Arial" w:hAnsi="Arial"/>
+        </w:rPr>
+        <w:t xml:space="preserve">un log de auditoría </w:t>
+      </w:r>
+      <w:r>
+        <w:rPr>
+          <w:rFonts w:ascii="Arial" w:cs="Arial" w:eastAsia="Arial" w:hAnsi="Arial"/>
+          <w:b/>
+          <w:bCs/>
+        </w:rPr>
+        <w:t xml:space="preserve">append-only</w:t>
+      </w:r>
+      <w:r>
+        <w:rPr>
+          <w:rFonts w:ascii="Arial" w:cs="Arial" w:eastAsia="Arial" w:hAnsi="Arial"/>
+        </w:rPr>
+        <w:t xml:space="preserve"> en el que cada entrada incluye el hash SHA-256 de la anterior, formando una cadena. Si alguien altera, inserta o borra un registro del pasado, el enlace se rompe y la manipulación es </w:t>
+      </w:r>
+      <w:r>
+        <w:rPr>
+          <w:rFonts w:ascii="Arial" w:cs="Arial" w:eastAsia="Arial" w:hAnsi="Arial"/>
+          <w:b/>
+          <w:bCs/>
+        </w:rPr>
+        <w:t xml:space="preserve">detectable</w:t>
+      </w:r>
+      <w:r>
+        <w:rPr>
+          <w:rFonts w:ascii="Arial" w:cs="Arial" w:eastAsia="Arial" w:hAnsi="Arial"/>
+        </w:rPr>
+        <w:t xml:space="preserve"> — la misma idea de integridad que una blockchain, sin la parte distribuida. Requisito habitual de cumplimiento en banca.</w:t>
+      </w:r>
+    </w:p>
+    <w:p>
+      <w:pPr>
+        <w:pStyle w:val="ListParagraph"/>
+        <w:numPr>
+          <w:ilvl w:val="0"/>
+          <w:numId w:val="2"/>
+        </w:numPr>
+        <w:spacing w:after="80" w:line="268"/>
+      </w:pPr>
+      <w:r>
+        <w:rPr>
+          <w:rFonts w:ascii="Arial" w:cs="Arial" w:eastAsia="Arial" w:hAnsi="Arial"/>
+          <w:b/>
+          <w:bCs/>
+        </w:rPr>
+        <w:t xml:space="preserve">Encadenado por hash: </w:t>
+      </w:r>
+      <w:r>
+        <w:rPr>
+          <w:rFonts w:ascii="Consolas" w:cs="Consolas" w:eastAsia="Consolas" w:hAnsi="Consolas"/>
+          <w:color w:val="4F46E5"/>
+        </w:rPr>
+        <w:t xml:space="preserve">HashChainedAuditLog</w:t>
+      </w:r>
+      <w:r>
+        <w:rPr>
+          <w:rFonts w:ascii="Arial" w:cs="Arial" w:eastAsia="Arial" w:hAnsi="Arial"/>
+        </w:rPr>
+        <w:t xml:space="preserve"> calcula </w:t>
+      </w:r>
+      <w:r>
+        <w:rPr>
+          <w:rFonts w:ascii="Consolas" w:cs="Consolas" w:eastAsia="Consolas" w:hAnsi="Consolas"/>
+          <w:color w:val="4F46E5"/>
+        </w:rPr>
+        <w:t xml:space="preserve">hash(n) = SHA256(seq | ts | actor | acción | detalle | hash(n-1))</w:t>
+      </w:r>
+      <w:r>
+        <w:rPr>
+          <w:rFonts w:ascii="Arial" w:cs="Arial" w:eastAsia="Arial" w:hAnsi="Arial"/>
+        </w:rPr>
+        <w:t xml:space="preserve">; la primera entrada enlaza con un hash génesis. Las entradas (</w:t>
+      </w:r>
+      <w:r>
+        <w:rPr>
+          <w:rFonts w:ascii="Consolas" w:cs="Consolas" w:eastAsia="Consolas" w:hAnsi="Consolas"/>
+          <w:color w:val="4F46E5"/>
+        </w:rPr>
+        <w:t xml:space="preserve">AuditEntry</w:t>
+      </w:r>
+      <w:r>
+        <w:rPr>
+          <w:rFonts w:ascii="Arial" w:cs="Arial" w:eastAsia="Arial" w:hAnsi="Arial"/>
+        </w:rPr>
+        <w:t xml:space="preserve">) son inmutables.</w:t>
+      </w:r>
+    </w:p>
+    <w:p>
+      <w:pPr>
+        <w:pStyle w:val="ListParagraph"/>
+        <w:numPr>
+          <w:ilvl w:val="0"/>
+          <w:numId w:val="2"/>
+        </w:numPr>
+        <w:spacing w:after="80" w:line="268"/>
+      </w:pPr>
+      <w:r>
+        <w:rPr>
+          <w:rFonts w:ascii="Arial" w:cs="Arial" w:eastAsia="Arial" w:hAnsi="Arial"/>
+          <w:b/>
+          <w:bCs/>
+        </w:rPr>
+        <w:t xml:space="preserve">Verificación de integridad: </w:t>
+      </w:r>
+      <w:r>
+        <w:rPr>
+          <w:rFonts w:ascii="Consolas" w:cs="Consolas" w:eastAsia="Consolas" w:hAnsi="Consolas"/>
+          <w:color w:val="4F46E5"/>
+        </w:rPr>
+        <w:t xml:space="preserve">verify()</w:t>
+      </w:r>
+      <w:r>
+        <w:rPr>
+          <w:rFonts w:ascii="Arial" w:cs="Arial" w:eastAsia="Arial" w:hAnsi="Arial"/>
+        </w:rPr>
+        <w:t xml:space="preserve"> recomputa toda la cadena y comprueba la secuencia, el enlace </w:t>
+      </w:r>
+      <w:r>
+        <w:rPr>
+          <w:rFonts w:ascii="Consolas" w:cs="Consolas" w:eastAsia="Consolas" w:hAnsi="Consolas"/>
+          <w:color w:val="4F46E5"/>
+        </w:rPr>
+        <w:t xml:space="preserve">prevHash</w:t>
+      </w:r>
+      <w:r>
+        <w:rPr>
+          <w:rFonts w:ascii="Arial" w:cs="Arial" w:eastAsia="Arial" w:hAnsi="Arial"/>
+        </w:rPr>
+        <w:t xml:space="preserve"> y el hash de cada entrada; devuelve false ante cualquier manipulación.</w:t>
+      </w:r>
+    </w:p>
+    <w:p>
+      <w:pPr>
+        <w:spacing w:after="120" w:line="276"/>
+      </w:pPr>
+      <w:r>
+        <w:rPr>
+          <w:rFonts w:ascii="Arial" w:cs="Arial" w:eastAsia="Arial" w:hAnsi="Arial"/>
+          <w:b/>
+          <w:bCs/>
+        </w:rPr>
+        <w:t xml:space="preserve">Verificación: </w:t>
+      </w:r>
+      <w:r>
+        <w:rPr>
+          <w:rFonts w:ascii="Consolas" w:cs="Consolas" w:eastAsia="Consolas" w:hAnsi="Consolas"/>
+          <w:color w:val="4F46E5"/>
+        </w:rPr>
+        <w:t xml:space="preserve">HashChainedAuditLogTest</w:t>
+      </w:r>
+      <w:r>
+        <w:rPr>
+          <w:rFonts w:ascii="Arial" w:cs="Arial" w:eastAsia="Arial" w:hAnsi="Arial"/>
+        </w:rPr>
+        <w:t xml:space="preserve"> confirma que una cadena recién construida es íntegra, y que </w:t>
+      </w:r>
+      <w:r>
+        <w:rPr>
+          <w:rFonts w:ascii="Arial" w:cs="Arial" w:eastAsia="Arial" w:hAnsi="Arial"/>
+          <w:b/>
+          <w:bCs/>
+        </w:rPr>
+        <w:t xml:space="preserve">alterar el importe de una entrada o borrar una del medio rompe la verificación</w:t>
+      </w:r>
+      <w:r>
+        <w:rPr>
+          <w:rFonts w:ascii="Arial" w:cs="Arial" w:eastAsia="Arial" w:hAnsi="Arial"/>
+        </w:rPr>
+        <w:t xml:space="preserve">.</w:t>
+      </w:r>
+    </w:p>
+    <w:p>
+      <w:pPr>
+        <w:pStyle w:val="Heading2"/>
+      </w:pPr>
+      <w:r>
+        <w:rPr>
+          <w:rFonts w:ascii="Arial" w:cs="Arial" w:eastAsia="Arial" w:hAnsi="Arial"/>
+        </w:rPr>
+        <w:t xml:space="preserve">13.53 Chaos Engineering con Toxiproxy</w:t>
+      </w:r>
+    </w:p>
+    <w:p>
+      <w:pPr>
+        <w:spacing w:after="120" w:line="276"/>
+      </w:pPr>
+      <w:r>
+        <w:rPr>
+          <w:rFonts w:ascii="Arial" w:cs="Arial" w:eastAsia="Arial" w:hAnsi="Arial"/>
+          <w:b/>
+          <w:bCs/>
+        </w:rPr>
+        <w:t xml:space="preserve">Qué es: </w:t>
+      </w:r>
+      <w:r>
+        <w:rPr>
+          <w:rFonts w:ascii="Arial" w:cs="Arial" w:eastAsia="Arial" w:hAnsi="Arial"/>
+        </w:rPr>
+        <w:t xml:space="preserve">probar la resiliencia </w:t>
+      </w:r>
+      <w:r>
+        <w:rPr>
+          <w:rFonts w:ascii="Arial" w:cs="Arial" w:eastAsia="Arial" w:hAnsi="Arial"/>
+          <w:b/>
+          <w:bCs/>
+        </w:rPr>
+        <w:t xml:space="preserve">de verdad</w:t>
+      </w:r>
+      <w:r>
+        <w:rPr>
+          <w:rFonts w:ascii="Arial" w:cs="Arial" w:eastAsia="Arial" w:hAnsi="Arial"/>
+        </w:rPr>
+        <w:t xml:space="preserve">, inyectando fallos de red reales en lugar de confiar en que el código teórico funcione. </w:t>
+      </w:r>
+      <w:r>
+        <w:rPr>
+          <w:rFonts w:ascii="Arial" w:cs="Arial" w:eastAsia="Arial" w:hAnsi="Arial"/>
+          <w:b/>
+          <w:bCs/>
+        </w:rPr>
+        <w:t xml:space="preserve">Toxiproxy</w:t>
+      </w:r>
+      <w:r>
+        <w:rPr>
+          <w:rFonts w:ascii="Arial" w:cs="Arial" w:eastAsia="Arial" w:hAnsi="Arial"/>
+        </w:rPr>
+        <w:t xml:space="preserve"> es un proxy TCP que se interpone entre un servicio y su dependencia y añade latencia, cortes o límites de ancho de banda a demanda.</w:t>
+      </w:r>
+    </w:p>
+    <w:p>
+      <w:pPr>
+        <w:pStyle w:val="ListParagraph"/>
+        <w:numPr>
+          <w:ilvl w:val="0"/>
+          <w:numId w:val="2"/>
+        </w:numPr>
+        <w:spacing w:after="80" w:line="268"/>
+      </w:pPr>
+      <w:r>
+        <w:rPr>
+          <w:rFonts w:ascii="Arial" w:cs="Arial" w:eastAsia="Arial" w:hAnsi="Arial"/>
+          <w:b/>
+          <w:bCs/>
+        </w:rPr>
+        <w:t xml:space="preserve">Montaje opt-in: </w:t>
+      </w:r>
+      <w:r>
+        <w:rPr>
+          <w:rFonts w:ascii="Arial" w:cs="Arial" w:eastAsia="Arial" w:hAnsi="Arial"/>
+        </w:rPr>
+        <w:t xml:space="preserve">el overlay </w:t>
+      </w:r>
+      <w:r>
+        <w:rPr>
+          <w:rFonts w:ascii="Consolas" w:cs="Consolas" w:eastAsia="Consolas" w:hAnsi="Consolas"/>
+          <w:color w:val="4F46E5"/>
+        </w:rPr>
+        <w:t xml:space="preserve">docker-compose.chaos.yml</w:t>
+      </w:r>
+      <w:r>
+        <w:rPr>
+          <w:rFonts w:ascii="Arial" w:cs="Arial" w:eastAsia="Arial" w:hAnsi="Arial"/>
+        </w:rPr>
+        <w:t xml:space="preserve"> (no altera el stack normal) levanta Toxiproxy y hace que el </w:t>
+      </w:r>
+      <w:r>
+        <w:rPr>
+          <w:rFonts w:ascii="Consolas" w:cs="Consolas" w:eastAsia="Consolas" w:hAnsi="Consolas"/>
+          <w:color w:val="4F46E5"/>
+        </w:rPr>
+        <w:t xml:space="preserve">catalog-service</w:t>
+      </w:r>
+      <w:r>
+        <w:rPr>
+          <w:rFonts w:ascii="Arial" w:cs="Arial" w:eastAsia="Arial" w:hAnsi="Arial"/>
+        </w:rPr>
+        <w:t xml:space="preserve"> hable con Elasticsearch A TRAVÉS del proxy (</w:t>
+      </w:r>
+      <w:r>
+        <w:rPr>
+          <w:rFonts w:ascii="Consolas" w:cs="Consolas" w:eastAsia="Consolas" w:hAnsi="Consolas"/>
+          <w:color w:val="4F46E5"/>
+        </w:rPr>
+        <w:t xml:space="preserve">chaos/toxiproxy.json</w:t>
+      </w:r>
+      <w:r>
+        <w:rPr>
+          <w:rFonts w:ascii="Arial" w:cs="Arial" w:eastAsia="Arial" w:hAnsi="Arial"/>
+        </w:rPr>
+        <w:t xml:space="preserve">).</w:t>
+      </w:r>
+    </w:p>
+    <w:p>
+      <w:pPr>
+        <w:pStyle w:val="ListParagraph"/>
+        <w:numPr>
+          <w:ilvl w:val="0"/>
+          <w:numId w:val="2"/>
+        </w:numPr>
+        <w:spacing w:after="80" w:line="268"/>
+      </w:pPr>
+      <w:r>
+        <w:rPr>
+          <w:rFonts w:ascii="Arial" w:cs="Arial" w:eastAsia="Arial" w:hAnsi="Arial"/>
+          <w:b/>
+          <w:bCs/>
+        </w:rPr>
+        <w:t xml:space="preserve">Experimento reproducible: </w:t>
+      </w:r>
+      <w:r>
+        <w:rPr>
+          <w:rFonts w:ascii="Consolas" w:cs="Consolas" w:eastAsia="Consolas" w:hAnsi="Consolas"/>
+          <w:color w:val="4F46E5"/>
+        </w:rPr>
+        <w:t xml:space="preserve">chaos/run-experiment.sh</w:t>
+      </w:r>
+      <w:r>
+        <w:rPr>
+          <w:rFonts w:ascii="Arial" w:cs="Arial" w:eastAsia="Arial" w:hAnsi="Arial"/>
+        </w:rPr>
+        <w:t xml:space="preserve"> usa la API de Toxiproxy para inyectar 1500ms de latencia y luego retirarla, permitiendo observar cómo el </w:t>
+      </w:r>
+      <w:r>
+        <w:rPr>
+          <w:rFonts w:ascii="Arial" w:cs="Arial" w:eastAsia="Arial" w:hAnsi="Arial"/>
+          <w:b/>
+          <w:bCs/>
+        </w:rPr>
+        <w:t xml:space="preserve">circuit breaker</w:t>
+      </w:r>
+      <w:r>
+        <w:rPr>
+          <w:rFonts w:ascii="Arial" w:cs="Arial" w:eastAsia="Arial" w:hAnsi="Arial"/>
+        </w:rPr>
+        <w:t xml:space="preserve"> de Resilience4j (</w:t>
+      </w:r>
+      <w:r>
+        <w:rPr>
+          <w:rFonts w:ascii="Consolas" w:cs="Consolas" w:eastAsia="Consolas" w:hAnsi="Consolas"/>
+          <w:color w:val="4F46E5"/>
+        </w:rPr>
+        <w:t xml:space="preserve">bookSearch</w:t>
+      </w:r>
+      <w:r>
+        <w:rPr>
+          <w:rFonts w:ascii="Arial" w:cs="Arial" w:eastAsia="Arial" w:hAnsi="Arial"/>
+        </w:rPr>
+        <w:t xml:space="preserve">) pasa a OPEN y responde con el fallback en vez de colgarse.</w:t>
+      </w:r>
+    </w:p>
+    <w:p>
+      <w:pPr>
+        <w:spacing w:after="120" w:line="276"/>
+      </w:pPr>
+      <w:r>
+        <w:rPr>
+          <w:rFonts w:ascii="Arial" w:cs="Arial" w:eastAsia="Arial" w:hAnsi="Arial"/>
+          <w:b/>
+          <w:bCs/>
+        </w:rPr>
+        <w:t xml:space="preserve">Verificación: </w:t>
+      </w:r>
+      <w:r>
+        <w:rPr>
+          <w:rFonts w:ascii="Arial" w:cs="Arial" w:eastAsia="Arial" w:hAnsi="Arial"/>
+        </w:rPr>
+        <w:t xml:space="preserve">el overlay y la configuración se validaron (YAML/JSON) y el overlay compone correctamente sobre el </w:t>
+      </w:r>
+      <w:r>
+        <w:rPr>
+          <w:rFonts w:ascii="Consolas" w:cs="Consolas" w:eastAsia="Consolas" w:hAnsi="Consolas"/>
+          <w:color w:val="4F46E5"/>
+        </w:rPr>
+        <w:t xml:space="preserve">docker-compose.full.yml</w:t>
+      </w:r>
+      <w:r>
+        <w:rPr>
+          <w:rFonts w:ascii="Arial" w:cs="Arial" w:eastAsia="Arial" w:hAnsi="Arial"/>
+        </w:rPr>
+        <w:t xml:space="preserve"> (override de </w:t>
+      </w:r>
+      <w:r>
+        <w:rPr>
+          <w:rFonts w:ascii="Consolas" w:cs="Consolas" w:eastAsia="Consolas" w:hAnsi="Consolas"/>
+          <w:color w:val="4F46E5"/>
+        </w:rPr>
+        <w:t xml:space="preserve">catalog-service</w:t>
+      </w:r>
+      <w:r>
+        <w:rPr>
+          <w:rFonts w:ascii="Arial" w:cs="Arial" w:eastAsia="Arial" w:hAnsi="Arial"/>
+        </w:rPr>
+        <w:t xml:space="preserve">).</w:t>
+      </w:r>
+    </w:p>
+    <w:p>
+      <w:pPr>
+        <w:pStyle w:val="Heading2"/>
+      </w:pPr>
+      <w:r>
+        <w:rPr>
+          <w:rFonts w:ascii="Arial" w:cs="Arial" w:eastAsia="Arial" w:hAnsi="Arial"/>
+        </w:rPr>
+        <w:t xml:space="preserve">13.54 WebAuthn / Passkeys (autenticación resistente a phishing)</w:t>
+      </w:r>
+    </w:p>
+    <w:p>
+      <w:pPr>
+        <w:spacing w:after="120" w:line="276"/>
+      </w:pPr>
+      <w:r>
+        <w:rPr>
+          <w:rFonts w:ascii="Arial" w:cs="Arial" w:eastAsia="Arial" w:hAnsi="Arial"/>
+          <w:b/>
+          <w:bCs/>
+        </w:rPr>
+        <w:t xml:space="preserve">Qué es: </w:t>
+      </w:r>
+      <w:r>
+        <w:rPr>
+          <w:rFonts w:ascii="Arial" w:cs="Arial" w:eastAsia="Arial" w:hAnsi="Arial"/>
+        </w:rPr>
+        <w:t xml:space="preserve">el estándar FIDO2/WebAuthn, evolución del MFA hacia autenticación </w:t>
+      </w:r>
+      <w:r>
+        <w:rPr>
+          <w:rFonts w:ascii="Arial" w:cs="Arial" w:eastAsia="Arial" w:hAnsi="Arial"/>
+          <w:b/>
+          <w:bCs/>
+        </w:rPr>
+        <w:t xml:space="preserve">resistente a phishing</w:t>
+      </w:r>
+      <w:r>
+        <w:rPr>
+          <w:rFonts w:ascii="Arial" w:cs="Arial" w:eastAsia="Arial" w:hAnsi="Arial"/>
+        </w:rPr>
+        <w:t xml:space="preserve">. En vez de una contraseña o un TOTP (que se pueden teclear en un sitio falso), el autenticador del usuario (llave de seguridad, Touch ID, Windows Hello) firma un reto con una clave privada que </w:t>
+      </w:r>
+      <w:r>
+        <w:rPr>
+          <w:rFonts w:ascii="Arial" w:cs="Arial" w:eastAsia="Arial" w:hAnsi="Arial"/>
+          <w:b/>
+          <w:bCs/>
+        </w:rPr>
+        <w:t xml:space="preserve">nunca sale del dispositivo</w:t>
+      </w:r>
+      <w:r>
+        <w:rPr>
+          <w:rFonts w:ascii="Arial" w:cs="Arial" w:eastAsia="Arial" w:hAnsi="Arial"/>
+        </w:rPr>
+        <w:t xml:space="preserve">; el servidor verifica con la clave pública registrada. Como el </w:t>
+      </w:r>
+      <w:r>
+        <w:rPr>
+          <w:rFonts w:ascii="Consolas" w:cs="Consolas" w:eastAsia="Consolas" w:hAnsi="Consolas"/>
+          <w:color w:val="4F46E5"/>
+        </w:rPr>
+        <w:t xml:space="preserve">origin</w:t>
+      </w:r>
+      <w:r>
+        <w:rPr>
+          <w:rFonts w:ascii="Arial" w:cs="Arial" w:eastAsia="Arial" w:hAnsi="Arial"/>
+        </w:rPr>
+        <w:t xml:space="preserve"> va firmado, una web falsa no puede reutilizar la firma.</w:t>
+      </w:r>
+    </w:p>
+    <w:p>
+      <w:pPr>
+        <w:pStyle w:val="ListParagraph"/>
+        <w:numPr>
+          <w:ilvl w:val="0"/>
+          <w:numId w:val="2"/>
+        </w:numPr>
+        <w:spacing w:after="80" w:line="268"/>
+      </w:pPr>
+      <w:r>
+        <w:rPr>
+          <w:rFonts w:ascii="Arial" w:cs="Arial" w:eastAsia="Arial" w:hAnsi="Arial"/>
+          <w:b/>
+          <w:bCs/>
+        </w:rPr>
+        <w:t xml:space="preserve">Verificación de la aserción: </w:t>
+      </w:r>
+      <w:r>
+        <w:rPr>
+          <w:rFonts w:ascii="Consolas" w:cs="Consolas" w:eastAsia="Consolas" w:hAnsi="Consolas"/>
+          <w:color w:val="4F46E5"/>
+        </w:rPr>
+        <w:t xml:space="preserve">WebAuthnAssertionVerifier</w:t>
+      </w:r>
+      <w:r>
+        <w:rPr>
+          <w:rFonts w:ascii="Arial" w:cs="Arial" w:eastAsia="Arial" w:hAnsi="Arial"/>
+        </w:rPr>
+        <w:t xml:space="preserve"> (JDK puro) comprueba en el login: (1) </w:t>
+      </w:r>
+      <w:r>
+        <w:rPr>
+          <w:rFonts w:ascii="Consolas" w:cs="Consolas" w:eastAsia="Consolas" w:hAnsi="Consolas"/>
+          <w:color w:val="4F46E5"/>
+        </w:rPr>
+        <w:t xml:space="preserve">clientDataJSON</w:t>
+      </w:r>
+      <w:r>
+        <w:rPr>
+          <w:rFonts w:ascii="Arial" w:cs="Arial" w:eastAsia="Arial" w:hAnsi="Arial"/>
+        </w:rPr>
+        <w:t xml:space="preserve"> — type </w:t>
+      </w:r>
+      <w:r>
+        <w:rPr>
+          <w:rFonts w:ascii="Consolas" w:cs="Consolas" w:eastAsia="Consolas" w:hAnsi="Consolas"/>
+          <w:color w:val="4F46E5"/>
+        </w:rPr>
+        <w:t xml:space="preserve">webauthn.get</w:t>
+      </w:r>
+      <w:r>
+        <w:rPr>
+          <w:rFonts w:ascii="Arial" w:cs="Arial" w:eastAsia="Arial" w:hAnsi="Arial"/>
+        </w:rPr>
+        <w:t xml:space="preserve">, reto y origin esperados; (2) </w:t>
+      </w:r>
+      <w:r>
+        <w:rPr>
+          <w:rFonts w:ascii="Consolas" w:cs="Consolas" w:eastAsia="Consolas" w:hAnsi="Consolas"/>
+          <w:color w:val="4F46E5"/>
+        </w:rPr>
+        <w:t xml:space="preserve">authenticatorData</w:t>
+      </w:r>
+      <w:r>
+        <w:rPr>
+          <w:rFonts w:ascii="Arial" w:cs="Arial" w:eastAsia="Arial" w:hAnsi="Arial"/>
+        </w:rPr>
+        <w:t xml:space="preserve"> — </w:t>
+      </w:r>
+      <w:r>
+        <w:rPr>
+          <w:rFonts w:ascii="Consolas" w:cs="Consolas" w:eastAsia="Consolas" w:hAnsi="Consolas"/>
+          <w:color w:val="4F46E5"/>
+        </w:rPr>
+        <w:t xml:space="preserve">rpIdHash</w:t>
+      </w:r>
+      <w:r>
+        <w:rPr>
+          <w:rFonts w:ascii="Arial" w:cs="Arial" w:eastAsia="Arial" w:hAnsi="Arial"/>
+        </w:rPr>
+        <w:t xml:space="preserve"> correcto y flag </w:t>
+      </w:r>
+      <w:r>
+        <w:rPr>
+          <w:rFonts w:ascii="Arial" w:cs="Arial" w:eastAsia="Arial" w:hAnsi="Arial"/>
+          <w:b/>
+          <w:bCs/>
+        </w:rPr>
+        <w:t xml:space="preserve">User Present</w:t>
+      </w:r>
+      <w:r>
+        <w:rPr>
+          <w:rFonts w:ascii="Arial" w:cs="Arial" w:eastAsia="Arial" w:hAnsi="Arial"/>
+        </w:rPr>
+        <w:t xml:space="preserve">; (3) la firma </w:t>
+      </w:r>
+      <w:r>
+        <w:rPr>
+          <w:rFonts w:ascii="Arial" w:cs="Arial" w:eastAsia="Arial" w:hAnsi="Arial"/>
+          <w:b/>
+          <w:bCs/>
+        </w:rPr>
+        <w:t xml:space="preserve">ECDSA P-256</w:t>
+      </w:r>
+      <w:r>
+        <w:rPr>
+          <w:rFonts w:ascii="Arial" w:cs="Arial" w:eastAsia="Arial" w:hAnsi="Arial"/>
+        </w:rPr>
+        <w:t xml:space="preserve"> sobre </w:t>
+      </w:r>
+      <w:r>
+        <w:rPr>
+          <w:rFonts w:ascii="Consolas" w:cs="Consolas" w:eastAsia="Consolas" w:hAnsi="Consolas"/>
+          <w:color w:val="4F46E5"/>
+        </w:rPr>
+        <w:t xml:space="preserve">authenticatorData || SHA256(clientDataJSON)</w:t>
+      </w:r>
+      <w:r>
+        <w:rPr>
+          <w:rFonts w:ascii="Arial" w:cs="Arial" w:eastAsia="Arial" w:hAnsi="Arial"/>
+        </w:rPr>
+        <w:t xml:space="preserve">.</w:t>
+      </w:r>
+    </w:p>
+    <w:p>
+      <w:pPr>
+        <w:pStyle w:val="ListParagraph"/>
+        <w:numPr>
+          <w:ilvl w:val="0"/>
+          <w:numId w:val="2"/>
+        </w:numPr>
+        <w:spacing w:after="80" w:line="268"/>
+      </w:pPr>
+      <w:r>
+        <w:rPr>
+          <w:rFonts w:ascii="Arial" w:cs="Arial" w:eastAsia="Arial" w:hAnsi="Arial"/>
+          <w:b/>
+          <w:bCs/>
+        </w:rPr>
+        <w:t xml:space="preserve">Sin dependencias externas: </w:t>
+      </w:r>
+      <w:r>
+        <w:rPr>
+          <w:rFonts w:ascii="Arial" w:cs="Arial" w:eastAsia="Arial" w:hAnsi="Arial"/>
+        </w:rPr>
+        <w:t xml:space="preserve">todo con </w:t>
+      </w:r>
+      <w:r>
+        <w:rPr>
+          <w:rFonts w:ascii="Consolas" w:cs="Consolas" w:eastAsia="Consolas" w:hAnsi="Consolas"/>
+          <w:color w:val="4F46E5"/>
+        </w:rPr>
+        <w:t xml:space="preserve">java.security</w:t>
+      </w:r>
+      <w:r>
+        <w:rPr>
+          <w:rFonts w:ascii="Arial" w:cs="Arial" w:eastAsia="Arial" w:hAnsi="Arial"/>
+        </w:rPr>
+        <w:t xml:space="preserve"> (Signature </w:t>
+      </w:r>
+      <w:r>
+        <w:rPr>
+          <w:rFonts w:ascii="Consolas" w:cs="Consolas" w:eastAsia="Consolas" w:hAnsi="Consolas"/>
+          <w:color w:val="4F46E5"/>
+        </w:rPr>
+        <w:t xml:space="preserve">SHA256withECDSA</w:t>
+      </w:r>
+      <w:r>
+        <w:rPr>
+          <w:rFonts w:ascii="Arial" w:cs="Arial" w:eastAsia="Arial" w:hAnsi="Arial"/>
+        </w:rPr>
+        <w:t xml:space="preserve">, </w:t>
+      </w:r>
+      <w:r>
+        <w:rPr>
+          <w:rFonts w:ascii="Consolas" w:cs="Consolas" w:eastAsia="Consolas" w:hAnsi="Consolas"/>
+          <w:color w:val="4F46E5"/>
+        </w:rPr>
+        <w:t xml:space="preserve">MessageDigest</w:t>
+      </w:r>
+      <w:r>
+        <w:rPr>
+          <w:rFonts w:ascii="Arial" w:cs="Arial" w:eastAsia="Arial" w:hAnsi="Arial"/>
+        </w:rPr>
+        <w:t xml:space="preserve">), sin librerías de terceros.</w:t>
+      </w:r>
+    </w:p>
+    <w:p>
+      <w:pPr>
+        <w:spacing w:after="120" w:line="276"/>
+      </w:pPr>
+      <w:r>
+        <w:rPr>
+          <w:rFonts w:ascii="Arial" w:cs="Arial" w:eastAsia="Arial" w:hAnsi="Arial"/>
+          <w:b/>
+          <w:bCs/>
+        </w:rPr>
+        <w:t xml:space="preserve">Verificación: </w:t>
+      </w:r>
+      <w:r>
+        <w:rPr>
+          <w:rFonts w:ascii="Consolas" w:cs="Consolas" w:eastAsia="Consolas" w:hAnsi="Consolas"/>
+          <w:color w:val="4F46E5"/>
+        </w:rPr>
+        <w:t xml:space="preserve">WebAuthnAssertionVerifierTest</w:t>
+      </w:r>
+      <w:r>
+        <w:rPr>
+          <w:rFonts w:ascii="Arial" w:cs="Arial" w:eastAsia="Arial" w:hAnsi="Arial"/>
+        </w:rPr>
+        <w:t xml:space="preserve"> genera un par de claves EC P-256 real, fabrica y firma una aserción como lo haría un autenticador, y comprueba que se acepta la válida y se </w:t>
+      </w:r>
+      <w:r>
+        <w:rPr>
+          <w:rFonts w:ascii="Arial" w:cs="Arial" w:eastAsia="Arial" w:hAnsi="Arial"/>
+          <w:b/>
+          <w:bCs/>
+        </w:rPr>
+        <w:t xml:space="preserve">rechazan reto, origin y firma manipulados</w:t>
+      </w:r>
+      <w:r>
+        <w:rPr>
+          <w:rFonts w:ascii="Arial" w:cs="Arial" w:eastAsia="Arial" w:hAnsi="Arial"/>
+        </w:rPr>
+        <w:t xml:space="preserve">. El esquema criptográfico se contrastó además de forma independiente.</w:t>
+      </w:r>
+    </w:p>
+    <w:p>
+      <w:pPr>
         <w:pStyle w:val="Heading1"/>
       </w:pPr>
       <w:r>
@@ -20901,6 +23038,766 @@
                 <w:szCs w:val="19"/>
               </w:rPr>
               <w:t xml:space="preserve">Comunicación interna binaria, tipada y de baja latencia</w:t>
+            </w:r>
+          </w:p>
+        </w:tc>
+      </w:tr>
+      <w:tr>
+        <w:trPr>
+          <w:tblHeader w:val="false"/>
+        </w:trPr>
+        <w:tc>
+          <w:tcPr>
+            <w:tcW w:type="dxa" w:w="2500"/>
+            <w:tcBorders>
+              <w:top w:val="single" w:color="D1D5DB" w:sz="1"/>
+              <w:left w:val="single" w:color="D1D5DB" w:sz="1"/>
+              <w:bottom w:val="single" w:color="D1D5DB" w:sz="1"/>
+              <w:right w:val="single" w:color="D1D5DB" w:sz="1"/>
+            </w:tcBorders>
+            <w:tcMar>
+              <w:top w:type="dxa" w:w="60"/>
+              <w:left w:type="dxa" w:w="110"/>
+              <w:bottom w:type="dxa" w:w="60"/>
+              <w:right w:type="dxa" w:w="110"/>
+            </w:tcMar>
+          </w:tcPr>
+          <w:p>
+            <w:pPr>
+              <w:spacing w:after="0" w:line="264"/>
+            </w:pPr>
+            <w:r>
+              <w:rPr>
+                <w:rFonts w:ascii="Arial" w:cs="Arial" w:eastAsia="Arial" w:hAnsi="Arial"/>
+                <w:sz w:val="19"/>
+                <w:szCs w:val="19"/>
+              </w:rPr>
+              <w:t xml:space="preserve">Contract-first REST (OpenAPI)</w:t>
+            </w:r>
+          </w:p>
+        </w:tc>
+        <w:tc>
+          <w:tcPr>
+            <w:tcW w:type="dxa" w:w="3700"/>
+            <w:tcBorders>
+              <w:top w:val="single" w:color="D1D5DB" w:sz="1"/>
+              <w:left w:val="single" w:color="D1D5DB" w:sz="1"/>
+              <w:bottom w:val="single" w:color="D1D5DB" w:sz="1"/>
+              <w:right w:val="single" w:color="D1D5DB" w:sz="1"/>
+            </w:tcBorders>
+            <w:tcMar>
+              <w:top w:type="dxa" w:w="60"/>
+              <w:left w:type="dxa" w:w="110"/>
+              <w:bottom w:type="dxa" w:w="60"/>
+              <w:right w:type="dxa" w:w="110"/>
+            </w:tcMar>
+          </w:tcPr>
+          <w:p>
+            <w:pPr>
+              <w:spacing w:after="0" w:line="264"/>
+            </w:pPr>
+            <w:r>
+              <w:rPr>
+                <w:rFonts w:ascii="Arial" w:cs="Arial" w:eastAsia="Arial" w:hAnsi="Arial"/>
+                <w:sz w:val="19"/>
+                <w:szCs w:val="19"/>
+              </w:rPr>
+              <w:t xml:space="preserve">api/openapi + Spectral en CI</w:t>
+            </w:r>
+          </w:p>
+        </w:tc>
+        <w:tc>
+          <w:tcPr>
+            <w:tcW w:type="dxa" w:w="3160"/>
+            <w:tcBorders>
+              <w:top w:val="single" w:color="D1D5DB" w:sz="1"/>
+              <w:left w:val="single" w:color="D1D5DB" w:sz="1"/>
+              <w:bottom w:val="single" w:color="D1D5DB" w:sz="1"/>
+              <w:right w:val="single" w:color="D1D5DB" w:sz="1"/>
+            </w:tcBorders>
+            <w:tcMar>
+              <w:top w:type="dxa" w:w="60"/>
+              <w:left w:type="dxa" w:w="110"/>
+              <w:bottom w:type="dxa" w:w="60"/>
+              <w:right w:type="dxa" w:w="110"/>
+            </w:tcMar>
+          </w:tcPr>
+          <w:p>
+            <w:pPr>
+              <w:spacing w:after="0" w:line="264"/>
+            </w:pPr>
+            <w:r>
+              <w:rPr>
+                <w:rFonts w:ascii="Arial" w:cs="Arial" w:eastAsia="Arial" w:hAnsi="Arial"/>
+                <w:sz w:val="19"/>
+                <w:szCs w:val="19"/>
+              </w:rPr>
+              <w:t xml:space="preserve">El contrato es la fuente de verdad; el lint evita que se degrade</w:t>
+            </w:r>
+          </w:p>
+        </w:tc>
+      </w:tr>
+      <w:tr>
+        <w:trPr>
+          <w:tblHeader w:val="false"/>
+        </w:trPr>
+        <w:tc>
+          <w:tcPr>
+            <w:tcW w:type="dxa" w:w="2500"/>
+            <w:tcBorders>
+              <w:top w:val="single" w:color="D1D5DB" w:sz="1"/>
+              <w:left w:val="single" w:color="D1D5DB" w:sz="1"/>
+              <w:bottom w:val="single" w:color="D1D5DB" w:sz="1"/>
+              <w:right w:val="single" w:color="D1D5DB" w:sz="1"/>
+            </w:tcBorders>
+            <w:tcMar>
+              <w:top w:type="dxa" w:w="60"/>
+              <w:left w:type="dxa" w:w="110"/>
+              <w:bottom w:type="dxa" w:w="60"/>
+              <w:right w:type="dxa" w:w="110"/>
+            </w:tcMar>
+          </w:tcPr>
+          <w:p>
+            <w:pPr>
+              <w:spacing w:after="0" w:line="264"/>
+            </w:pPr>
+            <w:r>
+              <w:rPr>
+                <w:rFonts w:ascii="Arial" w:cs="Arial" w:eastAsia="Arial" w:hAnsi="Arial"/>
+                <w:sz w:val="19"/>
+                <w:szCs w:val="19"/>
+              </w:rPr>
+              <w:t xml:space="preserve">Event Sourcing</w:t>
+            </w:r>
+          </w:p>
+        </w:tc>
+        <w:tc>
+          <w:tcPr>
+            <w:tcW w:type="dxa" w:w="3700"/>
+            <w:tcBorders>
+              <w:top w:val="single" w:color="D1D5DB" w:sz="1"/>
+              <w:left w:val="single" w:color="D1D5DB" w:sz="1"/>
+              <w:bottom w:val="single" w:color="D1D5DB" w:sz="1"/>
+              <w:right w:val="single" w:color="D1D5DB" w:sz="1"/>
+            </w:tcBorders>
+            <w:tcMar>
+              <w:top w:type="dxa" w:w="60"/>
+              <w:left w:type="dxa" w:w="110"/>
+              <w:bottom w:type="dxa" w:w="60"/>
+              <w:right w:type="dxa" w:w="110"/>
+            </w:tcMar>
+          </w:tcPr>
+          <w:p>
+            <w:pPr>
+              <w:spacing w:after="0" w:line="264"/>
+            </w:pPr>
+            <w:r>
+              <w:rPr>
+                <w:rFonts w:ascii="Arial" w:cs="Arial" w:eastAsia="Arial" w:hAnsi="Arial"/>
+                <w:sz w:val="19"/>
+                <w:szCs w:val="19"/>
+              </w:rPr>
+              <w:t xml:space="preserve">order: EventSourcedOrder + EventStore</w:t>
+            </w:r>
+          </w:p>
+        </w:tc>
+        <w:tc>
+          <w:tcPr>
+            <w:tcW w:type="dxa" w:w="3160"/>
+            <w:tcBorders>
+              <w:top w:val="single" w:color="D1D5DB" w:sz="1"/>
+              <w:left w:val="single" w:color="D1D5DB" w:sz="1"/>
+              <w:bottom w:val="single" w:color="D1D5DB" w:sz="1"/>
+              <w:right w:val="single" w:color="D1D5DB" w:sz="1"/>
+            </w:tcBorders>
+            <w:tcMar>
+              <w:top w:type="dxa" w:w="60"/>
+              <w:left w:type="dxa" w:w="110"/>
+              <w:bottom w:type="dxa" w:w="60"/>
+              <w:right w:type="dxa" w:w="110"/>
+            </w:tcMar>
+          </w:tcPr>
+          <w:p>
+            <w:pPr>
+              <w:spacing w:after="0" w:line="264"/>
+            </w:pPr>
+            <w:r>
+              <w:rPr>
+                <w:rFonts w:ascii="Arial" w:cs="Arial" w:eastAsia="Arial" w:hAnsi="Arial"/>
+                <w:sz w:val="19"/>
+                <w:szCs w:val="19"/>
+              </w:rPr>
+              <w:t xml:space="preserve">El estado se deriva de eventos inmutables; auditoría y replay</w:t>
+            </w:r>
+          </w:p>
+        </w:tc>
+      </w:tr>
+      <w:tr>
+        <w:trPr>
+          <w:tblHeader w:val="false"/>
+        </w:trPr>
+        <w:tc>
+          <w:tcPr>
+            <w:tcW w:type="dxa" w:w="2500"/>
+            <w:tcBorders>
+              <w:top w:val="single" w:color="D1D5DB" w:sz="1"/>
+              <w:left w:val="single" w:color="D1D5DB" w:sz="1"/>
+              <w:bottom w:val="single" w:color="D1D5DB" w:sz="1"/>
+              <w:right w:val="single" w:color="D1D5DB" w:sz="1"/>
+            </w:tcBorders>
+            <w:tcMar>
+              <w:top w:type="dxa" w:w="60"/>
+              <w:left w:type="dxa" w:w="110"/>
+              <w:bottom w:type="dxa" w:w="60"/>
+              <w:right w:type="dxa" w:w="110"/>
+            </w:tcMar>
+          </w:tcPr>
+          <w:p>
+            <w:pPr>
+              <w:spacing w:after="0" w:line="264"/>
+            </w:pPr>
+            <w:r>
+              <w:rPr>
+                <w:rFonts w:ascii="Arial" w:cs="Arial" w:eastAsia="Arial" w:hAnsi="Arial"/>
+                <w:sz w:val="19"/>
+                <w:szCs w:val="19"/>
+              </w:rPr>
+              <w:t xml:space="preserve">CQRS (read model)</w:t>
+            </w:r>
+          </w:p>
+        </w:tc>
+        <w:tc>
+          <w:tcPr>
+            <w:tcW w:type="dxa" w:w="3700"/>
+            <w:tcBorders>
+              <w:top w:val="single" w:color="D1D5DB" w:sz="1"/>
+              <w:left w:val="single" w:color="D1D5DB" w:sz="1"/>
+              <w:bottom w:val="single" w:color="D1D5DB" w:sz="1"/>
+              <w:right w:val="single" w:color="D1D5DB" w:sz="1"/>
+            </w:tcBorders>
+            <w:tcMar>
+              <w:top w:type="dxa" w:w="60"/>
+              <w:left w:type="dxa" w:w="110"/>
+              <w:bottom w:type="dxa" w:w="60"/>
+              <w:right w:type="dxa" w:w="110"/>
+            </w:tcMar>
+          </w:tcPr>
+          <w:p>
+            <w:pPr>
+              <w:spacing w:after="0" w:line="264"/>
+            </w:pPr>
+            <w:r>
+              <w:rPr>
+                <w:rFonts w:ascii="Arial" w:cs="Arial" w:eastAsia="Arial" w:hAnsi="Arial"/>
+                <w:sz w:val="19"/>
+                <w:szCs w:val="19"/>
+              </w:rPr>
+              <w:t xml:space="preserve">order: OrderSummaryProjection</w:t>
+            </w:r>
+          </w:p>
+        </w:tc>
+        <w:tc>
+          <w:tcPr>
+            <w:tcW w:type="dxa" w:w="3160"/>
+            <w:tcBorders>
+              <w:top w:val="single" w:color="D1D5DB" w:sz="1"/>
+              <w:left w:val="single" w:color="D1D5DB" w:sz="1"/>
+              <w:bottom w:val="single" w:color="D1D5DB" w:sz="1"/>
+              <w:right w:val="single" w:color="D1D5DB" w:sz="1"/>
+            </w:tcBorders>
+            <w:tcMar>
+              <w:top w:type="dxa" w:w="60"/>
+              <w:left w:type="dxa" w:w="110"/>
+              <w:bottom w:type="dxa" w:w="60"/>
+              <w:right w:type="dxa" w:w="110"/>
+            </w:tcMar>
+          </w:tcPr>
+          <w:p>
+            <w:pPr>
+              <w:spacing w:after="0" w:line="264"/>
+            </w:pPr>
+            <w:r>
+              <w:rPr>
+                <w:rFonts w:ascii="Arial" w:cs="Arial" w:eastAsia="Arial" w:hAnsi="Arial"/>
+                <w:sz w:val="19"/>
+                <w:szCs w:val="19"/>
+              </w:rPr>
+              <w:t xml:space="preserve">Separar el modelo de escritura del de lectura</w:t>
+            </w:r>
+          </w:p>
+        </w:tc>
+      </w:tr>
+      <w:tr>
+        <w:trPr>
+          <w:tblHeader w:val="false"/>
+        </w:trPr>
+        <w:tc>
+          <w:tcPr>
+            <w:tcW w:type="dxa" w:w="2500"/>
+            <w:tcBorders>
+              <w:top w:val="single" w:color="D1D5DB" w:sz="1"/>
+              <w:left w:val="single" w:color="D1D5DB" w:sz="1"/>
+              <w:bottom w:val="single" w:color="D1D5DB" w:sz="1"/>
+              <w:right w:val="single" w:color="D1D5DB" w:sz="1"/>
+            </w:tcBorders>
+            <w:tcMar>
+              <w:top w:type="dxa" w:w="60"/>
+              <w:left w:type="dxa" w:w="110"/>
+              <w:bottom w:type="dxa" w:w="60"/>
+              <w:right w:type="dxa" w:w="110"/>
+            </w:tcMar>
+          </w:tcPr>
+          <w:p>
+            <w:pPr>
+              <w:spacing w:after="0" w:line="264"/>
+            </w:pPr>
+            <w:r>
+              <w:rPr>
+                <w:rFonts w:ascii="Arial" w:cs="Arial" w:eastAsia="Arial" w:hAnsi="Arial"/>
+                <w:sz w:val="19"/>
+                <w:szCs w:val="19"/>
+              </w:rPr>
+              <w:t xml:space="preserve">Dynamic secrets (leasing)</w:t>
+            </w:r>
+          </w:p>
+        </w:tc>
+        <w:tc>
+          <w:tcPr>
+            <w:tcW w:type="dxa" w:w="3700"/>
+            <w:tcBorders>
+              <w:top w:val="single" w:color="D1D5DB" w:sz="1"/>
+              <w:left w:val="single" w:color="D1D5DB" w:sz="1"/>
+              <w:bottom w:val="single" w:color="D1D5DB" w:sz="1"/>
+              <w:right w:val="single" w:color="D1D5DB" w:sz="1"/>
+            </w:tcBorders>
+            <w:tcMar>
+              <w:top w:type="dxa" w:w="60"/>
+              <w:left w:type="dxa" w:w="110"/>
+              <w:bottom w:type="dxa" w:w="60"/>
+              <w:right w:type="dxa" w:w="110"/>
+            </w:tcMar>
+          </w:tcPr>
+          <w:p>
+            <w:pPr>
+              <w:spacing w:after="0" w:line="264"/>
+            </w:pPr>
+            <w:r>
+              <w:rPr>
+                <w:rFonts w:ascii="Arial" w:cs="Arial" w:eastAsia="Arial" w:hAnsi="Arial"/>
+                <w:sz w:val="19"/>
+                <w:szCs w:val="19"/>
+              </w:rPr>
+              <w:t xml:space="preserve">Vault database engine + Spring Cloud Vault</w:t>
+            </w:r>
+          </w:p>
+        </w:tc>
+        <w:tc>
+          <w:tcPr>
+            <w:tcW w:type="dxa" w:w="3160"/>
+            <w:tcBorders>
+              <w:top w:val="single" w:color="D1D5DB" w:sz="1"/>
+              <w:left w:val="single" w:color="D1D5DB" w:sz="1"/>
+              <w:bottom w:val="single" w:color="D1D5DB" w:sz="1"/>
+              <w:right w:val="single" w:color="D1D5DB" w:sz="1"/>
+            </w:tcBorders>
+            <w:tcMar>
+              <w:top w:type="dxa" w:w="60"/>
+              <w:left w:type="dxa" w:w="110"/>
+              <w:bottom w:type="dxa" w:w="60"/>
+              <w:right w:type="dxa" w:w="110"/>
+            </w:tcMar>
+          </w:tcPr>
+          <w:p>
+            <w:pPr>
+              <w:spacing w:after="0" w:line="264"/>
+            </w:pPr>
+            <w:r>
+              <w:rPr>
+                <w:rFonts w:ascii="Arial" w:cs="Arial" w:eastAsia="Arial" w:hAnsi="Arial"/>
+                <w:sz w:val="19"/>
+                <w:szCs w:val="19"/>
+              </w:rPr>
+              <w:t xml:space="preserve">Credenciales de BD efímeras generadas y rotadas por Vault</w:t>
+            </w:r>
+          </w:p>
+        </w:tc>
+      </w:tr>
+      <w:tr>
+        <w:trPr>
+          <w:tblHeader w:val="false"/>
+        </w:trPr>
+        <w:tc>
+          <w:tcPr>
+            <w:tcW w:type="dxa" w:w="2500"/>
+            <w:tcBorders>
+              <w:top w:val="single" w:color="D1D5DB" w:sz="1"/>
+              <w:left w:val="single" w:color="D1D5DB" w:sz="1"/>
+              <w:bottom w:val="single" w:color="D1D5DB" w:sz="1"/>
+              <w:right w:val="single" w:color="D1D5DB" w:sz="1"/>
+            </w:tcBorders>
+            <w:tcMar>
+              <w:top w:type="dxa" w:w="60"/>
+              <w:left w:type="dxa" w:w="110"/>
+              <w:bottom w:type="dxa" w:w="60"/>
+              <w:right w:type="dxa" w:w="110"/>
+            </w:tcMar>
+          </w:tcPr>
+          <w:p>
+            <w:pPr>
+              <w:spacing w:after="0" w:line="264"/>
+            </w:pPr>
+            <w:r>
+              <w:rPr>
+                <w:rFonts w:ascii="Arial" w:cs="Arial" w:eastAsia="Arial" w:hAnsi="Arial"/>
+                <w:sz w:val="19"/>
+                <w:szCs w:val="19"/>
+              </w:rPr>
+              <w:t xml:space="preserve">Contract governance gRPC (Buf)</w:t>
+            </w:r>
+          </w:p>
+        </w:tc>
+        <w:tc>
+          <w:tcPr>
+            <w:tcW w:type="dxa" w:w="3700"/>
+            <w:tcBorders>
+              <w:top w:val="single" w:color="D1D5DB" w:sz="1"/>
+              <w:left w:val="single" w:color="D1D5DB" w:sz="1"/>
+              <w:bottom w:val="single" w:color="D1D5DB" w:sz="1"/>
+              <w:right w:val="single" w:color="D1D5DB" w:sz="1"/>
+            </w:tcBorders>
+            <w:tcMar>
+              <w:top w:type="dxa" w:w="60"/>
+              <w:left w:type="dxa" w:w="110"/>
+              <w:bottom w:type="dxa" w:w="60"/>
+              <w:right w:type="dxa" w:w="110"/>
+            </w:tcMar>
+          </w:tcPr>
+          <w:p>
+            <w:pPr>
+              <w:spacing w:after="0" w:line="264"/>
+            </w:pPr>
+            <w:r>
+              <w:rPr>
+                <w:rFonts w:ascii="Arial" w:cs="Arial" w:eastAsia="Arial" w:hAnsi="Arial"/>
+                <w:sz w:val="19"/>
+                <w:szCs w:val="19"/>
+              </w:rPr>
+              <w:t xml:space="preserve">buf lint + buf breaking en CI</w:t>
+            </w:r>
+          </w:p>
+        </w:tc>
+        <w:tc>
+          <w:tcPr>
+            <w:tcW w:type="dxa" w:w="3160"/>
+            <w:tcBorders>
+              <w:top w:val="single" w:color="D1D5DB" w:sz="1"/>
+              <w:left w:val="single" w:color="D1D5DB" w:sz="1"/>
+              <w:bottom w:val="single" w:color="D1D5DB" w:sz="1"/>
+              <w:right w:val="single" w:color="D1D5DB" w:sz="1"/>
+            </w:tcBorders>
+            <w:tcMar>
+              <w:top w:type="dxa" w:w="60"/>
+              <w:left w:type="dxa" w:w="110"/>
+              <w:bottom w:type="dxa" w:w="60"/>
+              <w:right w:type="dxa" w:w="110"/>
+            </w:tcMar>
+          </w:tcPr>
+          <w:p>
+            <w:pPr>
+              <w:spacing w:after="0" w:line="264"/>
+            </w:pPr>
+            <w:r>
+              <w:rPr>
+                <w:rFonts w:ascii="Arial" w:cs="Arial" w:eastAsia="Arial" w:hAnsi="Arial"/>
+                <w:sz w:val="19"/>
+                <w:szCs w:val="19"/>
+              </w:rPr>
+              <w:t xml:space="preserve">Estilo y compatibilidad hacia atrás de los .proto</w:t>
+            </w:r>
+          </w:p>
+        </w:tc>
+      </w:tr>
+      <w:tr>
+        <w:trPr>
+          <w:tblHeader w:val="false"/>
+        </w:trPr>
+        <w:tc>
+          <w:tcPr>
+            <w:tcW w:type="dxa" w:w="2500"/>
+            <w:tcBorders>
+              <w:top w:val="single" w:color="D1D5DB" w:sz="1"/>
+              <w:left w:val="single" w:color="D1D5DB" w:sz="1"/>
+              <w:bottom w:val="single" w:color="D1D5DB" w:sz="1"/>
+              <w:right w:val="single" w:color="D1D5DB" w:sz="1"/>
+            </w:tcBorders>
+            <w:tcMar>
+              <w:top w:type="dxa" w:w="60"/>
+              <w:left w:type="dxa" w:w="110"/>
+              <w:bottom w:type="dxa" w:w="60"/>
+              <w:right w:type="dxa" w:w="110"/>
+            </w:tcMar>
+          </w:tcPr>
+          <w:p>
+            <w:pPr>
+              <w:spacing w:after="0" w:line="264"/>
+            </w:pPr>
+            <w:r>
+              <w:rPr>
+                <w:rFonts w:ascii="Arial" w:cs="Arial" w:eastAsia="Arial" w:hAnsi="Arial"/>
+                <w:sz w:val="19"/>
+                <w:szCs w:val="19"/>
+              </w:rPr>
+              <w:t xml:space="preserve">Tamper-evident audit log (hash chain)</w:t>
+            </w:r>
+          </w:p>
+        </w:tc>
+        <w:tc>
+          <w:tcPr>
+            <w:tcW w:type="dxa" w:w="3700"/>
+            <w:tcBorders>
+              <w:top w:val="single" w:color="D1D5DB" w:sz="1"/>
+              <w:left w:val="single" w:color="D1D5DB" w:sz="1"/>
+              <w:bottom w:val="single" w:color="D1D5DB" w:sz="1"/>
+              <w:right w:val="single" w:color="D1D5DB" w:sz="1"/>
+            </w:tcBorders>
+            <w:tcMar>
+              <w:top w:type="dxa" w:w="60"/>
+              <w:left w:type="dxa" w:w="110"/>
+              <w:bottom w:type="dxa" w:w="60"/>
+              <w:right w:type="dxa" w:w="110"/>
+            </w:tcMar>
+          </w:tcPr>
+          <w:p>
+            <w:pPr>
+              <w:spacing w:after="0" w:line="264"/>
+            </w:pPr>
+            <w:r>
+              <w:rPr>
+                <w:rFonts w:ascii="Arial" w:cs="Arial" w:eastAsia="Arial" w:hAnsi="Arial"/>
+                <w:sz w:val="19"/>
+                <w:szCs w:val="19"/>
+              </w:rPr>
+              <w:t xml:space="preserve">order: HashChainedAuditLog</w:t>
+            </w:r>
+          </w:p>
+        </w:tc>
+        <w:tc>
+          <w:tcPr>
+            <w:tcW w:type="dxa" w:w="3160"/>
+            <w:tcBorders>
+              <w:top w:val="single" w:color="D1D5DB" w:sz="1"/>
+              <w:left w:val="single" w:color="D1D5DB" w:sz="1"/>
+              <w:bottom w:val="single" w:color="D1D5DB" w:sz="1"/>
+              <w:right w:val="single" w:color="D1D5DB" w:sz="1"/>
+            </w:tcBorders>
+            <w:tcMar>
+              <w:top w:type="dxa" w:w="60"/>
+              <w:left w:type="dxa" w:w="110"/>
+              <w:bottom w:type="dxa" w:w="60"/>
+              <w:right w:type="dxa" w:w="110"/>
+            </w:tcMar>
+          </w:tcPr>
+          <w:p>
+            <w:pPr>
+              <w:spacing w:after="0" w:line="264"/>
+            </w:pPr>
+            <w:r>
+              <w:rPr>
+                <w:rFonts w:ascii="Arial" w:cs="Arial" w:eastAsia="Arial" w:hAnsi="Arial"/>
+                <w:sz w:val="19"/>
+                <w:szCs w:val="19"/>
+              </w:rPr>
+              <w:t xml:space="preserve">Registro append-only encadenado por hash; manipulación detectable</w:t>
+            </w:r>
+          </w:p>
+        </w:tc>
+      </w:tr>
+      <w:tr>
+        <w:trPr>
+          <w:tblHeader w:val="false"/>
+        </w:trPr>
+        <w:tc>
+          <w:tcPr>
+            <w:tcW w:type="dxa" w:w="2500"/>
+            <w:tcBorders>
+              <w:top w:val="single" w:color="D1D5DB" w:sz="1"/>
+              <w:left w:val="single" w:color="D1D5DB" w:sz="1"/>
+              <w:bottom w:val="single" w:color="D1D5DB" w:sz="1"/>
+              <w:right w:val="single" w:color="D1D5DB" w:sz="1"/>
+            </w:tcBorders>
+            <w:tcMar>
+              <w:top w:type="dxa" w:w="60"/>
+              <w:left w:type="dxa" w:w="110"/>
+              <w:bottom w:type="dxa" w:w="60"/>
+              <w:right w:type="dxa" w:w="110"/>
+            </w:tcMar>
+          </w:tcPr>
+          <w:p>
+            <w:pPr>
+              <w:spacing w:after="0" w:line="264"/>
+            </w:pPr>
+            <w:r>
+              <w:rPr>
+                <w:rFonts w:ascii="Arial" w:cs="Arial" w:eastAsia="Arial" w:hAnsi="Arial"/>
+                <w:sz w:val="19"/>
+                <w:szCs w:val="19"/>
+              </w:rPr>
+              <w:t xml:space="preserve">Chaos Engineering (fault injection)</w:t>
+            </w:r>
+          </w:p>
+        </w:tc>
+        <w:tc>
+          <w:tcPr>
+            <w:tcW w:type="dxa" w:w="3700"/>
+            <w:tcBorders>
+              <w:top w:val="single" w:color="D1D5DB" w:sz="1"/>
+              <w:left w:val="single" w:color="D1D5DB" w:sz="1"/>
+              <w:bottom w:val="single" w:color="D1D5DB" w:sz="1"/>
+              <w:right w:val="single" w:color="D1D5DB" w:sz="1"/>
+            </w:tcBorders>
+            <w:tcMar>
+              <w:top w:type="dxa" w:w="60"/>
+              <w:left w:type="dxa" w:w="110"/>
+              <w:bottom w:type="dxa" w:w="60"/>
+              <w:right w:type="dxa" w:w="110"/>
+            </w:tcMar>
+          </w:tcPr>
+          <w:p>
+            <w:pPr>
+              <w:spacing w:after="0" w:line="264"/>
+            </w:pPr>
+            <w:r>
+              <w:rPr>
+                <w:rFonts w:ascii="Arial" w:cs="Arial" w:eastAsia="Arial" w:hAnsi="Arial"/>
+                <w:sz w:val="19"/>
+                <w:szCs w:val="19"/>
+              </w:rPr>
+              <w:t xml:space="preserve">Toxiproxy (docker-compose.chaos.yml)</w:t>
+            </w:r>
+          </w:p>
+        </w:tc>
+        <w:tc>
+          <w:tcPr>
+            <w:tcW w:type="dxa" w:w="3160"/>
+            <w:tcBorders>
+              <w:top w:val="single" w:color="D1D5DB" w:sz="1"/>
+              <w:left w:val="single" w:color="D1D5DB" w:sz="1"/>
+              <w:bottom w:val="single" w:color="D1D5DB" w:sz="1"/>
+              <w:right w:val="single" w:color="D1D5DB" w:sz="1"/>
+            </w:tcBorders>
+            <w:tcMar>
+              <w:top w:type="dxa" w:w="60"/>
+              <w:left w:type="dxa" w:w="110"/>
+              <w:bottom w:type="dxa" w:w="60"/>
+              <w:right w:type="dxa" w:w="110"/>
+            </w:tcMar>
+          </w:tcPr>
+          <w:p>
+            <w:pPr>
+              <w:spacing w:after="0" w:line="264"/>
+            </w:pPr>
+            <w:r>
+              <w:rPr>
+                <w:rFonts w:ascii="Arial" w:cs="Arial" w:eastAsia="Arial" w:hAnsi="Arial"/>
+                <w:sz w:val="19"/>
+                <w:szCs w:val="19"/>
+              </w:rPr>
+              <w:t xml:space="preserve">Inyectar latencia/cortes reales para probar la resiliencia</w:t>
+            </w:r>
+          </w:p>
+        </w:tc>
+      </w:tr>
+      <w:tr>
+        <w:trPr>
+          <w:tblHeader w:val="false"/>
+        </w:trPr>
+        <w:tc>
+          <w:tcPr>
+            <w:tcW w:type="dxa" w:w="2500"/>
+            <w:tcBorders>
+              <w:top w:val="single" w:color="D1D5DB" w:sz="1"/>
+              <w:left w:val="single" w:color="D1D5DB" w:sz="1"/>
+              <w:bottom w:val="single" w:color="D1D5DB" w:sz="1"/>
+              <w:right w:val="single" w:color="D1D5DB" w:sz="1"/>
+            </w:tcBorders>
+            <w:tcMar>
+              <w:top w:type="dxa" w:w="60"/>
+              <w:left w:type="dxa" w:w="110"/>
+              <w:bottom w:type="dxa" w:w="60"/>
+              <w:right w:type="dxa" w:w="110"/>
+            </w:tcMar>
+          </w:tcPr>
+          <w:p>
+            <w:pPr>
+              <w:spacing w:after="0" w:line="264"/>
+            </w:pPr>
+            <w:r>
+              <w:rPr>
+                <w:rFonts w:ascii="Arial" w:cs="Arial" w:eastAsia="Arial" w:hAnsi="Arial"/>
+                <w:sz w:val="19"/>
+                <w:szCs w:val="19"/>
+              </w:rPr>
+              <w:t xml:space="preserve">Phishing-resistant auth (WebAuthn/FIDO2)</w:t>
+            </w:r>
+          </w:p>
+        </w:tc>
+        <w:tc>
+          <w:tcPr>
+            <w:tcW w:type="dxa" w:w="3700"/>
+            <w:tcBorders>
+              <w:top w:val="single" w:color="D1D5DB" w:sz="1"/>
+              <w:left w:val="single" w:color="D1D5DB" w:sz="1"/>
+              <w:bottom w:val="single" w:color="D1D5DB" w:sz="1"/>
+              <w:right w:val="single" w:color="D1D5DB" w:sz="1"/>
+            </w:tcBorders>
+            <w:tcMar>
+              <w:top w:type="dxa" w:w="60"/>
+              <w:left w:type="dxa" w:w="110"/>
+              <w:bottom w:type="dxa" w:w="60"/>
+              <w:right w:type="dxa" w:w="110"/>
+            </w:tcMar>
+          </w:tcPr>
+          <w:p>
+            <w:pPr>
+              <w:spacing w:after="0" w:line="264"/>
+            </w:pPr>
+            <w:r>
+              <w:rPr>
+                <w:rFonts w:ascii="Arial" w:cs="Arial" w:eastAsia="Arial" w:hAnsi="Arial"/>
+                <w:sz w:val="19"/>
+                <w:szCs w:val="19"/>
+              </w:rPr>
+              <w:t xml:space="preserve">auth: WebAuthnAssertionVerifier</w:t>
+            </w:r>
+          </w:p>
+        </w:tc>
+        <w:tc>
+          <w:tcPr>
+            <w:tcW w:type="dxa" w:w="3160"/>
+            <w:tcBorders>
+              <w:top w:val="single" w:color="D1D5DB" w:sz="1"/>
+              <w:left w:val="single" w:color="D1D5DB" w:sz="1"/>
+              <w:bottom w:val="single" w:color="D1D5DB" w:sz="1"/>
+              <w:right w:val="single" w:color="D1D5DB" w:sz="1"/>
+            </w:tcBorders>
+            <w:tcMar>
+              <w:top w:type="dxa" w:w="60"/>
+              <w:left w:type="dxa" w:w="110"/>
+              <w:bottom w:type="dxa" w:w="60"/>
+              <w:right w:type="dxa" w:w="110"/>
+            </w:tcMar>
+          </w:tcPr>
+          <w:p>
+            <w:pPr>
+              <w:spacing w:after="0" w:line="264"/>
+            </w:pPr>
+            <w:r>
+              <w:rPr>
+                <w:rFonts w:ascii="Arial" w:cs="Arial" w:eastAsia="Arial" w:hAnsi="Arial"/>
+                <w:sz w:val="19"/>
+                <w:szCs w:val="19"/>
+              </w:rPr>
+              <w:t xml:space="preserve">Login por firma de clave privada; el origin va firmado</w:t>
             </w:r>
           </w:p>
         </w:tc>

</xml_diff>

<commit_message>
feat(k8s): NetworkPolicy, PDB, RBAC, CronJob backups, Prometheus Operator + CI de validacion
</commit_message>
<xml_diff>
--- a/BookPlus-Stack-Tecnologico.docx
+++ b/BookPlus-Stack-Tecnologico.docx
@@ -31608,6 +31608,97 @@
           <w:b/>
           <w:bCs/>
         </w:rPr>
+        <w:t xml:space="preserve">RBAC y agentes de nodo: </w:t>
+      </w:r>
+      <w:r>
+        <w:rPr>
+          <w:rFonts w:ascii="Arial" w:cs="Arial" w:eastAsia="Arial" w:hAnsi="Arial"/>
+        </w:rPr>
+        <w:t xml:space="preserve">cada app usa una </w:t>
+      </w:r>
+      <w:r>
+        <w:rPr>
+          <w:rFonts w:ascii="Arial" w:cs="Arial" w:eastAsia="Arial" w:hAnsi="Arial"/>
+          <w:b/>
+          <w:bCs/>
+        </w:rPr>
+        <w:t xml:space="preserve">ServiceAccount</w:t>
+      </w:r>
+      <w:r>
+        <w:rPr>
+          <w:rFonts w:ascii="Arial" w:cs="Arial" w:eastAsia="Arial" w:hAnsi="Arial"/>
+        </w:rPr>
+        <w:t xml:space="preserve"> de minimo privilegio (</w:t>
+      </w:r>
+      <w:r>
+        <w:rPr>
+          <w:rFonts w:ascii="Consolas" w:cs="Consolas" w:eastAsia="Consolas" w:hAnsi="Consolas"/>
+          <w:color w:val="4F46E5"/>
+        </w:rPr>
+        <w:t xml:space="preserve">Role</w:t>
+      </w:r>
+      <w:r>
+        <w:rPr>
+          <w:rFonts w:ascii="Arial" w:cs="Arial" w:eastAsia="Arial" w:hAnsi="Arial"/>
+        </w:rPr>
+        <w:t xml:space="preserve">/</w:t>
+      </w:r>
+      <w:r>
+        <w:rPr>
+          <w:rFonts w:ascii="Consolas" w:cs="Consolas" w:eastAsia="Consolas" w:hAnsi="Consolas"/>
+          <w:color w:val="4F46E5"/>
+        </w:rPr>
+        <w:t xml:space="preserve">RoleBinding</w:t>
+      </w:r>
+      <w:r>
+        <w:rPr>
+          <w:rFonts w:ascii="Arial" w:cs="Arial" w:eastAsia="Arial" w:hAnsi="Arial"/>
+        </w:rPr>
+        <w:t xml:space="preserve"> de solo lectura), y los logs se recogen con un </w:t>
+      </w:r>
+      <w:r>
+        <w:rPr>
+          <w:rFonts w:ascii="Arial" w:cs="Arial" w:eastAsia="Arial" w:hAnsi="Arial"/>
+          <w:b/>
+          <w:bCs/>
+        </w:rPr>
+        <w:t xml:space="preserve">DaemonSet</w:t>
+      </w:r>
+      <w:r>
+        <w:rPr>
+          <w:rFonts w:ascii="Arial" w:cs="Arial" w:eastAsia="Arial" w:hAnsi="Arial"/>
+        </w:rPr>
+        <w:t xml:space="preserve"> (</w:t>
+      </w:r>
+      <w:r>
+        <w:rPr>
+          <w:rFonts w:ascii="Consolas" w:cs="Consolas" w:eastAsia="Consolas" w:hAnsi="Consolas"/>
+          <w:color w:val="4F46E5"/>
+        </w:rPr>
+        <w:t xml:space="preserve">Promtail</w:t>
+      </w:r>
+      <w:r>
+        <w:rPr>
+          <w:rFonts w:ascii="Arial" w:cs="Arial" w:eastAsia="Arial" w:hAnsi="Arial"/>
+        </w:rPr>
+        <w:t xml:space="preserve">) que corre un pod en cada nodo y los envia a Loki.</w:t>
+      </w:r>
+    </w:p>
+    <w:p>
+      <w:pPr>
+        <w:pStyle w:val="ListParagraph"/>
+        <w:numPr>
+          <w:ilvl w:val="0"/>
+          <w:numId w:val="2"/>
+        </w:numPr>
+        <w:spacing w:after="80" w:line="268"/>
+      </w:pPr>
+      <w:r>
+        <w:rPr>
+          <w:rFonts w:ascii="Arial" w:cs="Arial" w:eastAsia="Arial" w:hAnsi="Arial"/>
+          <w:b/>
+          <w:bCs/>
+        </w:rPr>
         <w:t xml:space="preserve">Secretos y datos: </w:t>
       </w:r>
       <w:r>
@@ -32685,6 +32776,4854 @@
           <w:color w:val="4F46E5"/>
         </w:rPr>
         <w:t xml:space="preserve">k8s/README.md</w:t>
+      </w:r>
+      <w:r>
+        <w:rPr>
+          <w:rFonts w:ascii="Arial" w:cs="Arial" w:eastAsia="Arial" w:hAnsi="Arial"/>
+        </w:rPr>
+        <w:t xml:space="preserve">.</w:t>
+      </w:r>
+    </w:p>
+    <w:p>
+      <w:pPr>
+        <w:pStyle w:val="Heading2"/>
+      </w:pPr>
+      <w:r>
+        <w:rPr>
+          <w:rFonts w:ascii="Arial" w:cs="Arial" w:eastAsia="Arial" w:hAnsi="Arial"/>
+        </w:rPr>
+        <w:t xml:space="preserve">17.1 Inventario de manifiestos generados</w:t>
+      </w:r>
+    </w:p>
+    <w:p>
+      <w:pPr>
+        <w:spacing w:after="120" w:line="276"/>
+      </w:pPr>
+      <w:r>
+        <w:rPr>
+          <w:rFonts w:ascii="Arial" w:cs="Arial" w:eastAsia="Arial" w:hAnsi="Arial"/>
+        </w:rPr>
+        <w:t xml:space="preserve">Todos los manifiestos se generan desde el compose con </w:t>
+      </w:r>
+      <w:r>
+        <w:rPr>
+          <w:rFonts w:ascii="Consolas" w:cs="Consolas" w:eastAsia="Consolas" w:hAnsi="Consolas"/>
+          <w:color w:val="4F46E5"/>
+        </w:rPr>
+        <w:t xml:space="preserve">k8s/generate.py</w:t>
+      </w:r>
+      <w:r>
+        <w:rPr>
+          <w:rFonts w:ascii="Arial" w:cs="Arial" w:eastAsia="Arial" w:hAnsi="Arial"/>
+        </w:rPr>
+        <w:t xml:space="preserve"> y se validan contra el esquema de Kubernetes (130 recursos, 0 fallos). Resumen por tipo:</w:t>
+      </w:r>
+    </w:p>
+    <w:p>
+      <w:pPr>
+        <w:pBdr>
+          <w:left w:val="single" w:color="CBD5E1" w:sz="16" w:space="8"/>
+        </w:pBdr>
+        <w:shd w:fill="F3F4F6" w:val="clear"/>
+        <w:spacing w:after="0" w:before="40" w:line="240"/>
+        <w:ind w:left="120"/>
+      </w:pPr>
+      <w:r>
+        <w:rPr>
+          <w:rFonts w:ascii="Consolas" w:cs="Consolas" w:eastAsia="Consolas" w:hAnsi="Consolas"/>
+          <w:color w:val="0F172A"/>
+          <w:sz w:val="17"/>
+          <w:szCs w:val="17"/>
+        </w:rPr>
+        <w:t xml:space="preserve">Deployment            23      HorizontalPodAutoscaler  10</w:t>
+      </w:r>
+    </w:p>
+    <w:p>
+      <w:pPr>
+        <w:pBdr>
+          <w:left w:val="single" w:color="CBD5E1" w:sz="16" w:space="8"/>
+        </w:pBdr>
+        <w:shd w:fill="F3F4F6" w:val="clear"/>
+        <w:spacing w:after="0" w:before="0" w:line="240"/>
+        <w:ind w:left="120"/>
+      </w:pPr>
+      <w:r>
+        <w:rPr>
+          <w:rFonts w:ascii="Consolas" w:cs="Consolas" w:eastAsia="Consolas" w:hAnsi="Consolas"/>
+          <w:color w:val="0F172A"/>
+          <w:sz w:val="17"/>
+          <w:szCs w:val="17"/>
+        </w:rPr>
+        <w:t xml:space="preserve">Service               32      PodDisruptionBudget      10</w:t>
+      </w:r>
+    </w:p>
+    <w:p>
+      <w:pPr>
+        <w:pBdr>
+          <w:left w:val="single" w:color="CBD5E1" w:sz="16" w:space="8"/>
+        </w:pBdr>
+        <w:shd w:fill="F3F4F6" w:val="clear"/>
+        <w:spacing w:after="0" w:before="0" w:line="240"/>
+        <w:ind w:left="120"/>
+      </w:pPr>
+      <w:r>
+        <w:rPr>
+          <w:rFonts w:ascii="Consolas" w:cs="Consolas" w:eastAsia="Consolas" w:hAnsi="Consolas"/>
+          <w:color w:val="0F172A"/>
+          <w:sz w:val="17"/>
+          <w:szCs w:val="17"/>
+        </w:rPr>
+        <w:t xml:space="preserve">StatefulSet            9      NetworkPolicy             3</w:t>
+      </w:r>
+    </w:p>
+    <w:p>
+      <w:pPr>
+        <w:pBdr>
+          <w:left w:val="single" w:color="CBD5E1" w:sz="16" w:space="8"/>
+        </w:pBdr>
+        <w:shd w:fill="F3F4F6" w:val="clear"/>
+        <w:spacing w:after="0" w:before="0" w:line="240"/>
+        <w:ind w:left="120"/>
+      </w:pPr>
+      <w:r>
+        <w:rPr>
+          <w:rFonts w:ascii="Consolas" w:cs="Consolas" w:eastAsia="Consolas" w:hAnsi="Consolas"/>
+          <w:color w:val="0F172A"/>
+          <w:sz w:val="17"/>
+          <w:szCs w:val="17"/>
+        </w:rPr>
+        <w:t xml:space="preserve">ConfigMap             15      ServiceAccount            2</w:t>
+      </w:r>
+    </w:p>
+    <w:p>
+      <w:pPr>
+        <w:pBdr>
+          <w:left w:val="single" w:color="CBD5E1" w:sz="16" w:space="8"/>
+        </w:pBdr>
+        <w:shd w:fill="F3F4F6" w:val="clear"/>
+        <w:spacing w:after="0" w:before="0" w:line="240"/>
+        <w:ind w:left="120"/>
+      </w:pPr>
+      <w:r>
+        <w:rPr>
+          <w:rFonts w:ascii="Consolas" w:cs="Consolas" w:eastAsia="Consolas" w:hAnsi="Consolas"/>
+          <w:color w:val="0F172A"/>
+          <w:sz w:val="17"/>
+          <w:szCs w:val="17"/>
+        </w:rPr>
+        <w:t xml:space="preserve">Secret                19      Role / RoleBinding        1 / 1</w:t>
+      </w:r>
+    </w:p>
+    <w:p>
+      <w:pPr>
+        <w:pBdr>
+          <w:left w:val="single" w:color="CBD5E1" w:sz="16" w:space="8"/>
+        </w:pBdr>
+        <w:shd w:fill="F3F4F6" w:val="clear"/>
+        <w:spacing w:after="0" w:before="0" w:line="240"/>
+        <w:ind w:left="120"/>
+      </w:pPr>
+      <w:r>
+        <w:rPr>
+          <w:rFonts w:ascii="Consolas" w:cs="Consolas" w:eastAsia="Consolas" w:hAnsi="Consolas"/>
+          <w:color w:val="0F172A"/>
+          <w:sz w:val="17"/>
+          <w:szCs w:val="17"/>
+        </w:rPr>
+        <w:t xml:space="preserve">Namespace              1      ClusterRole / Binding     1 / 1</w:t>
+      </w:r>
+    </w:p>
+    <w:p>
+      <w:pPr>
+        <w:pBdr>
+          <w:left w:val="single" w:color="CBD5E1" w:sz="16" w:space="8"/>
+        </w:pBdr>
+        <w:shd w:fill="F3F4F6" w:val="clear"/>
+        <w:spacing w:after="150" w:before="0" w:line="240"/>
+        <w:ind w:left="120"/>
+      </w:pPr>
+      <w:r>
+        <w:rPr>
+          <w:rFonts w:ascii="Consolas" w:cs="Consolas" w:eastAsia="Consolas" w:hAnsi="Consolas"/>
+          <w:color w:val="0F172A"/>
+          <w:sz w:val="17"/>
+          <w:szCs w:val="17"/>
+        </w:rPr>
+        <w:t xml:space="preserve">Ingress                1      DaemonSet                 1  (Promtail)</w:t>
+      </w:r>
+    </w:p>
+    <w:p>
+      <w:pPr>
+        <w:pStyle w:val="Heading2"/>
+      </w:pPr>
+      <w:r>
+        <w:rPr>
+          <w:rFonts w:ascii="Arial" w:cs="Arial" w:eastAsia="Arial" w:hAnsi="Arial"/>
+        </w:rPr>
+        <w:t xml:space="preserve">17.2 Namespace, ConfigMap y Secret</w:t>
+      </w:r>
+    </w:p>
+    <w:p>
+      <w:pPr>
+        <w:pBdr>
+          <w:left w:val="single" w:color="CBD5E1" w:sz="16" w:space="8"/>
+        </w:pBdr>
+        <w:shd w:fill="F3F4F6" w:val="clear"/>
+        <w:spacing w:after="0" w:before="40" w:line="240"/>
+        <w:ind w:left="120"/>
+      </w:pPr>
+      <w:r>
+        <w:rPr>
+          <w:rFonts w:ascii="Consolas" w:cs="Consolas" w:eastAsia="Consolas" w:hAnsi="Consolas"/>
+          <w:color w:val="0F172A"/>
+          <w:sz w:val="17"/>
+          <w:szCs w:val="17"/>
+        </w:rPr>
+        <w:t xml:space="preserve">apiVersion: v1</w:t>
+      </w:r>
+    </w:p>
+    <w:p>
+      <w:pPr>
+        <w:pBdr>
+          <w:left w:val="single" w:color="CBD5E1" w:sz="16" w:space="8"/>
+        </w:pBdr>
+        <w:shd w:fill="F3F4F6" w:val="clear"/>
+        <w:spacing w:after="0" w:before="0" w:line="240"/>
+        <w:ind w:left="120"/>
+      </w:pPr>
+      <w:r>
+        <w:rPr>
+          <w:rFonts w:ascii="Consolas" w:cs="Consolas" w:eastAsia="Consolas" w:hAnsi="Consolas"/>
+          <w:color w:val="0F172A"/>
+          <w:sz w:val="17"/>
+          <w:szCs w:val="17"/>
+        </w:rPr>
+        <w:t xml:space="preserve">kind: Namespace</w:t>
+      </w:r>
+    </w:p>
+    <w:p>
+      <w:pPr>
+        <w:pBdr>
+          <w:left w:val="single" w:color="CBD5E1" w:sz="16" w:space="8"/>
+        </w:pBdr>
+        <w:shd w:fill="F3F4F6" w:val="clear"/>
+        <w:spacing w:after="0" w:before="0" w:line="240"/>
+        <w:ind w:left="120"/>
+      </w:pPr>
+      <w:r>
+        <w:rPr>
+          <w:rFonts w:ascii="Consolas" w:cs="Consolas" w:eastAsia="Consolas" w:hAnsi="Consolas"/>
+          <w:color w:val="0F172A"/>
+          <w:sz w:val="17"/>
+          <w:szCs w:val="17"/>
+        </w:rPr>
+        <w:t xml:space="preserve">metadata: { name: bookplus }</w:t>
+      </w:r>
+    </w:p>
+    <w:p>
+      <w:pPr>
+        <w:pBdr>
+          <w:left w:val="single" w:color="CBD5E1" w:sz="16" w:space="8"/>
+        </w:pBdr>
+        <w:shd w:fill="F3F4F6" w:val="clear"/>
+        <w:spacing w:after="0" w:before="0" w:line="240"/>
+        <w:ind w:left="120"/>
+      </w:pPr>
+      <w:r>
+        <w:rPr>
+          <w:rFonts w:ascii="Consolas" w:cs="Consolas" w:eastAsia="Consolas" w:hAnsi="Consolas"/>
+          <w:color w:val="0F172A"/>
+          <w:sz w:val="17"/>
+          <w:szCs w:val="17"/>
+        </w:rPr>
+        <w:t xml:space="preserve">---</w:t>
+      </w:r>
+    </w:p>
+    <w:p>
+      <w:pPr>
+        <w:pBdr>
+          <w:left w:val="single" w:color="CBD5E1" w:sz="16" w:space="8"/>
+        </w:pBdr>
+        <w:shd w:fill="F3F4F6" w:val="clear"/>
+        <w:spacing w:after="0" w:before="0" w:line="240"/>
+        <w:ind w:left="120"/>
+      </w:pPr>
+      <w:r>
+        <w:rPr>
+          <w:rFonts w:ascii="Consolas" w:cs="Consolas" w:eastAsia="Consolas" w:hAnsi="Consolas"/>
+          <w:color w:val="0F172A"/>
+          <w:sz w:val="17"/>
+          <w:szCs w:val="17"/>
+        </w:rPr>
+        <w:t xml:space="preserve">apiVersion: v1</w:t>
+      </w:r>
+    </w:p>
+    <w:p>
+      <w:pPr>
+        <w:pBdr>
+          <w:left w:val="single" w:color="CBD5E1" w:sz="16" w:space="8"/>
+        </w:pBdr>
+        <w:shd w:fill="F3F4F6" w:val="clear"/>
+        <w:spacing w:after="0" w:before="0" w:line="240"/>
+        <w:ind w:left="120"/>
+      </w:pPr>
+      <w:r>
+        <w:rPr>
+          <w:rFonts w:ascii="Consolas" w:cs="Consolas" w:eastAsia="Consolas" w:hAnsi="Consolas"/>
+          <w:color w:val="0F172A"/>
+          <w:sz w:val="17"/>
+          <w:szCs w:val="17"/>
+        </w:rPr>
+        <w:t xml:space="preserve">kind: ConfigMap                 # configuracion NO sensible (envFrom)</w:t>
+      </w:r>
+    </w:p>
+    <w:p>
+      <w:pPr>
+        <w:pBdr>
+          <w:left w:val="single" w:color="CBD5E1" w:sz="16" w:space="8"/>
+        </w:pBdr>
+        <w:shd w:fill="F3F4F6" w:val="clear"/>
+        <w:spacing w:after="0" w:before="0" w:line="240"/>
+        <w:ind w:left="120"/>
+      </w:pPr>
+      <w:r>
+        <w:rPr>
+          <w:rFonts w:ascii="Consolas" w:cs="Consolas" w:eastAsia="Consolas" w:hAnsi="Consolas"/>
+          <w:color w:val="0F172A"/>
+          <w:sz w:val="17"/>
+          <w:szCs w:val="17"/>
+        </w:rPr>
+        <w:t xml:space="preserve">metadata: { name: auth-service-config }</w:t>
+      </w:r>
+    </w:p>
+    <w:p>
+      <w:pPr>
+        <w:pBdr>
+          <w:left w:val="single" w:color="CBD5E1" w:sz="16" w:space="8"/>
+        </w:pBdr>
+        <w:shd w:fill="F3F4F6" w:val="clear"/>
+        <w:spacing w:after="0" w:before="0" w:line="240"/>
+        <w:ind w:left="120"/>
+      </w:pPr>
+      <w:r>
+        <w:rPr>
+          <w:rFonts w:ascii="Consolas" w:cs="Consolas" w:eastAsia="Consolas" w:hAnsi="Consolas"/>
+          <w:color w:val="0F172A"/>
+          <w:sz w:val="17"/>
+          <w:szCs w:val="17"/>
+        </w:rPr>
+        <w:t xml:space="preserve">data:</w:t>
+      </w:r>
+    </w:p>
+    <w:p>
+      <w:pPr>
+        <w:pBdr>
+          <w:left w:val="single" w:color="CBD5E1" w:sz="16" w:space="8"/>
+        </w:pBdr>
+        <w:shd w:fill="F3F4F6" w:val="clear"/>
+        <w:spacing w:after="0" w:before="0" w:line="240"/>
+        <w:ind w:left="120"/>
+      </w:pPr>
+      <w:r>
+        <w:rPr>
+          <w:rFonts w:ascii="Consolas" w:cs="Consolas" w:eastAsia="Consolas" w:hAnsi="Consolas"/>
+          <w:color w:val="0F172A"/>
+          <w:sz w:val="17"/>
+          <w:szCs w:val="17"/>
+        </w:rPr>
+        <w:t xml:space="preserve">  DB_HOST: auth-postgres</w:t>
+      </w:r>
+    </w:p>
+    <w:p>
+      <w:pPr>
+        <w:pBdr>
+          <w:left w:val="single" w:color="CBD5E1" w:sz="16" w:space="8"/>
+        </w:pBdr>
+        <w:shd w:fill="F3F4F6" w:val="clear"/>
+        <w:spacing w:after="0" w:before="0" w:line="240"/>
+        <w:ind w:left="120"/>
+      </w:pPr>
+      <w:r>
+        <w:rPr>
+          <w:rFonts w:ascii="Consolas" w:cs="Consolas" w:eastAsia="Consolas" w:hAnsi="Consolas"/>
+          <w:color w:val="0F172A"/>
+          <w:sz w:val="17"/>
+          <w:szCs w:val="17"/>
+        </w:rPr>
+        <w:t xml:space="preserve">  KAFKA_BOOTSTRAP_SERVERS: kafka:9092</w:t>
+      </w:r>
+    </w:p>
+    <w:p>
+      <w:pPr>
+        <w:pBdr>
+          <w:left w:val="single" w:color="CBD5E1" w:sz="16" w:space="8"/>
+        </w:pBdr>
+        <w:shd w:fill="F3F4F6" w:val="clear"/>
+        <w:spacing w:after="0" w:before="0" w:line="240"/>
+        <w:ind w:left="120"/>
+      </w:pPr>
+      <w:r>
+        <w:rPr>
+          <w:rFonts w:ascii="Consolas" w:cs="Consolas" w:eastAsia="Consolas" w:hAnsi="Consolas"/>
+          <w:color w:val="0F172A"/>
+          <w:sz w:val="17"/>
+          <w:szCs w:val="17"/>
+        </w:rPr>
+        <w:t xml:space="preserve">  MANAGEMENT_OTLP_TRACING_ENDPOINT: http://otel-collector:4318/v1/traces</w:t>
+      </w:r>
+    </w:p>
+    <w:p>
+      <w:pPr>
+        <w:pBdr>
+          <w:left w:val="single" w:color="CBD5E1" w:sz="16" w:space="8"/>
+        </w:pBdr>
+        <w:shd w:fill="F3F4F6" w:val="clear"/>
+        <w:spacing w:after="0" w:before="0" w:line="240"/>
+        <w:ind w:left="120"/>
+      </w:pPr>
+      <w:r>
+        <w:rPr>
+          <w:rFonts w:ascii="Consolas" w:cs="Consolas" w:eastAsia="Consolas" w:hAnsi="Consolas"/>
+          <w:color w:val="0F172A"/>
+          <w:sz w:val="17"/>
+          <w:szCs w:val="17"/>
+        </w:rPr>
+        <w:t xml:space="preserve">---</w:t>
+      </w:r>
+    </w:p>
+    <w:p>
+      <w:pPr>
+        <w:pBdr>
+          <w:left w:val="single" w:color="CBD5E1" w:sz="16" w:space="8"/>
+        </w:pBdr>
+        <w:shd w:fill="F3F4F6" w:val="clear"/>
+        <w:spacing w:after="0" w:before="0" w:line="240"/>
+        <w:ind w:left="120"/>
+      </w:pPr>
+      <w:r>
+        <w:rPr>
+          <w:rFonts w:ascii="Consolas" w:cs="Consolas" w:eastAsia="Consolas" w:hAnsi="Consolas"/>
+          <w:color w:val="0F172A"/>
+          <w:sz w:val="17"/>
+          <w:szCs w:val="17"/>
+        </w:rPr>
+        <w:t xml:space="preserve">apiVersion: v1</w:t>
+      </w:r>
+    </w:p>
+    <w:p>
+      <w:pPr>
+        <w:pBdr>
+          <w:left w:val="single" w:color="CBD5E1" w:sz="16" w:space="8"/>
+        </w:pBdr>
+        <w:shd w:fill="F3F4F6" w:val="clear"/>
+        <w:spacing w:after="0" w:before="0" w:line="240"/>
+        <w:ind w:left="120"/>
+      </w:pPr>
+      <w:r>
+        <w:rPr>
+          <w:rFonts w:ascii="Consolas" w:cs="Consolas" w:eastAsia="Consolas" w:hAnsi="Consolas"/>
+          <w:color w:val="0F172A"/>
+          <w:sz w:val="17"/>
+          <w:szCs w:val="17"/>
+        </w:rPr>
+        <w:t xml:space="preserve">kind: Secret                    # sensible: claves JWT y contrasenas</w:t>
+      </w:r>
+    </w:p>
+    <w:p>
+      <w:pPr>
+        <w:pBdr>
+          <w:left w:val="single" w:color="CBD5E1" w:sz="16" w:space="8"/>
+        </w:pBdr>
+        <w:shd w:fill="F3F4F6" w:val="clear"/>
+        <w:spacing w:after="0" w:before="0" w:line="240"/>
+        <w:ind w:left="120"/>
+      </w:pPr>
+      <w:r>
+        <w:rPr>
+          <w:rFonts w:ascii="Consolas" w:cs="Consolas" w:eastAsia="Consolas" w:hAnsi="Consolas"/>
+          <w:color w:val="0F172A"/>
+          <w:sz w:val="17"/>
+          <w:szCs w:val="17"/>
+        </w:rPr>
+        <w:t xml:space="preserve">metadata: { name: auth-service-secret }</w:t>
+      </w:r>
+    </w:p>
+    <w:p>
+      <w:pPr>
+        <w:pBdr>
+          <w:left w:val="single" w:color="CBD5E1" w:sz="16" w:space="8"/>
+        </w:pBdr>
+        <w:shd w:fill="F3F4F6" w:val="clear"/>
+        <w:spacing w:after="0" w:before="0" w:line="240"/>
+        <w:ind w:left="120"/>
+      </w:pPr>
+      <w:r>
+        <w:rPr>
+          <w:rFonts w:ascii="Consolas" w:cs="Consolas" w:eastAsia="Consolas" w:hAnsi="Consolas"/>
+          <w:color w:val="0F172A"/>
+          <w:sz w:val="17"/>
+          <w:szCs w:val="17"/>
+        </w:rPr>
+        <w:t xml:space="preserve">type: Opaque</w:t>
+      </w:r>
+    </w:p>
+    <w:p>
+      <w:pPr>
+        <w:pBdr>
+          <w:left w:val="single" w:color="CBD5E1" w:sz="16" w:space="8"/>
+        </w:pBdr>
+        <w:shd w:fill="F3F4F6" w:val="clear"/>
+        <w:spacing w:after="0" w:before="0" w:line="240"/>
+        <w:ind w:left="120"/>
+      </w:pPr>
+      <w:r>
+        <w:rPr>
+          <w:rFonts w:ascii="Consolas" w:cs="Consolas" w:eastAsia="Consolas" w:hAnsi="Consolas"/>
+          <w:color w:val="0F172A"/>
+          <w:sz w:val="17"/>
+          <w:szCs w:val="17"/>
+        </w:rPr>
+        <w:t xml:space="preserve">stringData:</w:t>
+      </w:r>
+    </w:p>
+    <w:p>
+      <w:pPr>
+        <w:pBdr>
+          <w:left w:val="single" w:color="CBD5E1" w:sz="16" w:space="8"/>
+        </w:pBdr>
+        <w:shd w:fill="F3F4F6" w:val="clear"/>
+        <w:spacing w:after="0" w:before="0" w:line="240"/>
+        <w:ind w:left="120"/>
+      </w:pPr>
+      <w:r>
+        <w:rPr>
+          <w:rFonts w:ascii="Consolas" w:cs="Consolas" w:eastAsia="Consolas" w:hAnsi="Consolas"/>
+          <w:color w:val="0F172A"/>
+          <w:sz w:val="17"/>
+          <w:szCs w:val="17"/>
+        </w:rPr>
+        <w:t xml:space="preserve">  DB_PASS: REPLACE_WITH_BASE64_VALUE</w:t>
+      </w:r>
+    </w:p>
+    <w:p>
+      <w:pPr>
+        <w:pBdr>
+          <w:left w:val="single" w:color="CBD5E1" w:sz="16" w:space="8"/>
+        </w:pBdr>
+        <w:shd w:fill="F3F4F6" w:val="clear"/>
+        <w:spacing w:after="150" w:before="0" w:line="240"/>
+        <w:ind w:left="120"/>
+      </w:pPr>
+      <w:r>
+        <w:rPr>
+          <w:rFonts w:ascii="Consolas" w:cs="Consolas" w:eastAsia="Consolas" w:hAnsi="Consolas"/>
+          <w:color w:val="0F172A"/>
+          <w:sz w:val="17"/>
+          <w:szCs w:val="17"/>
+        </w:rPr>
+        <w:t xml:space="preserve">  APP_SECURITY_JWT_PRIVATE_KEY: REPLACE_WITH_BASE64_VALUE</w:t>
+      </w:r>
+    </w:p>
+    <w:p>
+      <w:pPr>
+        <w:pStyle w:val="Heading2"/>
+      </w:pPr>
+      <w:r>
+        <w:rPr>
+          <w:rFonts w:ascii="Arial" w:cs="Arial" w:eastAsia="Arial" w:hAnsi="Arial"/>
+        </w:rPr>
+        <w:t xml:space="preserve">17.3 Deployment (con probes, envFrom, ServiceAccount y limites)</w:t>
+      </w:r>
+    </w:p>
+    <w:p>
+      <w:pPr>
+        <w:pBdr>
+          <w:left w:val="single" w:color="CBD5E1" w:sz="16" w:space="8"/>
+        </w:pBdr>
+        <w:shd w:fill="F3F4F6" w:val="clear"/>
+        <w:spacing w:after="0" w:before="40" w:line="240"/>
+        <w:ind w:left="120"/>
+      </w:pPr>
+      <w:r>
+        <w:rPr>
+          <w:rFonts w:ascii="Consolas" w:cs="Consolas" w:eastAsia="Consolas" w:hAnsi="Consolas"/>
+          <w:color w:val="0F172A"/>
+          <w:sz w:val="17"/>
+          <w:szCs w:val="17"/>
+        </w:rPr>
+        <w:t xml:space="preserve">apiVersion: apps/v1</w:t>
+      </w:r>
+    </w:p>
+    <w:p>
+      <w:pPr>
+        <w:pBdr>
+          <w:left w:val="single" w:color="CBD5E1" w:sz="16" w:space="8"/>
+        </w:pBdr>
+        <w:shd w:fill="F3F4F6" w:val="clear"/>
+        <w:spacing w:after="0" w:before="0" w:line="240"/>
+        <w:ind w:left="120"/>
+      </w:pPr>
+      <w:r>
+        <w:rPr>
+          <w:rFonts w:ascii="Consolas" w:cs="Consolas" w:eastAsia="Consolas" w:hAnsi="Consolas"/>
+          <w:color w:val="0F172A"/>
+          <w:sz w:val="17"/>
+          <w:szCs w:val="17"/>
+        </w:rPr>
+        <w:t xml:space="preserve">kind: Deployment</w:t>
+      </w:r>
+    </w:p>
+    <w:p>
+      <w:pPr>
+        <w:pBdr>
+          <w:left w:val="single" w:color="CBD5E1" w:sz="16" w:space="8"/>
+        </w:pBdr>
+        <w:shd w:fill="F3F4F6" w:val="clear"/>
+        <w:spacing w:after="0" w:before="0" w:line="240"/>
+        <w:ind w:left="120"/>
+      </w:pPr>
+      <w:r>
+        <w:rPr>
+          <w:rFonts w:ascii="Consolas" w:cs="Consolas" w:eastAsia="Consolas" w:hAnsi="Consolas"/>
+          <w:color w:val="0F172A"/>
+          <w:sz w:val="17"/>
+          <w:szCs w:val="17"/>
+        </w:rPr>
+        <w:t xml:space="preserve">metadata: { name: auth-service }</w:t>
+      </w:r>
+    </w:p>
+    <w:p>
+      <w:pPr>
+        <w:pBdr>
+          <w:left w:val="single" w:color="CBD5E1" w:sz="16" w:space="8"/>
+        </w:pBdr>
+        <w:shd w:fill="F3F4F6" w:val="clear"/>
+        <w:spacing w:after="0" w:before="0" w:line="240"/>
+        <w:ind w:left="120"/>
+      </w:pPr>
+      <w:r>
+        <w:rPr>
+          <w:rFonts w:ascii="Consolas" w:cs="Consolas" w:eastAsia="Consolas" w:hAnsi="Consolas"/>
+          <w:color w:val="0F172A"/>
+          <w:sz w:val="17"/>
+          <w:szCs w:val="17"/>
+        </w:rPr>
+        <w:t xml:space="preserve">spec:</w:t>
+      </w:r>
+    </w:p>
+    <w:p>
+      <w:pPr>
+        <w:pBdr>
+          <w:left w:val="single" w:color="CBD5E1" w:sz="16" w:space="8"/>
+        </w:pBdr>
+        <w:shd w:fill="F3F4F6" w:val="clear"/>
+        <w:spacing w:after="0" w:before="0" w:line="240"/>
+        <w:ind w:left="120"/>
+      </w:pPr>
+      <w:r>
+        <w:rPr>
+          <w:rFonts w:ascii="Consolas" w:cs="Consolas" w:eastAsia="Consolas" w:hAnsi="Consolas"/>
+          <w:color w:val="0F172A"/>
+          <w:sz w:val="17"/>
+          <w:szCs w:val="17"/>
+        </w:rPr>
+        <w:t xml:space="preserve">  replicas: 1</w:t>
+      </w:r>
+    </w:p>
+    <w:p>
+      <w:pPr>
+        <w:pBdr>
+          <w:left w:val="single" w:color="CBD5E1" w:sz="16" w:space="8"/>
+        </w:pBdr>
+        <w:shd w:fill="F3F4F6" w:val="clear"/>
+        <w:spacing w:after="0" w:before="0" w:line="240"/>
+        <w:ind w:left="120"/>
+      </w:pPr>
+      <w:r>
+        <w:rPr>
+          <w:rFonts w:ascii="Consolas" w:cs="Consolas" w:eastAsia="Consolas" w:hAnsi="Consolas"/>
+          <w:color w:val="0F172A"/>
+          <w:sz w:val="17"/>
+          <w:szCs w:val="17"/>
+        </w:rPr>
+        <w:t xml:space="preserve">  selector: { matchLabels: { app.kubernetes.io/name: auth-service } }</w:t>
+      </w:r>
+    </w:p>
+    <w:p>
+      <w:pPr>
+        <w:pBdr>
+          <w:left w:val="single" w:color="CBD5E1" w:sz="16" w:space="8"/>
+        </w:pBdr>
+        <w:shd w:fill="F3F4F6" w:val="clear"/>
+        <w:spacing w:after="0" w:before="0" w:line="240"/>
+        <w:ind w:left="120"/>
+      </w:pPr>
+      <w:r>
+        <w:rPr>
+          <w:rFonts w:ascii="Consolas" w:cs="Consolas" w:eastAsia="Consolas" w:hAnsi="Consolas"/>
+          <w:color w:val="0F172A"/>
+          <w:sz w:val="17"/>
+          <w:szCs w:val="17"/>
+        </w:rPr>
+        <w:t xml:space="preserve">  template:</w:t>
+      </w:r>
+    </w:p>
+    <w:p>
+      <w:pPr>
+        <w:pBdr>
+          <w:left w:val="single" w:color="CBD5E1" w:sz="16" w:space="8"/>
+        </w:pBdr>
+        <w:shd w:fill="F3F4F6" w:val="clear"/>
+        <w:spacing w:after="0" w:before="0" w:line="240"/>
+        <w:ind w:left="120"/>
+      </w:pPr>
+      <w:r>
+        <w:rPr>
+          <w:rFonts w:ascii="Consolas" w:cs="Consolas" w:eastAsia="Consolas" w:hAnsi="Consolas"/>
+          <w:color w:val="0F172A"/>
+          <w:sz w:val="17"/>
+          <w:szCs w:val="17"/>
+        </w:rPr>
+        <w:t xml:space="preserve">    metadata: { labels: { app.kubernetes.io/name: auth-service } }</w:t>
+      </w:r>
+    </w:p>
+    <w:p>
+      <w:pPr>
+        <w:pBdr>
+          <w:left w:val="single" w:color="CBD5E1" w:sz="16" w:space="8"/>
+        </w:pBdr>
+        <w:shd w:fill="F3F4F6" w:val="clear"/>
+        <w:spacing w:after="0" w:before="0" w:line="240"/>
+        <w:ind w:left="120"/>
+      </w:pPr>
+      <w:r>
+        <w:rPr>
+          <w:rFonts w:ascii="Consolas" w:cs="Consolas" w:eastAsia="Consolas" w:hAnsi="Consolas"/>
+          <w:color w:val="0F172A"/>
+          <w:sz w:val="17"/>
+          <w:szCs w:val="17"/>
+        </w:rPr>
+        <w:t xml:space="preserve">    spec:</w:t>
+      </w:r>
+    </w:p>
+    <w:p>
+      <w:pPr>
+        <w:pBdr>
+          <w:left w:val="single" w:color="CBD5E1" w:sz="16" w:space="8"/>
+        </w:pBdr>
+        <w:shd w:fill="F3F4F6" w:val="clear"/>
+        <w:spacing w:after="0" w:before="0" w:line="240"/>
+        <w:ind w:left="120"/>
+      </w:pPr>
+      <w:r>
+        <w:rPr>
+          <w:rFonts w:ascii="Consolas" w:cs="Consolas" w:eastAsia="Consolas" w:hAnsi="Consolas"/>
+          <w:color w:val="0F172A"/>
+          <w:sz w:val="17"/>
+          <w:szCs w:val="17"/>
+        </w:rPr>
+        <w:t xml:space="preserve">      serviceAccountName: bookplus-app        # RBAC de minimo privilegio</w:t>
+      </w:r>
+    </w:p>
+    <w:p>
+      <w:pPr>
+        <w:pBdr>
+          <w:left w:val="single" w:color="CBD5E1" w:sz="16" w:space="8"/>
+        </w:pBdr>
+        <w:shd w:fill="F3F4F6" w:val="clear"/>
+        <w:spacing w:after="0" w:before="0" w:line="240"/>
+        <w:ind w:left="120"/>
+      </w:pPr>
+      <w:r>
+        <w:rPr>
+          <w:rFonts w:ascii="Consolas" w:cs="Consolas" w:eastAsia="Consolas" w:hAnsi="Consolas"/>
+          <w:color w:val="0F172A"/>
+          <w:sz w:val="17"/>
+          <w:szCs w:val="17"/>
+        </w:rPr>
+        <w:t xml:space="preserve">      containers:</w:t>
+      </w:r>
+    </w:p>
+    <w:p>
+      <w:pPr>
+        <w:pBdr>
+          <w:left w:val="single" w:color="CBD5E1" w:sz="16" w:space="8"/>
+        </w:pBdr>
+        <w:shd w:fill="F3F4F6" w:val="clear"/>
+        <w:spacing w:after="0" w:before="0" w:line="240"/>
+        <w:ind w:left="120"/>
+      </w:pPr>
+      <w:r>
+        <w:rPr>
+          <w:rFonts w:ascii="Consolas" w:cs="Consolas" w:eastAsia="Consolas" w:hAnsi="Consolas"/>
+          <w:color w:val="0F172A"/>
+          <w:sz w:val="17"/>
+          <w:szCs w:val="17"/>
+        </w:rPr>
+        <w:t xml:space="preserve">        - name: auth-service</w:t>
+      </w:r>
+    </w:p>
+    <w:p>
+      <w:pPr>
+        <w:pBdr>
+          <w:left w:val="single" w:color="CBD5E1" w:sz="16" w:space="8"/>
+        </w:pBdr>
+        <w:shd w:fill="F3F4F6" w:val="clear"/>
+        <w:spacing w:after="0" w:before="0" w:line="240"/>
+        <w:ind w:left="120"/>
+      </w:pPr>
+      <w:r>
+        <w:rPr>
+          <w:rFonts w:ascii="Consolas" w:cs="Consolas" w:eastAsia="Consolas" w:hAnsi="Consolas"/>
+          <w:color w:val="0F172A"/>
+          <w:sz w:val="17"/>
+          <w:szCs w:val="17"/>
+        </w:rPr>
+        <w:t xml:space="preserve">          image: ghcr.io/bookplus-org/auth-service:1.0.0</w:t>
+      </w:r>
+    </w:p>
+    <w:p>
+      <w:pPr>
+        <w:pBdr>
+          <w:left w:val="single" w:color="CBD5E1" w:sz="16" w:space="8"/>
+        </w:pBdr>
+        <w:shd w:fill="F3F4F6" w:val="clear"/>
+        <w:spacing w:after="0" w:before="0" w:line="240"/>
+        <w:ind w:left="120"/>
+      </w:pPr>
+      <w:r>
+        <w:rPr>
+          <w:rFonts w:ascii="Consolas" w:cs="Consolas" w:eastAsia="Consolas" w:hAnsi="Consolas"/>
+          <w:color w:val="0F172A"/>
+          <w:sz w:val="17"/>
+          <w:szCs w:val="17"/>
+        </w:rPr>
+        <w:t xml:space="preserve">          ports: [ { containerPort: 8081, name: http } ]</w:t>
+      </w:r>
+    </w:p>
+    <w:p>
+      <w:pPr>
+        <w:pBdr>
+          <w:left w:val="single" w:color="CBD5E1" w:sz="16" w:space="8"/>
+        </w:pBdr>
+        <w:shd w:fill="F3F4F6" w:val="clear"/>
+        <w:spacing w:after="0" w:before="0" w:line="240"/>
+        <w:ind w:left="120"/>
+      </w:pPr>
+      <w:r>
+        <w:rPr>
+          <w:rFonts w:ascii="Consolas" w:cs="Consolas" w:eastAsia="Consolas" w:hAnsi="Consolas"/>
+          <w:color w:val="0F172A"/>
+          <w:sz w:val="17"/>
+          <w:szCs w:val="17"/>
+        </w:rPr>
+        <w:t xml:space="preserve">          envFrom:</w:t>
+      </w:r>
+    </w:p>
+    <w:p>
+      <w:pPr>
+        <w:pBdr>
+          <w:left w:val="single" w:color="CBD5E1" w:sz="16" w:space="8"/>
+        </w:pBdr>
+        <w:shd w:fill="F3F4F6" w:val="clear"/>
+        <w:spacing w:after="0" w:before="0" w:line="240"/>
+        <w:ind w:left="120"/>
+      </w:pPr>
+      <w:r>
+        <w:rPr>
+          <w:rFonts w:ascii="Consolas" w:cs="Consolas" w:eastAsia="Consolas" w:hAnsi="Consolas"/>
+          <w:color w:val="0F172A"/>
+          <w:sz w:val="17"/>
+          <w:szCs w:val="17"/>
+        </w:rPr>
+        <w:t xml:space="preserve">            - configMapRef: { name: auth-service-config }</w:t>
+      </w:r>
+    </w:p>
+    <w:p>
+      <w:pPr>
+        <w:pBdr>
+          <w:left w:val="single" w:color="CBD5E1" w:sz="16" w:space="8"/>
+        </w:pBdr>
+        <w:shd w:fill="F3F4F6" w:val="clear"/>
+        <w:spacing w:after="0" w:before="0" w:line="240"/>
+        <w:ind w:left="120"/>
+      </w:pPr>
+      <w:r>
+        <w:rPr>
+          <w:rFonts w:ascii="Consolas" w:cs="Consolas" w:eastAsia="Consolas" w:hAnsi="Consolas"/>
+          <w:color w:val="0F172A"/>
+          <w:sz w:val="17"/>
+          <w:szCs w:val="17"/>
+        </w:rPr>
+        <w:t xml:space="preserve">            - secretRef:    { name: auth-service-secret }</w:t>
+      </w:r>
+    </w:p>
+    <w:p>
+      <w:pPr>
+        <w:pBdr>
+          <w:left w:val="single" w:color="CBD5E1" w:sz="16" w:space="8"/>
+        </w:pBdr>
+        <w:shd w:fill="F3F4F6" w:val="clear"/>
+        <w:spacing w:after="0" w:before="0" w:line="240"/>
+        <w:ind w:left="120"/>
+      </w:pPr>
+      <w:r>
+        <w:rPr>
+          <w:rFonts w:ascii="Consolas" w:cs="Consolas" w:eastAsia="Consolas" w:hAnsi="Consolas"/>
+          <w:color w:val="0F172A"/>
+          <w:sz w:val="17"/>
+          <w:szCs w:val="17"/>
+        </w:rPr>
+        <w:t xml:space="preserve">          startupProbe:   { httpGet: { path: /actuator/health, port: 8081 }, failureThreshold: 30, periodSeconds: 5 }</w:t>
+      </w:r>
+    </w:p>
+    <w:p>
+      <w:pPr>
+        <w:pBdr>
+          <w:left w:val="single" w:color="CBD5E1" w:sz="16" w:space="8"/>
+        </w:pBdr>
+        <w:shd w:fill="F3F4F6" w:val="clear"/>
+        <w:spacing w:after="0" w:before="0" w:line="240"/>
+        <w:ind w:left="120"/>
+      </w:pPr>
+      <w:r>
+        <w:rPr>
+          <w:rFonts w:ascii="Consolas" w:cs="Consolas" w:eastAsia="Consolas" w:hAnsi="Consolas"/>
+          <w:color w:val="0F172A"/>
+          <w:sz w:val="17"/>
+          <w:szCs w:val="17"/>
+        </w:rPr>
+        <w:t xml:space="preserve">          readinessProbe: { httpGet: { path: /actuator/health, port: 8081 }, periodSeconds: 10 }</w:t>
+      </w:r>
+    </w:p>
+    <w:p>
+      <w:pPr>
+        <w:pBdr>
+          <w:left w:val="single" w:color="CBD5E1" w:sz="16" w:space="8"/>
+        </w:pBdr>
+        <w:shd w:fill="F3F4F6" w:val="clear"/>
+        <w:spacing w:after="0" w:before="0" w:line="240"/>
+        <w:ind w:left="120"/>
+      </w:pPr>
+      <w:r>
+        <w:rPr>
+          <w:rFonts w:ascii="Consolas" w:cs="Consolas" w:eastAsia="Consolas" w:hAnsi="Consolas"/>
+          <w:color w:val="0F172A"/>
+          <w:sz w:val="17"/>
+          <w:szCs w:val="17"/>
+        </w:rPr>
+        <w:t xml:space="preserve">          livenessProbe:  { httpGet: { path: /actuator/health, port: 8081 }, periodSeconds: 15 }</w:t>
+      </w:r>
+    </w:p>
+    <w:p>
+      <w:pPr>
+        <w:pBdr>
+          <w:left w:val="single" w:color="CBD5E1" w:sz="16" w:space="8"/>
+        </w:pBdr>
+        <w:shd w:fill="F3F4F6" w:val="clear"/>
+        <w:spacing w:after="0" w:before="0" w:line="240"/>
+        <w:ind w:left="120"/>
+      </w:pPr>
+      <w:r>
+        <w:rPr>
+          <w:rFonts w:ascii="Consolas" w:cs="Consolas" w:eastAsia="Consolas" w:hAnsi="Consolas"/>
+          <w:color w:val="0F172A"/>
+          <w:sz w:val="17"/>
+          <w:szCs w:val="17"/>
+        </w:rPr>
+        <w:t xml:space="preserve">          resources:</w:t>
+      </w:r>
+    </w:p>
+    <w:p>
+      <w:pPr>
+        <w:pBdr>
+          <w:left w:val="single" w:color="CBD5E1" w:sz="16" w:space="8"/>
+        </w:pBdr>
+        <w:shd w:fill="F3F4F6" w:val="clear"/>
+        <w:spacing w:after="0" w:before="0" w:line="240"/>
+        <w:ind w:left="120"/>
+      </w:pPr>
+      <w:r>
+        <w:rPr>
+          <w:rFonts w:ascii="Consolas" w:cs="Consolas" w:eastAsia="Consolas" w:hAnsi="Consolas"/>
+          <w:color w:val="0F172A"/>
+          <w:sz w:val="17"/>
+          <w:szCs w:val="17"/>
+        </w:rPr>
+        <w:t xml:space="preserve">            requests: { cpu: 200m, memory: 512Mi }</w:t>
+      </w:r>
+    </w:p>
+    <w:p>
+      <w:pPr>
+        <w:pBdr>
+          <w:left w:val="single" w:color="CBD5E1" w:sz="16" w:space="8"/>
+        </w:pBdr>
+        <w:shd w:fill="F3F4F6" w:val="clear"/>
+        <w:spacing w:after="150" w:before="0" w:line="240"/>
+        <w:ind w:left="120"/>
+      </w:pPr>
+      <w:r>
+        <w:rPr>
+          <w:rFonts w:ascii="Consolas" w:cs="Consolas" w:eastAsia="Consolas" w:hAnsi="Consolas"/>
+          <w:color w:val="0F172A"/>
+          <w:sz w:val="17"/>
+          <w:szCs w:val="17"/>
+        </w:rPr>
+        <w:t xml:space="preserve">            limits:   { cpu: 1,    memory: 1Gi }</w:t>
+      </w:r>
+    </w:p>
+    <w:p>
+      <w:pPr>
+        <w:pStyle w:val="Heading2"/>
+      </w:pPr>
+      <w:r>
+        <w:rPr>
+          <w:rFonts w:ascii="Arial" w:cs="Arial" w:eastAsia="Arial" w:hAnsi="Arial"/>
+        </w:rPr>
+        <w:t xml:space="preserve">17.4 Service y HorizontalPodAutoscaler</w:t>
+      </w:r>
+    </w:p>
+    <w:p>
+      <w:pPr>
+        <w:pBdr>
+          <w:left w:val="single" w:color="CBD5E1" w:sz="16" w:space="8"/>
+        </w:pBdr>
+        <w:shd w:fill="F3F4F6" w:val="clear"/>
+        <w:spacing w:after="0" w:before="40" w:line="240"/>
+        <w:ind w:left="120"/>
+      </w:pPr>
+      <w:r>
+        <w:rPr>
+          <w:rFonts w:ascii="Consolas" w:cs="Consolas" w:eastAsia="Consolas" w:hAnsi="Consolas"/>
+          <w:color w:val="0F172A"/>
+          <w:sz w:val="17"/>
+          <w:szCs w:val="17"/>
+        </w:rPr>
+        <w:t xml:space="preserve">apiVersion: v1</w:t>
+      </w:r>
+    </w:p>
+    <w:p>
+      <w:pPr>
+        <w:pBdr>
+          <w:left w:val="single" w:color="CBD5E1" w:sz="16" w:space="8"/>
+        </w:pBdr>
+        <w:shd w:fill="F3F4F6" w:val="clear"/>
+        <w:spacing w:after="0" w:before="0" w:line="240"/>
+        <w:ind w:left="120"/>
+      </w:pPr>
+      <w:r>
+        <w:rPr>
+          <w:rFonts w:ascii="Consolas" w:cs="Consolas" w:eastAsia="Consolas" w:hAnsi="Consolas"/>
+          <w:color w:val="0F172A"/>
+          <w:sz w:val="17"/>
+          <w:szCs w:val="17"/>
+        </w:rPr>
+        <w:t xml:space="preserve">kind: Service</w:t>
+      </w:r>
+    </w:p>
+    <w:p>
+      <w:pPr>
+        <w:pBdr>
+          <w:left w:val="single" w:color="CBD5E1" w:sz="16" w:space="8"/>
+        </w:pBdr>
+        <w:shd w:fill="F3F4F6" w:val="clear"/>
+        <w:spacing w:after="0" w:before="0" w:line="240"/>
+        <w:ind w:left="120"/>
+      </w:pPr>
+      <w:r>
+        <w:rPr>
+          <w:rFonts w:ascii="Consolas" w:cs="Consolas" w:eastAsia="Consolas" w:hAnsi="Consolas"/>
+          <w:color w:val="0F172A"/>
+          <w:sz w:val="17"/>
+          <w:szCs w:val="17"/>
+        </w:rPr>
+        <w:t xml:space="preserve">metadata: { name: auth-service }</w:t>
+      </w:r>
+    </w:p>
+    <w:p>
+      <w:pPr>
+        <w:pBdr>
+          <w:left w:val="single" w:color="CBD5E1" w:sz="16" w:space="8"/>
+        </w:pBdr>
+        <w:shd w:fill="F3F4F6" w:val="clear"/>
+        <w:spacing w:after="0" w:before="0" w:line="240"/>
+        <w:ind w:left="120"/>
+      </w:pPr>
+      <w:r>
+        <w:rPr>
+          <w:rFonts w:ascii="Consolas" w:cs="Consolas" w:eastAsia="Consolas" w:hAnsi="Consolas"/>
+          <w:color w:val="0F172A"/>
+          <w:sz w:val="17"/>
+          <w:szCs w:val="17"/>
+        </w:rPr>
+        <w:t xml:space="preserve">spec:</w:t>
+      </w:r>
+    </w:p>
+    <w:p>
+      <w:pPr>
+        <w:pBdr>
+          <w:left w:val="single" w:color="CBD5E1" w:sz="16" w:space="8"/>
+        </w:pBdr>
+        <w:shd w:fill="F3F4F6" w:val="clear"/>
+        <w:spacing w:after="0" w:before="0" w:line="240"/>
+        <w:ind w:left="120"/>
+      </w:pPr>
+      <w:r>
+        <w:rPr>
+          <w:rFonts w:ascii="Consolas" w:cs="Consolas" w:eastAsia="Consolas" w:hAnsi="Consolas"/>
+          <w:color w:val="0F172A"/>
+          <w:sz w:val="17"/>
+          <w:szCs w:val="17"/>
+        </w:rPr>
+        <w:t xml:space="preserve">  selector: { app.kubernetes.io/name: auth-service }</w:t>
+      </w:r>
+    </w:p>
+    <w:p>
+      <w:pPr>
+        <w:pBdr>
+          <w:left w:val="single" w:color="CBD5E1" w:sz="16" w:space="8"/>
+        </w:pBdr>
+        <w:shd w:fill="F3F4F6" w:val="clear"/>
+        <w:spacing w:after="0" w:before="0" w:line="240"/>
+        <w:ind w:left="120"/>
+      </w:pPr>
+      <w:r>
+        <w:rPr>
+          <w:rFonts w:ascii="Consolas" w:cs="Consolas" w:eastAsia="Consolas" w:hAnsi="Consolas"/>
+          <w:color w:val="0F172A"/>
+          <w:sz w:val="17"/>
+          <w:szCs w:val="17"/>
+        </w:rPr>
+        <w:t xml:space="preserve">  ports: [ { port: 8081, targetPort: 8081, name: http } ]</w:t>
+      </w:r>
+    </w:p>
+    <w:p>
+      <w:pPr>
+        <w:pBdr>
+          <w:left w:val="single" w:color="CBD5E1" w:sz="16" w:space="8"/>
+        </w:pBdr>
+        <w:shd w:fill="F3F4F6" w:val="clear"/>
+        <w:spacing w:after="0" w:before="0" w:line="240"/>
+        <w:ind w:left="120"/>
+      </w:pPr>
+      <w:r>
+        <w:rPr>
+          <w:rFonts w:ascii="Consolas" w:cs="Consolas" w:eastAsia="Consolas" w:hAnsi="Consolas"/>
+          <w:color w:val="0F172A"/>
+          <w:sz w:val="17"/>
+          <w:szCs w:val="17"/>
+        </w:rPr>
+        <w:t xml:space="preserve">---</w:t>
+      </w:r>
+    </w:p>
+    <w:p>
+      <w:pPr>
+        <w:pBdr>
+          <w:left w:val="single" w:color="CBD5E1" w:sz="16" w:space="8"/>
+        </w:pBdr>
+        <w:shd w:fill="F3F4F6" w:val="clear"/>
+        <w:spacing w:after="0" w:before="0" w:line="240"/>
+        <w:ind w:left="120"/>
+      </w:pPr>
+      <w:r>
+        <w:rPr>
+          <w:rFonts w:ascii="Consolas" w:cs="Consolas" w:eastAsia="Consolas" w:hAnsi="Consolas"/>
+          <w:color w:val="0F172A"/>
+          <w:sz w:val="17"/>
+          <w:szCs w:val="17"/>
+        </w:rPr>
+        <w:t xml:space="preserve">apiVersion: autoscaling/v2</w:t>
+      </w:r>
+    </w:p>
+    <w:p>
+      <w:pPr>
+        <w:pBdr>
+          <w:left w:val="single" w:color="CBD5E1" w:sz="16" w:space="8"/>
+        </w:pBdr>
+        <w:shd w:fill="F3F4F6" w:val="clear"/>
+        <w:spacing w:after="0" w:before="0" w:line="240"/>
+        <w:ind w:left="120"/>
+      </w:pPr>
+      <w:r>
+        <w:rPr>
+          <w:rFonts w:ascii="Consolas" w:cs="Consolas" w:eastAsia="Consolas" w:hAnsi="Consolas"/>
+          <w:color w:val="0F172A"/>
+          <w:sz w:val="17"/>
+          <w:szCs w:val="17"/>
+        </w:rPr>
+        <w:t xml:space="preserve">kind: HorizontalPodAutoscaler</w:t>
+      </w:r>
+    </w:p>
+    <w:p>
+      <w:pPr>
+        <w:pBdr>
+          <w:left w:val="single" w:color="CBD5E1" w:sz="16" w:space="8"/>
+        </w:pBdr>
+        <w:shd w:fill="F3F4F6" w:val="clear"/>
+        <w:spacing w:after="0" w:before="0" w:line="240"/>
+        <w:ind w:left="120"/>
+      </w:pPr>
+      <w:r>
+        <w:rPr>
+          <w:rFonts w:ascii="Consolas" w:cs="Consolas" w:eastAsia="Consolas" w:hAnsi="Consolas"/>
+          <w:color w:val="0F172A"/>
+          <w:sz w:val="17"/>
+          <w:szCs w:val="17"/>
+        </w:rPr>
+        <w:t xml:space="preserve">metadata: { name: auth-service-hpa }</w:t>
+      </w:r>
+    </w:p>
+    <w:p>
+      <w:pPr>
+        <w:pBdr>
+          <w:left w:val="single" w:color="CBD5E1" w:sz="16" w:space="8"/>
+        </w:pBdr>
+        <w:shd w:fill="F3F4F6" w:val="clear"/>
+        <w:spacing w:after="0" w:before="0" w:line="240"/>
+        <w:ind w:left="120"/>
+      </w:pPr>
+      <w:r>
+        <w:rPr>
+          <w:rFonts w:ascii="Consolas" w:cs="Consolas" w:eastAsia="Consolas" w:hAnsi="Consolas"/>
+          <w:color w:val="0F172A"/>
+          <w:sz w:val="17"/>
+          <w:szCs w:val="17"/>
+        </w:rPr>
+        <w:t xml:space="preserve">spec:</w:t>
+      </w:r>
+    </w:p>
+    <w:p>
+      <w:pPr>
+        <w:pBdr>
+          <w:left w:val="single" w:color="CBD5E1" w:sz="16" w:space="8"/>
+        </w:pBdr>
+        <w:shd w:fill="F3F4F6" w:val="clear"/>
+        <w:spacing w:after="0" w:before="0" w:line="240"/>
+        <w:ind w:left="120"/>
+      </w:pPr>
+      <w:r>
+        <w:rPr>
+          <w:rFonts w:ascii="Consolas" w:cs="Consolas" w:eastAsia="Consolas" w:hAnsi="Consolas"/>
+          <w:color w:val="0F172A"/>
+          <w:sz w:val="17"/>
+          <w:szCs w:val="17"/>
+        </w:rPr>
+        <w:t xml:space="preserve">  scaleTargetRef: { apiVersion: apps/v1, kind: Deployment, name: auth-service }</w:t>
+      </w:r>
+    </w:p>
+    <w:p>
+      <w:pPr>
+        <w:pBdr>
+          <w:left w:val="single" w:color="CBD5E1" w:sz="16" w:space="8"/>
+        </w:pBdr>
+        <w:shd w:fill="F3F4F6" w:val="clear"/>
+        <w:spacing w:after="0" w:before="0" w:line="240"/>
+        <w:ind w:left="120"/>
+      </w:pPr>
+      <w:r>
+        <w:rPr>
+          <w:rFonts w:ascii="Consolas" w:cs="Consolas" w:eastAsia="Consolas" w:hAnsi="Consolas"/>
+          <w:color w:val="0F172A"/>
+          <w:sz w:val="17"/>
+          <w:szCs w:val="17"/>
+        </w:rPr>
+        <w:t xml:space="preserve">  minReplicas: 2</w:t>
+      </w:r>
+    </w:p>
+    <w:p>
+      <w:pPr>
+        <w:pBdr>
+          <w:left w:val="single" w:color="CBD5E1" w:sz="16" w:space="8"/>
+        </w:pBdr>
+        <w:shd w:fill="F3F4F6" w:val="clear"/>
+        <w:spacing w:after="0" w:before="0" w:line="240"/>
+        <w:ind w:left="120"/>
+      </w:pPr>
+      <w:r>
+        <w:rPr>
+          <w:rFonts w:ascii="Consolas" w:cs="Consolas" w:eastAsia="Consolas" w:hAnsi="Consolas"/>
+          <w:color w:val="0F172A"/>
+          <w:sz w:val="17"/>
+          <w:szCs w:val="17"/>
+        </w:rPr>
+        <w:t xml:space="preserve">  maxReplicas: 8</w:t>
+      </w:r>
+    </w:p>
+    <w:p>
+      <w:pPr>
+        <w:pBdr>
+          <w:left w:val="single" w:color="CBD5E1" w:sz="16" w:space="8"/>
+        </w:pBdr>
+        <w:shd w:fill="F3F4F6" w:val="clear"/>
+        <w:spacing w:after="0" w:before="0" w:line="240"/>
+        <w:ind w:left="120"/>
+      </w:pPr>
+      <w:r>
+        <w:rPr>
+          <w:rFonts w:ascii="Consolas" w:cs="Consolas" w:eastAsia="Consolas" w:hAnsi="Consolas"/>
+          <w:color w:val="0F172A"/>
+          <w:sz w:val="17"/>
+          <w:szCs w:val="17"/>
+        </w:rPr>
+        <w:t xml:space="preserve">  metrics:</w:t>
+      </w:r>
+    </w:p>
+    <w:p>
+      <w:pPr>
+        <w:pBdr>
+          <w:left w:val="single" w:color="CBD5E1" w:sz="16" w:space="8"/>
+        </w:pBdr>
+        <w:shd w:fill="F3F4F6" w:val="clear"/>
+        <w:spacing w:after="0" w:before="0" w:line="240"/>
+        <w:ind w:left="120"/>
+      </w:pPr>
+      <w:r>
+        <w:rPr>
+          <w:rFonts w:ascii="Consolas" w:cs="Consolas" w:eastAsia="Consolas" w:hAnsi="Consolas"/>
+          <w:color w:val="0F172A"/>
+          <w:sz w:val="17"/>
+          <w:szCs w:val="17"/>
+        </w:rPr>
+        <w:t xml:space="preserve">    - type: Resource</w:t>
+      </w:r>
+    </w:p>
+    <w:p>
+      <w:pPr>
+        <w:pBdr>
+          <w:left w:val="single" w:color="CBD5E1" w:sz="16" w:space="8"/>
+        </w:pBdr>
+        <w:shd w:fill="F3F4F6" w:val="clear"/>
+        <w:spacing w:after="150" w:before="0" w:line="240"/>
+        <w:ind w:left="120"/>
+      </w:pPr>
+      <w:r>
+        <w:rPr>
+          <w:rFonts w:ascii="Consolas" w:cs="Consolas" w:eastAsia="Consolas" w:hAnsi="Consolas"/>
+          <w:color w:val="0F172A"/>
+          <w:sz w:val="17"/>
+          <w:szCs w:val="17"/>
+        </w:rPr>
+        <w:t xml:space="preserve">      resource: { name: cpu, target: { type: Utilization, averageUtilization: 70 } }</w:t>
+      </w:r>
+    </w:p>
+    <w:p>
+      <w:pPr>
+        <w:pStyle w:val="Heading2"/>
+      </w:pPr>
+      <w:r>
+        <w:rPr>
+          <w:rFonts w:ascii="Arial" w:cs="Arial" w:eastAsia="Arial" w:hAnsi="Arial"/>
+        </w:rPr>
+        <w:t xml:space="preserve">17.5 StatefulSet con almacenamiento persistente (Postgres)</w:t>
+      </w:r>
+    </w:p>
+    <w:p>
+      <w:pPr>
+        <w:pBdr>
+          <w:left w:val="single" w:color="CBD5E1" w:sz="16" w:space="8"/>
+        </w:pBdr>
+        <w:shd w:fill="F3F4F6" w:val="clear"/>
+        <w:spacing w:after="0" w:before="40" w:line="240"/>
+        <w:ind w:left="120"/>
+      </w:pPr>
+      <w:r>
+        <w:rPr>
+          <w:rFonts w:ascii="Consolas" w:cs="Consolas" w:eastAsia="Consolas" w:hAnsi="Consolas"/>
+          <w:color w:val="0F172A"/>
+          <w:sz w:val="17"/>
+          <w:szCs w:val="17"/>
+        </w:rPr>
+        <w:t xml:space="preserve">apiVersion: apps/v1</w:t>
+      </w:r>
+    </w:p>
+    <w:p>
+      <w:pPr>
+        <w:pBdr>
+          <w:left w:val="single" w:color="CBD5E1" w:sz="16" w:space="8"/>
+        </w:pBdr>
+        <w:shd w:fill="F3F4F6" w:val="clear"/>
+        <w:spacing w:after="0" w:before="0" w:line="240"/>
+        <w:ind w:left="120"/>
+      </w:pPr>
+      <w:r>
+        <w:rPr>
+          <w:rFonts w:ascii="Consolas" w:cs="Consolas" w:eastAsia="Consolas" w:hAnsi="Consolas"/>
+          <w:color w:val="0F172A"/>
+          <w:sz w:val="17"/>
+          <w:szCs w:val="17"/>
+        </w:rPr>
+        <w:t xml:space="preserve">kind: StatefulSet</w:t>
+      </w:r>
+    </w:p>
+    <w:p>
+      <w:pPr>
+        <w:pBdr>
+          <w:left w:val="single" w:color="CBD5E1" w:sz="16" w:space="8"/>
+        </w:pBdr>
+        <w:shd w:fill="F3F4F6" w:val="clear"/>
+        <w:spacing w:after="0" w:before="0" w:line="240"/>
+        <w:ind w:left="120"/>
+      </w:pPr>
+      <w:r>
+        <w:rPr>
+          <w:rFonts w:ascii="Consolas" w:cs="Consolas" w:eastAsia="Consolas" w:hAnsi="Consolas"/>
+          <w:color w:val="0F172A"/>
+          <w:sz w:val="17"/>
+          <w:szCs w:val="17"/>
+        </w:rPr>
+        <w:t xml:space="preserve">metadata: { name: auth-postgres }</w:t>
+      </w:r>
+    </w:p>
+    <w:p>
+      <w:pPr>
+        <w:pBdr>
+          <w:left w:val="single" w:color="CBD5E1" w:sz="16" w:space="8"/>
+        </w:pBdr>
+        <w:shd w:fill="F3F4F6" w:val="clear"/>
+        <w:spacing w:after="0" w:before="0" w:line="240"/>
+        <w:ind w:left="120"/>
+      </w:pPr>
+      <w:r>
+        <w:rPr>
+          <w:rFonts w:ascii="Consolas" w:cs="Consolas" w:eastAsia="Consolas" w:hAnsi="Consolas"/>
+          <w:color w:val="0F172A"/>
+          <w:sz w:val="17"/>
+          <w:szCs w:val="17"/>
+        </w:rPr>
+        <w:t xml:space="preserve">spec:</w:t>
+      </w:r>
+    </w:p>
+    <w:p>
+      <w:pPr>
+        <w:pBdr>
+          <w:left w:val="single" w:color="CBD5E1" w:sz="16" w:space="8"/>
+        </w:pBdr>
+        <w:shd w:fill="F3F4F6" w:val="clear"/>
+        <w:spacing w:after="0" w:before="0" w:line="240"/>
+        <w:ind w:left="120"/>
+      </w:pPr>
+      <w:r>
+        <w:rPr>
+          <w:rFonts w:ascii="Consolas" w:cs="Consolas" w:eastAsia="Consolas" w:hAnsi="Consolas"/>
+          <w:color w:val="0F172A"/>
+          <w:sz w:val="17"/>
+          <w:szCs w:val="17"/>
+        </w:rPr>
+        <w:t xml:space="preserve">  serviceName: auth-postgres          # Service headless (clusterIP: None)</w:t>
+      </w:r>
+    </w:p>
+    <w:p>
+      <w:pPr>
+        <w:pBdr>
+          <w:left w:val="single" w:color="CBD5E1" w:sz="16" w:space="8"/>
+        </w:pBdr>
+        <w:shd w:fill="F3F4F6" w:val="clear"/>
+        <w:spacing w:after="0" w:before="0" w:line="240"/>
+        <w:ind w:left="120"/>
+      </w:pPr>
+      <w:r>
+        <w:rPr>
+          <w:rFonts w:ascii="Consolas" w:cs="Consolas" w:eastAsia="Consolas" w:hAnsi="Consolas"/>
+          <w:color w:val="0F172A"/>
+          <w:sz w:val="17"/>
+          <w:szCs w:val="17"/>
+        </w:rPr>
+        <w:t xml:space="preserve">  replicas: 1</w:t>
+      </w:r>
+    </w:p>
+    <w:p>
+      <w:pPr>
+        <w:pBdr>
+          <w:left w:val="single" w:color="CBD5E1" w:sz="16" w:space="8"/>
+        </w:pBdr>
+        <w:shd w:fill="F3F4F6" w:val="clear"/>
+        <w:spacing w:after="0" w:before="0" w:line="240"/>
+        <w:ind w:left="120"/>
+      </w:pPr>
+      <w:r>
+        <w:rPr>
+          <w:rFonts w:ascii="Consolas" w:cs="Consolas" w:eastAsia="Consolas" w:hAnsi="Consolas"/>
+          <w:color w:val="0F172A"/>
+          <w:sz w:val="17"/>
+          <w:szCs w:val="17"/>
+        </w:rPr>
+        <w:t xml:space="preserve">  selector: { matchLabels: { app.kubernetes.io/name: auth-postgres } }</w:t>
+      </w:r>
+    </w:p>
+    <w:p>
+      <w:pPr>
+        <w:pBdr>
+          <w:left w:val="single" w:color="CBD5E1" w:sz="16" w:space="8"/>
+        </w:pBdr>
+        <w:shd w:fill="F3F4F6" w:val="clear"/>
+        <w:spacing w:after="0" w:before="0" w:line="240"/>
+        <w:ind w:left="120"/>
+      </w:pPr>
+      <w:r>
+        <w:rPr>
+          <w:rFonts w:ascii="Consolas" w:cs="Consolas" w:eastAsia="Consolas" w:hAnsi="Consolas"/>
+          <w:color w:val="0F172A"/>
+          <w:sz w:val="17"/>
+          <w:szCs w:val="17"/>
+        </w:rPr>
+        <w:t xml:space="preserve">  template:</w:t>
+      </w:r>
+    </w:p>
+    <w:p>
+      <w:pPr>
+        <w:pBdr>
+          <w:left w:val="single" w:color="CBD5E1" w:sz="16" w:space="8"/>
+        </w:pBdr>
+        <w:shd w:fill="F3F4F6" w:val="clear"/>
+        <w:spacing w:after="0" w:before="0" w:line="240"/>
+        <w:ind w:left="120"/>
+      </w:pPr>
+      <w:r>
+        <w:rPr>
+          <w:rFonts w:ascii="Consolas" w:cs="Consolas" w:eastAsia="Consolas" w:hAnsi="Consolas"/>
+          <w:color w:val="0F172A"/>
+          <w:sz w:val="17"/>
+          <w:szCs w:val="17"/>
+        </w:rPr>
+        <w:t xml:space="preserve">    spec:</w:t>
+      </w:r>
+    </w:p>
+    <w:p>
+      <w:pPr>
+        <w:pBdr>
+          <w:left w:val="single" w:color="CBD5E1" w:sz="16" w:space="8"/>
+        </w:pBdr>
+        <w:shd w:fill="F3F4F6" w:val="clear"/>
+        <w:spacing w:after="0" w:before="0" w:line="240"/>
+        <w:ind w:left="120"/>
+      </w:pPr>
+      <w:r>
+        <w:rPr>
+          <w:rFonts w:ascii="Consolas" w:cs="Consolas" w:eastAsia="Consolas" w:hAnsi="Consolas"/>
+          <w:color w:val="0F172A"/>
+          <w:sz w:val="17"/>
+          <w:szCs w:val="17"/>
+        </w:rPr>
+        <w:t xml:space="preserve">      containers:</w:t>
+      </w:r>
+    </w:p>
+    <w:p>
+      <w:pPr>
+        <w:pBdr>
+          <w:left w:val="single" w:color="CBD5E1" w:sz="16" w:space="8"/>
+        </w:pBdr>
+        <w:shd w:fill="F3F4F6" w:val="clear"/>
+        <w:spacing w:after="0" w:before="0" w:line="240"/>
+        <w:ind w:left="120"/>
+      </w:pPr>
+      <w:r>
+        <w:rPr>
+          <w:rFonts w:ascii="Consolas" w:cs="Consolas" w:eastAsia="Consolas" w:hAnsi="Consolas"/>
+          <w:color w:val="0F172A"/>
+          <w:sz w:val="17"/>
+          <w:szCs w:val="17"/>
+        </w:rPr>
+        <w:t xml:space="preserve">        - name: postgres</w:t>
+      </w:r>
+    </w:p>
+    <w:p>
+      <w:pPr>
+        <w:pBdr>
+          <w:left w:val="single" w:color="CBD5E1" w:sz="16" w:space="8"/>
+        </w:pBdr>
+        <w:shd w:fill="F3F4F6" w:val="clear"/>
+        <w:spacing w:after="0" w:before="0" w:line="240"/>
+        <w:ind w:left="120"/>
+      </w:pPr>
+      <w:r>
+        <w:rPr>
+          <w:rFonts w:ascii="Consolas" w:cs="Consolas" w:eastAsia="Consolas" w:hAnsi="Consolas"/>
+          <w:color w:val="0F172A"/>
+          <w:sz w:val="17"/>
+          <w:szCs w:val="17"/>
+        </w:rPr>
+        <w:t xml:space="preserve">          image: postgres:16-alpine</w:t>
+      </w:r>
+    </w:p>
+    <w:p>
+      <w:pPr>
+        <w:pBdr>
+          <w:left w:val="single" w:color="CBD5E1" w:sz="16" w:space="8"/>
+        </w:pBdr>
+        <w:shd w:fill="F3F4F6" w:val="clear"/>
+        <w:spacing w:after="0" w:before="0" w:line="240"/>
+        <w:ind w:left="120"/>
+      </w:pPr>
+      <w:r>
+        <w:rPr>
+          <w:rFonts w:ascii="Consolas" w:cs="Consolas" w:eastAsia="Consolas" w:hAnsi="Consolas"/>
+          <w:color w:val="0F172A"/>
+          <w:sz w:val="17"/>
+          <w:szCs w:val="17"/>
+        </w:rPr>
+        <w:t xml:space="preserve">          env:</w:t>
+      </w:r>
+    </w:p>
+    <w:p>
+      <w:pPr>
+        <w:pBdr>
+          <w:left w:val="single" w:color="CBD5E1" w:sz="16" w:space="8"/>
+        </w:pBdr>
+        <w:shd w:fill="F3F4F6" w:val="clear"/>
+        <w:spacing w:after="0" w:before="0" w:line="240"/>
+        <w:ind w:left="120"/>
+      </w:pPr>
+      <w:r>
+        <w:rPr>
+          <w:rFonts w:ascii="Consolas" w:cs="Consolas" w:eastAsia="Consolas" w:hAnsi="Consolas"/>
+          <w:color w:val="0F172A"/>
+          <w:sz w:val="17"/>
+          <w:szCs w:val="17"/>
+        </w:rPr>
+        <w:t xml:space="preserve">            - { name: POSTGRES_DB,   value: auth_db }</w:t>
+      </w:r>
+    </w:p>
+    <w:p>
+      <w:pPr>
+        <w:pBdr>
+          <w:left w:val="single" w:color="CBD5E1" w:sz="16" w:space="8"/>
+        </w:pBdr>
+        <w:shd w:fill="F3F4F6" w:val="clear"/>
+        <w:spacing w:after="0" w:before="0" w:line="240"/>
+        <w:ind w:left="120"/>
+      </w:pPr>
+      <w:r>
+        <w:rPr>
+          <w:rFonts w:ascii="Consolas" w:cs="Consolas" w:eastAsia="Consolas" w:hAnsi="Consolas"/>
+          <w:color w:val="0F172A"/>
+          <w:sz w:val="17"/>
+          <w:szCs w:val="17"/>
+        </w:rPr>
+        <w:t xml:space="preserve">            - { name: POSTGRES_USER, value: auth_user }</w:t>
+      </w:r>
+    </w:p>
+    <w:p>
+      <w:pPr>
+        <w:pBdr>
+          <w:left w:val="single" w:color="CBD5E1" w:sz="16" w:space="8"/>
+        </w:pBdr>
+        <w:shd w:fill="F3F4F6" w:val="clear"/>
+        <w:spacing w:after="0" w:before="0" w:line="240"/>
+        <w:ind w:left="120"/>
+      </w:pPr>
+      <w:r>
+        <w:rPr>
+          <w:rFonts w:ascii="Consolas" w:cs="Consolas" w:eastAsia="Consolas" w:hAnsi="Consolas"/>
+          <w:color w:val="0F172A"/>
+          <w:sz w:val="17"/>
+          <w:szCs w:val="17"/>
+        </w:rPr>
+        <w:t xml:space="preserve">            - name: POSTGRES_PASSWORD</w:t>
+      </w:r>
+    </w:p>
+    <w:p>
+      <w:pPr>
+        <w:pBdr>
+          <w:left w:val="single" w:color="CBD5E1" w:sz="16" w:space="8"/>
+        </w:pBdr>
+        <w:shd w:fill="F3F4F6" w:val="clear"/>
+        <w:spacing w:after="0" w:before="0" w:line="240"/>
+        <w:ind w:left="120"/>
+      </w:pPr>
+      <w:r>
+        <w:rPr>
+          <w:rFonts w:ascii="Consolas" w:cs="Consolas" w:eastAsia="Consolas" w:hAnsi="Consolas"/>
+          <w:color w:val="0F172A"/>
+          <w:sz w:val="17"/>
+          <w:szCs w:val="17"/>
+        </w:rPr>
+        <w:t xml:space="preserve">              valueFrom: { secretKeyRef: { name: auth-postgres-secret, key: POSTGRES_PASSWORD } }</w:t>
+      </w:r>
+    </w:p>
+    <w:p>
+      <w:pPr>
+        <w:pBdr>
+          <w:left w:val="single" w:color="CBD5E1" w:sz="16" w:space="8"/>
+        </w:pBdr>
+        <w:shd w:fill="F3F4F6" w:val="clear"/>
+        <w:spacing w:after="0" w:before="0" w:line="240"/>
+        <w:ind w:left="120"/>
+      </w:pPr>
+      <w:r>
+        <w:rPr>
+          <w:rFonts w:ascii="Consolas" w:cs="Consolas" w:eastAsia="Consolas" w:hAnsi="Consolas"/>
+          <w:color w:val="0F172A"/>
+          <w:sz w:val="17"/>
+          <w:szCs w:val="17"/>
+        </w:rPr>
+        <w:t xml:space="preserve">          volumeMounts: [ { name: data, mountPath: /var/lib/postgresql/data } ]</w:t>
+      </w:r>
+    </w:p>
+    <w:p>
+      <w:pPr>
+        <w:pBdr>
+          <w:left w:val="single" w:color="CBD5E1" w:sz="16" w:space="8"/>
+        </w:pBdr>
+        <w:shd w:fill="F3F4F6" w:val="clear"/>
+        <w:spacing w:after="0" w:before="0" w:line="240"/>
+        <w:ind w:left="120"/>
+      </w:pPr>
+      <w:r>
+        <w:rPr>
+          <w:rFonts w:ascii="Consolas" w:cs="Consolas" w:eastAsia="Consolas" w:hAnsi="Consolas"/>
+          <w:color w:val="0F172A"/>
+          <w:sz w:val="17"/>
+          <w:szCs w:val="17"/>
+        </w:rPr>
+        <w:t xml:space="preserve">  volumeClaimTemplates:                # crea un PVC persistente por pod</w:t>
+      </w:r>
+    </w:p>
+    <w:p>
+      <w:pPr>
+        <w:pBdr>
+          <w:left w:val="single" w:color="CBD5E1" w:sz="16" w:space="8"/>
+        </w:pBdr>
+        <w:shd w:fill="F3F4F6" w:val="clear"/>
+        <w:spacing w:after="0" w:before="0" w:line="240"/>
+        <w:ind w:left="120"/>
+      </w:pPr>
+      <w:r>
+        <w:rPr>
+          <w:rFonts w:ascii="Consolas" w:cs="Consolas" w:eastAsia="Consolas" w:hAnsi="Consolas"/>
+          <w:color w:val="0F172A"/>
+          <w:sz w:val="17"/>
+          <w:szCs w:val="17"/>
+        </w:rPr>
+        <w:t xml:space="preserve">    - metadata: { name: data }</w:t>
+      </w:r>
+    </w:p>
+    <w:p>
+      <w:pPr>
+        <w:pBdr>
+          <w:left w:val="single" w:color="CBD5E1" w:sz="16" w:space="8"/>
+        </w:pBdr>
+        <w:shd w:fill="F3F4F6" w:val="clear"/>
+        <w:spacing w:after="150" w:before="0" w:line="240"/>
+        <w:ind w:left="120"/>
+      </w:pPr>
+      <w:r>
+        <w:rPr>
+          <w:rFonts w:ascii="Consolas" w:cs="Consolas" w:eastAsia="Consolas" w:hAnsi="Consolas"/>
+          <w:color w:val="0F172A"/>
+          <w:sz w:val="17"/>
+          <w:szCs w:val="17"/>
+        </w:rPr>
+        <w:t xml:space="preserve">      spec: { accessModes: [ReadWriteOnce], resources: { requests: { storage: 2Gi } } }</w:t>
+      </w:r>
+    </w:p>
+    <w:p>
+      <w:pPr>
+        <w:pStyle w:val="Heading2"/>
+      </w:pPr>
+      <w:r>
+        <w:rPr>
+          <w:rFonts w:ascii="Arial" w:cs="Arial" w:eastAsia="Arial" w:hAnsi="Arial"/>
+        </w:rPr>
+        <w:t xml:space="preserve">17.6 DaemonSet: Promtail (un agente de logs por nodo)</w:t>
+      </w:r>
+    </w:p>
+    <w:p>
+      <w:pPr>
+        <w:pBdr>
+          <w:left w:val="single" w:color="CBD5E1" w:sz="16" w:space="8"/>
+        </w:pBdr>
+        <w:shd w:fill="F3F4F6" w:val="clear"/>
+        <w:spacing w:after="0" w:before="40" w:line="240"/>
+        <w:ind w:left="120"/>
+      </w:pPr>
+      <w:r>
+        <w:rPr>
+          <w:rFonts w:ascii="Consolas" w:cs="Consolas" w:eastAsia="Consolas" w:hAnsi="Consolas"/>
+          <w:color w:val="0F172A"/>
+          <w:sz w:val="17"/>
+          <w:szCs w:val="17"/>
+        </w:rPr>
+        <w:t xml:space="preserve">apiVersion: apps/v1</w:t>
+      </w:r>
+    </w:p>
+    <w:p>
+      <w:pPr>
+        <w:pBdr>
+          <w:left w:val="single" w:color="CBD5E1" w:sz="16" w:space="8"/>
+        </w:pBdr>
+        <w:shd w:fill="F3F4F6" w:val="clear"/>
+        <w:spacing w:after="0" w:before="0" w:line="240"/>
+        <w:ind w:left="120"/>
+      </w:pPr>
+      <w:r>
+        <w:rPr>
+          <w:rFonts w:ascii="Consolas" w:cs="Consolas" w:eastAsia="Consolas" w:hAnsi="Consolas"/>
+          <w:color w:val="0F172A"/>
+          <w:sz w:val="17"/>
+          <w:szCs w:val="17"/>
+        </w:rPr>
+        <w:t xml:space="preserve">kind: DaemonSet                        # 1 pod en CADA nodo del cluster</w:t>
+      </w:r>
+    </w:p>
+    <w:p>
+      <w:pPr>
+        <w:pBdr>
+          <w:left w:val="single" w:color="CBD5E1" w:sz="16" w:space="8"/>
+        </w:pBdr>
+        <w:shd w:fill="F3F4F6" w:val="clear"/>
+        <w:spacing w:after="0" w:before="0" w:line="240"/>
+        <w:ind w:left="120"/>
+      </w:pPr>
+      <w:r>
+        <w:rPr>
+          <w:rFonts w:ascii="Consolas" w:cs="Consolas" w:eastAsia="Consolas" w:hAnsi="Consolas"/>
+          <w:color w:val="0F172A"/>
+          <w:sz w:val="17"/>
+          <w:szCs w:val="17"/>
+        </w:rPr>
+        <w:t xml:space="preserve">metadata: { name: promtail }</w:t>
+      </w:r>
+    </w:p>
+    <w:p>
+      <w:pPr>
+        <w:pBdr>
+          <w:left w:val="single" w:color="CBD5E1" w:sz="16" w:space="8"/>
+        </w:pBdr>
+        <w:shd w:fill="F3F4F6" w:val="clear"/>
+        <w:spacing w:after="0" w:before="0" w:line="240"/>
+        <w:ind w:left="120"/>
+      </w:pPr>
+      <w:r>
+        <w:rPr>
+          <w:rFonts w:ascii="Consolas" w:cs="Consolas" w:eastAsia="Consolas" w:hAnsi="Consolas"/>
+          <w:color w:val="0F172A"/>
+          <w:sz w:val="17"/>
+          <w:szCs w:val="17"/>
+        </w:rPr>
+        <w:t xml:space="preserve">spec:</w:t>
+      </w:r>
+    </w:p>
+    <w:p>
+      <w:pPr>
+        <w:pBdr>
+          <w:left w:val="single" w:color="CBD5E1" w:sz="16" w:space="8"/>
+        </w:pBdr>
+        <w:shd w:fill="F3F4F6" w:val="clear"/>
+        <w:spacing w:after="0" w:before="0" w:line="240"/>
+        <w:ind w:left="120"/>
+      </w:pPr>
+      <w:r>
+        <w:rPr>
+          <w:rFonts w:ascii="Consolas" w:cs="Consolas" w:eastAsia="Consolas" w:hAnsi="Consolas"/>
+          <w:color w:val="0F172A"/>
+          <w:sz w:val="17"/>
+          <w:szCs w:val="17"/>
+        </w:rPr>
+        <w:t xml:space="preserve">  selector: { matchLabels: { app.kubernetes.io/name: promtail } }</w:t>
+      </w:r>
+    </w:p>
+    <w:p>
+      <w:pPr>
+        <w:pBdr>
+          <w:left w:val="single" w:color="CBD5E1" w:sz="16" w:space="8"/>
+        </w:pBdr>
+        <w:shd w:fill="F3F4F6" w:val="clear"/>
+        <w:spacing w:after="0" w:before="0" w:line="240"/>
+        <w:ind w:left="120"/>
+      </w:pPr>
+      <w:r>
+        <w:rPr>
+          <w:rFonts w:ascii="Consolas" w:cs="Consolas" w:eastAsia="Consolas" w:hAnsi="Consolas"/>
+          <w:color w:val="0F172A"/>
+          <w:sz w:val="17"/>
+          <w:szCs w:val="17"/>
+        </w:rPr>
+        <w:t xml:space="preserve">  template:</w:t>
+      </w:r>
+    </w:p>
+    <w:p>
+      <w:pPr>
+        <w:pBdr>
+          <w:left w:val="single" w:color="CBD5E1" w:sz="16" w:space="8"/>
+        </w:pBdr>
+        <w:shd w:fill="F3F4F6" w:val="clear"/>
+        <w:spacing w:after="0" w:before="0" w:line="240"/>
+        <w:ind w:left="120"/>
+      </w:pPr>
+      <w:r>
+        <w:rPr>
+          <w:rFonts w:ascii="Consolas" w:cs="Consolas" w:eastAsia="Consolas" w:hAnsi="Consolas"/>
+          <w:color w:val="0F172A"/>
+          <w:sz w:val="17"/>
+          <w:szCs w:val="17"/>
+        </w:rPr>
+        <w:t xml:space="preserve">    spec:</w:t>
+      </w:r>
+    </w:p>
+    <w:p>
+      <w:pPr>
+        <w:pBdr>
+          <w:left w:val="single" w:color="CBD5E1" w:sz="16" w:space="8"/>
+        </w:pBdr>
+        <w:shd w:fill="F3F4F6" w:val="clear"/>
+        <w:spacing w:after="0" w:before="0" w:line="240"/>
+        <w:ind w:left="120"/>
+      </w:pPr>
+      <w:r>
+        <w:rPr>
+          <w:rFonts w:ascii="Consolas" w:cs="Consolas" w:eastAsia="Consolas" w:hAnsi="Consolas"/>
+          <w:color w:val="0F172A"/>
+          <w:sz w:val="17"/>
+          <w:szCs w:val="17"/>
+        </w:rPr>
+        <w:t xml:space="preserve">      serviceAccountName: promtail</w:t>
+      </w:r>
+    </w:p>
+    <w:p>
+      <w:pPr>
+        <w:pBdr>
+          <w:left w:val="single" w:color="CBD5E1" w:sz="16" w:space="8"/>
+        </w:pBdr>
+        <w:shd w:fill="F3F4F6" w:val="clear"/>
+        <w:spacing w:after="0" w:before="0" w:line="240"/>
+        <w:ind w:left="120"/>
+      </w:pPr>
+      <w:r>
+        <w:rPr>
+          <w:rFonts w:ascii="Consolas" w:cs="Consolas" w:eastAsia="Consolas" w:hAnsi="Consolas"/>
+          <w:color w:val="0F172A"/>
+          <w:sz w:val="17"/>
+          <w:szCs w:val="17"/>
+        </w:rPr>
+        <w:t xml:space="preserve">      containers:</w:t>
+      </w:r>
+    </w:p>
+    <w:p>
+      <w:pPr>
+        <w:pBdr>
+          <w:left w:val="single" w:color="CBD5E1" w:sz="16" w:space="8"/>
+        </w:pBdr>
+        <w:shd w:fill="F3F4F6" w:val="clear"/>
+        <w:spacing w:after="0" w:before="0" w:line="240"/>
+        <w:ind w:left="120"/>
+      </w:pPr>
+      <w:r>
+        <w:rPr>
+          <w:rFonts w:ascii="Consolas" w:cs="Consolas" w:eastAsia="Consolas" w:hAnsi="Consolas"/>
+          <w:color w:val="0F172A"/>
+          <w:sz w:val="17"/>
+          <w:szCs w:val="17"/>
+        </w:rPr>
+        <w:t xml:space="preserve">        - name: promtail</w:t>
+      </w:r>
+    </w:p>
+    <w:p>
+      <w:pPr>
+        <w:pBdr>
+          <w:left w:val="single" w:color="CBD5E1" w:sz="16" w:space="8"/>
+        </w:pBdr>
+        <w:shd w:fill="F3F4F6" w:val="clear"/>
+        <w:spacing w:after="0" w:before="0" w:line="240"/>
+        <w:ind w:left="120"/>
+      </w:pPr>
+      <w:r>
+        <w:rPr>
+          <w:rFonts w:ascii="Consolas" w:cs="Consolas" w:eastAsia="Consolas" w:hAnsi="Consolas"/>
+          <w:color w:val="0F172A"/>
+          <w:sz w:val="17"/>
+          <w:szCs w:val="17"/>
+        </w:rPr>
+        <w:t xml:space="preserve">          image: grafana/promtail:3.1.1</w:t>
+      </w:r>
+    </w:p>
+    <w:p>
+      <w:pPr>
+        <w:pBdr>
+          <w:left w:val="single" w:color="CBD5E1" w:sz="16" w:space="8"/>
+        </w:pBdr>
+        <w:shd w:fill="F3F4F6" w:val="clear"/>
+        <w:spacing w:after="0" w:before="0" w:line="240"/>
+        <w:ind w:left="120"/>
+      </w:pPr>
+      <w:r>
+        <w:rPr>
+          <w:rFonts w:ascii="Consolas" w:cs="Consolas" w:eastAsia="Consolas" w:hAnsi="Consolas"/>
+          <w:color w:val="0F172A"/>
+          <w:sz w:val="17"/>
+          <w:szCs w:val="17"/>
+        </w:rPr>
+        <w:t xml:space="preserve">          args: [ -config.file=/etc/promtail/promtail.yaml ]</w:t>
+      </w:r>
+    </w:p>
+    <w:p>
+      <w:pPr>
+        <w:pBdr>
+          <w:left w:val="single" w:color="CBD5E1" w:sz="16" w:space="8"/>
+        </w:pBdr>
+        <w:shd w:fill="F3F4F6" w:val="clear"/>
+        <w:spacing w:after="0" w:before="0" w:line="240"/>
+        <w:ind w:left="120"/>
+      </w:pPr>
+      <w:r>
+        <w:rPr>
+          <w:rFonts w:ascii="Consolas" w:cs="Consolas" w:eastAsia="Consolas" w:hAnsi="Consolas"/>
+          <w:color w:val="0F172A"/>
+          <w:sz w:val="17"/>
+          <w:szCs w:val="17"/>
+        </w:rPr>
+        <w:t xml:space="preserve">          volumeMounts:</w:t>
+      </w:r>
+    </w:p>
+    <w:p>
+      <w:pPr>
+        <w:pBdr>
+          <w:left w:val="single" w:color="CBD5E1" w:sz="16" w:space="8"/>
+        </w:pBdr>
+        <w:shd w:fill="F3F4F6" w:val="clear"/>
+        <w:spacing w:after="0" w:before="0" w:line="240"/>
+        <w:ind w:left="120"/>
+      </w:pPr>
+      <w:r>
+        <w:rPr>
+          <w:rFonts w:ascii="Consolas" w:cs="Consolas" w:eastAsia="Consolas" w:hAnsi="Consolas"/>
+          <w:color w:val="0F172A"/>
+          <w:sz w:val="17"/>
+          <w:szCs w:val="17"/>
+        </w:rPr>
+        <w:t xml:space="preserve">            - { name: varlog, mountPath: /var/log, readOnly: true }</w:t>
+      </w:r>
+    </w:p>
+    <w:p>
+      <w:pPr>
+        <w:pBdr>
+          <w:left w:val="single" w:color="CBD5E1" w:sz="16" w:space="8"/>
+        </w:pBdr>
+        <w:shd w:fill="F3F4F6" w:val="clear"/>
+        <w:spacing w:after="0" w:before="0" w:line="240"/>
+        <w:ind w:left="120"/>
+      </w:pPr>
+      <w:r>
+        <w:rPr>
+          <w:rFonts w:ascii="Consolas" w:cs="Consolas" w:eastAsia="Consolas" w:hAnsi="Consolas"/>
+          <w:color w:val="0F172A"/>
+          <w:sz w:val="17"/>
+          <w:szCs w:val="17"/>
+        </w:rPr>
+        <w:t xml:space="preserve">            - { name: pods,   mountPath: /var/log/pods, readOnly: true }</w:t>
+      </w:r>
+    </w:p>
+    <w:p>
+      <w:pPr>
+        <w:pBdr>
+          <w:left w:val="single" w:color="CBD5E1" w:sz="16" w:space="8"/>
+        </w:pBdr>
+        <w:shd w:fill="F3F4F6" w:val="clear"/>
+        <w:spacing w:after="0" w:before="0" w:line="240"/>
+        <w:ind w:left="120"/>
+      </w:pPr>
+      <w:r>
+        <w:rPr>
+          <w:rFonts w:ascii="Consolas" w:cs="Consolas" w:eastAsia="Consolas" w:hAnsi="Consolas"/>
+          <w:color w:val="0F172A"/>
+          <w:sz w:val="17"/>
+          <w:szCs w:val="17"/>
+        </w:rPr>
+        <w:t xml:space="preserve">      volumes:</w:t>
+      </w:r>
+    </w:p>
+    <w:p>
+      <w:pPr>
+        <w:pBdr>
+          <w:left w:val="single" w:color="CBD5E1" w:sz="16" w:space="8"/>
+        </w:pBdr>
+        <w:shd w:fill="F3F4F6" w:val="clear"/>
+        <w:spacing w:after="0" w:before="0" w:line="240"/>
+        <w:ind w:left="120"/>
+      </w:pPr>
+      <w:r>
+        <w:rPr>
+          <w:rFonts w:ascii="Consolas" w:cs="Consolas" w:eastAsia="Consolas" w:hAnsi="Consolas"/>
+          <w:color w:val="0F172A"/>
+          <w:sz w:val="17"/>
+          <w:szCs w:val="17"/>
+        </w:rPr>
+        <w:t xml:space="preserve">        - { name: varlog, hostPath: { path: /var/log } }</w:t>
+      </w:r>
+    </w:p>
+    <w:p>
+      <w:pPr>
+        <w:pBdr>
+          <w:left w:val="single" w:color="CBD5E1" w:sz="16" w:space="8"/>
+        </w:pBdr>
+        <w:shd w:fill="F3F4F6" w:val="clear"/>
+        <w:spacing w:after="150" w:before="0" w:line="240"/>
+        <w:ind w:left="120"/>
+      </w:pPr>
+      <w:r>
+        <w:rPr>
+          <w:rFonts w:ascii="Consolas" w:cs="Consolas" w:eastAsia="Consolas" w:hAnsi="Consolas"/>
+          <w:color w:val="0F172A"/>
+          <w:sz w:val="17"/>
+          <w:szCs w:val="17"/>
+        </w:rPr>
+        <w:t xml:space="preserve">        - { name: pods,   hostPath: { path: /var/log/pods } }</w:t>
+      </w:r>
+    </w:p>
+    <w:p>
+      <w:pPr>
+        <w:pStyle w:val="Heading2"/>
+      </w:pPr>
+      <w:r>
+        <w:rPr>
+          <w:rFonts w:ascii="Arial" w:cs="Arial" w:eastAsia="Arial" w:hAnsi="Arial"/>
+        </w:rPr>
+        <w:t xml:space="preserve">17.7 RBAC de las aplicaciones (mínimo privilegio)</w:t>
+      </w:r>
+    </w:p>
+    <w:p>
+      <w:pPr>
+        <w:pBdr>
+          <w:left w:val="single" w:color="CBD5E1" w:sz="16" w:space="8"/>
+        </w:pBdr>
+        <w:shd w:fill="F3F4F6" w:val="clear"/>
+        <w:spacing w:after="0" w:before="40" w:line="240"/>
+        <w:ind w:left="120"/>
+      </w:pPr>
+      <w:r>
+        <w:rPr>
+          <w:rFonts w:ascii="Consolas" w:cs="Consolas" w:eastAsia="Consolas" w:hAnsi="Consolas"/>
+          <w:color w:val="0F172A"/>
+          <w:sz w:val="17"/>
+          <w:szCs w:val="17"/>
+        </w:rPr>
+        <w:t xml:space="preserve">apiVersion: v1</w:t>
+      </w:r>
+    </w:p>
+    <w:p>
+      <w:pPr>
+        <w:pBdr>
+          <w:left w:val="single" w:color="CBD5E1" w:sz="16" w:space="8"/>
+        </w:pBdr>
+        <w:shd w:fill="F3F4F6" w:val="clear"/>
+        <w:spacing w:after="0" w:before="0" w:line="240"/>
+        <w:ind w:left="120"/>
+      </w:pPr>
+      <w:r>
+        <w:rPr>
+          <w:rFonts w:ascii="Consolas" w:cs="Consolas" w:eastAsia="Consolas" w:hAnsi="Consolas"/>
+          <w:color w:val="0F172A"/>
+          <w:sz w:val="17"/>
+          <w:szCs w:val="17"/>
+        </w:rPr>
+        <w:t xml:space="preserve">kind: ServiceAccount</w:t>
+      </w:r>
+    </w:p>
+    <w:p>
+      <w:pPr>
+        <w:pBdr>
+          <w:left w:val="single" w:color="CBD5E1" w:sz="16" w:space="8"/>
+        </w:pBdr>
+        <w:shd w:fill="F3F4F6" w:val="clear"/>
+        <w:spacing w:after="0" w:before="0" w:line="240"/>
+        <w:ind w:left="120"/>
+      </w:pPr>
+      <w:r>
+        <w:rPr>
+          <w:rFonts w:ascii="Consolas" w:cs="Consolas" w:eastAsia="Consolas" w:hAnsi="Consolas"/>
+          <w:color w:val="0F172A"/>
+          <w:sz w:val="17"/>
+          <w:szCs w:val="17"/>
+        </w:rPr>
+        <w:t xml:space="preserve">metadata: { name: bookplus-app }</w:t>
+      </w:r>
+    </w:p>
+    <w:p>
+      <w:pPr>
+        <w:pBdr>
+          <w:left w:val="single" w:color="CBD5E1" w:sz="16" w:space="8"/>
+        </w:pBdr>
+        <w:shd w:fill="F3F4F6" w:val="clear"/>
+        <w:spacing w:after="0" w:before="0" w:line="240"/>
+        <w:ind w:left="120"/>
+      </w:pPr>
+      <w:r>
+        <w:rPr>
+          <w:rFonts w:ascii="Consolas" w:cs="Consolas" w:eastAsia="Consolas" w:hAnsi="Consolas"/>
+          <w:color w:val="0F172A"/>
+          <w:sz w:val="17"/>
+          <w:szCs w:val="17"/>
+        </w:rPr>
+        <w:t xml:space="preserve">automountServiceAccountToken: false      # las apps no llaman al API de K8s</w:t>
+      </w:r>
+    </w:p>
+    <w:p>
+      <w:pPr>
+        <w:pBdr>
+          <w:left w:val="single" w:color="CBD5E1" w:sz="16" w:space="8"/>
+        </w:pBdr>
+        <w:shd w:fill="F3F4F6" w:val="clear"/>
+        <w:spacing w:after="0" w:before="0" w:line="240"/>
+        <w:ind w:left="120"/>
+      </w:pPr>
+      <w:r>
+        <w:rPr>
+          <w:rFonts w:ascii="Consolas" w:cs="Consolas" w:eastAsia="Consolas" w:hAnsi="Consolas"/>
+          <w:color w:val="0F172A"/>
+          <w:sz w:val="17"/>
+          <w:szCs w:val="17"/>
+        </w:rPr>
+        <w:t xml:space="preserve">---</w:t>
+      </w:r>
+    </w:p>
+    <w:p>
+      <w:pPr>
+        <w:pBdr>
+          <w:left w:val="single" w:color="CBD5E1" w:sz="16" w:space="8"/>
+        </w:pBdr>
+        <w:shd w:fill="F3F4F6" w:val="clear"/>
+        <w:spacing w:after="0" w:before="0" w:line="240"/>
+        <w:ind w:left="120"/>
+      </w:pPr>
+      <w:r>
+        <w:rPr>
+          <w:rFonts w:ascii="Consolas" w:cs="Consolas" w:eastAsia="Consolas" w:hAnsi="Consolas"/>
+          <w:color w:val="0F172A"/>
+          <w:sz w:val="17"/>
+          <w:szCs w:val="17"/>
+        </w:rPr>
+        <w:t xml:space="preserve">apiVersion: rbac.authorization.k8s.io/v1</w:t>
+      </w:r>
+    </w:p>
+    <w:p>
+      <w:pPr>
+        <w:pBdr>
+          <w:left w:val="single" w:color="CBD5E1" w:sz="16" w:space="8"/>
+        </w:pBdr>
+        <w:shd w:fill="F3F4F6" w:val="clear"/>
+        <w:spacing w:after="0" w:before="0" w:line="240"/>
+        <w:ind w:left="120"/>
+      </w:pPr>
+      <w:r>
+        <w:rPr>
+          <w:rFonts w:ascii="Consolas" w:cs="Consolas" w:eastAsia="Consolas" w:hAnsi="Consolas"/>
+          <w:color w:val="0F172A"/>
+          <w:sz w:val="17"/>
+          <w:szCs w:val="17"/>
+        </w:rPr>
+        <w:t xml:space="preserve">kind: Role</w:t>
+      </w:r>
+    </w:p>
+    <w:p>
+      <w:pPr>
+        <w:pBdr>
+          <w:left w:val="single" w:color="CBD5E1" w:sz="16" w:space="8"/>
+        </w:pBdr>
+        <w:shd w:fill="F3F4F6" w:val="clear"/>
+        <w:spacing w:after="0" w:before="0" w:line="240"/>
+        <w:ind w:left="120"/>
+      </w:pPr>
+      <w:r>
+        <w:rPr>
+          <w:rFonts w:ascii="Consolas" w:cs="Consolas" w:eastAsia="Consolas" w:hAnsi="Consolas"/>
+          <w:color w:val="0F172A"/>
+          <w:sz w:val="17"/>
+          <w:szCs w:val="17"/>
+        </w:rPr>
+        <w:t xml:space="preserve">metadata: { name: bookplus-app-read }</w:t>
+      </w:r>
+    </w:p>
+    <w:p>
+      <w:pPr>
+        <w:pBdr>
+          <w:left w:val="single" w:color="CBD5E1" w:sz="16" w:space="8"/>
+        </w:pBdr>
+        <w:shd w:fill="F3F4F6" w:val="clear"/>
+        <w:spacing w:after="0" w:before="0" w:line="240"/>
+        <w:ind w:left="120"/>
+      </w:pPr>
+      <w:r>
+        <w:rPr>
+          <w:rFonts w:ascii="Consolas" w:cs="Consolas" w:eastAsia="Consolas" w:hAnsi="Consolas"/>
+          <w:color w:val="0F172A"/>
+          <w:sz w:val="17"/>
+          <w:szCs w:val="17"/>
+        </w:rPr>
+        <w:t xml:space="preserve">rules:</w:t>
+      </w:r>
+    </w:p>
+    <w:p>
+      <w:pPr>
+        <w:pBdr>
+          <w:left w:val="single" w:color="CBD5E1" w:sz="16" w:space="8"/>
+        </w:pBdr>
+        <w:shd w:fill="F3F4F6" w:val="clear"/>
+        <w:spacing w:after="0" w:before="0" w:line="240"/>
+        <w:ind w:left="120"/>
+      </w:pPr>
+      <w:r>
+        <w:rPr>
+          <w:rFonts w:ascii="Consolas" w:cs="Consolas" w:eastAsia="Consolas" w:hAnsi="Consolas"/>
+          <w:color w:val="0F172A"/>
+          <w:sz w:val="17"/>
+          <w:szCs w:val="17"/>
+        </w:rPr>
+        <w:t xml:space="preserve">  - apiGroups: [""]</w:t>
+      </w:r>
+    </w:p>
+    <w:p>
+      <w:pPr>
+        <w:pBdr>
+          <w:left w:val="single" w:color="CBD5E1" w:sz="16" w:space="8"/>
+        </w:pBdr>
+        <w:shd w:fill="F3F4F6" w:val="clear"/>
+        <w:spacing w:after="0" w:before="0" w:line="240"/>
+        <w:ind w:left="120"/>
+      </w:pPr>
+      <w:r>
+        <w:rPr>
+          <w:rFonts w:ascii="Consolas" w:cs="Consolas" w:eastAsia="Consolas" w:hAnsi="Consolas"/>
+          <w:color w:val="0F172A"/>
+          <w:sz w:val="17"/>
+          <w:szCs w:val="17"/>
+        </w:rPr>
+        <w:t xml:space="preserve">    resources: [configmaps, endpoints, services]</w:t>
+      </w:r>
+    </w:p>
+    <w:p>
+      <w:pPr>
+        <w:pBdr>
+          <w:left w:val="single" w:color="CBD5E1" w:sz="16" w:space="8"/>
+        </w:pBdr>
+        <w:shd w:fill="F3F4F6" w:val="clear"/>
+        <w:spacing w:after="0" w:before="0" w:line="240"/>
+        <w:ind w:left="120"/>
+      </w:pPr>
+      <w:r>
+        <w:rPr>
+          <w:rFonts w:ascii="Consolas" w:cs="Consolas" w:eastAsia="Consolas" w:hAnsi="Consolas"/>
+          <w:color w:val="0F172A"/>
+          <w:sz w:val="17"/>
+          <w:szCs w:val="17"/>
+        </w:rPr>
+        <w:t xml:space="preserve">    verbs: [get, list, watch]           # solo lectura</w:t>
+      </w:r>
+    </w:p>
+    <w:p>
+      <w:pPr>
+        <w:pBdr>
+          <w:left w:val="single" w:color="CBD5E1" w:sz="16" w:space="8"/>
+        </w:pBdr>
+        <w:shd w:fill="F3F4F6" w:val="clear"/>
+        <w:spacing w:after="0" w:before="0" w:line="240"/>
+        <w:ind w:left="120"/>
+      </w:pPr>
+      <w:r>
+        <w:rPr>
+          <w:rFonts w:ascii="Consolas" w:cs="Consolas" w:eastAsia="Consolas" w:hAnsi="Consolas"/>
+          <w:color w:val="0F172A"/>
+          <w:sz w:val="17"/>
+          <w:szCs w:val="17"/>
+        </w:rPr>
+        <w:t xml:space="preserve">---</w:t>
+      </w:r>
+    </w:p>
+    <w:p>
+      <w:pPr>
+        <w:pBdr>
+          <w:left w:val="single" w:color="CBD5E1" w:sz="16" w:space="8"/>
+        </w:pBdr>
+        <w:shd w:fill="F3F4F6" w:val="clear"/>
+        <w:spacing w:after="0" w:before="0" w:line="240"/>
+        <w:ind w:left="120"/>
+      </w:pPr>
+      <w:r>
+        <w:rPr>
+          <w:rFonts w:ascii="Consolas" w:cs="Consolas" w:eastAsia="Consolas" w:hAnsi="Consolas"/>
+          <w:color w:val="0F172A"/>
+          <w:sz w:val="17"/>
+          <w:szCs w:val="17"/>
+        </w:rPr>
+        <w:t xml:space="preserve">apiVersion: rbac.authorization.k8s.io/v1</w:t>
+      </w:r>
+    </w:p>
+    <w:p>
+      <w:pPr>
+        <w:pBdr>
+          <w:left w:val="single" w:color="CBD5E1" w:sz="16" w:space="8"/>
+        </w:pBdr>
+        <w:shd w:fill="F3F4F6" w:val="clear"/>
+        <w:spacing w:after="0" w:before="0" w:line="240"/>
+        <w:ind w:left="120"/>
+      </w:pPr>
+      <w:r>
+        <w:rPr>
+          <w:rFonts w:ascii="Consolas" w:cs="Consolas" w:eastAsia="Consolas" w:hAnsi="Consolas"/>
+          <w:color w:val="0F172A"/>
+          <w:sz w:val="17"/>
+          <w:szCs w:val="17"/>
+        </w:rPr>
+        <w:t xml:space="preserve">kind: RoleBinding</w:t>
+      </w:r>
+    </w:p>
+    <w:p>
+      <w:pPr>
+        <w:pBdr>
+          <w:left w:val="single" w:color="CBD5E1" w:sz="16" w:space="8"/>
+        </w:pBdr>
+        <w:shd w:fill="F3F4F6" w:val="clear"/>
+        <w:spacing w:after="0" w:before="0" w:line="240"/>
+        <w:ind w:left="120"/>
+      </w:pPr>
+      <w:r>
+        <w:rPr>
+          <w:rFonts w:ascii="Consolas" w:cs="Consolas" w:eastAsia="Consolas" w:hAnsi="Consolas"/>
+          <w:color w:val="0F172A"/>
+          <w:sz w:val="17"/>
+          <w:szCs w:val="17"/>
+        </w:rPr>
+        <w:t xml:space="preserve">metadata: { name: bookplus-app-read }</w:t>
+      </w:r>
+    </w:p>
+    <w:p>
+      <w:pPr>
+        <w:pBdr>
+          <w:left w:val="single" w:color="CBD5E1" w:sz="16" w:space="8"/>
+        </w:pBdr>
+        <w:shd w:fill="F3F4F6" w:val="clear"/>
+        <w:spacing w:after="0" w:before="0" w:line="240"/>
+        <w:ind w:left="120"/>
+      </w:pPr>
+      <w:r>
+        <w:rPr>
+          <w:rFonts w:ascii="Consolas" w:cs="Consolas" w:eastAsia="Consolas" w:hAnsi="Consolas"/>
+          <w:color w:val="0F172A"/>
+          <w:sz w:val="17"/>
+          <w:szCs w:val="17"/>
+        </w:rPr>
+        <w:t xml:space="preserve">roleRef:  { apiGroup: rbac.authorization.k8s.io, kind: Role, name: bookplus-app-read }</w:t>
+      </w:r>
+    </w:p>
+    <w:p>
+      <w:pPr>
+        <w:pBdr>
+          <w:left w:val="single" w:color="CBD5E1" w:sz="16" w:space="8"/>
+        </w:pBdr>
+        <w:shd w:fill="F3F4F6" w:val="clear"/>
+        <w:spacing w:after="150" w:before="0" w:line="240"/>
+        <w:ind w:left="120"/>
+      </w:pPr>
+      <w:r>
+        <w:rPr>
+          <w:rFonts w:ascii="Consolas" w:cs="Consolas" w:eastAsia="Consolas" w:hAnsi="Consolas"/>
+          <w:color w:val="0F172A"/>
+          <w:sz w:val="17"/>
+          <w:szCs w:val="17"/>
+        </w:rPr>
+        <w:t xml:space="preserve">subjects: [ { kind: ServiceAccount, name: bookplus-app, namespace: bookplus } ]</w:t>
+      </w:r>
+    </w:p>
+    <w:p>
+      <w:pPr>
+        <w:pStyle w:val="Heading2"/>
+      </w:pPr>
+      <w:r>
+        <w:rPr>
+          <w:rFonts w:ascii="Arial" w:cs="Arial" w:eastAsia="Arial" w:hAnsi="Arial"/>
+        </w:rPr>
+        <w:t xml:space="preserve">17.8 NetworkPolicy (segmentación de red, zero-trust)</w:t>
+      </w:r>
+    </w:p>
+    <w:p>
+      <w:pPr>
+        <w:pBdr>
+          <w:left w:val="single" w:color="CBD5E1" w:sz="16" w:space="8"/>
+        </w:pBdr>
+        <w:shd w:fill="F3F4F6" w:val="clear"/>
+        <w:spacing w:after="0" w:before="40" w:line="240"/>
+        <w:ind w:left="120"/>
+      </w:pPr>
+      <w:r>
+        <w:rPr>
+          <w:rFonts w:ascii="Consolas" w:cs="Consolas" w:eastAsia="Consolas" w:hAnsi="Consolas"/>
+          <w:color w:val="0F172A"/>
+          <w:sz w:val="17"/>
+          <w:szCs w:val="17"/>
+        </w:rPr>
+        <w:t xml:space="preserve"># 1) Denegar TODO el trafico entrante por defecto</w:t>
+      </w:r>
+    </w:p>
+    <w:p>
+      <w:pPr>
+        <w:pBdr>
+          <w:left w:val="single" w:color="CBD5E1" w:sz="16" w:space="8"/>
+        </w:pBdr>
+        <w:shd w:fill="F3F4F6" w:val="clear"/>
+        <w:spacing w:after="0" w:before="0" w:line="240"/>
+        <w:ind w:left="120"/>
+      </w:pPr>
+      <w:r>
+        <w:rPr>
+          <w:rFonts w:ascii="Consolas" w:cs="Consolas" w:eastAsia="Consolas" w:hAnsi="Consolas"/>
+          <w:color w:val="0F172A"/>
+          <w:sz w:val="17"/>
+          <w:szCs w:val="17"/>
+        </w:rPr>
+        <w:t xml:space="preserve">apiVersion: networking.k8s.io/v1</w:t>
+      </w:r>
+    </w:p>
+    <w:p>
+      <w:pPr>
+        <w:pBdr>
+          <w:left w:val="single" w:color="CBD5E1" w:sz="16" w:space="8"/>
+        </w:pBdr>
+        <w:shd w:fill="F3F4F6" w:val="clear"/>
+        <w:spacing w:after="0" w:before="0" w:line="240"/>
+        <w:ind w:left="120"/>
+      </w:pPr>
+      <w:r>
+        <w:rPr>
+          <w:rFonts w:ascii="Consolas" w:cs="Consolas" w:eastAsia="Consolas" w:hAnsi="Consolas"/>
+          <w:color w:val="0F172A"/>
+          <w:sz w:val="17"/>
+          <w:szCs w:val="17"/>
+        </w:rPr>
+        <w:t xml:space="preserve">kind: NetworkPolicy</w:t>
+      </w:r>
+    </w:p>
+    <w:p>
+      <w:pPr>
+        <w:pBdr>
+          <w:left w:val="single" w:color="CBD5E1" w:sz="16" w:space="8"/>
+        </w:pBdr>
+        <w:shd w:fill="F3F4F6" w:val="clear"/>
+        <w:spacing w:after="0" w:before="0" w:line="240"/>
+        <w:ind w:left="120"/>
+      </w:pPr>
+      <w:r>
+        <w:rPr>
+          <w:rFonts w:ascii="Consolas" w:cs="Consolas" w:eastAsia="Consolas" w:hAnsi="Consolas"/>
+          <w:color w:val="0F172A"/>
+          <w:sz w:val="17"/>
+          <w:szCs w:val="17"/>
+        </w:rPr>
+        <w:t xml:space="preserve">metadata: { name: default-deny-ingress }</w:t>
+      </w:r>
+    </w:p>
+    <w:p>
+      <w:pPr>
+        <w:pBdr>
+          <w:left w:val="single" w:color="CBD5E1" w:sz="16" w:space="8"/>
+        </w:pBdr>
+        <w:shd w:fill="F3F4F6" w:val="clear"/>
+        <w:spacing w:after="0" w:before="0" w:line="240"/>
+        <w:ind w:left="120"/>
+      </w:pPr>
+      <w:r>
+        <w:rPr>
+          <w:rFonts w:ascii="Consolas" w:cs="Consolas" w:eastAsia="Consolas" w:hAnsi="Consolas"/>
+          <w:color w:val="0F172A"/>
+          <w:sz w:val="17"/>
+          <w:szCs w:val="17"/>
+        </w:rPr>
+        <w:t xml:space="preserve">spec: { podSelector: {}, policyTypes: [Ingress] }</w:t>
+      </w:r>
+    </w:p>
+    <w:p>
+      <w:pPr>
+        <w:pBdr>
+          <w:left w:val="single" w:color="CBD5E1" w:sz="16" w:space="8"/>
+        </w:pBdr>
+        <w:shd w:fill="F3F4F6" w:val="clear"/>
+        <w:spacing w:after="0" w:before="0" w:line="240"/>
+        <w:ind w:left="120"/>
+      </w:pPr>
+      <w:r>
+        <w:rPr>
+          <w:rFonts w:ascii="Consolas" w:cs="Consolas" w:eastAsia="Consolas" w:hAnsi="Consolas"/>
+          <w:color w:val="0F172A"/>
+          <w:sz w:val="17"/>
+          <w:szCs w:val="17"/>
+        </w:rPr>
+        <w:t xml:space="preserve">---</w:t>
+      </w:r>
+    </w:p>
+    <w:p>
+      <w:pPr>
+        <w:pBdr>
+          <w:left w:val="single" w:color="CBD5E1" w:sz="16" w:space="8"/>
+        </w:pBdr>
+        <w:shd w:fill="F3F4F6" w:val="clear"/>
+        <w:spacing w:after="0" w:before="0" w:line="240"/>
+        <w:ind w:left="120"/>
+      </w:pPr>
+      <w:r>
+        <w:rPr>
+          <w:rFonts w:ascii="Consolas" w:cs="Consolas" w:eastAsia="Consolas" w:hAnsi="Consolas"/>
+          <w:color w:val="0F172A"/>
+          <w:sz w:val="17"/>
+          <w:szCs w:val="17"/>
+        </w:rPr>
+        <w:t xml:space="preserve"># 2) Permitir trafico solo entre pods del mismo namespace</w:t>
+      </w:r>
+    </w:p>
+    <w:p>
+      <w:pPr>
+        <w:pBdr>
+          <w:left w:val="single" w:color="CBD5E1" w:sz="16" w:space="8"/>
+        </w:pBdr>
+        <w:shd w:fill="F3F4F6" w:val="clear"/>
+        <w:spacing w:after="0" w:before="0" w:line="240"/>
+        <w:ind w:left="120"/>
+      </w:pPr>
+      <w:r>
+        <w:rPr>
+          <w:rFonts w:ascii="Consolas" w:cs="Consolas" w:eastAsia="Consolas" w:hAnsi="Consolas"/>
+          <w:color w:val="0F172A"/>
+          <w:sz w:val="17"/>
+          <w:szCs w:val="17"/>
+        </w:rPr>
+        <w:t xml:space="preserve">apiVersion: networking.k8s.io/v1</w:t>
+      </w:r>
+    </w:p>
+    <w:p>
+      <w:pPr>
+        <w:pBdr>
+          <w:left w:val="single" w:color="CBD5E1" w:sz="16" w:space="8"/>
+        </w:pBdr>
+        <w:shd w:fill="F3F4F6" w:val="clear"/>
+        <w:spacing w:after="0" w:before="0" w:line="240"/>
+        <w:ind w:left="120"/>
+      </w:pPr>
+      <w:r>
+        <w:rPr>
+          <w:rFonts w:ascii="Consolas" w:cs="Consolas" w:eastAsia="Consolas" w:hAnsi="Consolas"/>
+          <w:color w:val="0F172A"/>
+          <w:sz w:val="17"/>
+          <w:szCs w:val="17"/>
+        </w:rPr>
+        <w:t xml:space="preserve">kind: NetworkPolicy</w:t>
+      </w:r>
+    </w:p>
+    <w:p>
+      <w:pPr>
+        <w:pBdr>
+          <w:left w:val="single" w:color="CBD5E1" w:sz="16" w:space="8"/>
+        </w:pBdr>
+        <w:shd w:fill="F3F4F6" w:val="clear"/>
+        <w:spacing w:after="0" w:before="0" w:line="240"/>
+        <w:ind w:left="120"/>
+      </w:pPr>
+      <w:r>
+        <w:rPr>
+          <w:rFonts w:ascii="Consolas" w:cs="Consolas" w:eastAsia="Consolas" w:hAnsi="Consolas"/>
+          <w:color w:val="0F172A"/>
+          <w:sz w:val="17"/>
+          <w:szCs w:val="17"/>
+        </w:rPr>
+        <w:t xml:space="preserve">metadata: { name: allow-same-namespace }</w:t>
+      </w:r>
+    </w:p>
+    <w:p>
+      <w:pPr>
+        <w:pBdr>
+          <w:left w:val="single" w:color="CBD5E1" w:sz="16" w:space="8"/>
+        </w:pBdr>
+        <w:shd w:fill="F3F4F6" w:val="clear"/>
+        <w:spacing w:after="0" w:before="0" w:line="240"/>
+        <w:ind w:left="120"/>
+      </w:pPr>
+      <w:r>
+        <w:rPr>
+          <w:rFonts w:ascii="Consolas" w:cs="Consolas" w:eastAsia="Consolas" w:hAnsi="Consolas"/>
+          <w:color w:val="0F172A"/>
+          <w:sz w:val="17"/>
+          <w:szCs w:val="17"/>
+        </w:rPr>
+        <w:t xml:space="preserve">spec:</w:t>
+      </w:r>
+    </w:p>
+    <w:p>
+      <w:pPr>
+        <w:pBdr>
+          <w:left w:val="single" w:color="CBD5E1" w:sz="16" w:space="8"/>
+        </w:pBdr>
+        <w:shd w:fill="F3F4F6" w:val="clear"/>
+        <w:spacing w:after="0" w:before="0" w:line="240"/>
+        <w:ind w:left="120"/>
+      </w:pPr>
+      <w:r>
+        <w:rPr>
+          <w:rFonts w:ascii="Consolas" w:cs="Consolas" w:eastAsia="Consolas" w:hAnsi="Consolas"/>
+          <w:color w:val="0F172A"/>
+          <w:sz w:val="17"/>
+          <w:szCs w:val="17"/>
+        </w:rPr>
+        <w:t xml:space="preserve">  podSelector: {}</w:t>
+      </w:r>
+    </w:p>
+    <w:p>
+      <w:pPr>
+        <w:pBdr>
+          <w:left w:val="single" w:color="CBD5E1" w:sz="16" w:space="8"/>
+        </w:pBdr>
+        <w:shd w:fill="F3F4F6" w:val="clear"/>
+        <w:spacing w:after="0" w:before="0" w:line="240"/>
+        <w:ind w:left="120"/>
+      </w:pPr>
+      <w:r>
+        <w:rPr>
+          <w:rFonts w:ascii="Consolas" w:cs="Consolas" w:eastAsia="Consolas" w:hAnsi="Consolas"/>
+          <w:color w:val="0F172A"/>
+          <w:sz w:val="17"/>
+          <w:szCs w:val="17"/>
+        </w:rPr>
+        <w:t xml:space="preserve">  policyTypes: [Ingress]</w:t>
+      </w:r>
+    </w:p>
+    <w:p>
+      <w:pPr>
+        <w:pBdr>
+          <w:left w:val="single" w:color="CBD5E1" w:sz="16" w:space="8"/>
+        </w:pBdr>
+        <w:shd w:fill="F3F4F6" w:val="clear"/>
+        <w:spacing w:after="150" w:before="0" w:line="240"/>
+        <w:ind w:left="120"/>
+      </w:pPr>
+      <w:r>
+        <w:rPr>
+          <w:rFonts w:ascii="Consolas" w:cs="Consolas" w:eastAsia="Consolas" w:hAnsi="Consolas"/>
+          <w:color w:val="0F172A"/>
+          <w:sz w:val="17"/>
+          <w:szCs w:val="17"/>
+        </w:rPr>
+        <w:t xml:space="preserve">  ingress: [ { from: [ { podSelector: {} } ] } ]</w:t>
+      </w:r>
+    </w:p>
+    <w:p>
+      <w:pPr>
+        <w:pStyle w:val="Heading2"/>
+      </w:pPr>
+      <w:r>
+        <w:rPr>
+          <w:rFonts w:ascii="Arial" w:cs="Arial" w:eastAsia="Arial" w:hAnsi="Arial"/>
+        </w:rPr>
+        <w:t xml:space="preserve">17.9 PodDisruptionBudget (disponibilidad en mantenimientos)</w:t>
+      </w:r>
+    </w:p>
+    <w:p>
+      <w:pPr>
+        <w:pBdr>
+          <w:left w:val="single" w:color="CBD5E1" w:sz="16" w:space="8"/>
+        </w:pBdr>
+        <w:shd w:fill="F3F4F6" w:val="clear"/>
+        <w:spacing w:after="0" w:before="40" w:line="240"/>
+        <w:ind w:left="120"/>
+      </w:pPr>
+      <w:r>
+        <w:rPr>
+          <w:rFonts w:ascii="Consolas" w:cs="Consolas" w:eastAsia="Consolas" w:hAnsi="Consolas"/>
+          <w:color w:val="0F172A"/>
+          <w:sz w:val="17"/>
+          <w:szCs w:val="17"/>
+        </w:rPr>
+        <w:t xml:space="preserve">apiVersion: policy/v1</w:t>
+      </w:r>
+    </w:p>
+    <w:p>
+      <w:pPr>
+        <w:pBdr>
+          <w:left w:val="single" w:color="CBD5E1" w:sz="16" w:space="8"/>
+        </w:pBdr>
+        <w:shd w:fill="F3F4F6" w:val="clear"/>
+        <w:spacing w:after="0" w:before="0" w:line="240"/>
+        <w:ind w:left="120"/>
+      </w:pPr>
+      <w:r>
+        <w:rPr>
+          <w:rFonts w:ascii="Consolas" w:cs="Consolas" w:eastAsia="Consolas" w:hAnsi="Consolas"/>
+          <w:color w:val="0F172A"/>
+          <w:sz w:val="17"/>
+          <w:szCs w:val="17"/>
+        </w:rPr>
+        <w:t xml:space="preserve">kind: PodDisruptionBudget</w:t>
+      </w:r>
+    </w:p>
+    <w:p>
+      <w:pPr>
+        <w:pBdr>
+          <w:left w:val="single" w:color="CBD5E1" w:sz="16" w:space="8"/>
+        </w:pBdr>
+        <w:shd w:fill="F3F4F6" w:val="clear"/>
+        <w:spacing w:after="0" w:before="0" w:line="240"/>
+        <w:ind w:left="120"/>
+      </w:pPr>
+      <w:r>
+        <w:rPr>
+          <w:rFonts w:ascii="Consolas" w:cs="Consolas" w:eastAsia="Consolas" w:hAnsi="Consolas"/>
+          <w:color w:val="0F172A"/>
+          <w:sz w:val="17"/>
+          <w:szCs w:val="17"/>
+        </w:rPr>
+        <w:t xml:space="preserve">metadata: { name: auth-service-pdb }</w:t>
+      </w:r>
+    </w:p>
+    <w:p>
+      <w:pPr>
+        <w:pBdr>
+          <w:left w:val="single" w:color="CBD5E1" w:sz="16" w:space="8"/>
+        </w:pBdr>
+        <w:shd w:fill="F3F4F6" w:val="clear"/>
+        <w:spacing w:after="0" w:before="0" w:line="240"/>
+        <w:ind w:left="120"/>
+      </w:pPr>
+      <w:r>
+        <w:rPr>
+          <w:rFonts w:ascii="Consolas" w:cs="Consolas" w:eastAsia="Consolas" w:hAnsi="Consolas"/>
+          <w:color w:val="0F172A"/>
+          <w:sz w:val="17"/>
+          <w:szCs w:val="17"/>
+        </w:rPr>
+        <w:t xml:space="preserve">spec:</w:t>
+      </w:r>
+    </w:p>
+    <w:p>
+      <w:pPr>
+        <w:pBdr>
+          <w:left w:val="single" w:color="CBD5E1" w:sz="16" w:space="8"/>
+        </w:pBdr>
+        <w:shd w:fill="F3F4F6" w:val="clear"/>
+        <w:spacing w:after="0" w:before="0" w:line="240"/>
+        <w:ind w:left="120"/>
+      </w:pPr>
+      <w:r>
+        <w:rPr>
+          <w:rFonts w:ascii="Consolas" w:cs="Consolas" w:eastAsia="Consolas" w:hAnsi="Consolas"/>
+          <w:color w:val="0F172A"/>
+          <w:sz w:val="17"/>
+          <w:szCs w:val="17"/>
+        </w:rPr>
+        <w:t xml:space="preserve">  minAvailable: 1                        # nunca menos de 1 pod durante drenajes de nodo</w:t>
+      </w:r>
+    </w:p>
+    <w:p>
+      <w:pPr>
+        <w:pBdr>
+          <w:left w:val="single" w:color="CBD5E1" w:sz="16" w:space="8"/>
+        </w:pBdr>
+        <w:shd w:fill="F3F4F6" w:val="clear"/>
+        <w:spacing w:after="150" w:before="0" w:line="240"/>
+        <w:ind w:left="120"/>
+      </w:pPr>
+      <w:r>
+        <w:rPr>
+          <w:rFonts w:ascii="Consolas" w:cs="Consolas" w:eastAsia="Consolas" w:hAnsi="Consolas"/>
+          <w:color w:val="0F172A"/>
+          <w:sz w:val="17"/>
+          <w:szCs w:val="17"/>
+        </w:rPr>
+        <w:t xml:space="preserve">  selector: { matchLabels: { app.kubernetes.io/name: auth-service } }</w:t>
+      </w:r>
+    </w:p>
+    <w:p>
+      <w:pPr>
+        <w:pStyle w:val="Heading2"/>
+      </w:pPr>
+      <w:r>
+        <w:rPr>
+          <w:rFonts w:ascii="Arial" w:cs="Arial" w:eastAsia="Arial" w:hAnsi="Arial"/>
+        </w:rPr>
+        <w:t xml:space="preserve">17.10 Kustomize: base y overlay de producción</w:t>
+      </w:r>
+    </w:p>
+    <w:p>
+      <w:pPr>
+        <w:pBdr>
+          <w:left w:val="single" w:color="CBD5E1" w:sz="16" w:space="8"/>
+        </w:pBdr>
+        <w:shd w:fill="F3F4F6" w:val="clear"/>
+        <w:spacing w:after="0" w:before="40" w:line="240"/>
+        <w:ind w:left="120"/>
+      </w:pPr>
+      <w:r>
+        <w:rPr>
+          <w:rFonts w:ascii="Consolas" w:cs="Consolas" w:eastAsia="Consolas" w:hAnsi="Consolas"/>
+          <w:color w:val="0F172A"/>
+          <w:sz w:val="17"/>
+          <w:szCs w:val="17"/>
+        </w:rPr>
+        <w:t xml:space="preserve"># base/kustomization.yaml</w:t>
+      </w:r>
+    </w:p>
+    <w:p>
+      <w:pPr>
+        <w:pBdr>
+          <w:left w:val="single" w:color="CBD5E1" w:sz="16" w:space="8"/>
+        </w:pBdr>
+        <w:shd w:fill="F3F4F6" w:val="clear"/>
+        <w:spacing w:after="0" w:before="0" w:line="240"/>
+        <w:ind w:left="120"/>
+      </w:pPr>
+      <w:r>
+        <w:rPr>
+          <w:rFonts w:ascii="Consolas" w:cs="Consolas" w:eastAsia="Consolas" w:hAnsi="Consolas"/>
+          <w:color w:val="0F172A"/>
+          <w:sz w:val="17"/>
+          <w:szCs w:val="17"/>
+        </w:rPr>
+        <w:t xml:space="preserve">apiVersion: kustomize.config.k8s.io/v1beta1</w:t>
+      </w:r>
+    </w:p>
+    <w:p>
+      <w:pPr>
+        <w:pBdr>
+          <w:left w:val="single" w:color="CBD5E1" w:sz="16" w:space="8"/>
+        </w:pBdr>
+        <w:shd w:fill="F3F4F6" w:val="clear"/>
+        <w:spacing w:after="0" w:before="0" w:line="240"/>
+        <w:ind w:left="120"/>
+      </w:pPr>
+      <w:r>
+        <w:rPr>
+          <w:rFonts w:ascii="Consolas" w:cs="Consolas" w:eastAsia="Consolas" w:hAnsi="Consolas"/>
+          <w:color w:val="0F172A"/>
+          <w:sz w:val="17"/>
+          <w:szCs w:val="17"/>
+        </w:rPr>
+        <w:t xml:space="preserve">kind: Kustomization</w:t>
+      </w:r>
+    </w:p>
+    <w:p>
+      <w:pPr>
+        <w:pBdr>
+          <w:left w:val="single" w:color="CBD5E1" w:sz="16" w:space="8"/>
+        </w:pBdr>
+        <w:shd w:fill="F3F4F6" w:val="clear"/>
+        <w:spacing w:after="0" w:before="0" w:line="240"/>
+        <w:ind w:left="120"/>
+      </w:pPr>
+      <w:r>
+        <w:rPr>
+          <w:rFonts w:ascii="Consolas" w:cs="Consolas" w:eastAsia="Consolas" w:hAnsi="Consolas"/>
+          <w:color w:val="0F172A"/>
+          <w:sz w:val="17"/>
+          <w:szCs w:val="17"/>
+        </w:rPr>
+        <w:t xml:space="preserve">namespace: bookplus</w:t>
+      </w:r>
+    </w:p>
+    <w:p>
+      <w:pPr>
+        <w:pBdr>
+          <w:left w:val="single" w:color="CBD5E1" w:sz="16" w:space="8"/>
+        </w:pBdr>
+        <w:shd w:fill="F3F4F6" w:val="clear"/>
+        <w:spacing w:after="0" w:before="0" w:line="240"/>
+        <w:ind w:left="120"/>
+      </w:pPr>
+      <w:r>
+        <w:rPr>
+          <w:rFonts w:ascii="Consolas" w:cs="Consolas" w:eastAsia="Consolas" w:hAnsi="Consolas"/>
+          <w:color w:val="0F172A"/>
+          <w:sz w:val="17"/>
+          <w:szCs w:val="17"/>
+        </w:rPr>
+        <w:t xml:space="preserve">resources: [ namespace.yaml, apps/..., infra/..., observability/..., rbac.yaml, ingress.yaml ]</w:t>
+      </w:r>
+    </w:p>
+    <w:p>
+      <w:pPr>
+        <w:pBdr>
+          <w:left w:val="single" w:color="CBD5E1" w:sz="16" w:space="8"/>
+        </w:pBdr>
+        <w:shd w:fill="F3F4F6" w:val="clear"/>
+        <w:spacing w:after="0" w:before="0" w:line="240"/>
+        <w:ind w:left="120"/>
+      </w:pPr>
+      <w:r>
+        <w:rPr>
+          <w:rFonts w:ascii="Consolas" w:cs="Consolas" w:eastAsia="Consolas" w:hAnsi="Consolas"/>
+          <w:color w:val="0F172A"/>
+          <w:sz w:val="17"/>
+          <w:szCs w:val="17"/>
+        </w:rPr>
+        <w:t xml:space="preserve">---</w:t>
+      </w:r>
+    </w:p>
+    <w:p>
+      <w:pPr>
+        <w:pBdr>
+          <w:left w:val="single" w:color="CBD5E1" w:sz="16" w:space="8"/>
+        </w:pBdr>
+        <w:shd w:fill="F3F4F6" w:val="clear"/>
+        <w:spacing w:after="0" w:before="0" w:line="240"/>
+        <w:ind w:left="120"/>
+      </w:pPr>
+      <w:r>
+        <w:rPr>
+          <w:rFonts w:ascii="Consolas" w:cs="Consolas" w:eastAsia="Consolas" w:hAnsi="Consolas"/>
+          <w:color w:val="0F172A"/>
+          <w:sz w:val="17"/>
+          <w:szCs w:val="17"/>
+        </w:rPr>
+        <w:t xml:space="preserve"># overlays/prod/kustomization.yaml  (anade HPA, PDB, NetworkPolicy y sube replicas)</w:t>
+      </w:r>
+    </w:p>
+    <w:p>
+      <w:pPr>
+        <w:pBdr>
+          <w:left w:val="single" w:color="CBD5E1" w:sz="16" w:space="8"/>
+        </w:pBdr>
+        <w:shd w:fill="F3F4F6" w:val="clear"/>
+        <w:spacing w:after="0" w:before="0" w:line="240"/>
+        <w:ind w:left="120"/>
+      </w:pPr>
+      <w:r>
+        <w:rPr>
+          <w:rFonts w:ascii="Consolas" w:cs="Consolas" w:eastAsia="Consolas" w:hAnsi="Consolas"/>
+          <w:color w:val="0F172A"/>
+          <w:sz w:val="17"/>
+          <w:szCs w:val="17"/>
+        </w:rPr>
+        <w:t xml:space="preserve">resources: [ ../../base, ../../base/hpa, ../../base/policies ]</w:t>
+      </w:r>
+    </w:p>
+    <w:p>
+      <w:pPr>
+        <w:pBdr>
+          <w:left w:val="single" w:color="CBD5E1" w:sz="16" w:space="8"/>
+        </w:pBdr>
+        <w:shd w:fill="F3F4F6" w:val="clear"/>
+        <w:spacing w:after="0" w:before="0" w:line="240"/>
+        <w:ind w:left="120"/>
+      </w:pPr>
+      <w:r>
+        <w:rPr>
+          <w:rFonts w:ascii="Consolas" w:cs="Consolas" w:eastAsia="Consolas" w:hAnsi="Consolas"/>
+          <w:color w:val="0F172A"/>
+          <w:sz w:val="17"/>
+          <w:szCs w:val="17"/>
+        </w:rPr>
+        <w:t xml:space="preserve">replicas:</w:t>
+      </w:r>
+    </w:p>
+    <w:p>
+      <w:pPr>
+        <w:pBdr>
+          <w:left w:val="single" w:color="CBD5E1" w:sz="16" w:space="8"/>
+        </w:pBdr>
+        <w:shd w:fill="F3F4F6" w:val="clear"/>
+        <w:spacing w:after="0" w:before="0" w:line="240"/>
+        <w:ind w:left="120"/>
+      </w:pPr>
+      <w:r>
+        <w:rPr>
+          <w:rFonts w:ascii="Consolas" w:cs="Consolas" w:eastAsia="Consolas" w:hAnsi="Consolas"/>
+          <w:color w:val="0F172A"/>
+          <w:sz w:val="17"/>
+          <w:szCs w:val="17"/>
+        </w:rPr>
+        <w:t xml:space="preserve">  - { name: auth-service, count: 2 }</w:t>
+      </w:r>
+    </w:p>
+    <w:p>
+      <w:pPr>
+        <w:pBdr>
+          <w:left w:val="single" w:color="CBD5E1" w:sz="16" w:space="8"/>
+        </w:pBdr>
+        <w:shd w:fill="F3F4F6" w:val="clear"/>
+        <w:spacing w:after="0" w:before="0" w:line="240"/>
+        <w:ind w:left="120"/>
+      </w:pPr>
+      <w:r>
+        <w:rPr>
+          <w:rFonts w:ascii="Consolas" w:cs="Consolas" w:eastAsia="Consolas" w:hAnsi="Consolas"/>
+          <w:color w:val="0F172A"/>
+          <w:sz w:val="17"/>
+          <w:szCs w:val="17"/>
+        </w:rPr>
+        <w:t xml:space="preserve">patches:</w:t>
+      </w:r>
+    </w:p>
+    <w:p>
+      <w:pPr>
+        <w:pBdr>
+          <w:left w:val="single" w:color="CBD5E1" w:sz="16" w:space="8"/>
+        </w:pBdr>
+        <w:shd w:fill="F3F4F6" w:val="clear"/>
+        <w:spacing w:after="0" w:before="0" w:line="240"/>
+        <w:ind w:left="120"/>
+      </w:pPr>
+      <w:r>
+        <w:rPr>
+          <w:rFonts w:ascii="Consolas" w:cs="Consolas" w:eastAsia="Consolas" w:hAnsi="Consolas"/>
+          <w:color w:val="0F172A"/>
+          <w:sz w:val="17"/>
+          <w:szCs w:val="17"/>
+        </w:rPr>
+        <w:t xml:space="preserve">  - target: { kind: ConfigMap, name: api-gateway-config }</w:t>
+      </w:r>
+    </w:p>
+    <w:p>
+      <w:pPr>
+        <w:pBdr>
+          <w:left w:val="single" w:color="CBD5E1" w:sz="16" w:space="8"/>
+        </w:pBdr>
+        <w:shd w:fill="F3F4F6" w:val="clear"/>
+        <w:spacing w:after="0" w:before="0" w:line="240"/>
+        <w:ind w:left="120"/>
+      </w:pPr>
+      <w:r>
+        <w:rPr>
+          <w:rFonts w:ascii="Consolas" w:cs="Consolas" w:eastAsia="Consolas" w:hAnsi="Consolas"/>
+          <w:color w:val="0F172A"/>
+          <w:sz w:val="17"/>
+          <w:szCs w:val="17"/>
+        </w:rPr>
+        <w:t xml:space="preserve">    patch: |</w:t>
+      </w:r>
+    </w:p>
+    <w:p>
+      <w:pPr>
+        <w:pBdr>
+          <w:left w:val="single" w:color="CBD5E1" w:sz="16" w:space="8"/>
+        </w:pBdr>
+        <w:shd w:fill="F3F4F6" w:val="clear"/>
+        <w:spacing w:after="0" w:before="0" w:line="240"/>
+        <w:ind w:left="120"/>
+      </w:pPr>
+      <w:r>
+        <w:rPr>
+          <w:rFonts w:ascii="Consolas" w:cs="Consolas" w:eastAsia="Consolas" w:hAnsi="Consolas"/>
+          <w:color w:val="0F172A"/>
+          <w:sz w:val="17"/>
+          <w:szCs w:val="17"/>
+        </w:rPr>
+        <w:t xml:space="preserve">      - op: replace</w:t>
+      </w:r>
+    </w:p>
+    <w:p>
+      <w:pPr>
+        <w:pBdr>
+          <w:left w:val="single" w:color="CBD5E1" w:sz="16" w:space="8"/>
+        </w:pBdr>
+        <w:shd w:fill="F3F4F6" w:val="clear"/>
+        <w:spacing w:after="0" w:before="0" w:line="240"/>
+        <w:ind w:left="120"/>
+      </w:pPr>
+      <w:r>
+        <w:rPr>
+          <w:rFonts w:ascii="Consolas" w:cs="Consolas" w:eastAsia="Consolas" w:hAnsi="Consolas"/>
+          <w:color w:val="0F172A"/>
+          <w:sz w:val="17"/>
+          <w:szCs w:val="17"/>
+        </w:rPr>
+        <w:t xml:space="preserve">        path: /data/CORS_ALLOWED_ORIGINS</w:t>
+      </w:r>
+    </w:p>
+    <w:p>
+      <w:pPr>
+        <w:pBdr>
+          <w:left w:val="single" w:color="CBD5E1" w:sz="16" w:space="8"/>
+        </w:pBdr>
+        <w:shd w:fill="F3F4F6" w:val="clear"/>
+        <w:spacing w:after="150" w:before="0" w:line="240"/>
+        <w:ind w:left="120"/>
+      </w:pPr>
+      <w:r>
+        <w:rPr>
+          <w:rFonts w:ascii="Consolas" w:cs="Consolas" w:eastAsia="Consolas" w:hAnsi="Consolas"/>
+          <w:color w:val="0F172A"/>
+          <w:sz w:val="17"/>
+          <w:szCs w:val="17"/>
+        </w:rPr>
+        <w:t xml:space="preserve">        value: https://app.bookplus.example</w:t>
+      </w:r>
+    </w:p>
+    <w:p>
+      <w:pPr>
+        <w:pStyle w:val="Heading2"/>
+      </w:pPr>
+      <w:r>
+        <w:rPr>
+          <w:rFonts w:ascii="Arial" w:cs="Arial" w:eastAsia="Arial" w:hAnsi="Arial"/>
+        </w:rPr>
+        <w:t xml:space="preserve">17.11 Helm: plantilla genérica (recorre los servicios)</w:t>
+      </w:r>
+    </w:p>
+    <w:p>
+      <w:pPr>
+        <w:pBdr>
+          <w:left w:val="single" w:color="CBD5E1" w:sz="16" w:space="8"/>
+        </w:pBdr>
+        <w:shd w:fill="F3F4F6" w:val="clear"/>
+        <w:spacing w:after="0" w:before="40" w:line="240"/>
+        <w:ind w:left="120"/>
+      </w:pPr>
+      <w:r>
+        <w:rPr>
+          <w:rFonts w:ascii="Consolas" w:cs="Consolas" w:eastAsia="Consolas" w:hAnsi="Consolas"/>
+          <w:color w:val="0F172A"/>
+          <w:sz w:val="17"/>
+          <w:szCs w:val="17"/>
+        </w:rPr>
+        <w:t xml:space="preserve"># templates/deployment.yaml — un Deployment por cada .Values.services</w:t>
+      </w:r>
+    </w:p>
+    <w:p>
+      <w:pPr>
+        <w:pBdr>
+          <w:left w:val="single" w:color="CBD5E1" w:sz="16" w:space="8"/>
+        </w:pBdr>
+        <w:shd w:fill="F3F4F6" w:val="clear"/>
+        <w:spacing w:after="0" w:before="0" w:line="240"/>
+        <w:ind w:left="120"/>
+      </w:pPr>
+      <w:r>
+        <w:rPr>
+          <w:rFonts w:ascii="Consolas" w:cs="Consolas" w:eastAsia="Consolas" w:hAnsi="Consolas"/>
+          <w:color w:val="0F172A"/>
+          <w:sz w:val="17"/>
+          <w:szCs w:val="17"/>
+        </w:rPr>
+        <w:t xml:space="preserve">{{- range .Values.services }}</w:t>
+      </w:r>
+    </w:p>
+    <w:p>
+      <w:pPr>
+        <w:pBdr>
+          <w:left w:val="single" w:color="CBD5E1" w:sz="16" w:space="8"/>
+        </w:pBdr>
+        <w:shd w:fill="F3F4F6" w:val="clear"/>
+        <w:spacing w:after="0" w:before="0" w:line="240"/>
+        <w:ind w:left="120"/>
+      </w:pPr>
+      <w:r>
+        <w:rPr>
+          <w:rFonts w:ascii="Consolas" w:cs="Consolas" w:eastAsia="Consolas" w:hAnsi="Consolas"/>
+          <w:color w:val="0F172A"/>
+          <w:sz w:val="17"/>
+          <w:szCs w:val="17"/>
+        </w:rPr>
+        <w:t xml:space="preserve">apiVersion: apps/v1</w:t>
+      </w:r>
+    </w:p>
+    <w:p>
+      <w:pPr>
+        <w:pBdr>
+          <w:left w:val="single" w:color="CBD5E1" w:sz="16" w:space="8"/>
+        </w:pBdr>
+        <w:shd w:fill="F3F4F6" w:val="clear"/>
+        <w:spacing w:after="0" w:before="0" w:line="240"/>
+        <w:ind w:left="120"/>
+      </w:pPr>
+      <w:r>
+        <w:rPr>
+          <w:rFonts w:ascii="Consolas" w:cs="Consolas" w:eastAsia="Consolas" w:hAnsi="Consolas"/>
+          <w:color w:val="0F172A"/>
+          <w:sz w:val="17"/>
+          <w:szCs w:val="17"/>
+        </w:rPr>
+        <w:t xml:space="preserve">kind: Deployment</w:t>
+      </w:r>
+    </w:p>
+    <w:p>
+      <w:pPr>
+        <w:pBdr>
+          <w:left w:val="single" w:color="CBD5E1" w:sz="16" w:space="8"/>
+        </w:pBdr>
+        <w:shd w:fill="F3F4F6" w:val="clear"/>
+        <w:spacing w:after="0" w:before="0" w:line="240"/>
+        <w:ind w:left="120"/>
+      </w:pPr>
+      <w:r>
+        <w:rPr>
+          <w:rFonts w:ascii="Consolas" w:cs="Consolas" w:eastAsia="Consolas" w:hAnsi="Consolas"/>
+          <w:color w:val="0F172A"/>
+          <w:sz w:val="17"/>
+          <w:szCs w:val="17"/>
+        </w:rPr>
+        <w:t xml:space="preserve">metadata: { name: {{ .name }} }</w:t>
+      </w:r>
+    </w:p>
+    <w:p>
+      <w:pPr>
+        <w:pBdr>
+          <w:left w:val="single" w:color="CBD5E1" w:sz="16" w:space="8"/>
+        </w:pBdr>
+        <w:shd w:fill="F3F4F6" w:val="clear"/>
+        <w:spacing w:after="0" w:before="0" w:line="240"/>
+        <w:ind w:left="120"/>
+      </w:pPr>
+      <w:r>
+        <w:rPr>
+          <w:rFonts w:ascii="Consolas" w:cs="Consolas" w:eastAsia="Consolas" w:hAnsi="Consolas"/>
+          <w:color w:val="0F172A"/>
+          <w:sz w:val="17"/>
+          <w:szCs w:val="17"/>
+        </w:rPr>
+        <w:t xml:space="preserve">spec:</w:t>
+      </w:r>
+    </w:p>
+    <w:p>
+      <w:pPr>
+        <w:pBdr>
+          <w:left w:val="single" w:color="CBD5E1" w:sz="16" w:space="8"/>
+        </w:pBdr>
+        <w:shd w:fill="F3F4F6" w:val="clear"/>
+        <w:spacing w:after="0" w:before="0" w:line="240"/>
+        <w:ind w:left="120"/>
+      </w:pPr>
+      <w:r>
+        <w:rPr>
+          <w:rFonts w:ascii="Consolas" w:cs="Consolas" w:eastAsia="Consolas" w:hAnsi="Consolas"/>
+          <w:color w:val="0F172A"/>
+          <w:sz w:val="17"/>
+          <w:szCs w:val="17"/>
+        </w:rPr>
+        <w:t xml:space="preserve">  template:</w:t>
+      </w:r>
+    </w:p>
+    <w:p>
+      <w:pPr>
+        <w:pBdr>
+          <w:left w:val="single" w:color="CBD5E1" w:sz="16" w:space="8"/>
+        </w:pBdr>
+        <w:shd w:fill="F3F4F6" w:val="clear"/>
+        <w:spacing w:after="0" w:before="0" w:line="240"/>
+        <w:ind w:left="120"/>
+      </w:pPr>
+      <w:r>
+        <w:rPr>
+          <w:rFonts w:ascii="Consolas" w:cs="Consolas" w:eastAsia="Consolas" w:hAnsi="Consolas"/>
+          <w:color w:val="0F172A"/>
+          <w:sz w:val="17"/>
+          <w:szCs w:val="17"/>
+        </w:rPr>
+        <w:t xml:space="preserve">    spec:</w:t>
+      </w:r>
+    </w:p>
+    <w:p>
+      <w:pPr>
+        <w:pBdr>
+          <w:left w:val="single" w:color="CBD5E1" w:sz="16" w:space="8"/>
+        </w:pBdr>
+        <w:shd w:fill="F3F4F6" w:val="clear"/>
+        <w:spacing w:after="0" w:before="0" w:line="240"/>
+        <w:ind w:left="120"/>
+      </w:pPr>
+      <w:r>
+        <w:rPr>
+          <w:rFonts w:ascii="Consolas" w:cs="Consolas" w:eastAsia="Consolas" w:hAnsi="Consolas"/>
+          <w:color w:val="0F172A"/>
+          <w:sz w:val="17"/>
+          <w:szCs w:val="17"/>
+        </w:rPr>
+        <w:t xml:space="preserve">      containers:</w:t>
+      </w:r>
+    </w:p>
+    <w:p>
+      <w:pPr>
+        <w:pBdr>
+          <w:left w:val="single" w:color="CBD5E1" w:sz="16" w:space="8"/>
+        </w:pBdr>
+        <w:shd w:fill="F3F4F6" w:val="clear"/>
+        <w:spacing w:after="0" w:before="0" w:line="240"/>
+        <w:ind w:left="120"/>
+      </w:pPr>
+      <w:r>
+        <w:rPr>
+          <w:rFonts w:ascii="Consolas" w:cs="Consolas" w:eastAsia="Consolas" w:hAnsi="Consolas"/>
+          <w:color w:val="0F172A"/>
+          <w:sz w:val="17"/>
+          <w:szCs w:val="17"/>
+        </w:rPr>
+        <w:t xml:space="preserve">        - name: {{ .name }}</w:t>
+      </w:r>
+    </w:p>
+    <w:p>
+      <w:pPr>
+        <w:pBdr>
+          <w:left w:val="single" w:color="CBD5E1" w:sz="16" w:space="8"/>
+        </w:pBdr>
+        <w:shd w:fill="F3F4F6" w:val="clear"/>
+        <w:spacing w:after="0" w:before="0" w:line="240"/>
+        <w:ind w:left="120"/>
+      </w:pPr>
+      <w:r>
+        <w:rPr>
+          <w:rFonts w:ascii="Consolas" w:cs="Consolas" w:eastAsia="Consolas" w:hAnsi="Consolas"/>
+          <w:color w:val="0F172A"/>
+          <w:sz w:val="17"/>
+          <w:szCs w:val="17"/>
+        </w:rPr>
+        <w:t xml:space="preserve">          image: "{{ $.Values.image.registry }}/{{ .name }}:{{ $.Values.image.tag }}"</w:t>
+      </w:r>
+    </w:p>
+    <w:p>
+      <w:pPr>
+        <w:pBdr>
+          <w:left w:val="single" w:color="CBD5E1" w:sz="16" w:space="8"/>
+        </w:pBdr>
+        <w:shd w:fill="F3F4F6" w:val="clear"/>
+        <w:spacing w:after="0" w:before="0" w:line="240"/>
+        <w:ind w:left="120"/>
+      </w:pPr>
+      <w:r>
+        <w:rPr>
+          <w:rFonts w:ascii="Consolas" w:cs="Consolas" w:eastAsia="Consolas" w:hAnsi="Consolas"/>
+          <w:color w:val="0F172A"/>
+          <w:sz w:val="17"/>
+          <w:szCs w:val="17"/>
+        </w:rPr>
+        <w:t xml:space="preserve">          ports: [ { containerPort: {{ .port }} } ]</w:t>
+      </w:r>
+    </w:p>
+    <w:p>
+      <w:pPr>
+        <w:pBdr>
+          <w:left w:val="single" w:color="CBD5E1" w:sz="16" w:space="8"/>
+        </w:pBdr>
+        <w:shd w:fill="F3F4F6" w:val="clear"/>
+        <w:spacing w:after="0" w:before="0" w:line="240"/>
+        <w:ind w:left="120"/>
+      </w:pPr>
+      <w:r>
+        <w:rPr>
+          <w:rFonts w:ascii="Consolas" w:cs="Consolas" w:eastAsia="Consolas" w:hAnsi="Consolas"/>
+          <w:color w:val="0F172A"/>
+          <w:sz w:val="17"/>
+          <w:szCs w:val="17"/>
+        </w:rPr>
+        <w:t xml:space="preserve">---</w:t>
+      </w:r>
+    </w:p>
+    <w:p>
+      <w:pPr>
+        <w:pBdr>
+          <w:left w:val="single" w:color="CBD5E1" w:sz="16" w:space="8"/>
+        </w:pBdr>
+        <w:shd w:fill="F3F4F6" w:val="clear"/>
+        <w:spacing w:after="150" w:before="0" w:line="240"/>
+        <w:ind w:left="120"/>
+      </w:pPr>
+      <w:r>
+        <w:rPr>
+          <w:rFonts w:ascii="Consolas" w:cs="Consolas" w:eastAsia="Consolas" w:hAnsi="Consolas"/>
+          <w:color w:val="0F172A"/>
+          <w:sz w:val="17"/>
+          <w:szCs w:val="17"/>
+        </w:rPr>
+        <w:t xml:space="preserve">{{- end }}</w:t>
+      </w:r>
+    </w:p>
+    <w:p>
+      <w:pPr>
+        <w:pStyle w:val="Heading2"/>
+      </w:pPr>
+      <w:r>
+        <w:rPr>
+          <w:rFonts w:ascii="Arial" w:cs="Arial" w:eastAsia="Arial" w:hAnsi="Arial"/>
+        </w:rPr>
+        <w:t xml:space="preserve">17.12 Comandos: desplegar, validar y operar</w:t>
+      </w:r>
+    </w:p>
+    <w:p>
+      <w:pPr>
+        <w:pBdr>
+          <w:left w:val="single" w:color="CBD5E1" w:sz="16" w:space="8"/>
+        </w:pBdr>
+        <w:shd w:fill="F3F4F6" w:val="clear"/>
+        <w:spacing w:after="0" w:before="40" w:line="240"/>
+        <w:ind w:left="120"/>
+      </w:pPr>
+      <w:r>
+        <w:rPr>
+          <w:rFonts w:ascii="Consolas" w:cs="Consolas" w:eastAsia="Consolas" w:hAnsi="Consolas"/>
+          <w:color w:val="0F172A"/>
+          <w:sz w:val="17"/>
+          <w:szCs w:val="17"/>
+        </w:rPr>
+        <w:t xml:space="preserve">kubectl apply -k k8s/overlays/prod                 # despliega (HPA+PDB+NetworkPolicy)</w:t>
+      </w:r>
+    </w:p>
+    <w:p>
+      <w:pPr>
+        <w:pBdr>
+          <w:left w:val="single" w:color="CBD5E1" w:sz="16" w:space="8"/>
+        </w:pBdr>
+        <w:shd w:fill="F3F4F6" w:val="clear"/>
+        <w:spacing w:after="0" w:before="0" w:line="240"/>
+        <w:ind w:left="120"/>
+      </w:pPr>
+      <w:r>
+        <w:rPr>
+          <w:rFonts w:ascii="Consolas" w:cs="Consolas" w:eastAsia="Consolas" w:hAnsi="Consolas"/>
+          <w:color w:val="0F172A"/>
+          <w:sz w:val="17"/>
+          <w:szCs w:val="17"/>
+        </w:rPr>
+        <w:t xml:space="preserve">kubectl kustomize k8s/overlays/prod | kubeconform -strict -summary   # validar</w:t>
+      </w:r>
+    </w:p>
+    <w:p>
+      <w:pPr>
+        <w:pBdr>
+          <w:left w:val="single" w:color="CBD5E1" w:sz="16" w:space="8"/>
+        </w:pBdr>
+        <w:shd w:fill="F3F4F6" w:val="clear"/>
+        <w:spacing w:after="0" w:before="0" w:line="240"/>
+        <w:ind w:left="120"/>
+      </w:pPr>
+      <w:r>
+        <w:rPr>
+          <w:rFonts w:ascii="Consolas" w:cs="Consolas" w:eastAsia="Consolas" w:hAnsi="Consolas"/>
+          <w:color w:val="0F172A"/>
+          <w:sz w:val="17"/>
+          <w:szCs w:val="17"/>
+        </w:rPr>
+        <w:t xml:space="preserve">helm install bookplus helm/bookplus -n bookplus --create-namespace</w:t>
+      </w:r>
+    </w:p>
+    <w:p>
+      <w:pPr>
+        <w:pBdr>
+          <w:left w:val="single" w:color="CBD5E1" w:sz="16" w:space="8"/>
+        </w:pBdr>
+        <w:shd w:fill="F3F4F6" w:val="clear"/>
+        <w:spacing w:after="0" w:before="0" w:line="240"/>
+        <w:ind w:left="120"/>
+      </w:pPr>
+      <w:r>
+        <w:rPr>
+          <w:rFonts w:ascii="Consolas" w:cs="Consolas" w:eastAsia="Consolas" w:hAnsi="Consolas"/>
+          <w:color w:val="0F172A"/>
+          <w:sz w:val="17"/>
+          <w:szCs w:val="17"/>
+        </w:rPr>
+        <w:t xml:space="preserve">kubectl get pods,svc,hpa,pdb,netpol -n bookplus    # estado</w:t>
+      </w:r>
+    </w:p>
+    <w:p>
+      <w:pPr>
+        <w:pBdr>
+          <w:left w:val="single" w:color="CBD5E1" w:sz="16" w:space="8"/>
+        </w:pBdr>
+        <w:shd w:fill="F3F4F6" w:val="clear"/>
+        <w:spacing w:after="0" w:before="0" w:line="240"/>
+        <w:ind w:left="120"/>
+      </w:pPr>
+      <w:r>
+        <w:rPr>
+          <w:rFonts w:ascii="Consolas" w:cs="Consolas" w:eastAsia="Consolas" w:hAnsi="Consolas"/>
+          <w:color w:val="0F172A"/>
+          <w:sz w:val="17"/>
+          <w:szCs w:val="17"/>
+        </w:rPr>
+        <w:t xml:space="preserve">kubectl rollout status deploy/auth-service -n bookplus</w:t>
+      </w:r>
+    </w:p>
+    <w:p>
+      <w:pPr>
+        <w:pBdr>
+          <w:left w:val="single" w:color="CBD5E1" w:sz="16" w:space="8"/>
+        </w:pBdr>
+        <w:shd w:fill="F3F4F6" w:val="clear"/>
+        <w:spacing w:after="150" w:before="0" w:line="240"/>
+        <w:ind w:left="120"/>
+      </w:pPr>
+      <w:r>
+        <w:rPr>
+          <w:rFonts w:ascii="Consolas" w:cs="Consolas" w:eastAsia="Consolas" w:hAnsi="Consolas"/>
+          <w:color w:val="0F172A"/>
+          <w:sz w:val="17"/>
+          <w:szCs w:val="17"/>
+        </w:rPr>
+        <w:t xml:space="preserve">kubectl top pods -n bookplus                       # consumo (metrics-server)</w:t>
+      </w:r>
+    </w:p>
+    <w:p>
+      <w:pPr>
+        <w:spacing w:after="120" w:line="276"/>
+      </w:pPr>
+      <w:r>
+        <w:rPr>
+          <w:rFonts w:ascii="Arial" w:cs="Arial" w:eastAsia="Arial" w:hAnsi="Arial"/>
+          <w:b/>
+          <w:bCs/>
+        </w:rPr>
+        <w:t xml:space="preserve">Verificación: </w:t>
+      </w:r>
+      <w:r>
+        <w:rPr>
+          <w:rFonts w:ascii="Arial" w:cs="Arial" w:eastAsia="Arial" w:hAnsi="Arial"/>
+        </w:rPr>
+        <w:t xml:space="preserve">los 130 recursos se validaron contra el esquema de Kubernetes (0 fallos) y el </w:t>
+      </w:r>
+      <w:r>
+        <w:rPr>
+          <w:rFonts w:ascii="Consolas" w:cs="Consolas" w:eastAsia="Consolas" w:hAnsi="Consolas"/>
+          <w:color w:val="4F46E5"/>
+        </w:rPr>
+        <w:t xml:space="preserve">kubectl kustomize k8s/overlays/prod</w:t>
+      </w:r>
+      <w:r>
+        <w:rPr>
+          <w:rFonts w:ascii="Arial" w:cs="Arial" w:eastAsia="Arial" w:hAnsi="Arial"/>
+        </w:rPr>
+        <w:t xml:space="preserve"> renderiza correctamente el conjunto completo. El runbook detallado esta en </w:t>
+      </w:r>
+      <w:r>
+        <w:rPr>
+          <w:rFonts w:ascii="Consolas" w:cs="Consolas" w:eastAsia="Consolas" w:hAnsi="Consolas"/>
+          <w:color w:val="4F46E5"/>
+        </w:rPr>
+        <w:t xml:space="preserve">k8s/README.md</w:t>
+      </w:r>
+      <w:r>
+        <w:rPr>
+          <w:rFonts w:ascii="Arial" w:cs="Arial" w:eastAsia="Arial" w:hAnsi="Arial"/>
+        </w:rPr>
+        <w:t xml:space="preserve"> y la gestion de secretos en </w:t>
+      </w:r>
+      <w:r>
+        <w:rPr>
+          <w:rFonts w:ascii="Consolas" w:cs="Consolas" w:eastAsia="Consolas" w:hAnsi="Consolas"/>
+          <w:color w:val="4F46E5"/>
+        </w:rPr>
+        <w:t xml:space="preserve">k8s/secrets/</w:t>
+      </w:r>
+      <w:r>
+        <w:rPr>
+          <w:rFonts w:ascii="Arial" w:cs="Arial" w:eastAsia="Arial" w:hAnsi="Arial"/>
+        </w:rPr>
+        <w:t xml:space="preserve">.</w:t>
+      </w:r>
+    </w:p>
+    <w:p>
+      <w:pPr>
+        <w:pStyle w:val="Heading2"/>
+      </w:pPr>
+      <w:r>
+        <w:rPr>
+          <w:rFonts w:ascii="Arial" w:cs="Arial" w:eastAsia="Arial" w:hAnsi="Arial"/>
+        </w:rPr>
+        <w:t xml:space="preserve">17.13 CronJob: backups automáticos de PostgreSQL</w:t>
+      </w:r>
+    </w:p>
+    <w:p>
+      <w:pPr>
+        <w:spacing w:after="120" w:line="276"/>
+      </w:pPr>
+      <w:r>
+        <w:rPr>
+          <w:rFonts w:ascii="Arial" w:cs="Arial" w:eastAsia="Arial" w:hAnsi="Arial"/>
+        </w:rPr>
+        <w:t xml:space="preserve">Un </w:t>
+      </w:r>
+      <w:r>
+        <w:rPr>
+          <w:rFonts w:ascii="Consolas" w:cs="Consolas" w:eastAsia="Consolas" w:hAnsi="Consolas"/>
+          <w:color w:val="4F46E5"/>
+        </w:rPr>
+        <w:t xml:space="preserve">CronJob</w:t>
+      </w:r>
+      <w:r>
+        <w:rPr>
+          <w:rFonts w:ascii="Arial" w:cs="Arial" w:eastAsia="Arial" w:hAnsi="Arial"/>
+        </w:rPr>
+        <w:t xml:space="preserve"> diario (2:00 AM) hace </w:t>
+      </w:r>
+      <w:r>
+        <w:rPr>
+          <w:rFonts w:ascii="Consolas" w:cs="Consolas" w:eastAsia="Consolas" w:hAnsi="Consolas"/>
+          <w:color w:val="4F46E5"/>
+        </w:rPr>
+        <w:t xml:space="preserve">pg_dump</w:t>
+      </w:r>
+      <w:r>
+        <w:rPr>
+          <w:rFonts w:ascii="Arial" w:cs="Arial" w:eastAsia="Arial" w:hAnsi="Arial"/>
+        </w:rPr>
+        <w:t xml:space="preserve"> de las 7 bases a un volumen persistente y borra los backups de mas de 7 dias. Las contrasenas vienen de un Secret.</w:t>
+      </w:r>
+    </w:p>
+    <w:p>
+      <w:pPr>
+        <w:pBdr>
+          <w:left w:val="single" w:color="CBD5E1" w:sz="16" w:space="8"/>
+        </w:pBdr>
+        <w:shd w:fill="F3F4F6" w:val="clear"/>
+        <w:spacing w:after="0" w:before="40" w:line="240"/>
+        <w:ind w:left="120"/>
+      </w:pPr>
+      <w:r>
+        <w:rPr>
+          <w:rFonts w:ascii="Consolas" w:cs="Consolas" w:eastAsia="Consolas" w:hAnsi="Consolas"/>
+          <w:color w:val="0F172A"/>
+          <w:sz w:val="17"/>
+          <w:szCs w:val="17"/>
+        </w:rPr>
+        <w:t xml:space="preserve">apiVersion: batch/v1</w:t>
+      </w:r>
+    </w:p>
+    <w:p>
+      <w:pPr>
+        <w:pBdr>
+          <w:left w:val="single" w:color="CBD5E1" w:sz="16" w:space="8"/>
+        </w:pBdr>
+        <w:shd w:fill="F3F4F6" w:val="clear"/>
+        <w:spacing w:after="0" w:before="0" w:line="240"/>
+        <w:ind w:left="120"/>
+      </w:pPr>
+      <w:r>
+        <w:rPr>
+          <w:rFonts w:ascii="Consolas" w:cs="Consolas" w:eastAsia="Consolas" w:hAnsi="Consolas"/>
+          <w:color w:val="0F172A"/>
+          <w:sz w:val="17"/>
+          <w:szCs w:val="17"/>
+        </w:rPr>
+        <w:t xml:space="preserve">kind: CronJob</w:t>
+      </w:r>
+    </w:p>
+    <w:p>
+      <w:pPr>
+        <w:pBdr>
+          <w:left w:val="single" w:color="CBD5E1" w:sz="16" w:space="8"/>
+        </w:pBdr>
+        <w:shd w:fill="F3F4F6" w:val="clear"/>
+        <w:spacing w:after="0" w:before="0" w:line="240"/>
+        <w:ind w:left="120"/>
+      </w:pPr>
+      <w:r>
+        <w:rPr>
+          <w:rFonts w:ascii="Consolas" w:cs="Consolas" w:eastAsia="Consolas" w:hAnsi="Consolas"/>
+          <w:color w:val="0F172A"/>
+          <w:sz w:val="17"/>
+          <w:szCs w:val="17"/>
+        </w:rPr>
+        <w:t xml:space="preserve">metadata: { name: postgres-backup }</w:t>
+      </w:r>
+    </w:p>
+    <w:p>
+      <w:pPr>
+        <w:pBdr>
+          <w:left w:val="single" w:color="CBD5E1" w:sz="16" w:space="8"/>
+        </w:pBdr>
+        <w:shd w:fill="F3F4F6" w:val="clear"/>
+        <w:spacing w:after="0" w:before="0" w:line="240"/>
+        <w:ind w:left="120"/>
+      </w:pPr>
+      <w:r>
+        <w:rPr>
+          <w:rFonts w:ascii="Consolas" w:cs="Consolas" w:eastAsia="Consolas" w:hAnsi="Consolas"/>
+          <w:color w:val="0F172A"/>
+          <w:sz w:val="17"/>
+          <w:szCs w:val="17"/>
+        </w:rPr>
+        <w:t xml:space="preserve">spec:</w:t>
+      </w:r>
+    </w:p>
+    <w:p>
+      <w:pPr>
+        <w:pBdr>
+          <w:left w:val="single" w:color="CBD5E1" w:sz="16" w:space="8"/>
+        </w:pBdr>
+        <w:shd w:fill="F3F4F6" w:val="clear"/>
+        <w:spacing w:after="0" w:before="0" w:line="240"/>
+        <w:ind w:left="120"/>
+      </w:pPr>
+      <w:r>
+        <w:rPr>
+          <w:rFonts w:ascii="Consolas" w:cs="Consolas" w:eastAsia="Consolas" w:hAnsi="Consolas"/>
+          <w:color w:val="0F172A"/>
+          <w:sz w:val="17"/>
+          <w:szCs w:val="17"/>
+        </w:rPr>
+        <w:t xml:space="preserve">  schedule: "0 2 * * *"          # todos los dias a las 02:00</w:t>
+      </w:r>
+    </w:p>
+    <w:p>
+      <w:pPr>
+        <w:pBdr>
+          <w:left w:val="single" w:color="CBD5E1" w:sz="16" w:space="8"/>
+        </w:pBdr>
+        <w:shd w:fill="F3F4F6" w:val="clear"/>
+        <w:spacing w:after="0" w:before="0" w:line="240"/>
+        <w:ind w:left="120"/>
+      </w:pPr>
+      <w:r>
+        <w:rPr>
+          <w:rFonts w:ascii="Consolas" w:cs="Consolas" w:eastAsia="Consolas" w:hAnsi="Consolas"/>
+          <w:color w:val="0F172A"/>
+          <w:sz w:val="17"/>
+          <w:szCs w:val="17"/>
+        </w:rPr>
+        <w:t xml:space="preserve">  concurrencyPolicy: Forbid</w:t>
+      </w:r>
+    </w:p>
+    <w:p>
+      <w:pPr>
+        <w:pBdr>
+          <w:left w:val="single" w:color="CBD5E1" w:sz="16" w:space="8"/>
+        </w:pBdr>
+        <w:shd w:fill="F3F4F6" w:val="clear"/>
+        <w:spacing w:after="0" w:before="0" w:line="240"/>
+        <w:ind w:left="120"/>
+      </w:pPr>
+      <w:r>
+        <w:rPr>
+          <w:rFonts w:ascii="Consolas" w:cs="Consolas" w:eastAsia="Consolas" w:hAnsi="Consolas"/>
+          <w:color w:val="0F172A"/>
+          <w:sz w:val="17"/>
+          <w:szCs w:val="17"/>
+        </w:rPr>
+        <w:t xml:space="preserve">  jobTemplate:</w:t>
+      </w:r>
+    </w:p>
+    <w:p>
+      <w:pPr>
+        <w:pBdr>
+          <w:left w:val="single" w:color="CBD5E1" w:sz="16" w:space="8"/>
+        </w:pBdr>
+        <w:shd w:fill="F3F4F6" w:val="clear"/>
+        <w:spacing w:after="0" w:before="0" w:line="240"/>
+        <w:ind w:left="120"/>
+      </w:pPr>
+      <w:r>
+        <w:rPr>
+          <w:rFonts w:ascii="Consolas" w:cs="Consolas" w:eastAsia="Consolas" w:hAnsi="Consolas"/>
+          <w:color w:val="0F172A"/>
+          <w:sz w:val="17"/>
+          <w:szCs w:val="17"/>
+        </w:rPr>
+        <w:t xml:space="preserve">    spec:</w:t>
+      </w:r>
+    </w:p>
+    <w:p>
+      <w:pPr>
+        <w:pBdr>
+          <w:left w:val="single" w:color="CBD5E1" w:sz="16" w:space="8"/>
+        </w:pBdr>
+        <w:shd w:fill="F3F4F6" w:val="clear"/>
+        <w:spacing w:after="0" w:before="0" w:line="240"/>
+        <w:ind w:left="120"/>
+      </w:pPr>
+      <w:r>
+        <w:rPr>
+          <w:rFonts w:ascii="Consolas" w:cs="Consolas" w:eastAsia="Consolas" w:hAnsi="Consolas"/>
+          <w:color w:val="0F172A"/>
+          <w:sz w:val="17"/>
+          <w:szCs w:val="17"/>
+        </w:rPr>
+        <w:t xml:space="preserve">      template:</w:t>
+      </w:r>
+    </w:p>
+    <w:p>
+      <w:pPr>
+        <w:pBdr>
+          <w:left w:val="single" w:color="CBD5E1" w:sz="16" w:space="8"/>
+        </w:pBdr>
+        <w:shd w:fill="F3F4F6" w:val="clear"/>
+        <w:spacing w:after="0" w:before="0" w:line="240"/>
+        <w:ind w:left="120"/>
+      </w:pPr>
+      <w:r>
+        <w:rPr>
+          <w:rFonts w:ascii="Consolas" w:cs="Consolas" w:eastAsia="Consolas" w:hAnsi="Consolas"/>
+          <w:color w:val="0F172A"/>
+          <w:sz w:val="17"/>
+          <w:szCs w:val="17"/>
+        </w:rPr>
+        <w:t xml:space="preserve">        spec:</w:t>
+      </w:r>
+    </w:p>
+    <w:p>
+      <w:pPr>
+        <w:pBdr>
+          <w:left w:val="single" w:color="CBD5E1" w:sz="16" w:space="8"/>
+        </w:pBdr>
+        <w:shd w:fill="F3F4F6" w:val="clear"/>
+        <w:spacing w:after="0" w:before="0" w:line="240"/>
+        <w:ind w:left="120"/>
+      </w:pPr>
+      <w:r>
+        <w:rPr>
+          <w:rFonts w:ascii="Consolas" w:cs="Consolas" w:eastAsia="Consolas" w:hAnsi="Consolas"/>
+          <w:color w:val="0F172A"/>
+          <w:sz w:val="17"/>
+          <w:szCs w:val="17"/>
+        </w:rPr>
+        <w:t xml:space="preserve">          restartPolicy: OnFailure</w:t>
+      </w:r>
+    </w:p>
+    <w:p>
+      <w:pPr>
+        <w:pBdr>
+          <w:left w:val="single" w:color="CBD5E1" w:sz="16" w:space="8"/>
+        </w:pBdr>
+        <w:shd w:fill="F3F4F6" w:val="clear"/>
+        <w:spacing w:after="0" w:before="0" w:line="240"/>
+        <w:ind w:left="120"/>
+      </w:pPr>
+      <w:r>
+        <w:rPr>
+          <w:rFonts w:ascii="Consolas" w:cs="Consolas" w:eastAsia="Consolas" w:hAnsi="Consolas"/>
+          <w:color w:val="0F172A"/>
+          <w:sz w:val="17"/>
+          <w:szCs w:val="17"/>
+        </w:rPr>
+        <w:t xml:space="preserve">          containers:</w:t>
+      </w:r>
+    </w:p>
+    <w:p>
+      <w:pPr>
+        <w:pBdr>
+          <w:left w:val="single" w:color="CBD5E1" w:sz="16" w:space="8"/>
+        </w:pBdr>
+        <w:shd w:fill="F3F4F6" w:val="clear"/>
+        <w:spacing w:after="0" w:before="0" w:line="240"/>
+        <w:ind w:left="120"/>
+      </w:pPr>
+      <w:r>
+        <w:rPr>
+          <w:rFonts w:ascii="Consolas" w:cs="Consolas" w:eastAsia="Consolas" w:hAnsi="Consolas"/>
+          <w:color w:val="0F172A"/>
+          <w:sz w:val="17"/>
+          <w:szCs w:val="17"/>
+        </w:rPr>
+        <w:t xml:space="preserve">            - name: pgdump</w:t>
+      </w:r>
+    </w:p>
+    <w:p>
+      <w:pPr>
+        <w:pBdr>
+          <w:left w:val="single" w:color="CBD5E1" w:sz="16" w:space="8"/>
+        </w:pBdr>
+        <w:shd w:fill="F3F4F6" w:val="clear"/>
+        <w:spacing w:after="0" w:before="0" w:line="240"/>
+        <w:ind w:left="120"/>
+      </w:pPr>
+      <w:r>
+        <w:rPr>
+          <w:rFonts w:ascii="Consolas" w:cs="Consolas" w:eastAsia="Consolas" w:hAnsi="Consolas"/>
+          <w:color w:val="0F172A"/>
+          <w:sz w:val="17"/>
+          <w:szCs w:val="17"/>
+        </w:rPr>
+        <w:t xml:space="preserve">              image: postgres:16-alpine</w:t>
+      </w:r>
+    </w:p>
+    <w:p>
+      <w:pPr>
+        <w:pBdr>
+          <w:left w:val="single" w:color="CBD5E1" w:sz="16" w:space="8"/>
+        </w:pBdr>
+        <w:shd w:fill="F3F4F6" w:val="clear"/>
+        <w:spacing w:after="0" w:before="0" w:line="240"/>
+        <w:ind w:left="120"/>
+      </w:pPr>
+      <w:r>
+        <w:rPr>
+          <w:rFonts w:ascii="Consolas" w:cs="Consolas" w:eastAsia="Consolas" w:hAnsi="Consolas"/>
+          <w:color w:val="0F172A"/>
+          <w:sz w:val="17"/>
+          <w:szCs w:val="17"/>
+        </w:rPr>
+        <w:t xml:space="preserve">              envFrom: [ { secretRef: { name: backup-secret } } ]</w:t>
+      </w:r>
+    </w:p>
+    <w:p>
+      <w:pPr>
+        <w:pBdr>
+          <w:left w:val="single" w:color="CBD5E1" w:sz="16" w:space="8"/>
+        </w:pBdr>
+        <w:shd w:fill="F3F4F6" w:val="clear"/>
+        <w:spacing w:after="0" w:before="0" w:line="240"/>
+        <w:ind w:left="120"/>
+      </w:pPr>
+      <w:r>
+        <w:rPr>
+          <w:rFonts w:ascii="Consolas" w:cs="Consolas" w:eastAsia="Consolas" w:hAnsi="Consolas"/>
+          <w:color w:val="0F172A"/>
+          <w:sz w:val="17"/>
+          <w:szCs w:val="17"/>
+        </w:rPr>
+        <w:t xml:space="preserve">              command: ["/bin/sh","-c","TS=$(date +%F); </w:t>
+      </w:r>
+    </w:p>
+    <w:p>
+      <w:pPr>
+        <w:pBdr>
+          <w:left w:val="single" w:color="CBD5E1" w:sz="16" w:space="8"/>
+        </w:pBdr>
+        <w:shd w:fill="F3F4F6" w:val="clear"/>
+        <w:spacing w:after="0" w:before="0" w:line="240"/>
+        <w:ind w:left="120"/>
+      </w:pPr>
+      <w:r>
+        <w:rPr>
+          <w:rFonts w:ascii="Consolas" w:cs="Consolas" w:eastAsia="Consolas" w:hAnsi="Consolas"/>
+          <w:color w:val="0F172A"/>
+          <w:sz w:val="17"/>
+          <w:szCs w:val="17"/>
+        </w:rPr>
+        <w:t xml:space="preserve">                 PGPASSWORD=$AUTH_PASS pg_dump -h auth-postgres -U auth_user auth_db &gt; /backups/auth-$TS.sql; </w:t>
+      </w:r>
+    </w:p>
+    <w:p>
+      <w:pPr>
+        <w:pBdr>
+          <w:left w:val="single" w:color="CBD5E1" w:sz="16" w:space="8"/>
+        </w:pBdr>
+        <w:shd w:fill="F3F4F6" w:val="clear"/>
+        <w:spacing w:after="0" w:before="0" w:line="240"/>
+        <w:ind w:left="120"/>
+      </w:pPr>
+      <w:r>
+        <w:rPr>
+          <w:rFonts w:ascii="Consolas" w:cs="Consolas" w:eastAsia="Consolas" w:hAnsi="Consolas"/>
+          <w:color w:val="0F172A"/>
+          <w:sz w:val="17"/>
+          <w:szCs w:val="17"/>
+        </w:rPr>
+        <w:t xml:space="preserve">                 # ... (una linea por base) ...  find /backups -name '*.sql' -mtime +7 -delete"]</w:t>
+      </w:r>
+    </w:p>
+    <w:p>
+      <w:pPr>
+        <w:pBdr>
+          <w:left w:val="single" w:color="CBD5E1" w:sz="16" w:space="8"/>
+        </w:pBdr>
+        <w:shd w:fill="F3F4F6" w:val="clear"/>
+        <w:spacing w:after="0" w:before="0" w:line="240"/>
+        <w:ind w:left="120"/>
+      </w:pPr>
+      <w:r>
+        <w:rPr>
+          <w:rFonts w:ascii="Consolas" w:cs="Consolas" w:eastAsia="Consolas" w:hAnsi="Consolas"/>
+          <w:color w:val="0F172A"/>
+          <w:sz w:val="17"/>
+          <w:szCs w:val="17"/>
+        </w:rPr>
+        <w:t xml:space="preserve">              volumeMounts: [ { name: backups, mountPath: /backups } ]</w:t>
+      </w:r>
+    </w:p>
+    <w:p>
+      <w:pPr>
+        <w:pBdr>
+          <w:left w:val="single" w:color="CBD5E1" w:sz="16" w:space="8"/>
+        </w:pBdr>
+        <w:shd w:fill="F3F4F6" w:val="clear"/>
+        <w:spacing w:after="0" w:before="0" w:line="240"/>
+        <w:ind w:left="120"/>
+      </w:pPr>
+      <w:r>
+        <w:rPr>
+          <w:rFonts w:ascii="Consolas" w:cs="Consolas" w:eastAsia="Consolas" w:hAnsi="Consolas"/>
+          <w:color w:val="0F172A"/>
+          <w:sz w:val="17"/>
+          <w:szCs w:val="17"/>
+        </w:rPr>
+        <w:t xml:space="preserve">          volumes:</w:t>
+      </w:r>
+    </w:p>
+    <w:p>
+      <w:pPr>
+        <w:pBdr>
+          <w:left w:val="single" w:color="CBD5E1" w:sz="16" w:space="8"/>
+        </w:pBdr>
+        <w:shd w:fill="F3F4F6" w:val="clear"/>
+        <w:spacing w:after="0" w:before="0" w:line="240"/>
+        <w:ind w:left="120"/>
+      </w:pPr>
+      <w:r>
+        <w:rPr>
+          <w:rFonts w:ascii="Consolas" w:cs="Consolas" w:eastAsia="Consolas" w:hAnsi="Consolas"/>
+          <w:color w:val="0F172A"/>
+          <w:sz w:val="17"/>
+          <w:szCs w:val="17"/>
+        </w:rPr>
+        <w:t xml:space="preserve">            - name: backups</w:t>
+      </w:r>
+    </w:p>
+    <w:p>
+      <w:pPr>
+        <w:pBdr>
+          <w:left w:val="single" w:color="CBD5E1" w:sz="16" w:space="8"/>
+        </w:pBdr>
+        <w:shd w:fill="F3F4F6" w:val="clear"/>
+        <w:spacing w:after="150" w:before="0" w:line="240"/>
+        <w:ind w:left="120"/>
+      </w:pPr>
+      <w:r>
+        <w:rPr>
+          <w:rFonts w:ascii="Consolas" w:cs="Consolas" w:eastAsia="Consolas" w:hAnsi="Consolas"/>
+          <w:color w:val="0F172A"/>
+          <w:sz w:val="17"/>
+          <w:szCs w:val="17"/>
+        </w:rPr>
+        <w:t xml:space="preserve">              persistentVolumeClaim: { claimName: postgres-backups }</w:t>
+      </w:r>
+    </w:p>
+    <w:p>
+      <w:pPr>
+        <w:pStyle w:val="Heading2"/>
+      </w:pPr>
+      <w:r>
+        <w:rPr>
+          <w:rFonts w:ascii="Arial" w:cs="Arial" w:eastAsia="Arial" w:hAnsi="Arial"/>
+        </w:rPr>
+        <w:t xml:space="preserve">17.14 Prometheus Operator: ServiceMonitor y PrometheusRule</w:t>
+      </w:r>
+    </w:p>
+    <w:p>
+      <w:pPr>
+        <w:spacing w:after="120" w:line="276"/>
+      </w:pPr>
+      <w:r>
+        <w:rPr>
+          <w:rFonts w:ascii="Arial" w:cs="Arial" w:eastAsia="Arial" w:hAnsi="Arial"/>
+        </w:rPr>
+        <w:t xml:space="preserve">Cuando el cluster tiene instalado el </w:t>
+      </w:r>
+      <w:r>
+        <w:rPr>
+          <w:rFonts w:ascii="Arial" w:cs="Arial" w:eastAsia="Arial" w:hAnsi="Arial"/>
+          <w:b/>
+          <w:bCs/>
+        </w:rPr>
+        <w:t xml:space="preserve">Prometheus Operator</w:t>
+      </w:r>
+      <w:r>
+        <w:rPr>
+          <w:rFonts w:ascii="Arial" w:cs="Arial" w:eastAsia="Arial" w:hAnsi="Arial"/>
+        </w:rPr>
+        <w:t xml:space="preserve"> (kube-prometheus-stack), en vez de configurar el scrape a mano se declaran objetos: un </w:t>
+      </w:r>
+      <w:r>
+        <w:rPr>
+          <w:rFonts w:ascii="Consolas" w:cs="Consolas" w:eastAsia="Consolas" w:hAnsi="Consolas"/>
+          <w:color w:val="4F46E5"/>
+        </w:rPr>
+        <w:t xml:space="preserve">ServiceMonitor</w:t>
+      </w:r>
+      <w:r>
+        <w:rPr>
+          <w:rFonts w:ascii="Arial" w:cs="Arial" w:eastAsia="Arial" w:hAnsi="Arial"/>
+        </w:rPr>
+        <w:t xml:space="preserve"> (que servicios scrapear) y un </w:t>
+      </w:r>
+      <w:r>
+        <w:rPr>
+          <w:rFonts w:ascii="Consolas" w:cs="Consolas" w:eastAsia="Consolas" w:hAnsi="Consolas"/>
+          <w:color w:val="4F46E5"/>
+        </w:rPr>
+        <w:t xml:space="preserve">PrometheusRule</w:t>
+      </w:r>
+      <w:r>
+        <w:rPr>
+          <w:rFonts w:ascii="Arial" w:cs="Arial" w:eastAsia="Arial" w:hAnsi="Arial"/>
+        </w:rPr>
+        <w:t xml:space="preserve"> (las alertas como codigo). Van en </w:t>
+      </w:r>
+      <w:r>
+        <w:rPr>
+          <w:rFonts w:ascii="Consolas" w:cs="Consolas" w:eastAsia="Consolas" w:hAnsi="Consolas"/>
+          <w:color w:val="4F46E5"/>
+        </w:rPr>
+        <w:t xml:space="preserve">k8s/monitoring-operator/</w:t>
+      </w:r>
+      <w:r>
+        <w:rPr>
+          <w:rFonts w:ascii="Arial" w:cs="Arial" w:eastAsia="Arial" w:hAnsi="Arial"/>
+        </w:rPr>
+        <w:t xml:space="preserve">, separados de la base porque requieren esos CRDs.</w:t>
+      </w:r>
+    </w:p>
+    <w:p>
+      <w:pPr>
+        <w:pBdr>
+          <w:left w:val="single" w:color="CBD5E1" w:sz="16" w:space="8"/>
+        </w:pBdr>
+        <w:shd w:fill="F3F4F6" w:val="clear"/>
+        <w:spacing w:after="0" w:before="40" w:line="240"/>
+        <w:ind w:left="120"/>
+      </w:pPr>
+      <w:r>
+        <w:rPr>
+          <w:rFonts w:ascii="Consolas" w:cs="Consolas" w:eastAsia="Consolas" w:hAnsi="Consolas"/>
+          <w:color w:val="0F172A"/>
+          <w:sz w:val="17"/>
+          <w:szCs w:val="17"/>
+        </w:rPr>
+        <w:t xml:space="preserve">apiVersion: monitoring.coreos.com/v1</w:t>
+      </w:r>
+    </w:p>
+    <w:p>
+      <w:pPr>
+        <w:pBdr>
+          <w:left w:val="single" w:color="CBD5E1" w:sz="16" w:space="8"/>
+        </w:pBdr>
+        <w:shd w:fill="F3F4F6" w:val="clear"/>
+        <w:spacing w:after="0" w:before="0" w:line="240"/>
+        <w:ind w:left="120"/>
+      </w:pPr>
+      <w:r>
+        <w:rPr>
+          <w:rFonts w:ascii="Consolas" w:cs="Consolas" w:eastAsia="Consolas" w:hAnsi="Consolas"/>
+          <w:color w:val="0F172A"/>
+          <w:sz w:val="17"/>
+          <w:szCs w:val="17"/>
+        </w:rPr>
+        <w:t xml:space="preserve">kind: ServiceMonitor</w:t>
+      </w:r>
+    </w:p>
+    <w:p>
+      <w:pPr>
+        <w:pBdr>
+          <w:left w:val="single" w:color="CBD5E1" w:sz="16" w:space="8"/>
+        </w:pBdr>
+        <w:shd w:fill="F3F4F6" w:val="clear"/>
+        <w:spacing w:after="0" w:before="0" w:line="240"/>
+        <w:ind w:left="120"/>
+      </w:pPr>
+      <w:r>
+        <w:rPr>
+          <w:rFonts w:ascii="Consolas" w:cs="Consolas" w:eastAsia="Consolas" w:hAnsi="Consolas"/>
+          <w:color w:val="0F172A"/>
+          <w:sz w:val="17"/>
+          <w:szCs w:val="17"/>
+        </w:rPr>
+        <w:t xml:space="preserve">metadata: { name: bookplus-apps }</w:t>
+      </w:r>
+    </w:p>
+    <w:p>
+      <w:pPr>
+        <w:pBdr>
+          <w:left w:val="single" w:color="CBD5E1" w:sz="16" w:space="8"/>
+        </w:pBdr>
+        <w:shd w:fill="F3F4F6" w:val="clear"/>
+        <w:spacing w:after="0" w:before="0" w:line="240"/>
+        <w:ind w:left="120"/>
+      </w:pPr>
+      <w:r>
+        <w:rPr>
+          <w:rFonts w:ascii="Consolas" w:cs="Consolas" w:eastAsia="Consolas" w:hAnsi="Consolas"/>
+          <w:color w:val="0F172A"/>
+          <w:sz w:val="17"/>
+          <w:szCs w:val="17"/>
+        </w:rPr>
+        <w:t xml:space="preserve">spec:</w:t>
+      </w:r>
+    </w:p>
+    <w:p>
+      <w:pPr>
+        <w:pBdr>
+          <w:left w:val="single" w:color="CBD5E1" w:sz="16" w:space="8"/>
+        </w:pBdr>
+        <w:shd w:fill="F3F4F6" w:val="clear"/>
+        <w:spacing w:after="0" w:before="0" w:line="240"/>
+        <w:ind w:left="120"/>
+      </w:pPr>
+      <w:r>
+        <w:rPr>
+          <w:rFonts w:ascii="Consolas" w:cs="Consolas" w:eastAsia="Consolas" w:hAnsi="Consolas"/>
+          <w:color w:val="0F172A"/>
+          <w:sz w:val="17"/>
+          <w:szCs w:val="17"/>
+        </w:rPr>
+        <w:t xml:space="preserve">  selector: { matchLabels: { bookplus.io/metrics: "true" } }   # solo los microservicios</w:t>
+      </w:r>
+    </w:p>
+    <w:p>
+      <w:pPr>
+        <w:pBdr>
+          <w:left w:val="single" w:color="CBD5E1" w:sz="16" w:space="8"/>
+        </w:pBdr>
+        <w:shd w:fill="F3F4F6" w:val="clear"/>
+        <w:spacing w:after="0" w:before="0" w:line="240"/>
+        <w:ind w:left="120"/>
+      </w:pPr>
+      <w:r>
+        <w:rPr>
+          <w:rFonts w:ascii="Consolas" w:cs="Consolas" w:eastAsia="Consolas" w:hAnsi="Consolas"/>
+          <w:color w:val="0F172A"/>
+          <w:sz w:val="17"/>
+          <w:szCs w:val="17"/>
+        </w:rPr>
+        <w:t xml:space="preserve">  endpoints:</w:t>
+      </w:r>
+    </w:p>
+    <w:p>
+      <w:pPr>
+        <w:pBdr>
+          <w:left w:val="single" w:color="CBD5E1" w:sz="16" w:space="8"/>
+        </w:pBdr>
+        <w:shd w:fill="F3F4F6" w:val="clear"/>
+        <w:spacing w:after="0" w:before="0" w:line="240"/>
+        <w:ind w:left="120"/>
+      </w:pPr>
+      <w:r>
+        <w:rPr>
+          <w:rFonts w:ascii="Consolas" w:cs="Consolas" w:eastAsia="Consolas" w:hAnsi="Consolas"/>
+          <w:color w:val="0F172A"/>
+          <w:sz w:val="17"/>
+          <w:szCs w:val="17"/>
+        </w:rPr>
+        <w:t xml:space="preserve">    - { port: http, path: /actuator/prometheus, interval: 15s }</w:t>
+      </w:r>
+    </w:p>
+    <w:p>
+      <w:pPr>
+        <w:pBdr>
+          <w:left w:val="single" w:color="CBD5E1" w:sz="16" w:space="8"/>
+        </w:pBdr>
+        <w:shd w:fill="F3F4F6" w:val="clear"/>
+        <w:spacing w:after="0" w:before="0" w:line="240"/>
+        <w:ind w:left="120"/>
+      </w:pPr>
+      <w:r>
+        <w:rPr>
+          <w:rFonts w:ascii="Consolas" w:cs="Consolas" w:eastAsia="Consolas" w:hAnsi="Consolas"/>
+          <w:color w:val="0F172A"/>
+          <w:sz w:val="17"/>
+          <w:szCs w:val="17"/>
+        </w:rPr>
+        <w:t xml:space="preserve">---</w:t>
+      </w:r>
+    </w:p>
+    <w:p>
+      <w:pPr>
+        <w:pBdr>
+          <w:left w:val="single" w:color="CBD5E1" w:sz="16" w:space="8"/>
+        </w:pBdr>
+        <w:shd w:fill="F3F4F6" w:val="clear"/>
+        <w:spacing w:after="0" w:before="0" w:line="240"/>
+        <w:ind w:left="120"/>
+      </w:pPr>
+      <w:r>
+        <w:rPr>
+          <w:rFonts w:ascii="Consolas" w:cs="Consolas" w:eastAsia="Consolas" w:hAnsi="Consolas"/>
+          <w:color w:val="0F172A"/>
+          <w:sz w:val="17"/>
+          <w:szCs w:val="17"/>
+        </w:rPr>
+        <w:t xml:space="preserve">apiVersion: monitoring.coreos.com/v1</w:t>
+      </w:r>
+    </w:p>
+    <w:p>
+      <w:pPr>
+        <w:pBdr>
+          <w:left w:val="single" w:color="CBD5E1" w:sz="16" w:space="8"/>
+        </w:pBdr>
+        <w:shd w:fill="F3F4F6" w:val="clear"/>
+        <w:spacing w:after="0" w:before="0" w:line="240"/>
+        <w:ind w:left="120"/>
+      </w:pPr>
+      <w:r>
+        <w:rPr>
+          <w:rFonts w:ascii="Consolas" w:cs="Consolas" w:eastAsia="Consolas" w:hAnsi="Consolas"/>
+          <w:color w:val="0F172A"/>
+          <w:sz w:val="17"/>
+          <w:szCs w:val="17"/>
+        </w:rPr>
+        <w:t xml:space="preserve">kind: PrometheusRule</w:t>
+      </w:r>
+    </w:p>
+    <w:p>
+      <w:pPr>
+        <w:pBdr>
+          <w:left w:val="single" w:color="CBD5E1" w:sz="16" w:space="8"/>
+        </w:pBdr>
+        <w:shd w:fill="F3F4F6" w:val="clear"/>
+        <w:spacing w:after="0" w:before="0" w:line="240"/>
+        <w:ind w:left="120"/>
+      </w:pPr>
+      <w:r>
+        <w:rPr>
+          <w:rFonts w:ascii="Consolas" w:cs="Consolas" w:eastAsia="Consolas" w:hAnsi="Consolas"/>
+          <w:color w:val="0F172A"/>
+          <w:sz w:val="17"/>
+          <w:szCs w:val="17"/>
+        </w:rPr>
+        <w:t xml:space="preserve">metadata: { name: bookplus-alerts }</w:t>
+      </w:r>
+    </w:p>
+    <w:p>
+      <w:pPr>
+        <w:pBdr>
+          <w:left w:val="single" w:color="CBD5E1" w:sz="16" w:space="8"/>
+        </w:pBdr>
+        <w:shd w:fill="F3F4F6" w:val="clear"/>
+        <w:spacing w:after="0" w:before="0" w:line="240"/>
+        <w:ind w:left="120"/>
+      </w:pPr>
+      <w:r>
+        <w:rPr>
+          <w:rFonts w:ascii="Consolas" w:cs="Consolas" w:eastAsia="Consolas" w:hAnsi="Consolas"/>
+          <w:color w:val="0F172A"/>
+          <w:sz w:val="17"/>
+          <w:szCs w:val="17"/>
+        </w:rPr>
+        <w:t xml:space="preserve">spec:</w:t>
+      </w:r>
+    </w:p>
+    <w:p>
+      <w:pPr>
+        <w:pBdr>
+          <w:left w:val="single" w:color="CBD5E1" w:sz="16" w:space="8"/>
+        </w:pBdr>
+        <w:shd w:fill="F3F4F6" w:val="clear"/>
+        <w:spacing w:after="0" w:before="0" w:line="240"/>
+        <w:ind w:left="120"/>
+      </w:pPr>
+      <w:r>
+        <w:rPr>
+          <w:rFonts w:ascii="Consolas" w:cs="Consolas" w:eastAsia="Consolas" w:hAnsi="Consolas"/>
+          <w:color w:val="0F172A"/>
+          <w:sz w:val="17"/>
+          <w:szCs w:val="17"/>
+        </w:rPr>
+        <w:t xml:space="preserve">  groups:</w:t>
+      </w:r>
+    </w:p>
+    <w:p>
+      <w:pPr>
+        <w:pBdr>
+          <w:left w:val="single" w:color="CBD5E1" w:sz="16" w:space="8"/>
+        </w:pBdr>
+        <w:shd w:fill="F3F4F6" w:val="clear"/>
+        <w:spacing w:after="0" w:before="0" w:line="240"/>
+        <w:ind w:left="120"/>
+      </w:pPr>
+      <w:r>
+        <w:rPr>
+          <w:rFonts w:ascii="Consolas" w:cs="Consolas" w:eastAsia="Consolas" w:hAnsi="Consolas"/>
+          <w:color w:val="0F172A"/>
+          <w:sz w:val="17"/>
+          <w:szCs w:val="17"/>
+        </w:rPr>
+        <w:t xml:space="preserve">    - name: bookplus-red</w:t>
+      </w:r>
+    </w:p>
+    <w:p>
+      <w:pPr>
+        <w:pBdr>
+          <w:left w:val="single" w:color="CBD5E1" w:sz="16" w:space="8"/>
+        </w:pBdr>
+        <w:shd w:fill="F3F4F6" w:val="clear"/>
+        <w:spacing w:after="0" w:before="0" w:line="240"/>
+        <w:ind w:left="120"/>
+      </w:pPr>
+      <w:r>
+        <w:rPr>
+          <w:rFonts w:ascii="Consolas" w:cs="Consolas" w:eastAsia="Consolas" w:hAnsi="Consolas"/>
+          <w:color w:val="0F172A"/>
+          <w:sz w:val="17"/>
+          <w:szCs w:val="17"/>
+        </w:rPr>
+        <w:t xml:space="preserve">      rules:</w:t>
+      </w:r>
+    </w:p>
+    <w:p>
+      <w:pPr>
+        <w:pBdr>
+          <w:left w:val="single" w:color="CBD5E1" w:sz="16" w:space="8"/>
+        </w:pBdr>
+        <w:shd w:fill="F3F4F6" w:val="clear"/>
+        <w:spacing w:after="0" w:before="0" w:line="240"/>
+        <w:ind w:left="120"/>
+      </w:pPr>
+      <w:r>
+        <w:rPr>
+          <w:rFonts w:ascii="Consolas" w:cs="Consolas" w:eastAsia="Consolas" w:hAnsi="Consolas"/>
+          <w:color w:val="0F172A"/>
+          <w:sz w:val="17"/>
+          <w:szCs w:val="17"/>
+        </w:rPr>
+        <w:t xml:space="preserve">        - alert: HighErrorRate</w:t>
+      </w:r>
+    </w:p>
+    <w:p>
+      <w:pPr>
+        <w:pBdr>
+          <w:left w:val="single" w:color="CBD5E1" w:sz="16" w:space="8"/>
+        </w:pBdr>
+        <w:shd w:fill="F3F4F6" w:val="clear"/>
+        <w:spacing w:after="0" w:before="0" w:line="240"/>
+        <w:ind w:left="120"/>
+      </w:pPr>
+      <w:r>
+        <w:rPr>
+          <w:rFonts w:ascii="Consolas" w:cs="Consolas" w:eastAsia="Consolas" w:hAnsi="Consolas"/>
+          <w:color w:val="0F172A"/>
+          <w:sz w:val="17"/>
+          <w:szCs w:val="17"/>
+        </w:rPr>
+        <w:t xml:space="preserve">          expr: sum by (instance) (rate(http_server_requests_seconds_count{status=~"5.."}[5m]))</w:t>
+      </w:r>
+    </w:p>
+    <w:p>
+      <w:pPr>
+        <w:pBdr>
+          <w:left w:val="single" w:color="CBD5E1" w:sz="16" w:space="8"/>
+        </w:pBdr>
+        <w:shd w:fill="F3F4F6" w:val="clear"/>
+        <w:spacing w:after="0" w:before="0" w:line="240"/>
+        <w:ind w:left="120"/>
+      </w:pPr>
+      <w:r>
+        <w:rPr>
+          <w:rFonts w:ascii="Consolas" w:cs="Consolas" w:eastAsia="Consolas" w:hAnsi="Consolas"/>
+          <w:color w:val="0F172A"/>
+          <w:sz w:val="17"/>
+          <w:szCs w:val="17"/>
+        </w:rPr>
+        <w:t xml:space="preserve">                / sum by (instance) (rate(http_server_requests_seconds_count[5m])) &gt; 0.05</w:t>
+      </w:r>
+    </w:p>
+    <w:p>
+      <w:pPr>
+        <w:pBdr>
+          <w:left w:val="single" w:color="CBD5E1" w:sz="16" w:space="8"/>
+        </w:pBdr>
+        <w:shd w:fill="F3F4F6" w:val="clear"/>
+        <w:spacing w:after="0" w:before="0" w:line="240"/>
+        <w:ind w:left="120"/>
+      </w:pPr>
+      <w:r>
+        <w:rPr>
+          <w:rFonts w:ascii="Consolas" w:cs="Consolas" w:eastAsia="Consolas" w:hAnsi="Consolas"/>
+          <w:color w:val="0F172A"/>
+          <w:sz w:val="17"/>
+          <w:szCs w:val="17"/>
+        </w:rPr>
+        <w:t xml:space="preserve">          for: 5m</w:t>
+      </w:r>
+    </w:p>
+    <w:p>
+      <w:pPr>
+        <w:pBdr>
+          <w:left w:val="single" w:color="CBD5E1" w:sz="16" w:space="8"/>
+        </w:pBdr>
+        <w:shd w:fill="F3F4F6" w:val="clear"/>
+        <w:spacing w:after="150" w:before="0" w:line="240"/>
+        <w:ind w:left="120"/>
+      </w:pPr>
+      <w:r>
+        <w:rPr>
+          <w:rFonts w:ascii="Consolas" w:cs="Consolas" w:eastAsia="Consolas" w:hAnsi="Consolas"/>
+          <w:color w:val="0F172A"/>
+          <w:sz w:val="17"/>
+          <w:szCs w:val="17"/>
+        </w:rPr>
+        <w:t xml:space="preserve">          labels: { severity: warning }</w:t>
+      </w:r>
+    </w:p>
+    <w:p>
+      <w:pPr>
+        <w:pStyle w:val="Heading2"/>
+      </w:pPr>
+      <w:r>
+        <w:rPr>
+          <w:rFonts w:ascii="Arial" w:cs="Arial" w:eastAsia="Arial" w:hAnsi="Arial"/>
+        </w:rPr>
+        <w:t xml:space="preserve">17.15 CI: validación de los manifiestos (cierre GitOps)</w:t>
+      </w:r>
+    </w:p>
+    <w:p>
+      <w:pPr>
+        <w:spacing w:after="120" w:line="276"/>
+      </w:pPr>
+      <w:r>
+        <w:rPr>
+          <w:rFonts w:ascii="Arial" w:cs="Arial" w:eastAsia="Arial" w:hAnsi="Arial"/>
+        </w:rPr>
+        <w:t xml:space="preserve">Un workflow (</w:t>
+      </w:r>
+      <w:r>
+        <w:rPr>
+          <w:rFonts w:ascii="Consolas" w:cs="Consolas" w:eastAsia="Consolas" w:hAnsi="Consolas"/>
+          <w:color w:val="4F46E5"/>
+        </w:rPr>
+        <w:t xml:space="preserve">.github/workflows/k8s-validate.yml</w:t>
+      </w:r>
+      <w:r>
+        <w:rPr>
+          <w:rFonts w:ascii="Arial" w:cs="Arial" w:eastAsia="Arial" w:hAnsi="Arial"/>
+        </w:rPr>
+        <w:t xml:space="preserve">) valida los manifiestos en cada cambio: renderiza los overlays con </w:t>
+      </w:r>
+      <w:r>
+        <w:rPr>
+          <w:rFonts w:ascii="Arial" w:cs="Arial" w:eastAsia="Arial" w:hAnsi="Arial"/>
+          <w:b/>
+          <w:bCs/>
+        </w:rPr>
+        <w:t xml:space="preserve">Kustomize</w:t>
+      </w:r>
+      <w:r>
+        <w:rPr>
+          <w:rFonts w:ascii="Arial" w:cs="Arial" w:eastAsia="Arial" w:hAnsi="Arial"/>
+        </w:rPr>
+        <w:t xml:space="preserve"> y comprueba el esquema con </w:t>
+      </w:r>
+      <w:r>
+        <w:rPr>
+          <w:rFonts w:ascii="Arial" w:cs="Arial" w:eastAsia="Arial" w:hAnsi="Arial"/>
+          <w:b/>
+          <w:bCs/>
+        </w:rPr>
+        <w:t xml:space="preserve">kubeconform</w:t>
+      </w:r>
+      <w:r>
+        <w:rPr>
+          <w:rFonts w:ascii="Arial" w:cs="Arial" w:eastAsia="Arial" w:hAnsi="Arial"/>
+        </w:rPr>
+        <w:t xml:space="preserve">; ademas hace </w:t>
+      </w:r>
+      <w:r>
+        <w:rPr>
+          <w:rFonts w:ascii="Consolas" w:cs="Consolas" w:eastAsia="Consolas" w:hAnsi="Consolas"/>
+          <w:color w:val="4F46E5"/>
+        </w:rPr>
+        <w:t xml:space="preserve">helm lint</w:t>
+      </w:r>
+      <w:r>
+        <w:rPr>
+          <w:rFonts w:ascii="Arial" w:cs="Arial" w:eastAsia="Arial" w:hAnsi="Arial"/>
+        </w:rPr>
+        <w:t xml:space="preserve"> y </w:t>
+      </w:r>
+      <w:r>
+        <w:rPr>
+          <w:rFonts w:ascii="Consolas" w:cs="Consolas" w:eastAsia="Consolas" w:hAnsi="Consolas"/>
+          <w:color w:val="4F46E5"/>
+        </w:rPr>
+        <w:t xml:space="preserve">helm template</w:t>
+      </w:r>
+      <w:r>
+        <w:rPr>
+          <w:rFonts w:ascii="Arial" w:cs="Arial" w:eastAsia="Arial" w:hAnsi="Arial"/>
+        </w:rPr>
+        <w:t xml:space="preserve">. Asi ningun YAML roto entra al repo.</w:t>
+      </w:r>
+    </w:p>
+    <w:p>
+      <w:pPr>
+        <w:pBdr>
+          <w:left w:val="single" w:color="CBD5E1" w:sz="16" w:space="8"/>
+        </w:pBdr>
+        <w:shd w:fill="F3F4F6" w:val="clear"/>
+        <w:spacing w:after="0" w:before="40" w:line="240"/>
+        <w:ind w:left="120"/>
+      </w:pPr>
+      <w:r>
+        <w:rPr>
+          <w:rFonts w:ascii="Consolas" w:cs="Consolas" w:eastAsia="Consolas" w:hAnsi="Consolas"/>
+          <w:color w:val="0F172A"/>
+          <w:sz w:val="17"/>
+          <w:szCs w:val="17"/>
+        </w:rPr>
+        <w:t xml:space="preserve">on: { push: { paths: ["k8s/**","helm/**"] }, pull_request: { paths: ["k8s/**","helm/**"] } }</w:t>
+      </w:r>
+    </w:p>
+    <w:p>
+      <w:pPr>
+        <w:pBdr>
+          <w:left w:val="single" w:color="CBD5E1" w:sz="16" w:space="8"/>
+        </w:pBdr>
+        <w:shd w:fill="F3F4F6" w:val="clear"/>
+        <w:spacing w:after="0" w:before="0" w:line="240"/>
+        <w:ind w:left="120"/>
+      </w:pPr>
+      <w:r>
+        <w:rPr>
+          <w:rFonts w:ascii="Consolas" w:cs="Consolas" w:eastAsia="Consolas" w:hAnsi="Consolas"/>
+          <w:color w:val="0F172A"/>
+          <w:sz w:val="17"/>
+          <w:szCs w:val="17"/>
+        </w:rPr>
+        <w:t xml:space="preserve">jobs:</w:t>
+      </w:r>
+    </w:p>
+    <w:p>
+      <w:pPr>
+        <w:pBdr>
+          <w:left w:val="single" w:color="CBD5E1" w:sz="16" w:space="8"/>
+        </w:pBdr>
+        <w:shd w:fill="F3F4F6" w:val="clear"/>
+        <w:spacing w:after="0" w:before="0" w:line="240"/>
+        <w:ind w:left="120"/>
+      </w:pPr>
+      <w:r>
+        <w:rPr>
+          <w:rFonts w:ascii="Consolas" w:cs="Consolas" w:eastAsia="Consolas" w:hAnsi="Consolas"/>
+          <w:color w:val="0F172A"/>
+          <w:sz w:val="17"/>
+          <w:szCs w:val="17"/>
+        </w:rPr>
+        <w:t xml:space="preserve">  validate:</w:t>
+      </w:r>
+    </w:p>
+    <w:p>
+      <w:pPr>
+        <w:pBdr>
+          <w:left w:val="single" w:color="CBD5E1" w:sz="16" w:space="8"/>
+        </w:pBdr>
+        <w:shd w:fill="F3F4F6" w:val="clear"/>
+        <w:spacing w:after="0" w:before="0" w:line="240"/>
+        <w:ind w:left="120"/>
+      </w:pPr>
+      <w:r>
+        <w:rPr>
+          <w:rFonts w:ascii="Consolas" w:cs="Consolas" w:eastAsia="Consolas" w:hAnsi="Consolas"/>
+          <w:color w:val="0F172A"/>
+          <w:sz w:val="17"/>
+          <w:szCs w:val="17"/>
+        </w:rPr>
+        <w:t xml:space="preserve">    steps:</w:t>
+      </w:r>
+    </w:p>
+    <w:p>
+      <w:pPr>
+        <w:pBdr>
+          <w:left w:val="single" w:color="CBD5E1" w:sz="16" w:space="8"/>
+        </w:pBdr>
+        <w:shd w:fill="F3F4F6" w:val="clear"/>
+        <w:spacing w:after="0" w:before="0" w:line="240"/>
+        <w:ind w:left="120"/>
+      </w:pPr>
+      <w:r>
+        <w:rPr>
+          <w:rFonts w:ascii="Consolas" w:cs="Consolas" w:eastAsia="Consolas" w:hAnsi="Consolas"/>
+          <w:color w:val="0F172A"/>
+          <w:sz w:val="17"/>
+          <w:szCs w:val="17"/>
+        </w:rPr>
+        <w:t xml:space="preserve">      - uses: actions/checkout@v4</w:t>
+      </w:r>
+    </w:p>
+    <w:p>
+      <w:pPr>
+        <w:pBdr>
+          <w:left w:val="single" w:color="CBD5E1" w:sz="16" w:space="8"/>
+        </w:pBdr>
+        <w:shd w:fill="F3F4F6" w:val="clear"/>
+        <w:spacing w:after="0" w:before="0" w:line="240"/>
+        <w:ind w:left="120"/>
+      </w:pPr>
+      <w:r>
+        <w:rPr>
+          <w:rFonts w:ascii="Consolas" w:cs="Consolas" w:eastAsia="Consolas" w:hAnsi="Consolas"/>
+          <w:color w:val="0F172A"/>
+          <w:sz w:val="17"/>
+          <w:szCs w:val="17"/>
+        </w:rPr>
+        <w:t xml:space="preserve">      - uses: yokawasa/action-setup-kube-tools@v0.11.2</w:t>
+      </w:r>
+    </w:p>
+    <w:p>
+      <w:pPr>
+        <w:pBdr>
+          <w:left w:val="single" w:color="CBD5E1" w:sz="16" w:space="8"/>
+        </w:pBdr>
+        <w:shd w:fill="F3F4F6" w:val="clear"/>
+        <w:spacing w:after="0" w:before="0" w:line="240"/>
+        <w:ind w:left="120"/>
+      </w:pPr>
+      <w:r>
+        <w:rPr>
+          <w:rFonts w:ascii="Consolas" w:cs="Consolas" w:eastAsia="Consolas" w:hAnsi="Consolas"/>
+          <w:color w:val="0F172A"/>
+          <w:sz w:val="17"/>
+          <w:szCs w:val="17"/>
+        </w:rPr>
+        <w:t xml:space="preserve">        with: { kustomize: "5.4.3", kubeconform: "0.6.7", helm: "3.15.4" }</w:t>
+      </w:r>
+    </w:p>
+    <w:p>
+      <w:pPr>
+        <w:pBdr>
+          <w:left w:val="single" w:color="CBD5E1" w:sz="16" w:space="8"/>
+        </w:pBdr>
+        <w:shd w:fill="F3F4F6" w:val="clear"/>
+        <w:spacing w:after="0" w:before="0" w:line="240"/>
+        <w:ind w:left="120"/>
+      </w:pPr>
+      <w:r>
+        <w:rPr>
+          <w:rFonts w:ascii="Consolas" w:cs="Consolas" w:eastAsia="Consolas" w:hAnsi="Consolas"/>
+          <w:color w:val="0F172A"/>
+          <w:sz w:val="17"/>
+          <w:szCs w:val="17"/>
+        </w:rPr>
+        <w:t xml:space="preserve">      - run: kustomize build k8s/overlays/prod |</w:t>
+      </w:r>
+    </w:p>
+    <w:p>
+      <w:pPr>
+        <w:pBdr>
+          <w:left w:val="single" w:color="CBD5E1" w:sz="16" w:space="8"/>
+        </w:pBdr>
+        <w:shd w:fill="F3F4F6" w:val="clear"/>
+        <w:spacing w:after="0" w:before="0" w:line="240"/>
+        <w:ind w:left="120"/>
+      </w:pPr>
+      <w:r>
+        <w:rPr>
+          <w:rFonts w:ascii="Consolas" w:cs="Consolas" w:eastAsia="Consolas" w:hAnsi="Consolas"/>
+          <w:color w:val="0F172A"/>
+          <w:sz w:val="17"/>
+          <w:szCs w:val="17"/>
+        </w:rPr>
+        <w:t xml:space="preserve">             kubeconform -strict -summary -ignore-missing-schemas -kubernetes-version 1.29.0</w:t>
+      </w:r>
+    </w:p>
+    <w:p>
+      <w:pPr>
+        <w:pBdr>
+          <w:left w:val="single" w:color="CBD5E1" w:sz="16" w:space="8"/>
+        </w:pBdr>
+        <w:shd w:fill="F3F4F6" w:val="clear"/>
+        <w:spacing w:after="150" w:before="0" w:line="240"/>
+        <w:ind w:left="120"/>
+      </w:pPr>
+      <w:r>
+        <w:rPr>
+          <w:rFonts w:ascii="Consolas" w:cs="Consolas" w:eastAsia="Consolas" w:hAnsi="Consolas"/>
+          <w:color w:val="0F172A"/>
+          <w:sz w:val="17"/>
+          <w:szCs w:val="17"/>
+        </w:rPr>
+        <w:t xml:space="preserve">      - run: helm lint helm/bookplus</w:t>
+      </w:r>
+    </w:p>
+    <w:p>
+      <w:pPr>
+        <w:spacing w:after="120" w:line="276"/>
+      </w:pPr>
+      <w:r>
+        <w:rPr>
+          <w:rFonts w:ascii="Arial" w:cs="Arial" w:eastAsia="Arial" w:hAnsi="Arial"/>
+          <w:b/>
+          <w:bCs/>
+        </w:rPr>
+        <w:t xml:space="preserve">Cierre del despliegue: </w:t>
+      </w:r>
+      <w:r>
+        <w:rPr>
+          <w:rFonts w:ascii="Arial" w:cs="Arial" w:eastAsia="Arial" w:hAnsi="Arial"/>
+        </w:rPr>
+        <w:t xml:space="preserve">con esto la plataforma queda cubierta de extremo a extremo: codigo -&gt; CI/CD (build, test, calidad, seguridad) -&gt; imagenes firmadas -&gt; Kubernetes (Kustomize/Helm) con HPA, PDB, NetworkPolicy, RBAC, backups y observabilidad, todo </w:t>
+      </w:r>
+      <w:r>
+        <w:rPr>
+          <w:rFonts w:ascii="Arial" w:cs="Arial" w:eastAsia="Arial" w:hAnsi="Arial"/>
+          <w:b/>
+          <w:bCs/>
+        </w:rPr>
+        <w:t xml:space="preserve">validado automaticamente</w:t>
       </w:r>
       <w:r>
         <w:rPr>

</xml_diff>

<commit_message>
refactor(arch): enforce hexagonal boundaries in order & catalog
Los adaptadores de entrada (controladores REST y consumers Kafka) que accedian
a repositorios JPA directamente ahora pasan por casos de uso y puertos.

order-service:
- AdminCouponController -> ManageCouponUseCase + CouponPort
- DeliveryProofController -> DeliveryProofUseCase + DeliveryProofPort
- IdempotencyGuard -> ProcessedEventPort

catalog-service:
- Favoritos, Biblioteca/Compras (+2 consumers), Preview PDF y Portada
  movidos tras puertos + casos de uso; eliminado PdfPreviewService
- excepciones de dominio nuevas (InvalidPdf 400, PurchaseAccessDenied 403)

- Nueva regla ArchUnit: adapter.in no puede depender de adapter.out.persistence
- Tests: consumer reescrito + PurchaseAccessUseCaseImplTest
- Doc: seccion 18 en BookPlus-Stack-Tecnologico.docx

Verificado: mvn test verde (order 82, catalog 69).
</commit_message>
<xml_diff>
--- a/BookPlus-Stack-Tecnologico.docx
+++ b/BookPlus-Stack-Tecnologico.docx
@@ -37632,6 +37632,1693 @@
         <w:t xml:space="preserve">.</w:t>
       </w:r>
     </w:p>
+    <w:p>
+      <w:r>
+        <w:br w:type="page"/>
+      </w:r>
+    </w:p>
+    <w:p>
+      <w:pPr>
+        <w:pStyle w:val="Heading1"/>
+      </w:pPr>
+      <w:r>
+        <w:rPr>
+          <w:rFonts w:ascii="Arial" w:cs="Arial" w:eastAsia="Arial" w:hAnsi="Arial"/>
+        </w:rPr>
+        <w:t xml:space="preserve">18. Arquitectura hexagonal verificable: puertos, casos de uso y ArchUnit</w:t>
+      </w:r>
+    </w:p>
+    <w:p>
+      <w:pPr>
+        <w:spacing w:after="120" w:line="276"/>
+      </w:pPr>
+      <w:r>
+        <w:rPr>
+          <w:rFonts w:ascii="Arial" w:cs="Arial" w:eastAsia="Arial" w:hAnsi="Arial"/>
+        </w:rPr>
+        <w:t xml:space="preserve">La arquitectura hexagonal (puertos y adaptadores) exige una dirección de dependencias estricta: un </w:t>
+      </w:r>
+      <w:r>
+        <w:rPr>
+          <w:rFonts w:ascii="Arial" w:cs="Arial" w:eastAsia="Arial" w:hAnsi="Arial"/>
+          <w:b/>
+          <w:bCs/>
+        </w:rPr>
+        <w:t xml:space="preserve">adaptador de entrada</w:t>
+      </w:r>
+      <w:r>
+        <w:rPr>
+          <w:rFonts w:ascii="Arial" w:cs="Arial" w:eastAsia="Arial" w:hAnsi="Arial"/>
+        </w:rPr>
+        <w:t xml:space="preserve"> (controlador REST o consumidor Kafka) traduce el mundo exterior a llamadas de dominio, pero </w:t>
+      </w:r>
+      <w:r>
+        <w:rPr>
+          <w:rFonts w:ascii="Arial" w:cs="Arial" w:eastAsia="Arial" w:hAnsi="Arial"/>
+          <w:b/>
+          <w:bCs/>
+        </w:rPr>
+        <w:t xml:space="preserve">nunca habla con la persistencia directamente</w:t>
+      </w:r>
+      <w:r>
+        <w:rPr>
+          <w:rFonts w:ascii="Arial" w:cs="Arial" w:eastAsia="Arial" w:hAnsi="Arial"/>
+        </w:rPr>
+        <w:t xml:space="preserve">. Debe pasar por un </w:t>
+      </w:r>
+      <w:r>
+        <w:rPr>
+          <w:rFonts w:ascii="Arial" w:cs="Arial" w:eastAsia="Arial" w:hAnsi="Arial"/>
+          <w:b/>
+          <w:bCs/>
+        </w:rPr>
+        <w:t xml:space="preserve">puerto de entrada</w:t>
+      </w:r>
+      <w:r>
+        <w:rPr>
+          <w:rFonts w:ascii="Arial" w:cs="Arial" w:eastAsia="Arial" w:hAnsi="Arial"/>
+        </w:rPr>
+        <w:t xml:space="preserve"> (un caso de uso), que a su vez usa </w:t>
+      </w:r>
+      <w:r>
+        <w:rPr>
+          <w:rFonts w:ascii="Arial" w:cs="Arial" w:eastAsia="Arial" w:hAnsi="Arial"/>
+          <w:b/>
+          <w:bCs/>
+        </w:rPr>
+        <w:t xml:space="preserve">puertos de salida</w:t>
+      </w:r>
+      <w:r>
+        <w:rPr>
+          <w:rFonts w:ascii="Arial" w:cs="Arial" w:eastAsia="Arial" w:hAnsi="Arial"/>
+        </w:rPr>
+        <w:t xml:space="preserve"> implementados por los adaptadores de infraestructura. Así la lógica de negocio queda testeable y aislada de JPA, Kafka o el framework web.</w:t>
+      </w:r>
+    </w:p>
+    <w:p>
+      <w:pPr>
+        <w:pStyle w:val="Heading2"/>
+      </w:pPr>
+      <w:r>
+        <w:rPr>
+          <w:rFonts w:ascii="Arial" w:cs="Arial" w:eastAsia="Arial" w:hAnsi="Arial"/>
+        </w:rPr>
+        <w:t xml:space="preserve">18.1 El problema detectado en una auditoría</w:t>
+      </w:r>
+    </w:p>
+    <w:p>
+      <w:pPr>
+        <w:spacing w:after="120" w:line="276"/>
+      </w:pPr>
+      <w:r>
+        <w:rPr>
+          <w:rFonts w:ascii="Arial" w:cs="Arial" w:eastAsia="Arial" w:hAnsi="Arial"/>
+        </w:rPr>
+        <w:t xml:space="preserve">Una revisión de todos los microservicios encontró un puñado de adaptadores de entrada que inyectaban repositorios JPA y llamaban a </w:t>
+      </w:r>
+      <w:r>
+        <w:rPr>
+          <w:rFonts w:ascii="Consolas" w:cs="Consolas" w:eastAsia="Consolas" w:hAnsi="Consolas"/>
+          <w:color w:val="4F46E5"/>
+        </w:rPr>
+        <w:t xml:space="preserve">repository.findAll()</w:t>
+      </w:r>
+      <w:r>
+        <w:rPr>
+          <w:rFonts w:ascii="Arial" w:cs="Arial" w:eastAsia="Arial" w:hAnsi="Arial"/>
+        </w:rPr>
+        <w:t xml:space="preserve"> / </w:t>
+      </w:r>
+      <w:r>
+        <w:rPr>
+          <w:rFonts w:ascii="Consolas" w:cs="Consolas" w:eastAsia="Consolas" w:hAnsi="Consolas"/>
+          <w:color w:val="4F46E5"/>
+        </w:rPr>
+        <w:t xml:space="preserve">repository.save()</w:t>
+      </w:r>
+      <w:r>
+        <w:rPr>
+          <w:rFonts w:ascii="Arial" w:cs="Arial" w:eastAsia="Arial" w:hAnsi="Arial"/>
+        </w:rPr>
+        <w:t xml:space="preserve"> directamente, saltándose el caso de uso. Es un olor de diseño: acopla el controlador a JPA, mete lógica de negocio en la capa web y rompe la simetría del resto del código. Los puntos corregidos fueron:</w:t>
+      </w:r>
+    </w:p>
+    <w:p>
+      <w:pPr>
+        <w:pStyle w:val="ListParagraph"/>
+        <w:numPr>
+          <w:ilvl w:val="0"/>
+          <w:numId w:val="2"/>
+        </w:numPr>
+        <w:spacing w:after="80" w:line="268"/>
+      </w:pPr>
+      <w:r>
+        <w:rPr>
+          <w:rFonts w:ascii="Arial" w:cs="Arial" w:eastAsia="Arial" w:hAnsi="Arial"/>
+          <w:b/>
+          <w:bCs/>
+        </w:rPr>
+        <w:t xml:space="preserve">order-service: </w:t>
+      </w:r>
+      <w:r>
+        <w:rPr>
+          <w:rFonts w:ascii="Arial" w:cs="Arial" w:eastAsia="Arial" w:hAnsi="Arial"/>
+        </w:rPr>
+        <w:t xml:space="preserve">AdminCouponController y DeliveryProofController (repositorios de cupones y de prueba de entrega), e IdempotencyGuard (registro de idempotencia).</w:t>
+      </w:r>
+    </w:p>
+    <w:p>
+      <w:pPr>
+        <w:pStyle w:val="ListParagraph"/>
+        <w:numPr>
+          <w:ilvl w:val="0"/>
+          <w:numId w:val="2"/>
+        </w:numPr>
+        <w:spacing w:after="80" w:line="268"/>
+      </w:pPr>
+      <w:r>
+        <w:rPr>
+          <w:rFonts w:ascii="Arial" w:cs="Arial" w:eastAsia="Arial" w:hAnsi="Arial"/>
+          <w:b/>
+          <w:bCs/>
+        </w:rPr>
+        <w:t xml:space="preserve">catalog-service: </w:t>
+      </w:r>
+      <w:r>
+        <w:rPr>
+          <w:rFonts w:ascii="Arial" w:cs="Arial" w:eastAsia="Arial" w:hAnsi="Arial"/>
+        </w:rPr>
+        <w:t xml:space="preserve">FavoritesController, LibraryController, BookCoverController, BookPreviewController y PdfPreviewService, más los consumidores OrderPaymentConfirmedConsumer y DigitalAccessRevokedConsumer.</w:t>
+      </w:r>
+    </w:p>
+    <w:p>
+      <w:pPr>
+        <w:pStyle w:val="ListParagraph"/>
+        <w:numPr>
+          <w:ilvl w:val="0"/>
+          <w:numId w:val="2"/>
+        </w:numPr>
+        <w:spacing w:after="80" w:line="268"/>
+      </w:pPr>
+      <w:r>
+        <w:rPr>
+          <w:rFonts w:ascii="Arial" w:cs="Arial" w:eastAsia="Arial" w:hAnsi="Arial"/>
+          <w:b/>
+          <w:bCs/>
+        </w:rPr>
+        <w:t xml:space="preserve">Los otros 6 servicios </w:t>
+      </w:r>
+      <w:r>
+        <w:rPr>
+          <w:rFonts w:ascii="Arial" w:cs="Arial" w:eastAsia="Arial" w:hAnsi="Arial"/>
+        </w:rPr>
+        <w:t xml:space="preserve">(auth, cart, inventory, notification, payment, report) ya respetaban la regla.</w:t>
+      </w:r>
+    </w:p>
+    <w:p>
+      <w:pPr>
+        <w:pStyle w:val="Heading2"/>
+      </w:pPr>
+      <w:r>
+        <w:rPr>
+          <w:rFonts w:ascii="Arial" w:cs="Arial" w:eastAsia="Arial" w:hAnsi="Arial"/>
+        </w:rPr>
+        <w:t xml:space="preserve">18.2 El patrón aplicado</w:t>
+      </w:r>
+    </w:p>
+    <w:p>
+      <w:pPr>
+        <w:spacing w:after="120" w:line="276"/>
+      </w:pPr>
+      <w:r>
+        <w:rPr>
+          <w:rFonts w:ascii="Arial" w:cs="Arial" w:eastAsia="Arial" w:hAnsi="Arial"/>
+        </w:rPr>
+        <w:t xml:space="preserve">Cada infracción se corrigió llevando la lógica y el acceso a datos detrás de puertos, dejando el adaptador de entrada como una pieza "delgada" que solo traduce HTTP/Kafka:</w:t>
+      </w:r>
+    </w:p>
+    <w:p>
+      <w:pPr>
+        <w:spacing w:after="120" w:line="276"/>
+      </w:pPr>
+      <w:r>
+        <w:rPr>
+          <w:rFonts w:ascii="Consolas" w:cs="Consolas" w:eastAsia="Consolas" w:hAnsi="Consolas"/>
+          <w:color w:val="4F46E5"/>
+        </w:rPr>
+        <w:t xml:space="preserve">Controlador  →  Puerto de entrada (@UseCase)  →  Implementación  →  Puerto de salida  →  Adaptador (@PersistenceAdapter)</w:t>
+      </w:r>
+    </w:p>
+    <w:p>
+      <w:pPr>
+        <w:spacing w:after="120" w:line="276"/>
+      </w:pPr>
+      <w:r>
+        <w:rPr>
+          <w:rFonts w:ascii="Arial" w:cs="Arial" w:eastAsia="Arial" w:hAnsi="Arial"/>
+          <w:b/>
+          <w:bCs/>
+        </w:rPr>
+        <w:t xml:space="preserve">Antes</w:t>
+      </w:r>
+      <w:r>
+        <w:rPr>
+          <w:rFonts w:ascii="Arial" w:cs="Arial" w:eastAsia="Arial" w:hAnsi="Arial"/>
+        </w:rPr>
+        <w:t xml:space="preserve"> — el controlador dependía de JPA:</w:t>
+      </w:r>
+    </w:p>
+    <w:p>
+      <w:pPr>
+        <w:pBdr>
+          <w:left w:val="single" w:color="CBD5E1" w:sz="16" w:space="8"/>
+        </w:pBdr>
+        <w:shd w:fill="F3F4F6" w:val="clear"/>
+        <w:spacing w:after="0" w:before="40" w:line="240"/>
+        <w:ind w:left="120"/>
+      </w:pPr>
+      <w:r>
+        <w:rPr>
+          <w:rFonts w:ascii="Consolas" w:cs="Consolas" w:eastAsia="Consolas" w:hAnsi="Consolas"/>
+          <w:color w:val="0F172A"/>
+          <w:sz w:val="17"/>
+          <w:szCs w:val="17"/>
+        </w:rPr>
+        <w:t xml:space="preserve">public class AdminCouponController {</w:t>
+      </w:r>
+    </w:p>
+    <w:p>
+      <w:pPr>
+        <w:pBdr>
+          <w:left w:val="single" w:color="CBD5E1" w:sz="16" w:space="8"/>
+        </w:pBdr>
+        <w:shd w:fill="F3F4F6" w:val="clear"/>
+        <w:spacing w:after="0" w:before="0" w:line="240"/>
+        <w:ind w:left="120"/>
+      </w:pPr>
+      <w:r>
+        <w:rPr>
+          <w:rFonts w:ascii="Consolas" w:cs="Consolas" w:eastAsia="Consolas" w:hAnsi="Consolas"/>
+          <w:color w:val="0F172A"/>
+          <w:sz w:val="17"/>
+          <w:szCs w:val="17"/>
+        </w:rPr>
+        <w:t xml:space="preserve">    private final CouponJpaRepository repository;   // ⚠️ web → persistencia</w:t>
+      </w:r>
+    </w:p>
+    <w:p>
+      <w:pPr>
+        <w:pBdr>
+          <w:left w:val="single" w:color="CBD5E1" w:sz="16" w:space="8"/>
+        </w:pBdr>
+        <w:shd w:fill="F3F4F6" w:val="clear"/>
+        <w:spacing w:after="0" w:before="0" w:line="240"/>
+        <w:ind w:left="120"/>
+      </w:pPr>
+      <w:r>
+        <w:rPr>
+          <w:rFonts w:ascii="Consolas" w:cs="Consolas" w:eastAsia="Consolas" w:hAnsi="Consolas"/>
+          <w:color w:val="0F172A"/>
+          <w:sz w:val="17"/>
+          <w:szCs w:val="17"/>
+        </w:rPr>
+        <w:t xml:space="preserve">    public List&lt;CouponResponse&gt; list() {</w:t>
+      </w:r>
+    </w:p>
+    <w:p>
+      <w:pPr>
+        <w:pBdr>
+          <w:left w:val="single" w:color="CBD5E1" w:sz="16" w:space="8"/>
+        </w:pBdr>
+        <w:shd w:fill="F3F4F6" w:val="clear"/>
+        <w:spacing w:after="0" w:before="0" w:line="240"/>
+        <w:ind w:left="120"/>
+      </w:pPr>
+      <w:r>
+        <w:rPr>
+          <w:rFonts w:ascii="Consolas" w:cs="Consolas" w:eastAsia="Consolas" w:hAnsi="Consolas"/>
+          <w:color w:val="0F172A"/>
+          <w:sz w:val="17"/>
+          <w:szCs w:val="17"/>
+        </w:rPr>
+        <w:t xml:space="preserve">        return repository.findAll().stream()...      // lógica en el controlador</w:t>
+      </w:r>
+    </w:p>
+    <w:p>
+      <w:pPr>
+        <w:pBdr>
+          <w:left w:val="single" w:color="CBD5E1" w:sz="16" w:space="8"/>
+        </w:pBdr>
+        <w:shd w:fill="F3F4F6" w:val="clear"/>
+        <w:spacing w:after="0" w:before="0" w:line="240"/>
+        <w:ind w:left="120"/>
+      </w:pPr>
+      <w:r>
+        <w:rPr>
+          <w:rFonts w:ascii="Consolas" w:cs="Consolas" w:eastAsia="Consolas" w:hAnsi="Consolas"/>
+          <w:color w:val="0F172A"/>
+          <w:sz w:val="17"/>
+          <w:szCs w:val="17"/>
+        </w:rPr>
+        <w:t xml:space="preserve">    }</w:t>
+      </w:r>
+    </w:p>
+    <w:p>
+      <w:pPr>
+        <w:pBdr>
+          <w:left w:val="single" w:color="CBD5E1" w:sz="16" w:space="8"/>
+        </w:pBdr>
+        <w:shd w:fill="F3F4F6" w:val="clear"/>
+        <w:spacing w:after="150" w:before="0" w:line="240"/>
+        <w:ind w:left="120"/>
+      </w:pPr>
+      <w:r>
+        <w:rPr>
+          <w:rFonts w:ascii="Consolas" w:cs="Consolas" w:eastAsia="Consolas" w:hAnsi="Consolas"/>
+          <w:color w:val="0F172A"/>
+          <w:sz w:val="17"/>
+          <w:szCs w:val="17"/>
+        </w:rPr>
+        <w:t xml:space="preserve">}</w:t>
+      </w:r>
+    </w:p>
+    <w:p>
+      <w:pPr>
+        <w:spacing w:after="120" w:line="276"/>
+      </w:pPr>
+      <w:r>
+        <w:rPr>
+          <w:rFonts w:ascii="Arial" w:cs="Arial" w:eastAsia="Arial" w:hAnsi="Arial"/>
+          <w:b/>
+          <w:bCs/>
+        </w:rPr>
+        <w:t xml:space="preserve">Después</w:t>
+      </w:r>
+      <w:r>
+        <w:rPr>
+          <w:rFonts w:ascii="Arial" w:cs="Arial" w:eastAsia="Arial" w:hAnsi="Arial"/>
+        </w:rPr>
+        <w:t xml:space="preserve"> — el controlador delega en el caso de uso:</w:t>
+      </w:r>
+    </w:p>
+    <w:p>
+      <w:pPr>
+        <w:pBdr>
+          <w:left w:val="single" w:color="CBD5E1" w:sz="16" w:space="8"/>
+        </w:pBdr>
+        <w:shd w:fill="F3F4F6" w:val="clear"/>
+        <w:spacing w:after="0" w:before="40" w:line="240"/>
+        <w:ind w:left="120"/>
+      </w:pPr>
+      <w:r>
+        <w:rPr>
+          <w:rFonts w:ascii="Consolas" w:cs="Consolas" w:eastAsia="Consolas" w:hAnsi="Consolas"/>
+          <w:color w:val="0F172A"/>
+          <w:sz w:val="17"/>
+          <w:szCs w:val="17"/>
+        </w:rPr>
+        <w:t xml:space="preserve">public class AdminCouponController {</w:t>
+      </w:r>
+    </w:p>
+    <w:p>
+      <w:pPr>
+        <w:pBdr>
+          <w:left w:val="single" w:color="CBD5E1" w:sz="16" w:space="8"/>
+        </w:pBdr>
+        <w:shd w:fill="F3F4F6" w:val="clear"/>
+        <w:spacing w:after="0" w:before="0" w:line="240"/>
+        <w:ind w:left="120"/>
+      </w:pPr>
+      <w:r>
+        <w:rPr>
+          <w:rFonts w:ascii="Consolas" w:cs="Consolas" w:eastAsia="Consolas" w:hAnsi="Consolas"/>
+          <w:color w:val="0F172A"/>
+          <w:sz w:val="17"/>
+          <w:szCs w:val="17"/>
+        </w:rPr>
+        <w:t xml:space="preserve">    private final ManageCouponUseCase manageCouponUseCase;   // ✅ puerto de entrada</w:t>
+      </w:r>
+    </w:p>
+    <w:p>
+      <w:pPr>
+        <w:pBdr>
+          <w:left w:val="single" w:color="CBD5E1" w:sz="16" w:space="8"/>
+        </w:pBdr>
+        <w:shd w:fill="F3F4F6" w:val="clear"/>
+        <w:spacing w:after="0" w:before="0" w:line="240"/>
+        <w:ind w:left="120"/>
+      </w:pPr>
+      <w:r>
+        <w:rPr>
+          <w:rFonts w:ascii="Consolas" w:cs="Consolas" w:eastAsia="Consolas" w:hAnsi="Consolas"/>
+          <w:color w:val="0F172A"/>
+          <w:sz w:val="17"/>
+          <w:szCs w:val="17"/>
+        </w:rPr>
+        <w:t xml:space="preserve">    public List&lt;CouponResponse&gt; list() {</w:t>
+      </w:r>
+    </w:p>
+    <w:p>
+      <w:pPr>
+        <w:pBdr>
+          <w:left w:val="single" w:color="CBD5E1" w:sz="16" w:space="8"/>
+        </w:pBdr>
+        <w:shd w:fill="F3F4F6" w:val="clear"/>
+        <w:spacing w:after="0" w:before="0" w:line="240"/>
+        <w:ind w:left="120"/>
+      </w:pPr>
+      <w:r>
+        <w:rPr>
+          <w:rFonts w:ascii="Consolas" w:cs="Consolas" w:eastAsia="Consolas" w:hAnsi="Consolas"/>
+          <w:color w:val="0F172A"/>
+          <w:sz w:val="17"/>
+          <w:szCs w:val="17"/>
+        </w:rPr>
+        <w:t xml:space="preserve">        return manageCouponUseCase.listAll().stream().map(CouponResponse::from).toList();</w:t>
+      </w:r>
+    </w:p>
+    <w:p>
+      <w:pPr>
+        <w:pBdr>
+          <w:left w:val="single" w:color="CBD5E1" w:sz="16" w:space="8"/>
+        </w:pBdr>
+        <w:shd w:fill="F3F4F6" w:val="clear"/>
+        <w:spacing w:after="0" w:before="0" w:line="240"/>
+        <w:ind w:left="120"/>
+      </w:pPr>
+      <w:r>
+        <w:rPr>
+          <w:rFonts w:ascii="Consolas" w:cs="Consolas" w:eastAsia="Consolas" w:hAnsi="Consolas"/>
+          <w:color w:val="0F172A"/>
+          <w:sz w:val="17"/>
+          <w:szCs w:val="17"/>
+        </w:rPr>
+        <w:t xml:space="preserve">    }</w:t>
+      </w:r>
+    </w:p>
+    <w:p>
+      <w:pPr>
+        <w:pBdr>
+          <w:left w:val="single" w:color="CBD5E1" w:sz="16" w:space="8"/>
+        </w:pBdr>
+        <w:shd w:fill="F3F4F6" w:val="clear"/>
+        <w:spacing w:after="0" w:before="0" w:line="240"/>
+        <w:ind w:left="120"/>
+      </w:pPr>
+      <w:r>
+        <w:rPr>
+          <w:rFonts w:ascii="Consolas" w:cs="Consolas" w:eastAsia="Consolas" w:hAnsi="Consolas"/>
+          <w:color w:val="0F172A"/>
+          <w:sz w:val="17"/>
+          <w:szCs w:val="17"/>
+        </w:rPr>
+        <w:t xml:space="preserve">}</w:t>
+      </w:r>
+    </w:p>
+    <w:p>
+      <w:pPr>
+        <w:pBdr>
+          <w:left w:val="single" w:color="CBD5E1" w:sz="16" w:space="8"/>
+        </w:pBdr>
+        <w:shd w:fill="F3F4F6" w:val="clear"/>
+        <w:spacing w:after="0" w:before="0" w:line="240"/>
+        <w:ind w:left="120"/>
+      </w:pPr>
+      <w:r>
+        <w:rPr>
+          <w:rFonts w:ascii="Consolas" w:cs="Consolas" w:eastAsia="Consolas" w:hAnsi="Consolas"/>
+          <w:color w:val="0F172A"/>
+          <w:sz w:val="17"/>
+          <w:szCs w:val="17"/>
+        </w:rPr>
+        <w:t xml:space="preserve"> </w:t>
+      </w:r>
+    </w:p>
+    <w:p>
+      <w:pPr>
+        <w:pBdr>
+          <w:left w:val="single" w:color="CBD5E1" w:sz="16" w:space="8"/>
+        </w:pBdr>
+        <w:shd w:fill="F3F4F6" w:val="clear"/>
+        <w:spacing w:after="0" w:before="0" w:line="240"/>
+        <w:ind w:left="120"/>
+      </w:pPr>
+      <w:r>
+        <w:rPr>
+          <w:rFonts w:ascii="Consolas" w:cs="Consolas" w:eastAsia="Consolas" w:hAnsi="Consolas"/>
+          <w:color w:val="0F172A"/>
+          <w:sz w:val="17"/>
+          <w:szCs w:val="17"/>
+        </w:rPr>
+        <w:t xml:space="preserve">@UseCase   // la lógica (validación, duplicados, orden) vive aquí, no en el web</w:t>
+      </w:r>
+    </w:p>
+    <w:p>
+      <w:pPr>
+        <w:pBdr>
+          <w:left w:val="single" w:color="CBD5E1" w:sz="16" w:space="8"/>
+        </w:pBdr>
+        <w:shd w:fill="F3F4F6" w:val="clear"/>
+        <w:spacing w:after="0" w:before="0" w:line="240"/>
+        <w:ind w:left="120"/>
+      </w:pPr>
+      <w:r>
+        <w:rPr>
+          <w:rFonts w:ascii="Consolas" w:cs="Consolas" w:eastAsia="Consolas" w:hAnsi="Consolas"/>
+          <w:color w:val="0F172A"/>
+          <w:sz w:val="17"/>
+          <w:szCs w:val="17"/>
+        </w:rPr>
+        <w:t xml:space="preserve">class ManageCouponUseCaseImpl implements ManageCouponUseCase {</w:t>
+      </w:r>
+    </w:p>
+    <w:p>
+      <w:pPr>
+        <w:pBdr>
+          <w:left w:val="single" w:color="CBD5E1" w:sz="16" w:space="8"/>
+        </w:pBdr>
+        <w:shd w:fill="F3F4F6" w:val="clear"/>
+        <w:spacing w:after="0" w:before="0" w:line="240"/>
+        <w:ind w:left="120"/>
+      </w:pPr>
+      <w:r>
+        <w:rPr>
+          <w:rFonts w:ascii="Consolas" w:cs="Consolas" w:eastAsia="Consolas" w:hAnsi="Consolas"/>
+          <w:color w:val="0F172A"/>
+          <w:sz w:val="17"/>
+          <w:szCs w:val="17"/>
+        </w:rPr>
+        <w:t xml:space="preserve">    private final CouponPort couponPort;            // puerto de salida (no JPA)</w:t>
+      </w:r>
+    </w:p>
+    <w:p>
+      <w:pPr>
+        <w:pBdr>
+          <w:left w:val="single" w:color="CBD5E1" w:sz="16" w:space="8"/>
+        </w:pBdr>
+        <w:shd w:fill="F3F4F6" w:val="clear"/>
+        <w:spacing w:after="150" w:before="0" w:line="240"/>
+        <w:ind w:left="120"/>
+      </w:pPr>
+      <w:r>
+        <w:rPr>
+          <w:rFonts w:ascii="Consolas" w:cs="Consolas" w:eastAsia="Consolas" w:hAnsi="Consolas"/>
+          <w:color w:val="0F172A"/>
+          <w:sz w:val="17"/>
+          <w:szCs w:val="17"/>
+        </w:rPr>
+        <w:t xml:space="preserve">}</w:t>
+      </w:r>
+    </w:p>
+    <w:p>
+      <w:pPr>
+        <w:pStyle w:val="Heading2"/>
+      </w:pPr>
+      <w:r>
+        <w:rPr>
+          <w:rFonts w:ascii="Arial" w:cs="Arial" w:eastAsia="Arial" w:hAnsi="Arial"/>
+        </w:rPr>
+        <w:t xml:space="preserve">18.3 Puertos y casos de uso creados</w:t>
+      </w:r>
+    </w:p>
+    <w:p>
+      <w:pPr>
+        <w:spacing w:after="120" w:line="276"/>
+      </w:pPr>
+      <w:r>
+        <w:rPr>
+          <w:rFonts w:ascii="Arial" w:cs="Arial" w:eastAsia="Arial" w:hAnsi="Arial"/>
+        </w:rPr>
+        <w:t xml:space="preserve">El refactor introdujo puertos de entrada (casos de uso) y de salida por cada capacidad, con su adaptador de persistencia:</w:t>
+      </w:r>
+    </w:p>
+    <w:tbl>
+      <w:tblPr>
+        <w:tblW w:type="dxa" w:w="9360"/>
+        <w:tblBorders>
+          <w:top w:val="single" w:color="auto" w:sz="4"/>
+          <w:left w:val="single" w:color="auto" w:sz="4"/>
+          <w:bottom w:val="single" w:color="auto" w:sz="4"/>
+          <w:right w:val="single" w:color="auto" w:sz="4"/>
+          <w:insideH w:val="single" w:color="auto" w:sz="4"/>
+          <w:insideV w:val="single" w:color="auto" w:sz="4"/>
+        </w:tblBorders>
+      </w:tblPr>
+      <w:tblGrid>
+        <w:gridCol w:w="2600"/>
+        <w:gridCol w:w="3680"/>
+        <w:gridCol w:w="3080"/>
+      </w:tblGrid>
+      <w:tr>
+        <w:trPr>
+          <w:tblHeader/>
+        </w:trPr>
+        <w:tc>
+          <w:tcPr>
+            <w:tcW w:type="dxa" w:w="2600"/>
+            <w:tcBorders>
+              <w:top w:val="single" w:color="D1D5DB" w:sz="1"/>
+              <w:left w:val="single" w:color="D1D5DB" w:sz="1"/>
+              <w:bottom w:val="single" w:color="D1D5DB" w:sz="1"/>
+              <w:right w:val="single" w:color="D1D5DB" w:sz="1"/>
+            </w:tcBorders>
+            <w:shd w:fill="EEF2FF" w:val="clear"/>
+            <w:tcMar>
+              <w:top w:type="dxa" w:w="60"/>
+              <w:left w:type="dxa" w:w="110"/>
+              <w:bottom w:type="dxa" w:w="60"/>
+              <w:right w:type="dxa" w:w="110"/>
+            </w:tcMar>
+          </w:tcPr>
+          <w:p>
+            <w:pPr>
+              <w:spacing w:after="0" w:line="264"/>
+            </w:pPr>
+            <w:r>
+              <w:rPr>
+                <w:rFonts w:ascii="Arial" w:cs="Arial" w:eastAsia="Arial" w:hAnsi="Arial"/>
+                <w:b/>
+                <w:bCs/>
+                <w:sz w:val="19"/>
+                <w:szCs w:val="19"/>
+              </w:rPr>
+              <w:t xml:space="preserve">Capacidad</w:t>
+            </w:r>
+          </w:p>
+        </w:tc>
+        <w:tc>
+          <w:tcPr>
+            <w:tcW w:type="dxa" w:w="3680"/>
+            <w:tcBorders>
+              <w:top w:val="single" w:color="D1D5DB" w:sz="1"/>
+              <w:left w:val="single" w:color="D1D5DB" w:sz="1"/>
+              <w:bottom w:val="single" w:color="D1D5DB" w:sz="1"/>
+              <w:right w:val="single" w:color="D1D5DB" w:sz="1"/>
+            </w:tcBorders>
+            <w:shd w:fill="EEF2FF" w:val="clear"/>
+            <w:tcMar>
+              <w:top w:type="dxa" w:w="60"/>
+              <w:left w:type="dxa" w:w="110"/>
+              <w:bottom w:type="dxa" w:w="60"/>
+              <w:right w:type="dxa" w:w="110"/>
+            </w:tcMar>
+          </w:tcPr>
+          <w:p>
+            <w:pPr>
+              <w:spacing w:after="0" w:line="264"/>
+            </w:pPr>
+            <w:r>
+              <w:rPr>
+                <w:rFonts w:ascii="Arial" w:cs="Arial" w:eastAsia="Arial" w:hAnsi="Arial"/>
+                <w:b/>
+                <w:bCs/>
+                <w:sz w:val="19"/>
+                <w:szCs w:val="19"/>
+              </w:rPr>
+              <w:t xml:space="preserve">Puerto de entrada (@UseCase)</w:t>
+            </w:r>
+          </w:p>
+        </w:tc>
+        <w:tc>
+          <w:tcPr>
+            <w:tcW w:type="dxa" w:w="3080"/>
+            <w:tcBorders>
+              <w:top w:val="single" w:color="D1D5DB" w:sz="1"/>
+              <w:left w:val="single" w:color="D1D5DB" w:sz="1"/>
+              <w:bottom w:val="single" w:color="D1D5DB" w:sz="1"/>
+              <w:right w:val="single" w:color="D1D5DB" w:sz="1"/>
+            </w:tcBorders>
+            <w:shd w:fill="EEF2FF" w:val="clear"/>
+            <w:tcMar>
+              <w:top w:type="dxa" w:w="60"/>
+              <w:left w:type="dxa" w:w="110"/>
+              <w:bottom w:type="dxa" w:w="60"/>
+              <w:right w:type="dxa" w:w="110"/>
+            </w:tcMar>
+          </w:tcPr>
+          <w:p>
+            <w:pPr>
+              <w:spacing w:after="0" w:line="264"/>
+            </w:pPr>
+            <w:r>
+              <w:rPr>
+                <w:rFonts w:ascii="Arial" w:cs="Arial" w:eastAsia="Arial" w:hAnsi="Arial"/>
+                <w:b/>
+                <w:bCs/>
+                <w:sz w:val="19"/>
+                <w:szCs w:val="19"/>
+              </w:rPr>
+              <w:t xml:space="preserve">Puerto de salida</w:t>
+            </w:r>
+          </w:p>
+        </w:tc>
+      </w:tr>
+      <w:tr>
+        <w:trPr>
+          <w:tblHeader w:val="false"/>
+        </w:trPr>
+        <w:tc>
+          <w:tcPr>
+            <w:tcW w:type="dxa" w:w="2600"/>
+            <w:tcBorders>
+              <w:top w:val="single" w:color="D1D5DB" w:sz="1"/>
+              <w:left w:val="single" w:color="D1D5DB" w:sz="1"/>
+              <w:bottom w:val="single" w:color="D1D5DB" w:sz="1"/>
+              <w:right w:val="single" w:color="D1D5DB" w:sz="1"/>
+            </w:tcBorders>
+            <w:tcMar>
+              <w:top w:type="dxa" w:w="60"/>
+              <w:left w:type="dxa" w:w="110"/>
+              <w:bottom w:type="dxa" w:w="60"/>
+              <w:right w:type="dxa" w:w="110"/>
+            </w:tcMar>
+          </w:tcPr>
+          <w:p>
+            <w:pPr>
+              <w:spacing w:after="0" w:line="264"/>
+            </w:pPr>
+            <w:r>
+              <w:rPr>
+                <w:rFonts w:ascii="Arial" w:cs="Arial" w:eastAsia="Arial" w:hAnsi="Arial"/>
+                <w:sz w:val="19"/>
+                <w:szCs w:val="19"/>
+              </w:rPr>
+              <w:t xml:space="preserve">Cupones (admin)</w:t>
+            </w:r>
+          </w:p>
+        </w:tc>
+        <w:tc>
+          <w:tcPr>
+            <w:tcW w:type="dxa" w:w="3680"/>
+            <w:tcBorders>
+              <w:top w:val="single" w:color="D1D5DB" w:sz="1"/>
+              <w:left w:val="single" w:color="D1D5DB" w:sz="1"/>
+              <w:bottom w:val="single" w:color="D1D5DB" w:sz="1"/>
+              <w:right w:val="single" w:color="D1D5DB" w:sz="1"/>
+            </w:tcBorders>
+            <w:tcMar>
+              <w:top w:type="dxa" w:w="60"/>
+              <w:left w:type="dxa" w:w="110"/>
+              <w:bottom w:type="dxa" w:w="60"/>
+              <w:right w:type="dxa" w:w="110"/>
+            </w:tcMar>
+          </w:tcPr>
+          <w:p>
+            <w:pPr>
+              <w:spacing w:after="0" w:line="264"/>
+            </w:pPr>
+            <w:r>
+              <w:rPr>
+                <w:rFonts w:ascii="Arial" w:cs="Arial" w:eastAsia="Arial" w:hAnsi="Arial"/>
+                <w:sz w:val="19"/>
+                <w:szCs w:val="19"/>
+              </w:rPr>
+              <w:t xml:space="preserve">ManageCouponUseCase</w:t>
+            </w:r>
+          </w:p>
+        </w:tc>
+        <w:tc>
+          <w:tcPr>
+            <w:tcW w:type="dxa" w:w="3080"/>
+            <w:tcBorders>
+              <w:top w:val="single" w:color="D1D5DB" w:sz="1"/>
+              <w:left w:val="single" w:color="D1D5DB" w:sz="1"/>
+              <w:bottom w:val="single" w:color="D1D5DB" w:sz="1"/>
+              <w:right w:val="single" w:color="D1D5DB" w:sz="1"/>
+            </w:tcBorders>
+            <w:tcMar>
+              <w:top w:type="dxa" w:w="60"/>
+              <w:left w:type="dxa" w:w="110"/>
+              <w:bottom w:type="dxa" w:w="60"/>
+              <w:right w:type="dxa" w:w="110"/>
+            </w:tcMar>
+          </w:tcPr>
+          <w:p>
+            <w:pPr>
+              <w:spacing w:after="0" w:line="264"/>
+            </w:pPr>
+            <w:r>
+              <w:rPr>
+                <w:rFonts w:ascii="Arial" w:cs="Arial" w:eastAsia="Arial" w:hAnsi="Arial"/>
+                <w:sz w:val="19"/>
+                <w:szCs w:val="19"/>
+              </w:rPr>
+              <w:t xml:space="preserve">CouponPort</w:t>
+            </w:r>
+          </w:p>
+        </w:tc>
+      </w:tr>
+      <w:tr>
+        <w:trPr>
+          <w:tblHeader w:val="false"/>
+        </w:trPr>
+        <w:tc>
+          <w:tcPr>
+            <w:tcW w:type="dxa" w:w="2600"/>
+            <w:tcBorders>
+              <w:top w:val="single" w:color="D1D5DB" w:sz="1"/>
+              <w:left w:val="single" w:color="D1D5DB" w:sz="1"/>
+              <w:bottom w:val="single" w:color="D1D5DB" w:sz="1"/>
+              <w:right w:val="single" w:color="D1D5DB" w:sz="1"/>
+            </w:tcBorders>
+            <w:tcMar>
+              <w:top w:type="dxa" w:w="60"/>
+              <w:left w:type="dxa" w:w="110"/>
+              <w:bottom w:type="dxa" w:w="60"/>
+              <w:right w:type="dxa" w:w="110"/>
+            </w:tcMar>
+          </w:tcPr>
+          <w:p>
+            <w:pPr>
+              <w:spacing w:after="0" w:line="264"/>
+            </w:pPr>
+            <w:r>
+              <w:rPr>
+                <w:rFonts w:ascii="Arial" w:cs="Arial" w:eastAsia="Arial" w:hAnsi="Arial"/>
+                <w:sz w:val="19"/>
+                <w:szCs w:val="19"/>
+              </w:rPr>
+              <w:t xml:space="preserve">Prueba de entrega</w:t>
+            </w:r>
+          </w:p>
+        </w:tc>
+        <w:tc>
+          <w:tcPr>
+            <w:tcW w:type="dxa" w:w="3680"/>
+            <w:tcBorders>
+              <w:top w:val="single" w:color="D1D5DB" w:sz="1"/>
+              <w:left w:val="single" w:color="D1D5DB" w:sz="1"/>
+              <w:bottom w:val="single" w:color="D1D5DB" w:sz="1"/>
+              <w:right w:val="single" w:color="D1D5DB" w:sz="1"/>
+            </w:tcBorders>
+            <w:tcMar>
+              <w:top w:type="dxa" w:w="60"/>
+              <w:left w:type="dxa" w:w="110"/>
+              <w:bottom w:type="dxa" w:w="60"/>
+              <w:right w:type="dxa" w:w="110"/>
+            </w:tcMar>
+          </w:tcPr>
+          <w:p>
+            <w:pPr>
+              <w:spacing w:after="0" w:line="264"/>
+            </w:pPr>
+            <w:r>
+              <w:rPr>
+                <w:rFonts w:ascii="Arial" w:cs="Arial" w:eastAsia="Arial" w:hAnsi="Arial"/>
+                <w:sz w:val="19"/>
+                <w:szCs w:val="19"/>
+              </w:rPr>
+              <w:t xml:space="preserve">DeliveryProofUseCase</w:t>
+            </w:r>
+          </w:p>
+        </w:tc>
+        <w:tc>
+          <w:tcPr>
+            <w:tcW w:type="dxa" w:w="3080"/>
+            <w:tcBorders>
+              <w:top w:val="single" w:color="D1D5DB" w:sz="1"/>
+              <w:left w:val="single" w:color="D1D5DB" w:sz="1"/>
+              <w:bottom w:val="single" w:color="D1D5DB" w:sz="1"/>
+              <w:right w:val="single" w:color="D1D5DB" w:sz="1"/>
+            </w:tcBorders>
+            <w:tcMar>
+              <w:top w:type="dxa" w:w="60"/>
+              <w:left w:type="dxa" w:w="110"/>
+              <w:bottom w:type="dxa" w:w="60"/>
+              <w:right w:type="dxa" w:w="110"/>
+            </w:tcMar>
+          </w:tcPr>
+          <w:p>
+            <w:pPr>
+              <w:spacing w:after="0" w:line="264"/>
+            </w:pPr>
+            <w:r>
+              <w:rPr>
+                <w:rFonts w:ascii="Arial" w:cs="Arial" w:eastAsia="Arial" w:hAnsi="Arial"/>
+                <w:sz w:val="19"/>
+                <w:szCs w:val="19"/>
+              </w:rPr>
+              <w:t xml:space="preserve">DeliveryProofPort</w:t>
+            </w:r>
+          </w:p>
+        </w:tc>
+      </w:tr>
+      <w:tr>
+        <w:trPr>
+          <w:tblHeader w:val="false"/>
+        </w:trPr>
+        <w:tc>
+          <w:tcPr>
+            <w:tcW w:type="dxa" w:w="2600"/>
+            <w:tcBorders>
+              <w:top w:val="single" w:color="D1D5DB" w:sz="1"/>
+              <w:left w:val="single" w:color="D1D5DB" w:sz="1"/>
+              <w:bottom w:val="single" w:color="D1D5DB" w:sz="1"/>
+              <w:right w:val="single" w:color="D1D5DB" w:sz="1"/>
+            </w:tcBorders>
+            <w:tcMar>
+              <w:top w:type="dxa" w:w="60"/>
+              <w:left w:type="dxa" w:w="110"/>
+              <w:bottom w:type="dxa" w:w="60"/>
+              <w:right w:type="dxa" w:w="110"/>
+            </w:tcMar>
+          </w:tcPr>
+          <w:p>
+            <w:pPr>
+              <w:spacing w:after="0" w:line="264"/>
+            </w:pPr>
+            <w:r>
+              <w:rPr>
+                <w:rFonts w:ascii="Arial" w:cs="Arial" w:eastAsia="Arial" w:hAnsi="Arial"/>
+                <w:sz w:val="19"/>
+                <w:szCs w:val="19"/>
+              </w:rPr>
+              <w:t xml:space="preserve">Idempotencia Kafka</w:t>
+            </w:r>
+          </w:p>
+        </w:tc>
+        <w:tc>
+          <w:tcPr>
+            <w:tcW w:type="dxa" w:w="3680"/>
+            <w:tcBorders>
+              <w:top w:val="single" w:color="D1D5DB" w:sz="1"/>
+              <w:left w:val="single" w:color="D1D5DB" w:sz="1"/>
+              <w:bottom w:val="single" w:color="D1D5DB" w:sz="1"/>
+              <w:right w:val="single" w:color="D1D5DB" w:sz="1"/>
+            </w:tcBorders>
+            <w:tcMar>
+              <w:top w:type="dxa" w:w="60"/>
+              <w:left w:type="dxa" w:w="110"/>
+              <w:bottom w:type="dxa" w:w="60"/>
+              <w:right w:type="dxa" w:w="110"/>
+            </w:tcMar>
+          </w:tcPr>
+          <w:p>
+            <w:pPr>
+              <w:spacing w:after="0" w:line="264"/>
+            </w:pPr>
+            <w:r>
+              <w:rPr>
+                <w:rFonts w:ascii="Arial" w:cs="Arial" w:eastAsia="Arial" w:hAnsi="Arial"/>
+                <w:sz w:val="19"/>
+                <w:szCs w:val="19"/>
+              </w:rPr>
+              <w:t xml:space="preserve">(IdempotencyGuard)</w:t>
+            </w:r>
+          </w:p>
+        </w:tc>
+        <w:tc>
+          <w:tcPr>
+            <w:tcW w:type="dxa" w:w="3080"/>
+            <w:tcBorders>
+              <w:top w:val="single" w:color="D1D5DB" w:sz="1"/>
+              <w:left w:val="single" w:color="D1D5DB" w:sz="1"/>
+              <w:bottom w:val="single" w:color="D1D5DB" w:sz="1"/>
+              <w:right w:val="single" w:color="D1D5DB" w:sz="1"/>
+            </w:tcBorders>
+            <w:tcMar>
+              <w:top w:type="dxa" w:w="60"/>
+              <w:left w:type="dxa" w:w="110"/>
+              <w:bottom w:type="dxa" w:w="60"/>
+              <w:right w:type="dxa" w:w="110"/>
+            </w:tcMar>
+          </w:tcPr>
+          <w:p>
+            <w:pPr>
+              <w:spacing w:after="0" w:line="264"/>
+            </w:pPr>
+            <w:r>
+              <w:rPr>
+                <w:rFonts w:ascii="Arial" w:cs="Arial" w:eastAsia="Arial" w:hAnsi="Arial"/>
+                <w:sz w:val="19"/>
+                <w:szCs w:val="19"/>
+              </w:rPr>
+              <w:t xml:space="preserve">ProcessedEventPort</w:t>
+            </w:r>
+          </w:p>
+        </w:tc>
+      </w:tr>
+      <w:tr>
+        <w:trPr>
+          <w:tblHeader w:val="false"/>
+        </w:trPr>
+        <w:tc>
+          <w:tcPr>
+            <w:tcW w:type="dxa" w:w="2600"/>
+            <w:tcBorders>
+              <w:top w:val="single" w:color="D1D5DB" w:sz="1"/>
+              <w:left w:val="single" w:color="D1D5DB" w:sz="1"/>
+              <w:bottom w:val="single" w:color="D1D5DB" w:sz="1"/>
+              <w:right w:val="single" w:color="D1D5DB" w:sz="1"/>
+            </w:tcBorders>
+            <w:tcMar>
+              <w:top w:type="dxa" w:w="60"/>
+              <w:left w:type="dxa" w:w="110"/>
+              <w:bottom w:type="dxa" w:w="60"/>
+              <w:right w:type="dxa" w:w="110"/>
+            </w:tcMar>
+          </w:tcPr>
+          <w:p>
+            <w:pPr>
+              <w:spacing w:after="0" w:line="264"/>
+            </w:pPr>
+            <w:r>
+              <w:rPr>
+                <w:rFonts w:ascii="Arial" w:cs="Arial" w:eastAsia="Arial" w:hAnsi="Arial"/>
+                <w:sz w:val="19"/>
+                <w:szCs w:val="19"/>
+              </w:rPr>
+              <w:t xml:space="preserve">Favoritos</w:t>
+            </w:r>
+          </w:p>
+        </w:tc>
+        <w:tc>
+          <w:tcPr>
+            <w:tcW w:type="dxa" w:w="3680"/>
+            <w:tcBorders>
+              <w:top w:val="single" w:color="D1D5DB" w:sz="1"/>
+              <w:left w:val="single" w:color="D1D5DB" w:sz="1"/>
+              <w:bottom w:val="single" w:color="D1D5DB" w:sz="1"/>
+              <w:right w:val="single" w:color="D1D5DB" w:sz="1"/>
+            </w:tcBorders>
+            <w:tcMar>
+              <w:top w:type="dxa" w:w="60"/>
+              <w:left w:type="dxa" w:w="110"/>
+              <w:bottom w:type="dxa" w:w="60"/>
+              <w:right w:type="dxa" w:w="110"/>
+            </w:tcMar>
+          </w:tcPr>
+          <w:p>
+            <w:pPr>
+              <w:spacing w:after="0" w:line="264"/>
+            </w:pPr>
+            <w:r>
+              <w:rPr>
+                <w:rFonts w:ascii="Arial" w:cs="Arial" w:eastAsia="Arial" w:hAnsi="Arial"/>
+                <w:sz w:val="19"/>
+                <w:szCs w:val="19"/>
+              </w:rPr>
+              <w:t xml:space="preserve">ManageFavoritesUseCase</w:t>
+            </w:r>
+          </w:p>
+        </w:tc>
+        <w:tc>
+          <w:tcPr>
+            <w:tcW w:type="dxa" w:w="3080"/>
+            <w:tcBorders>
+              <w:top w:val="single" w:color="D1D5DB" w:sz="1"/>
+              <w:left w:val="single" w:color="D1D5DB" w:sz="1"/>
+              <w:bottom w:val="single" w:color="D1D5DB" w:sz="1"/>
+              <w:right w:val="single" w:color="D1D5DB" w:sz="1"/>
+            </w:tcBorders>
+            <w:tcMar>
+              <w:top w:type="dxa" w:w="60"/>
+              <w:left w:type="dxa" w:w="110"/>
+              <w:bottom w:type="dxa" w:w="60"/>
+              <w:right w:type="dxa" w:w="110"/>
+            </w:tcMar>
+          </w:tcPr>
+          <w:p>
+            <w:pPr>
+              <w:spacing w:after="0" w:line="264"/>
+            </w:pPr>
+            <w:r>
+              <w:rPr>
+                <w:rFonts w:ascii="Arial" w:cs="Arial" w:eastAsia="Arial" w:hAnsi="Arial"/>
+                <w:sz w:val="19"/>
+                <w:szCs w:val="19"/>
+              </w:rPr>
+              <w:t xml:space="preserve">FavoritePort</w:t>
+            </w:r>
+          </w:p>
+        </w:tc>
+      </w:tr>
+      <w:tr>
+        <w:trPr>
+          <w:tblHeader w:val="false"/>
+        </w:trPr>
+        <w:tc>
+          <w:tcPr>
+            <w:tcW w:type="dxa" w:w="2600"/>
+            <w:tcBorders>
+              <w:top w:val="single" w:color="D1D5DB" w:sz="1"/>
+              <w:left w:val="single" w:color="D1D5DB" w:sz="1"/>
+              <w:bottom w:val="single" w:color="D1D5DB" w:sz="1"/>
+              <w:right w:val="single" w:color="D1D5DB" w:sz="1"/>
+            </w:tcBorders>
+            <w:tcMar>
+              <w:top w:type="dxa" w:w="60"/>
+              <w:left w:type="dxa" w:w="110"/>
+              <w:bottom w:type="dxa" w:w="60"/>
+              <w:right w:type="dxa" w:w="110"/>
+            </w:tcMar>
+          </w:tcPr>
+          <w:p>
+            <w:pPr>
+              <w:spacing w:after="0" w:line="264"/>
+            </w:pPr>
+            <w:r>
+              <w:rPr>
+                <w:rFonts w:ascii="Arial" w:cs="Arial" w:eastAsia="Arial" w:hAnsi="Arial"/>
+                <w:sz w:val="19"/>
+                <w:szCs w:val="19"/>
+              </w:rPr>
+              <w:t xml:space="preserve">Biblioteca / compras</w:t>
+            </w:r>
+          </w:p>
+        </w:tc>
+        <w:tc>
+          <w:tcPr>
+            <w:tcW w:type="dxa" w:w="3680"/>
+            <w:tcBorders>
+              <w:top w:val="single" w:color="D1D5DB" w:sz="1"/>
+              <w:left w:val="single" w:color="D1D5DB" w:sz="1"/>
+              <w:bottom w:val="single" w:color="D1D5DB" w:sz="1"/>
+              <w:right w:val="single" w:color="D1D5DB" w:sz="1"/>
+            </w:tcBorders>
+            <w:tcMar>
+              <w:top w:type="dxa" w:w="60"/>
+              <w:left w:type="dxa" w:w="110"/>
+              <w:bottom w:type="dxa" w:w="60"/>
+              <w:right w:type="dxa" w:w="110"/>
+            </w:tcMar>
+          </w:tcPr>
+          <w:p>
+            <w:pPr>
+              <w:spacing w:after="0" w:line="264"/>
+            </w:pPr>
+            <w:r>
+              <w:rPr>
+                <w:rFonts w:ascii="Arial" w:cs="Arial" w:eastAsia="Arial" w:hAnsi="Arial"/>
+                <w:sz w:val="19"/>
+                <w:szCs w:val="19"/>
+              </w:rPr>
+              <w:t xml:space="preserve">LibraryUseCase</w:t>
+            </w:r>
+          </w:p>
+        </w:tc>
+        <w:tc>
+          <w:tcPr>
+            <w:tcW w:type="dxa" w:w="3080"/>
+            <w:tcBorders>
+              <w:top w:val="single" w:color="D1D5DB" w:sz="1"/>
+              <w:left w:val="single" w:color="D1D5DB" w:sz="1"/>
+              <w:bottom w:val="single" w:color="D1D5DB" w:sz="1"/>
+              <w:right w:val="single" w:color="D1D5DB" w:sz="1"/>
+            </w:tcBorders>
+            <w:tcMar>
+              <w:top w:type="dxa" w:w="60"/>
+              <w:left w:type="dxa" w:w="110"/>
+              <w:bottom w:type="dxa" w:w="60"/>
+              <w:right w:type="dxa" w:w="110"/>
+            </w:tcMar>
+          </w:tcPr>
+          <w:p>
+            <w:pPr>
+              <w:spacing w:after="0" w:line="264"/>
+            </w:pPr>
+            <w:r>
+              <w:rPr>
+                <w:rFonts w:ascii="Arial" w:cs="Arial" w:eastAsia="Arial" w:hAnsi="Arial"/>
+                <w:sz w:val="19"/>
+                <w:szCs w:val="19"/>
+              </w:rPr>
+              <w:t xml:space="preserve">PurchasePort</w:t>
+            </w:r>
+          </w:p>
+        </w:tc>
+      </w:tr>
+      <w:tr>
+        <w:trPr>
+          <w:tblHeader w:val="false"/>
+        </w:trPr>
+        <w:tc>
+          <w:tcPr>
+            <w:tcW w:type="dxa" w:w="2600"/>
+            <w:tcBorders>
+              <w:top w:val="single" w:color="D1D5DB" w:sz="1"/>
+              <w:left w:val="single" w:color="D1D5DB" w:sz="1"/>
+              <w:bottom w:val="single" w:color="D1D5DB" w:sz="1"/>
+              <w:right w:val="single" w:color="D1D5DB" w:sz="1"/>
+            </w:tcBorders>
+            <w:tcMar>
+              <w:top w:type="dxa" w:w="60"/>
+              <w:left w:type="dxa" w:w="110"/>
+              <w:bottom w:type="dxa" w:w="60"/>
+              <w:right w:type="dxa" w:w="110"/>
+            </w:tcMar>
+          </w:tcPr>
+          <w:p>
+            <w:pPr>
+              <w:spacing w:after="0" w:line="264"/>
+            </w:pPr>
+            <w:r>
+              <w:rPr>
+                <w:rFonts w:ascii="Arial" w:cs="Arial" w:eastAsia="Arial" w:hAnsi="Arial"/>
+                <w:sz w:val="19"/>
+                <w:szCs w:val="19"/>
+              </w:rPr>
+              <w:t xml:space="preserve">Acceso a compra</w:t>
+            </w:r>
+          </w:p>
+        </w:tc>
+        <w:tc>
+          <w:tcPr>
+            <w:tcW w:type="dxa" w:w="3680"/>
+            <w:tcBorders>
+              <w:top w:val="single" w:color="D1D5DB" w:sz="1"/>
+              <w:left w:val="single" w:color="D1D5DB" w:sz="1"/>
+              <w:bottom w:val="single" w:color="D1D5DB" w:sz="1"/>
+              <w:right w:val="single" w:color="D1D5DB" w:sz="1"/>
+            </w:tcBorders>
+            <w:tcMar>
+              <w:top w:type="dxa" w:w="60"/>
+              <w:left w:type="dxa" w:w="110"/>
+              <w:bottom w:type="dxa" w:w="60"/>
+              <w:right w:type="dxa" w:w="110"/>
+            </w:tcMar>
+          </w:tcPr>
+          <w:p>
+            <w:pPr>
+              <w:spacing w:after="0" w:line="264"/>
+            </w:pPr>
+            <w:r>
+              <w:rPr>
+                <w:rFonts w:ascii="Arial" w:cs="Arial" w:eastAsia="Arial" w:hAnsi="Arial"/>
+                <w:sz w:val="19"/>
+                <w:szCs w:val="19"/>
+              </w:rPr>
+              <w:t xml:space="preserve">PurchaseAccessUseCase</w:t>
+            </w:r>
+          </w:p>
+        </w:tc>
+        <w:tc>
+          <w:tcPr>
+            <w:tcW w:type="dxa" w:w="3080"/>
+            <w:tcBorders>
+              <w:top w:val="single" w:color="D1D5DB" w:sz="1"/>
+              <w:left w:val="single" w:color="D1D5DB" w:sz="1"/>
+              <w:bottom w:val="single" w:color="D1D5DB" w:sz="1"/>
+              <w:right w:val="single" w:color="D1D5DB" w:sz="1"/>
+            </w:tcBorders>
+            <w:tcMar>
+              <w:top w:type="dxa" w:w="60"/>
+              <w:left w:type="dxa" w:w="110"/>
+              <w:bottom w:type="dxa" w:w="60"/>
+              <w:right w:type="dxa" w:w="110"/>
+            </w:tcMar>
+          </w:tcPr>
+          <w:p>
+            <w:pPr>
+              <w:spacing w:after="0" w:line="264"/>
+            </w:pPr>
+            <w:r>
+              <w:rPr>
+                <w:rFonts w:ascii="Arial" w:cs="Arial" w:eastAsia="Arial" w:hAnsi="Arial"/>
+                <w:sz w:val="19"/>
+                <w:szCs w:val="19"/>
+              </w:rPr>
+              <w:t xml:space="preserve">PurchasePort</w:t>
+            </w:r>
+          </w:p>
+        </w:tc>
+      </w:tr>
+      <w:tr>
+        <w:trPr>
+          <w:tblHeader w:val="false"/>
+        </w:trPr>
+        <w:tc>
+          <w:tcPr>
+            <w:tcW w:type="dxa" w:w="2600"/>
+            <w:tcBorders>
+              <w:top w:val="single" w:color="D1D5DB" w:sz="1"/>
+              <w:left w:val="single" w:color="D1D5DB" w:sz="1"/>
+              <w:bottom w:val="single" w:color="D1D5DB" w:sz="1"/>
+              <w:right w:val="single" w:color="D1D5DB" w:sz="1"/>
+            </w:tcBorders>
+            <w:tcMar>
+              <w:top w:type="dxa" w:w="60"/>
+              <w:left w:type="dxa" w:w="110"/>
+              <w:bottom w:type="dxa" w:w="60"/>
+              <w:right w:type="dxa" w:w="110"/>
+            </w:tcMar>
+          </w:tcPr>
+          <w:p>
+            <w:pPr>
+              <w:spacing w:after="0" w:line="264"/>
+            </w:pPr>
+            <w:r>
+              <w:rPr>
+                <w:rFonts w:ascii="Arial" w:cs="Arial" w:eastAsia="Arial" w:hAnsi="Arial"/>
+                <w:sz w:val="19"/>
+                <w:szCs w:val="19"/>
+              </w:rPr>
+              <w:t xml:space="preserve">Muestra PDF</w:t>
+            </w:r>
+          </w:p>
+        </w:tc>
+        <w:tc>
+          <w:tcPr>
+            <w:tcW w:type="dxa" w:w="3680"/>
+            <w:tcBorders>
+              <w:top w:val="single" w:color="D1D5DB" w:sz="1"/>
+              <w:left w:val="single" w:color="D1D5DB" w:sz="1"/>
+              <w:bottom w:val="single" w:color="D1D5DB" w:sz="1"/>
+              <w:right w:val="single" w:color="D1D5DB" w:sz="1"/>
+            </w:tcBorders>
+            <w:tcMar>
+              <w:top w:type="dxa" w:w="60"/>
+              <w:left w:type="dxa" w:w="110"/>
+              <w:bottom w:type="dxa" w:w="60"/>
+              <w:right w:type="dxa" w:w="110"/>
+            </w:tcMar>
+          </w:tcPr>
+          <w:p>
+            <w:pPr>
+              <w:spacing w:after="0" w:line="264"/>
+            </w:pPr>
+            <w:r>
+              <w:rPr>
+                <w:rFonts w:ascii="Arial" w:cs="Arial" w:eastAsia="Arial" w:hAnsi="Arial"/>
+                <w:sz w:val="19"/>
+                <w:szCs w:val="19"/>
+              </w:rPr>
+              <w:t xml:space="preserve">BookPreviewUseCase</w:t>
+            </w:r>
+          </w:p>
+        </w:tc>
+        <w:tc>
+          <w:tcPr>
+            <w:tcW w:type="dxa" w:w="3080"/>
+            <w:tcBorders>
+              <w:top w:val="single" w:color="D1D5DB" w:sz="1"/>
+              <w:left w:val="single" w:color="D1D5DB" w:sz="1"/>
+              <w:bottom w:val="single" w:color="D1D5DB" w:sz="1"/>
+              <w:right w:val="single" w:color="D1D5DB" w:sz="1"/>
+            </w:tcBorders>
+            <w:tcMar>
+              <w:top w:type="dxa" w:w="60"/>
+              <w:left w:type="dxa" w:w="110"/>
+              <w:bottom w:type="dxa" w:w="60"/>
+              <w:right w:type="dxa" w:w="110"/>
+            </w:tcMar>
+          </w:tcPr>
+          <w:p>
+            <w:pPr>
+              <w:spacing w:after="0" w:line="264"/>
+            </w:pPr>
+            <w:r>
+              <w:rPr>
+                <w:rFonts w:ascii="Arial" w:cs="Arial" w:eastAsia="Arial" w:hAnsi="Arial"/>
+                <w:sz w:val="19"/>
+                <w:szCs w:val="19"/>
+              </w:rPr>
+              <w:t xml:space="preserve">BookPreviewPort</w:t>
+            </w:r>
+          </w:p>
+        </w:tc>
+      </w:tr>
+      <w:tr>
+        <w:trPr>
+          <w:tblHeader w:val="false"/>
+        </w:trPr>
+        <w:tc>
+          <w:tcPr>
+            <w:tcW w:type="dxa" w:w="2600"/>
+            <w:tcBorders>
+              <w:top w:val="single" w:color="D1D5DB" w:sz="1"/>
+              <w:left w:val="single" w:color="D1D5DB" w:sz="1"/>
+              <w:bottom w:val="single" w:color="D1D5DB" w:sz="1"/>
+              <w:right w:val="single" w:color="D1D5DB" w:sz="1"/>
+            </w:tcBorders>
+            <w:tcMar>
+              <w:top w:type="dxa" w:w="60"/>
+              <w:left w:type="dxa" w:w="110"/>
+              <w:bottom w:type="dxa" w:w="60"/>
+              <w:right w:type="dxa" w:w="110"/>
+            </w:tcMar>
+          </w:tcPr>
+          <w:p>
+            <w:pPr>
+              <w:spacing w:after="0" w:line="264"/>
+            </w:pPr>
+            <w:r>
+              <w:rPr>
+                <w:rFonts w:ascii="Arial" w:cs="Arial" w:eastAsia="Arial" w:hAnsi="Arial"/>
+                <w:sz w:val="19"/>
+                <w:szCs w:val="19"/>
+              </w:rPr>
+              <w:t xml:space="preserve">Portada</w:t>
+            </w:r>
+          </w:p>
+        </w:tc>
+        <w:tc>
+          <w:tcPr>
+            <w:tcW w:type="dxa" w:w="3680"/>
+            <w:tcBorders>
+              <w:top w:val="single" w:color="D1D5DB" w:sz="1"/>
+              <w:left w:val="single" w:color="D1D5DB" w:sz="1"/>
+              <w:bottom w:val="single" w:color="D1D5DB" w:sz="1"/>
+              <w:right w:val="single" w:color="D1D5DB" w:sz="1"/>
+            </w:tcBorders>
+            <w:tcMar>
+              <w:top w:type="dxa" w:w="60"/>
+              <w:left w:type="dxa" w:w="110"/>
+              <w:bottom w:type="dxa" w:w="60"/>
+              <w:right w:type="dxa" w:w="110"/>
+            </w:tcMar>
+          </w:tcPr>
+          <w:p>
+            <w:pPr>
+              <w:spacing w:after="0" w:line="264"/>
+            </w:pPr>
+            <w:r>
+              <w:rPr>
+                <w:rFonts w:ascii="Arial" w:cs="Arial" w:eastAsia="Arial" w:hAnsi="Arial"/>
+                <w:sz w:val="19"/>
+                <w:szCs w:val="19"/>
+              </w:rPr>
+              <w:t xml:space="preserve">BookCoverUseCase</w:t>
+            </w:r>
+          </w:p>
+        </w:tc>
+        <w:tc>
+          <w:tcPr>
+            <w:tcW w:type="dxa" w:w="3080"/>
+            <w:tcBorders>
+              <w:top w:val="single" w:color="D1D5DB" w:sz="1"/>
+              <w:left w:val="single" w:color="D1D5DB" w:sz="1"/>
+              <w:bottom w:val="single" w:color="D1D5DB" w:sz="1"/>
+              <w:right w:val="single" w:color="D1D5DB" w:sz="1"/>
+            </w:tcBorders>
+            <w:tcMar>
+              <w:top w:type="dxa" w:w="60"/>
+              <w:left w:type="dxa" w:w="110"/>
+              <w:bottom w:type="dxa" w:w="60"/>
+              <w:right w:type="dxa" w:w="110"/>
+            </w:tcMar>
+          </w:tcPr>
+          <w:p>
+            <w:pPr>
+              <w:spacing w:after="0" w:line="264"/>
+            </w:pPr>
+            <w:r>
+              <w:rPr>
+                <w:rFonts w:ascii="Arial" w:cs="Arial" w:eastAsia="Arial" w:hAnsi="Arial"/>
+                <w:sz w:val="19"/>
+                <w:szCs w:val="19"/>
+              </w:rPr>
+              <w:t xml:space="preserve">BookCoverPort</w:t>
+            </w:r>
+          </w:p>
+        </w:tc>
+      </w:tr>
+    </w:tbl>
+    <w:p>
+      <w:pPr>
+        <w:spacing w:after="160"/>
+      </w:pPr>
+      <w:r>
+        <w:rPr>
+          <w:rFonts w:ascii="Arial" w:cs="Arial" w:eastAsia="Arial" w:hAnsi="Arial"/>
+          <w:i/>
+          <w:iCs/>
+          <w:color w:val="6B7280"/>
+          <w:sz w:val="18"/>
+          <w:szCs w:val="18"/>
+        </w:rPr>
+        <w:t xml:space="preserve">Los DTO de entrada/salida y las excepciones de dominio (p. ej. CouponNotFound→404, DuplicateCoupon→409, InvalidPdf→400, PurchaseAccessDenied→403) se añadieron para mantener el contrato HTTP idéntico.</w:t>
+      </w:r>
+    </w:p>
+    <w:p>
+      <w:pPr>
+        <w:pStyle w:val="Heading2"/>
+      </w:pPr>
+      <w:r>
+        <w:rPr>
+          <w:rFonts w:ascii="Arial" w:cs="Arial" w:eastAsia="Arial" w:hAnsi="Arial"/>
+        </w:rPr>
+        <w:t xml:space="preserve">18.4 La regla ArchUnit que lo blinda</w:t>
+      </w:r>
+    </w:p>
+    <w:p>
+      <w:pPr>
+        <w:spacing w:after="120" w:line="276"/>
+      </w:pPr>
+      <w:r>
+        <w:rPr>
+          <w:rFonts w:ascii="Arial" w:cs="Arial" w:eastAsia="Arial" w:hAnsi="Arial"/>
+        </w:rPr>
+        <w:t xml:space="preserve">Para que el problema no reaparezca, se añadió una regla </w:t>
+      </w:r>
+      <w:r>
+        <w:rPr>
+          <w:rFonts w:ascii="Arial" w:cs="Arial" w:eastAsia="Arial" w:hAnsi="Arial"/>
+          <w:b/>
+          <w:bCs/>
+        </w:rPr>
+        <w:t xml:space="preserve">ArchUnit</w:t>
+      </w:r>
+      <w:r>
+        <w:rPr>
+          <w:rFonts w:ascii="Arial" w:cs="Arial" w:eastAsia="Arial" w:hAnsi="Arial"/>
+        </w:rPr>
+        <w:t xml:space="preserve"> en los tests de arquitectura de order y catalog. La regla </w:t>
+      </w:r>
+      <w:r>
+        <w:rPr>
+          <w:rFonts w:ascii="Consolas" w:cs="Consolas" w:eastAsia="Consolas" w:hAnsi="Consolas"/>
+          <w:color w:val="4F46E5"/>
+        </w:rPr>
+        <w:t xml:space="preserve">layeredArchitecture</w:t>
+      </w:r>
+      <w:r>
+        <w:rPr>
+          <w:rFonts w:ascii="Arial" w:cs="Arial" w:eastAsia="Arial" w:hAnsi="Arial"/>
+        </w:rPr>
+        <w:t xml:space="preserve"> existente no lo detectaba porque trata a todos los adaptadores como una sola capa (un adaptador llamando a otro adaptador es intra-capa). Esta regla explícita cierra ese hueco:</w:t>
+      </w:r>
+    </w:p>
+    <w:p>
+      <w:pPr>
+        <w:pBdr>
+          <w:left w:val="single" w:color="CBD5E1" w:sz="16" w:space="8"/>
+        </w:pBdr>
+        <w:shd w:fill="F3F4F6" w:val="clear"/>
+        <w:spacing w:after="0" w:before="40" w:line="240"/>
+        <w:ind w:left="120"/>
+      </w:pPr>
+      <w:r>
+        <w:rPr>
+          <w:rFonts w:ascii="Consolas" w:cs="Consolas" w:eastAsia="Consolas" w:hAnsi="Consolas"/>
+          <w:color w:val="0F172A"/>
+          <w:sz w:val="17"/>
+          <w:szCs w:val="17"/>
+        </w:rPr>
+        <w:t xml:space="preserve">@ArchTest</w:t>
+      </w:r>
+    </w:p>
+    <w:p>
+      <w:pPr>
+        <w:pBdr>
+          <w:left w:val="single" w:color="CBD5E1" w:sz="16" w:space="8"/>
+        </w:pBdr>
+        <w:shd w:fill="F3F4F6" w:val="clear"/>
+        <w:spacing w:after="0" w:before="0" w:line="240"/>
+        <w:ind w:left="120"/>
+      </w:pPr>
+      <w:r>
+        <w:rPr>
+          <w:rFonts w:ascii="Consolas" w:cs="Consolas" w:eastAsia="Consolas" w:hAnsi="Consolas"/>
+          <w:color w:val="0F172A"/>
+          <w:sz w:val="17"/>
+          <w:szCs w:val="17"/>
+        </w:rPr>
+        <w:t xml:space="preserve">static final ArchRule los_adaptadores_de_entrada_no_acceden_a_persistencia =</w:t>
+      </w:r>
+    </w:p>
+    <w:p>
+      <w:pPr>
+        <w:pBdr>
+          <w:left w:val="single" w:color="CBD5E1" w:sz="16" w:space="8"/>
+        </w:pBdr>
+        <w:shd w:fill="F3F4F6" w:val="clear"/>
+        <w:spacing w:after="0" w:before="0" w:line="240"/>
+        <w:ind w:left="120"/>
+      </w:pPr>
+      <w:r>
+        <w:rPr>
+          <w:rFonts w:ascii="Consolas" w:cs="Consolas" w:eastAsia="Consolas" w:hAnsi="Consolas"/>
+          <w:color w:val="0F172A"/>
+          <w:sz w:val="17"/>
+          <w:szCs w:val="17"/>
+        </w:rPr>
+        <w:t xml:space="preserve">    noClasses().that().resideInAPackage("..adapter.in..")</w:t>
+      </w:r>
+    </w:p>
+    <w:p>
+      <w:pPr>
+        <w:pBdr>
+          <w:left w:val="single" w:color="CBD5E1" w:sz="16" w:space="8"/>
+        </w:pBdr>
+        <w:shd w:fill="F3F4F6" w:val="clear"/>
+        <w:spacing w:after="0" w:before="0" w:line="240"/>
+        <w:ind w:left="120"/>
+      </w:pPr>
+      <w:r>
+        <w:rPr>
+          <w:rFonts w:ascii="Consolas" w:cs="Consolas" w:eastAsia="Consolas" w:hAnsi="Consolas"/>
+          <w:color w:val="0F172A"/>
+          <w:sz w:val="17"/>
+          <w:szCs w:val="17"/>
+        </w:rPr>
+        <w:t xml:space="preserve">        .should().dependOnClassesThat().resideInAPackage("..adapter.out.persistence..")</w:t>
+      </w:r>
+    </w:p>
+    <w:p>
+      <w:pPr>
+        <w:pBdr>
+          <w:left w:val="single" w:color="CBD5E1" w:sz="16" w:space="8"/>
+        </w:pBdr>
+        <w:shd w:fill="F3F4F6" w:val="clear"/>
+        <w:spacing w:after="150" w:before="0" w:line="240"/>
+        <w:ind w:left="120"/>
+      </w:pPr>
+      <w:r>
+        <w:rPr>
+          <w:rFonts w:ascii="Consolas" w:cs="Consolas" w:eastAsia="Consolas" w:hAnsi="Consolas"/>
+          <w:color w:val="0F172A"/>
+          <w:sz w:val="17"/>
+          <w:szCs w:val="17"/>
+        </w:rPr>
+        <w:t xml:space="preserve">        .as("Los adaptadores de entrada deben pasar por un puerto, no por JPA/repositorios");</w:t>
+      </w:r>
+    </w:p>
+    <w:p>
+      <w:pPr>
+        <w:spacing w:after="120" w:line="276"/>
+      </w:pPr>
+      <w:r>
+        <w:rPr>
+          <w:rFonts w:ascii="Arial" w:cs="Arial" w:eastAsia="Arial" w:hAnsi="Arial"/>
+        </w:rPr>
+        <w:t xml:space="preserve">A partir de ahora, si alguien vuelve a inyectar un repositorio en un controlador o consumidor, </w:t>
+      </w:r>
+      <w:r>
+        <w:rPr>
+          <w:rFonts w:ascii="Arial" w:cs="Arial" w:eastAsia="Arial" w:hAnsi="Arial"/>
+          <w:b/>
+          <w:bCs/>
+        </w:rPr>
+        <w:t xml:space="preserve">el build falla</w:t>
+      </w:r>
+      <w:r>
+        <w:rPr>
+          <w:rFonts w:ascii="Arial" w:cs="Arial" w:eastAsia="Arial" w:hAnsi="Arial"/>
+        </w:rPr>
+        <w:t xml:space="preserve"> en la fase de test — la arquitectura queda documentada y verificada por el propio pipeline, no solo por convención.</w:t>
+      </w:r>
+    </w:p>
     <w:sectPr>
       <w:footerReference w:type="default" r:id="rId7"/>
       <w:pgSz w:w="12240" w:h="15840" w:orient="portrait"/>

</xml_diff>

<commit_message>
ci(gate): bloquear despliegue si falla la Quality Gate + doc §19
</commit_message>
<xml_diff>
--- a/BookPlus-Stack-Tecnologico.docx
+++ b/BookPlus-Stack-Tecnologico.docx
@@ -39319,6 +39319,1021 @@
         <w:t xml:space="preserve"> en la fase de test — la arquitectura queda documentada y verificada por el propio pipeline, no solo por convención.</w:t>
       </w:r>
     </w:p>
+    <w:p>
+      <w:r>
+        <w:br w:type="page"/>
+      </w:r>
+    </w:p>
+    <w:p>
+      <w:pPr>
+        <w:pStyle w:val="Heading1"/>
+      </w:pPr>
+      <w:r>
+        <w:rPr>
+          <w:rFonts w:ascii="Arial" w:cs="Arial" w:eastAsia="Arial" w:hAnsi="Arial"/>
+        </w:rPr>
+        <w:t xml:space="preserve">19. Quality Gate que bloquea el despliegue (CI/CD gating)</w:t>
+      </w:r>
+    </w:p>
+    <w:p>
+      <w:pPr>
+        <w:spacing w:after="120" w:line="276"/>
+      </w:pPr>
+      <w:r>
+        <w:rPr>
+          <w:rFonts w:ascii="Arial" w:cs="Arial" w:eastAsia="Arial" w:hAnsi="Arial"/>
+        </w:rPr>
+        <w:t xml:space="preserve">La </w:t>
+      </w:r>
+      <w:r>
+        <w:rPr>
+          <w:rFonts w:ascii="Arial" w:cs="Arial" w:eastAsia="Arial" w:hAnsi="Arial"/>
+          <w:b/>
+          <w:bCs/>
+        </w:rPr>
+        <w:t xml:space="preserve">Quality Gate</w:t>
+      </w:r>
+      <w:r>
+        <w:rPr>
+          <w:rFonts w:ascii="Arial" w:cs="Arial" w:eastAsia="Arial" w:hAnsi="Arial"/>
+        </w:rPr>
+        <w:t xml:space="preserve"> de SonarCloud es un conjunto de umbrales de aprobado/reprobado (cobertura del código nuevo, cero bugs/vulnerabilidades nuevas, mantenibilidad en A, duplicación baja) que sigue la filosofía </w:t>
+      </w:r>
+      <w:r>
+        <w:rPr>
+          <w:rFonts w:ascii="Arial" w:cs="Arial" w:eastAsia="Arial" w:hAnsi="Arial"/>
+          <w:b/>
+          <w:bCs/>
+        </w:rPr>
+        <w:t xml:space="preserve">Clean as You Code</w:t>
+      </w:r>
+      <w:r>
+        <w:rPr>
+          <w:rFonts w:ascii="Arial" w:cs="Arial" w:eastAsia="Arial" w:hAnsi="Arial"/>
+        </w:rPr>
+        <w:t xml:space="preserve">: no exige saldar toda la deuda histórica, solo que lo nuevo esté limpio. La gate se configura en el servidor de SonarCloud, no en el repositorio; lo que sí vive en el repo es la instrucción de esperarla y bloquear si falla.</w:t>
+      </w:r>
+    </w:p>
+    <w:p>
+      <w:pPr>
+        <w:pStyle w:val="Heading2"/>
+      </w:pPr>
+      <w:r>
+        <w:rPr>
+          <w:rFonts w:ascii="Arial" w:cs="Arial" w:eastAsia="Arial" w:hAnsi="Arial"/>
+        </w:rPr>
+        <w:t xml:space="preserve">19.1 En Jenkins — puerta lineal antes de empaquetar</w:t>
+      </w:r>
+    </w:p>
+    <w:p>
+      <w:pPr>
+        <w:spacing w:after="120" w:line="276"/>
+      </w:pPr>
+      <w:r>
+        <w:rPr>
+          <w:rFonts w:ascii="Arial" w:cs="Arial" w:eastAsia="Arial" w:hAnsi="Arial"/>
+        </w:rPr>
+        <w:t xml:space="preserve">El pipeline de Jenkins es lineal: el </w:t>
+      </w:r>
+      <w:r>
+        <w:rPr>
+          <w:rFonts w:ascii="Consolas" w:cs="Consolas" w:eastAsia="Consolas" w:hAnsi="Consolas"/>
+          <w:color w:val="4F46E5"/>
+        </w:rPr>
+        <w:t xml:space="preserve">waitForQualityGate abortPipeline: true</w:t>
+      </w:r>
+      <w:r>
+        <w:rPr>
+          <w:rFonts w:ascii="Arial" w:cs="Arial" w:eastAsia="Arial" w:hAnsi="Arial"/>
+        </w:rPr>
+        <w:t xml:space="preserve"> pausa el build esperando el veredicto vía webhook y aborta antes del stage de empaquetado si la gate reprueba.</w:t>
+      </w:r>
+    </w:p>
+    <w:p>
+      <w:pPr>
+        <w:pBdr>
+          <w:left w:val="single" w:color="CBD5E1" w:sz="16" w:space="8"/>
+        </w:pBdr>
+        <w:shd w:fill="F3F4F6" w:val="clear"/>
+        <w:spacing w:after="0" w:before="40" w:line="240"/>
+        <w:ind w:left="120"/>
+      </w:pPr>
+      <w:r>
+        <w:rPr>
+          <w:rFonts w:ascii="Consolas" w:cs="Consolas" w:eastAsia="Consolas" w:hAnsi="Consolas"/>
+          <w:color w:val="0F172A"/>
+          <w:sz w:val="17"/>
+          <w:szCs w:val="17"/>
+        </w:rPr>
+        <w:t xml:space="preserve">stage('SonarCloud + Quality Gate') {</w:t>
+      </w:r>
+    </w:p>
+    <w:p>
+      <w:pPr>
+        <w:pBdr>
+          <w:left w:val="single" w:color="CBD5E1" w:sz="16" w:space="8"/>
+        </w:pBdr>
+        <w:shd w:fill="F3F4F6" w:val="clear"/>
+        <w:spacing w:after="0" w:before="0" w:line="240"/>
+        <w:ind w:left="120"/>
+      </w:pPr>
+      <w:r>
+        <w:rPr>
+          <w:rFonts w:ascii="Consolas" w:cs="Consolas" w:eastAsia="Consolas" w:hAnsi="Consolas"/>
+          <w:color w:val="0F172A"/>
+          <w:sz w:val="17"/>
+          <w:szCs w:val="17"/>
+        </w:rPr>
+        <w:t xml:space="preserve">    steps {</w:t>
+      </w:r>
+    </w:p>
+    <w:p>
+      <w:pPr>
+        <w:pBdr>
+          <w:left w:val="single" w:color="CBD5E1" w:sz="16" w:space="8"/>
+        </w:pBdr>
+        <w:shd w:fill="F3F4F6" w:val="clear"/>
+        <w:spacing w:after="0" w:before="0" w:line="240"/>
+        <w:ind w:left="120"/>
+      </w:pPr>
+      <w:r>
+        <w:rPr>
+          <w:rFonts w:ascii="Consolas" w:cs="Consolas" w:eastAsia="Consolas" w:hAnsi="Consolas"/>
+          <w:color w:val="0F172A"/>
+          <w:sz w:val="17"/>
+          <w:szCs w:val="17"/>
+        </w:rPr>
+        <w:t xml:space="preserve">        withSonarQubeEnv('SonarCloud') {</w:t>
+      </w:r>
+    </w:p>
+    <w:p>
+      <w:pPr>
+        <w:pBdr>
+          <w:left w:val="single" w:color="CBD5E1" w:sz="16" w:space="8"/>
+        </w:pBdr>
+        <w:shd w:fill="F3F4F6" w:val="clear"/>
+        <w:spacing w:after="0" w:before="0" w:line="240"/>
+        <w:ind w:left="120"/>
+      </w:pPr>
+      <w:r>
+        <w:rPr>
+          <w:rFonts w:ascii="Consolas" w:cs="Consolas" w:eastAsia="Consolas" w:hAnsi="Consolas"/>
+          <w:color w:val="0F172A"/>
+          <w:sz w:val="17"/>
+          <w:szCs w:val="17"/>
+        </w:rPr>
+        <w:t xml:space="preserve">            sh 'cd book-plus-order-service &amp;&amp; mvn -B -q verify sonar:sonar'</w:t>
+      </w:r>
+    </w:p>
+    <w:p>
+      <w:pPr>
+        <w:pBdr>
+          <w:left w:val="single" w:color="CBD5E1" w:sz="16" w:space="8"/>
+        </w:pBdr>
+        <w:shd w:fill="F3F4F6" w:val="clear"/>
+        <w:spacing w:after="0" w:before="0" w:line="240"/>
+        <w:ind w:left="120"/>
+      </w:pPr>
+      <w:r>
+        <w:rPr>
+          <w:rFonts w:ascii="Consolas" w:cs="Consolas" w:eastAsia="Consolas" w:hAnsi="Consolas"/>
+          <w:color w:val="0F172A"/>
+          <w:sz w:val="17"/>
+          <w:szCs w:val="17"/>
+        </w:rPr>
+        <w:t xml:space="preserve">        }</w:t>
+      </w:r>
+    </w:p>
+    <w:p>
+      <w:pPr>
+        <w:pBdr>
+          <w:left w:val="single" w:color="CBD5E1" w:sz="16" w:space="8"/>
+        </w:pBdr>
+        <w:shd w:fill="F3F4F6" w:val="clear"/>
+        <w:spacing w:after="0" w:before="0" w:line="240"/>
+        <w:ind w:left="120"/>
+      </w:pPr>
+      <w:r>
+        <w:rPr>
+          <w:rFonts w:ascii="Consolas" w:cs="Consolas" w:eastAsia="Consolas" w:hAnsi="Consolas"/>
+          <w:color w:val="0F172A"/>
+          <w:sz w:val="17"/>
+          <w:szCs w:val="17"/>
+        </w:rPr>
+        <w:t xml:space="preserve">        timeout(time: 10, unit: 'MINUTES') {</w:t>
+      </w:r>
+    </w:p>
+    <w:p>
+      <w:pPr>
+        <w:pBdr>
+          <w:left w:val="single" w:color="CBD5E1" w:sz="16" w:space="8"/>
+        </w:pBdr>
+        <w:shd w:fill="F3F4F6" w:val="clear"/>
+        <w:spacing w:after="0" w:before="0" w:line="240"/>
+        <w:ind w:left="120"/>
+      </w:pPr>
+      <w:r>
+        <w:rPr>
+          <w:rFonts w:ascii="Consolas" w:cs="Consolas" w:eastAsia="Consolas" w:hAnsi="Consolas"/>
+          <w:color w:val="0F172A"/>
+          <w:sz w:val="17"/>
+          <w:szCs w:val="17"/>
+        </w:rPr>
+        <w:t xml:space="preserve">            waitForQualityGate abortPipeline: true   // gate roja → build abortado</w:t>
+      </w:r>
+    </w:p>
+    <w:p>
+      <w:pPr>
+        <w:pBdr>
+          <w:left w:val="single" w:color="CBD5E1" w:sz="16" w:space="8"/>
+        </w:pBdr>
+        <w:shd w:fill="F3F4F6" w:val="clear"/>
+        <w:spacing w:after="0" w:before="0" w:line="240"/>
+        <w:ind w:left="120"/>
+      </w:pPr>
+      <w:r>
+        <w:rPr>
+          <w:rFonts w:ascii="Consolas" w:cs="Consolas" w:eastAsia="Consolas" w:hAnsi="Consolas"/>
+          <w:color w:val="0F172A"/>
+          <w:sz w:val="17"/>
+          <w:szCs w:val="17"/>
+        </w:rPr>
+        <w:t xml:space="preserve">        }</w:t>
+      </w:r>
+    </w:p>
+    <w:p>
+      <w:pPr>
+        <w:pBdr>
+          <w:left w:val="single" w:color="CBD5E1" w:sz="16" w:space="8"/>
+        </w:pBdr>
+        <w:shd w:fill="F3F4F6" w:val="clear"/>
+        <w:spacing w:after="0" w:before="0" w:line="240"/>
+        <w:ind w:left="120"/>
+      </w:pPr>
+      <w:r>
+        <w:rPr>
+          <w:rFonts w:ascii="Consolas" w:cs="Consolas" w:eastAsia="Consolas" w:hAnsi="Consolas"/>
+          <w:color w:val="0F172A"/>
+          <w:sz w:val="17"/>
+          <w:szCs w:val="17"/>
+        </w:rPr>
+        <w:t xml:space="preserve">    }</w:t>
+      </w:r>
+    </w:p>
+    <w:p>
+      <w:pPr>
+        <w:pBdr>
+          <w:left w:val="single" w:color="CBD5E1" w:sz="16" w:space="8"/>
+        </w:pBdr>
+        <w:shd w:fill="F3F4F6" w:val="clear"/>
+        <w:spacing w:after="150" w:before="0" w:line="240"/>
+        <w:ind w:left="120"/>
+      </w:pPr>
+      <w:r>
+        <w:rPr>
+          <w:rFonts w:ascii="Consolas" w:cs="Consolas" w:eastAsia="Consolas" w:hAnsi="Consolas"/>
+          <w:color w:val="0F172A"/>
+          <w:sz w:val="17"/>
+          <w:szCs w:val="17"/>
+        </w:rPr>
+        <w:t xml:space="preserve">}</w:t>
+      </w:r>
+    </w:p>
+    <w:p>
+      <w:pPr>
+        <w:pStyle w:val="Heading2"/>
+      </w:pPr>
+      <w:r>
+        <w:rPr>
+          <w:rFonts w:ascii="Arial" w:cs="Arial" w:eastAsia="Arial" w:hAnsi="Arial"/>
+        </w:rPr>
+        <w:t xml:space="preserve">19.2 En GitHub Actions — la gate hace fallar el job de CI</w:t>
+      </w:r>
+    </w:p>
+    <w:p>
+      <w:pPr>
+        <w:spacing w:after="120" w:line="276"/>
+      </w:pPr>
+      <w:r>
+        <w:rPr>
+          <w:rFonts w:ascii="Arial" w:cs="Arial" w:eastAsia="Arial" w:hAnsi="Arial"/>
+        </w:rPr>
+        <w:t xml:space="preserve">El equivalente en GitHub Actions es la propiedad </w:t>
+      </w:r>
+      <w:r>
+        <w:rPr>
+          <w:rFonts w:ascii="Consolas" w:cs="Consolas" w:eastAsia="Consolas" w:hAnsi="Consolas"/>
+          <w:color w:val="4F46E5"/>
+        </w:rPr>
+        <w:t xml:space="preserve">sonar.qualitygate.wait=true</w:t>
+      </w:r>
+      <w:r>
+        <w:rPr>
+          <w:rFonts w:ascii="Arial" w:cs="Arial" w:eastAsia="Arial" w:hAnsi="Arial"/>
+        </w:rPr>
+        <w:t xml:space="preserve">: Maven espera el veredicto y devuelve error si la gate falla, dejando el workflow CI en rojo.</w:t>
+      </w:r>
+    </w:p>
+    <w:p>
+      <w:pPr>
+        <w:pBdr>
+          <w:left w:val="single" w:color="CBD5E1" w:sz="16" w:space="8"/>
+        </w:pBdr>
+        <w:shd w:fill="F3F4F6" w:val="clear"/>
+        <w:spacing w:after="0" w:before="40" w:line="240"/>
+        <w:ind w:left="120"/>
+      </w:pPr>
+      <w:r>
+        <w:rPr>
+          <w:rFonts w:ascii="Consolas" w:cs="Consolas" w:eastAsia="Consolas" w:hAnsi="Consolas"/>
+          <w:color w:val="0F172A"/>
+          <w:sz w:val="17"/>
+          <w:szCs w:val="17"/>
+        </w:rPr>
+        <w:t xml:space="preserve"># .github/workflows/ci.yml — job sonar</w:t>
+      </w:r>
+    </w:p>
+    <w:p>
+      <w:pPr>
+        <w:pBdr>
+          <w:left w:val="single" w:color="CBD5E1" w:sz="16" w:space="8"/>
+        </w:pBdr>
+        <w:shd w:fill="F3F4F6" w:val="clear"/>
+        <w:spacing w:after="0" w:before="0" w:line="240"/>
+        <w:ind w:left="120"/>
+      </w:pPr>
+      <w:r>
+        <w:rPr>
+          <w:rFonts w:ascii="Consolas" w:cs="Consolas" w:eastAsia="Consolas" w:hAnsi="Consolas"/>
+          <w:color w:val="0F172A"/>
+          <w:sz w:val="17"/>
+          <w:szCs w:val="17"/>
+        </w:rPr>
+        <w:t xml:space="preserve">mvn -B clean test sonar:sonar \</w:t>
+      </w:r>
+    </w:p>
+    <w:p>
+      <w:pPr>
+        <w:pBdr>
+          <w:left w:val="single" w:color="CBD5E1" w:sz="16" w:space="8"/>
+        </w:pBdr>
+        <w:shd w:fill="F3F4F6" w:val="clear"/>
+        <w:spacing w:after="0" w:before="0" w:line="240"/>
+        <w:ind w:left="120"/>
+      </w:pPr>
+      <w:r>
+        <w:rPr>
+          <w:rFonts w:ascii="Consolas" w:cs="Consolas" w:eastAsia="Consolas" w:hAnsi="Consolas"/>
+          <w:color w:val="0F172A"/>
+          <w:sz w:val="17"/>
+          <w:szCs w:val="17"/>
+        </w:rPr>
+        <w:t xml:space="preserve">  -Dsonar.host.url=$SONAR_HOST_URL \</w:t>
+      </w:r>
+    </w:p>
+    <w:p>
+      <w:pPr>
+        <w:pBdr>
+          <w:left w:val="single" w:color="CBD5E1" w:sz="16" w:space="8"/>
+        </w:pBdr>
+        <w:shd w:fill="F3F4F6" w:val="clear"/>
+        <w:spacing w:after="0" w:before="0" w:line="240"/>
+        <w:ind w:left="120"/>
+      </w:pPr>
+      <w:r>
+        <w:rPr>
+          <w:rFonts w:ascii="Consolas" w:cs="Consolas" w:eastAsia="Consolas" w:hAnsi="Consolas"/>
+          <w:color w:val="0F172A"/>
+          <w:sz w:val="17"/>
+          <w:szCs w:val="17"/>
+        </w:rPr>
+        <w:t xml:space="preserve">  -Dsonar.token=$SONAR_TOKEN \</w:t>
+      </w:r>
+    </w:p>
+    <w:p>
+      <w:pPr>
+        <w:pBdr>
+          <w:left w:val="single" w:color="CBD5E1" w:sz="16" w:space="8"/>
+        </w:pBdr>
+        <w:shd w:fill="F3F4F6" w:val="clear"/>
+        <w:spacing w:after="0" w:before="0" w:line="240"/>
+        <w:ind w:left="120"/>
+      </w:pPr>
+      <w:r>
+        <w:rPr>
+          <w:rFonts w:ascii="Consolas" w:cs="Consolas" w:eastAsia="Consolas" w:hAnsi="Consolas"/>
+          <w:color w:val="0F172A"/>
+          <w:sz w:val="17"/>
+          <w:szCs w:val="17"/>
+        </w:rPr>
+        <w:t xml:space="preserve">  -Dsonar.qualitygate.wait=true \</w:t>
+      </w:r>
+    </w:p>
+    <w:p>
+      <w:pPr>
+        <w:pBdr>
+          <w:left w:val="single" w:color="CBD5E1" w:sz="16" w:space="8"/>
+        </w:pBdr>
+        <w:shd w:fill="F3F4F6" w:val="clear"/>
+        <w:spacing w:after="150" w:before="0" w:line="240"/>
+        <w:ind w:left="120"/>
+      </w:pPr>
+      <w:r>
+        <w:rPr>
+          <w:rFonts w:ascii="Consolas" w:cs="Consolas" w:eastAsia="Consolas" w:hAnsi="Consolas"/>
+          <w:color w:val="0F172A"/>
+          <w:sz w:val="17"/>
+          <w:szCs w:val="17"/>
+        </w:rPr>
+        <w:t xml:space="preserve">  $ORG_FLAG</w:t>
+      </w:r>
+    </w:p>
+    <w:p>
+      <w:pPr>
+        <w:pStyle w:val="Heading2"/>
+      </w:pPr>
+      <w:r>
+        <w:rPr>
+          <w:rFonts w:ascii="Arial" w:cs="Arial" w:eastAsia="Arial" w:hAnsi="Arial"/>
+        </w:rPr>
+        <w:t xml:space="preserve">19.3 El CD encadenado al éxito del CI</w:t>
+      </w:r>
+    </w:p>
+    <w:p>
+      <w:pPr>
+        <w:spacing w:after="120" w:line="276"/>
+      </w:pPr>
+      <w:r>
+        <w:rPr>
+          <w:rFonts w:ascii="Arial" w:cs="Arial" w:eastAsia="Arial" w:hAnsi="Arial"/>
+        </w:rPr>
+        <w:t xml:space="preserve">El despliegue (build + push de imágenes a GHCR) NO se dispara por su cuenta en cada push: se encadena al workflow CI con </w:t>
+      </w:r>
+      <w:r>
+        <w:rPr>
+          <w:rFonts w:ascii="Consolas" w:cs="Consolas" w:eastAsia="Consolas" w:hAnsi="Consolas"/>
+          <w:color w:val="4F46E5"/>
+        </w:rPr>
+        <w:t xml:space="preserve">workflow_run</w:t>
+      </w:r>
+      <w:r>
+        <w:rPr>
+          <w:rFonts w:ascii="Arial" w:cs="Arial" w:eastAsia="Arial" w:hAnsi="Arial"/>
+        </w:rPr>
+        <w:t xml:space="preserve">, de modo que las imágenes solo se construyen si el CI —tests, cobertura y Quality Gate— terminó en éxito. Si la gate falla, el CD ni siquiera arranca.</w:t>
+      </w:r>
+    </w:p>
+    <w:p>
+      <w:pPr>
+        <w:pBdr>
+          <w:left w:val="single" w:color="CBD5E1" w:sz="16" w:space="8"/>
+        </w:pBdr>
+        <w:shd w:fill="F3F4F6" w:val="clear"/>
+        <w:spacing w:after="0" w:before="40" w:line="240"/>
+        <w:ind w:left="120"/>
+      </w:pPr>
+      <w:r>
+        <w:rPr>
+          <w:rFonts w:ascii="Consolas" w:cs="Consolas" w:eastAsia="Consolas" w:hAnsi="Consolas"/>
+          <w:color w:val="0F172A"/>
+          <w:sz w:val="17"/>
+          <w:szCs w:val="17"/>
+        </w:rPr>
+        <w:t xml:space="preserve"># .github/workflows/cd.yml</w:t>
+      </w:r>
+    </w:p>
+    <w:p>
+      <w:pPr>
+        <w:pBdr>
+          <w:left w:val="single" w:color="CBD5E1" w:sz="16" w:space="8"/>
+        </w:pBdr>
+        <w:shd w:fill="F3F4F6" w:val="clear"/>
+        <w:spacing w:after="0" w:before="0" w:line="240"/>
+        <w:ind w:left="120"/>
+      </w:pPr>
+      <w:r>
+        <w:rPr>
+          <w:rFonts w:ascii="Consolas" w:cs="Consolas" w:eastAsia="Consolas" w:hAnsi="Consolas"/>
+          <w:color w:val="0F172A"/>
+          <w:sz w:val="17"/>
+          <w:szCs w:val="17"/>
+        </w:rPr>
+        <w:t xml:space="preserve">on:</w:t>
+      </w:r>
+    </w:p>
+    <w:p>
+      <w:pPr>
+        <w:pBdr>
+          <w:left w:val="single" w:color="CBD5E1" w:sz="16" w:space="8"/>
+        </w:pBdr>
+        <w:shd w:fill="F3F4F6" w:val="clear"/>
+        <w:spacing w:after="0" w:before="0" w:line="240"/>
+        <w:ind w:left="120"/>
+      </w:pPr>
+      <w:r>
+        <w:rPr>
+          <w:rFonts w:ascii="Consolas" w:cs="Consolas" w:eastAsia="Consolas" w:hAnsi="Consolas"/>
+          <w:color w:val="0F172A"/>
+          <w:sz w:val="17"/>
+          <w:szCs w:val="17"/>
+        </w:rPr>
+        <w:t xml:space="preserve">  workflow_run:</w:t>
+      </w:r>
+    </w:p>
+    <w:p>
+      <w:pPr>
+        <w:pBdr>
+          <w:left w:val="single" w:color="CBD5E1" w:sz="16" w:space="8"/>
+        </w:pBdr>
+        <w:shd w:fill="F3F4F6" w:val="clear"/>
+        <w:spacing w:after="0" w:before="0" w:line="240"/>
+        <w:ind w:left="120"/>
+      </w:pPr>
+      <w:r>
+        <w:rPr>
+          <w:rFonts w:ascii="Consolas" w:cs="Consolas" w:eastAsia="Consolas" w:hAnsi="Consolas"/>
+          <w:color w:val="0F172A"/>
+          <w:sz w:val="17"/>
+          <w:szCs w:val="17"/>
+        </w:rPr>
+        <w:t xml:space="preserve">    workflows: ["CI"]</w:t>
+      </w:r>
+    </w:p>
+    <w:p>
+      <w:pPr>
+        <w:pBdr>
+          <w:left w:val="single" w:color="CBD5E1" w:sz="16" w:space="8"/>
+        </w:pBdr>
+        <w:shd w:fill="F3F4F6" w:val="clear"/>
+        <w:spacing w:after="0" w:before="0" w:line="240"/>
+        <w:ind w:left="120"/>
+      </w:pPr>
+      <w:r>
+        <w:rPr>
+          <w:rFonts w:ascii="Consolas" w:cs="Consolas" w:eastAsia="Consolas" w:hAnsi="Consolas"/>
+          <w:color w:val="0F172A"/>
+          <w:sz w:val="17"/>
+          <w:szCs w:val="17"/>
+        </w:rPr>
+        <w:t xml:space="preserve">    types: [completed]</w:t>
+      </w:r>
+    </w:p>
+    <w:p>
+      <w:pPr>
+        <w:pBdr>
+          <w:left w:val="single" w:color="CBD5E1" w:sz="16" w:space="8"/>
+        </w:pBdr>
+        <w:shd w:fill="F3F4F6" w:val="clear"/>
+        <w:spacing w:after="0" w:before="0" w:line="240"/>
+        <w:ind w:left="120"/>
+      </w:pPr>
+      <w:r>
+        <w:rPr>
+          <w:rFonts w:ascii="Consolas" w:cs="Consolas" w:eastAsia="Consolas" w:hAnsi="Consolas"/>
+          <w:color w:val="0F172A"/>
+          <w:sz w:val="17"/>
+          <w:szCs w:val="17"/>
+        </w:rPr>
+        <w:t xml:space="preserve">    branches: [main, master]</w:t>
+      </w:r>
+    </w:p>
+    <w:p>
+      <w:pPr>
+        <w:pBdr>
+          <w:left w:val="single" w:color="CBD5E1" w:sz="16" w:space="8"/>
+        </w:pBdr>
+        <w:shd w:fill="F3F4F6" w:val="clear"/>
+        <w:spacing w:after="0" w:before="0" w:line="240"/>
+        <w:ind w:left="120"/>
+      </w:pPr>
+      <w:r>
+        <w:rPr>
+          <w:rFonts w:ascii="Consolas" w:cs="Consolas" w:eastAsia="Consolas" w:hAnsi="Consolas"/>
+          <w:color w:val="0F172A"/>
+          <w:sz w:val="17"/>
+          <w:szCs w:val="17"/>
+        </w:rPr>
+        <w:t xml:space="preserve">  push:</w:t>
+      </w:r>
+    </w:p>
+    <w:p>
+      <w:pPr>
+        <w:pBdr>
+          <w:left w:val="single" w:color="CBD5E1" w:sz="16" w:space="8"/>
+        </w:pBdr>
+        <w:shd w:fill="F3F4F6" w:val="clear"/>
+        <w:spacing w:after="0" w:before="0" w:line="240"/>
+        <w:ind w:left="120"/>
+      </w:pPr>
+      <w:r>
+        <w:rPr>
+          <w:rFonts w:ascii="Consolas" w:cs="Consolas" w:eastAsia="Consolas" w:hAnsi="Consolas"/>
+          <w:color w:val="0F172A"/>
+          <w:sz w:val="17"/>
+          <w:szCs w:val="17"/>
+        </w:rPr>
+        <w:t xml:space="preserve">    tags: ["v*"]          # releases por tag</w:t>
+      </w:r>
+    </w:p>
+    <w:p>
+      <w:pPr>
+        <w:pBdr>
+          <w:left w:val="single" w:color="CBD5E1" w:sz="16" w:space="8"/>
+        </w:pBdr>
+        <w:shd w:fill="F3F4F6" w:val="clear"/>
+        <w:spacing w:after="0" w:before="0" w:line="240"/>
+        <w:ind w:left="120"/>
+      </w:pPr>
+      <w:r>
+        <w:rPr>
+          <w:rFonts w:ascii="Consolas" w:cs="Consolas" w:eastAsia="Consolas" w:hAnsi="Consolas"/>
+          <w:color w:val="0F172A"/>
+          <w:sz w:val="17"/>
+          <w:szCs w:val="17"/>
+        </w:rPr>
+        <w:t xml:space="preserve">  workflow_dispatch: {}</w:t>
+      </w:r>
+    </w:p>
+    <w:p>
+      <w:pPr>
+        <w:pBdr>
+          <w:left w:val="single" w:color="CBD5E1" w:sz="16" w:space="8"/>
+        </w:pBdr>
+        <w:shd w:fill="F3F4F6" w:val="clear"/>
+        <w:spacing w:after="0" w:before="0" w:line="240"/>
+        <w:ind w:left="120"/>
+      </w:pPr>
+      <w:r>
+        <w:rPr>
+          <w:rFonts w:ascii="Consolas" w:cs="Consolas" w:eastAsia="Consolas" w:hAnsi="Consolas"/>
+          <w:color w:val="0F172A"/>
+          <w:sz w:val="17"/>
+          <w:szCs w:val="17"/>
+        </w:rPr>
+        <w:t xml:space="preserve"> </w:t>
+      </w:r>
+    </w:p>
+    <w:p>
+      <w:pPr>
+        <w:pBdr>
+          <w:left w:val="single" w:color="CBD5E1" w:sz="16" w:space="8"/>
+        </w:pBdr>
+        <w:shd w:fill="F3F4F6" w:val="clear"/>
+        <w:spacing w:after="0" w:before="0" w:line="240"/>
+        <w:ind w:left="120"/>
+      </w:pPr>
+      <w:r>
+        <w:rPr>
+          <w:rFonts w:ascii="Consolas" w:cs="Consolas" w:eastAsia="Consolas" w:hAnsi="Consolas"/>
+          <w:color w:val="0F172A"/>
+          <w:sz w:val="17"/>
+          <w:szCs w:val="17"/>
+        </w:rPr>
+        <w:t xml:space="preserve">jobs:</w:t>
+      </w:r>
+    </w:p>
+    <w:p>
+      <w:pPr>
+        <w:pBdr>
+          <w:left w:val="single" w:color="CBD5E1" w:sz="16" w:space="8"/>
+        </w:pBdr>
+        <w:shd w:fill="F3F4F6" w:val="clear"/>
+        <w:spacing w:after="0" w:before="0" w:line="240"/>
+        <w:ind w:left="120"/>
+      </w:pPr>
+      <w:r>
+        <w:rPr>
+          <w:rFonts w:ascii="Consolas" w:cs="Consolas" w:eastAsia="Consolas" w:hAnsi="Consolas"/>
+          <w:color w:val="0F172A"/>
+          <w:sz w:val="17"/>
+          <w:szCs w:val="17"/>
+        </w:rPr>
+        <w:t xml:space="preserve">  build-push:</w:t>
+      </w:r>
+    </w:p>
+    <w:p>
+      <w:pPr>
+        <w:pBdr>
+          <w:left w:val="single" w:color="CBD5E1" w:sz="16" w:space="8"/>
+        </w:pBdr>
+        <w:shd w:fill="F3F4F6" w:val="clear"/>
+        <w:spacing w:after="0" w:before="0" w:line="240"/>
+        <w:ind w:left="120"/>
+      </w:pPr>
+      <w:r>
+        <w:rPr>
+          <w:rFonts w:ascii="Consolas" w:cs="Consolas" w:eastAsia="Consolas" w:hAnsi="Consolas"/>
+          <w:color w:val="0F172A"/>
+          <w:sz w:val="17"/>
+          <w:szCs w:val="17"/>
+        </w:rPr>
+        <w:t xml:space="preserve">    if: &gt;-</w:t>
+      </w:r>
+    </w:p>
+    <w:p>
+      <w:pPr>
+        <w:pBdr>
+          <w:left w:val="single" w:color="CBD5E1" w:sz="16" w:space="8"/>
+        </w:pBdr>
+        <w:shd w:fill="F3F4F6" w:val="clear"/>
+        <w:spacing w:after="0" w:before="0" w:line="240"/>
+        <w:ind w:left="120"/>
+      </w:pPr>
+      <w:r>
+        <w:rPr>
+          <w:rFonts w:ascii="Consolas" w:cs="Consolas" w:eastAsia="Consolas" w:hAnsi="Consolas"/>
+          <w:color w:val="0F172A"/>
+          <w:sz w:val="17"/>
+          <w:szCs w:val="17"/>
+        </w:rPr>
+        <w:t xml:space="preserve">      github.event_name == 'workflow_dispatch' ||</w:t>
+      </w:r>
+    </w:p>
+    <w:p>
+      <w:pPr>
+        <w:pBdr>
+          <w:left w:val="single" w:color="CBD5E1" w:sz="16" w:space="8"/>
+        </w:pBdr>
+        <w:shd w:fill="F3F4F6" w:val="clear"/>
+        <w:spacing w:after="0" w:before="0" w:line="240"/>
+        <w:ind w:left="120"/>
+      </w:pPr>
+      <w:r>
+        <w:rPr>
+          <w:rFonts w:ascii="Consolas" w:cs="Consolas" w:eastAsia="Consolas" w:hAnsi="Consolas"/>
+          <w:color w:val="0F172A"/>
+          <w:sz w:val="17"/>
+          <w:szCs w:val="17"/>
+        </w:rPr>
+        <w:t xml:space="preserve">      github.event_name == 'push' ||</w:t>
+      </w:r>
+    </w:p>
+    <w:p>
+      <w:pPr>
+        <w:pBdr>
+          <w:left w:val="single" w:color="CBD5E1" w:sz="16" w:space="8"/>
+        </w:pBdr>
+        <w:shd w:fill="F3F4F6" w:val="clear"/>
+        <w:spacing w:after="0" w:before="0" w:line="240"/>
+        <w:ind w:left="120"/>
+      </w:pPr>
+      <w:r>
+        <w:rPr>
+          <w:rFonts w:ascii="Consolas" w:cs="Consolas" w:eastAsia="Consolas" w:hAnsi="Consolas"/>
+          <w:color w:val="0F172A"/>
+          <w:sz w:val="17"/>
+          <w:szCs w:val="17"/>
+        </w:rPr>
+        <w:t xml:space="preserve">      (github.event_name == 'workflow_run' &amp;&amp;</w:t>
+      </w:r>
+    </w:p>
+    <w:p>
+      <w:pPr>
+        <w:pBdr>
+          <w:left w:val="single" w:color="CBD5E1" w:sz="16" w:space="8"/>
+        </w:pBdr>
+        <w:shd w:fill="F3F4F6" w:val="clear"/>
+        <w:spacing w:after="150" w:before="0" w:line="240"/>
+        <w:ind w:left="120"/>
+      </w:pPr>
+      <w:r>
+        <w:rPr>
+          <w:rFonts w:ascii="Consolas" w:cs="Consolas" w:eastAsia="Consolas" w:hAnsi="Consolas"/>
+          <w:color w:val="0F172A"/>
+          <w:sz w:val="17"/>
+          <w:szCs w:val="17"/>
+        </w:rPr>
+        <w:t xml:space="preserve">       github.event.workflow_run.conclusion == 'success')</w:t>
+      </w:r>
+    </w:p>
+    <w:p>
+      <w:pPr>
+        <w:spacing w:after="160"/>
+      </w:pPr>
+      <w:r>
+        <w:rPr>
+          <w:rFonts w:ascii="Arial" w:cs="Arial" w:eastAsia="Arial" w:hAnsi="Arial"/>
+          <w:i/>
+          <w:iCs/>
+          <w:color w:val="6B7280"/>
+          <w:sz w:val="18"/>
+          <w:szCs w:val="18"/>
+        </w:rPr>
+        <w:t xml:space="preserve">Detalle: bajo workflow_run, github.sha apunta a la rama por defecto; el checkout y el tag de la imagen usan github.event.workflow_run.head_sha para construir el commit realmente validado.</w:t>
+      </w:r>
+    </w:p>
+    <w:p>
+      <w:pPr>
+        <w:pStyle w:val="Heading2"/>
+      </w:pPr>
+      <w:r>
+        <w:rPr>
+          <w:rFonts w:ascii="Arial" w:cs="Arial" w:eastAsia="Arial" w:hAnsi="Arial"/>
+        </w:rPr>
+        <w:t xml:space="preserve">19.4 Resultado: ninguna imagen con la gate en rojo</w:t>
+      </w:r>
+    </w:p>
+    <w:p>
+      <w:pPr>
+        <w:spacing w:after="120" w:line="276"/>
+      </w:pPr>
+      <w:r>
+        <w:rPr>
+          <w:rFonts w:ascii="Arial" w:cs="Arial" w:eastAsia="Arial" w:hAnsi="Arial"/>
+        </w:rPr>
+        <w:t xml:space="preserve">Con las dos piezas, GitHub Actions queda tan estricto como Jenkins:</w:t>
+      </w:r>
+    </w:p>
+    <w:p>
+      <w:pPr>
+        <w:pBdr>
+          <w:left w:val="single" w:color="CBD5E1" w:sz="16" w:space="8"/>
+        </w:pBdr>
+        <w:shd w:fill="F3F4F6" w:val="clear"/>
+        <w:spacing w:after="0" w:before="40" w:line="240"/>
+        <w:ind w:left="120"/>
+      </w:pPr>
+      <w:r>
+        <w:rPr>
+          <w:rFonts w:ascii="Consolas" w:cs="Consolas" w:eastAsia="Consolas" w:hAnsi="Consolas"/>
+          <w:color w:val="0F172A"/>
+          <w:sz w:val="17"/>
+          <w:szCs w:val="17"/>
+        </w:rPr>
+        <w:t xml:space="preserve">push a main → CI (tests + JaCoCo + Quality Gate)</w:t>
+      </w:r>
+    </w:p>
+    <w:p>
+      <w:pPr>
+        <w:pBdr>
+          <w:left w:val="single" w:color="CBD5E1" w:sz="16" w:space="8"/>
+        </w:pBdr>
+        <w:shd w:fill="F3F4F6" w:val="clear"/>
+        <w:spacing w:after="0" w:before="0" w:line="240"/>
+        <w:ind w:left="120"/>
+      </w:pPr>
+      <w:r>
+        <w:rPr>
+          <w:rFonts w:ascii="Consolas" w:cs="Consolas" w:eastAsia="Consolas" w:hAnsi="Consolas"/>
+          <w:color w:val="0F172A"/>
+          <w:sz w:val="17"/>
+          <w:szCs w:val="17"/>
+        </w:rPr>
+        <w:t xml:space="preserve">                 │</w:t>
+      </w:r>
+    </w:p>
+    <w:p>
+      <w:pPr>
+        <w:pBdr>
+          <w:left w:val="single" w:color="CBD5E1" w:sz="16" w:space="8"/>
+        </w:pBdr>
+        <w:shd w:fill="F3F4F6" w:val="clear"/>
+        <w:spacing w:after="0" w:before="0" w:line="240"/>
+        <w:ind w:left="120"/>
+      </w:pPr>
+      <w:r>
+        <w:rPr>
+          <w:rFonts w:ascii="Consolas" w:cs="Consolas" w:eastAsia="Consolas" w:hAnsi="Consolas"/>
+          <w:color w:val="0F172A"/>
+          <w:sz w:val="17"/>
+          <w:szCs w:val="17"/>
+        </w:rPr>
+        <w:t xml:space="preserve">        ┌────────┴────────┐</w:t>
+      </w:r>
+    </w:p>
+    <w:p>
+      <w:pPr>
+        <w:pBdr>
+          <w:left w:val="single" w:color="CBD5E1" w:sz="16" w:space="8"/>
+        </w:pBdr>
+        <w:shd w:fill="F3F4F6" w:val="clear"/>
+        <w:spacing w:after="0" w:before="0" w:line="240"/>
+        <w:ind w:left="120"/>
+      </w:pPr>
+      <w:r>
+        <w:rPr>
+          <w:rFonts w:ascii="Consolas" w:cs="Consolas" w:eastAsia="Consolas" w:hAnsi="Consolas"/>
+          <w:color w:val="0F172A"/>
+          <w:sz w:val="17"/>
+          <w:szCs w:val="17"/>
+        </w:rPr>
+        <w:t xml:space="preserve">     gate OK           gate FALLA</w:t>
+      </w:r>
+    </w:p>
+    <w:p>
+      <w:pPr>
+        <w:pBdr>
+          <w:left w:val="single" w:color="CBD5E1" w:sz="16" w:space="8"/>
+        </w:pBdr>
+        <w:shd w:fill="F3F4F6" w:val="clear"/>
+        <w:spacing w:after="0" w:before="0" w:line="240"/>
+        <w:ind w:left="120"/>
+      </w:pPr>
+      <w:r>
+        <w:rPr>
+          <w:rFonts w:ascii="Consolas" w:cs="Consolas" w:eastAsia="Consolas" w:hAnsi="Consolas"/>
+          <w:color w:val="0F172A"/>
+          <w:sz w:val="17"/>
+          <w:szCs w:val="17"/>
+        </w:rPr>
+        <w:t xml:space="preserve">        │                  │</w:t>
+      </w:r>
+    </w:p>
+    <w:p>
+      <w:pPr>
+        <w:pBdr>
+          <w:left w:val="single" w:color="CBD5E1" w:sz="16" w:space="8"/>
+        </w:pBdr>
+        <w:shd w:fill="F3F4F6" w:val="clear"/>
+        <w:spacing w:after="0" w:before="0" w:line="240"/>
+        <w:ind w:left="120"/>
+      </w:pPr>
+      <w:r>
+        <w:rPr>
+          <w:rFonts w:ascii="Consolas" w:cs="Consolas" w:eastAsia="Consolas" w:hAnsi="Consolas"/>
+          <w:color w:val="0F172A"/>
+          <w:sz w:val="17"/>
+          <w:szCs w:val="17"/>
+        </w:rPr>
+        <w:t xml:space="preserve">   CI verde            CI rojo</w:t>
+      </w:r>
+    </w:p>
+    <w:p>
+      <w:pPr>
+        <w:pBdr>
+          <w:left w:val="single" w:color="CBD5E1" w:sz="16" w:space="8"/>
+        </w:pBdr>
+        <w:shd w:fill="F3F4F6" w:val="clear"/>
+        <w:spacing w:after="0" w:before="0" w:line="240"/>
+        <w:ind w:left="120"/>
+      </w:pPr>
+      <w:r>
+        <w:rPr>
+          <w:rFonts w:ascii="Consolas" w:cs="Consolas" w:eastAsia="Consolas" w:hAnsi="Consolas"/>
+          <w:color w:val="0F172A"/>
+          <w:sz w:val="17"/>
+          <w:szCs w:val="17"/>
+        </w:rPr>
+        <w:t xml:space="preserve">        │                  │</w:t>
+      </w:r>
+    </w:p>
+    <w:p>
+      <w:pPr>
+        <w:pBdr>
+          <w:left w:val="single" w:color="CBD5E1" w:sz="16" w:space="8"/>
+        </w:pBdr>
+        <w:shd w:fill="F3F4F6" w:val="clear"/>
+        <w:spacing w:after="0" w:before="0" w:line="240"/>
+        <w:ind w:left="120"/>
+      </w:pPr>
+      <w:r>
+        <w:rPr>
+          <w:rFonts w:ascii="Consolas" w:cs="Consolas" w:eastAsia="Consolas" w:hAnsi="Consolas"/>
+          <w:color w:val="0F172A"/>
+          <w:sz w:val="17"/>
+          <w:szCs w:val="17"/>
+        </w:rPr>
+        <w:t xml:space="preserve">  CD arranca         CD no arranca</w:t>
+      </w:r>
+    </w:p>
+    <w:p>
+      <w:pPr>
+        <w:pBdr>
+          <w:left w:val="single" w:color="CBD5E1" w:sz="16" w:space="8"/>
+        </w:pBdr>
+        <w:shd w:fill="F3F4F6" w:val="clear"/>
+        <w:spacing w:after="150" w:before="0" w:line="240"/>
+        <w:ind w:left="120"/>
+      </w:pPr>
+      <w:r>
+        <w:rPr>
+          <w:rFonts w:ascii="Consolas" w:cs="Consolas" w:eastAsia="Consolas" w:hAnsi="Consolas"/>
+          <w:color w:val="0F172A"/>
+          <w:sz w:val="17"/>
+          <w:szCs w:val="17"/>
+        </w:rPr>
+        <w:t xml:space="preserve">  (imagenes+deploy)  (sin imagen, sin deploy)</w:t>
+      </w:r>
+    </w:p>
+    <w:p>
+      <w:pPr>
+        <w:spacing w:after="120" w:line="276"/>
+      </w:pPr>
+      <w:r>
+        <w:rPr>
+          <w:rFonts w:ascii="Arial" w:cs="Arial" w:eastAsia="Arial" w:hAnsi="Arial"/>
+          <w:b/>
+          <w:bCs/>
+        </w:rPr>
+        <w:t xml:space="preserve">Nota operativa: </w:t>
+      </w:r>
+      <w:r>
+        <w:rPr>
+          <w:rFonts w:ascii="Arial" w:cs="Arial" w:eastAsia="Arial" w:hAnsi="Arial"/>
+        </w:rPr>
+        <w:t xml:space="preserve">el encadenado surte efecto una vez el workflow vive en la rama por defecto (workflow_run solo lo dispara la versión de main). Si SONAR_TOKEN no está configurado, el análisis se omite y el CI queda verde — la gate solo bloquea cuando Sonar está activo.</w:t>
+      </w:r>
+    </w:p>
     <w:sectPr>
       <w:footerReference w:type="default" r:id="rId7"/>
       <w:pgSz w:w="12240" w:h="15840" w:orient="portrait"/>

</xml_diff>

<commit_message>
test(pact): verificación del proveedor cart-service + doc §16.18
</commit_message>
<xml_diff>
--- a/BookPlus-Stack-Tecnologico.docx
+++ b/BookPlus-Stack-Tecnologico.docx
@@ -8144,7 +8144,7 @@
         <w:rPr>
           <w:rFonts w:ascii="Arial" w:cs="Arial" w:eastAsia="Arial" w:hAnsi="Arial"/>
         </w:rPr>
-        <w:t xml:space="preserve">. El productor verifica luego que su mensaje cumple ese contrato. El intercambio del contrato lo automatiza un Pact Broker, incluido en el stack (Docker Compose, UI en el puerto 9292): el consumidor publica y el productor verifica, con un “can-i-deploy” que avisa antes de desplegar si un cambio rompe a algún consumidor. Detalle en CONTRACT-TESTING.md.</w:t>
+        <w:t xml:space="preserve">. El proveedor (cart) verifica en su propio test que el evento REAL que emite cumple ese contrato — un test de proveedor construye el evento, lo serializa como en producción y Pact lo valida contra los matchers, de modo que el ciclo consumer-driven queda cerrado en ambos lados. El intercambio del contrato lo automatiza un Pact Broker, incluido en el stack (Docker Compose, UI en el puerto 9292): el consumidor publica y el productor verifica, con un “can-i-deploy” que avisa antes de desplegar si un cambio rompe a algún consumidor. Detalle en CONTRACT-TESTING.md.</w:t>
       </w:r>
     </w:p>
     <w:p>
@@ -30561,7 +30561,7 @@
         <w:rPr>
           <w:rFonts w:ascii="Arial" w:cs="Arial" w:eastAsia="Arial" w:hAnsi="Arial"/>
         </w:rPr>
-        <w:t xml:space="preserve">Pact: contrato entre consumidor y proveedor de eventos</w:t>
+        <w:t xml:space="preserve">Pact: contrato entre consumidor y proveedor de eventos (ambos lados)</w:t>
       </w:r>
     </w:p>
     <w:p>
@@ -30580,45 +30580,235 @@
           <w:sz w:val="17"/>
           <w:szCs w:val="17"/>
         </w:rPr>
-        <w:t xml:space="preserve">// order (consumidor) declara que espera 'cart.checked-out' con ciertos campos.</w:t>
-      </w:r>
-    </w:p>
-    <w:p>
-      <w:pPr>
-        <w:pBdr>
-          <w:left w:val="single" w:color="CBD5E1" w:sz="16" w:space="8"/>
-        </w:pBdr>
-        <w:shd w:fill="F3F4F6" w:val="clear"/>
-        <w:spacing w:after="0" w:before="0" w:line="240"/>
-        <w:ind w:left="120"/>
-      </w:pPr>
-      <w:r>
-        <w:rPr>
-          <w:rFonts w:ascii="Consolas" w:cs="Consolas" w:eastAsia="Consolas" w:hAnsi="Consolas"/>
-          <w:color w:val="0F172A"/>
-          <w:sz w:val="17"/>
-          <w:szCs w:val="17"/>
-        </w:rPr>
-        <w:t xml:space="preserve">// cart (proveedor) verifica en su build que su evento cumple ese contrato.</w:t>
-      </w:r>
-    </w:p>
-    <w:p>
-      <w:pPr>
-        <w:pBdr>
-          <w:left w:val="single" w:color="CBD5E1" w:sz="16" w:space="8"/>
-        </w:pBdr>
-        <w:shd w:fill="F3F4F6" w:val="clear"/>
-        <w:spacing w:after="0" w:before="0" w:line="240"/>
-        <w:ind w:left="120"/>
-      </w:pPr>
-      <w:r>
-        <w:rPr>
-          <w:rFonts w:ascii="Consolas" w:cs="Consolas" w:eastAsia="Consolas" w:hAnsi="Consolas"/>
-          <w:color w:val="0F172A"/>
-          <w:sz w:val="17"/>
-          <w:szCs w:val="17"/>
-        </w:rPr>
-        <w:t xml:space="preserve">@PactTestFor(providerName = "cart-service")</w:t>
+        <w:t xml:space="preserve">// LADO CONSUMIDOR (order): declara el contrato del evento 'cart.checked-out'</w:t>
+      </w:r>
+    </w:p>
+    <w:p>
+      <w:pPr>
+        <w:pBdr>
+          <w:left w:val="single" w:color="CBD5E1" w:sz="16" w:space="8"/>
+        </w:pBdr>
+        <w:shd w:fill="F3F4F6" w:val="clear"/>
+        <w:spacing w:after="0" w:before="0" w:line="240"/>
+        <w:ind w:left="120"/>
+      </w:pPr>
+      <w:r>
+        <w:rPr>
+          <w:rFonts w:ascii="Consolas" w:cs="Consolas" w:eastAsia="Consolas" w:hAnsi="Consolas"/>
+          <w:color w:val="0F172A"/>
+          <w:sz w:val="17"/>
+          <w:szCs w:val="17"/>
+        </w:rPr>
+        <w:t xml:space="preserve">// y verifica que su consumidor real lo procesa. Al pasar, genera el pact.</w:t>
+      </w:r>
+    </w:p>
+    <w:p>
+      <w:pPr>
+        <w:pBdr>
+          <w:left w:val="single" w:color="CBD5E1" w:sz="16" w:space="8"/>
+        </w:pBdr>
+        <w:shd w:fill="F3F4F6" w:val="clear"/>
+        <w:spacing w:after="0" w:before="0" w:line="240"/>
+        <w:ind w:left="120"/>
+      </w:pPr>
+      <w:r>
+        <w:rPr>
+          <w:rFonts w:ascii="Consolas" w:cs="Consolas" w:eastAsia="Consolas" w:hAnsi="Consolas"/>
+          <w:color w:val="0F172A"/>
+          <w:sz w:val="17"/>
+          <w:szCs w:val="17"/>
+        </w:rPr>
+        <w:t xml:space="preserve">@PactTestFor(providerName = "cart-service", providerType = ProviderType.ASYNCH)</w:t>
+      </w:r>
+    </w:p>
+    <w:p>
+      <w:pPr>
+        <w:pBdr>
+          <w:left w:val="single" w:color="CBD5E1" w:sz="16" w:space="8"/>
+        </w:pBdr>
+        <w:shd w:fill="F3F4F6" w:val="clear"/>
+        <w:spacing w:after="0" w:before="0" w:line="240"/>
+        <w:ind w:left="120"/>
+      </w:pPr>
+      <w:r>
+        <w:rPr>
+          <w:rFonts w:ascii="Consolas" w:cs="Consolas" w:eastAsia="Consolas" w:hAnsi="Consolas"/>
+          <w:color w:val="0F172A"/>
+          <w:sz w:val="17"/>
+          <w:szCs w:val="17"/>
+        </w:rPr>
+        <w:t xml:space="preserve">class CartCheckedOutContractTest { @Pact(consumer = "order-service") ... }</w:t>
+      </w:r>
+    </w:p>
+    <w:p>
+      <w:pPr>
+        <w:pBdr>
+          <w:left w:val="single" w:color="CBD5E1" w:sz="16" w:space="8"/>
+        </w:pBdr>
+        <w:shd w:fill="F3F4F6" w:val="clear"/>
+        <w:spacing w:after="0" w:before="0" w:line="240"/>
+        <w:ind w:left="120"/>
+      </w:pPr>
+      <w:r>
+        <w:rPr>
+          <w:rFonts w:ascii="Consolas" w:cs="Consolas" w:eastAsia="Consolas" w:hAnsi="Consolas"/>
+          <w:color w:val="0F172A"/>
+          <w:sz w:val="17"/>
+          <w:szCs w:val="17"/>
+        </w:rPr>
+        <w:t xml:space="preserve"> </w:t>
+      </w:r>
+    </w:p>
+    <w:p>
+      <w:pPr>
+        <w:pBdr>
+          <w:left w:val="single" w:color="CBD5E1" w:sz="16" w:space="8"/>
+        </w:pBdr>
+        <w:shd w:fill="F3F4F6" w:val="clear"/>
+        <w:spacing w:after="0" w:before="0" w:line="240"/>
+        <w:ind w:left="120"/>
+      </w:pPr>
+      <w:r>
+        <w:rPr>
+          <w:rFonts w:ascii="Consolas" w:cs="Consolas" w:eastAsia="Consolas" w:hAnsi="Consolas"/>
+          <w:color w:val="0F172A"/>
+          <w:sz w:val="17"/>
+          <w:szCs w:val="17"/>
+        </w:rPr>
+        <w:t xml:space="preserve">// LADO PROVEEDOR (cart): construye el evento REAL, lo serializa como en</w:t>
+      </w:r>
+    </w:p>
+    <w:p>
+      <w:pPr>
+        <w:pBdr>
+          <w:left w:val="single" w:color="CBD5E1" w:sz="16" w:space="8"/>
+        </w:pBdr>
+        <w:shd w:fill="F3F4F6" w:val="clear"/>
+        <w:spacing w:after="0" w:before="0" w:line="240"/>
+        <w:ind w:left="120"/>
+      </w:pPr>
+      <w:r>
+        <w:rPr>
+          <w:rFonts w:ascii="Consolas" w:cs="Consolas" w:eastAsia="Consolas" w:hAnsi="Consolas"/>
+          <w:color w:val="0F172A"/>
+          <w:sz w:val="17"/>
+          <w:szCs w:val="17"/>
+        </w:rPr>
+        <w:t xml:space="preserve">// produccion y Pact comprueba que cumple los matchers del contrato.</w:t>
+      </w:r>
+    </w:p>
+    <w:p>
+      <w:pPr>
+        <w:pBdr>
+          <w:left w:val="single" w:color="CBD5E1" w:sz="16" w:space="8"/>
+        </w:pBdr>
+        <w:shd w:fill="F3F4F6" w:val="clear"/>
+        <w:spacing w:after="0" w:before="0" w:line="240"/>
+        <w:ind w:left="120"/>
+      </w:pPr>
+      <w:r>
+        <w:rPr>
+          <w:rFonts w:ascii="Consolas" w:cs="Consolas" w:eastAsia="Consolas" w:hAnsi="Consolas"/>
+          <w:color w:val="0F172A"/>
+          <w:sz w:val="17"/>
+          <w:szCs w:val="17"/>
+        </w:rPr>
+        <w:t xml:space="preserve">@Provider("cart-service")</w:t>
+      </w:r>
+    </w:p>
+    <w:p>
+      <w:pPr>
+        <w:pBdr>
+          <w:left w:val="single" w:color="CBD5E1" w:sz="16" w:space="8"/>
+        </w:pBdr>
+        <w:shd w:fill="F3F4F6" w:val="clear"/>
+        <w:spacing w:after="0" w:before="0" w:line="240"/>
+        <w:ind w:left="120"/>
+      </w:pPr>
+      <w:r>
+        <w:rPr>
+          <w:rFonts w:ascii="Consolas" w:cs="Consolas" w:eastAsia="Consolas" w:hAnsi="Consolas"/>
+          <w:color w:val="0F172A"/>
+          <w:sz w:val="17"/>
+          <w:szCs w:val="17"/>
+        </w:rPr>
+        <w:t xml:space="preserve">@PactFolder("../book-plus-order-service/target/pacts")</w:t>
+      </w:r>
+    </w:p>
+    <w:p>
+      <w:pPr>
+        <w:pBdr>
+          <w:left w:val="single" w:color="CBD5E1" w:sz="16" w:space="8"/>
+        </w:pBdr>
+        <w:shd w:fill="F3F4F6" w:val="clear"/>
+        <w:spacing w:after="0" w:before="0" w:line="240"/>
+        <w:ind w:left="120"/>
+      </w:pPr>
+      <w:r>
+        <w:rPr>
+          <w:rFonts w:ascii="Consolas" w:cs="Consolas" w:eastAsia="Consolas" w:hAnsi="Consolas"/>
+          <w:color w:val="0F172A"/>
+          <w:sz w:val="17"/>
+          <w:szCs w:val="17"/>
+        </w:rPr>
+        <w:t xml:space="preserve">@IgnoreNoPactsToVerify   // se omite si el pact aun no se genero</w:t>
+      </w:r>
+    </w:p>
+    <w:p>
+      <w:pPr>
+        <w:pBdr>
+          <w:left w:val="single" w:color="CBD5E1" w:sz="16" w:space="8"/>
+        </w:pBdr>
+        <w:shd w:fill="F3F4F6" w:val="clear"/>
+        <w:spacing w:after="0" w:before="0" w:line="240"/>
+        <w:ind w:left="120"/>
+      </w:pPr>
+      <w:r>
+        <w:rPr>
+          <w:rFonts w:ascii="Consolas" w:cs="Consolas" w:eastAsia="Consolas" w:hAnsi="Consolas"/>
+          <w:color w:val="0F172A"/>
+          <w:sz w:val="17"/>
+          <w:szCs w:val="17"/>
+        </w:rPr>
+        <w:t xml:space="preserve">class CartCheckedOutProviderPactTest {</w:t>
+      </w:r>
+    </w:p>
+    <w:p>
+      <w:pPr>
+        <w:pBdr>
+          <w:left w:val="single" w:color="CBD5E1" w:sz="16" w:space="8"/>
+        </w:pBdr>
+        <w:shd w:fill="F3F4F6" w:val="clear"/>
+        <w:spacing w:after="0" w:before="0" w:line="240"/>
+        <w:ind w:left="120"/>
+      </w:pPr>
+      <w:r>
+        <w:rPr>
+          <w:rFonts w:ascii="Consolas" w:cs="Consolas" w:eastAsia="Consolas" w:hAnsi="Consolas"/>
+          <w:color w:val="0F172A"/>
+          <w:sz w:val="17"/>
+          <w:szCs w:val="17"/>
+        </w:rPr>
+        <w:t xml:space="preserve">  @PactVerifyProvider("a cart checked-out event")</w:t>
+      </w:r>
+    </w:p>
+    <w:p>
+      <w:pPr>
+        <w:pBdr>
+          <w:left w:val="single" w:color="CBD5E1" w:sz="16" w:space="8"/>
+        </w:pBdr>
+        <w:shd w:fill="F3F4F6" w:val="clear"/>
+        <w:spacing w:after="0" w:before="0" w:line="240"/>
+        <w:ind w:left="120"/>
+      </w:pPr>
+      <w:r>
+        <w:rPr>
+          <w:rFonts w:ascii="Consolas" w:cs="Consolas" w:eastAsia="Consolas" w:hAnsi="Consolas"/>
+          <w:color w:val="0F172A"/>
+          <w:sz w:val="17"/>
+          <w:szCs w:val="17"/>
+        </w:rPr>
+        <w:t xml:space="preserve">  public String cartCheckedOutEvent() { return mapper.writeValueAsString(event); }</w:t>
       </w:r>
     </w:p>
     <w:p>
@@ -30637,7 +30827,23 @@
           <w:sz w:val="17"/>
           <w:szCs w:val="17"/>
         </w:rPr>
-        <w:t xml:space="preserve">void verifyCartCheckedOutContract() { ... }</w:t>
+        <w:t xml:space="preserve">}</w:t>
+      </w:r>
+    </w:p>
+    <w:p>
+      <w:pPr>
+        <w:spacing w:after="160"/>
+      </w:pPr>
+      <w:r>
+        <w:rPr>
+          <w:rFonts w:ascii="Arial" w:cs="Arial" w:eastAsia="Arial" w:hAnsi="Arial"/>
+          <w:i/>
+          <w:iCs/>
+          <w:color w:val="6B7280"/>
+          <w:sz w:val="18"/>
+          <w:szCs w:val="18"/>
+        </w:rPr>
+        <w:t xml:space="preserve">El ciclo consumer-driven queda cerrado: order genera el contrato (target/pacts) y cart lo verifica contra su evento real. Ejecución: primero el test de consumidor de order, luego el de proveedor de cart.</w:t>
       </w:r>
     </w:p>
     <w:p>

</xml_diff>